<commit_message>
Ajustando comentários em sort.c e adicionando declarações no main.c
</commit_message>
<xml_diff>
--- a/Relatorio_Equipe_HeapSort.docx
+++ b/Relatorio_Equipe_HeapSort.docx
@@ -610,6 +610,335 @@
           <w:szCs w:val="24"/>
         </w:rPr>
         <w:t>.</w:t>
+      </w:r>
+    </w:p>
+    <w:p>
+      <w:pPr>
+        <w:pStyle w:val="PargrafodaLista"/>
+        <w:spacing w:line="480" w:lineRule="auto"/>
+        <w:rPr>
+          <w:rFonts w:ascii="Times" w:hAnsi="Times" w:cs="Times"/>
+          <w:sz w:val="24"/>
+          <w:szCs w:val="24"/>
+        </w:rPr>
+      </w:pPr>
+    </w:p>
+    <w:p>
+      <w:pPr>
+        <w:pStyle w:val="PargrafodaLista"/>
+        <w:spacing w:line="480" w:lineRule="auto"/>
+      </w:pPr>
+      <w:hyperlink r:id="rId5" w:history="1">
+        <w:proofErr w:type="spellStart"/>
+        <w:r>
+          <w:rPr>
+            <w:rStyle w:val="Hyperlink"/>
+          </w:rPr>
+          <w:t>Heap</w:t>
+        </w:r>
+        <w:proofErr w:type="spellEnd"/>
+        <w:r>
+          <w:rPr>
+            <w:rStyle w:val="Hyperlink"/>
+          </w:rPr>
+          <w:t xml:space="preserve"> </w:t>
+        </w:r>
+        <w:proofErr w:type="spellStart"/>
+        <w:r>
+          <w:rPr>
+            <w:rStyle w:val="Hyperlink"/>
+          </w:rPr>
+          <w:t>Sort</w:t>
+        </w:r>
+        <w:proofErr w:type="spellEnd"/>
+        <w:r>
+          <w:rPr>
+            <w:rStyle w:val="Hyperlink"/>
+          </w:rPr>
+          <w:t xml:space="preserve"> (</w:t>
+        </w:r>
+        <w:proofErr w:type="spellStart"/>
+        <w:r>
+          <w:rPr>
+            <w:rStyle w:val="Hyperlink"/>
+          </w:rPr>
+          <w:t>With</w:t>
+        </w:r>
+        <w:proofErr w:type="spellEnd"/>
+        <w:r>
+          <w:rPr>
+            <w:rStyle w:val="Hyperlink"/>
+          </w:rPr>
+          <w:t xml:space="preserve"> </w:t>
+        </w:r>
+        <w:proofErr w:type="spellStart"/>
+        <w:r>
+          <w:rPr>
+            <w:rStyle w:val="Hyperlink"/>
+          </w:rPr>
+          <w:t>Code</w:t>
+        </w:r>
+        <w:proofErr w:type="spellEnd"/>
+        <w:r>
+          <w:rPr>
+            <w:rStyle w:val="Hyperlink"/>
+          </w:rPr>
+          <w:t xml:space="preserve"> in </w:t>
+        </w:r>
+        <w:proofErr w:type="spellStart"/>
+        <w:r>
+          <w:rPr>
+            <w:rStyle w:val="Hyperlink"/>
+          </w:rPr>
+          <w:t>Python</w:t>
+        </w:r>
+        <w:proofErr w:type="spellEnd"/>
+        <w:r>
+          <w:rPr>
+            <w:rStyle w:val="Hyperlink"/>
+          </w:rPr>
+          <w:t xml:space="preserve">, C++, Java </w:t>
+        </w:r>
+        <w:proofErr w:type="spellStart"/>
+        <w:r>
+          <w:rPr>
+            <w:rStyle w:val="Hyperlink"/>
+          </w:rPr>
+          <w:t>and</w:t>
+        </w:r>
+        <w:proofErr w:type="spellEnd"/>
+        <w:r>
+          <w:rPr>
+            <w:rStyle w:val="Hyperlink"/>
+          </w:rPr>
+          <w:t xml:space="preserve"> C)</w:t>
+        </w:r>
+      </w:hyperlink>
+    </w:p>
+    <w:p>
+      <w:pPr>
+        <w:pStyle w:val="PargrafodaLista"/>
+        <w:spacing w:line="480" w:lineRule="auto"/>
+      </w:pPr>
+      <w:hyperlink r:id="rId6" w:history="1">
+        <w:r>
+          <w:rPr>
+            <w:rStyle w:val="Hyperlink"/>
+          </w:rPr>
+          <w:t xml:space="preserve">C </w:t>
+        </w:r>
+        <w:proofErr w:type="spellStart"/>
+        <w:r>
+          <w:rPr>
+            <w:rStyle w:val="Hyperlink"/>
+          </w:rPr>
+          <w:t>Program</w:t>
+        </w:r>
+        <w:proofErr w:type="spellEnd"/>
+        <w:r>
+          <w:rPr>
+            <w:rStyle w:val="Hyperlink"/>
+          </w:rPr>
+          <w:t xml:space="preserve"> for </w:t>
+        </w:r>
+        <w:proofErr w:type="spellStart"/>
+        <w:r>
+          <w:rPr>
+            <w:rStyle w:val="Hyperlink"/>
+          </w:rPr>
+          <w:t>Heap</w:t>
+        </w:r>
+        <w:proofErr w:type="spellEnd"/>
+        <w:r>
+          <w:rPr>
+            <w:rStyle w:val="Hyperlink"/>
+          </w:rPr>
+          <w:t xml:space="preserve"> </w:t>
+        </w:r>
+        <w:proofErr w:type="spellStart"/>
+        <w:r>
+          <w:rPr>
+            <w:rStyle w:val="Hyperlink"/>
+          </w:rPr>
+          <w:t>Sort</w:t>
+        </w:r>
+        <w:proofErr w:type="spellEnd"/>
+        <w:r>
+          <w:rPr>
+            <w:rStyle w:val="Hyperlink"/>
+          </w:rPr>
+          <w:t xml:space="preserve"> | </w:t>
+        </w:r>
+        <w:proofErr w:type="spellStart"/>
+        <w:proofErr w:type="gramStart"/>
+        <w:r>
+          <w:rPr>
+            <w:rStyle w:val="Hyperlink"/>
+          </w:rPr>
+          <w:t>GeeksforGeeks</w:t>
+        </w:r>
+        <w:proofErr w:type="spellEnd"/>
+        <w:proofErr w:type="gramEnd"/>
+      </w:hyperlink>
+    </w:p>
+    <w:p>
+      <w:pPr>
+        <w:pStyle w:val="PargrafodaLista"/>
+        <w:spacing w:line="480" w:lineRule="auto"/>
+      </w:pPr>
+      <w:hyperlink r:id="rId7" w:history="1">
+        <w:r>
+          <w:rPr>
+            <w:rStyle w:val="Hyperlink"/>
+          </w:rPr>
+          <w:t xml:space="preserve">(11) C </w:t>
+        </w:r>
+        <w:proofErr w:type="spellStart"/>
+        <w:r>
+          <w:rPr>
+            <w:rStyle w:val="Hyperlink"/>
+          </w:rPr>
+          <w:t>Program</w:t>
+        </w:r>
+        <w:proofErr w:type="spellEnd"/>
+        <w:r>
+          <w:rPr>
+            <w:rStyle w:val="Hyperlink"/>
+          </w:rPr>
+          <w:t xml:space="preserve"> For </w:t>
+        </w:r>
+        <w:proofErr w:type="spellStart"/>
+        <w:r>
+          <w:rPr>
+            <w:rStyle w:val="Hyperlink"/>
+          </w:rPr>
+          <w:t>Heap</w:t>
+        </w:r>
+        <w:proofErr w:type="spellEnd"/>
+        <w:r>
+          <w:rPr>
+            <w:rStyle w:val="Hyperlink"/>
+          </w:rPr>
+          <w:t xml:space="preserve"> </w:t>
+        </w:r>
+        <w:proofErr w:type="spellStart"/>
+        <w:r>
+          <w:rPr>
+            <w:rStyle w:val="Hyperlink"/>
+          </w:rPr>
+          <w:t>Sort</w:t>
+        </w:r>
+        <w:proofErr w:type="spellEnd"/>
+        <w:r>
+          <w:rPr>
+            <w:rStyle w:val="Hyperlink"/>
+          </w:rPr>
+          <w:t xml:space="preserve"> </w:t>
+        </w:r>
+        <w:proofErr w:type="spellStart"/>
+        <w:r>
+          <w:rPr>
+            <w:rStyle w:val="Hyperlink"/>
+          </w:rPr>
+          <w:t>Algorithm</w:t>
+        </w:r>
+        <w:proofErr w:type="spellEnd"/>
+        <w:r>
+          <w:rPr>
+            <w:rStyle w:val="Hyperlink"/>
+          </w:rPr>
+          <w:t xml:space="preserve"> - </w:t>
+        </w:r>
+        <w:proofErr w:type="spellStart"/>
+        <w:proofErr w:type="gramStart"/>
+        <w:r>
+          <w:rPr>
+            <w:rStyle w:val="Hyperlink"/>
+          </w:rPr>
+          <w:t>YouTube</w:t>
+        </w:r>
+        <w:proofErr w:type="spellEnd"/>
+        <w:proofErr w:type="gramEnd"/>
+      </w:hyperlink>
+    </w:p>
+    <w:p>
+      <w:pPr>
+        <w:pStyle w:val="PargrafodaLista"/>
+        <w:spacing w:line="480" w:lineRule="auto"/>
+      </w:pPr>
+      <w:hyperlink r:id="rId8" w:history="1">
+        <w:r>
+          <w:rPr>
+            <w:rStyle w:val="Hyperlink"/>
+          </w:rPr>
+          <w:t xml:space="preserve">(11) </w:t>
+        </w:r>
+        <w:proofErr w:type="spellStart"/>
+        <w:r>
+          <w:rPr>
+            <w:rStyle w:val="Hyperlink"/>
+          </w:rPr>
+          <w:t>Heap</w:t>
+        </w:r>
+        <w:proofErr w:type="spellEnd"/>
+        <w:r>
+          <w:rPr>
+            <w:rStyle w:val="Hyperlink"/>
+          </w:rPr>
+          <w:t xml:space="preserve"> </w:t>
+        </w:r>
+        <w:proofErr w:type="spellStart"/>
+        <w:r>
+          <w:rPr>
+            <w:rStyle w:val="Hyperlink"/>
+          </w:rPr>
+          <w:t>Sort</w:t>
+        </w:r>
+        <w:proofErr w:type="spellEnd"/>
+        <w:r>
+          <w:rPr>
+            <w:rStyle w:val="Hyperlink"/>
+          </w:rPr>
+          <w:t xml:space="preserve"> </w:t>
+        </w:r>
+        <w:proofErr w:type="spellStart"/>
+        <w:r>
+          <w:rPr>
+            <w:rStyle w:val="Hyperlink"/>
+          </w:rPr>
+          <w:t>Algorithm</w:t>
+        </w:r>
+        <w:proofErr w:type="spellEnd"/>
+        <w:r>
+          <w:rPr>
+            <w:rStyle w:val="Hyperlink"/>
+          </w:rPr>
+          <w:t xml:space="preserve"> - </w:t>
+        </w:r>
+        <w:proofErr w:type="spellStart"/>
+        <w:proofErr w:type="gramStart"/>
+        <w:r>
+          <w:rPr>
+            <w:rStyle w:val="Hyperlink"/>
+          </w:rPr>
+          <w:t>YouTube</w:t>
+        </w:r>
+        <w:proofErr w:type="spellEnd"/>
+        <w:proofErr w:type="gramEnd"/>
+      </w:hyperlink>
+    </w:p>
+    <w:p>
+      <w:pPr>
+        <w:pStyle w:val="PargrafodaLista"/>
+        <w:spacing w:line="480" w:lineRule="auto"/>
+        <w:rPr>
+          <w:rFonts w:ascii="Times" w:hAnsi="Times" w:cs="Times"/>
+          <w:sz w:val="24"/>
+          <w:szCs w:val="24"/>
+        </w:rPr>
+      </w:pPr>
+      <w:r>
+        <w:t>Livro</w:t>
       </w:r>
     </w:p>
     <w:sectPr>
@@ -941,6 +1270,18 @@
       <w:ind w:left="720"/>
       <w:contextualSpacing/>
     </w:pPr>
+  </w:style>
+  <w:style w:type="character" w:styleId="Hyperlink">
+    <w:name w:val="Hyperlink"/>
+    <w:basedOn w:val="Fontepargpadro"/>
+    <w:uiPriority w:val="99"/>
+    <w:semiHidden/>
+    <w:unhideWhenUsed/>
+    <w:rsid w:val="00425AB1"/>
+    <w:rPr>
+      <w:color w:val="0000FF"/>
+      <w:u w:val="single"/>
+    </w:rPr>
   </w:style>
 </w:styles>
 </file>

</xml_diff>

<commit_message>
Novo teste e adicionando novas informações sobre Complexidade
</commit_message>
<xml_diff>
--- a/Relatorio_Equipe_HeapSort.docx
+++ b/Relatorio_Equipe_HeapSort.docx
@@ -5,6 +5,7 @@
     <w:p>
       <w:pPr>
         <w:spacing w:line="480" w:lineRule="auto"/>
+        <w:jc w:val="both"/>
         <w:rPr>
           <w:rFonts w:ascii="Times" w:hAnsi="Times" w:cs="Times"/>
           <w:sz w:val="24"/>
@@ -106,6 +107,7 @@
           <w:p>
             <w:pPr>
               <w:spacing w:line="480" w:lineRule="auto"/>
+              <w:jc w:val="both"/>
               <w:rPr>
                 <w:rFonts w:ascii="Times" w:hAnsi="Times" w:cs="Times"/>
                 <w:b/>
@@ -131,6 +133,7 @@
           <w:p>
             <w:pPr>
               <w:spacing w:line="480" w:lineRule="auto"/>
+              <w:jc w:val="both"/>
               <w:rPr>
                 <w:rFonts w:ascii="Times" w:hAnsi="Times" w:cs="Times"/>
                 <w:b/>
@@ -158,6 +161,7 @@
           <w:p>
             <w:pPr>
               <w:spacing w:line="480" w:lineRule="auto"/>
+              <w:jc w:val="both"/>
               <w:rPr>
                 <w:rFonts w:ascii="Times" w:hAnsi="Times" w:cs="Times"/>
                 <w:sz w:val="24"/>
@@ -181,6 +185,7 @@
           <w:p>
             <w:pPr>
               <w:spacing w:line="480" w:lineRule="auto"/>
+              <w:jc w:val="both"/>
               <w:rPr>
                 <w:rFonts w:ascii="Times" w:hAnsi="Times" w:cs="Times"/>
                 <w:sz w:val="24"/>
@@ -206,6 +211,7 @@
           <w:p>
             <w:pPr>
               <w:spacing w:line="480" w:lineRule="auto"/>
+              <w:jc w:val="both"/>
               <w:rPr>
                 <w:rFonts w:ascii="Times" w:hAnsi="Times" w:cs="Times"/>
                 <w:sz w:val="24"/>
@@ -229,6 +235,7 @@
           <w:p>
             <w:pPr>
               <w:spacing w:line="480" w:lineRule="auto"/>
+              <w:jc w:val="both"/>
               <w:rPr>
                 <w:rFonts w:ascii="Times" w:hAnsi="Times" w:cs="Times"/>
                 <w:sz w:val="24"/>
@@ -246,6 +253,7 @@
           <w:p>
             <w:pPr>
               <w:spacing w:line="480" w:lineRule="auto"/>
+              <w:jc w:val="both"/>
               <w:rPr>
                 <w:rFonts w:ascii="Times" w:hAnsi="Times" w:cs="Times"/>
                 <w:sz w:val="24"/>
@@ -269,6 +277,7 @@
           <w:p>
             <w:pPr>
               <w:spacing w:line="480" w:lineRule="auto"/>
+              <w:jc w:val="both"/>
               <w:rPr>
                 <w:rFonts w:ascii="Times" w:hAnsi="Times" w:cs="Times"/>
                 <w:sz w:val="24"/>
@@ -282,7 +291,10 @@
     <w:sdt>
       <w:sdtPr>
         <w:rPr>
-          <w:rFonts w:ascii="Times" w:hAnsi="Times" w:cs="Times"/>
+          <w:rFonts w:ascii="Times" w:eastAsiaTheme="minorHAnsi" w:hAnsi="Times" w:cs="Times"/>
+          <w:b w:val="0"/>
+          <w:bCs w:val="0"/>
+          <w:color w:val="auto"/>
           <w:sz w:val="24"/>
           <w:szCs w:val="24"/>
         </w:rPr>
@@ -292,18 +304,11 @@
           <w:docPartUnique/>
         </w:docPartObj>
       </w:sdtPr>
-      <w:sdtEndPr>
-        <w:rPr>
-          <w:rFonts w:eastAsiaTheme="minorHAnsi"/>
-          <w:b w:val="0"/>
-          <w:bCs w:val="0"/>
-          <w:color w:val="auto"/>
-        </w:rPr>
-      </w:sdtEndPr>
       <w:sdtContent>
         <w:p>
           <w:pPr>
             <w:pStyle w:val="CabealhodoSumrio"/>
+            <w:jc w:val="both"/>
             <w:rPr>
               <w:rFonts w:ascii="Times" w:hAnsi="Times" w:cs="Times"/>
               <w:sz w:val="24"/>
@@ -326,6 +331,7 @@
               <w:tab w:val="left" w:pos="440"/>
               <w:tab w:val="right" w:leader="dot" w:pos="9016"/>
             </w:tabs>
+            <w:jc w:val="both"/>
             <w:rPr>
               <w:rFonts w:ascii="Times" w:hAnsi="Times" w:cs="Times"/>
               <w:noProof/>
@@ -464,6 +470,7 @@
             <w:tabs>
               <w:tab w:val="right" w:leader="dot" w:pos="9016"/>
             </w:tabs>
+            <w:jc w:val="both"/>
             <w:rPr>
               <w:rFonts w:ascii="Times" w:hAnsi="Times" w:cs="Times"/>
               <w:noProof/>
@@ -559,6 +566,7 @@
             <w:tabs>
               <w:tab w:val="right" w:leader="dot" w:pos="9016"/>
             </w:tabs>
+            <w:jc w:val="both"/>
             <w:rPr>
               <w:rFonts w:ascii="Times" w:hAnsi="Times" w:cs="Times"/>
               <w:noProof/>
@@ -654,6 +662,7 @@
             <w:tabs>
               <w:tab w:val="right" w:leader="dot" w:pos="9016"/>
             </w:tabs>
+            <w:jc w:val="both"/>
             <w:rPr>
               <w:rFonts w:ascii="Times" w:hAnsi="Times" w:cs="Times"/>
               <w:noProof/>
@@ -750,6 +759,7 @@
               <w:tab w:val="left" w:pos="440"/>
               <w:tab w:val="right" w:leader="dot" w:pos="9016"/>
             </w:tabs>
+            <w:jc w:val="both"/>
             <w:rPr>
               <w:rFonts w:ascii="Times" w:hAnsi="Times" w:cs="Times"/>
               <w:noProof/>
@@ -864,6 +874,7 @@
             <w:tabs>
               <w:tab w:val="right" w:leader="dot" w:pos="9016"/>
             </w:tabs>
+            <w:jc w:val="both"/>
             <w:rPr>
               <w:rFonts w:ascii="Times" w:hAnsi="Times" w:cs="Times"/>
               <w:noProof/>
@@ -959,6 +970,7 @@
             <w:tabs>
               <w:tab w:val="right" w:leader="dot" w:pos="9016"/>
             </w:tabs>
+            <w:jc w:val="both"/>
             <w:rPr>
               <w:rFonts w:ascii="Times" w:hAnsi="Times" w:cs="Times"/>
               <w:noProof/>
@@ -1054,6 +1066,7 @@
             <w:tabs>
               <w:tab w:val="right" w:leader="dot" w:pos="9016"/>
             </w:tabs>
+            <w:jc w:val="both"/>
             <w:rPr>
               <w:rFonts w:ascii="Times" w:hAnsi="Times" w:cs="Times"/>
               <w:noProof/>
@@ -1149,6 +1162,7 @@
             <w:tabs>
               <w:tab w:val="right" w:leader="dot" w:pos="9016"/>
             </w:tabs>
+            <w:jc w:val="both"/>
             <w:rPr>
               <w:rFonts w:ascii="Times" w:hAnsi="Times" w:cs="Times"/>
               <w:noProof/>
@@ -1244,6 +1258,7 @@
             <w:tabs>
               <w:tab w:val="right" w:leader="dot" w:pos="9016"/>
             </w:tabs>
+            <w:jc w:val="both"/>
             <w:rPr>
               <w:rFonts w:ascii="Times" w:hAnsi="Times" w:cs="Times"/>
               <w:noProof/>
@@ -1339,6 +1354,7 @@
             <w:tabs>
               <w:tab w:val="right" w:leader="dot" w:pos="9016"/>
             </w:tabs>
+            <w:jc w:val="both"/>
             <w:rPr>
               <w:rFonts w:ascii="Times" w:hAnsi="Times" w:cs="Times"/>
               <w:noProof/>
@@ -1434,6 +1450,7 @@
             <w:tabs>
               <w:tab w:val="right" w:leader="dot" w:pos="9016"/>
             </w:tabs>
+            <w:jc w:val="both"/>
             <w:rPr>
               <w:rFonts w:ascii="Times" w:hAnsi="Times" w:cs="Times"/>
               <w:noProof/>
@@ -1530,6 +1547,7 @@
               <w:tab w:val="left" w:pos="440"/>
               <w:tab w:val="right" w:leader="dot" w:pos="9016"/>
             </w:tabs>
+            <w:jc w:val="both"/>
             <w:rPr>
               <w:rFonts w:ascii="Times" w:hAnsi="Times" w:cs="Times"/>
               <w:noProof/>
@@ -1644,6 +1662,7 @@
             <w:tabs>
               <w:tab w:val="right" w:leader="dot" w:pos="9016"/>
             </w:tabs>
+            <w:jc w:val="both"/>
             <w:rPr>
               <w:rFonts w:ascii="Times" w:hAnsi="Times" w:cs="Times"/>
               <w:noProof/>
@@ -1739,6 +1758,7 @@
             <w:tabs>
               <w:tab w:val="right" w:leader="dot" w:pos="9016"/>
             </w:tabs>
+            <w:jc w:val="both"/>
             <w:rPr>
               <w:rFonts w:ascii="Times" w:hAnsi="Times" w:cs="Times"/>
               <w:noProof/>
@@ -1834,6 +1854,7 @@
             <w:tabs>
               <w:tab w:val="right" w:leader="dot" w:pos="9016"/>
             </w:tabs>
+            <w:jc w:val="both"/>
             <w:rPr>
               <w:rFonts w:ascii="Times" w:hAnsi="Times" w:cs="Times"/>
               <w:noProof/>
@@ -1930,6 +1951,7 @@
               <w:tab w:val="left" w:pos="440"/>
               <w:tab w:val="right" w:leader="dot" w:pos="9016"/>
             </w:tabs>
+            <w:jc w:val="both"/>
             <w:rPr>
               <w:rFonts w:ascii="Times" w:hAnsi="Times" w:cs="Times"/>
               <w:noProof/>
@@ -2044,6 +2066,7 @@
             <w:tabs>
               <w:tab w:val="right" w:leader="dot" w:pos="9016"/>
             </w:tabs>
+            <w:jc w:val="both"/>
             <w:rPr>
               <w:rFonts w:ascii="Times" w:hAnsi="Times" w:cs="Times"/>
               <w:noProof/>
@@ -2139,6 +2162,7 @@
             <w:tabs>
               <w:tab w:val="right" w:leader="dot" w:pos="9016"/>
             </w:tabs>
+            <w:jc w:val="both"/>
             <w:rPr>
               <w:rFonts w:ascii="Times" w:hAnsi="Times" w:cs="Times"/>
               <w:noProof/>
@@ -2235,6 +2259,7 @@
               <w:tab w:val="left" w:pos="440"/>
               <w:tab w:val="right" w:leader="dot" w:pos="9016"/>
             </w:tabs>
+            <w:jc w:val="both"/>
             <w:rPr>
               <w:rFonts w:ascii="Times" w:hAnsi="Times" w:cs="Times"/>
               <w:noProof/>
@@ -2345,6 +2370,7 @@
         </w:p>
         <w:p>
           <w:pPr>
+            <w:jc w:val="both"/>
             <w:rPr>
               <w:rFonts w:ascii="Times" w:hAnsi="Times" w:cs="Times"/>
               <w:sz w:val="24"/>
@@ -2365,6 +2391,7 @@
     <w:p>
       <w:pPr>
         <w:pStyle w:val="Ttulo1"/>
+        <w:jc w:val="both"/>
         <w:rPr>
           <w:rFonts w:ascii="Times" w:hAnsi="Times" w:cs="Times"/>
           <w:sz w:val="24"/>
@@ -2379,6 +2406,7 @@
           <w:ilvl w:val="0"/>
           <w:numId w:val="2"/>
         </w:numPr>
+        <w:jc w:val="both"/>
         <w:rPr>
           <w:rFonts w:ascii="Times" w:hAnsi="Times" w:cs="Times"/>
           <w:sz w:val="24"/>
@@ -2399,6 +2427,7 @@
     <w:p>
       <w:pPr>
         <w:pStyle w:val="Ttulo2"/>
+        <w:jc w:val="both"/>
         <w:rPr>
           <w:rFonts w:ascii="Times" w:hAnsi="Times" w:cs="Times"/>
           <w:sz w:val="24"/>
@@ -2427,6 +2456,7 @@
     <w:p>
       <w:pPr>
         <w:pStyle w:val="Ttulo2"/>
+        <w:jc w:val="both"/>
         <w:rPr>
           <w:rFonts w:ascii="Times" w:hAnsi="Times" w:cs="Times"/>
           <w:sz w:val="24"/>
@@ -2465,6 +2495,7 @@
     <w:p>
       <w:pPr>
         <w:pStyle w:val="Ttulo2"/>
+        <w:jc w:val="both"/>
         <w:rPr>
           <w:rFonts w:ascii="Times" w:hAnsi="Times" w:cs="Times"/>
           <w:sz w:val="24"/>
@@ -2504,6 +2535,7 @@
       <w:pPr>
         <w:pStyle w:val="PargrafodaLista"/>
         <w:spacing w:line="480" w:lineRule="auto"/>
+        <w:jc w:val="both"/>
         <w:rPr>
           <w:rFonts w:ascii="Times" w:hAnsi="Times" w:cs="Times"/>
           <w:sz w:val="24"/>
@@ -2526,6 +2558,7 @@
           <w:ilvl w:val="0"/>
           <w:numId w:val="2"/>
         </w:numPr>
+        <w:jc w:val="both"/>
         <w:rPr>
           <w:rFonts w:ascii="Times" w:hAnsi="Times" w:cs="Times"/>
           <w:sz w:val="24"/>
@@ -2582,6 +2615,7 @@
     <w:p>
       <w:pPr>
         <w:pStyle w:val="Ttulo2"/>
+        <w:jc w:val="both"/>
         <w:rPr>
           <w:rFonts w:ascii="Times" w:hAnsi="Times" w:cs="Times"/>
           <w:sz w:val="24"/>
@@ -2601,7 +2635,13 @@
     </w:p>
     <w:p>
       <w:pPr>
+        <w:jc w:val="both"/>
+      </w:pPr>
+    </w:p>
+    <w:p>
+      <w:pPr>
         <w:pStyle w:val="Ttulo2"/>
+        <w:jc w:val="both"/>
         <w:rPr>
           <w:rFonts w:ascii="Times" w:hAnsi="Times" w:cs="Times"/>
           <w:sz w:val="24"/>
@@ -2639,6 +2679,7 @@
       <w:pPr>
         <w:pStyle w:val="PargrafodaLista"/>
         <w:spacing w:line="480" w:lineRule="auto"/>
+        <w:jc w:val="both"/>
         <w:rPr>
           <w:rFonts w:ascii="Times" w:hAnsi="Times" w:cs="Times"/>
           <w:sz w:val="24"/>
@@ -2694,6 +2735,7 @@
       <w:pPr>
         <w:pStyle w:val="PargrafodaLista"/>
         <w:spacing w:line="480" w:lineRule="auto"/>
+        <w:jc w:val="both"/>
         <w:rPr>
           <w:rFonts w:ascii="Times" w:eastAsiaTheme="minorEastAsia" w:hAnsi="Times" w:cs="Times"/>
           <w:sz w:val="24"/>
@@ -2776,6 +2818,7 @@
       <w:pPr>
         <w:pStyle w:val="PargrafodaLista"/>
         <w:spacing w:line="480" w:lineRule="auto"/>
+        <w:jc w:val="both"/>
         <w:rPr>
           <w:rFonts w:ascii="Times" w:hAnsi="Times" w:cs="Times"/>
           <w:sz w:val="24"/>
@@ -2799,6 +2842,7 @@
           <w:numId w:val="4"/>
         </w:numPr>
         <w:spacing w:line="480" w:lineRule="auto"/>
+        <w:jc w:val="both"/>
         <w:rPr>
           <w:rFonts w:ascii="Times" w:eastAsiaTheme="minorEastAsia" w:hAnsi="Times" w:cs="Times"/>
           <w:sz w:val="24"/>
@@ -2831,13 +2875,89 @@
         </w:rPr>
         <w:t>:</w:t>
       </w:r>
-      <w:r>
-        <w:rPr>
-          <w:rFonts w:ascii="Times" w:hAnsi="Times" w:cs="Times"/>
-          <w:sz w:val="24"/>
-          <w:szCs w:val="24"/>
-        </w:rPr>
-        <w:t xml:space="preserve"> </w:t>
+    </w:p>
+    <w:p>
+      <w:pPr>
+        <w:pStyle w:val="PargrafodaLista"/>
+        <w:spacing w:line="480" w:lineRule="auto"/>
+        <w:ind w:left="1080"/>
+        <w:jc w:val="both"/>
+        <w:rPr>
+          <w:rFonts w:ascii="Times" w:eastAsiaTheme="minorEastAsia" w:hAnsi="Times" w:cs="Times"/>
+          <w:sz w:val="24"/>
+          <w:szCs w:val="24"/>
+        </w:rPr>
+      </w:pPr>
+      <m:oMathPara>
+        <m:oMath>
+          <m:r>
+            <w:rPr>
+              <w:rFonts w:ascii="Cambria Math" w:hAnsi="Cambria Math" w:cs="Times"/>
+              <w:sz w:val="24"/>
+              <w:szCs w:val="24"/>
+            </w:rPr>
+            <m:t>O</m:t>
+          </m:r>
+          <m:d>
+            <m:dPr>
+              <m:ctrlPr>
+                <w:rPr>
+                  <w:rFonts w:ascii="Cambria Math" w:hAnsi="Times" w:cs="Times"/>
+                  <w:i/>
+                  <w:sz w:val="24"/>
+                  <w:szCs w:val="24"/>
+                </w:rPr>
+              </m:ctrlPr>
+            </m:dPr>
+            <m:e>
+              <m:r>
+                <w:rPr>
+                  <w:rFonts w:ascii="Cambria Math" w:hAnsi="Cambria Math" w:cs="Times"/>
+                  <w:sz w:val="24"/>
+                  <w:szCs w:val="24"/>
+                </w:rPr>
+                <m:t>n</m:t>
+              </m:r>
+            </m:e>
+          </m:d>
+        </m:oMath>
+      </m:oMathPara>
+    </w:p>
+    <w:p>
+      <w:pPr>
+        <w:spacing w:line="480" w:lineRule="auto"/>
+        <w:jc w:val="both"/>
+        <w:rPr>
+          <w:rFonts w:ascii="Times" w:eastAsiaTheme="minorEastAsia" w:hAnsi="Times" w:cs="Times"/>
+          <w:sz w:val="24"/>
+          <w:szCs w:val="24"/>
+        </w:rPr>
+      </w:pPr>
+      <w:r>
+        <w:rPr>
+          <w:rFonts w:ascii="Times" w:eastAsiaTheme="minorEastAsia" w:hAnsi="Times" w:cs="Times"/>
+          <w:sz w:val="24"/>
+          <w:szCs w:val="24"/>
+        </w:rPr>
+        <w:t xml:space="preserve">A Construção do </w:t>
+      </w:r>
+      <w:proofErr w:type="spellStart"/>
+      <w:r>
+        <w:rPr>
+          <w:rFonts w:ascii="Times" w:eastAsiaTheme="minorEastAsia" w:hAnsi="Times" w:cs="Times"/>
+          <w:sz w:val="24"/>
+          <w:szCs w:val="24"/>
+        </w:rPr>
+        <w:t>Heap</w:t>
+      </w:r>
+      <w:proofErr w:type="spellEnd"/>
+      <w:r>
+        <w:rPr>
+          <w:rFonts w:ascii="Times" w:eastAsiaTheme="minorEastAsia" w:hAnsi="Times" w:cs="Times"/>
+          <w:sz w:val="24"/>
+          <w:szCs w:val="24"/>
+        </w:rPr>
+        <w:t xml:space="preserve"> vale </w:t>
       </w:r>
       <m:oMath>
         <m:r>
@@ -2871,370 +2991,13 @@
           </m:e>
         </m:d>
       </m:oMath>
-    </w:p>
-    <w:p>
-      <w:pPr>
-        <w:pStyle w:val="PargrafodaLista"/>
-        <w:numPr>
-          <w:ilvl w:val="0"/>
-          <w:numId w:val="4"/>
-        </w:numPr>
-        <w:spacing w:line="480" w:lineRule="auto"/>
-        <w:rPr>
-          <w:rFonts w:ascii="Times" w:eastAsiaTheme="minorEastAsia" w:hAnsi="Times" w:cs="Times"/>
-          <w:sz w:val="24"/>
-          <w:szCs w:val="24"/>
-        </w:rPr>
-      </w:pPr>
-      <w:proofErr w:type="spellStart"/>
-      <w:r>
-        <w:rPr>
-          <w:rFonts w:ascii="Times" w:eastAsiaTheme="minorEastAsia" w:hAnsi="Times" w:cs="Times"/>
-          <w:sz w:val="24"/>
-          <w:szCs w:val="24"/>
-        </w:rPr>
-        <w:t>Heapify</w:t>
-      </w:r>
-      <w:proofErr w:type="spellEnd"/>
-      <w:r>
-        <w:rPr>
-          <w:rFonts w:ascii="Times" w:eastAsiaTheme="minorEastAsia" w:hAnsi="Times" w:cs="Times"/>
-          <w:sz w:val="24"/>
-          <w:szCs w:val="24"/>
-        </w:rPr>
-        <w:t xml:space="preserve">: </w:t>
-      </w:r>
-      <m:oMath>
-        <m:r>
-          <w:rPr>
-            <w:rFonts w:ascii="Cambria Math" w:hAnsi="Cambria Math" w:cs="Times"/>
-            <w:sz w:val="24"/>
-            <w:szCs w:val="24"/>
-          </w:rPr>
-          <m:t>O</m:t>
-        </m:r>
-        <m:r>
-          <w:rPr>
-            <w:rFonts w:ascii="Cambria Math" w:hAnsi="Times" w:cs="Times"/>
-            <w:sz w:val="24"/>
-            <w:szCs w:val="24"/>
-          </w:rPr>
-          <m:t>(</m:t>
-        </m:r>
-        <m:func>
-          <m:funcPr>
-            <m:ctrlPr>
-              <w:rPr>
-                <w:rFonts w:ascii="Cambria Math" w:hAnsi="Times" w:cs="Times"/>
-                <w:i/>
-                <w:sz w:val="24"/>
-                <w:szCs w:val="24"/>
-              </w:rPr>
-            </m:ctrlPr>
-          </m:funcPr>
-          <m:fName>
-            <m:r>
-              <m:rPr>
-                <m:sty m:val="p"/>
-              </m:rPr>
-              <w:rPr>
-                <w:rFonts w:ascii="Cambria Math" w:hAnsi="Times" w:cs="Times"/>
-                <w:sz w:val="24"/>
-                <w:szCs w:val="24"/>
-              </w:rPr>
-              <m:t>log</m:t>
-            </m:r>
-          </m:fName>
-          <m:e>
-            <m:r>
-              <w:rPr>
-                <w:rFonts w:ascii="Cambria Math" w:hAnsi="Times" w:cs="Times"/>
-                <w:sz w:val="24"/>
-                <w:szCs w:val="24"/>
-              </w:rPr>
-              <m:t>n)</m:t>
-            </m:r>
-            <m:r>
-              <w:rPr>
-                <w:rFonts w:ascii="Cambria Math" w:hAnsi="Times" w:cs="Times"/>
-                <w:sz w:val="24"/>
-                <w:szCs w:val="24"/>
-              </w:rPr>
-              <m:t>*</m:t>
-            </m:r>
-            <m:r>
-              <w:rPr>
-                <w:rFonts w:ascii="Cambria Math" w:hAnsi="Times" w:cs="Times"/>
-                <w:sz w:val="24"/>
-                <w:szCs w:val="24"/>
-              </w:rPr>
-              <m:t>n</m:t>
-            </m:r>
-          </m:e>
-        </m:func>
-      </m:oMath>
-    </w:p>
-    <w:p>
-      <w:pPr>
-        <w:pStyle w:val="PargrafodaLista"/>
-        <w:numPr>
-          <w:ilvl w:val="0"/>
-          <w:numId w:val="4"/>
-        </w:numPr>
-        <w:spacing w:line="480" w:lineRule="auto"/>
-        <w:rPr>
-          <w:rFonts w:ascii="Times" w:eastAsiaTheme="minorEastAsia" w:hAnsi="Times" w:cs="Times"/>
-          <w:sz w:val="24"/>
-          <w:szCs w:val="24"/>
-        </w:rPr>
-      </w:pPr>
-      <w:r>
-        <w:rPr>
-          <w:rFonts w:ascii="Times" w:eastAsiaTheme="minorEastAsia" w:hAnsi="Times" w:cs="Times"/>
-          <w:sz w:val="24"/>
-          <w:szCs w:val="24"/>
-        </w:rPr>
-        <w:t xml:space="preserve">Swap: </w:t>
-      </w:r>
-      <m:oMath>
-        <m:r>
-          <w:rPr>
-            <w:rFonts w:ascii="Cambria Math" w:hAnsi="Cambria Math" w:cs="Times"/>
-            <w:sz w:val="24"/>
-            <w:szCs w:val="24"/>
-          </w:rPr>
-          <m:t>O</m:t>
-        </m:r>
-        <m:d>
-          <m:dPr>
-            <m:ctrlPr>
-              <w:rPr>
-                <w:rFonts w:ascii="Cambria Math" w:hAnsi="Times" w:cs="Times"/>
-                <w:i/>
-                <w:sz w:val="24"/>
-                <w:szCs w:val="24"/>
-              </w:rPr>
-            </m:ctrlPr>
-          </m:dPr>
-          <m:e>
-            <m:r>
-              <w:rPr>
-                <w:rFonts w:ascii="Cambria Math" w:hAnsi="Times" w:cs="Times"/>
-                <w:sz w:val="24"/>
-                <w:szCs w:val="24"/>
-              </w:rPr>
-              <m:t>1</m:t>
-            </m:r>
-          </m:e>
-        </m:d>
-        <m:r>
-          <w:rPr>
-            <w:rFonts w:ascii="Cambria Math" w:hAnsi="Times" w:cs="Times"/>
-            <w:sz w:val="24"/>
-            <w:szCs w:val="24"/>
-          </w:rPr>
-          <m:t>→</m:t>
-        </m:r>
-        <m:r>
-          <w:rPr>
-            <w:rFonts w:ascii="Cambria Math" w:hAnsi="Times" w:cs="Times"/>
-            <w:sz w:val="24"/>
-            <w:szCs w:val="24"/>
-          </w:rPr>
-          <m:t>O</m:t>
-        </m:r>
-        <m:d>
-          <m:dPr>
-            <m:ctrlPr>
-              <w:rPr>
-                <w:rFonts w:ascii="Cambria Math" w:hAnsi="Times" w:cs="Times"/>
-                <w:i/>
-                <w:sz w:val="24"/>
-                <w:szCs w:val="24"/>
-              </w:rPr>
-            </m:ctrlPr>
-          </m:dPr>
-          <m:e>
-            <m:r>
-              <w:rPr>
-                <w:rFonts w:ascii="Cambria Math" w:hAnsi="Times" w:cs="Times"/>
-                <w:sz w:val="24"/>
-                <w:szCs w:val="24"/>
-              </w:rPr>
-              <m:t>1</m:t>
-            </m:r>
-          </m:e>
-        </m:d>
-        <m:r>
-          <w:rPr>
-            <w:rFonts w:ascii="Cambria Math" w:hAnsi="Times" w:cs="Times"/>
-            <w:sz w:val="24"/>
-            <w:szCs w:val="24"/>
-          </w:rPr>
-          <m:t>→</m:t>
-        </m:r>
-        <m:r>
-          <w:rPr>
-            <w:rFonts w:ascii="Cambria Math" w:hAnsi="Times" w:cs="Times"/>
-            <w:sz w:val="24"/>
-            <w:szCs w:val="24"/>
-          </w:rPr>
-          <m:t>O(</m:t>
-        </m:r>
-        <m:func>
-          <m:funcPr>
-            <m:ctrlPr>
-              <w:rPr>
-                <w:rFonts w:ascii="Cambria Math" w:hAnsi="Times" w:cs="Times"/>
-                <w:i/>
-                <w:sz w:val="24"/>
-                <w:szCs w:val="24"/>
-              </w:rPr>
-            </m:ctrlPr>
-          </m:funcPr>
-          <m:fName>
-            <m:r>
-              <m:rPr>
-                <m:sty m:val="p"/>
-              </m:rPr>
-              <w:rPr>
-                <w:rFonts w:ascii="Cambria Math" w:hAnsi="Times" w:cs="Times"/>
-                <w:sz w:val="24"/>
-                <w:szCs w:val="24"/>
-              </w:rPr>
-              <m:t>log</m:t>
-            </m:r>
-          </m:fName>
-          <m:e>
-            <m:r>
-              <w:rPr>
-                <w:rFonts w:ascii="Cambria Math" w:hAnsi="Times" w:cs="Times"/>
-                <w:sz w:val="24"/>
-                <w:szCs w:val="24"/>
-              </w:rPr>
-              <m:t>n</m:t>
-            </m:r>
-            <w:proofErr w:type="gramStart"/>
-            <m:r>
-              <w:rPr>
-                <w:rFonts w:ascii="Cambria Math" w:hAnsi="Times" w:cs="Times"/>
-                <w:sz w:val="24"/>
-                <w:szCs w:val="24"/>
-              </w:rPr>
-              <m:t>)</m:t>
-            </m:r>
-            <w:proofErr w:type="gramEnd"/>
-          </m:e>
-        </m:func>
-      </m:oMath>
-    </w:p>
-    <w:p>
-      <w:pPr>
-        <w:pStyle w:val="PargrafodaLista"/>
-        <w:spacing w:line="480" w:lineRule="auto"/>
-        <w:rPr>
-          <w:rFonts w:ascii="Times" w:eastAsiaTheme="minorEastAsia" w:hAnsi="Times" w:cs="Times"/>
-          <w:sz w:val="24"/>
-          <w:szCs w:val="24"/>
-        </w:rPr>
-      </w:pPr>
-      <w:r>
-        <w:rPr>
-          <w:rFonts w:ascii="Times" w:eastAsiaTheme="minorEastAsia" w:hAnsi="Times" w:cs="Times"/>
-          <w:sz w:val="24"/>
-          <w:szCs w:val="24"/>
-        </w:rPr>
-        <w:t>**</w:t>
-      </w:r>
-      <w:r>
-        <w:rPr>
-          <w:rFonts w:ascii="Times" w:eastAsiaTheme="minorEastAsia" w:hAnsi="Times" w:cs="Times"/>
-          <w:sz w:val="24"/>
-          <w:szCs w:val="24"/>
-        </w:rPr>
-        <w:t xml:space="preserve"> A Construção do </w:t>
-      </w:r>
-      <w:proofErr w:type="spellStart"/>
-      <w:r>
-        <w:rPr>
-          <w:rFonts w:ascii="Times" w:eastAsiaTheme="minorEastAsia" w:hAnsi="Times" w:cs="Times"/>
-          <w:sz w:val="24"/>
-          <w:szCs w:val="24"/>
-        </w:rPr>
-        <w:t>Heap</w:t>
-      </w:r>
-      <w:proofErr w:type="spellEnd"/>
-      <w:r>
-        <w:rPr>
-          <w:rFonts w:ascii="Times" w:eastAsiaTheme="minorEastAsia" w:hAnsi="Times" w:cs="Times"/>
-          <w:sz w:val="24"/>
-          <w:szCs w:val="24"/>
-        </w:rPr>
-        <w:t xml:space="preserve"> vale </w:t>
-      </w:r>
-      <m:oMath>
-        <m:r>
-          <w:rPr>
-            <w:rFonts w:ascii="Cambria Math" w:hAnsi="Cambria Math" w:cs="Times"/>
-            <w:sz w:val="24"/>
-            <w:szCs w:val="24"/>
-          </w:rPr>
-          <m:t>O</m:t>
-        </m:r>
-        <m:d>
-          <m:dPr>
-            <m:ctrlPr>
-              <w:rPr>
-                <w:rFonts w:ascii="Cambria Math" w:hAnsi="Times" w:cs="Times"/>
-                <w:i/>
-                <w:sz w:val="24"/>
-                <w:szCs w:val="24"/>
-              </w:rPr>
-            </m:ctrlPr>
-          </m:dPr>
-          <m:e>
-            <m:r>
-              <w:rPr>
-                <w:rFonts w:ascii="Cambria Math" w:hAnsi="Cambria Math" w:cs="Times"/>
-                <w:sz w:val="24"/>
-                <w:szCs w:val="24"/>
-              </w:rPr>
-              <m:t>n</m:t>
-            </m:r>
-          </m:e>
-        </m:d>
-      </m:oMath>
-      <w:r>
-        <w:rPr>
-          <w:rFonts w:ascii="Times" w:eastAsiaTheme="minorEastAsia" w:hAnsi="Times" w:cs="Times"/>
-          <w:sz w:val="24"/>
-          <w:szCs w:val="24"/>
-        </w:rPr>
-        <w:t>,</w:t>
-      </w:r>
-      <w:r>
-        <w:rPr>
-          <w:rFonts w:ascii="Times" w:eastAsiaTheme="minorEastAsia" w:hAnsi="Times" w:cs="Times"/>
-          <w:sz w:val="24"/>
-          <w:szCs w:val="24"/>
-        </w:rPr>
-        <w:t xml:space="preserve"> pois a sua complexidade de espaço dependerá da quantidade</w:t>
-      </w:r>
-      <w:r>
-        <w:rPr>
-          <w:rFonts w:ascii="Times" w:eastAsiaTheme="minorEastAsia" w:hAnsi="Times" w:cs="Times"/>
-          <w:sz w:val="24"/>
-          <w:szCs w:val="24"/>
-        </w:rPr>
-        <w:t xml:space="preserve"> de</w:t>
-      </w:r>
-      <w:r>
-        <w:rPr>
-          <w:rFonts w:ascii="Times" w:eastAsiaTheme="minorEastAsia" w:hAnsi="Times" w:cs="Times"/>
-          <w:sz w:val="24"/>
-          <w:szCs w:val="24"/>
-        </w:rPr>
-        <w:t xml:space="preserve"> </w:t>
+      <w:r>
+        <w:rPr>
+          <w:rFonts w:ascii="Times" w:eastAsiaTheme="minorEastAsia" w:hAnsi="Times" w:cs="Times"/>
+          <w:sz w:val="24"/>
+          <w:szCs w:val="24"/>
+        </w:rPr>
+        <w:t xml:space="preserve">, pois a sua complexidade de espaço dependerá da quantidade de </w:t>
       </w:r>
       <m:oMath>
         <m:r>
@@ -3252,24 +3015,24 @@
           <w:sz w:val="24"/>
           <w:szCs w:val="24"/>
         </w:rPr>
-        <w:t xml:space="preserve"> elementos</w:t>
-      </w:r>
-      <w:r>
-        <w:rPr>
-          <w:rFonts w:ascii="Times" w:eastAsiaTheme="minorEastAsia" w:hAnsi="Times" w:cs="Times"/>
-          <w:sz w:val="24"/>
-          <w:szCs w:val="24"/>
-        </w:rPr>
-        <w:t>.</w:t>
-      </w:r>
-      <w:r>
-        <w:rPr>
-          <w:rFonts w:ascii="Times" w:eastAsiaTheme="minorEastAsia" w:hAnsi="Times" w:cs="Times"/>
-          <w:sz w:val="24"/>
-          <w:szCs w:val="24"/>
-        </w:rPr>
-        <w:t xml:space="preserve"> O procedimento </w:t>
-      </w:r>
+        <w:t xml:space="preserve"> elementos.</w:t>
+      </w:r>
+    </w:p>
+    <w:p>
+      <w:pPr>
+        <w:pStyle w:val="PargrafodaLista"/>
+        <w:numPr>
+          <w:ilvl w:val="0"/>
+          <w:numId w:val="4"/>
+        </w:numPr>
+        <w:spacing w:line="480" w:lineRule="auto"/>
+        <w:jc w:val="both"/>
+        <w:rPr>
+          <w:rFonts w:ascii="Times" w:eastAsiaTheme="minorEastAsia" w:hAnsi="Times" w:cs="Times"/>
+          <w:sz w:val="24"/>
+          <w:szCs w:val="24"/>
+        </w:rPr>
+      </w:pPr>
       <w:proofErr w:type="spellStart"/>
       <w:r>
         <w:rPr>
@@ -3286,15 +3049,128 @@
           <w:sz w:val="24"/>
           <w:szCs w:val="24"/>
         </w:rPr>
-        <w:t xml:space="preserve"> vale</w:t>
-      </w:r>
-      <w:r>
-        <w:rPr>
-          <w:rFonts w:ascii="Times" w:eastAsiaTheme="minorEastAsia" w:hAnsi="Times" w:cs="Times"/>
-          <w:sz w:val="24"/>
-          <w:szCs w:val="24"/>
-        </w:rPr>
-        <w:t xml:space="preserve"> </w:t>
+        <w:t>:</w:t>
+      </w:r>
+    </w:p>
+    <w:p>
+      <w:pPr>
+        <w:pStyle w:val="PargrafodaLista"/>
+        <w:spacing w:line="480" w:lineRule="auto"/>
+        <w:ind w:left="1080"/>
+        <w:jc w:val="both"/>
+        <w:rPr>
+          <w:rFonts w:ascii="Times" w:eastAsiaTheme="minorEastAsia" w:hAnsi="Times" w:cs="Times"/>
+          <w:sz w:val="24"/>
+          <w:szCs w:val="24"/>
+        </w:rPr>
+      </w:pPr>
+      <m:oMathPara>
+        <m:oMath>
+          <m:r>
+            <w:rPr>
+              <w:rFonts w:ascii="Cambria Math" w:hAnsi="Cambria Math" w:cs="Times"/>
+              <w:sz w:val="24"/>
+              <w:szCs w:val="24"/>
+            </w:rPr>
+            <m:t>O</m:t>
+          </m:r>
+          <m:r>
+            <w:rPr>
+              <w:rFonts w:ascii="Cambria Math" w:hAnsi="Times" w:cs="Times"/>
+              <w:sz w:val="24"/>
+              <w:szCs w:val="24"/>
+            </w:rPr>
+            <m:t>(</m:t>
+          </m:r>
+          <m:func>
+            <m:funcPr>
+              <m:ctrlPr>
+                <w:rPr>
+                  <w:rFonts w:ascii="Cambria Math" w:hAnsi="Times" w:cs="Times"/>
+                  <w:i/>
+                  <w:sz w:val="24"/>
+                  <w:szCs w:val="24"/>
+                </w:rPr>
+              </m:ctrlPr>
+            </m:funcPr>
+            <m:fName>
+              <m:r>
+                <m:rPr>
+                  <m:sty m:val="p"/>
+                </m:rPr>
+                <w:rPr>
+                  <w:rFonts w:ascii="Cambria Math" w:hAnsi="Times" w:cs="Times"/>
+                  <w:sz w:val="24"/>
+                  <w:szCs w:val="24"/>
+                </w:rPr>
+                <m:t>log</m:t>
+              </m:r>
+            </m:fName>
+            <m:e>
+              <m:r>
+                <w:rPr>
+                  <w:rFonts w:ascii="Cambria Math" w:hAnsi="Times" w:cs="Times"/>
+                  <w:sz w:val="24"/>
+                  <w:szCs w:val="24"/>
+                </w:rPr>
+                <m:t>n)</m:t>
+              </m:r>
+              <m:r>
+                <w:rPr>
+                  <w:rFonts w:ascii="Cambria Math" w:hAnsi="Times" w:cs="Times"/>
+                  <w:sz w:val="24"/>
+                  <w:szCs w:val="24"/>
+                </w:rPr>
+                <m:t>*</m:t>
+              </m:r>
+              <m:r>
+                <w:rPr>
+                  <w:rFonts w:ascii="Cambria Math" w:hAnsi="Times" w:cs="Times"/>
+                  <w:sz w:val="24"/>
+                  <w:szCs w:val="24"/>
+                </w:rPr>
+                <m:t>n</m:t>
+              </m:r>
+            </m:e>
+          </m:func>
+        </m:oMath>
+      </m:oMathPara>
+    </w:p>
+    <w:p>
+      <w:pPr>
+        <w:spacing w:line="480" w:lineRule="auto"/>
+        <w:jc w:val="both"/>
+        <w:rPr>
+          <w:rFonts w:ascii="Times" w:eastAsiaTheme="minorEastAsia" w:hAnsi="Times" w:cs="Times"/>
+          <w:sz w:val="24"/>
+          <w:szCs w:val="24"/>
+        </w:rPr>
+      </w:pPr>
+      <w:r>
+        <w:rPr>
+          <w:rFonts w:ascii="Times" w:eastAsiaTheme="minorEastAsia" w:hAnsi="Times" w:cs="Times"/>
+          <w:sz w:val="24"/>
+          <w:szCs w:val="24"/>
+        </w:rPr>
+        <w:t xml:space="preserve">O procedimento </w:t>
+      </w:r>
+      <w:proofErr w:type="spellStart"/>
+      <w:r>
+        <w:rPr>
+          <w:rFonts w:ascii="Times" w:eastAsiaTheme="minorEastAsia" w:hAnsi="Times" w:cs="Times"/>
+          <w:sz w:val="24"/>
+          <w:szCs w:val="24"/>
+        </w:rPr>
+        <w:t>Heapify</w:t>
+      </w:r>
+      <w:proofErr w:type="spellEnd"/>
+      <w:r>
+        <w:rPr>
+          <w:rFonts w:ascii="Times" w:eastAsiaTheme="minorEastAsia" w:hAnsi="Times" w:cs="Times"/>
+          <w:sz w:val="24"/>
+          <w:szCs w:val="24"/>
+        </w:rPr>
+        <w:t xml:space="preserve"> vale </w:t>
       </w:r>
       <m:oMath>
         <m:r>
@@ -3357,63 +3233,7 @@
           <w:sz w:val="24"/>
           <w:szCs w:val="24"/>
         </w:rPr>
-        <w:t xml:space="preserve">, </w:t>
-      </w:r>
-      <w:r>
-        <w:rPr>
-          <w:rFonts w:ascii="Times" w:eastAsiaTheme="minorEastAsia" w:hAnsi="Times" w:cs="Times"/>
-          <w:sz w:val="24"/>
-          <w:szCs w:val="24"/>
-        </w:rPr>
-        <w:t>mas as suas repetições depende</w:t>
-      </w:r>
-      <w:r>
-        <w:rPr>
-          <w:rFonts w:ascii="Times" w:eastAsiaTheme="minorEastAsia" w:hAnsi="Times" w:cs="Times"/>
-          <w:sz w:val="24"/>
-          <w:szCs w:val="24"/>
-        </w:rPr>
-        <w:t>m</w:t>
-      </w:r>
-      <w:r>
-        <w:rPr>
-          <w:rFonts w:ascii="Times" w:eastAsiaTheme="minorEastAsia" w:hAnsi="Times" w:cs="Times"/>
-          <w:sz w:val="24"/>
-          <w:szCs w:val="24"/>
-        </w:rPr>
-        <w:t xml:space="preserve"> da q</w:t>
-      </w:r>
-      <w:r>
-        <w:rPr>
-          <w:rFonts w:ascii="Times" w:eastAsiaTheme="minorEastAsia" w:hAnsi="Times" w:cs="Times"/>
-          <w:sz w:val="24"/>
-          <w:szCs w:val="24"/>
-        </w:rPr>
-        <w:t>ua</w:t>
-      </w:r>
-      <w:r>
-        <w:rPr>
-          <w:rFonts w:ascii="Times" w:eastAsiaTheme="minorEastAsia" w:hAnsi="Times" w:cs="Times"/>
-          <w:sz w:val="24"/>
-          <w:szCs w:val="24"/>
-        </w:rPr>
-        <w:t>nt</w:t>
-      </w:r>
-      <w:r>
-        <w:rPr>
-          <w:rFonts w:ascii="Times" w:eastAsiaTheme="minorEastAsia" w:hAnsi="Times" w:cs="Times"/>
-          <w:sz w:val="24"/>
-          <w:szCs w:val="24"/>
-        </w:rPr>
-        <w:t>ida</w:t>
-      </w:r>
-      <w:r>
-        <w:rPr>
-          <w:rFonts w:ascii="Times" w:eastAsiaTheme="minorEastAsia" w:hAnsi="Times" w:cs="Times"/>
-          <w:sz w:val="24"/>
-          <w:szCs w:val="24"/>
-        </w:rPr>
-        <w:t xml:space="preserve">de de </w:t>
+        <w:t xml:space="preserve">, mas as suas repetições dependem da quantidade de </w:t>
       </w:r>
       <m:oMath>
         <m:r>
@@ -3431,23 +3251,7 @@
           <w:sz w:val="24"/>
           <w:szCs w:val="24"/>
         </w:rPr>
-        <w:t xml:space="preserve"> elementos</w:t>
-      </w:r>
-      <w:r>
-        <w:rPr>
-          <w:rFonts w:ascii="Times" w:eastAsiaTheme="minorEastAsia" w:hAnsi="Times" w:cs="Times"/>
-          <w:sz w:val="24"/>
-          <w:szCs w:val="24"/>
-        </w:rPr>
-        <w:t xml:space="preserve">, logo </w:t>
-      </w:r>
-      <w:r>
-        <w:rPr>
-          <w:rFonts w:ascii="Times" w:eastAsiaTheme="minorEastAsia" w:hAnsi="Times" w:cs="Times"/>
-          <w:sz w:val="24"/>
-          <w:szCs w:val="24"/>
-        </w:rPr>
-        <w:t xml:space="preserve">a multiplicação </w:t>
+        <w:t xml:space="preserve"> elementos, logo a multiplicação </w:t>
       </w:r>
       <m:oMath>
         <m:r>
@@ -3601,7 +3405,181 @@
           <w:sz w:val="24"/>
           <w:szCs w:val="24"/>
         </w:rPr>
-        <w:t xml:space="preserve">. O procedimento Swap, em si, </w:t>
+        <w:t>.</w:t>
+      </w:r>
+    </w:p>
+    <w:p>
+      <w:pPr>
+        <w:pStyle w:val="PargrafodaLista"/>
+        <w:numPr>
+          <w:ilvl w:val="0"/>
+          <w:numId w:val="4"/>
+        </w:numPr>
+        <w:spacing w:line="480" w:lineRule="auto"/>
+        <w:jc w:val="both"/>
+        <w:rPr>
+          <w:rFonts w:ascii="Times" w:eastAsiaTheme="minorEastAsia" w:hAnsi="Times" w:cs="Times"/>
+          <w:sz w:val="24"/>
+          <w:szCs w:val="24"/>
+        </w:rPr>
+      </w:pPr>
+      <w:r>
+        <w:rPr>
+          <w:rFonts w:ascii="Times" w:eastAsiaTheme="minorEastAsia" w:hAnsi="Times" w:cs="Times"/>
+          <w:sz w:val="24"/>
+          <w:szCs w:val="24"/>
+        </w:rPr>
+        <w:t xml:space="preserve">Swap: </w:t>
+      </w:r>
+      <m:oMath>
+        <m:r>
+          <w:rPr>
+            <w:rFonts w:ascii="Cambria Math" w:hAnsi="Cambria Math" w:cs="Times"/>
+            <w:sz w:val="24"/>
+            <w:szCs w:val="24"/>
+          </w:rPr>
+          <m:t>O</m:t>
+        </m:r>
+        <m:d>
+          <m:dPr>
+            <m:ctrlPr>
+              <w:rPr>
+                <w:rFonts w:ascii="Cambria Math" w:hAnsi="Times" w:cs="Times"/>
+                <w:i/>
+                <w:sz w:val="24"/>
+                <w:szCs w:val="24"/>
+              </w:rPr>
+            </m:ctrlPr>
+          </m:dPr>
+          <m:e>
+            <m:r>
+              <w:rPr>
+                <w:rFonts w:ascii="Cambria Math" w:hAnsi="Times" w:cs="Times"/>
+                <w:sz w:val="24"/>
+                <w:szCs w:val="24"/>
+              </w:rPr>
+              <m:t>1</m:t>
+            </m:r>
+          </m:e>
+        </m:d>
+        <m:r>
+          <w:rPr>
+            <w:rFonts w:ascii="Cambria Math" w:hAnsi="Times" w:cs="Times"/>
+            <w:sz w:val="24"/>
+            <w:szCs w:val="24"/>
+          </w:rPr>
+          <m:t>→</m:t>
+        </m:r>
+        <m:r>
+          <w:rPr>
+            <w:rFonts w:ascii="Cambria Math" w:hAnsi="Times" w:cs="Times"/>
+            <w:sz w:val="24"/>
+            <w:szCs w:val="24"/>
+          </w:rPr>
+          <m:t>O</m:t>
+        </m:r>
+        <m:d>
+          <m:dPr>
+            <m:ctrlPr>
+              <w:rPr>
+                <w:rFonts w:ascii="Cambria Math" w:hAnsi="Times" w:cs="Times"/>
+                <w:i/>
+                <w:sz w:val="24"/>
+                <w:szCs w:val="24"/>
+              </w:rPr>
+            </m:ctrlPr>
+          </m:dPr>
+          <m:e>
+            <m:r>
+              <w:rPr>
+                <w:rFonts w:ascii="Cambria Math" w:hAnsi="Times" w:cs="Times"/>
+                <w:sz w:val="24"/>
+                <w:szCs w:val="24"/>
+              </w:rPr>
+              <m:t>1</m:t>
+            </m:r>
+          </m:e>
+        </m:d>
+        <m:r>
+          <w:rPr>
+            <w:rFonts w:ascii="Cambria Math" w:hAnsi="Times" w:cs="Times"/>
+            <w:sz w:val="24"/>
+            <w:szCs w:val="24"/>
+          </w:rPr>
+          <m:t>→</m:t>
+        </m:r>
+        <m:r>
+          <w:rPr>
+            <w:rFonts w:ascii="Cambria Math" w:hAnsi="Times" w:cs="Times"/>
+            <w:sz w:val="24"/>
+            <w:szCs w:val="24"/>
+          </w:rPr>
+          <m:t>O(</m:t>
+        </m:r>
+        <m:func>
+          <m:funcPr>
+            <m:ctrlPr>
+              <w:rPr>
+                <w:rFonts w:ascii="Cambria Math" w:hAnsi="Times" w:cs="Times"/>
+                <w:i/>
+                <w:sz w:val="24"/>
+                <w:szCs w:val="24"/>
+              </w:rPr>
+            </m:ctrlPr>
+          </m:funcPr>
+          <m:fName>
+            <m:r>
+              <m:rPr>
+                <m:sty m:val="p"/>
+              </m:rPr>
+              <w:rPr>
+                <w:rFonts w:ascii="Cambria Math" w:hAnsi="Times" w:cs="Times"/>
+                <w:sz w:val="24"/>
+                <w:szCs w:val="24"/>
+              </w:rPr>
+              <m:t>log</m:t>
+            </m:r>
+          </m:fName>
+          <m:e>
+            <m:r>
+              <w:rPr>
+                <w:rFonts w:ascii="Cambria Math" w:hAnsi="Times" w:cs="Times"/>
+                <w:sz w:val="24"/>
+                <w:szCs w:val="24"/>
+              </w:rPr>
+              <m:t>n</m:t>
+            </m:r>
+            <w:proofErr w:type="gramStart"/>
+            <m:r>
+              <w:rPr>
+                <w:rFonts w:ascii="Cambria Math" w:hAnsi="Times" w:cs="Times"/>
+                <w:sz w:val="24"/>
+                <w:szCs w:val="24"/>
+              </w:rPr>
+              <m:t>)</m:t>
+            </m:r>
+            <w:proofErr w:type="gramEnd"/>
+          </m:e>
+        </m:func>
+      </m:oMath>
+    </w:p>
+    <w:p>
+      <w:pPr>
+        <w:spacing w:line="480" w:lineRule="auto"/>
+        <w:jc w:val="both"/>
+        <w:rPr>
+          <w:rFonts w:ascii="Times" w:eastAsiaTheme="minorEastAsia" w:hAnsi="Times" w:cs="Times"/>
+          <w:sz w:val="24"/>
+          <w:szCs w:val="24"/>
+        </w:rPr>
+      </w:pPr>
+      <w:r>
+        <w:rPr>
+          <w:rFonts w:ascii="Times" w:eastAsiaTheme="minorEastAsia" w:hAnsi="Times" w:cs="Times"/>
+          <w:sz w:val="24"/>
+          <w:szCs w:val="24"/>
+        </w:rPr>
+        <w:t xml:space="preserve">O procedimento Swap, em si, </w:t>
       </w:r>
       <w:r>
         <w:rPr>
@@ -3779,7 +3757,16 @@
           <w:sz w:val="24"/>
           <w:szCs w:val="24"/>
         </w:rPr>
-        <w:t xml:space="preserve">o tamanho do </w:t>
+        <w:t xml:space="preserve">o </w:t>
+      </w:r>
+      <w:r>
+        <w:rPr>
+          <w:rFonts w:ascii="Times" w:eastAsiaTheme="minorEastAsia" w:hAnsi="Times" w:cs="Times"/>
+          <w:sz w:val="24"/>
+          <w:szCs w:val="24"/>
+        </w:rPr>
+        <w:lastRenderedPageBreak/>
+        <w:t xml:space="preserve">tamanho do </w:t>
       </w:r>
       <w:proofErr w:type="spellStart"/>
       <w:r>
@@ -3805,7 +3792,7 @@
           <w:sz w:val="24"/>
           <w:szCs w:val="24"/>
         </w:rPr>
-        <w:t xml:space="preserve">devido </w:t>
+        <w:t xml:space="preserve">por </w:t>
       </w:r>
       <w:proofErr w:type="gramStart"/>
       <w:r>
@@ -3814,7 +3801,7 @@
           <w:sz w:val="24"/>
           <w:szCs w:val="24"/>
         </w:rPr>
-        <w:t>a</w:t>
+        <w:t>1</w:t>
       </w:r>
       <w:proofErr w:type="gramEnd"/>
       <w:r>
@@ -3823,7 +3810,15 @@
           <w:sz w:val="24"/>
           <w:szCs w:val="24"/>
         </w:rPr>
-        <w:t xml:space="preserve"> remoção do maior elemento</w:t>
+        <w:t xml:space="preserve"> </w:t>
+      </w:r>
+      <w:r>
+        <w:rPr>
+          <w:rFonts w:ascii="Times" w:eastAsiaTheme="minorEastAsia" w:hAnsi="Times" w:cs="Times"/>
+          <w:sz w:val="24"/>
+          <w:szCs w:val="24"/>
+        </w:rPr>
+        <w:t>devido a remoção do maior elemento</w:t>
       </w:r>
       <w:r>
         <w:rPr>
@@ -3872,7 +3867,15 @@
           <w:sz w:val="24"/>
           <w:szCs w:val="24"/>
         </w:rPr>
-        <w:t>heapify</w:t>
+        <w:t>H</w:t>
+      </w:r>
+      <w:r>
+        <w:rPr>
+          <w:rFonts w:ascii="Times" w:eastAsiaTheme="minorEastAsia" w:hAnsi="Times" w:cs="Times"/>
+          <w:sz w:val="24"/>
+          <w:szCs w:val="24"/>
+        </w:rPr>
+        <w:t>eapify</w:t>
       </w:r>
       <w:proofErr w:type="spellEnd"/>
       <w:r>
@@ -4022,16 +4025,7 @@
           <w:sz w:val="24"/>
           <w:szCs w:val="24"/>
         </w:rPr>
-        <w:t xml:space="preserve"> e concedido a sua </w:t>
-      </w:r>
-      <w:r>
-        <w:rPr>
-          <w:rFonts w:ascii="Times" w:eastAsiaTheme="minorEastAsia" w:hAnsi="Times" w:cs="Times"/>
-          <w:sz w:val="24"/>
-          <w:szCs w:val="24"/>
-        </w:rPr>
-        <w:lastRenderedPageBreak/>
-        <w:t>posição com o elemento-filho com o maior valor</w:t>
+        <w:t xml:space="preserve"> e concedido a sua posição com o elemento-filho com o maior valor</w:t>
       </w:r>
       <w:r>
         <w:rPr>
@@ -4073,7 +4067,23 @@
           <w:sz w:val="24"/>
           <w:szCs w:val="24"/>
         </w:rPr>
-        <w:t>(ultimo elemento)</w:t>
+        <w:t>(ultimo elemento</w:t>
+      </w:r>
+      <w:r>
+        <w:rPr>
+          <w:rFonts w:ascii="Times" w:eastAsiaTheme="minorEastAsia" w:hAnsi="Times" w:cs="Times"/>
+          <w:sz w:val="24"/>
+          <w:szCs w:val="24"/>
+        </w:rPr>
+        <w:t>)</w:t>
+      </w:r>
+      <w:r>
+        <w:rPr>
+          <w:rFonts w:ascii="Times" w:eastAsiaTheme="minorEastAsia" w:hAnsi="Times" w:cs="Times"/>
+          <w:sz w:val="24"/>
+          <w:szCs w:val="24"/>
+        </w:rPr>
+        <w:t>)</w:t>
       </w:r>
       <w:r>
         <w:rPr>
@@ -4095,26 +4105,1799 @@
     <w:p>
       <w:pPr>
         <w:spacing w:line="480" w:lineRule="auto"/>
-        <w:ind w:left="720"/>
-        <w:rPr>
-          <w:rFonts w:ascii="Times" w:eastAsiaTheme="minorEastAsia" w:hAnsi="Times" w:cs="Times"/>
-          <w:sz w:val="24"/>
-          <w:szCs w:val="24"/>
-        </w:rPr>
-      </w:pPr>
-      <w:r>
-        <w:rPr>
-          <w:rFonts w:ascii="Times" w:eastAsiaTheme="minorEastAsia" w:hAnsi="Times" w:cs="Times"/>
-          <w:sz w:val="24"/>
-          <w:szCs w:val="24"/>
-        </w:rPr>
-        <w:t>Teremos o seguinte cálculo:</w:t>
+        <w:jc w:val="both"/>
+        <w:rPr>
+          <w:rFonts w:ascii="Times" w:eastAsiaTheme="minorEastAsia" w:hAnsi="Times" w:cs="Times"/>
+          <w:sz w:val="24"/>
+          <w:szCs w:val="24"/>
+        </w:rPr>
+      </w:pPr>
+      <w:r>
+        <w:rPr>
+          <w:rFonts w:ascii="Times" w:eastAsiaTheme="minorEastAsia" w:hAnsi="Times" w:cs="Times"/>
+          <w:sz w:val="24"/>
+          <w:szCs w:val="24"/>
+        </w:rPr>
+        <w:t xml:space="preserve">Contudo, o que fará a sua </w:t>
+      </w:r>
+      <w:r>
+        <w:rPr>
+          <w:rFonts w:ascii="Times" w:eastAsiaTheme="minorEastAsia" w:hAnsi="Times" w:cs="Times"/>
+          <w:sz w:val="24"/>
+          <w:szCs w:val="24"/>
+        </w:rPr>
+        <w:t>complexidade resultar em</w:t>
+      </w:r>
+      <w:r>
+        <w:rPr>
+          <w:rFonts w:ascii="Times" w:eastAsiaTheme="minorEastAsia" w:hAnsi="Times" w:cs="Times"/>
+          <w:sz w:val="24"/>
+          <w:szCs w:val="24"/>
+        </w:rPr>
+        <w:t xml:space="preserve"> </w:t>
+      </w:r>
+      <m:oMath>
+        <m:r>
+          <w:rPr>
+            <w:rFonts w:ascii="Cambria Math" w:eastAsiaTheme="minorEastAsia" w:hAnsi="Cambria Math" w:cs="Times"/>
+            <w:sz w:val="24"/>
+            <w:szCs w:val="24"/>
+          </w:rPr>
+          <m:t>O</m:t>
+        </m:r>
+        <m:r>
+          <m:rPr>
+            <m:sty m:val="p"/>
+          </m:rPr>
+          <w:rPr>
+            <w:rFonts w:ascii="Cambria Math" w:eastAsiaTheme="minorEastAsia" w:hAnsi="Cambria Math" w:cs="Times"/>
+            <w:sz w:val="24"/>
+            <w:szCs w:val="24"/>
+          </w:rPr>
+          <m:t>(</m:t>
+        </m:r>
+        <m:func>
+          <m:funcPr>
+            <m:ctrlPr>
+              <w:rPr>
+                <w:rFonts w:ascii="Cambria Math" w:eastAsiaTheme="minorEastAsia" w:hAnsi="Cambria Math" w:cs="Times"/>
+                <w:sz w:val="24"/>
+                <w:szCs w:val="24"/>
+              </w:rPr>
+            </m:ctrlPr>
+          </m:funcPr>
+          <m:fName>
+            <m:r>
+              <m:rPr>
+                <m:sty m:val="p"/>
+              </m:rPr>
+              <w:rPr>
+                <w:rFonts w:ascii="Cambria Math" w:eastAsiaTheme="minorEastAsia" w:hAnsi="Cambria Math" w:cs="Times"/>
+                <w:sz w:val="24"/>
+                <w:szCs w:val="24"/>
+              </w:rPr>
+              <m:t>log</m:t>
+            </m:r>
+          </m:fName>
+          <m:e>
+            <m:r>
+              <w:rPr>
+                <w:rFonts w:ascii="Cambria Math" w:eastAsiaTheme="minorEastAsia" w:hAnsi="Cambria Math" w:cs="Times"/>
+                <w:sz w:val="24"/>
+                <w:szCs w:val="24"/>
+              </w:rPr>
+              <m:t>n</m:t>
+            </m:r>
+            <w:proofErr w:type="gramStart"/>
+            <m:r>
+              <m:rPr>
+                <m:sty m:val="p"/>
+              </m:rPr>
+              <w:rPr>
+                <w:rFonts w:ascii="Cambria Math" w:eastAsiaTheme="minorEastAsia" w:hAnsi="Cambria Math" w:cs="Times"/>
+                <w:sz w:val="24"/>
+                <w:szCs w:val="24"/>
+              </w:rPr>
+              <m:t>)</m:t>
+            </m:r>
+            <w:proofErr w:type="gramEnd"/>
+          </m:e>
+        </m:func>
+      </m:oMath>
+      <w:r>
+        <w:rPr>
+          <w:rFonts w:ascii="Times" w:eastAsiaTheme="minorEastAsia" w:hAnsi="Times" w:cs="Times"/>
+          <w:sz w:val="24"/>
+          <w:szCs w:val="24"/>
+        </w:rPr>
+        <w:t xml:space="preserve"> é </w:t>
+      </w:r>
+      <w:r>
+        <w:rPr>
+          <w:rFonts w:ascii="Times" w:eastAsiaTheme="minorEastAsia" w:hAnsi="Times" w:cs="Times"/>
+          <w:sz w:val="24"/>
+          <w:szCs w:val="24"/>
+        </w:rPr>
+        <w:t>que ao considerar</w:t>
+      </w:r>
+      <w:r>
+        <w:rPr>
+          <w:rFonts w:ascii="Times" w:eastAsiaTheme="minorEastAsia" w:hAnsi="Times" w:cs="Times"/>
+          <w:sz w:val="24"/>
+          <w:szCs w:val="24"/>
+        </w:rPr>
+        <w:t>:</w:t>
       </w:r>
     </w:p>
     <w:p>
       <w:pPr>
+        <w:pStyle w:val="PargrafodaLista"/>
+        <w:numPr>
+          <w:ilvl w:val="1"/>
+          <w:numId w:val="4"/>
+        </w:numPr>
+        <w:spacing w:line="480" w:lineRule="auto"/>
+        <w:jc w:val="both"/>
+        <w:rPr>
+          <w:rFonts w:ascii="Times" w:eastAsiaTheme="minorEastAsia" w:hAnsi="Times" w:cs="Times"/>
+          <w:sz w:val="24"/>
+          <w:szCs w:val="24"/>
+        </w:rPr>
+      </w:pPr>
+      <w:r>
+        <w:rPr>
+          <w:rFonts w:ascii="Times" w:eastAsiaTheme="minorEastAsia" w:hAnsi="Times" w:cs="Times"/>
+          <w:iCs/>
+          <w:sz w:val="24"/>
+          <w:szCs w:val="24"/>
+        </w:rPr>
+        <w:t>//</w:t>
+      </w:r>
+      <w:r>
+        <w:rPr>
+          <w:rFonts w:ascii="Times" w:eastAsiaTheme="minorEastAsia" w:hAnsi="Times" w:cs="Times"/>
+          <w:iCs/>
+          <w:sz w:val="24"/>
+          <w:szCs w:val="24"/>
+        </w:rPr>
+        <w:t xml:space="preserve">As </w:t>
+      </w:r>
+      <m:oMath>
+        <m:r>
+          <w:rPr>
+            <w:rFonts w:ascii="Cambria Math" w:eastAsiaTheme="minorEastAsia" w:hAnsi="Cambria Math" w:cs="Times"/>
+            <w:sz w:val="24"/>
+            <w:szCs w:val="24"/>
+          </w:rPr>
+          <m:t>n</m:t>
+        </m:r>
+        <m:r>
+          <m:rPr>
+            <m:sty m:val="p"/>
+          </m:rPr>
+          <w:rPr>
+            <w:rFonts w:ascii="Cambria Math" w:eastAsiaTheme="minorEastAsia" w:hAnsi="Cambria Math" w:cs="Times"/>
+            <w:sz w:val="24"/>
+            <w:szCs w:val="24"/>
+          </w:rPr>
+          <m:t xml:space="preserve"> </m:t>
+        </m:r>
+      </m:oMath>
+      <w:r>
+        <w:rPr>
+          <w:rFonts w:ascii="Times" w:eastAsiaTheme="minorEastAsia" w:hAnsi="Times" w:cs="Times"/>
+          <w:sz w:val="24"/>
+          <w:szCs w:val="24"/>
+        </w:rPr>
+        <w:t>remoções</w:t>
+      </w:r>
+      <w:r>
+        <w:rPr>
+          <w:rFonts w:ascii="Times" w:eastAsiaTheme="minorEastAsia" w:hAnsi="Times" w:cs="Times"/>
+          <w:sz w:val="24"/>
+          <w:szCs w:val="24"/>
+        </w:rPr>
+        <w:t xml:space="preserve"> de elementos</w:t>
+      </w:r>
+      <w:r>
+        <w:rPr>
+          <w:rFonts w:ascii="Times" w:eastAsiaTheme="minorEastAsia" w:hAnsi="Times" w:cs="Times"/>
+          <w:sz w:val="24"/>
+          <w:szCs w:val="24"/>
+        </w:rPr>
+        <w:t xml:space="preserve"> </w:t>
+      </w:r>
+      <w:r>
+        <w:rPr>
+          <w:rFonts w:ascii="Times" w:eastAsiaTheme="minorEastAsia" w:hAnsi="Times" w:cs="Times"/>
+          <w:sz w:val="24"/>
+          <w:szCs w:val="24"/>
+        </w:rPr>
+        <w:t xml:space="preserve">(que </w:t>
+      </w:r>
+      <w:r>
+        <w:rPr>
+          <w:rFonts w:ascii="Times" w:eastAsiaTheme="minorEastAsia" w:hAnsi="Times" w:cs="Times"/>
+          <w:sz w:val="24"/>
+          <w:szCs w:val="24"/>
+        </w:rPr>
+        <w:t>diminuem</w:t>
+      </w:r>
+      <w:r>
+        <w:rPr>
+          <w:rFonts w:ascii="Times" w:eastAsiaTheme="minorEastAsia" w:hAnsi="Times" w:cs="Times"/>
+          <w:sz w:val="24"/>
+          <w:szCs w:val="24"/>
+        </w:rPr>
+        <w:t xml:space="preserve"> o </w:t>
+      </w:r>
+      <w:proofErr w:type="spellStart"/>
+      <w:r>
+        <w:rPr>
+          <w:rFonts w:ascii="Times" w:eastAsiaTheme="minorEastAsia" w:hAnsi="Times" w:cs="Times"/>
+          <w:sz w:val="24"/>
+          <w:szCs w:val="24"/>
+        </w:rPr>
+        <w:t>H</w:t>
+      </w:r>
+      <w:r>
+        <w:rPr>
+          <w:rFonts w:ascii="Times" w:eastAsiaTheme="minorEastAsia" w:hAnsi="Times" w:cs="Times"/>
+          <w:sz w:val="24"/>
+          <w:szCs w:val="24"/>
+        </w:rPr>
+        <w:t>eap</w:t>
+      </w:r>
+      <w:proofErr w:type="spellEnd"/>
+      <w:r>
+        <w:rPr>
+          <w:rFonts w:ascii="Times" w:eastAsiaTheme="minorEastAsia" w:hAnsi="Times" w:cs="Times"/>
+          <w:sz w:val="24"/>
+          <w:szCs w:val="24"/>
+        </w:rPr>
+        <w:t xml:space="preserve"> </w:t>
+      </w:r>
+      <w:r>
+        <w:rPr>
+          <w:rFonts w:ascii="Times" w:eastAsiaTheme="minorEastAsia" w:hAnsi="Times" w:cs="Times"/>
+          <w:sz w:val="24"/>
+          <w:szCs w:val="24"/>
+        </w:rPr>
+        <w:t>gradualmente</w:t>
+      </w:r>
+      <w:r>
+        <w:rPr>
+          <w:rFonts w:ascii="Times" w:eastAsiaTheme="minorEastAsia" w:hAnsi="Times" w:cs="Times"/>
+          <w:sz w:val="24"/>
+          <w:szCs w:val="24"/>
+        </w:rPr>
+        <w:t>)</w:t>
+      </w:r>
+      <w:r>
+        <w:rPr>
+          <w:rFonts w:ascii="Times" w:eastAsiaTheme="minorEastAsia" w:hAnsi="Times" w:cs="Times"/>
+          <w:sz w:val="24"/>
+          <w:szCs w:val="24"/>
+        </w:rPr>
+        <w:t>.</w:t>
+      </w:r>
+      <w:r>
+        <w:rPr>
+          <w:rFonts w:ascii="Times" w:eastAsiaTheme="minorEastAsia" w:hAnsi="Times" w:cs="Times"/>
+          <w:sz w:val="24"/>
+          <w:szCs w:val="24"/>
+        </w:rPr>
+        <w:t xml:space="preserve"> </w:t>
+      </w:r>
+    </w:p>
+    <w:p>
+      <w:pPr>
+        <w:pStyle w:val="PargrafodaLista"/>
+        <w:numPr>
+          <w:ilvl w:val="1"/>
+          <w:numId w:val="4"/>
+        </w:numPr>
+        <w:spacing w:line="480" w:lineRule="auto"/>
+        <w:jc w:val="both"/>
+        <w:rPr>
+          <w:rFonts w:ascii="Times" w:eastAsiaTheme="minorEastAsia" w:hAnsi="Times" w:cs="Times"/>
+          <w:sz w:val="24"/>
+          <w:szCs w:val="24"/>
+        </w:rPr>
+      </w:pPr>
+      <w:r>
+        <w:rPr>
+          <w:rFonts w:ascii="Times" w:eastAsiaTheme="minorEastAsia" w:hAnsi="Times" w:cs="Times"/>
+          <w:sz w:val="24"/>
+          <w:szCs w:val="24"/>
+        </w:rPr>
+        <w:t xml:space="preserve">O </w:t>
+      </w:r>
+      <w:r>
+        <w:rPr>
+          <w:rFonts w:ascii="Times" w:eastAsiaTheme="minorEastAsia" w:hAnsi="Times" w:cs="Times"/>
+          <w:sz w:val="24"/>
+          <w:szCs w:val="24"/>
+        </w:rPr>
+        <w:t>custo para cada Swap</w:t>
+      </w:r>
+      <w:r>
+        <w:rPr>
+          <w:rFonts w:ascii="Times" w:eastAsiaTheme="minorEastAsia" w:hAnsi="Times" w:cs="Times"/>
+          <w:sz w:val="24"/>
+          <w:szCs w:val="24"/>
+        </w:rPr>
+        <w:t>,</w:t>
+      </w:r>
+      <w:r>
+        <w:rPr>
+          <w:rFonts w:ascii="Times" w:eastAsiaTheme="minorEastAsia" w:hAnsi="Times" w:cs="Times"/>
+          <w:sz w:val="24"/>
+          <w:szCs w:val="24"/>
+        </w:rPr>
+        <w:t xml:space="preserve"> em si</w:t>
+      </w:r>
+      <w:r>
+        <w:rPr>
+          <w:rFonts w:ascii="Times" w:eastAsiaTheme="minorEastAsia" w:hAnsi="Times" w:cs="Times"/>
+          <w:sz w:val="24"/>
+          <w:szCs w:val="24"/>
+        </w:rPr>
+        <w:t>, é</w:t>
+      </w:r>
+      <w:r>
+        <w:rPr>
+          <w:rFonts w:ascii="Times" w:eastAsiaTheme="minorEastAsia" w:hAnsi="Times" w:cs="Times"/>
+          <w:sz w:val="24"/>
+          <w:szCs w:val="24"/>
+        </w:rPr>
+        <w:t xml:space="preserve">: </w:t>
+      </w:r>
+      <m:oMath>
+        <m:r>
+          <w:rPr>
+            <w:rFonts w:ascii="Cambria Math" w:eastAsiaTheme="minorEastAsia" w:hAnsi="Cambria Math" w:cs="Times"/>
+            <w:sz w:val="24"/>
+            <w:szCs w:val="24"/>
+          </w:rPr>
+          <m:t>O</m:t>
+        </m:r>
+        <m:d>
+          <m:dPr>
+            <m:ctrlPr>
+              <w:rPr>
+                <w:rFonts w:ascii="Cambria Math" w:eastAsiaTheme="minorEastAsia" w:hAnsi="Cambria Math" w:cs="Times"/>
+                <w:i/>
+                <w:sz w:val="24"/>
+                <w:szCs w:val="24"/>
+              </w:rPr>
+            </m:ctrlPr>
+          </m:dPr>
+          <m:e>
+            <m:r>
+              <w:rPr>
+                <w:rFonts w:ascii="Cambria Math" w:eastAsiaTheme="minorEastAsia" w:hAnsi="Cambria Math" w:cs="Times"/>
+                <w:sz w:val="24"/>
+                <w:szCs w:val="24"/>
+              </w:rPr>
+              <m:t>1</m:t>
+            </m:r>
+          </m:e>
+        </m:d>
+      </m:oMath>
+    </w:p>
+    <w:p>
+      <w:pPr>
+        <w:pStyle w:val="PargrafodaLista"/>
+        <w:numPr>
+          <w:ilvl w:val="1"/>
+          <w:numId w:val="4"/>
+        </w:numPr>
+        <w:spacing w:line="480" w:lineRule="auto"/>
+        <w:jc w:val="both"/>
+        <w:rPr>
+          <w:rFonts w:ascii="Times" w:eastAsiaTheme="minorEastAsia" w:hAnsi="Times" w:cs="Times"/>
+          <w:sz w:val="24"/>
+          <w:szCs w:val="24"/>
+        </w:rPr>
+      </w:pPr>
+      <w:r>
+        <w:rPr>
+          <w:rFonts w:ascii="Times" w:eastAsiaTheme="minorEastAsia" w:hAnsi="Times" w:cs="Times"/>
+          <w:sz w:val="24"/>
+          <w:szCs w:val="24"/>
+        </w:rPr>
+        <w:t xml:space="preserve">E </w:t>
+      </w:r>
+      <w:r>
+        <w:rPr>
+          <w:rFonts w:ascii="Times" w:eastAsiaTheme="minorEastAsia" w:hAnsi="Times" w:cs="Times"/>
+          <w:sz w:val="24"/>
+          <w:szCs w:val="24"/>
+        </w:rPr>
+        <w:t>o peso d</w:t>
+      </w:r>
+      <w:r>
+        <w:rPr>
+          <w:rFonts w:ascii="Times" w:eastAsiaTheme="minorEastAsia" w:hAnsi="Times" w:cs="Times"/>
+          <w:sz w:val="24"/>
+          <w:szCs w:val="24"/>
+        </w:rPr>
+        <w:t>os</w:t>
+      </w:r>
+      <w:r>
+        <w:rPr>
+          <w:rFonts w:ascii="Times" w:eastAsiaTheme="minorEastAsia" w:hAnsi="Times" w:cs="Times"/>
+          <w:sz w:val="24"/>
+          <w:szCs w:val="24"/>
+        </w:rPr>
+        <w:t xml:space="preserve"> procedimento</w:t>
+      </w:r>
+      <w:r>
+        <w:rPr>
+          <w:rFonts w:ascii="Times" w:eastAsiaTheme="minorEastAsia" w:hAnsi="Times" w:cs="Times"/>
+          <w:sz w:val="24"/>
+          <w:szCs w:val="24"/>
+        </w:rPr>
+        <w:t>s</w:t>
+      </w:r>
+      <w:r>
+        <w:rPr>
+          <w:rFonts w:ascii="Times" w:eastAsiaTheme="minorEastAsia" w:hAnsi="Times" w:cs="Times"/>
+          <w:sz w:val="24"/>
+          <w:szCs w:val="24"/>
+        </w:rPr>
+        <w:t xml:space="preserve"> de </w:t>
+      </w:r>
+      <w:proofErr w:type="spellStart"/>
+      <w:r>
+        <w:rPr>
+          <w:rFonts w:ascii="Times" w:eastAsiaTheme="minorEastAsia" w:hAnsi="Times" w:cs="Times"/>
+          <w:i/>
+          <w:sz w:val="24"/>
+          <w:szCs w:val="24"/>
+        </w:rPr>
+        <w:t>sif</w:t>
+      </w:r>
+      <w:r>
+        <w:rPr>
+          <w:rFonts w:ascii="Times" w:eastAsiaTheme="minorEastAsia" w:hAnsi="Times" w:cs="Times"/>
+          <w:i/>
+          <w:sz w:val="24"/>
+          <w:szCs w:val="24"/>
+        </w:rPr>
+        <w:t>t-down</w:t>
+      </w:r>
+      <w:proofErr w:type="spellEnd"/>
+      <w:r>
+        <w:rPr>
+          <w:rFonts w:ascii="Times" w:eastAsiaTheme="minorEastAsia" w:hAnsi="Times" w:cs="Times"/>
+          <w:sz w:val="24"/>
+          <w:szCs w:val="24"/>
+        </w:rPr>
+        <w:t xml:space="preserve"> do </w:t>
+      </w:r>
+      <w:proofErr w:type="spellStart"/>
+      <w:r>
+        <w:rPr>
+          <w:rFonts w:ascii="Times" w:eastAsiaTheme="minorEastAsia" w:hAnsi="Times" w:cs="Times"/>
+          <w:sz w:val="24"/>
+          <w:szCs w:val="24"/>
+        </w:rPr>
+        <w:t>heapify</w:t>
+      </w:r>
+      <w:proofErr w:type="spellEnd"/>
+      <w:r>
+        <w:rPr>
+          <w:rFonts w:ascii="Times" w:eastAsiaTheme="minorEastAsia" w:hAnsi="Times" w:cs="Times"/>
+          <w:sz w:val="24"/>
+          <w:szCs w:val="24"/>
+        </w:rPr>
+        <w:t xml:space="preserve"> para reestruturar o </w:t>
+      </w:r>
+      <w:proofErr w:type="spellStart"/>
+      <w:r>
+        <w:rPr>
+          <w:rFonts w:ascii="Times" w:eastAsiaTheme="minorEastAsia" w:hAnsi="Times" w:cs="Times"/>
+          <w:sz w:val="24"/>
+          <w:szCs w:val="24"/>
+        </w:rPr>
+        <w:t>Heap</w:t>
+      </w:r>
+      <w:proofErr w:type="spellEnd"/>
+      <w:r>
+        <w:rPr>
+          <w:rFonts w:ascii="Times" w:eastAsiaTheme="minorEastAsia" w:hAnsi="Times" w:cs="Times"/>
+          <w:sz w:val="24"/>
+          <w:szCs w:val="24"/>
+        </w:rPr>
+        <w:t xml:space="preserve"> custando: </w:t>
+      </w:r>
+      <m:oMath>
+        <m:r>
+          <w:rPr>
+            <w:rFonts w:ascii="Cambria Math" w:eastAsiaTheme="minorEastAsia" w:hAnsi="Cambria Math" w:cs="Times"/>
+            <w:sz w:val="24"/>
+            <w:szCs w:val="24"/>
+          </w:rPr>
+          <m:t>O</m:t>
+        </m:r>
+        <m:r>
+          <m:rPr>
+            <m:sty m:val="p"/>
+          </m:rPr>
+          <w:rPr>
+            <w:rFonts w:ascii="Cambria Math" w:eastAsiaTheme="minorEastAsia" w:hAnsi="Cambria Math" w:cs="Times"/>
+            <w:sz w:val="24"/>
+            <w:szCs w:val="24"/>
+          </w:rPr>
+          <m:t>(</m:t>
+        </m:r>
+        <m:func>
+          <m:funcPr>
+            <m:ctrlPr>
+              <w:rPr>
+                <w:rFonts w:ascii="Cambria Math" w:eastAsiaTheme="minorEastAsia" w:hAnsi="Cambria Math" w:cs="Times"/>
+                <w:sz w:val="24"/>
+                <w:szCs w:val="24"/>
+              </w:rPr>
+            </m:ctrlPr>
+          </m:funcPr>
+          <m:fName>
+            <m:r>
+              <m:rPr>
+                <m:sty m:val="p"/>
+              </m:rPr>
+              <w:rPr>
+                <w:rFonts w:ascii="Cambria Math" w:eastAsiaTheme="minorEastAsia" w:hAnsi="Cambria Math" w:cs="Times"/>
+                <w:sz w:val="24"/>
+                <w:szCs w:val="24"/>
+              </w:rPr>
+              <m:t>log</m:t>
+            </m:r>
+          </m:fName>
+          <m:e>
+            <m:r>
+              <w:rPr>
+                <w:rFonts w:ascii="Cambria Math" w:eastAsiaTheme="minorEastAsia" w:hAnsi="Cambria Math" w:cs="Times"/>
+                <w:sz w:val="24"/>
+                <w:szCs w:val="24"/>
+              </w:rPr>
+              <m:t>n</m:t>
+            </m:r>
+            <w:proofErr w:type="gramStart"/>
+            <m:r>
+              <m:rPr>
+                <m:sty m:val="p"/>
+              </m:rPr>
+              <w:rPr>
+                <w:rFonts w:ascii="Cambria Math" w:eastAsiaTheme="minorEastAsia" w:hAnsi="Cambria Math" w:cs="Times"/>
+                <w:sz w:val="24"/>
+                <w:szCs w:val="24"/>
+              </w:rPr>
+              <m:t>)</m:t>
+            </m:r>
+            <w:proofErr w:type="gramEnd"/>
+          </m:e>
+        </m:func>
+      </m:oMath>
+      <w:r>
+        <w:rPr>
+          <w:rFonts w:ascii="Times" w:eastAsiaTheme="minorEastAsia" w:hAnsi="Times" w:cs="Times"/>
+          <w:sz w:val="24"/>
+          <w:szCs w:val="24"/>
+        </w:rPr>
+        <w:t>//</w:t>
+      </w:r>
+      <w:r>
+        <w:rPr>
+          <w:rFonts w:ascii="Times" w:eastAsiaTheme="minorEastAsia" w:hAnsi="Times" w:cs="Times"/>
+          <w:sz w:val="24"/>
+          <w:szCs w:val="24"/>
+        </w:rPr>
+        <w:t xml:space="preserve"> após </w:t>
+      </w:r>
+      <m:oMath>
+        <m:r>
+          <w:rPr>
+            <w:rFonts w:ascii="Cambria Math" w:eastAsiaTheme="minorEastAsia" w:hAnsi="Cambria Math" w:cs="Times"/>
+            <w:sz w:val="24"/>
+            <w:szCs w:val="24"/>
+          </w:rPr>
+          <m:t>n</m:t>
+        </m:r>
+        <m:r>
+          <m:rPr>
+            <m:sty m:val="p"/>
+          </m:rPr>
+          <w:rPr>
+            <w:rFonts w:ascii="Cambria Math" w:eastAsiaTheme="minorEastAsia" w:hAnsi="Cambria Math" w:cs="Times"/>
+            <w:sz w:val="24"/>
+            <w:szCs w:val="24"/>
+          </w:rPr>
+          <m:t xml:space="preserve"> </m:t>
+        </m:r>
+      </m:oMath>
+      <w:r>
+        <w:rPr>
+          <w:rFonts w:ascii="Times" w:eastAsiaTheme="minorEastAsia" w:hAnsi="Times" w:cs="Times"/>
+          <w:sz w:val="24"/>
+          <w:szCs w:val="24"/>
+        </w:rPr>
+        <w:t>remoções</w:t>
+      </w:r>
+      <w:r>
+        <w:rPr>
+          <w:rFonts w:ascii="Times" w:eastAsiaTheme="minorEastAsia" w:hAnsi="Times" w:cs="Times"/>
+          <w:sz w:val="24"/>
+          <w:szCs w:val="24"/>
+        </w:rPr>
+        <w:t>.</w:t>
+      </w:r>
+    </w:p>
+    <w:p>
+      <w:pPr>
+        <w:spacing w:line="480" w:lineRule="auto"/>
+        <w:jc w:val="both"/>
+        <w:rPr>
+          <w:rFonts w:ascii="Times" w:eastAsiaTheme="minorEastAsia" w:hAnsi="Times" w:cs="Times"/>
+          <w:sz w:val="24"/>
+          <w:szCs w:val="24"/>
+        </w:rPr>
+      </w:pPr>
+      <w:r>
+        <w:rPr>
+          <w:rFonts w:ascii="Times" w:eastAsiaTheme="minorEastAsia" w:hAnsi="Times" w:cs="Times"/>
+          <w:sz w:val="24"/>
+          <w:szCs w:val="24"/>
+        </w:rPr>
+        <w:t>No fim eliminando a</w:t>
+      </w:r>
+      <w:r>
+        <w:rPr>
+          <w:rFonts w:ascii="Times" w:eastAsiaTheme="minorEastAsia" w:hAnsi="Times" w:cs="Times"/>
+          <w:sz w:val="24"/>
+          <w:szCs w:val="24"/>
+        </w:rPr>
+        <w:t xml:space="preserve">s constantes: </w:t>
+      </w:r>
+      <w:proofErr w:type="gramStart"/>
+      <w:r>
+        <w:rPr>
+          <w:rFonts w:ascii="Times" w:eastAsiaTheme="minorEastAsia" w:hAnsi="Times" w:cs="Times"/>
+          <w:sz w:val="24"/>
+          <w:szCs w:val="24"/>
+        </w:rPr>
+        <w:t>O(</w:t>
+      </w:r>
+      <w:proofErr w:type="gramEnd"/>
+      <w:r>
+        <w:rPr>
+          <w:rFonts w:ascii="Times" w:eastAsiaTheme="minorEastAsia" w:hAnsi="Times" w:cs="Times"/>
+          <w:sz w:val="24"/>
+          <w:szCs w:val="24"/>
+        </w:rPr>
+        <w:t>1), teremos O(</w:t>
+      </w:r>
+      <w:proofErr w:type="spellStart"/>
+      <w:r>
+        <w:rPr>
+          <w:rFonts w:ascii="Times" w:eastAsiaTheme="minorEastAsia" w:hAnsi="Times" w:cs="Times"/>
+          <w:sz w:val="24"/>
+          <w:szCs w:val="24"/>
+        </w:rPr>
+        <w:t>log</w:t>
+      </w:r>
+      <w:proofErr w:type="spellEnd"/>
+      <w:r>
+        <w:rPr>
+          <w:rFonts w:ascii="Times" w:eastAsiaTheme="minorEastAsia" w:hAnsi="Times" w:cs="Times"/>
+          <w:sz w:val="24"/>
+          <w:szCs w:val="24"/>
+        </w:rPr>
+        <w:t xml:space="preserve"> n)</w:t>
+      </w:r>
+      <w:r>
+        <w:rPr>
+          <w:rFonts w:ascii="Times" w:eastAsiaTheme="minorEastAsia" w:hAnsi="Times" w:cs="Times"/>
+          <w:sz w:val="24"/>
+          <w:szCs w:val="24"/>
+        </w:rPr>
+        <w:t>.</w:t>
+      </w:r>
+    </w:p>
+    <w:p>
+      <w:pPr>
+        <w:spacing w:line="480" w:lineRule="auto"/>
+        <w:jc w:val="both"/>
+        <w:rPr>
+          <w:rFonts w:ascii="Times" w:eastAsiaTheme="minorEastAsia" w:hAnsi="Times" w:cs="Times"/>
+          <w:sz w:val="24"/>
+          <w:szCs w:val="24"/>
+        </w:rPr>
+      </w:pPr>
+      <w:r>
+        <w:rPr>
+          <w:rFonts w:ascii="Times" w:eastAsiaTheme="minorEastAsia" w:hAnsi="Times" w:cs="Times"/>
+          <w:sz w:val="24"/>
+          <w:szCs w:val="24"/>
+        </w:rPr>
+        <w:t xml:space="preserve">Todavia, </w:t>
+      </w:r>
+      <w:r>
+        <w:rPr>
+          <w:rFonts w:ascii="Times" w:eastAsiaTheme="minorEastAsia" w:hAnsi="Times" w:cs="Times"/>
+          <w:sz w:val="24"/>
+          <w:szCs w:val="24"/>
+        </w:rPr>
+        <w:t xml:space="preserve">para </w:t>
+      </w:r>
+      <w:r>
+        <w:rPr>
+          <w:rFonts w:ascii="Times" w:eastAsiaTheme="minorEastAsia" w:hAnsi="Times" w:cs="Times"/>
+          <w:sz w:val="24"/>
+          <w:szCs w:val="24"/>
+        </w:rPr>
+        <w:t xml:space="preserve">o </w:t>
+      </w:r>
+      <w:r>
+        <w:rPr>
+          <w:rFonts w:ascii="Times" w:eastAsiaTheme="minorEastAsia" w:hAnsi="Times" w:cs="Times"/>
+          <w:sz w:val="24"/>
+          <w:szCs w:val="24"/>
+        </w:rPr>
+        <w:t>cálculo</w:t>
+      </w:r>
+      <w:r>
+        <w:rPr>
+          <w:rFonts w:ascii="Times" w:eastAsiaTheme="minorEastAsia" w:hAnsi="Times" w:cs="Times"/>
+          <w:sz w:val="24"/>
+          <w:szCs w:val="24"/>
+        </w:rPr>
+        <w:t xml:space="preserve"> final, teremos que considerar</w:t>
+      </w:r>
+      <w:r>
+        <w:rPr>
+          <w:rFonts w:ascii="Times" w:eastAsiaTheme="minorEastAsia" w:hAnsi="Times" w:cs="Times"/>
+          <w:sz w:val="24"/>
+          <w:szCs w:val="24"/>
+        </w:rPr>
+        <w:t>:</w:t>
+      </w:r>
+    </w:p>
+    <w:p>
+      <w:pPr>
+        <w:pStyle w:val="PargrafodaLista"/>
+        <w:numPr>
+          <w:ilvl w:val="1"/>
+          <w:numId w:val="5"/>
+        </w:numPr>
+        <w:spacing w:line="480" w:lineRule="auto"/>
+        <w:jc w:val="both"/>
+        <w:rPr>
+          <w:rFonts w:ascii="Times" w:eastAsiaTheme="minorEastAsia" w:hAnsi="Times" w:cs="Times"/>
+          <w:sz w:val="24"/>
+          <w:szCs w:val="24"/>
+        </w:rPr>
+      </w:pPr>
+      <w:r>
+        <w:rPr>
+          <w:rFonts w:ascii="Times" w:eastAsiaTheme="minorEastAsia" w:hAnsi="Times" w:cs="Times"/>
+          <w:sz w:val="24"/>
+          <w:szCs w:val="24"/>
+        </w:rPr>
+        <w:t>O custo para a c</w:t>
+      </w:r>
+      <w:r>
+        <w:rPr>
+          <w:rFonts w:ascii="Times" w:eastAsiaTheme="minorEastAsia" w:hAnsi="Times" w:cs="Times"/>
+          <w:sz w:val="24"/>
+          <w:szCs w:val="24"/>
+        </w:rPr>
+        <w:t xml:space="preserve">onstrução </w:t>
+      </w:r>
+      <w:r>
+        <w:rPr>
+          <w:rFonts w:ascii="Times" w:eastAsiaTheme="minorEastAsia" w:hAnsi="Times" w:cs="Times"/>
+          <w:sz w:val="24"/>
+          <w:szCs w:val="24"/>
+        </w:rPr>
+        <w:t xml:space="preserve">inicial </w:t>
+      </w:r>
+      <w:r>
+        <w:rPr>
+          <w:rFonts w:ascii="Times" w:eastAsiaTheme="minorEastAsia" w:hAnsi="Times" w:cs="Times"/>
+          <w:sz w:val="24"/>
+          <w:szCs w:val="24"/>
+        </w:rPr>
+        <w:t xml:space="preserve">do </w:t>
+      </w:r>
+      <w:proofErr w:type="spellStart"/>
+      <w:r>
+        <w:rPr>
+          <w:rFonts w:ascii="Times" w:eastAsiaTheme="minorEastAsia" w:hAnsi="Times" w:cs="Times"/>
+          <w:sz w:val="24"/>
+          <w:szCs w:val="24"/>
+        </w:rPr>
+        <w:t>h</w:t>
+      </w:r>
+      <w:r>
+        <w:rPr>
+          <w:rFonts w:ascii="Times" w:eastAsiaTheme="minorEastAsia" w:hAnsi="Times" w:cs="Times"/>
+          <w:sz w:val="24"/>
+          <w:szCs w:val="24"/>
+        </w:rPr>
+        <w:t>eap</w:t>
+      </w:r>
+      <w:proofErr w:type="spellEnd"/>
+      <w:r>
+        <w:rPr>
+          <w:rFonts w:ascii="Times" w:eastAsiaTheme="minorEastAsia" w:hAnsi="Times" w:cs="Times"/>
+          <w:sz w:val="24"/>
+          <w:szCs w:val="24"/>
+        </w:rPr>
+        <w:t xml:space="preserve">: </w:t>
+      </w:r>
+      <m:oMath>
+        <m:r>
+          <w:rPr>
+            <w:rFonts w:ascii="Cambria Math" w:eastAsiaTheme="minorEastAsia" w:hAnsi="Cambria Math" w:cs="Times"/>
+            <w:sz w:val="24"/>
+            <w:szCs w:val="24"/>
+          </w:rPr>
+          <m:t>O(n)</m:t>
+        </m:r>
+      </m:oMath>
+      <w:r>
+        <w:rPr>
+          <w:rFonts w:ascii="Times" w:eastAsiaTheme="minorEastAsia" w:hAnsi="Times" w:cs="Times"/>
+          <w:sz w:val="24"/>
+          <w:szCs w:val="24"/>
+        </w:rPr>
+        <w:t>.</w:t>
+      </w:r>
+    </w:p>
+    <w:p>
+      <w:pPr>
+        <w:pStyle w:val="PargrafodaLista"/>
+        <w:numPr>
+          <w:ilvl w:val="1"/>
+          <w:numId w:val="5"/>
+        </w:numPr>
+        <w:spacing w:line="480" w:lineRule="auto"/>
+        <w:jc w:val="both"/>
+        <w:rPr>
+          <w:rFonts w:ascii="Times" w:eastAsiaTheme="minorEastAsia" w:hAnsi="Times" w:cs="Times"/>
+          <w:sz w:val="24"/>
+          <w:szCs w:val="24"/>
+        </w:rPr>
+      </w:pPr>
+      <w:r>
+        <w:rPr>
+          <w:rFonts w:ascii="Times" w:eastAsiaTheme="minorEastAsia" w:hAnsi="Times" w:cs="Times"/>
+          <w:sz w:val="24"/>
+          <w:szCs w:val="24"/>
+        </w:rPr>
+        <w:t xml:space="preserve">Para cada uma das </w:t>
+      </w:r>
+      <m:oMath>
+        <m:r>
+          <w:rPr>
+            <w:rFonts w:ascii="Cambria Math" w:eastAsiaTheme="minorEastAsia" w:hAnsi="Cambria Math" w:cs="Times"/>
+            <w:sz w:val="24"/>
+            <w:szCs w:val="24"/>
+          </w:rPr>
+          <m:t>n</m:t>
+        </m:r>
+      </m:oMath>
+      <w:r>
+        <w:rPr>
+          <w:rFonts w:ascii="Times" w:eastAsiaTheme="minorEastAsia" w:hAnsi="Times" w:cs="Times"/>
+          <w:sz w:val="24"/>
+          <w:szCs w:val="24"/>
+        </w:rPr>
+        <w:t xml:space="preserve"> </w:t>
+      </w:r>
+      <w:r>
+        <w:rPr>
+          <w:rFonts w:ascii="Times" w:eastAsiaTheme="minorEastAsia" w:hAnsi="Times" w:cs="Times"/>
+          <w:sz w:val="24"/>
+          <w:szCs w:val="24"/>
+        </w:rPr>
+        <w:t>remoções, acontece um</w:t>
+      </w:r>
+      <w:r>
+        <w:rPr>
+          <w:rFonts w:ascii="Times" w:eastAsiaTheme="minorEastAsia" w:hAnsi="Times" w:cs="Times"/>
+          <w:sz w:val="24"/>
+          <w:szCs w:val="24"/>
+        </w:rPr>
+        <w:t xml:space="preserve"> s</w:t>
+      </w:r>
+      <w:r>
+        <w:rPr>
+          <w:rFonts w:ascii="Times" w:eastAsiaTheme="minorEastAsia" w:hAnsi="Times" w:cs="Times"/>
+          <w:sz w:val="24"/>
+          <w:szCs w:val="24"/>
+        </w:rPr>
+        <w:t>wap</w:t>
+      </w:r>
+      <w:r>
+        <w:rPr>
+          <w:rFonts w:ascii="Times" w:eastAsiaTheme="minorEastAsia" w:hAnsi="Times" w:cs="Times"/>
+          <w:sz w:val="24"/>
+          <w:szCs w:val="24"/>
+        </w:rPr>
+        <w:t xml:space="preserve"> </w:t>
+      </w:r>
+      <m:oMath>
+        <m:r>
+          <w:rPr>
+            <w:rFonts w:ascii="Cambria Math" w:eastAsiaTheme="minorEastAsia" w:hAnsi="Cambria Math" w:cs="Times"/>
+            <w:sz w:val="24"/>
+            <w:szCs w:val="24"/>
+          </w:rPr>
+          <m:t>O(1)</m:t>
+        </m:r>
+      </m:oMath>
+      <w:r>
+        <w:rPr>
+          <w:rFonts w:ascii="Times" w:eastAsiaTheme="minorEastAsia" w:hAnsi="Times" w:cs="Times"/>
+          <w:sz w:val="24"/>
+          <w:szCs w:val="24"/>
+        </w:rPr>
+        <w:t xml:space="preserve">, </w:t>
+      </w:r>
+      <w:r>
+        <w:rPr>
+          <w:rFonts w:ascii="Times" w:eastAsiaTheme="minorEastAsia" w:hAnsi="Times" w:cs="Times"/>
+          <w:sz w:val="24"/>
+          <w:szCs w:val="24"/>
+        </w:rPr>
+        <w:t>custando</w:t>
+      </w:r>
+      <w:r>
+        <w:rPr>
+          <w:rFonts w:ascii="Times" w:eastAsiaTheme="minorEastAsia" w:hAnsi="Times" w:cs="Times"/>
+          <w:sz w:val="24"/>
+          <w:szCs w:val="24"/>
+        </w:rPr>
+        <w:t>:</w:t>
+      </w:r>
+      <w:r>
+        <w:rPr>
+          <w:rFonts w:ascii="Times" w:eastAsiaTheme="minorEastAsia" w:hAnsi="Times" w:cs="Times"/>
+          <w:sz w:val="24"/>
+          <w:szCs w:val="24"/>
+        </w:rPr>
+        <w:t xml:space="preserve"> </w:t>
+      </w:r>
+      <m:oMath>
+        <m:r>
+          <w:rPr>
+            <w:rFonts w:ascii="Cambria Math" w:eastAsiaTheme="minorEastAsia" w:hAnsi="Cambria Math" w:cs="Times"/>
+            <w:sz w:val="24"/>
+            <w:szCs w:val="24"/>
+          </w:rPr>
+          <m:t>O</m:t>
+        </m:r>
+        <m:d>
+          <m:dPr>
+            <m:ctrlPr>
+              <w:rPr>
+                <w:rFonts w:ascii="Cambria Math" w:eastAsiaTheme="minorEastAsia" w:hAnsi="Cambria Math" w:cs="Times"/>
+                <w:i/>
+                <w:sz w:val="24"/>
+                <w:szCs w:val="24"/>
+              </w:rPr>
+            </m:ctrlPr>
+          </m:dPr>
+          <m:e>
+            <m:r>
+              <w:rPr>
+                <w:rFonts w:ascii="Cambria Math" w:eastAsiaTheme="minorEastAsia" w:hAnsi="Cambria Math" w:cs="Times"/>
+                <w:sz w:val="24"/>
+                <w:szCs w:val="24"/>
+              </w:rPr>
+              <m:t>n*</m:t>
+            </m:r>
+            <m:r>
+              <w:rPr>
+                <w:rFonts w:ascii="Cambria Math" w:eastAsiaTheme="minorEastAsia" w:hAnsi="Cambria Math" w:cs="Times"/>
+                <w:sz w:val="24"/>
+                <w:szCs w:val="24"/>
+              </w:rPr>
+              <m:t>1</m:t>
+            </m:r>
+          </m:e>
+        </m:d>
+        <m:r>
+          <w:rPr>
+            <w:rFonts w:ascii="Cambria Math" w:eastAsiaTheme="minorEastAsia" w:hAnsi="Cambria Math" w:cs="Times"/>
+            <w:sz w:val="24"/>
+            <w:szCs w:val="24"/>
+          </w:rPr>
+          <m:t>→O(n)</m:t>
+        </m:r>
+      </m:oMath>
+      <w:r>
+        <w:rPr>
+          <w:rFonts w:ascii="Times" w:eastAsiaTheme="minorEastAsia" w:hAnsi="Times" w:cs="Times"/>
+          <w:sz w:val="24"/>
+          <w:szCs w:val="24"/>
+        </w:rPr>
+        <w:t>.</w:t>
+      </w:r>
+    </w:p>
+    <w:p>
+      <w:pPr>
+        <w:pStyle w:val="PargrafodaLista"/>
+        <w:numPr>
+          <w:ilvl w:val="1"/>
+          <w:numId w:val="5"/>
+        </w:numPr>
+        <w:spacing w:line="480" w:lineRule="auto"/>
+        <w:jc w:val="both"/>
+        <w:rPr>
+          <w:rFonts w:ascii="Times" w:eastAsiaTheme="minorEastAsia" w:hAnsi="Times" w:cs="Times"/>
+          <w:sz w:val="24"/>
+          <w:szCs w:val="24"/>
+        </w:rPr>
+      </w:pPr>
+      <w:r>
+        <w:rPr>
+          <w:rFonts w:ascii="Times" w:eastAsiaTheme="minorEastAsia" w:hAnsi="Times" w:cs="Times"/>
+          <w:sz w:val="24"/>
+          <w:szCs w:val="24"/>
+        </w:rPr>
+        <w:t>Após cada</w:t>
+      </w:r>
+      <w:r>
+        <w:rPr>
+          <w:rFonts w:ascii="Times" w:eastAsiaTheme="minorEastAsia" w:hAnsi="Times" w:cs="Times"/>
+          <w:sz w:val="24"/>
+          <w:szCs w:val="24"/>
+        </w:rPr>
+        <w:t xml:space="preserve"> remoção,</w:t>
+      </w:r>
+      <w:r>
+        <w:rPr>
+          <w:rFonts w:ascii="Times" w:eastAsiaTheme="minorEastAsia" w:hAnsi="Times" w:cs="Times"/>
+          <w:sz w:val="24"/>
+          <w:szCs w:val="24"/>
+        </w:rPr>
+        <w:t xml:space="preserve"> </w:t>
+      </w:r>
+      <w:r>
+        <w:rPr>
+          <w:rFonts w:ascii="Times" w:eastAsiaTheme="minorEastAsia" w:hAnsi="Times" w:cs="Times"/>
+          <w:sz w:val="24"/>
+          <w:szCs w:val="24"/>
+        </w:rPr>
+        <w:t>considerando</w:t>
+      </w:r>
+      <w:r>
+        <w:rPr>
+          <w:rFonts w:ascii="Times" w:eastAsiaTheme="minorEastAsia" w:hAnsi="Times" w:cs="Times"/>
+          <w:sz w:val="24"/>
+          <w:szCs w:val="24"/>
+        </w:rPr>
+        <w:t xml:space="preserve"> a</w:t>
+      </w:r>
+      <w:r>
+        <w:rPr>
+          <w:rFonts w:ascii="Times" w:eastAsiaTheme="minorEastAsia" w:hAnsi="Times" w:cs="Times"/>
+          <w:sz w:val="24"/>
+          <w:szCs w:val="24"/>
+        </w:rPr>
+        <w:t xml:space="preserve"> </w:t>
+      </w:r>
+      <w:r>
+        <w:rPr>
+          <w:rFonts w:ascii="Times" w:eastAsiaTheme="minorEastAsia" w:hAnsi="Times" w:cs="Times"/>
+          <w:sz w:val="24"/>
+          <w:szCs w:val="24"/>
+        </w:rPr>
+        <w:t xml:space="preserve">diminuição </w:t>
+      </w:r>
+      <w:r>
+        <w:rPr>
+          <w:rFonts w:ascii="Times" w:eastAsiaTheme="minorEastAsia" w:hAnsi="Times" w:cs="Times"/>
+          <w:sz w:val="24"/>
+          <w:szCs w:val="24"/>
+        </w:rPr>
+        <w:t>de uma posição</w:t>
+      </w:r>
+      <w:r>
+        <w:rPr>
+          <w:rFonts w:ascii="Times" w:eastAsiaTheme="minorEastAsia" w:hAnsi="Times" w:cs="Times"/>
+          <w:sz w:val="24"/>
+          <w:szCs w:val="24"/>
+        </w:rPr>
+        <w:t xml:space="preserve"> </w:t>
+      </w:r>
+      <w:r>
+        <w:rPr>
+          <w:rFonts w:ascii="Times" w:eastAsiaTheme="minorEastAsia" w:hAnsi="Times" w:cs="Times"/>
+          <w:sz w:val="24"/>
+          <w:szCs w:val="24"/>
+        </w:rPr>
+        <w:t xml:space="preserve">no </w:t>
+      </w:r>
+      <w:proofErr w:type="spellStart"/>
+      <w:r>
+        <w:rPr>
+          <w:rFonts w:ascii="Times" w:eastAsiaTheme="minorEastAsia" w:hAnsi="Times" w:cs="Times"/>
+          <w:sz w:val="24"/>
+          <w:szCs w:val="24"/>
+        </w:rPr>
+        <w:t>heap</w:t>
+      </w:r>
+      <w:proofErr w:type="spellEnd"/>
+      <w:r>
+        <w:rPr>
+          <w:rFonts w:ascii="Times" w:eastAsiaTheme="minorEastAsia" w:hAnsi="Times" w:cs="Times"/>
+          <w:sz w:val="24"/>
+          <w:szCs w:val="24"/>
+        </w:rPr>
+        <w:t xml:space="preserve"> </w:t>
+      </w:r>
+      <m:oMath>
+        <m:r>
+          <w:rPr>
+            <w:rFonts w:ascii="Cambria Math" w:eastAsiaTheme="minorEastAsia" w:hAnsi="Cambria Math" w:cs="Times"/>
+            <w:sz w:val="24"/>
+            <w:szCs w:val="24"/>
+          </w:rPr>
+          <m:t>(n-</m:t>
+        </m:r>
+        <w:proofErr w:type="gramStart"/>
+        <m:r>
+          <w:rPr>
+            <w:rFonts w:ascii="Cambria Math" w:eastAsiaTheme="minorEastAsia" w:hAnsi="Cambria Math" w:cs="Times"/>
+            <w:sz w:val="24"/>
+            <w:szCs w:val="24"/>
+          </w:rPr>
+          <m:t>1</m:t>
+        </m:r>
+        <w:proofErr w:type="gramEnd"/>
+        <m:r>
+          <w:rPr>
+            <w:rFonts w:ascii="Cambria Math" w:eastAsiaTheme="minorEastAsia" w:hAnsi="Cambria Math" w:cs="Times"/>
+            <w:sz w:val="24"/>
+            <w:szCs w:val="24"/>
+          </w:rPr>
+          <m:t xml:space="preserve"> operações)</m:t>
+        </m:r>
+      </m:oMath>
+      <w:r>
+        <w:rPr>
+          <w:rFonts w:ascii="Times" w:eastAsiaTheme="minorEastAsia" w:hAnsi="Times" w:cs="Times"/>
+          <w:sz w:val="24"/>
+          <w:szCs w:val="24"/>
+        </w:rPr>
+        <w:t xml:space="preserve"> e </w:t>
+      </w:r>
+      <w:r>
+        <w:rPr>
+          <w:rFonts w:ascii="Times" w:eastAsiaTheme="minorEastAsia" w:hAnsi="Times" w:cs="Times"/>
+          <w:sz w:val="24"/>
+          <w:szCs w:val="24"/>
+        </w:rPr>
+        <w:t xml:space="preserve">o </w:t>
+      </w:r>
+      <w:r>
+        <w:rPr>
+          <w:rFonts w:ascii="Times" w:eastAsiaTheme="minorEastAsia" w:hAnsi="Times" w:cs="Times"/>
+          <w:sz w:val="24"/>
+          <w:szCs w:val="24"/>
+        </w:rPr>
+        <w:t>custo do</w:t>
+      </w:r>
+      <w:r>
+        <w:rPr>
+          <w:rFonts w:ascii="Times" w:eastAsiaTheme="minorEastAsia" w:hAnsi="Times" w:cs="Times"/>
+          <w:sz w:val="24"/>
+          <w:szCs w:val="24"/>
+        </w:rPr>
+        <w:t xml:space="preserve"> procedimento de</w:t>
+      </w:r>
+      <w:r>
+        <w:rPr>
+          <w:rFonts w:ascii="Times" w:eastAsiaTheme="minorEastAsia" w:hAnsi="Times" w:cs="Times"/>
+          <w:sz w:val="24"/>
+          <w:szCs w:val="24"/>
+        </w:rPr>
+        <w:t xml:space="preserve"> </w:t>
+      </w:r>
+      <w:proofErr w:type="spellStart"/>
+      <w:r>
+        <w:rPr>
+          <w:rFonts w:ascii="Times" w:eastAsiaTheme="minorEastAsia" w:hAnsi="Times" w:cs="Times"/>
+          <w:sz w:val="24"/>
+          <w:szCs w:val="24"/>
+        </w:rPr>
+        <w:t>heapify</w:t>
+      </w:r>
+      <w:proofErr w:type="spellEnd"/>
+      <w:r>
+        <w:rPr>
+          <w:rFonts w:ascii="Times" w:eastAsiaTheme="minorEastAsia" w:hAnsi="Times" w:cs="Times"/>
+          <w:sz w:val="24"/>
+          <w:szCs w:val="24"/>
+        </w:rPr>
+        <w:t>(</w:t>
+      </w:r>
+      <w:proofErr w:type="spellStart"/>
+      <w:r>
+        <w:rPr>
+          <w:rFonts w:ascii="Times" w:eastAsiaTheme="minorEastAsia" w:hAnsi="Times" w:cs="Times"/>
+          <w:i/>
+          <w:sz w:val="24"/>
+          <w:szCs w:val="24"/>
+        </w:rPr>
+        <w:t>sift-down</w:t>
+      </w:r>
+      <w:proofErr w:type="spellEnd"/>
+      <w:r>
+        <w:rPr>
+          <w:rFonts w:ascii="Times" w:eastAsiaTheme="minorEastAsia" w:hAnsi="Times" w:cs="Times"/>
+          <w:i/>
+          <w:sz w:val="24"/>
+          <w:szCs w:val="24"/>
+        </w:rPr>
+        <w:t>)</w:t>
+      </w:r>
+      <w:r>
+        <w:rPr>
+          <w:rFonts w:ascii="Times" w:eastAsiaTheme="minorEastAsia" w:hAnsi="Times" w:cs="Times"/>
+          <w:sz w:val="24"/>
+          <w:szCs w:val="24"/>
+        </w:rPr>
+        <w:t xml:space="preserve"> para reestruturar o </w:t>
+      </w:r>
+      <w:proofErr w:type="spellStart"/>
+      <w:r>
+        <w:rPr>
+          <w:rFonts w:ascii="Times" w:eastAsiaTheme="minorEastAsia" w:hAnsi="Times" w:cs="Times"/>
+          <w:sz w:val="24"/>
+          <w:szCs w:val="24"/>
+        </w:rPr>
+        <w:t>Heap</w:t>
+      </w:r>
+      <w:proofErr w:type="spellEnd"/>
+      <w:r>
+        <w:rPr>
+          <w:rFonts w:ascii="Times" w:eastAsiaTheme="minorEastAsia" w:hAnsi="Times" w:cs="Times"/>
+          <w:sz w:val="24"/>
+          <w:szCs w:val="24"/>
+        </w:rPr>
+        <w:t xml:space="preserve"> </w:t>
+      </w:r>
+      <m:oMath>
+        <m:r>
+          <w:rPr>
+            <w:rFonts w:ascii="Cambria Math" w:eastAsiaTheme="minorEastAsia" w:hAnsi="Cambria Math" w:cs="Times"/>
+            <w:sz w:val="24"/>
+            <w:szCs w:val="24"/>
+          </w:rPr>
+          <m:t>O</m:t>
+        </m:r>
+        <m:r>
+          <m:rPr>
+            <m:sty m:val="p"/>
+          </m:rPr>
+          <w:rPr>
+            <w:rFonts w:ascii="Cambria Math" w:eastAsiaTheme="minorEastAsia" w:hAnsi="Cambria Math" w:cs="Times"/>
+            <w:sz w:val="24"/>
+            <w:szCs w:val="24"/>
+          </w:rPr>
+          <m:t>(</m:t>
+        </m:r>
+        <m:func>
+          <m:funcPr>
+            <m:ctrlPr>
+              <w:rPr>
+                <w:rFonts w:ascii="Cambria Math" w:eastAsiaTheme="minorEastAsia" w:hAnsi="Cambria Math" w:cs="Times"/>
+                <w:sz w:val="24"/>
+                <w:szCs w:val="24"/>
+              </w:rPr>
+            </m:ctrlPr>
+          </m:funcPr>
+          <m:fName>
+            <m:r>
+              <m:rPr>
+                <m:sty m:val="p"/>
+              </m:rPr>
+              <w:rPr>
+                <w:rFonts w:ascii="Cambria Math" w:eastAsiaTheme="minorEastAsia" w:hAnsi="Cambria Math" w:cs="Times"/>
+                <w:sz w:val="24"/>
+                <w:szCs w:val="24"/>
+              </w:rPr>
+              <m:t>log</m:t>
+            </m:r>
+          </m:fName>
+          <m:e>
+            <m:r>
+              <w:rPr>
+                <w:rFonts w:ascii="Cambria Math" w:eastAsiaTheme="minorEastAsia" w:hAnsi="Cambria Math" w:cs="Times"/>
+                <w:sz w:val="24"/>
+                <w:szCs w:val="24"/>
+              </w:rPr>
+              <m:t>n</m:t>
+            </m:r>
+            <m:r>
+              <m:rPr>
+                <m:sty m:val="p"/>
+              </m:rPr>
+              <w:rPr>
+                <w:rFonts w:ascii="Cambria Math" w:eastAsiaTheme="minorEastAsia" w:hAnsi="Cambria Math" w:cs="Times"/>
+                <w:sz w:val="24"/>
+                <w:szCs w:val="24"/>
+              </w:rPr>
+              <m:t>)</m:t>
+            </m:r>
+          </m:e>
+        </m:func>
+      </m:oMath>
+      <w:r>
+        <w:rPr>
+          <w:rFonts w:ascii="Times" w:eastAsiaTheme="minorEastAsia" w:hAnsi="Times" w:cs="Times"/>
+          <w:sz w:val="24"/>
+          <w:szCs w:val="24"/>
+        </w:rPr>
+        <w:t>,</w:t>
+      </w:r>
+      <w:r>
+        <w:rPr>
+          <w:rFonts w:ascii="Times" w:eastAsiaTheme="minorEastAsia" w:hAnsi="Times" w:cs="Times"/>
+          <w:sz w:val="24"/>
+          <w:szCs w:val="24"/>
+        </w:rPr>
+        <w:t xml:space="preserve"> </w:t>
+      </w:r>
+      <w:r>
+        <w:rPr>
+          <w:rFonts w:ascii="Times" w:eastAsiaTheme="minorEastAsia" w:hAnsi="Times" w:cs="Times"/>
+          <w:sz w:val="24"/>
+          <w:szCs w:val="24"/>
+        </w:rPr>
+        <w:t>calculado</w:t>
+      </w:r>
+      <w:r>
+        <w:rPr>
+          <w:rFonts w:ascii="Times" w:eastAsiaTheme="minorEastAsia" w:hAnsi="Times" w:cs="Times"/>
+          <w:sz w:val="24"/>
+          <w:szCs w:val="24"/>
+        </w:rPr>
+        <w:t>-se</w:t>
+      </w:r>
+      <w:r>
+        <w:rPr>
+          <w:rFonts w:ascii="Times" w:eastAsiaTheme="minorEastAsia" w:hAnsi="Times" w:cs="Times"/>
+          <w:sz w:val="24"/>
+          <w:szCs w:val="24"/>
+        </w:rPr>
+        <w:t xml:space="preserve">: </w:t>
+      </w:r>
+      <m:oMath>
+        <m:r>
+          <w:rPr>
+            <w:rFonts w:ascii="Cambria Math" w:eastAsiaTheme="minorEastAsia" w:hAnsi="Cambria Math" w:cs="Times"/>
+            <w:sz w:val="24"/>
+            <w:szCs w:val="24"/>
+          </w:rPr>
+          <m:t>O</m:t>
+        </m:r>
+        <m:d>
+          <m:dPr>
+            <m:ctrlPr>
+              <w:rPr>
+                <w:rFonts w:ascii="Cambria Math" w:eastAsiaTheme="minorEastAsia" w:hAnsi="Cambria Math" w:cs="Times"/>
+                <w:i/>
+                <w:sz w:val="24"/>
+                <w:szCs w:val="24"/>
+              </w:rPr>
+            </m:ctrlPr>
+          </m:dPr>
+          <m:e>
+            <m:r>
+              <w:rPr>
+                <w:rFonts w:ascii="Cambria Math" w:eastAsiaTheme="minorEastAsia" w:hAnsi="Cambria Math" w:cs="Times"/>
+                <w:sz w:val="24"/>
+                <w:szCs w:val="24"/>
+              </w:rPr>
+              <m:t>(</m:t>
+            </m:r>
+            <m:r>
+              <w:rPr>
+                <w:rFonts w:ascii="Cambria Math" w:eastAsiaTheme="minorEastAsia" w:hAnsi="Cambria Math" w:cs="Times"/>
+                <w:sz w:val="24"/>
+                <w:szCs w:val="24"/>
+              </w:rPr>
+              <m:t>n</m:t>
+            </m:r>
+            <m:r>
+              <w:rPr>
+                <w:rFonts w:ascii="Cambria Math" w:eastAsiaTheme="minorEastAsia" w:hAnsi="Cambria Math" w:cs="Times"/>
+                <w:sz w:val="24"/>
+                <w:szCs w:val="24"/>
+              </w:rPr>
+              <m:t>-1</m:t>
+            </m:r>
+          </m:e>
+        </m:d>
+        <m:r>
+          <w:rPr>
+            <w:rFonts w:ascii="Cambria Math" w:eastAsiaTheme="minorEastAsia" w:hAnsi="Cambria Math" w:cs="Times"/>
+            <w:sz w:val="24"/>
+            <w:szCs w:val="24"/>
+          </w:rPr>
+          <m:t>*</m:t>
+        </m:r>
+        <m:func>
+          <m:funcPr>
+            <m:ctrlPr>
+              <w:rPr>
+                <w:rFonts w:ascii="Cambria Math" w:eastAsiaTheme="minorEastAsia" w:hAnsi="Cambria Math" w:cs="Times"/>
+                <w:i/>
+                <w:sz w:val="24"/>
+                <w:szCs w:val="24"/>
+              </w:rPr>
+            </m:ctrlPr>
+          </m:funcPr>
+          <m:fName>
+            <m:r>
+              <m:rPr>
+                <m:sty m:val="p"/>
+              </m:rPr>
+              <w:rPr>
+                <w:rFonts w:ascii="Cambria Math" w:eastAsiaTheme="minorEastAsia" w:hAnsi="Cambria Math" w:cs="Times"/>
+                <w:sz w:val="24"/>
+                <w:szCs w:val="24"/>
+              </w:rPr>
+              <m:t>log</m:t>
+            </m:r>
+          </m:fName>
+          <m:e>
+            <m:r>
+              <w:rPr>
+                <w:rFonts w:ascii="Cambria Math" w:eastAsiaTheme="minorEastAsia" w:hAnsi="Cambria Math" w:cs="Times"/>
+                <w:sz w:val="24"/>
+                <w:szCs w:val="24"/>
+              </w:rPr>
+              <m:t>n</m:t>
+            </m:r>
+          </m:e>
+        </m:func>
+        <m:r>
+          <w:rPr>
+            <w:rFonts w:ascii="Cambria Math" w:eastAsiaTheme="minorEastAsia" w:hAnsi="Cambria Math" w:cs="Times"/>
+            <w:sz w:val="24"/>
+            <w:szCs w:val="24"/>
+          </w:rPr>
+          <m:t>)</m:t>
+        </m:r>
+        <m:r>
+          <w:rPr>
+            <w:rFonts w:ascii="Cambria Math" w:eastAsiaTheme="minorEastAsia" w:hAnsi="Cambria Math" w:cs="Times"/>
+            <w:sz w:val="24"/>
+            <w:szCs w:val="24"/>
+          </w:rPr>
+          <m:t>→O(n</m:t>
+        </m:r>
+        <m:func>
+          <m:funcPr>
+            <m:ctrlPr>
+              <w:rPr>
+                <w:rFonts w:ascii="Cambria Math" w:eastAsiaTheme="minorEastAsia" w:hAnsi="Cambria Math" w:cs="Times"/>
+                <w:i/>
+                <w:sz w:val="24"/>
+                <w:szCs w:val="24"/>
+              </w:rPr>
+            </m:ctrlPr>
+          </m:funcPr>
+          <m:fName>
+            <m:r>
+              <m:rPr>
+                <m:sty m:val="p"/>
+              </m:rPr>
+              <w:rPr>
+                <w:rFonts w:ascii="Cambria Math" w:eastAsiaTheme="minorEastAsia" w:hAnsi="Cambria Math" w:cs="Times"/>
+                <w:sz w:val="24"/>
+                <w:szCs w:val="24"/>
+              </w:rPr>
+              <m:t>log</m:t>
+            </m:r>
+          </m:fName>
+          <m:e>
+            <m:r>
+              <w:rPr>
+                <w:rFonts w:ascii="Cambria Math" w:eastAsiaTheme="minorEastAsia" w:hAnsi="Cambria Math" w:cs="Times"/>
+                <w:sz w:val="24"/>
+                <w:szCs w:val="24"/>
+              </w:rPr>
+              <m:t>n)</m:t>
+            </m:r>
+          </m:e>
+        </m:func>
+      </m:oMath>
+      <w:r>
+        <w:rPr>
+          <w:rFonts w:ascii="Times" w:eastAsiaTheme="minorEastAsia" w:hAnsi="Times" w:cs="Times"/>
+          <w:sz w:val="24"/>
+          <w:szCs w:val="24"/>
+        </w:rPr>
+        <w:t>.</w:t>
+      </w:r>
+    </w:p>
+    <w:p>
+      <w:pPr>
+        <w:spacing w:line="480" w:lineRule="auto"/>
+        <w:jc w:val="both"/>
+        <w:rPr>
+          <w:rFonts w:ascii="Times" w:eastAsiaTheme="minorEastAsia" w:hAnsi="Times" w:cs="Times"/>
+          <w:sz w:val="24"/>
+          <w:szCs w:val="24"/>
+        </w:rPr>
+      </w:pPr>
+      <w:r>
+        <w:rPr>
+          <w:rFonts w:ascii="Times" w:eastAsiaTheme="minorEastAsia" w:hAnsi="Times" w:cs="Times"/>
+          <w:sz w:val="24"/>
+          <w:szCs w:val="24"/>
+        </w:rPr>
+        <w:t xml:space="preserve">Convertendo </w:t>
+      </w:r>
+      <w:r>
+        <w:rPr>
+          <w:rFonts w:ascii="Times" w:eastAsiaTheme="minorEastAsia" w:hAnsi="Times" w:cs="Times"/>
+          <w:sz w:val="24"/>
+          <w:szCs w:val="24"/>
+        </w:rPr>
+        <w:t xml:space="preserve">para </w:t>
+      </w:r>
+      <w:r>
+        <w:rPr>
+          <w:rFonts w:ascii="Times" w:eastAsiaTheme="minorEastAsia" w:hAnsi="Times" w:cs="Times"/>
+          <w:sz w:val="24"/>
+          <w:szCs w:val="24"/>
+        </w:rPr>
+        <w:t>a fórmula</w:t>
+      </w:r>
+      <w:r>
+        <w:rPr>
+          <w:rFonts w:ascii="Times" w:eastAsiaTheme="minorEastAsia" w:hAnsi="Times" w:cs="Times"/>
+          <w:sz w:val="24"/>
+          <w:szCs w:val="24"/>
+        </w:rPr>
+        <w:t xml:space="preserve"> final,</w:t>
+      </w:r>
+      <w:r>
+        <w:rPr>
+          <w:rFonts w:ascii="Times" w:eastAsiaTheme="minorEastAsia" w:hAnsi="Times" w:cs="Times"/>
+          <w:sz w:val="24"/>
+          <w:szCs w:val="24"/>
+        </w:rPr>
+        <w:t xml:space="preserve"> teremos:</w:t>
+      </w:r>
+    </w:p>
+    <w:p>
+      <w:pPr>
+        <w:pStyle w:val="PargrafodaLista"/>
+        <w:spacing w:line="480" w:lineRule="auto"/>
+        <w:jc w:val="both"/>
+        <w:rPr>
+          <w:rFonts w:ascii="Times" w:eastAsiaTheme="minorEastAsia" w:hAnsi="Times" w:cs="Times"/>
+          <w:sz w:val="24"/>
+          <w:szCs w:val="24"/>
+        </w:rPr>
+      </w:pPr>
+      <m:oMathPara>
+        <m:oMath>
+          <m:r>
+            <w:rPr>
+              <w:rFonts w:ascii="Cambria Math" w:hAnsi="Cambria Math" w:cs="Times"/>
+              <w:sz w:val="24"/>
+              <w:szCs w:val="24"/>
+            </w:rPr>
+            <m:t>O</m:t>
+          </m:r>
+          <m:d>
+            <m:dPr>
+              <m:ctrlPr>
+                <w:rPr>
+                  <w:rFonts w:ascii="Cambria Math" w:hAnsi="Cambria Math" w:cs="Times"/>
+                  <w:i/>
+                  <w:sz w:val="24"/>
+                  <w:szCs w:val="24"/>
+                </w:rPr>
+              </m:ctrlPr>
+            </m:dPr>
+            <m:e>
+              <m:r>
+                <w:rPr>
+                  <w:rFonts w:ascii="Cambria Math" w:hAnsi="Cambria Math" w:cs="Times"/>
+                  <w:sz w:val="24"/>
+                  <w:szCs w:val="24"/>
+                </w:rPr>
+                <m:t>n</m:t>
+              </m:r>
+            </m:e>
+          </m:d>
+          <m:r>
+            <w:rPr>
+              <w:rFonts w:ascii="Cambria Math" w:hAnsi="Cambria Math" w:cs="Times"/>
+              <w:sz w:val="24"/>
+              <w:szCs w:val="24"/>
+            </w:rPr>
+            <m:t>+O</m:t>
+          </m:r>
+          <m:d>
+            <m:dPr>
+              <m:ctrlPr>
+                <w:rPr>
+                  <w:rFonts w:ascii="Cambria Math" w:hAnsi="Cambria Math" w:cs="Times"/>
+                  <w:i/>
+                  <w:sz w:val="24"/>
+                  <w:szCs w:val="24"/>
+                </w:rPr>
+              </m:ctrlPr>
+            </m:dPr>
+            <m:e>
+              <m:r>
+                <w:rPr>
+                  <w:rFonts w:ascii="Cambria Math" w:hAnsi="Cambria Math" w:cs="Times"/>
+                  <w:sz w:val="24"/>
+                  <w:szCs w:val="24"/>
+                </w:rPr>
+                <m:t>n</m:t>
+              </m:r>
+            </m:e>
+          </m:d>
+          <m:r>
+            <w:rPr>
+              <w:rFonts w:ascii="Cambria Math" w:hAnsi="Cambria Math" w:cs="Times"/>
+              <w:sz w:val="24"/>
+              <w:szCs w:val="24"/>
+            </w:rPr>
+            <m:t>+</m:t>
+          </m:r>
+          <m:r>
+            <w:rPr>
+              <w:rFonts w:ascii="Cambria Math" w:hAnsi="Cambria Math" w:cs="Times"/>
+              <w:sz w:val="24"/>
+              <w:szCs w:val="24"/>
+            </w:rPr>
+            <m:t>O(n</m:t>
+          </m:r>
+          <m:func>
+            <m:funcPr>
+              <m:ctrlPr>
+                <w:rPr>
+                  <w:rFonts w:ascii="Cambria Math" w:hAnsi="Cambria Math" w:cs="Times"/>
+                  <w:i/>
+                  <w:sz w:val="24"/>
+                  <w:szCs w:val="24"/>
+                </w:rPr>
+              </m:ctrlPr>
+            </m:funcPr>
+            <m:fName>
+              <m:r>
+                <m:rPr>
+                  <m:sty m:val="p"/>
+                </m:rPr>
+                <w:rPr>
+                  <w:rFonts w:ascii="Cambria Math" w:hAnsi="Cambria Math" w:cs="Times"/>
+                  <w:sz w:val="24"/>
+                  <w:szCs w:val="24"/>
+                </w:rPr>
+                <m:t>log</m:t>
+              </m:r>
+            </m:fName>
+            <m:e>
+              <m:r>
+                <w:rPr>
+                  <w:rFonts w:ascii="Cambria Math" w:hAnsi="Cambria Math" w:cs="Times"/>
+                  <w:sz w:val="24"/>
+                  <w:szCs w:val="24"/>
+                </w:rPr>
+                <m:t>n)</m:t>
+              </m:r>
+            </m:e>
+          </m:func>
+        </m:oMath>
+      </m:oMathPara>
+    </w:p>
+    <w:p>
+      <w:pPr>
+        <w:pStyle w:val="PargrafodaLista"/>
+        <w:spacing w:line="480" w:lineRule="auto"/>
+        <w:jc w:val="both"/>
+        <w:rPr>
+          <w:rFonts w:ascii="Times" w:eastAsiaTheme="minorEastAsia" w:hAnsi="Times" w:cs="Times"/>
+          <w:sz w:val="24"/>
+          <w:szCs w:val="24"/>
+        </w:rPr>
+      </w:pPr>
+      <m:oMathPara>
+        <m:oMath>
+          <m:r>
+            <w:rPr>
+              <w:rFonts w:ascii="Cambria Math" w:hAnsi="Cambria Math" w:cs="Times"/>
+              <w:sz w:val="24"/>
+              <w:szCs w:val="24"/>
+            </w:rPr>
+            <w:lastRenderedPageBreak/>
+            <m:t>= O</m:t>
+          </m:r>
+          <m:r>
+            <w:rPr>
+              <w:rFonts w:ascii="Cambria Math" w:hAnsi="Times" w:cs="Times"/>
+              <w:sz w:val="24"/>
+              <w:szCs w:val="24"/>
+            </w:rPr>
+            <m:t>(</m:t>
+          </m:r>
+          <m:r>
+            <w:rPr>
+              <w:rFonts w:ascii="Cambria Math" w:hAnsi="Cambria Math" w:cs="Times"/>
+              <w:sz w:val="24"/>
+              <w:szCs w:val="24"/>
+            </w:rPr>
+            <m:t>n</m:t>
+          </m:r>
+          <m:func>
+            <m:funcPr>
+              <m:ctrlPr>
+                <w:rPr>
+                  <w:rFonts w:ascii="Cambria Math" w:hAnsi="Times" w:cs="Times"/>
+                  <w:i/>
+                  <w:sz w:val="24"/>
+                  <w:szCs w:val="24"/>
+                </w:rPr>
+              </m:ctrlPr>
+            </m:funcPr>
+            <m:fName>
+              <m:r>
+                <m:rPr>
+                  <m:sty m:val="p"/>
+                </m:rPr>
+                <w:rPr>
+                  <w:rFonts w:ascii="Cambria Math" w:hAnsi="Times" w:cs="Times"/>
+                  <w:sz w:val="24"/>
+                  <w:szCs w:val="24"/>
+                </w:rPr>
+                <m:t>log</m:t>
+              </m:r>
+            </m:fName>
+            <m:e>
+              <m:r>
+                <w:rPr>
+                  <w:rFonts w:ascii="Cambria Math" w:hAnsi="Cambria Math" w:cs="Times"/>
+                  <w:sz w:val="24"/>
+                  <w:szCs w:val="24"/>
+                </w:rPr>
+                <m:t>n</m:t>
+              </m:r>
+              <m:r>
+                <w:rPr>
+                  <w:rFonts w:ascii="Cambria Math" w:hAnsi="Times" w:cs="Times"/>
+                  <w:sz w:val="24"/>
+                  <w:szCs w:val="24"/>
+                </w:rPr>
+                <m:t>)</m:t>
+              </m:r>
+            </m:e>
+          </m:func>
+        </m:oMath>
+      </m:oMathPara>
+    </w:p>
+    <w:p>
+      <w:pPr>
         <w:spacing w:line="480" w:lineRule="auto"/>
         <w:ind w:left="720"/>
+        <w:jc w:val="both"/>
         <w:rPr>
           <w:rFonts w:ascii="Times" w:eastAsiaTheme="minorEastAsia" w:hAnsi="Times" w:cs="Times"/>
           <w:sz w:val="24"/>
@@ -4125,6 +5908,7 @@
     <w:p>
       <w:pPr>
         <w:pStyle w:val="Ttulo2"/>
+        <w:jc w:val="both"/>
         <w:rPr>
           <w:rFonts w:ascii="Times" w:hAnsi="Times" w:cs="Times"/>
           <w:sz w:val="24"/>
@@ -4152,51 +5936,29 @@
     </w:p>
     <w:p>
       <w:pPr>
-        <w:pStyle w:val="Ttulo2"/>
-        <w:rPr>
-          <w:rFonts w:ascii="Times" w:hAnsi="Times" w:cs="Times"/>
-          <w:sz w:val="24"/>
-          <w:szCs w:val="24"/>
-        </w:rPr>
-      </w:pPr>
-      <w:bookmarkStart w:id="8" w:name="_Toc199934945"/>
-      <w:r>
-        <w:rPr>
-          <w:rFonts w:ascii="Times" w:hAnsi="Times" w:cs="Times"/>
-          <w:sz w:val="24"/>
-          <w:szCs w:val="24"/>
-        </w:rPr>
-        <w:t>Explicar se o algoritmo é ou não estável.</w:t>
-      </w:r>
-      <w:bookmarkEnd w:id="8"/>
-      <w:r>
-        <w:rPr>
-          <w:rFonts w:ascii="Times" w:hAnsi="Times" w:cs="Times"/>
-          <w:sz w:val="24"/>
-          <w:szCs w:val="24"/>
-        </w:rPr>
-        <w:t xml:space="preserve"> </w:t>
-      </w:r>
+        <w:jc w:val="both"/>
+      </w:pPr>
     </w:p>
     <w:p>
       <w:pPr>
         <w:pStyle w:val="Ttulo2"/>
-        <w:rPr>
-          <w:rFonts w:ascii="Times" w:hAnsi="Times" w:cs="Times"/>
-          <w:sz w:val="24"/>
-          <w:szCs w:val="24"/>
-        </w:rPr>
-      </w:pPr>
-      <w:bookmarkStart w:id="9" w:name="_Toc199934946"/>
-      <w:r>
-        <w:rPr>
-          <w:rFonts w:ascii="Times" w:hAnsi="Times" w:cs="Times"/>
-          <w:sz w:val="24"/>
-          <w:szCs w:val="24"/>
-        </w:rPr>
-        <w:t>Limitações do algoritmo.</w:t>
-      </w:r>
-      <w:bookmarkEnd w:id="9"/>
+        <w:jc w:val="both"/>
+        <w:rPr>
+          <w:rFonts w:ascii="Times" w:hAnsi="Times" w:cs="Times"/>
+          <w:sz w:val="24"/>
+          <w:szCs w:val="24"/>
+        </w:rPr>
+      </w:pPr>
+      <w:bookmarkStart w:id="8" w:name="_Toc199934945"/>
+      <w:r>
+        <w:rPr>
+          <w:rFonts w:ascii="Times" w:hAnsi="Times" w:cs="Times"/>
+          <w:sz w:val="24"/>
+          <w:szCs w:val="24"/>
+        </w:rPr>
+        <w:t>Explicar se o algoritmo é ou não estável.</w:t>
+      </w:r>
+      <w:bookmarkEnd w:id="8"/>
       <w:r>
         <w:rPr>
           <w:rFonts w:ascii="Times" w:hAnsi="Times" w:cs="Times"/>
@@ -4209,44 +5971,102 @@
     <w:p>
       <w:pPr>
         <w:pStyle w:val="Ttulo2"/>
-        <w:rPr>
-          <w:rFonts w:ascii="Times" w:hAnsi="Times" w:cs="Times"/>
-          <w:sz w:val="24"/>
-          <w:szCs w:val="24"/>
-        </w:rPr>
-      </w:pPr>
-      <w:bookmarkStart w:id="10" w:name="_Toc199934947"/>
-      <w:proofErr w:type="gramStart"/>
-      <w:r>
-        <w:rPr>
-          <w:rFonts w:ascii="Times" w:hAnsi="Times" w:cs="Times"/>
-          <w:sz w:val="24"/>
-          <w:szCs w:val="24"/>
-        </w:rPr>
-        <w:t>Exemplos de como o processo de ordenação acontece</w:t>
-      </w:r>
-      <w:proofErr w:type="gramEnd"/>
-      <w:r>
-        <w:rPr>
-          <w:rFonts w:ascii="Times" w:hAnsi="Times" w:cs="Times"/>
-          <w:sz w:val="24"/>
-          <w:szCs w:val="24"/>
-        </w:rPr>
-        <w:t>.</w:t>
-      </w:r>
-      <w:bookmarkEnd w:id="10"/>
-      <w:r>
-        <w:rPr>
-          <w:rFonts w:ascii="Times" w:hAnsi="Times" w:cs="Times"/>
-          <w:sz w:val="24"/>
-          <w:szCs w:val="24"/>
-        </w:rPr>
-        <w:t xml:space="preserve"> </w:t>
-      </w:r>
+        <w:jc w:val="both"/>
+        <w:rPr>
+          <w:rFonts w:ascii="Times" w:hAnsi="Times" w:cs="Times"/>
+          <w:sz w:val="24"/>
+          <w:szCs w:val="24"/>
+        </w:rPr>
+      </w:pPr>
+      <w:bookmarkStart w:id="9" w:name="_Toc199934946"/>
     </w:p>
     <w:p>
       <w:pPr>
         <w:pStyle w:val="Ttulo2"/>
+        <w:jc w:val="both"/>
+        <w:rPr>
+          <w:rFonts w:ascii="Times" w:hAnsi="Times" w:cs="Times"/>
+          <w:sz w:val="24"/>
+          <w:szCs w:val="24"/>
+        </w:rPr>
+      </w:pPr>
+      <w:r>
+        <w:rPr>
+          <w:rFonts w:ascii="Times" w:hAnsi="Times" w:cs="Times"/>
+          <w:sz w:val="24"/>
+          <w:szCs w:val="24"/>
+        </w:rPr>
+        <w:t>Limitações do algoritmo.</w:t>
+      </w:r>
+      <w:bookmarkEnd w:id="9"/>
+      <w:r>
+        <w:rPr>
+          <w:rFonts w:ascii="Times" w:hAnsi="Times" w:cs="Times"/>
+          <w:sz w:val="24"/>
+          <w:szCs w:val="24"/>
+        </w:rPr>
+        <w:t xml:space="preserve"> </w:t>
+      </w:r>
+    </w:p>
+    <w:p>
+      <w:pPr>
+        <w:pStyle w:val="Ttulo2"/>
+        <w:jc w:val="both"/>
+        <w:rPr>
+          <w:rFonts w:ascii="Times" w:hAnsi="Times" w:cs="Times"/>
+          <w:sz w:val="24"/>
+          <w:szCs w:val="24"/>
+        </w:rPr>
+      </w:pPr>
+      <w:bookmarkStart w:id="10" w:name="_Toc199934947"/>
+    </w:p>
+    <w:p>
+      <w:pPr>
+        <w:pStyle w:val="Ttulo2"/>
+        <w:jc w:val="both"/>
+        <w:rPr>
+          <w:rFonts w:ascii="Times" w:hAnsi="Times" w:cs="Times"/>
+          <w:sz w:val="24"/>
+          <w:szCs w:val="24"/>
+        </w:rPr>
+      </w:pPr>
+      <w:proofErr w:type="gramStart"/>
+      <w:r>
+        <w:rPr>
+          <w:rFonts w:ascii="Times" w:hAnsi="Times" w:cs="Times"/>
+          <w:sz w:val="24"/>
+          <w:szCs w:val="24"/>
+        </w:rPr>
+        <w:t>Exemplos de como o processo de ordenação acontece</w:t>
+      </w:r>
+      <w:proofErr w:type="gramEnd"/>
+      <w:r>
+        <w:rPr>
+          <w:rFonts w:ascii="Times" w:hAnsi="Times" w:cs="Times"/>
+          <w:sz w:val="24"/>
+          <w:szCs w:val="24"/>
+        </w:rPr>
+        <w:t>.</w:t>
+      </w:r>
+      <w:bookmarkEnd w:id="10"/>
+      <w:r>
+        <w:rPr>
+          <w:rFonts w:ascii="Times" w:hAnsi="Times" w:cs="Times"/>
+          <w:sz w:val="24"/>
+          <w:szCs w:val="24"/>
+        </w:rPr>
+        <w:t xml:space="preserve"> </w:t>
+      </w:r>
+    </w:p>
+    <w:p>
+      <w:pPr>
+        <w:jc w:val="both"/>
+      </w:pPr>
+    </w:p>
+    <w:p>
+      <w:pPr>
+        <w:pStyle w:val="Ttulo2"/>
+        <w:jc w:val="both"/>
         <w:rPr>
           <w:rFonts w:ascii="Times" w:hAnsi="Times" w:cs="Times"/>
           <w:sz w:val="24"/>
@@ -4271,6 +6091,7 @@
           <w:ilvl w:val="0"/>
           <w:numId w:val="2"/>
         </w:numPr>
+        <w:jc w:val="both"/>
         <w:rPr>
           <w:rFonts w:ascii="Times" w:hAnsi="Times" w:cs="Times"/>
           <w:sz w:val="24"/>
@@ -4301,6 +6122,7 @@
     <w:p>
       <w:pPr>
         <w:pStyle w:val="Ttulo2"/>
+        <w:jc w:val="both"/>
         <w:rPr>
           <w:rFonts w:ascii="Times" w:hAnsi="Times" w:cs="Times"/>
           <w:sz w:val="24"/>
@@ -4347,6 +6169,7 @@
     <w:p>
       <w:pPr>
         <w:pStyle w:val="Ttulo2"/>
+        <w:jc w:val="both"/>
         <w:rPr>
           <w:rFonts w:ascii="Times" w:hAnsi="Times" w:cs="Times"/>
           <w:sz w:val="24"/>
@@ -4375,6 +6198,7 @@
     <w:p>
       <w:pPr>
         <w:pStyle w:val="Ttulo2"/>
+        <w:jc w:val="both"/>
         <w:rPr>
           <w:rFonts w:ascii="Times" w:hAnsi="Times" w:cs="Times"/>
           <w:sz w:val="24"/>
@@ -4399,6 +6223,7 @@
           <w:ilvl w:val="0"/>
           <w:numId w:val="2"/>
         </w:numPr>
+        <w:jc w:val="both"/>
         <w:rPr>
           <w:rFonts w:ascii="Times" w:hAnsi="Times" w:cs="Times"/>
           <w:sz w:val="24"/>
@@ -4419,6 +6244,7 @@
     <w:p>
       <w:pPr>
         <w:pStyle w:val="Ttulo2"/>
+        <w:jc w:val="both"/>
         <w:rPr>
           <w:rFonts w:ascii="Times" w:hAnsi="Times" w:cs="Times"/>
           <w:sz w:val="24"/>
@@ -4447,6 +6273,7 @@
     <w:p>
       <w:pPr>
         <w:pStyle w:val="Ttulo2"/>
+        <w:jc w:val="both"/>
         <w:rPr>
           <w:rFonts w:ascii="Times" w:hAnsi="Times" w:cs="Times"/>
           <w:sz w:val="24"/>
@@ -4499,6 +6326,11 @@
         <w:t xml:space="preserve"> disponível na linguagem C.</w:t>
       </w:r>
       <w:bookmarkEnd w:id="18"/>
+    </w:p>
+    <w:p>
+      <w:pPr>
+        <w:jc w:val="both"/>
+      </w:pPr>
     </w:p>
     <w:p>
       <w:pPr>
@@ -4507,6 +6339,7 @@
           <w:ilvl w:val="0"/>
           <w:numId w:val="2"/>
         </w:numPr>
+        <w:jc w:val="both"/>
         <w:rPr>
           <w:rFonts w:ascii="Times" w:hAnsi="Times" w:cs="Times"/>
           <w:sz w:val="24"/>
@@ -4528,6 +6361,7 @@
       <w:pPr>
         <w:pStyle w:val="PargrafodaLista"/>
         <w:spacing w:line="480" w:lineRule="auto"/>
+        <w:jc w:val="both"/>
         <w:rPr>
           <w:rFonts w:ascii="Times" w:hAnsi="Times" w:cs="Times"/>
           <w:sz w:val="24"/>
@@ -4557,6 +6391,7 @@
       <w:pPr>
         <w:pStyle w:val="PargrafodaLista"/>
         <w:spacing w:line="480" w:lineRule="auto"/>
+        <w:jc w:val="both"/>
         <w:rPr>
           <w:rFonts w:ascii="Times" w:hAnsi="Times" w:cs="Times"/>
           <w:sz w:val="24"/>
@@ -4568,6 +6403,7 @@
       <w:pPr>
         <w:pStyle w:val="PargrafodaLista"/>
         <w:spacing w:line="480" w:lineRule="auto"/>
+        <w:jc w:val="both"/>
         <w:rPr>
           <w:rFonts w:ascii="Times" w:hAnsi="Times" w:cs="Times"/>
           <w:sz w:val="24"/>
@@ -4701,6 +6537,7 @@
       <w:pPr>
         <w:pStyle w:val="PargrafodaLista"/>
         <w:spacing w:line="480" w:lineRule="auto"/>
+        <w:jc w:val="both"/>
         <w:rPr>
           <w:rFonts w:ascii="Times" w:hAnsi="Times" w:cs="Times"/>
           <w:sz w:val="24"/>
@@ -4796,6 +6633,7 @@
       <w:pPr>
         <w:pStyle w:val="PargrafodaLista"/>
         <w:spacing w:line="480" w:lineRule="auto"/>
+        <w:jc w:val="both"/>
         <w:rPr>
           <w:rFonts w:ascii="Times" w:hAnsi="Times" w:cs="Times"/>
           <w:sz w:val="24"/>
@@ -4911,6 +6749,7 @@
       <w:pPr>
         <w:pStyle w:val="PargrafodaLista"/>
         <w:spacing w:line="480" w:lineRule="auto"/>
+        <w:jc w:val="both"/>
         <w:rPr>
           <w:rFonts w:ascii="Times" w:hAnsi="Times" w:cs="Times"/>
           <w:sz w:val="24"/>
@@ -5006,6 +6845,7 @@
       <w:pPr>
         <w:pStyle w:val="PargrafodaLista"/>
         <w:spacing w:line="480" w:lineRule="auto"/>
+        <w:jc w:val="both"/>
         <w:rPr>
           <w:rFonts w:ascii="Times" w:hAnsi="Times" w:cs="Times"/>
           <w:sz w:val="24"/>
@@ -5034,9 +6874,9 @@
 <file path=word/numbering.xml><?xml version="1.0" encoding="utf-8"?>
 <w:numbering xmlns:ve="http://schemas.openxmlformats.org/markup-compatibility/2006" xmlns:o="urn:schemas-microsoft-com:office:office" xmlns:r="http://schemas.openxmlformats.org/officeDocument/2006/relationships" xmlns:m="http://schemas.openxmlformats.org/officeDocument/2006/math" xmlns:v="urn:schemas-microsoft-com:vml" xmlns:wp="http://schemas.openxmlformats.org/drawingml/2006/wordprocessingDrawing" xmlns:w10="urn:schemas-microsoft-com:office:word" xmlns:w="http://schemas.openxmlformats.org/wordprocessingml/2006/main" xmlns:wne="http://schemas.microsoft.com/office/word/2006/wordml">
   <w:abstractNum w:abstractNumId="0">
-    <w:nsid w:val="15C1326F"/>
+    <w:nsid w:val="151735AB"/>
     <w:multiLevelType w:val="hybridMultilevel"/>
-    <w:tmpl w:val="A7D06106"/>
+    <w:tmpl w:val="200276DA"/>
     <w:lvl w:ilvl="0" w:tplc="A16AEFAE">
       <w:numFmt w:val="bullet"/>
       <w:lvlText w:val=""/>
@@ -5046,6 +6886,317 @@
       </w:pPr>
       <w:rPr>
         <w:rFonts w:ascii="Symbol" w:eastAsiaTheme="minorHAnsi" w:hAnsi="Symbol" w:cs="Times" w:hint="default"/>
+      </w:rPr>
+    </w:lvl>
+    <w:lvl w:ilvl="1" w:tplc="0416000F">
+      <w:start w:val="1"/>
+      <w:numFmt w:val="decimal"/>
+      <w:lvlText w:val="%2."/>
+      <w:lvlJc w:val="left"/>
+      <w:pPr>
+        <w:ind w:left="1800" w:hanging="360"/>
+      </w:pPr>
+      <w:rPr>
+        <w:rFonts w:hint="default"/>
+      </w:rPr>
+    </w:lvl>
+    <w:lvl w:ilvl="2" w:tplc="04160005">
+      <w:start w:val="1"/>
+      <w:numFmt w:val="bullet"/>
+      <w:lvlText w:val=""/>
+      <w:lvlJc w:val="left"/>
+      <w:pPr>
+        <w:ind w:left="2520" w:hanging="360"/>
+      </w:pPr>
+      <w:rPr>
+        <w:rFonts w:ascii="Wingdings" w:hAnsi="Wingdings" w:hint="default"/>
+      </w:rPr>
+    </w:lvl>
+    <w:lvl w:ilvl="3" w:tplc="04160001" w:tentative="1">
+      <w:start w:val="1"/>
+      <w:numFmt w:val="bullet"/>
+      <w:lvlText w:val=""/>
+      <w:lvlJc w:val="left"/>
+      <w:pPr>
+        <w:ind w:left="3240" w:hanging="360"/>
+      </w:pPr>
+      <w:rPr>
+        <w:rFonts w:ascii="Symbol" w:hAnsi="Symbol" w:hint="default"/>
+      </w:rPr>
+    </w:lvl>
+    <w:lvl w:ilvl="4" w:tplc="04160003" w:tentative="1">
+      <w:start w:val="1"/>
+      <w:numFmt w:val="bullet"/>
+      <w:lvlText w:val="o"/>
+      <w:lvlJc w:val="left"/>
+      <w:pPr>
+        <w:ind w:left="3960" w:hanging="360"/>
+      </w:pPr>
+      <w:rPr>
+        <w:rFonts w:ascii="Courier New" w:hAnsi="Courier New" w:cs="Courier New" w:hint="default"/>
+      </w:rPr>
+    </w:lvl>
+    <w:lvl w:ilvl="5" w:tplc="04160005" w:tentative="1">
+      <w:start w:val="1"/>
+      <w:numFmt w:val="bullet"/>
+      <w:lvlText w:val=""/>
+      <w:lvlJc w:val="left"/>
+      <w:pPr>
+        <w:ind w:left="4680" w:hanging="360"/>
+      </w:pPr>
+      <w:rPr>
+        <w:rFonts w:ascii="Wingdings" w:hAnsi="Wingdings" w:hint="default"/>
+      </w:rPr>
+    </w:lvl>
+    <w:lvl w:ilvl="6" w:tplc="04160001" w:tentative="1">
+      <w:start w:val="1"/>
+      <w:numFmt w:val="bullet"/>
+      <w:lvlText w:val=""/>
+      <w:lvlJc w:val="left"/>
+      <w:pPr>
+        <w:ind w:left="5400" w:hanging="360"/>
+      </w:pPr>
+      <w:rPr>
+        <w:rFonts w:ascii="Symbol" w:hAnsi="Symbol" w:hint="default"/>
+      </w:rPr>
+    </w:lvl>
+    <w:lvl w:ilvl="7" w:tplc="04160003" w:tentative="1">
+      <w:start w:val="1"/>
+      <w:numFmt w:val="bullet"/>
+      <w:lvlText w:val="o"/>
+      <w:lvlJc w:val="left"/>
+      <w:pPr>
+        <w:ind w:left="6120" w:hanging="360"/>
+      </w:pPr>
+      <w:rPr>
+        <w:rFonts w:ascii="Courier New" w:hAnsi="Courier New" w:cs="Courier New" w:hint="default"/>
+      </w:rPr>
+    </w:lvl>
+    <w:lvl w:ilvl="8" w:tplc="04160005" w:tentative="1">
+      <w:start w:val="1"/>
+      <w:numFmt w:val="bullet"/>
+      <w:lvlText w:val=""/>
+      <w:lvlJc w:val="left"/>
+      <w:pPr>
+        <w:ind w:left="6840" w:hanging="360"/>
+      </w:pPr>
+      <w:rPr>
+        <w:rFonts w:ascii="Wingdings" w:hAnsi="Wingdings" w:hint="default"/>
+      </w:rPr>
+    </w:lvl>
+  </w:abstractNum>
+  <w:abstractNum w:abstractNumId="1">
+    <w:nsid w:val="15C1326F"/>
+    <w:multiLevelType w:val="hybridMultilevel"/>
+    <w:tmpl w:val="DD62BD38"/>
+    <w:lvl w:ilvl="0" w:tplc="A16AEFAE">
+      <w:numFmt w:val="bullet"/>
+      <w:lvlText w:val=""/>
+      <w:lvlJc w:val="left"/>
+      <w:pPr>
+        <w:ind w:left="1080" w:hanging="360"/>
+      </w:pPr>
+      <w:rPr>
+        <w:rFonts w:ascii="Symbol" w:eastAsiaTheme="minorHAnsi" w:hAnsi="Symbol" w:cs="Times" w:hint="default"/>
+      </w:rPr>
+    </w:lvl>
+    <w:lvl w:ilvl="1" w:tplc="04160003">
+      <w:start w:val="1"/>
+      <w:numFmt w:val="bullet"/>
+      <w:lvlText w:val="o"/>
+      <w:lvlJc w:val="left"/>
+      <w:pPr>
+        <w:ind w:left="1800" w:hanging="360"/>
+      </w:pPr>
+      <w:rPr>
+        <w:rFonts w:ascii="Courier New" w:hAnsi="Courier New" w:cs="Courier New" w:hint="default"/>
+      </w:rPr>
+    </w:lvl>
+    <w:lvl w:ilvl="2" w:tplc="04160005">
+      <w:start w:val="1"/>
+      <w:numFmt w:val="bullet"/>
+      <w:lvlText w:val=""/>
+      <w:lvlJc w:val="left"/>
+      <w:pPr>
+        <w:ind w:left="2520" w:hanging="360"/>
+      </w:pPr>
+      <w:rPr>
+        <w:rFonts w:ascii="Wingdings" w:hAnsi="Wingdings" w:hint="default"/>
+      </w:rPr>
+    </w:lvl>
+    <w:lvl w:ilvl="3" w:tplc="04160001" w:tentative="1">
+      <w:start w:val="1"/>
+      <w:numFmt w:val="bullet"/>
+      <w:lvlText w:val=""/>
+      <w:lvlJc w:val="left"/>
+      <w:pPr>
+        <w:ind w:left="3240" w:hanging="360"/>
+      </w:pPr>
+      <w:rPr>
+        <w:rFonts w:ascii="Symbol" w:hAnsi="Symbol" w:hint="default"/>
+      </w:rPr>
+    </w:lvl>
+    <w:lvl w:ilvl="4" w:tplc="04160003" w:tentative="1">
+      <w:start w:val="1"/>
+      <w:numFmt w:val="bullet"/>
+      <w:lvlText w:val="o"/>
+      <w:lvlJc w:val="left"/>
+      <w:pPr>
+        <w:ind w:left="3960" w:hanging="360"/>
+      </w:pPr>
+      <w:rPr>
+        <w:rFonts w:ascii="Courier New" w:hAnsi="Courier New" w:cs="Courier New" w:hint="default"/>
+      </w:rPr>
+    </w:lvl>
+    <w:lvl w:ilvl="5" w:tplc="04160005" w:tentative="1">
+      <w:start w:val="1"/>
+      <w:numFmt w:val="bullet"/>
+      <w:lvlText w:val=""/>
+      <w:lvlJc w:val="left"/>
+      <w:pPr>
+        <w:ind w:left="4680" w:hanging="360"/>
+      </w:pPr>
+      <w:rPr>
+        <w:rFonts w:ascii="Wingdings" w:hAnsi="Wingdings" w:hint="default"/>
+      </w:rPr>
+    </w:lvl>
+    <w:lvl w:ilvl="6" w:tplc="04160001" w:tentative="1">
+      <w:start w:val="1"/>
+      <w:numFmt w:val="bullet"/>
+      <w:lvlText w:val=""/>
+      <w:lvlJc w:val="left"/>
+      <w:pPr>
+        <w:ind w:left="5400" w:hanging="360"/>
+      </w:pPr>
+      <w:rPr>
+        <w:rFonts w:ascii="Symbol" w:hAnsi="Symbol" w:hint="default"/>
+      </w:rPr>
+    </w:lvl>
+    <w:lvl w:ilvl="7" w:tplc="04160003" w:tentative="1">
+      <w:start w:val="1"/>
+      <w:numFmt w:val="bullet"/>
+      <w:lvlText w:val="o"/>
+      <w:lvlJc w:val="left"/>
+      <w:pPr>
+        <w:ind w:left="6120" w:hanging="360"/>
+      </w:pPr>
+      <w:rPr>
+        <w:rFonts w:ascii="Courier New" w:hAnsi="Courier New" w:cs="Courier New" w:hint="default"/>
+      </w:rPr>
+    </w:lvl>
+    <w:lvl w:ilvl="8" w:tplc="04160005" w:tentative="1">
+      <w:start w:val="1"/>
+      <w:numFmt w:val="bullet"/>
+      <w:lvlText w:val=""/>
+      <w:lvlJc w:val="left"/>
+      <w:pPr>
+        <w:ind w:left="6840" w:hanging="360"/>
+      </w:pPr>
+      <w:rPr>
+        <w:rFonts w:ascii="Wingdings" w:hAnsi="Wingdings" w:hint="default"/>
+      </w:rPr>
+    </w:lvl>
+  </w:abstractNum>
+  <w:abstractNum w:abstractNumId="2">
+    <w:nsid w:val="393F5EB5"/>
+    <w:multiLevelType w:val="hybridMultilevel"/>
+    <w:tmpl w:val="219E11D0"/>
+    <w:lvl w:ilvl="0" w:tplc="0416000F">
+      <w:start w:val="1"/>
+      <w:numFmt w:val="decimal"/>
+      <w:lvlText w:val="%1."/>
+      <w:lvlJc w:val="left"/>
+      <w:pPr>
+        <w:ind w:left="720" w:hanging="360"/>
+      </w:pPr>
+    </w:lvl>
+    <w:lvl w:ilvl="1" w:tplc="04160019" w:tentative="1">
+      <w:start w:val="1"/>
+      <w:numFmt w:val="lowerLetter"/>
+      <w:lvlText w:val="%2."/>
+      <w:lvlJc w:val="left"/>
+      <w:pPr>
+        <w:ind w:left="1440" w:hanging="360"/>
+      </w:pPr>
+    </w:lvl>
+    <w:lvl w:ilvl="2" w:tplc="0416001B" w:tentative="1">
+      <w:start w:val="1"/>
+      <w:numFmt w:val="lowerRoman"/>
+      <w:lvlText w:val="%3."/>
+      <w:lvlJc w:val="right"/>
+      <w:pPr>
+        <w:ind w:left="2160" w:hanging="180"/>
+      </w:pPr>
+    </w:lvl>
+    <w:lvl w:ilvl="3" w:tplc="0416000F" w:tentative="1">
+      <w:start w:val="1"/>
+      <w:numFmt w:val="decimal"/>
+      <w:lvlText w:val="%4."/>
+      <w:lvlJc w:val="left"/>
+      <w:pPr>
+        <w:ind w:left="2880" w:hanging="360"/>
+      </w:pPr>
+    </w:lvl>
+    <w:lvl w:ilvl="4" w:tplc="04160019" w:tentative="1">
+      <w:start w:val="1"/>
+      <w:numFmt w:val="lowerLetter"/>
+      <w:lvlText w:val="%5."/>
+      <w:lvlJc w:val="left"/>
+      <w:pPr>
+        <w:ind w:left="3600" w:hanging="360"/>
+      </w:pPr>
+    </w:lvl>
+    <w:lvl w:ilvl="5" w:tplc="0416001B" w:tentative="1">
+      <w:start w:val="1"/>
+      <w:numFmt w:val="lowerRoman"/>
+      <w:lvlText w:val="%6."/>
+      <w:lvlJc w:val="right"/>
+      <w:pPr>
+        <w:ind w:left="4320" w:hanging="180"/>
+      </w:pPr>
+    </w:lvl>
+    <w:lvl w:ilvl="6" w:tplc="0416000F" w:tentative="1">
+      <w:start w:val="1"/>
+      <w:numFmt w:val="decimal"/>
+      <w:lvlText w:val="%7."/>
+      <w:lvlJc w:val="left"/>
+      <w:pPr>
+        <w:ind w:left="5040" w:hanging="360"/>
+      </w:pPr>
+    </w:lvl>
+    <w:lvl w:ilvl="7" w:tplc="04160019" w:tentative="1">
+      <w:start w:val="1"/>
+      <w:numFmt w:val="lowerLetter"/>
+      <w:lvlText w:val="%8."/>
+      <w:lvlJc w:val="left"/>
+      <w:pPr>
+        <w:ind w:left="5760" w:hanging="360"/>
+      </w:pPr>
+    </w:lvl>
+    <w:lvl w:ilvl="8" w:tplc="0416001B" w:tentative="1">
+      <w:start w:val="1"/>
+      <w:numFmt w:val="lowerRoman"/>
+      <w:lvlText w:val="%9."/>
+      <w:lvlJc w:val="right"/>
+      <w:pPr>
+        <w:ind w:left="6480" w:hanging="180"/>
+      </w:pPr>
+    </w:lvl>
+  </w:abstractNum>
+  <w:abstractNum w:abstractNumId="3">
+    <w:nsid w:val="502A13C4"/>
+    <w:multiLevelType w:val="hybridMultilevel"/>
+    <w:tmpl w:val="11E60866"/>
+    <w:lvl w:ilvl="0" w:tplc="04160001">
+      <w:start w:val="1"/>
+      <w:numFmt w:val="bullet"/>
+      <w:lvlText w:val=""/>
+      <w:lvlJc w:val="left"/>
+      <w:pPr>
+        <w:ind w:left="1440" w:hanging="360"/>
+      </w:pPr>
+      <w:rPr>
+        <w:rFonts w:ascii="Symbol" w:hAnsi="Symbol" w:hint="default"/>
       </w:rPr>
     </w:lvl>
     <w:lvl w:ilvl="1" w:tplc="04160003" w:tentative="1">
@@ -5054,7 +7205,7 @@
       <w:lvlText w:val="o"/>
       <w:lvlJc w:val="left"/>
       <w:pPr>
-        <w:ind w:left="1800" w:hanging="360"/>
+        <w:ind w:left="2160" w:hanging="360"/>
       </w:pPr>
       <w:rPr>
         <w:rFonts w:ascii="Courier New" w:hAnsi="Courier New" w:cs="Courier New" w:hint="default"/>
@@ -5066,7 +7217,7 @@
       <w:lvlText w:val=""/>
       <w:lvlJc w:val="left"/>
       <w:pPr>
-        <w:ind w:left="2520" w:hanging="360"/>
+        <w:ind w:left="2880" w:hanging="360"/>
       </w:pPr>
       <w:rPr>
         <w:rFonts w:ascii="Wingdings" w:hAnsi="Wingdings" w:hint="default"/>
@@ -5078,7 +7229,7 @@
       <w:lvlText w:val=""/>
       <w:lvlJc w:val="left"/>
       <w:pPr>
-        <w:ind w:left="3240" w:hanging="360"/>
+        <w:ind w:left="3600" w:hanging="360"/>
       </w:pPr>
       <w:rPr>
         <w:rFonts w:ascii="Symbol" w:hAnsi="Symbol" w:hint="default"/>
@@ -5090,7 +7241,7 @@
       <w:lvlText w:val="o"/>
       <w:lvlJc w:val="left"/>
       <w:pPr>
-        <w:ind w:left="3960" w:hanging="360"/>
+        <w:ind w:left="4320" w:hanging="360"/>
       </w:pPr>
       <w:rPr>
         <w:rFonts w:ascii="Courier New" w:hAnsi="Courier New" w:cs="Courier New" w:hint="default"/>
@@ -5102,7 +7253,7 @@
       <w:lvlText w:val=""/>
       <w:lvlJc w:val="left"/>
       <w:pPr>
-        <w:ind w:left="4680" w:hanging="360"/>
+        <w:ind w:left="5040" w:hanging="360"/>
       </w:pPr>
       <w:rPr>
         <w:rFonts w:ascii="Wingdings" w:hAnsi="Wingdings" w:hint="default"/>
@@ -5114,7 +7265,7 @@
       <w:lvlText w:val=""/>
       <w:lvlJc w:val="left"/>
       <w:pPr>
-        <w:ind w:left="5400" w:hanging="360"/>
+        <w:ind w:left="5760" w:hanging="360"/>
       </w:pPr>
       <w:rPr>
         <w:rFonts w:ascii="Symbol" w:hAnsi="Symbol" w:hint="default"/>
@@ -5126,7 +7277,7 @@
       <w:lvlText w:val="o"/>
       <w:lvlJc w:val="left"/>
       <w:pPr>
-        <w:ind w:left="6120" w:hanging="360"/>
+        <w:ind w:left="6480" w:hanging="360"/>
       </w:pPr>
       <w:rPr>
         <w:rFonts w:ascii="Courier New" w:hAnsi="Courier New" w:cs="Courier New" w:hint="default"/>
@@ -5138,213 +7289,14 @@
       <w:lvlText w:val=""/>
       <w:lvlJc w:val="left"/>
       <w:pPr>
-        <w:ind w:left="6840" w:hanging="360"/>
+        <w:ind w:left="7200" w:hanging="360"/>
       </w:pPr>
       <w:rPr>
         <w:rFonts w:ascii="Wingdings" w:hAnsi="Wingdings" w:hint="default"/>
       </w:rPr>
     </w:lvl>
   </w:abstractNum>
-  <w:abstractNum w:abstractNumId="1">
-    <w:nsid w:val="393F5EB5"/>
-    <w:multiLevelType w:val="hybridMultilevel"/>
-    <w:tmpl w:val="219E11D0"/>
-    <w:lvl w:ilvl="0" w:tplc="0416000F">
-      <w:start w:val="1"/>
-      <w:numFmt w:val="decimal"/>
-      <w:lvlText w:val="%1."/>
-      <w:lvlJc w:val="left"/>
-      <w:pPr>
-        <w:ind w:left="720" w:hanging="360"/>
-      </w:pPr>
-    </w:lvl>
-    <w:lvl w:ilvl="1" w:tplc="04160019" w:tentative="1">
-      <w:start w:val="1"/>
-      <w:numFmt w:val="lowerLetter"/>
-      <w:lvlText w:val="%2."/>
-      <w:lvlJc w:val="left"/>
-      <w:pPr>
-        <w:ind w:left="1440" w:hanging="360"/>
-      </w:pPr>
-    </w:lvl>
-    <w:lvl w:ilvl="2" w:tplc="0416001B" w:tentative="1">
-      <w:start w:val="1"/>
-      <w:numFmt w:val="lowerRoman"/>
-      <w:lvlText w:val="%3."/>
-      <w:lvlJc w:val="right"/>
-      <w:pPr>
-        <w:ind w:left="2160" w:hanging="180"/>
-      </w:pPr>
-    </w:lvl>
-    <w:lvl w:ilvl="3" w:tplc="0416000F" w:tentative="1">
-      <w:start w:val="1"/>
-      <w:numFmt w:val="decimal"/>
-      <w:lvlText w:val="%4."/>
-      <w:lvlJc w:val="left"/>
-      <w:pPr>
-        <w:ind w:left="2880" w:hanging="360"/>
-      </w:pPr>
-    </w:lvl>
-    <w:lvl w:ilvl="4" w:tplc="04160019" w:tentative="1">
-      <w:start w:val="1"/>
-      <w:numFmt w:val="lowerLetter"/>
-      <w:lvlText w:val="%5."/>
-      <w:lvlJc w:val="left"/>
-      <w:pPr>
-        <w:ind w:left="3600" w:hanging="360"/>
-      </w:pPr>
-    </w:lvl>
-    <w:lvl w:ilvl="5" w:tplc="0416001B" w:tentative="1">
-      <w:start w:val="1"/>
-      <w:numFmt w:val="lowerRoman"/>
-      <w:lvlText w:val="%6."/>
-      <w:lvlJc w:val="right"/>
-      <w:pPr>
-        <w:ind w:left="4320" w:hanging="180"/>
-      </w:pPr>
-    </w:lvl>
-    <w:lvl w:ilvl="6" w:tplc="0416000F" w:tentative="1">
-      <w:start w:val="1"/>
-      <w:numFmt w:val="decimal"/>
-      <w:lvlText w:val="%7."/>
-      <w:lvlJc w:val="left"/>
-      <w:pPr>
-        <w:ind w:left="5040" w:hanging="360"/>
-      </w:pPr>
-    </w:lvl>
-    <w:lvl w:ilvl="7" w:tplc="04160019" w:tentative="1">
-      <w:start w:val="1"/>
-      <w:numFmt w:val="lowerLetter"/>
-      <w:lvlText w:val="%8."/>
-      <w:lvlJc w:val="left"/>
-      <w:pPr>
-        <w:ind w:left="5760" w:hanging="360"/>
-      </w:pPr>
-    </w:lvl>
-    <w:lvl w:ilvl="8" w:tplc="0416001B" w:tentative="1">
-      <w:start w:val="1"/>
-      <w:numFmt w:val="lowerRoman"/>
-      <w:lvlText w:val="%9."/>
-      <w:lvlJc w:val="right"/>
-      <w:pPr>
-        <w:ind w:left="6480" w:hanging="180"/>
-      </w:pPr>
-    </w:lvl>
-  </w:abstractNum>
-  <w:abstractNum w:abstractNumId="2">
-    <w:nsid w:val="502A13C4"/>
-    <w:multiLevelType w:val="hybridMultilevel"/>
-    <w:tmpl w:val="11E60866"/>
-    <w:lvl w:ilvl="0" w:tplc="04160001">
-      <w:start w:val="1"/>
-      <w:numFmt w:val="bullet"/>
-      <w:lvlText w:val=""/>
-      <w:lvlJc w:val="left"/>
-      <w:pPr>
-        <w:ind w:left="1440" w:hanging="360"/>
-      </w:pPr>
-      <w:rPr>
-        <w:rFonts w:ascii="Symbol" w:hAnsi="Symbol" w:hint="default"/>
-      </w:rPr>
-    </w:lvl>
-    <w:lvl w:ilvl="1" w:tplc="04160003" w:tentative="1">
-      <w:start w:val="1"/>
-      <w:numFmt w:val="bullet"/>
-      <w:lvlText w:val="o"/>
-      <w:lvlJc w:val="left"/>
-      <w:pPr>
-        <w:ind w:left="2160" w:hanging="360"/>
-      </w:pPr>
-      <w:rPr>
-        <w:rFonts w:ascii="Courier New" w:hAnsi="Courier New" w:cs="Courier New" w:hint="default"/>
-      </w:rPr>
-    </w:lvl>
-    <w:lvl w:ilvl="2" w:tplc="04160005" w:tentative="1">
-      <w:start w:val="1"/>
-      <w:numFmt w:val="bullet"/>
-      <w:lvlText w:val=""/>
-      <w:lvlJc w:val="left"/>
-      <w:pPr>
-        <w:ind w:left="2880" w:hanging="360"/>
-      </w:pPr>
-      <w:rPr>
-        <w:rFonts w:ascii="Wingdings" w:hAnsi="Wingdings" w:hint="default"/>
-      </w:rPr>
-    </w:lvl>
-    <w:lvl w:ilvl="3" w:tplc="04160001" w:tentative="1">
-      <w:start w:val="1"/>
-      <w:numFmt w:val="bullet"/>
-      <w:lvlText w:val=""/>
-      <w:lvlJc w:val="left"/>
-      <w:pPr>
-        <w:ind w:left="3600" w:hanging="360"/>
-      </w:pPr>
-      <w:rPr>
-        <w:rFonts w:ascii="Symbol" w:hAnsi="Symbol" w:hint="default"/>
-      </w:rPr>
-    </w:lvl>
-    <w:lvl w:ilvl="4" w:tplc="04160003" w:tentative="1">
-      <w:start w:val="1"/>
-      <w:numFmt w:val="bullet"/>
-      <w:lvlText w:val="o"/>
-      <w:lvlJc w:val="left"/>
-      <w:pPr>
-        <w:ind w:left="4320" w:hanging="360"/>
-      </w:pPr>
-      <w:rPr>
-        <w:rFonts w:ascii="Courier New" w:hAnsi="Courier New" w:cs="Courier New" w:hint="default"/>
-      </w:rPr>
-    </w:lvl>
-    <w:lvl w:ilvl="5" w:tplc="04160005" w:tentative="1">
-      <w:start w:val="1"/>
-      <w:numFmt w:val="bullet"/>
-      <w:lvlText w:val=""/>
-      <w:lvlJc w:val="left"/>
-      <w:pPr>
-        <w:ind w:left="5040" w:hanging="360"/>
-      </w:pPr>
-      <w:rPr>
-        <w:rFonts w:ascii="Wingdings" w:hAnsi="Wingdings" w:hint="default"/>
-      </w:rPr>
-    </w:lvl>
-    <w:lvl w:ilvl="6" w:tplc="04160001" w:tentative="1">
-      <w:start w:val="1"/>
-      <w:numFmt w:val="bullet"/>
-      <w:lvlText w:val=""/>
-      <w:lvlJc w:val="left"/>
-      <w:pPr>
-        <w:ind w:left="5760" w:hanging="360"/>
-      </w:pPr>
-      <w:rPr>
-        <w:rFonts w:ascii="Symbol" w:hAnsi="Symbol" w:hint="default"/>
-      </w:rPr>
-    </w:lvl>
-    <w:lvl w:ilvl="7" w:tplc="04160003" w:tentative="1">
-      <w:start w:val="1"/>
-      <w:numFmt w:val="bullet"/>
-      <w:lvlText w:val="o"/>
-      <w:lvlJc w:val="left"/>
-      <w:pPr>
-        <w:ind w:left="6480" w:hanging="360"/>
-      </w:pPr>
-      <w:rPr>
-        <w:rFonts w:ascii="Courier New" w:hAnsi="Courier New" w:cs="Courier New" w:hint="default"/>
-      </w:rPr>
-    </w:lvl>
-    <w:lvl w:ilvl="8" w:tplc="04160005" w:tentative="1">
-      <w:start w:val="1"/>
-      <w:numFmt w:val="bullet"/>
-      <w:lvlText w:val=""/>
-      <w:lvlJc w:val="left"/>
-      <w:pPr>
-        <w:ind w:left="7200" w:hanging="360"/>
-      </w:pPr>
-      <w:rPr>
-        <w:rFonts w:ascii="Wingdings" w:hAnsi="Wingdings" w:hint="default"/>
-      </w:rPr>
-    </w:lvl>
-  </w:abstractNum>
-  <w:abstractNum w:abstractNumId="3">
+  <w:abstractNum w:abstractNumId="4">
     <w:nsid w:val="56583B8C"/>
     <w:multiLevelType w:val="hybridMultilevel"/>
     <w:tmpl w:val="69A4382A"/>
@@ -5431,15 +7383,18 @@
     </w:lvl>
   </w:abstractNum>
   <w:num w:numId="1">
+    <w:abstractNumId w:val="4"/>
+  </w:num>
+  <w:num w:numId="2">
+    <w:abstractNumId w:val="2"/>
+  </w:num>
+  <w:num w:numId="3">
     <w:abstractNumId w:val="3"/>
   </w:num>
-  <w:num w:numId="2">
+  <w:num w:numId="4">
     <w:abstractNumId w:val="1"/>
   </w:num>
-  <w:num w:numId="3">
-    <w:abstractNumId w:val="2"/>
-  </w:num>
-  <w:num w:numId="4">
+  <w:num w:numId="5">
     <w:abstractNumId w:val="0"/>
   </w:num>
 </w:numbering>
@@ -5869,13 +7824,6 @@
     <w:pitch w:val="variable"/>
     <w:sig w:usb0="E0002EFF" w:usb1="C000785B" w:usb2="00000009" w:usb3="00000000" w:csb0="000001FF" w:csb1="00000000"/>
   </w:font>
-  <w:font w:name="Courier New">
-    <w:panose1 w:val="02070309020205020404"/>
-    <w:charset w:val="00"/>
-    <w:family w:val="modern"/>
-    <w:pitch w:val="fixed"/>
-    <w:sig w:usb0="E0002EFF" w:usb1="C0007843" w:usb2="00000009" w:usb3="00000000" w:csb0="000001FF" w:csb1="00000000"/>
-  </w:font>
   <w:font w:name="Times New Roman">
     <w:panose1 w:val="02020603050405020304"/>
     <w:charset w:val="00"/>
@@ -5889,6 +7837,13 @@
     <w:family w:val="auto"/>
     <w:pitch w:val="variable"/>
     <w:sig w:usb0="00000000" w:usb1="10000000" w:usb2="00000000" w:usb3="00000000" w:csb0="80000000" w:csb1="00000000"/>
+  </w:font>
+  <w:font w:name="Courier New">
+    <w:panose1 w:val="02070309020205020404"/>
+    <w:charset w:val="00"/>
+    <w:family w:val="modern"/>
+    <w:pitch w:val="fixed"/>
+    <w:sig w:usb0="E0002EFF" w:usb1="C0007843" w:usb2="00000009" w:usb3="00000000" w:csb0="000001FF" w:csb1="00000000"/>
   </w:font>
   <w:font w:name="Cambria">
     <w:panose1 w:val="02040503050406030204"/>
@@ -5924,9 +7879,9 @@
     <w:useFELayout/>
   </w:compat>
   <w:rsids>
-    <w:rsidRoot w:val="00131C45"/>
-    <w:rsid w:val="00131C45"/>
-    <w:rsid w:val="00353EB9"/>
+    <w:rsidRoot w:val="00AF3F7A"/>
+    <w:rsid w:val="00432745"/>
+    <w:rsid w:val="00AF3F7A"/>
   </w:rsids>
   <m:mathPr>
     <m:mathFont m:val="Cambria Math"/>
@@ -6141,7 +8096,7 @@
     <w:basedOn w:val="Fontepargpadro"/>
     <w:uiPriority w:val="99"/>
     <w:semiHidden/>
-    <w:rsid w:val="00131C45"/>
+    <w:rsid w:val="00AF3F7A"/>
     <w:rPr>
       <w:color w:val="808080"/>
     </w:rPr>

</xml_diff>

<commit_message>
Adicionando informações de Execução e do Sistema Operacional.
</commit_message>
<xml_diff>
--- a/Relatorio_Equipe_HeapSort.docx
+++ b/Relatorio_Equipe_HeapSort.docx
@@ -5599,21 +5599,56 @@
     </w:p>
     <w:p>
       <w:pPr>
+        <w:pStyle w:val="Ttulo3"/>
+        <w:rPr>
+          <w:rFonts w:ascii="Times" w:hAnsi="Times" w:cs="Times"/>
+          <w:sz w:val="24"/>
+          <w:szCs w:val="24"/>
+        </w:rPr>
+      </w:pPr>
+      <w:r>
+        <w:rPr>
+          <w:rFonts w:ascii="Times" w:hAnsi="Times" w:cs="Times"/>
+          <w:sz w:val="24"/>
+          <w:szCs w:val="24"/>
+        </w:rPr>
+        <w:t>PQINSERT</w:t>
+      </w:r>
+    </w:p>
+    <w:p>
+      <w:pPr>
         <w:ind w:firstLine="708"/>
         <w:jc w:val="both"/>
         <w:rPr>
-          <w:rFonts w:ascii="Times" w:hAnsi="Times" w:cs="Times"/>
-          <w:sz w:val="24"/>
-          <w:szCs w:val="24"/>
-        </w:rPr>
-      </w:pPr>
-      <w:r>
-        <w:rPr>
-          <w:rFonts w:ascii="Times" w:hAnsi="Times" w:cs="Times"/>
-          <w:sz w:val="24"/>
-          <w:szCs w:val="24"/>
-        </w:rPr>
-        <w:t xml:space="preserve">Para o procedimento pqinsert, suponha um vetor denominado </w:t>
+          <w:rFonts w:ascii="Times" w:eastAsiaTheme="minorEastAsia" w:hAnsi="Times" w:cs="Times"/>
+          <w:sz w:val="24"/>
+          <w:szCs w:val="24"/>
+        </w:rPr>
+      </w:pPr>
+      <w:r>
+        <w:rPr>
+          <w:rFonts w:ascii="Times" w:hAnsi="Times" w:cs="Times"/>
+          <w:sz w:val="24"/>
+          <w:szCs w:val="24"/>
+        </w:rPr>
+        <w:t xml:space="preserve">Para o procedimento </w:t>
+      </w:r>
+      <w:r>
+        <w:rPr>
+          <w:rFonts w:ascii="Times" w:hAnsi="Times" w:cs="Times"/>
+          <w:i/>
+          <w:sz w:val="24"/>
+          <w:szCs w:val="24"/>
+        </w:rPr>
+        <w:t>pqinsert</w:t>
+      </w:r>
+      <w:r>
+        <w:rPr>
+          <w:rFonts w:ascii="Times" w:hAnsi="Times" w:cs="Times"/>
+          <w:sz w:val="24"/>
+          <w:szCs w:val="24"/>
+        </w:rPr>
+        <w:t xml:space="preserve">, suponha um vetor denominado </w:t>
       </w:r>
       <w:r>
         <w:rPr>
@@ -5699,7 +5734,7 @@
           <w:sz w:val="24"/>
           <w:szCs w:val="24"/>
         </w:rPr>
-        <w:t xml:space="preserve"> como um parâmetro das operações de inserção e eliminação. Sendo assim, o procedimento pqinsert(</w:t>
+        <w:t xml:space="preserve"> como um parâmetro das operações de inserção e eliminação. Sendo assim, o procedimento </w:t>
       </w:r>
       <w:r>
         <w:rPr>
@@ -5708,15 +5743,15 @@
           <w:sz w:val="24"/>
           <w:szCs w:val="24"/>
         </w:rPr>
-        <w:t>dpq, k, elt</w:t>
-      </w:r>
-      <w:r>
-        <w:rPr>
-          <w:rFonts w:ascii="Times" w:hAnsi="Times" w:cs="Times"/>
-          <w:sz w:val="24"/>
-          <w:szCs w:val="24"/>
-        </w:rPr>
-        <w:t xml:space="preserve">) poderá ser implementado, bastanto inserir </w:t>
+        <w:t>pqinsert(dpq, k, elt)</w:t>
+      </w:r>
+      <w:r>
+        <w:rPr>
+          <w:rFonts w:ascii="Times" w:hAnsi="Times" w:cs="Times"/>
+          <w:sz w:val="24"/>
+          <w:szCs w:val="24"/>
+        </w:rPr>
+        <w:t xml:space="preserve"> poderá ser implementado, bastanto inserir </w:t>
       </w:r>
       <w:r>
         <w:rPr>
@@ -5851,62 +5886,1386 @@
     </w:p>
     <w:p>
       <w:pPr>
-        <w:jc w:val="both"/>
-        <w:rPr>
-          <w:rFonts w:ascii="Times" w:hAnsi="Times" w:cs="Times"/>
+        <w:ind w:firstLine="708"/>
+        <w:jc w:val="both"/>
+        <w:rPr>
+          <w:rFonts w:ascii="Times" w:eastAsiaTheme="minorEastAsia" w:hAnsi="Times" w:cs="Times"/>
+          <w:sz w:val="24"/>
+          <w:szCs w:val="24"/>
+        </w:rPr>
+      </w:pPr>
+      <w:r>
+        <w:rPr>
+          <w:rFonts w:ascii="Times" w:eastAsiaTheme="minorEastAsia" w:hAnsi="Times" w:cs="Times"/>
+          <w:sz w:val="24"/>
+          <w:szCs w:val="24"/>
+        </w:rPr>
+        <w:t xml:space="preserve">A inserção é efetuada percorrendo o caminho da posição </w:t>
+      </w:r>
+      <w:r>
+        <w:rPr>
+          <w:rFonts w:ascii="Times" w:eastAsiaTheme="minorEastAsia" w:hAnsi="Times" w:cs="Times"/>
+          <w:i/>
+          <w:sz w:val="24"/>
+          <w:szCs w:val="24"/>
+        </w:rPr>
+        <w:t>k</w:t>
+      </w:r>
+      <w:r>
+        <w:rPr>
+          <w:rFonts w:ascii="Times" w:eastAsiaTheme="minorEastAsia" w:hAnsi="Times" w:cs="Times"/>
+          <w:sz w:val="24"/>
+          <w:szCs w:val="24"/>
+        </w:rPr>
+        <w:t xml:space="preserve"> vazia até a posição 0 (elemento-raiz), procurando pelo primeiro elemento/valor maior ou igual a </w:t>
+      </w:r>
+      <w:r>
+        <w:rPr>
+          <w:rFonts w:ascii="Times" w:eastAsiaTheme="minorEastAsia" w:hAnsi="Times" w:cs="Times"/>
+          <w:i/>
+          <w:sz w:val="24"/>
+          <w:szCs w:val="24"/>
+        </w:rPr>
+        <w:t>elt</w:t>
+      </w:r>
+      <w:r>
+        <w:rPr>
+          <w:rFonts w:ascii="Times" w:eastAsiaTheme="minorEastAsia" w:hAnsi="Times" w:cs="Times"/>
+          <w:sz w:val="24"/>
+          <w:szCs w:val="24"/>
+        </w:rPr>
+        <w:t>.</w:t>
+      </w:r>
+      <w:r>
+        <w:rPr>
+          <w:rFonts w:ascii="Times" w:eastAsiaTheme="minorEastAsia" w:hAnsi="Times" w:cs="Times"/>
+          <w:sz w:val="24"/>
+          <w:szCs w:val="24"/>
+        </w:rPr>
+        <w:t xml:space="preserve"> Quando este elemento for encontrado, </w:t>
+      </w:r>
+      <w:r>
+        <w:rPr>
+          <w:rFonts w:ascii="Times" w:eastAsiaTheme="minorEastAsia" w:hAnsi="Times" w:cs="Times"/>
+          <w:i/>
+          <w:sz w:val="24"/>
+          <w:szCs w:val="24"/>
+        </w:rPr>
+        <w:t>elt</w:t>
+      </w:r>
+      <w:r>
+        <w:rPr>
+          <w:rFonts w:ascii="Times" w:eastAsiaTheme="minorEastAsia" w:hAnsi="Times" w:cs="Times"/>
+          <w:sz w:val="24"/>
+          <w:szCs w:val="24"/>
+        </w:rPr>
+        <w:t xml:space="preserve"> será introduzido, de forma imediata, antes deste mesmo elemento neste percurso(isto é, </w:t>
+      </w:r>
+      <w:r>
+        <w:rPr>
+          <w:rFonts w:ascii="Times" w:eastAsiaTheme="minorEastAsia" w:hAnsi="Times" w:cs="Times"/>
+          <w:i/>
+          <w:sz w:val="24"/>
+          <w:szCs w:val="24"/>
+        </w:rPr>
+        <w:t>elt</w:t>
+      </w:r>
+      <w:r>
+        <w:rPr>
+          <w:rFonts w:ascii="Times" w:eastAsiaTheme="minorEastAsia" w:hAnsi="Times" w:cs="Times"/>
+          <w:sz w:val="24"/>
+          <w:szCs w:val="24"/>
+        </w:rPr>
+        <w:t xml:space="preserve"> é inserido como seu elemento filho). À medida que cada elemento menor que </w:t>
+      </w:r>
+      <w:r>
+        <w:rPr>
+          <w:rFonts w:ascii="Times" w:eastAsiaTheme="minorEastAsia" w:hAnsi="Times" w:cs="Times"/>
+          <w:i/>
+          <w:sz w:val="24"/>
+          <w:szCs w:val="24"/>
+        </w:rPr>
+        <w:t>elt</w:t>
+      </w:r>
+      <w:r>
+        <w:rPr>
+          <w:rFonts w:ascii="Times" w:eastAsiaTheme="minorEastAsia" w:hAnsi="Times" w:cs="Times"/>
+          <w:sz w:val="24"/>
+          <w:szCs w:val="24"/>
+        </w:rPr>
+        <w:t xml:space="preserve"> </w:t>
+      </w:r>
+      <w:r>
+        <w:rPr>
+          <w:rFonts w:ascii="Times" w:eastAsiaTheme="minorEastAsia" w:hAnsi="Times" w:cs="Times"/>
+          <w:sz w:val="24"/>
+          <w:szCs w:val="24"/>
+        </w:rPr>
+        <w:t>for</w:t>
+      </w:r>
+      <w:r>
+        <w:rPr>
+          <w:rFonts w:ascii="Times" w:eastAsiaTheme="minorEastAsia" w:hAnsi="Times" w:cs="Times"/>
+          <w:sz w:val="24"/>
+          <w:szCs w:val="24"/>
+        </w:rPr>
+        <w:t xml:space="preserve"> visitado durante o percurso, esse elemento será movido á um nível abaixo na árvore</w:t>
+      </w:r>
+      <w:r>
+        <w:rPr>
+          <w:rFonts w:ascii="Times" w:eastAsiaTheme="minorEastAsia" w:hAnsi="Times" w:cs="Times"/>
+          <w:sz w:val="24"/>
+          <w:szCs w:val="24"/>
+        </w:rPr>
+        <w:t xml:space="preserve"> para ceder espaço para </w:t>
+      </w:r>
+      <w:r>
+        <w:rPr>
+          <w:rFonts w:ascii="Times" w:eastAsiaTheme="minorEastAsia" w:hAnsi="Times" w:cs="Times"/>
+          <w:i/>
+          <w:sz w:val="24"/>
+          <w:szCs w:val="24"/>
+        </w:rPr>
+        <w:t>elt</w:t>
+      </w:r>
+      <w:r>
+        <w:rPr>
+          <w:rFonts w:ascii="Times" w:eastAsiaTheme="minorEastAsia" w:hAnsi="Times" w:cs="Times"/>
+          <w:sz w:val="24"/>
+          <w:szCs w:val="24"/>
+        </w:rPr>
+        <w:t>.</w:t>
+      </w:r>
+    </w:p>
+    <w:p>
+      <w:pPr>
+        <w:jc w:val="both"/>
+        <w:rPr>
+          <w:rFonts w:ascii="Times" w:eastAsiaTheme="minorEastAsia" w:hAnsi="Times" w:cs="Times"/>
+          <w:sz w:val="24"/>
+          <w:szCs w:val="24"/>
+        </w:rPr>
+      </w:pPr>
+      <w:r>
+        <w:rPr>
+          <w:rFonts w:ascii="Times" w:eastAsiaTheme="minorEastAsia" w:hAnsi="Times" w:cs="Times"/>
+          <w:sz w:val="24"/>
+          <w:szCs w:val="24"/>
+        </w:rPr>
+        <w:t xml:space="preserve">** Esse deslocamento é necessário, pois nesse exemplo de algoritmo presente na obra, está sendo utilizada uma representação seqüencial ao invés de uma representação </w:t>
+      </w:r>
+      <w:r>
+        <w:rPr>
+          <w:rFonts w:ascii="Times" w:eastAsiaTheme="minorEastAsia" w:hAnsi="Times" w:cs="Times"/>
+          <w:sz w:val="24"/>
+          <w:szCs w:val="24"/>
+        </w:rPr>
+        <w:t>vinculada a</w:t>
+      </w:r>
+      <w:r>
+        <w:rPr>
+          <w:rFonts w:ascii="Times" w:eastAsiaTheme="minorEastAsia" w:hAnsi="Times" w:cs="Times"/>
+          <w:sz w:val="24"/>
+          <w:szCs w:val="24"/>
+        </w:rPr>
+        <w:t xml:space="preserve"> árvore binária.</w:t>
+      </w:r>
+      <w:r>
+        <w:rPr>
+          <w:rFonts w:ascii="Times" w:eastAsiaTheme="minorEastAsia" w:hAnsi="Times" w:cs="Times"/>
+          <w:sz w:val="24"/>
+          <w:szCs w:val="24"/>
+        </w:rPr>
+        <w:t xml:space="preserve"> Contudo, um novo elemento não pode ser inserido entre dois elementos já existentes sem deslocar/reposicionar elementos existentes com </w:t>
+      </w:r>
+      <w:r>
+        <w:rPr>
+          <w:rFonts w:ascii="Times" w:eastAsiaTheme="minorEastAsia" w:hAnsi="Times" w:cs="Times"/>
+          <w:i/>
+          <w:sz w:val="24"/>
+          <w:szCs w:val="24"/>
+        </w:rPr>
+        <w:t>pqinsert(dpq, k, elt)</w:t>
+      </w:r>
+      <w:r>
+        <w:rPr>
+          <w:rFonts w:ascii="Times" w:eastAsiaTheme="minorEastAsia" w:hAnsi="Times" w:cs="Times"/>
+          <w:sz w:val="24"/>
+          <w:szCs w:val="24"/>
+        </w:rPr>
+        <w:t>.</w:t>
+      </w:r>
+    </w:p>
+    <w:p>
+      <w:pPr>
+        <w:jc w:val="both"/>
+        <w:rPr>
+          <w:rFonts w:ascii="Times" w:eastAsiaTheme="minorEastAsia" w:hAnsi="Times" w:cs="Times"/>
+          <w:sz w:val="24"/>
+          <w:szCs w:val="24"/>
+        </w:rPr>
+      </w:pPr>
+      <w:r>
+        <w:rPr>
+          <w:rFonts w:ascii="Times" w:eastAsiaTheme="minorEastAsia" w:hAnsi="Times" w:cs="Times"/>
+          <w:sz w:val="24"/>
+          <w:szCs w:val="24"/>
+        </w:rPr>
+        <w:t>O seguinte algoritmo deverá ser implementado:</w:t>
+      </w:r>
+    </w:p>
+    <w:p>
+      <w:pPr>
+        <w:jc w:val="both"/>
+        <w:rPr>
+          <w:rFonts w:ascii="Courier New" w:eastAsiaTheme="minorEastAsia" w:hAnsi="Courier New" w:cs="Courier New"/>
           <w:sz w:val="20"/>
           <w:szCs w:val="24"/>
         </w:rPr>
       </w:pPr>
-    </w:p>
-    <w:p>
-      <w:pPr>
-        <w:jc w:val="both"/>
-        <w:rPr>
-          <w:rFonts w:ascii="Times" w:hAnsi="Times" w:cs="Times"/>
+      <w:r>
+        <w:rPr>
+          <w:rFonts w:ascii="Courier New" w:eastAsiaTheme="minorEastAsia" w:hAnsi="Courier New" w:cs="Courier New"/>
           <w:sz w:val="20"/>
           <w:szCs w:val="24"/>
         </w:rPr>
-      </w:pPr>
-    </w:p>
-    <w:p>
-      <w:pPr>
-        <w:jc w:val="both"/>
-        <w:rPr>
-          <w:rFonts w:ascii="Times" w:hAnsi="Times" w:cs="Times"/>
+        <w:t>void pqinsert(int dpq[], int k, int elt)</w:t>
+      </w:r>
+    </w:p>
+    <w:p>
+      <w:pPr>
+        <w:jc w:val="both"/>
+        <w:rPr>
+          <w:rFonts w:ascii="Courier New" w:eastAsiaTheme="minorEastAsia" w:hAnsi="Courier New" w:cs="Courier New"/>
           <w:sz w:val="20"/>
           <w:szCs w:val="24"/>
         </w:rPr>
       </w:pPr>
-    </w:p>
-    <w:p>
-      <w:pPr>
-        <w:jc w:val="both"/>
-        <w:rPr>
-          <w:rFonts w:ascii="Times" w:hAnsi="Times" w:cs="Times"/>
+      <w:r>
+        <w:rPr>
+          <w:rFonts w:ascii="Courier New" w:eastAsiaTheme="minorEastAsia" w:hAnsi="Courier New" w:cs="Courier New"/>
           <w:sz w:val="20"/>
           <w:szCs w:val="24"/>
         </w:rPr>
-      </w:pPr>
-    </w:p>
-    <w:p>
-      <w:pPr>
-        <w:jc w:val="both"/>
-        <w:rPr>
-          <w:rFonts w:ascii="Times" w:hAnsi="Times" w:cs="Times"/>
+        <w:t>{</w:t>
+      </w:r>
+    </w:p>
+    <w:p>
+      <w:pPr>
+        <w:jc w:val="both"/>
+        <w:rPr>
+          <w:rFonts w:ascii="Courier New" w:eastAsiaTheme="minorEastAsia" w:hAnsi="Courier New" w:cs="Courier New"/>
           <w:sz w:val="20"/>
           <w:szCs w:val="24"/>
         </w:rPr>
       </w:pPr>
-    </w:p>
-    <w:p>
-      <w:pPr>
-        <w:jc w:val="both"/>
-        <w:rPr>
-          <w:rFonts w:ascii="Times" w:hAnsi="Times" w:cs="Times"/>
+      <w:r>
+        <w:rPr>
+          <w:rFonts w:ascii="Courier New" w:eastAsiaTheme="minorEastAsia" w:hAnsi="Courier New" w:cs="Courier New"/>
           <w:sz w:val="20"/>
           <w:szCs w:val="24"/>
         </w:rPr>
+        <w:t xml:space="preserve">    int s = k;</w:t>
+      </w:r>
+    </w:p>
+    <w:p>
+      <w:pPr>
+        <w:jc w:val="both"/>
+        <w:rPr>
+          <w:rFonts w:ascii="Courier New" w:eastAsiaTheme="minorEastAsia" w:hAnsi="Courier New" w:cs="Courier New"/>
+          <w:sz w:val="20"/>
+          <w:szCs w:val="24"/>
+        </w:rPr>
+      </w:pPr>
+      <w:r>
+        <w:rPr>
+          <w:rFonts w:ascii="Courier New" w:eastAsiaTheme="minorEastAsia" w:hAnsi="Courier New" w:cs="Courier New"/>
+          <w:sz w:val="20"/>
+          <w:szCs w:val="24"/>
+        </w:rPr>
+        <w:t xml:space="preserve">    int f = (s - 1) / 2;</w:t>
+      </w:r>
+      <w:r>
+        <w:rPr>
+          <w:rFonts w:ascii="Courier New" w:eastAsiaTheme="minorEastAsia" w:hAnsi="Courier New" w:cs="Courier New"/>
+          <w:sz w:val="20"/>
+          <w:szCs w:val="24"/>
+        </w:rPr>
+        <w:t xml:space="preserve"> /* f eh o pai de s */</w:t>
+      </w:r>
+    </w:p>
+    <w:p>
+      <w:pPr>
+        <w:jc w:val="both"/>
+        <w:rPr>
+          <w:rFonts w:ascii="Courier New" w:eastAsiaTheme="minorEastAsia" w:hAnsi="Courier New" w:cs="Courier New"/>
+          <w:sz w:val="20"/>
+          <w:szCs w:val="24"/>
+        </w:rPr>
+      </w:pPr>
+      <w:r>
+        <w:rPr>
+          <w:rFonts w:ascii="Courier New" w:eastAsiaTheme="minorEastAsia" w:hAnsi="Courier New" w:cs="Courier New"/>
+          <w:sz w:val="20"/>
+          <w:szCs w:val="24"/>
+        </w:rPr>
+        <w:t xml:space="preserve">    while (s &gt; 0 &amp;&amp; dpq[f] &lt; elt)</w:t>
+      </w:r>
+    </w:p>
+    <w:p>
+      <w:pPr>
+        <w:jc w:val="both"/>
+        <w:rPr>
+          <w:rFonts w:ascii="Courier New" w:eastAsiaTheme="minorEastAsia" w:hAnsi="Courier New" w:cs="Courier New"/>
+          <w:sz w:val="20"/>
+          <w:szCs w:val="24"/>
+        </w:rPr>
+      </w:pPr>
+      <w:r>
+        <w:rPr>
+          <w:rFonts w:ascii="Courier New" w:eastAsiaTheme="minorEastAsia" w:hAnsi="Courier New" w:cs="Courier New"/>
+          <w:sz w:val="20"/>
+          <w:szCs w:val="24"/>
+        </w:rPr>
+        <w:t xml:space="preserve">    {</w:t>
+      </w:r>
+    </w:p>
+    <w:p>
+      <w:pPr>
+        <w:jc w:val="both"/>
+        <w:rPr>
+          <w:rFonts w:ascii="Courier New" w:eastAsiaTheme="minorEastAsia" w:hAnsi="Courier New" w:cs="Courier New"/>
+          <w:sz w:val="20"/>
+          <w:szCs w:val="24"/>
+        </w:rPr>
+      </w:pPr>
+      <w:r>
+        <w:rPr>
+          <w:rFonts w:ascii="Courier New" w:eastAsiaTheme="minorEastAsia" w:hAnsi="Courier New" w:cs="Courier New"/>
+          <w:sz w:val="20"/>
+          <w:szCs w:val="24"/>
+        </w:rPr>
+        <w:lastRenderedPageBreak/>
+        <w:t xml:space="preserve">        dpq[s] = dpq[f];</w:t>
+      </w:r>
+    </w:p>
+    <w:p>
+      <w:pPr>
+        <w:jc w:val="both"/>
+        <w:rPr>
+          <w:rFonts w:ascii="Courier New" w:eastAsiaTheme="minorEastAsia" w:hAnsi="Courier New" w:cs="Courier New"/>
+          <w:sz w:val="20"/>
+          <w:szCs w:val="24"/>
+        </w:rPr>
+      </w:pPr>
+      <w:r>
+        <w:rPr>
+          <w:rFonts w:ascii="Courier New" w:eastAsiaTheme="minorEastAsia" w:hAnsi="Courier New" w:cs="Courier New"/>
+          <w:sz w:val="20"/>
+          <w:szCs w:val="24"/>
+        </w:rPr>
+        <w:t xml:space="preserve">        s = f;</w:t>
+      </w:r>
+      <w:r>
+        <w:rPr>
+          <w:rFonts w:ascii="Courier New" w:eastAsiaTheme="minorEastAsia" w:hAnsi="Courier New" w:cs="Courier New"/>
+          <w:sz w:val="20"/>
+          <w:szCs w:val="24"/>
+        </w:rPr>
+        <w:t xml:space="preserve"> /* sobe na arvore */</w:t>
+      </w:r>
+    </w:p>
+    <w:p>
+      <w:pPr>
+        <w:jc w:val="both"/>
+        <w:rPr>
+          <w:rFonts w:ascii="Courier New" w:eastAsiaTheme="minorEastAsia" w:hAnsi="Courier New" w:cs="Courier New"/>
+          <w:sz w:val="20"/>
+          <w:szCs w:val="24"/>
+        </w:rPr>
+      </w:pPr>
+      <w:r>
+        <w:rPr>
+          <w:rFonts w:ascii="Courier New" w:eastAsiaTheme="minorEastAsia" w:hAnsi="Courier New" w:cs="Courier New"/>
+          <w:sz w:val="20"/>
+          <w:szCs w:val="24"/>
+        </w:rPr>
+        <w:t xml:space="preserve">        f = (s - 1) / 2;</w:t>
+      </w:r>
+    </w:p>
+    <w:p>
+      <w:pPr>
+        <w:jc w:val="both"/>
+        <w:rPr>
+          <w:rFonts w:ascii="Courier New" w:eastAsiaTheme="minorEastAsia" w:hAnsi="Courier New" w:cs="Courier New"/>
+          <w:sz w:val="20"/>
+          <w:szCs w:val="24"/>
+        </w:rPr>
+      </w:pPr>
+      <w:r>
+        <w:rPr>
+          <w:rFonts w:ascii="Courier New" w:eastAsiaTheme="minorEastAsia" w:hAnsi="Courier New" w:cs="Courier New"/>
+          <w:sz w:val="20"/>
+          <w:szCs w:val="24"/>
+        </w:rPr>
+        <w:t xml:space="preserve">    }</w:t>
+      </w:r>
+      <w:r>
+        <w:rPr>
+          <w:rFonts w:ascii="Courier New" w:eastAsiaTheme="minorEastAsia" w:hAnsi="Courier New" w:cs="Courier New"/>
+          <w:sz w:val="20"/>
+          <w:szCs w:val="24"/>
+        </w:rPr>
+        <w:t xml:space="preserve"> /* fim do while */</w:t>
+      </w:r>
+    </w:p>
+    <w:p>
+      <w:pPr>
+        <w:jc w:val="both"/>
+        <w:rPr>
+          <w:rFonts w:ascii="Courier New" w:eastAsiaTheme="minorEastAsia" w:hAnsi="Courier New" w:cs="Courier New"/>
+          <w:sz w:val="20"/>
+          <w:szCs w:val="24"/>
+        </w:rPr>
+      </w:pPr>
+      <w:r>
+        <w:rPr>
+          <w:rFonts w:ascii="Courier New" w:eastAsiaTheme="minorEastAsia" w:hAnsi="Courier New" w:cs="Courier New"/>
+          <w:sz w:val="20"/>
+          <w:szCs w:val="24"/>
+        </w:rPr>
+        <w:t xml:space="preserve">    dpq[s] = elt;</w:t>
+      </w:r>
+    </w:p>
+    <w:p>
+      <w:pPr>
+        <w:jc w:val="both"/>
+        <w:rPr>
+          <w:rFonts w:ascii="Courier New" w:eastAsiaTheme="minorEastAsia" w:hAnsi="Courier New" w:cs="Courier New"/>
+          <w:sz w:val="20"/>
+          <w:szCs w:val="24"/>
+        </w:rPr>
+      </w:pPr>
+      <w:r>
+        <w:rPr>
+          <w:rFonts w:ascii="Courier New" w:eastAsiaTheme="minorEastAsia" w:hAnsi="Courier New" w:cs="Courier New"/>
+          <w:sz w:val="20"/>
+          <w:szCs w:val="24"/>
+        </w:rPr>
+        <w:t>}</w:t>
+      </w:r>
+    </w:p>
+    <w:p>
+      <w:pPr>
+        <w:jc w:val="both"/>
+        <w:rPr>
+          <w:rFonts w:ascii="Times" w:eastAsiaTheme="minorEastAsia" w:hAnsi="Times" w:cs="Times"/>
+          <w:sz w:val="24"/>
+          <w:szCs w:val="24"/>
+        </w:rPr>
+      </w:pPr>
+      <w:r>
+        <w:rPr>
+          <w:rFonts w:ascii="Times" w:eastAsiaTheme="minorEastAsia" w:hAnsi="Times" w:cs="Times"/>
+          <w:sz w:val="24"/>
+          <w:szCs w:val="24"/>
+        </w:rPr>
+        <w:t xml:space="preserve">A inserção deste exemplo é </w:t>
+      </w:r>
+      <m:oMath>
+        <m:r>
+          <w:rPr>
+            <w:rFonts w:ascii="Cambria Math" w:eastAsiaTheme="minorEastAsia" w:hAnsi="Cambria Math" w:cs="Times"/>
+            <w:sz w:val="24"/>
+            <w:szCs w:val="24"/>
+          </w:rPr>
+          <m:t>O(</m:t>
+        </m:r>
+        <m:func>
+          <m:funcPr>
+            <m:ctrlPr>
+              <w:rPr>
+                <w:rFonts w:ascii="Cambria Math" w:eastAsiaTheme="minorEastAsia" w:hAnsi="Cambria Math" w:cs="Times"/>
+                <w:i/>
+                <w:sz w:val="24"/>
+                <w:szCs w:val="24"/>
+              </w:rPr>
+            </m:ctrlPr>
+          </m:funcPr>
+          <m:fName>
+            <m:r>
+              <m:rPr>
+                <m:sty m:val="p"/>
+              </m:rPr>
+              <w:rPr>
+                <w:rFonts w:ascii="Cambria Math" w:eastAsiaTheme="minorEastAsia" w:hAnsi="Cambria Math" w:cs="Times"/>
+                <w:sz w:val="24"/>
+                <w:szCs w:val="24"/>
+              </w:rPr>
+              <m:t>log</m:t>
+            </m:r>
+          </m:fName>
+          <m:e>
+            <m:r>
+              <w:rPr>
+                <w:rFonts w:ascii="Cambria Math" w:eastAsiaTheme="minorEastAsia" w:hAnsi="Cambria Math" w:cs="Times"/>
+                <w:sz w:val="24"/>
+                <w:szCs w:val="24"/>
+              </w:rPr>
+              <m:t>n)</m:t>
+            </m:r>
+          </m:e>
+        </m:func>
+      </m:oMath>
+      <w:r>
+        <w:rPr>
+          <w:rFonts w:ascii="Times" w:eastAsiaTheme="minorEastAsia" w:hAnsi="Times" w:cs="Times"/>
+          <w:sz w:val="24"/>
+          <w:szCs w:val="24"/>
+        </w:rPr>
+        <w:t xml:space="preserve"> pois uma árvore binária quase completa com </w:t>
+      </w:r>
+      <m:oMath>
+        <m:r>
+          <w:rPr>
+            <w:rFonts w:ascii="Cambria Math" w:eastAsiaTheme="minorEastAsia" w:hAnsi="Cambria Math" w:cs="Times"/>
+            <w:sz w:val="24"/>
+            <w:szCs w:val="24"/>
+          </w:rPr>
+          <m:t>n</m:t>
+        </m:r>
+      </m:oMath>
+      <w:r>
+        <w:rPr>
+          <w:rFonts w:ascii="Times" w:eastAsiaTheme="minorEastAsia" w:hAnsi="Times" w:cs="Times"/>
+          <w:sz w:val="24"/>
+          <w:szCs w:val="24"/>
+        </w:rPr>
+        <w:t xml:space="preserve"> nós tem </w:t>
+      </w:r>
+      <m:oMath>
+        <m:sSub>
+          <m:sSubPr>
+            <m:ctrlPr>
+              <w:rPr>
+                <w:rFonts w:ascii="Cambria Math" w:eastAsiaTheme="minorEastAsia" w:hAnsi="Cambria Math" w:cs="Times"/>
+                <w:i/>
+                <w:sz w:val="24"/>
+                <w:szCs w:val="24"/>
+              </w:rPr>
+            </m:ctrlPr>
+          </m:sSubPr>
+          <m:e>
+            <m:r>
+              <w:rPr>
+                <w:rFonts w:ascii="Cambria Math" w:eastAsiaTheme="minorEastAsia" w:hAnsi="Cambria Math" w:cs="Times"/>
+                <w:sz w:val="24"/>
+                <w:szCs w:val="24"/>
+              </w:rPr>
+              <m:t>log</m:t>
+            </m:r>
+          </m:e>
+          <m:sub>
+            <m:r>
+              <w:rPr>
+                <w:rFonts w:ascii="Cambria Math" w:eastAsiaTheme="minorEastAsia" w:hAnsi="Cambria Math" w:cs="Times"/>
+                <w:sz w:val="24"/>
+                <w:szCs w:val="24"/>
+              </w:rPr>
+              <m:t xml:space="preserve">2 </m:t>
+            </m:r>
+          </m:sub>
+        </m:sSub>
+        <m:r>
+          <w:rPr>
+            <w:rFonts w:ascii="Cambria Math" w:eastAsiaTheme="minorEastAsia" w:hAnsi="Cambria Math" w:cs="Times"/>
+            <w:sz w:val="24"/>
+            <w:szCs w:val="24"/>
+          </w:rPr>
+          <m:t>n+1</m:t>
+        </m:r>
+      </m:oMath>
+      <w:r>
+        <w:rPr>
+          <w:rFonts w:ascii="Times" w:eastAsiaTheme="minorEastAsia" w:hAnsi="Times" w:cs="Times"/>
+          <w:sz w:val="24"/>
+          <w:szCs w:val="24"/>
+        </w:rPr>
+        <w:t xml:space="preserve"> níveis,  e no máximo um nó por cada nível é acessado.</w:t>
+      </w:r>
+    </w:p>
+    <w:p>
+      <w:pPr>
+        <w:pStyle w:val="Ttulo3"/>
+        <w:rPr>
+          <w:rFonts w:ascii="Times" w:hAnsi="Times" w:cs="Times"/>
+          <w:sz w:val="24"/>
+          <w:szCs w:val="24"/>
+        </w:rPr>
+      </w:pPr>
+      <w:r>
+        <w:rPr>
+          <w:rFonts w:ascii="Times" w:hAnsi="Times" w:cs="Times"/>
+          <w:sz w:val="24"/>
+          <w:szCs w:val="24"/>
+        </w:rPr>
+        <w:t>PQMAXDELETE</w:t>
+      </w:r>
+    </w:p>
+    <w:p>
+      <w:pPr>
+        <w:ind w:firstLine="708"/>
+        <w:jc w:val="both"/>
+        <w:rPr>
+          <w:rFonts w:ascii="Times" w:eastAsiaTheme="minorEastAsia" w:hAnsi="Times" w:cs="Times"/>
+          <w:sz w:val="24"/>
+          <w:szCs w:val="24"/>
+        </w:rPr>
+      </w:pPr>
+      <w:r>
+        <w:rPr>
+          <w:rFonts w:ascii="Times" w:hAnsi="Times" w:cs="Times"/>
+          <w:sz w:val="24"/>
+          <w:szCs w:val="24"/>
+        </w:rPr>
+        <w:t xml:space="preserve">Para o procedimento </w:t>
+      </w:r>
+      <w:r>
+        <w:rPr>
+          <w:rFonts w:ascii="Times" w:hAnsi="Times" w:cs="Times"/>
+          <w:i/>
+          <w:sz w:val="24"/>
+          <w:szCs w:val="24"/>
+        </w:rPr>
+        <w:t>pq</w:t>
+      </w:r>
+      <w:r>
+        <w:rPr>
+          <w:rFonts w:ascii="Times" w:hAnsi="Times" w:cs="Times"/>
+          <w:i/>
+          <w:sz w:val="24"/>
+          <w:szCs w:val="24"/>
+        </w:rPr>
+        <w:t>maxdelete</w:t>
+      </w:r>
+      <w:r>
+        <w:rPr>
+          <w:rFonts w:ascii="Times" w:hAnsi="Times" w:cs="Times"/>
+          <w:sz w:val="24"/>
+          <w:szCs w:val="24"/>
+        </w:rPr>
+        <w:t xml:space="preserve">, observa-se que o elemento máximo sempre está na posição-raiz de um heap descendente de </w:t>
+      </w:r>
+      <m:oMath>
+        <m:r>
+          <w:rPr>
+            <w:rFonts w:ascii="Cambria Math" w:hAnsi="Cambria Math" w:cs="Times"/>
+            <w:sz w:val="24"/>
+            <w:szCs w:val="24"/>
+          </w:rPr>
+          <m:t>k</m:t>
+        </m:r>
+      </m:oMath>
+      <w:r>
+        <w:rPr>
+          <w:rFonts w:ascii="Times" w:eastAsiaTheme="minorEastAsia" w:hAnsi="Times" w:cs="Times"/>
+          <w:sz w:val="24"/>
+          <w:szCs w:val="24"/>
+        </w:rPr>
+        <w:t xml:space="preserve"> elementos. Quando este mesmo elemento é removido, os </w:t>
+      </w:r>
+      <m:oMath>
+        <m:r>
+          <w:rPr>
+            <w:rFonts w:ascii="Cambria Math" w:eastAsiaTheme="minorEastAsia" w:hAnsi="Cambria Math" w:cs="Times"/>
+            <w:sz w:val="24"/>
+            <w:szCs w:val="24"/>
+          </w:rPr>
+          <m:t>k-1</m:t>
+        </m:r>
+      </m:oMath>
+      <w:r>
+        <w:rPr>
+          <w:rFonts w:ascii="Times" w:eastAsiaTheme="minorEastAsia" w:hAnsi="Times" w:cs="Times"/>
+          <w:sz w:val="24"/>
+          <w:szCs w:val="24"/>
+        </w:rPr>
+        <w:t xml:space="preserve"> elementos restantes nas posições 1 a </w:t>
+      </w:r>
+      <m:oMath>
+        <m:r>
+          <w:rPr>
+            <w:rFonts w:ascii="Cambria Math" w:eastAsiaTheme="minorEastAsia" w:hAnsi="Cambria Math" w:cs="Times"/>
+            <w:sz w:val="24"/>
+            <w:szCs w:val="24"/>
+          </w:rPr>
+          <m:t>k-1</m:t>
+        </m:r>
+      </m:oMath>
+      <w:r>
+        <w:rPr>
+          <w:rFonts w:ascii="Times" w:eastAsiaTheme="minorEastAsia" w:hAnsi="Times" w:cs="Times"/>
+          <w:sz w:val="24"/>
+          <w:szCs w:val="24"/>
+        </w:rPr>
+        <w:t xml:space="preserve"> precisam ser redistribuídos nas posições 0 até </w:t>
+      </w:r>
+      <m:oMath>
+        <m:r>
+          <w:rPr>
+            <w:rFonts w:ascii="Cambria Math" w:eastAsiaTheme="minorEastAsia" w:hAnsi="Cambria Math" w:cs="Times"/>
+            <w:sz w:val="24"/>
+            <w:szCs w:val="24"/>
+          </w:rPr>
+          <m:t>k-2</m:t>
+        </m:r>
+      </m:oMath>
+      <w:r>
+        <w:rPr>
+          <w:rFonts w:ascii="Times" w:eastAsiaTheme="minorEastAsia" w:hAnsi="Times" w:cs="Times"/>
+          <w:sz w:val="24"/>
+          <w:szCs w:val="24"/>
+        </w:rPr>
+        <w:t xml:space="preserve"> a fim do segmento de vetor resultante de </w:t>
+      </w:r>
+      <w:r>
+        <w:rPr>
+          <w:rFonts w:ascii="Times" w:eastAsiaTheme="minorEastAsia" w:hAnsi="Times" w:cs="Times"/>
+          <w:i/>
+          <w:sz w:val="24"/>
+          <w:szCs w:val="24"/>
+        </w:rPr>
+        <w:t>dpq</w:t>
+      </w:r>
+      <m:oMath>
+        <m:r>
+          <m:rPr>
+            <m:sty m:val="p"/>
+          </m:rPr>
+          <w:rPr>
+            <w:rFonts w:ascii="Cambria Math" w:eastAsiaTheme="minorEastAsia" w:hAnsi="Cambria Math" w:cs="Times"/>
+            <w:sz w:val="24"/>
+            <w:szCs w:val="24"/>
+          </w:rPr>
+          <m:t xml:space="preserve">[0] </m:t>
+        </m:r>
+      </m:oMath>
+      <w:r>
+        <w:rPr>
+          <w:rFonts w:ascii="Times" w:eastAsiaTheme="minorEastAsia" w:hAnsi="Times" w:cs="Times"/>
+          <w:sz w:val="24"/>
+          <w:szCs w:val="24"/>
+        </w:rPr>
+        <w:t xml:space="preserve">até </w:t>
+      </w:r>
+      <w:r>
+        <w:rPr>
+          <w:rFonts w:ascii="Times" w:eastAsiaTheme="minorEastAsia" w:hAnsi="Times" w:cs="Times"/>
+          <w:i/>
+          <w:sz w:val="24"/>
+          <w:szCs w:val="24"/>
+        </w:rPr>
+        <w:t>dpq</w:t>
+      </w:r>
+      <m:oMath>
+        <m:r>
+          <w:rPr>
+            <w:rFonts w:ascii="Cambria Math" w:eastAsiaTheme="minorEastAsia" w:hAnsi="Cambria Math" w:cs="Times"/>
+            <w:sz w:val="24"/>
+            <w:szCs w:val="24"/>
+          </w:rPr>
+          <m:t>[k-2]</m:t>
+        </m:r>
+      </m:oMath>
+      <w:r>
+        <w:rPr>
+          <w:rFonts w:ascii="Times" w:eastAsiaTheme="minorEastAsia" w:hAnsi="Times" w:cs="Times"/>
+          <w:sz w:val="24"/>
+          <w:szCs w:val="24"/>
+        </w:rPr>
+        <w:t xml:space="preserve"> continue um heap descendente.</w:t>
+      </w:r>
+    </w:p>
+    <w:p>
+      <w:pPr>
+        <w:ind w:firstLine="708"/>
+        <w:jc w:val="both"/>
+        <w:rPr>
+          <w:rFonts w:ascii="Times" w:eastAsiaTheme="minorEastAsia" w:hAnsi="Times" w:cs="Times"/>
+          <w:sz w:val="24"/>
+          <w:szCs w:val="24"/>
+        </w:rPr>
+      </w:pPr>
+      <w:r>
+        <w:rPr>
+          <w:rFonts w:ascii="Times" w:eastAsiaTheme="minorEastAsia" w:hAnsi="Times" w:cs="Times"/>
+          <w:sz w:val="24"/>
+          <w:szCs w:val="24"/>
+        </w:rPr>
+        <w:t xml:space="preserve">Seja </w:t>
+      </w:r>
+      <w:r>
+        <w:rPr>
+          <w:rFonts w:ascii="Times" w:eastAsiaTheme="minorEastAsia" w:hAnsi="Times" w:cs="Times"/>
+          <w:i/>
+          <w:sz w:val="24"/>
+          <w:szCs w:val="24"/>
+        </w:rPr>
+        <w:t>adjustheap(root,p)</w:t>
+      </w:r>
+      <w:r>
+        <w:rPr>
+          <w:rFonts w:ascii="Times" w:eastAsiaTheme="minorEastAsia" w:hAnsi="Times" w:cs="Times"/>
+          <w:sz w:val="24"/>
+          <w:szCs w:val="24"/>
+        </w:rPr>
+        <w:t xml:space="preserve"> a reordenação dos elementos </w:t>
+      </w:r>
+      <w:r>
+        <w:rPr>
+          <w:rFonts w:ascii="Times" w:eastAsiaTheme="minorEastAsia" w:hAnsi="Times" w:cs="Times"/>
+          <w:i/>
+          <w:sz w:val="24"/>
+          <w:szCs w:val="24"/>
+        </w:rPr>
+        <w:t>dpq</w:t>
+      </w:r>
+      <m:oMath>
+        <m:r>
+          <w:rPr>
+            <w:rFonts w:ascii="Cambria Math" w:eastAsiaTheme="minorEastAsia" w:hAnsi="Cambria Math" w:cs="Times"/>
+            <w:sz w:val="24"/>
+            <w:szCs w:val="24"/>
+          </w:rPr>
+          <m:t>[root</m:t>
+        </m:r>
+        <m:r>
+          <m:rPr>
+            <m:sty m:val="p"/>
+          </m:rPr>
+          <w:rPr>
+            <w:rFonts w:ascii="Cambria Math" w:eastAsiaTheme="minorEastAsia" w:hAnsi="Cambria Math" w:cs="Times"/>
+            <w:sz w:val="24"/>
+            <w:szCs w:val="24"/>
+          </w:rPr>
+          <m:t xml:space="preserve"> +1</m:t>
+        </m:r>
+        <m:r>
+          <w:rPr>
+            <w:rFonts w:ascii="Cambria Math" w:eastAsiaTheme="minorEastAsia" w:hAnsi="Cambria Math" w:cs="Times"/>
+            <w:sz w:val="24"/>
+            <w:szCs w:val="24"/>
+          </w:rPr>
+          <m:t>]</m:t>
+        </m:r>
+      </m:oMath>
+      <w:r>
+        <w:rPr>
+          <w:rFonts w:ascii="Times" w:eastAsiaTheme="minorEastAsia" w:hAnsi="Times" w:cs="Times"/>
+          <w:sz w:val="24"/>
+          <w:szCs w:val="24"/>
+        </w:rPr>
+        <w:t xml:space="preserve"> até </w:t>
+      </w:r>
+      <w:r>
+        <w:rPr>
+          <w:rFonts w:ascii="Times" w:eastAsiaTheme="minorEastAsia" w:hAnsi="Times" w:cs="Times"/>
+          <w:i/>
+          <w:sz w:val="24"/>
+          <w:szCs w:val="24"/>
+        </w:rPr>
+        <w:t>dpq</w:t>
+      </w:r>
+      <m:oMath>
+        <m:r>
+          <w:rPr>
+            <w:rFonts w:ascii="Cambria Math" w:eastAsiaTheme="minorEastAsia" w:hAnsi="Cambria Math" w:cs="Times"/>
+            <w:sz w:val="24"/>
+            <w:szCs w:val="24"/>
+          </w:rPr>
+          <m:t>[k]</m:t>
+        </m:r>
+        <m:r>
+          <m:rPr>
+            <m:sty m:val="p"/>
+          </m:rPr>
+          <w:rPr>
+            <w:rFonts w:ascii="Cambria Math" w:eastAsiaTheme="minorEastAsia" w:hAnsi="Cambria Math" w:cs="Times"/>
+            <w:sz w:val="24"/>
+            <w:szCs w:val="24"/>
+          </w:rPr>
+          <m:t xml:space="preserve"> </m:t>
+        </m:r>
+      </m:oMath>
+      <w:r>
+        <w:rPr>
+          <w:rFonts w:ascii="Times" w:eastAsiaTheme="minorEastAsia" w:hAnsi="Times" w:cs="Times"/>
+          <w:sz w:val="24"/>
+          <w:szCs w:val="24"/>
+        </w:rPr>
+        <w:t xml:space="preserve">em </w:t>
+      </w:r>
+      <w:r>
+        <w:rPr>
+          <w:rFonts w:ascii="Times" w:eastAsiaTheme="minorEastAsia" w:hAnsi="Times" w:cs="Times"/>
+          <w:i/>
+          <w:sz w:val="24"/>
+          <w:szCs w:val="24"/>
+        </w:rPr>
+        <w:t>dpq</w:t>
+      </w:r>
+      <m:oMath>
+        <m:r>
+          <m:rPr>
+            <m:sty m:val="p"/>
+          </m:rPr>
+          <w:rPr>
+            <w:rFonts w:ascii="Cambria Math" w:eastAsiaTheme="minorEastAsia" w:hAnsi="Cambria Math" w:cs="Times"/>
+            <w:sz w:val="24"/>
+            <w:szCs w:val="24"/>
+          </w:rPr>
+          <m:t xml:space="preserve">[root] </m:t>
+        </m:r>
+      </m:oMath>
+      <w:r>
+        <w:rPr>
+          <w:rFonts w:ascii="Times" w:eastAsiaTheme="minorEastAsia" w:hAnsi="Times" w:cs="Times"/>
+          <w:sz w:val="24"/>
+          <w:szCs w:val="24"/>
+        </w:rPr>
+        <w:t xml:space="preserve">até </w:t>
+      </w:r>
+      <w:r>
+        <w:rPr>
+          <w:rFonts w:ascii="Times" w:eastAsiaTheme="minorEastAsia" w:hAnsi="Times" w:cs="Times"/>
+          <w:i/>
+          <w:sz w:val="24"/>
+          <w:szCs w:val="24"/>
+        </w:rPr>
+        <w:t>dpq</w:t>
+      </w:r>
+      <m:oMath>
+        <m:r>
+          <w:rPr>
+            <w:rFonts w:ascii="Cambria Math" w:eastAsiaTheme="minorEastAsia" w:hAnsi="Cambria Math" w:cs="Times"/>
+            <w:sz w:val="24"/>
+            <w:szCs w:val="24"/>
+          </w:rPr>
+          <m:t>[k-1]</m:t>
+        </m:r>
+      </m:oMath>
+      <w:r>
+        <w:rPr>
+          <w:rFonts w:ascii="Times" w:eastAsiaTheme="minorEastAsia" w:hAnsi="Times" w:cs="Times"/>
+          <w:sz w:val="24"/>
+          <w:szCs w:val="24"/>
+        </w:rPr>
+        <w:t xml:space="preserve"> tal que </w:t>
+      </w:r>
+      <w:r>
+        <w:rPr>
+          <w:rFonts w:ascii="Times" w:eastAsiaTheme="minorEastAsia" w:hAnsi="Times" w:cs="Times"/>
+          <w:i/>
+          <w:sz w:val="24"/>
+          <w:szCs w:val="24"/>
+        </w:rPr>
+        <w:t>subtree(root,</w:t>
+      </w:r>
+      <m:oMath>
+        <m:r>
+          <w:rPr>
+            <w:rFonts w:ascii="Cambria Math" w:eastAsiaTheme="minorEastAsia" w:hAnsi="Cambria Math" w:cs="Times"/>
+            <w:sz w:val="24"/>
+            <w:szCs w:val="24"/>
+          </w:rPr>
+          <m:t>k-1</m:t>
+        </m:r>
+      </m:oMath>
+      <w:r>
+        <w:rPr>
+          <w:rFonts w:ascii="Times" w:eastAsiaTheme="minorEastAsia" w:hAnsi="Times" w:cs="Times"/>
+          <w:i/>
+          <w:sz w:val="24"/>
+          <w:szCs w:val="24"/>
+        </w:rPr>
+        <w:t>)</w:t>
+      </w:r>
+      <w:r>
+        <w:rPr>
+          <w:rFonts w:ascii="Times" w:eastAsiaTheme="minorEastAsia" w:hAnsi="Times" w:cs="Times"/>
+          <w:sz w:val="24"/>
+          <w:szCs w:val="24"/>
+        </w:rPr>
+        <w:t xml:space="preserve"> forme um heap descendente. Assim, para implementar </w:t>
+      </w:r>
+      <w:r>
+        <w:rPr>
+          <w:rFonts w:ascii="Times" w:eastAsiaTheme="minorEastAsia" w:hAnsi="Times" w:cs="Times"/>
+          <w:i/>
+          <w:sz w:val="24"/>
+          <w:szCs w:val="24"/>
+        </w:rPr>
+        <w:t>pqmaxdelete(dpq,k)</w:t>
+      </w:r>
+      <w:r>
+        <w:rPr>
+          <w:rFonts w:ascii="Times" w:eastAsiaTheme="minorEastAsia" w:hAnsi="Times" w:cs="Times"/>
+          <w:sz w:val="24"/>
+          <w:szCs w:val="24"/>
+        </w:rPr>
+        <w:t xml:space="preserve"> para um heap descendente de </w:t>
+      </w:r>
+      <m:oMath>
+        <m:r>
+          <w:rPr>
+            <w:rFonts w:ascii="Cambria Math" w:eastAsiaTheme="minorEastAsia" w:hAnsi="Cambria Math" w:cs="Times"/>
+            <w:sz w:val="24"/>
+            <w:szCs w:val="24"/>
+          </w:rPr>
+          <m:t>k</m:t>
+        </m:r>
+      </m:oMath>
+      <w:r>
+        <w:rPr>
+          <w:rFonts w:ascii="Times" w:eastAsiaTheme="minorEastAsia" w:hAnsi="Times" w:cs="Times"/>
+          <w:sz w:val="24"/>
+          <w:szCs w:val="24"/>
+        </w:rPr>
+        <w:t xml:space="preserve"> elementos por:</w:t>
+      </w:r>
+    </w:p>
+    <w:p>
+      <w:pPr>
+        <w:jc w:val="both"/>
+        <w:rPr>
+          <w:rFonts w:ascii="Courier New" w:eastAsiaTheme="minorEastAsia" w:hAnsi="Courier New" w:cs="Courier New"/>
+          <w:sz w:val="20"/>
+          <w:szCs w:val="24"/>
+        </w:rPr>
+      </w:pPr>
+      <w:r>
+        <w:rPr>
+          <w:rFonts w:ascii="Courier New" w:eastAsiaTheme="minorEastAsia" w:hAnsi="Courier New" w:cs="Courier New"/>
+          <w:sz w:val="20"/>
+          <w:szCs w:val="24"/>
+        </w:rPr>
+        <w:t>int pqmaxdelete(int dpq[], int k)</w:t>
+      </w:r>
+    </w:p>
+    <w:p>
+      <w:pPr>
+        <w:jc w:val="both"/>
+        <w:rPr>
+          <w:rFonts w:ascii="Courier New" w:eastAsiaTheme="minorEastAsia" w:hAnsi="Courier New" w:cs="Courier New"/>
+          <w:sz w:val="20"/>
+          <w:szCs w:val="24"/>
+        </w:rPr>
+      </w:pPr>
+      <w:r>
+        <w:rPr>
+          <w:rFonts w:ascii="Courier New" w:eastAsiaTheme="minorEastAsia" w:hAnsi="Courier New" w:cs="Courier New"/>
+          <w:sz w:val="20"/>
+          <w:szCs w:val="24"/>
+        </w:rPr>
+        <w:t>{</w:t>
+      </w:r>
+    </w:p>
+    <w:p>
+      <w:pPr>
+        <w:jc w:val="both"/>
+        <w:rPr>
+          <w:rFonts w:ascii="Courier New" w:eastAsiaTheme="minorEastAsia" w:hAnsi="Courier New" w:cs="Courier New"/>
+          <w:sz w:val="20"/>
+          <w:szCs w:val="24"/>
+        </w:rPr>
+      </w:pPr>
+      <w:r>
+        <w:rPr>
+          <w:rFonts w:ascii="Courier New" w:eastAsiaTheme="minorEastAsia" w:hAnsi="Courier New" w:cs="Courier New"/>
+          <w:sz w:val="20"/>
+          <w:szCs w:val="24"/>
+        </w:rPr>
+        <w:t xml:space="preserve">    int p = dpq[0];</w:t>
+      </w:r>
+    </w:p>
+    <w:p>
+      <w:pPr>
+        <w:jc w:val="both"/>
+        <w:rPr>
+          <w:rFonts w:ascii="Courier New" w:eastAsiaTheme="minorEastAsia" w:hAnsi="Courier New" w:cs="Courier New"/>
+          <w:sz w:val="20"/>
+          <w:szCs w:val="24"/>
+        </w:rPr>
+      </w:pPr>
+      <w:r>
+        <w:rPr>
+          <w:rFonts w:ascii="Courier New" w:eastAsiaTheme="minorEastAsia" w:hAnsi="Courier New" w:cs="Courier New"/>
+          <w:sz w:val="20"/>
+          <w:szCs w:val="24"/>
+        </w:rPr>
+        <w:t xml:space="preserve">    dpq[0] = dpq[k - 1];</w:t>
+      </w:r>
+    </w:p>
+    <w:p>
+      <w:pPr>
+        <w:jc w:val="both"/>
+        <w:rPr>
+          <w:rFonts w:ascii="Courier New" w:eastAsiaTheme="minorEastAsia" w:hAnsi="Courier New" w:cs="Courier New"/>
+          <w:sz w:val="20"/>
+          <w:szCs w:val="24"/>
+        </w:rPr>
+      </w:pPr>
+      <w:r>
+        <w:rPr>
+          <w:rFonts w:ascii="Courier New" w:eastAsiaTheme="minorEastAsia" w:hAnsi="Courier New" w:cs="Courier New"/>
+          <w:sz w:val="20"/>
+          <w:szCs w:val="24"/>
+        </w:rPr>
+        <w:t xml:space="preserve">    adjustheap(dpq, 0, k - 1);</w:t>
+      </w:r>
+    </w:p>
+    <w:p>
+      <w:pPr>
+        <w:jc w:val="both"/>
+        <w:rPr>
+          <w:rFonts w:ascii="Courier New" w:eastAsiaTheme="minorEastAsia" w:hAnsi="Courier New" w:cs="Courier New"/>
+          <w:sz w:val="20"/>
+          <w:szCs w:val="24"/>
+        </w:rPr>
+      </w:pPr>
+      <w:r>
+        <w:rPr>
+          <w:rFonts w:ascii="Courier New" w:eastAsiaTheme="minorEastAsia" w:hAnsi="Courier New" w:cs="Courier New"/>
+          <w:sz w:val="20"/>
+          <w:szCs w:val="24"/>
+        </w:rPr>
+        <w:t xml:space="preserve">    return p;</w:t>
+      </w:r>
+    </w:p>
+    <w:p>
+      <w:pPr>
+        <w:jc w:val="both"/>
+        <w:rPr>
+          <w:rFonts w:ascii="Courier New" w:eastAsiaTheme="minorEastAsia" w:hAnsi="Courier New" w:cs="Courier New"/>
+          <w:sz w:val="20"/>
+          <w:szCs w:val="24"/>
+        </w:rPr>
+      </w:pPr>
+      <w:r>
+        <w:rPr>
+          <w:rFonts w:ascii="Courier New" w:eastAsiaTheme="minorEastAsia" w:hAnsi="Courier New" w:cs="Courier New"/>
+          <w:sz w:val="20"/>
+          <w:szCs w:val="24"/>
+        </w:rPr>
+        <w:t>}</w:t>
+      </w:r>
+    </w:p>
+    <w:p>
+      <w:pPr>
+        <w:pStyle w:val="Ttulo3"/>
+        <w:rPr>
+          <w:rFonts w:ascii="Times" w:hAnsi="Times" w:cs="Times"/>
+          <w:sz w:val="24"/>
+          <w:szCs w:val="24"/>
+        </w:rPr>
+      </w:pPr>
+      <w:r>
+        <w:rPr>
+          <w:rFonts w:ascii="Times" w:hAnsi="Times" w:cs="Times"/>
+          <w:sz w:val="24"/>
+          <w:szCs w:val="24"/>
+        </w:rPr>
+        <w:t>ADJUSTHEAP</w:t>
+      </w:r>
+    </w:p>
+    <w:p>
+      <w:pPr>
+        <w:ind w:firstLine="708"/>
+        <w:jc w:val="both"/>
+        <w:rPr>
+          <w:rFonts w:ascii="Times" w:eastAsiaTheme="minorEastAsia" w:hAnsi="Times" w:cs="Times"/>
+          <w:sz w:val="24"/>
+          <w:szCs w:val="24"/>
+        </w:rPr>
+      </w:pPr>
+      <w:r>
+        <w:rPr>
+          <w:rFonts w:ascii="Times" w:hAnsi="Times" w:cs="Times"/>
+          <w:sz w:val="24"/>
+          <w:szCs w:val="24"/>
+        </w:rPr>
+        <w:t>HHDHUEUHDUEHDEUFHUEHRUEH</w:t>
+      </w:r>
+    </w:p>
+    <w:p>
+      <w:pPr>
+        <w:pStyle w:val="Ttulo3"/>
+        <w:rPr>
+          <w:rFonts w:ascii="Times" w:hAnsi="Times" w:cs="Times"/>
+          <w:sz w:val="24"/>
+          <w:szCs w:val="24"/>
+        </w:rPr>
+      </w:pPr>
+      <w:r>
+        <w:rPr>
+          <w:rFonts w:ascii="Times" w:hAnsi="Times" w:cs="Times"/>
+          <w:sz w:val="24"/>
+          <w:szCs w:val="24"/>
+        </w:rPr>
+        <w:t>LARGESON</w:t>
+      </w:r>
+    </w:p>
+    <w:p>
+      <w:pPr>
+        <w:ind w:firstLine="708"/>
+        <w:jc w:val="both"/>
+        <w:rPr>
+          <w:rFonts w:ascii="Times" w:eastAsiaTheme="minorEastAsia" w:hAnsi="Times" w:cs="Times"/>
+          <w:sz w:val="24"/>
+          <w:szCs w:val="24"/>
+        </w:rPr>
+      </w:pPr>
+      <w:r>
+        <w:rPr>
+          <w:rFonts w:ascii="Times" w:hAnsi="Times" w:cs="Times"/>
+          <w:sz w:val="24"/>
+          <w:szCs w:val="24"/>
+        </w:rPr>
+        <w:t>HHDHUEUHDUEHDEUFHUEHRUEH</w:t>
+      </w:r>
+    </w:p>
+    <w:p>
+      <w:pPr>
+        <w:pStyle w:val="Ttulo3"/>
+        <w:rPr>
+          <w:rFonts w:ascii="Times" w:hAnsi="Times" w:cs="Times"/>
+          <w:sz w:val="24"/>
+          <w:szCs w:val="24"/>
+        </w:rPr>
+      </w:pPr>
+      <w:r>
+        <w:rPr>
+          <w:rFonts w:ascii="Times" w:hAnsi="Times" w:cs="Times"/>
+          <w:sz w:val="24"/>
+          <w:szCs w:val="24"/>
+        </w:rPr>
+        <w:t>HEAPSORT</w:t>
+      </w:r>
+    </w:p>
+    <w:p>
+      <w:pPr>
+        <w:ind w:firstLine="708"/>
+        <w:jc w:val="both"/>
+        <w:rPr>
+          <w:rFonts w:ascii="Times" w:eastAsiaTheme="minorEastAsia" w:hAnsi="Times" w:cs="Times"/>
+          <w:sz w:val="24"/>
+          <w:szCs w:val="24"/>
+        </w:rPr>
+      </w:pPr>
+      <w:r>
+        <w:rPr>
+          <w:rFonts w:ascii="Times" w:hAnsi="Times" w:cs="Times"/>
+          <w:sz w:val="24"/>
+          <w:szCs w:val="24"/>
+        </w:rPr>
+        <w:t>HHDHUEUHDUEHDEUFHUEHRUEH</w:t>
+      </w:r>
+    </w:p>
+    <w:p>
+      <w:pPr>
+        <w:pStyle w:val="Ttulo3"/>
+        <w:rPr>
+          <w:rFonts w:ascii="Times" w:hAnsi="Times" w:cs="Times"/>
+          <w:sz w:val="24"/>
+          <w:szCs w:val="24"/>
+        </w:rPr>
+      </w:pPr>
+      <w:r>
+        <w:rPr>
+          <w:rFonts w:ascii="Times" w:hAnsi="Times" w:cs="Times"/>
+          <w:sz w:val="24"/>
+          <w:szCs w:val="24"/>
+        </w:rPr>
+        <w:t>PRINTARRAY</w:t>
+      </w:r>
+    </w:p>
+    <w:p>
+      <w:pPr>
+        <w:ind w:firstLine="708"/>
+        <w:jc w:val="both"/>
+        <w:rPr>
+          <w:rFonts w:ascii="Times" w:eastAsiaTheme="minorEastAsia" w:hAnsi="Times" w:cs="Times"/>
+          <w:sz w:val="24"/>
+          <w:szCs w:val="24"/>
+        </w:rPr>
+      </w:pPr>
+      <w:r>
+        <w:rPr>
+          <w:rFonts w:ascii="Times" w:hAnsi="Times" w:cs="Times"/>
+          <w:sz w:val="24"/>
+          <w:szCs w:val="24"/>
+        </w:rPr>
+        <w:t>HHDHUEUHDUEHDEUFHUEHRUEH</w:t>
+      </w:r>
+    </w:p>
+    <w:p>
+      <w:pPr>
+        <w:jc w:val="both"/>
+        <w:rPr>
+          <w:rFonts w:ascii="Times" w:hAnsi="Times" w:cs="Times"/>
+          <w:sz w:val="20"/>
+          <w:szCs w:val="24"/>
+        </w:rPr>
+      </w:pPr>
+    </w:p>
+    <w:p>
+      <w:pPr>
+        <w:jc w:val="both"/>
+        <w:rPr>
+          <w:rFonts w:ascii="Times" w:hAnsi="Times" w:cs="Times"/>
+          <w:sz w:val="20"/>
+          <w:szCs w:val="24"/>
+        </w:rPr>
+      </w:pPr>
+    </w:p>
+    <w:p>
+      <w:pPr>
+        <w:jc w:val="both"/>
+        <w:rPr>
+          <w:rFonts w:ascii="Times" w:hAnsi="Times" w:cs="Times"/>
+          <w:sz w:val="20"/>
+          <w:szCs w:val="24"/>
+        </w:rPr>
+      </w:pPr>
+    </w:p>
+    <w:p>
+      <w:pPr>
+        <w:jc w:val="both"/>
+        <w:rPr>
+          <w:rFonts w:ascii="Times" w:hAnsi="Times" w:cs="Times"/>
+          <w:sz w:val="20"/>
+          <w:szCs w:val="24"/>
+        </w:rPr>
+      </w:pPr>
+    </w:p>
+    <w:p>
+      <w:pPr>
+        <w:jc w:val="both"/>
+        <w:rPr>
+          <w:rFonts w:ascii="Times" w:hAnsi="Times" w:cs="Times"/>
+          <w:sz w:val="20"/>
+          <w:szCs w:val="24"/>
+        </w:rPr>
+      </w:pPr>
+    </w:p>
+    <w:p>
+      <w:pPr>
+        <w:jc w:val="both"/>
+        <w:rPr>
+          <w:rFonts w:ascii="Times" w:hAnsi="Times" w:cs="Times"/>
+          <w:sz w:val="20"/>
+          <w:szCs w:val="24"/>
+        </w:rPr>
       </w:pPr>
     </w:p>
     <w:p>
@@ -5957,6 +7316,25 @@
         <w:t>Incluir detalhes da configuração do computador usado para testes: sistema Operacional, quantidade de RAM, velocidade da CPU (Hz).</w:t>
       </w:r>
       <w:bookmarkEnd w:id="14"/>
+    </w:p>
+    <w:p>
+      <w:pPr>
+        <w:ind w:firstLine="708"/>
+        <w:jc w:val="both"/>
+        <w:rPr>
+          <w:rFonts w:ascii="Times" w:eastAsiaTheme="minorEastAsia" w:hAnsi="Times" w:cs="Times"/>
+          <w:sz w:val="24"/>
+          <w:szCs w:val="24"/>
+        </w:rPr>
+      </w:pPr>
+      <w:r>
+        <w:rPr>
+          <w:rFonts w:ascii="Times" w:hAnsi="Times" w:cs="Times"/>
+          <w:sz w:val="24"/>
+          <w:szCs w:val="24"/>
+        </w:rPr>
+        <w:t>As configurações do computador utilizado nos testes de comparativos dos algoritmos de ordenação:</w:t>
+      </w:r>
     </w:p>
     <w:p>
       <w:pPr>
@@ -6059,7 +7437,6 @@
           <w:sz w:val="24"/>
           <w:szCs w:val="24"/>
         </w:rPr>
-        <w:lastRenderedPageBreak/>
         <w:t>Referências</w:t>
       </w:r>
       <w:bookmarkEnd w:id="18"/>
@@ -6285,7 +7662,7 @@
             <w:rPr>
               <w:noProof/>
             </w:rPr>
-            <w:t>5</w:t>
+            <w:t>7</w:t>
           </w:r>
         </w:fldSimple>
       </w:p>
@@ -7518,6 +8895,28 @@
       <w:color w:val="4F81BD" w:themeColor="accent1"/>
       <w:sz w:val="26"/>
       <w:szCs w:val="26"/>
+    </w:rPr>
+  </w:style>
+  <w:style w:type="paragraph" w:styleId="Ttulo3">
+    <w:name w:val="heading 3"/>
+    <w:basedOn w:val="Normal"/>
+    <w:next w:val="Normal"/>
+    <w:link w:val="Ttulo3Char"/>
+    <w:uiPriority w:val="9"/>
+    <w:unhideWhenUsed/>
+    <w:qFormat/>
+    <w:rsid w:val="009A5C0E"/>
+    <w:pPr>
+      <w:keepNext/>
+      <w:keepLines/>
+      <w:spacing w:before="200" w:after="0"/>
+      <w:outlineLvl w:val="2"/>
+    </w:pPr>
+    <w:rPr>
+      <w:rFonts w:asciiTheme="majorHAnsi" w:eastAsiaTheme="majorEastAsia" w:hAnsiTheme="majorHAnsi" w:cstheme="majorBidi"/>
+      <w:b/>
+      <w:bCs/>
+      <w:color w:val="4F81BD" w:themeColor="accent1"/>
     </w:rPr>
   </w:style>
   <w:style w:type="character" w:default="1" w:styleId="Fontepargpadro">
@@ -7750,6 +9149,19 @@
     <w:uiPriority w:val="99"/>
     <w:rsid w:val="007E18DB"/>
   </w:style>
+  <w:style w:type="character" w:customStyle="1" w:styleId="Ttulo3Char">
+    <w:name w:val="Título 3 Char"/>
+    <w:basedOn w:val="Fontepargpadro"/>
+    <w:link w:val="Ttulo3"/>
+    <w:uiPriority w:val="9"/>
+    <w:rsid w:val="009A5C0E"/>
+    <w:rPr>
+      <w:rFonts w:asciiTheme="majorHAnsi" w:eastAsiaTheme="majorEastAsia" w:hAnsiTheme="majorHAnsi" w:cstheme="majorBidi"/>
+      <w:b/>
+      <w:bCs/>
+      <w:color w:val="4F81BD" w:themeColor="accent1"/>
+    </w:rPr>
+  </w:style>
 </w:styles>
 </file>
 
@@ -7845,7 +9257,7 @@
   </w:compat>
   <w:rsids>
     <w:rsidRoot w:val="00DE5764"/>
-    <w:rsid w:val="00314390"/>
+    <w:rsid w:val="00232ED1"/>
     <w:rsid w:val="00DE5764"/>
   </w:rsids>
   <m:mathPr>
@@ -8072,6 +9484,10 @@
   </w:style>
   <w:style w:type="paragraph" w:customStyle="1" w:styleId="D88F553CF97A4004962B4B0963E07C3F">
     <w:name w:val="D88F553CF97A4004962B4B0963E07C3F"/>
+    <w:rsid w:val="00DE5764"/>
+  </w:style>
+  <w:style w:type="paragraph" w:customStyle="1" w:styleId="CC08B2741AD249CC9686C4F3D436C4C1">
+    <w:name w:val="CC08B2741AD249CC9686C4F3D436C4C1"/>
     <w:rsid w:val="00DE5764"/>
   </w:style>
 </w:styles>

</xml_diff>

<commit_message>
Subindo pasta de materiais e adicionando tabelas comparativas
</commit_message>
<xml_diff>
--- a/Relatorio_Equipe_HeapSort.docx
+++ b/Relatorio_Equipe_HeapSort.docx
@@ -333,7 +333,7 @@
             </w:rPr>
             <w:fldChar w:fldCharType="separate"/>
           </w:r>
-          <w:hyperlink w:anchor="_Toc200093191" w:history="1">
+          <w:hyperlink w:anchor="_Toc200142111" w:history="1">
             <w:r>
               <w:rPr>
                 <w:rStyle w:val="Hyperlink"/>
@@ -377,7 +377,7 @@
                 <w:noProof/>
                 <w:webHidden/>
               </w:rPr>
-              <w:instrText xml:space="preserve"> PAGEREF _Toc200093191 \h </w:instrText>
+              <w:instrText xml:space="preserve"> PAGEREF _Toc200142111 \h </w:instrText>
             </w:r>
             <w:r>
               <w:rPr>
@@ -420,7 +420,7 @@
               <w:lang w:eastAsia="pt-BR"/>
             </w:rPr>
           </w:pPr>
-          <w:hyperlink w:anchor="_Toc200093192" w:history="1">
+          <w:hyperlink w:anchor="_Toc200142112" w:history="1">
             <w:r>
               <w:rPr>
                 <w:rStyle w:val="Hyperlink"/>
@@ -448,7 +448,7 @@
                 <w:noProof/>
                 <w:webHidden/>
               </w:rPr>
-              <w:instrText xml:space="preserve"> PAGEREF _Toc200093192 \h </w:instrText>
+              <w:instrText xml:space="preserve"> PAGEREF _Toc200142112 \h </w:instrText>
             </w:r>
             <w:r>
               <w:rPr>
@@ -491,7 +491,7 @@
               <w:lang w:eastAsia="pt-BR"/>
             </w:rPr>
           </w:pPr>
-          <w:hyperlink w:anchor="_Toc200093193" w:history="1">
+          <w:hyperlink w:anchor="_Toc200142113" w:history="1">
             <w:r>
               <w:rPr>
                 <w:rStyle w:val="Hyperlink"/>
@@ -519,7 +519,7 @@
                 <w:noProof/>
                 <w:webHidden/>
               </w:rPr>
-              <w:instrText xml:space="preserve"> PAGEREF _Toc200093193 \h </w:instrText>
+              <w:instrText xml:space="preserve"> PAGEREF _Toc200142113 \h </w:instrText>
             </w:r>
             <w:r>
               <w:rPr>
@@ -562,7 +562,7 @@
               <w:lang w:eastAsia="pt-BR"/>
             </w:rPr>
           </w:pPr>
-          <w:hyperlink w:anchor="_Toc200093194" w:history="1">
+          <w:hyperlink w:anchor="_Toc200142114" w:history="1">
             <w:r>
               <w:rPr>
                 <w:rStyle w:val="Hyperlink"/>
@@ -590,7 +590,7 @@
                 <w:noProof/>
                 <w:webHidden/>
               </w:rPr>
-              <w:instrText xml:space="preserve"> PAGEREF _Toc200093194 \h </w:instrText>
+              <w:instrText xml:space="preserve"> PAGEREF _Toc200142114 \h </w:instrText>
             </w:r>
             <w:r>
               <w:rPr>
@@ -634,7 +634,7 @@
               <w:lang w:eastAsia="pt-BR"/>
             </w:rPr>
           </w:pPr>
-          <w:hyperlink w:anchor="_Toc200093195" w:history="1">
+          <w:hyperlink w:anchor="_Toc200142115" w:history="1">
             <w:r>
               <w:rPr>
                 <w:rStyle w:val="Hyperlink"/>
@@ -678,7 +678,7 @@
                 <w:noProof/>
                 <w:webHidden/>
               </w:rPr>
-              <w:instrText xml:space="preserve"> PAGEREF _Toc200093195 \h </w:instrText>
+              <w:instrText xml:space="preserve"> PAGEREF _Toc200142115 \h </w:instrText>
             </w:r>
             <w:r>
               <w:rPr>
@@ -721,7 +721,7 @@
               <w:lang w:eastAsia="pt-BR"/>
             </w:rPr>
           </w:pPr>
-          <w:hyperlink w:anchor="_Toc200093196" w:history="1">
+          <w:hyperlink w:anchor="_Toc200142116" w:history="1">
             <w:r>
               <w:rPr>
                 <w:rStyle w:val="Hyperlink"/>
@@ -749,7 +749,7 @@
                 <w:noProof/>
                 <w:webHidden/>
               </w:rPr>
-              <w:instrText xml:space="preserve"> PAGEREF _Toc200093196 \h </w:instrText>
+              <w:instrText xml:space="preserve"> PAGEREF _Toc200142116 \h </w:instrText>
             </w:r>
             <w:r>
               <w:rPr>
@@ -792,7 +792,7 @@
               <w:lang w:eastAsia="pt-BR"/>
             </w:rPr>
           </w:pPr>
-          <w:hyperlink w:anchor="_Toc200093197" w:history="1">
+          <w:hyperlink w:anchor="_Toc200142117" w:history="1">
             <w:r>
               <w:rPr>
                 <w:rStyle w:val="Hyperlink"/>
@@ -820,7 +820,7 @@
                 <w:noProof/>
                 <w:webHidden/>
               </w:rPr>
-              <w:instrText xml:space="preserve"> PAGEREF _Toc200093197 \h </w:instrText>
+              <w:instrText xml:space="preserve"> PAGEREF _Toc200142117 \h </w:instrText>
             </w:r>
             <w:r>
               <w:rPr>
@@ -863,7 +863,7 @@
               <w:lang w:eastAsia="pt-BR"/>
             </w:rPr>
           </w:pPr>
-          <w:hyperlink w:anchor="_Toc200093198" w:history="1">
+          <w:hyperlink w:anchor="_Toc200142118" w:history="1">
             <w:r>
               <w:rPr>
                 <w:rStyle w:val="Hyperlink"/>
@@ -891,7 +891,7 @@
                 <w:noProof/>
                 <w:webHidden/>
               </w:rPr>
-              <w:instrText xml:space="preserve"> PAGEREF _Toc200093198 \h </w:instrText>
+              <w:instrText xml:space="preserve"> PAGEREF _Toc200142118 \h </w:instrText>
             </w:r>
             <w:r>
               <w:rPr>
@@ -934,7 +934,7 @@
               <w:lang w:eastAsia="pt-BR"/>
             </w:rPr>
           </w:pPr>
-          <w:hyperlink w:anchor="_Toc200093199" w:history="1">
+          <w:hyperlink w:anchor="_Toc200142119" w:history="1">
             <w:r>
               <w:rPr>
                 <w:rStyle w:val="Hyperlink"/>
@@ -962,7 +962,7 @@
                 <w:noProof/>
                 <w:webHidden/>
               </w:rPr>
-              <w:instrText xml:space="preserve"> PAGEREF _Toc200093199 \h </w:instrText>
+              <w:instrText xml:space="preserve"> PAGEREF _Toc200142119 \h </w:instrText>
             </w:r>
             <w:r>
               <w:rPr>
@@ -1005,7 +1005,7 @@
               <w:lang w:eastAsia="pt-BR"/>
             </w:rPr>
           </w:pPr>
-          <w:hyperlink w:anchor="_Toc200093200" w:history="1">
+          <w:hyperlink w:anchor="_Toc200142120" w:history="1">
             <w:r>
               <w:rPr>
                 <w:rStyle w:val="Hyperlink"/>
@@ -1033,7 +1033,7 @@
                 <w:noProof/>
                 <w:webHidden/>
               </w:rPr>
-              <w:instrText xml:space="preserve"> PAGEREF _Toc200093200 \h </w:instrText>
+              <w:instrText xml:space="preserve"> PAGEREF _Toc200142120 \h </w:instrText>
             </w:r>
             <w:r>
               <w:rPr>
@@ -1076,7 +1076,7 @@
               <w:lang w:eastAsia="pt-BR"/>
             </w:rPr>
           </w:pPr>
-          <w:hyperlink w:anchor="_Toc200093201" w:history="1">
+          <w:hyperlink w:anchor="_Toc200142121" w:history="1">
             <w:r>
               <w:rPr>
                 <w:rStyle w:val="Hyperlink"/>
@@ -1104,7 +1104,7 @@
                 <w:noProof/>
                 <w:webHidden/>
               </w:rPr>
-              <w:instrText xml:space="preserve"> PAGEREF _Toc200093201 \h </w:instrText>
+              <w:instrText xml:space="preserve"> PAGEREF _Toc200142121 \h </w:instrText>
             </w:r>
             <w:r>
               <w:rPr>
@@ -1124,7 +1124,7 @@
                 <w:noProof/>
                 <w:webHidden/>
               </w:rPr>
-              <w:t>4</w:t>
+              <w:t>5</w:t>
             </w:r>
             <w:r>
               <w:rPr>
@@ -1148,7 +1148,7 @@
               <w:lang w:eastAsia="pt-BR"/>
             </w:rPr>
           </w:pPr>
-          <w:hyperlink w:anchor="_Toc200093202" w:history="1">
+          <w:hyperlink w:anchor="_Toc200142122" w:history="1">
             <w:r>
               <w:rPr>
                 <w:rStyle w:val="Hyperlink"/>
@@ -1192,7 +1192,7 @@
                 <w:noProof/>
                 <w:webHidden/>
               </w:rPr>
-              <w:instrText xml:space="preserve"> PAGEREF _Toc200093202 \h </w:instrText>
+              <w:instrText xml:space="preserve"> PAGEREF _Toc200142122 \h </w:instrText>
             </w:r>
             <w:r>
               <w:rPr>
@@ -1235,7 +1235,7 @@
               <w:lang w:eastAsia="pt-BR"/>
             </w:rPr>
           </w:pPr>
-          <w:hyperlink w:anchor="_Toc200093203" w:history="1">
+          <w:hyperlink w:anchor="_Toc200142123" w:history="1">
             <w:r>
               <w:rPr>
                 <w:rStyle w:val="Hyperlink"/>
@@ -1263,7 +1263,7 @@
                 <w:noProof/>
                 <w:webHidden/>
               </w:rPr>
-              <w:instrText xml:space="preserve"> PAGEREF _Toc200093203 \h </w:instrText>
+              <w:instrText xml:space="preserve"> PAGEREF _Toc200142123 \h </w:instrText>
             </w:r>
             <w:r>
               <w:rPr>
@@ -1284,6 +1284,431 @@
                 <w:webHidden/>
               </w:rPr>
               <w:t>5</w:t>
+            </w:r>
+            <w:r>
+              <w:rPr>
+                <w:noProof/>
+                <w:webHidden/>
+              </w:rPr>
+              <w:fldChar w:fldCharType="end"/>
+            </w:r>
+          </w:hyperlink>
+        </w:p>
+        <w:p>
+          <w:pPr>
+            <w:pStyle w:val="Sumrio3"/>
+            <w:tabs>
+              <w:tab w:val="right" w:leader="dot" w:pos="9016"/>
+            </w:tabs>
+            <w:rPr>
+              <w:rFonts w:eastAsiaTheme="minorEastAsia"/>
+              <w:noProof/>
+              <w:lang w:eastAsia="pt-BR"/>
+            </w:rPr>
+          </w:pPr>
+          <w:hyperlink w:anchor="_Toc200142124" w:history="1">
+            <w:r>
+              <w:rPr>
+                <w:rStyle w:val="Hyperlink"/>
+                <w:rFonts w:ascii="Times" w:hAnsi="Times" w:cs="Times"/>
+                <w:noProof/>
+              </w:rPr>
+              <w:t>PQINSERT</w:t>
+            </w:r>
+            <w:r>
+              <w:rPr>
+                <w:noProof/>
+                <w:webHidden/>
+              </w:rPr>
+              <w:tab/>
+            </w:r>
+            <w:r>
+              <w:rPr>
+                <w:noProof/>
+                <w:webHidden/>
+              </w:rPr>
+              <w:fldChar w:fldCharType="begin"/>
+            </w:r>
+            <w:r>
+              <w:rPr>
+                <w:noProof/>
+                <w:webHidden/>
+              </w:rPr>
+              <w:instrText xml:space="preserve"> PAGEREF _Toc200142124 \h </w:instrText>
+            </w:r>
+            <w:r>
+              <w:rPr>
+                <w:noProof/>
+                <w:webHidden/>
+              </w:rPr>
+            </w:r>
+            <w:r>
+              <w:rPr>
+                <w:noProof/>
+                <w:webHidden/>
+              </w:rPr>
+              <w:fldChar w:fldCharType="separate"/>
+            </w:r>
+            <w:r>
+              <w:rPr>
+                <w:noProof/>
+                <w:webHidden/>
+              </w:rPr>
+              <w:t>5</w:t>
+            </w:r>
+            <w:r>
+              <w:rPr>
+                <w:noProof/>
+                <w:webHidden/>
+              </w:rPr>
+              <w:fldChar w:fldCharType="end"/>
+            </w:r>
+          </w:hyperlink>
+        </w:p>
+        <w:p>
+          <w:pPr>
+            <w:pStyle w:val="Sumrio3"/>
+            <w:tabs>
+              <w:tab w:val="right" w:leader="dot" w:pos="9016"/>
+            </w:tabs>
+            <w:rPr>
+              <w:rFonts w:eastAsiaTheme="minorEastAsia"/>
+              <w:noProof/>
+              <w:lang w:eastAsia="pt-BR"/>
+            </w:rPr>
+          </w:pPr>
+          <w:hyperlink w:anchor="_Toc200142125" w:history="1">
+            <w:r>
+              <w:rPr>
+                <w:rStyle w:val="Hyperlink"/>
+                <w:rFonts w:ascii="Times" w:hAnsi="Times" w:cs="Times"/>
+                <w:noProof/>
+              </w:rPr>
+              <w:t>PQMAXDELETE</w:t>
+            </w:r>
+            <w:r>
+              <w:rPr>
+                <w:noProof/>
+                <w:webHidden/>
+              </w:rPr>
+              <w:tab/>
+            </w:r>
+            <w:r>
+              <w:rPr>
+                <w:noProof/>
+                <w:webHidden/>
+              </w:rPr>
+              <w:fldChar w:fldCharType="begin"/>
+            </w:r>
+            <w:r>
+              <w:rPr>
+                <w:noProof/>
+                <w:webHidden/>
+              </w:rPr>
+              <w:instrText xml:space="preserve"> PAGEREF _Toc200142125 \h </w:instrText>
+            </w:r>
+            <w:r>
+              <w:rPr>
+                <w:noProof/>
+                <w:webHidden/>
+              </w:rPr>
+            </w:r>
+            <w:r>
+              <w:rPr>
+                <w:noProof/>
+                <w:webHidden/>
+              </w:rPr>
+              <w:fldChar w:fldCharType="separate"/>
+            </w:r>
+            <w:r>
+              <w:rPr>
+                <w:noProof/>
+                <w:webHidden/>
+              </w:rPr>
+              <w:t>6</w:t>
+            </w:r>
+            <w:r>
+              <w:rPr>
+                <w:noProof/>
+                <w:webHidden/>
+              </w:rPr>
+              <w:fldChar w:fldCharType="end"/>
+            </w:r>
+          </w:hyperlink>
+        </w:p>
+        <w:p>
+          <w:pPr>
+            <w:pStyle w:val="Sumrio3"/>
+            <w:tabs>
+              <w:tab w:val="right" w:leader="dot" w:pos="9016"/>
+            </w:tabs>
+            <w:rPr>
+              <w:rFonts w:eastAsiaTheme="minorEastAsia"/>
+              <w:noProof/>
+              <w:lang w:eastAsia="pt-BR"/>
+            </w:rPr>
+          </w:pPr>
+          <w:hyperlink w:anchor="_Toc200142126" w:history="1">
+            <w:r>
+              <w:rPr>
+                <w:rStyle w:val="Hyperlink"/>
+                <w:noProof/>
+              </w:rPr>
+              <w:t>ADJUSTHEAP</w:t>
+            </w:r>
+            <w:r>
+              <w:rPr>
+                <w:noProof/>
+                <w:webHidden/>
+              </w:rPr>
+              <w:tab/>
+            </w:r>
+            <w:r>
+              <w:rPr>
+                <w:noProof/>
+                <w:webHidden/>
+              </w:rPr>
+              <w:fldChar w:fldCharType="begin"/>
+            </w:r>
+            <w:r>
+              <w:rPr>
+                <w:noProof/>
+                <w:webHidden/>
+              </w:rPr>
+              <w:instrText xml:space="preserve"> PAGEREF _Toc200142126 \h </w:instrText>
+            </w:r>
+            <w:r>
+              <w:rPr>
+                <w:noProof/>
+                <w:webHidden/>
+              </w:rPr>
+            </w:r>
+            <w:r>
+              <w:rPr>
+                <w:noProof/>
+                <w:webHidden/>
+              </w:rPr>
+              <w:fldChar w:fldCharType="separate"/>
+            </w:r>
+            <w:r>
+              <w:rPr>
+                <w:noProof/>
+                <w:webHidden/>
+              </w:rPr>
+              <w:t>6</w:t>
+            </w:r>
+            <w:r>
+              <w:rPr>
+                <w:noProof/>
+                <w:webHidden/>
+              </w:rPr>
+              <w:fldChar w:fldCharType="end"/>
+            </w:r>
+          </w:hyperlink>
+        </w:p>
+        <w:p>
+          <w:pPr>
+            <w:pStyle w:val="Sumrio3"/>
+            <w:tabs>
+              <w:tab w:val="right" w:leader="dot" w:pos="9016"/>
+            </w:tabs>
+            <w:rPr>
+              <w:rFonts w:eastAsiaTheme="minorEastAsia"/>
+              <w:noProof/>
+              <w:lang w:eastAsia="pt-BR"/>
+            </w:rPr>
+          </w:pPr>
+          <w:hyperlink w:anchor="_Toc200142127" w:history="1">
+            <w:r>
+              <w:rPr>
+                <w:rStyle w:val="Hyperlink"/>
+                <w:rFonts w:ascii="Times" w:hAnsi="Times" w:cs="Times"/>
+                <w:noProof/>
+              </w:rPr>
+              <w:t>LARGESON</w:t>
+            </w:r>
+            <w:r>
+              <w:rPr>
+                <w:noProof/>
+                <w:webHidden/>
+              </w:rPr>
+              <w:tab/>
+            </w:r>
+            <w:r>
+              <w:rPr>
+                <w:noProof/>
+                <w:webHidden/>
+              </w:rPr>
+              <w:fldChar w:fldCharType="begin"/>
+            </w:r>
+            <w:r>
+              <w:rPr>
+                <w:noProof/>
+                <w:webHidden/>
+              </w:rPr>
+              <w:instrText xml:space="preserve"> PAGEREF _Toc200142127 \h </w:instrText>
+            </w:r>
+            <w:r>
+              <w:rPr>
+                <w:noProof/>
+                <w:webHidden/>
+              </w:rPr>
+            </w:r>
+            <w:r>
+              <w:rPr>
+                <w:noProof/>
+                <w:webHidden/>
+              </w:rPr>
+              <w:fldChar w:fldCharType="separate"/>
+            </w:r>
+            <w:r>
+              <w:rPr>
+                <w:noProof/>
+                <w:webHidden/>
+              </w:rPr>
+              <w:t>7</w:t>
+            </w:r>
+            <w:r>
+              <w:rPr>
+                <w:noProof/>
+                <w:webHidden/>
+              </w:rPr>
+              <w:fldChar w:fldCharType="end"/>
+            </w:r>
+          </w:hyperlink>
+        </w:p>
+        <w:p>
+          <w:pPr>
+            <w:pStyle w:val="Sumrio3"/>
+            <w:tabs>
+              <w:tab w:val="right" w:leader="dot" w:pos="9016"/>
+            </w:tabs>
+            <w:rPr>
+              <w:rFonts w:eastAsiaTheme="minorEastAsia"/>
+              <w:noProof/>
+              <w:lang w:eastAsia="pt-BR"/>
+            </w:rPr>
+          </w:pPr>
+          <w:hyperlink w:anchor="_Toc200142128" w:history="1">
+            <w:r>
+              <w:rPr>
+                <w:rStyle w:val="Hyperlink"/>
+                <w:rFonts w:ascii="Times" w:hAnsi="Times" w:cs="Times"/>
+                <w:noProof/>
+              </w:rPr>
+              <w:t>HEAPSORT</w:t>
+            </w:r>
+            <w:r>
+              <w:rPr>
+                <w:noProof/>
+                <w:webHidden/>
+              </w:rPr>
+              <w:tab/>
+            </w:r>
+            <w:r>
+              <w:rPr>
+                <w:noProof/>
+                <w:webHidden/>
+              </w:rPr>
+              <w:fldChar w:fldCharType="begin"/>
+            </w:r>
+            <w:r>
+              <w:rPr>
+                <w:noProof/>
+                <w:webHidden/>
+              </w:rPr>
+              <w:instrText xml:space="preserve"> PAGEREF _Toc200142128 \h </w:instrText>
+            </w:r>
+            <w:r>
+              <w:rPr>
+                <w:noProof/>
+                <w:webHidden/>
+              </w:rPr>
+            </w:r>
+            <w:r>
+              <w:rPr>
+                <w:noProof/>
+                <w:webHidden/>
+              </w:rPr>
+              <w:fldChar w:fldCharType="separate"/>
+            </w:r>
+            <w:r>
+              <w:rPr>
+                <w:noProof/>
+                <w:webHidden/>
+              </w:rPr>
+              <w:t>7</w:t>
+            </w:r>
+            <w:r>
+              <w:rPr>
+                <w:noProof/>
+                <w:webHidden/>
+              </w:rPr>
+              <w:fldChar w:fldCharType="end"/>
+            </w:r>
+          </w:hyperlink>
+        </w:p>
+        <w:p>
+          <w:pPr>
+            <w:pStyle w:val="Sumrio3"/>
+            <w:tabs>
+              <w:tab w:val="right" w:leader="dot" w:pos="9016"/>
+            </w:tabs>
+            <w:rPr>
+              <w:rFonts w:eastAsiaTheme="minorEastAsia"/>
+              <w:noProof/>
+              <w:lang w:eastAsia="pt-BR"/>
+            </w:rPr>
+          </w:pPr>
+          <w:hyperlink w:anchor="_Toc200142129" w:history="1">
+            <w:r>
+              <w:rPr>
+                <w:rStyle w:val="Hyperlink"/>
+                <w:rFonts w:ascii="Times" w:hAnsi="Times" w:cs="Times"/>
+                <w:noProof/>
+              </w:rPr>
+              <w:t>PRINTARRAY</w:t>
+            </w:r>
+            <w:r>
+              <w:rPr>
+                <w:noProof/>
+                <w:webHidden/>
+              </w:rPr>
+              <w:tab/>
+            </w:r>
+            <w:r>
+              <w:rPr>
+                <w:noProof/>
+                <w:webHidden/>
+              </w:rPr>
+              <w:fldChar w:fldCharType="begin"/>
+            </w:r>
+            <w:r>
+              <w:rPr>
+                <w:noProof/>
+                <w:webHidden/>
+              </w:rPr>
+              <w:instrText xml:space="preserve"> PAGEREF _Toc200142129 \h </w:instrText>
+            </w:r>
+            <w:r>
+              <w:rPr>
+                <w:noProof/>
+                <w:webHidden/>
+              </w:rPr>
+            </w:r>
+            <w:r>
+              <w:rPr>
+                <w:noProof/>
+                <w:webHidden/>
+              </w:rPr>
+              <w:fldChar w:fldCharType="separate"/>
+            </w:r>
+            <w:r>
+              <w:rPr>
+                <w:noProof/>
+                <w:webHidden/>
+              </w:rPr>
+              <w:t>7</w:t>
             </w:r>
             <w:r>
               <w:rPr>
@@ -1306,11 +1731,10 @@
               <w:lang w:eastAsia="pt-BR"/>
             </w:rPr>
           </w:pPr>
-          <w:hyperlink w:anchor="_Toc200093204" w:history="1">
+          <w:hyperlink w:anchor="_Toc200142130" w:history="1">
             <w:r>
               <w:rPr>
                 <w:rStyle w:val="Hyperlink"/>
-                <w:rFonts w:ascii="Times" w:hAnsi="Times" w:cs="Times"/>
                 <w:noProof/>
               </w:rPr>
               <w:t>Tabelas e/ou gráficos deverão ser utilizados para apresentação dos resultados dos testes.</w:t>
@@ -1334,7 +1758,7 @@
                 <w:noProof/>
                 <w:webHidden/>
               </w:rPr>
-              <w:instrText xml:space="preserve"> PAGEREF _Toc200093204 \h </w:instrText>
+              <w:instrText xml:space="preserve"> PAGEREF _Toc200142130 \h </w:instrText>
             </w:r>
             <w:r>
               <w:rPr>
@@ -1354,7 +1778,7 @@
                 <w:noProof/>
                 <w:webHidden/>
               </w:rPr>
-              <w:t>5</w:t>
+              <w:t>7</w:t>
             </w:r>
             <w:r>
               <w:rPr>
@@ -1377,7 +1801,7 @@
               <w:lang w:eastAsia="pt-BR"/>
             </w:rPr>
           </w:pPr>
-          <w:hyperlink w:anchor="_Toc200093205" w:history="1">
+          <w:hyperlink w:anchor="_Toc200142131" w:history="1">
             <w:r>
               <w:rPr>
                 <w:rStyle w:val="Hyperlink"/>
@@ -1405,7 +1829,7 @@
                 <w:noProof/>
                 <w:webHidden/>
               </w:rPr>
-              <w:instrText xml:space="preserve"> PAGEREF _Toc200093205 \h </w:instrText>
+              <w:instrText xml:space="preserve"> PAGEREF _Toc200142131 \h </w:instrText>
             </w:r>
             <w:r>
               <w:rPr>
@@ -1425,7 +1849,147 @@
                 <w:noProof/>
                 <w:webHidden/>
               </w:rPr>
-              <w:t>5</w:t>
+              <w:t>7</w:t>
+            </w:r>
+            <w:r>
+              <w:rPr>
+                <w:noProof/>
+                <w:webHidden/>
+              </w:rPr>
+              <w:fldChar w:fldCharType="end"/>
+            </w:r>
+          </w:hyperlink>
+        </w:p>
+        <w:p>
+          <w:pPr>
+            <w:pStyle w:val="Sumrio3"/>
+            <w:tabs>
+              <w:tab w:val="right" w:leader="dot" w:pos="9016"/>
+            </w:tabs>
+            <w:rPr>
+              <w:rFonts w:eastAsiaTheme="minorEastAsia"/>
+              <w:noProof/>
+              <w:lang w:eastAsia="pt-BR"/>
+            </w:rPr>
+          </w:pPr>
+          <w:hyperlink w:anchor="_Toc200142132" w:history="1">
+            <w:r>
+              <w:rPr>
+                <w:rStyle w:val="Hyperlink"/>
+                <w:noProof/>
+              </w:rPr>
+              <w:t>Sistema Operacional</w:t>
+            </w:r>
+            <w:r>
+              <w:rPr>
+                <w:noProof/>
+                <w:webHidden/>
+              </w:rPr>
+              <w:tab/>
+            </w:r>
+            <w:r>
+              <w:rPr>
+                <w:noProof/>
+                <w:webHidden/>
+              </w:rPr>
+              <w:fldChar w:fldCharType="begin"/>
+            </w:r>
+            <w:r>
+              <w:rPr>
+                <w:noProof/>
+                <w:webHidden/>
+              </w:rPr>
+              <w:instrText xml:space="preserve"> PAGEREF _Toc200142132 \h </w:instrText>
+            </w:r>
+            <w:r>
+              <w:rPr>
+                <w:noProof/>
+                <w:webHidden/>
+              </w:rPr>
+            </w:r>
+            <w:r>
+              <w:rPr>
+                <w:noProof/>
+                <w:webHidden/>
+              </w:rPr>
+              <w:fldChar w:fldCharType="separate"/>
+            </w:r>
+            <w:r>
+              <w:rPr>
+                <w:noProof/>
+                <w:webHidden/>
+              </w:rPr>
+              <w:t>7</w:t>
+            </w:r>
+            <w:r>
+              <w:rPr>
+                <w:noProof/>
+                <w:webHidden/>
+              </w:rPr>
+              <w:fldChar w:fldCharType="end"/>
+            </w:r>
+          </w:hyperlink>
+        </w:p>
+        <w:p>
+          <w:pPr>
+            <w:pStyle w:val="Sumrio3"/>
+            <w:tabs>
+              <w:tab w:val="right" w:leader="dot" w:pos="9016"/>
+            </w:tabs>
+            <w:rPr>
+              <w:rFonts w:eastAsiaTheme="minorEastAsia"/>
+              <w:noProof/>
+              <w:lang w:eastAsia="pt-BR"/>
+            </w:rPr>
+          </w:pPr>
+          <w:hyperlink w:anchor="_Toc200142133" w:history="1">
+            <w:r>
+              <w:rPr>
+                <w:rStyle w:val="Hyperlink"/>
+                <w:noProof/>
+              </w:rPr>
+              <w:t>RAM</w:t>
+            </w:r>
+            <w:r>
+              <w:rPr>
+                <w:noProof/>
+                <w:webHidden/>
+              </w:rPr>
+              <w:tab/>
+            </w:r>
+            <w:r>
+              <w:rPr>
+                <w:noProof/>
+                <w:webHidden/>
+              </w:rPr>
+              <w:fldChar w:fldCharType="begin"/>
+            </w:r>
+            <w:r>
+              <w:rPr>
+                <w:noProof/>
+                <w:webHidden/>
+              </w:rPr>
+              <w:instrText xml:space="preserve"> PAGEREF _Toc200142133 \h </w:instrText>
+            </w:r>
+            <w:r>
+              <w:rPr>
+                <w:noProof/>
+                <w:webHidden/>
+              </w:rPr>
+            </w:r>
+            <w:r>
+              <w:rPr>
+                <w:noProof/>
+                <w:webHidden/>
+              </w:rPr>
+              <w:fldChar w:fldCharType="separate"/>
+            </w:r>
+            <w:r>
+              <w:rPr>
+                <w:noProof/>
+                <w:webHidden/>
+              </w:rPr>
+              <w:t>8</w:t>
             </w:r>
             <w:r>
               <w:rPr>
@@ -1449,7 +2013,7 @@
               <w:lang w:eastAsia="pt-BR"/>
             </w:rPr>
           </w:pPr>
-          <w:hyperlink w:anchor="_Toc200093206" w:history="1">
+          <w:hyperlink w:anchor="_Toc200142134" w:history="1">
             <w:r>
               <w:rPr>
                 <w:rStyle w:val="Hyperlink"/>
@@ -1493,7 +2057,7 @@
                 <w:noProof/>
                 <w:webHidden/>
               </w:rPr>
-              <w:instrText xml:space="preserve"> PAGEREF _Toc200093206 \h </w:instrText>
+              <w:instrText xml:space="preserve"> PAGEREF _Toc200142134 \h </w:instrText>
             </w:r>
             <w:r>
               <w:rPr>
@@ -1513,7 +2077,7 @@
                 <w:noProof/>
                 <w:webHidden/>
               </w:rPr>
-              <w:t>5</w:t>
+              <w:t>8</w:t>
             </w:r>
             <w:r>
               <w:rPr>
@@ -1536,7 +2100,7 @@
               <w:lang w:eastAsia="pt-BR"/>
             </w:rPr>
           </w:pPr>
-          <w:hyperlink w:anchor="_Toc200093207" w:history="1">
+          <w:hyperlink w:anchor="_Toc200142135" w:history="1">
             <w:r>
               <w:rPr>
                 <w:rStyle w:val="Hyperlink"/>
@@ -1564,7 +2128,7 @@
                 <w:noProof/>
                 <w:webHidden/>
               </w:rPr>
-              <w:instrText xml:space="preserve"> PAGEREF _Toc200093207 \h </w:instrText>
+              <w:instrText xml:space="preserve"> PAGEREF _Toc200142135 \h </w:instrText>
             </w:r>
             <w:r>
               <w:rPr>
@@ -1584,7 +2148,7 @@
                 <w:noProof/>
                 <w:webHidden/>
               </w:rPr>
-              <w:t>5</w:t>
+              <w:t>8</w:t>
             </w:r>
             <w:r>
               <w:rPr>
@@ -1607,7 +2171,7 @@
               <w:lang w:eastAsia="pt-BR"/>
             </w:rPr>
           </w:pPr>
-          <w:hyperlink w:anchor="_Toc200093208" w:history="1">
+          <w:hyperlink w:anchor="_Toc200142136" w:history="1">
             <w:r>
               <w:rPr>
                 <w:rStyle w:val="Hyperlink"/>
@@ -1635,7 +2199,7 @@
                 <w:noProof/>
                 <w:webHidden/>
               </w:rPr>
-              <w:instrText xml:space="preserve"> PAGEREF _Toc200093208 \h </w:instrText>
+              <w:instrText xml:space="preserve"> PAGEREF _Toc200142136 \h </w:instrText>
             </w:r>
             <w:r>
               <w:rPr>
@@ -1655,7 +2219,7 @@
                 <w:noProof/>
                 <w:webHidden/>
               </w:rPr>
-              <w:t>5</w:t>
+              <w:t>9</w:t>
             </w:r>
             <w:r>
               <w:rPr>
@@ -1679,7 +2243,7 @@
               <w:lang w:eastAsia="pt-BR"/>
             </w:rPr>
           </w:pPr>
-          <w:hyperlink w:anchor="_Toc200093209" w:history="1">
+          <w:hyperlink w:anchor="_Toc200142137" w:history="1">
             <w:r>
               <w:rPr>
                 <w:rStyle w:val="Hyperlink"/>
@@ -1723,7 +2287,7 @@
                 <w:noProof/>
                 <w:webHidden/>
               </w:rPr>
-              <w:instrText xml:space="preserve"> PAGEREF _Toc200093209 \h </w:instrText>
+              <w:instrText xml:space="preserve"> PAGEREF _Toc200142137 \h </w:instrText>
             </w:r>
             <w:r>
               <w:rPr>
@@ -1743,7 +2307,7 @@
                 <w:noProof/>
                 <w:webHidden/>
               </w:rPr>
-              <w:t>5</w:t>
+              <w:t>10</w:t>
             </w:r>
             <w:r>
               <w:rPr>
@@ -1799,7 +2363,7 @@
           <w:szCs w:val="24"/>
         </w:rPr>
       </w:pPr>
-      <w:bookmarkStart w:id="0" w:name="_Toc200093191"/>
+      <w:bookmarkStart w:id="0" w:name="_Toc200142111"/>
       <w:r>
         <w:rPr>
           <w:rFonts w:ascii="Times" w:hAnsi="Times" w:cs="Times"/>
@@ -1820,7 +2384,7 @@
           <w:szCs w:val="24"/>
         </w:rPr>
       </w:pPr>
-      <w:bookmarkStart w:id="1" w:name="_Toc200093192"/>
+      <w:bookmarkStart w:id="1" w:name="_Toc200142112"/>
       <w:r>
         <w:rPr>
           <w:rFonts w:ascii="Times" w:hAnsi="Times" w:cs="Times"/>
@@ -1849,7 +2413,7 @@
           <w:szCs w:val="24"/>
         </w:rPr>
       </w:pPr>
-      <w:bookmarkStart w:id="2" w:name="_Toc200093193"/>
+      <w:bookmarkStart w:id="2" w:name="_Toc200142113"/>
       <w:r>
         <w:rPr>
           <w:rFonts w:ascii="Times" w:hAnsi="Times" w:cs="Times"/>
@@ -1878,7 +2442,7 @@
           <w:szCs w:val="24"/>
         </w:rPr>
       </w:pPr>
-      <w:bookmarkStart w:id="3" w:name="_Toc200093194"/>
+      <w:bookmarkStart w:id="3" w:name="_Toc200142114"/>
       <w:r>
         <w:rPr>
           <w:rFonts w:ascii="Times" w:hAnsi="Times" w:cs="Times"/>
@@ -1930,7 +2494,7 @@
           <w:szCs w:val="24"/>
         </w:rPr>
       </w:pPr>
-      <w:bookmarkStart w:id="4" w:name="_Toc200093195"/>
+      <w:bookmarkStart w:id="4" w:name="_Toc200142115"/>
       <w:r>
         <w:rPr>
           <w:rFonts w:ascii="Times" w:hAnsi="Times" w:cs="Times"/>
@@ -1959,7 +2523,7 @@
           <w:szCs w:val="24"/>
         </w:rPr>
       </w:pPr>
-      <w:bookmarkStart w:id="5" w:name="_Toc200093196"/>
+      <w:bookmarkStart w:id="5" w:name="_Toc200142116"/>
       <w:r>
         <w:rPr>
           <w:rFonts w:ascii="Times" w:hAnsi="Times" w:cs="Times"/>
@@ -2125,7 +2689,7 @@
         </w:rPr>
         <w:t xml:space="preserve"> </w:t>
       </w:r>
-      <w:bookmarkStart w:id="6" w:name="_Toc200093197"/>
+      <w:bookmarkStart w:id="6" w:name="_Toc200142117"/>
       <w:r>
         <w:rPr>
           <w:rFonts w:ascii="Times" w:hAnsi="Times" w:cs="Times"/>
@@ -2354,6 +2918,7 @@
           <w:sz w:val="24"/>
           <w:szCs w:val="24"/>
         </w:rPr>
+        <w:lastRenderedPageBreak/>
         <w:t xml:space="preserve">A Construção do Heap vale </w:t>
       </w:r>
       <m:oMath>
@@ -2540,7 +3105,6 @@
           <w:sz w:val="24"/>
           <w:szCs w:val="24"/>
         </w:rPr>
-        <w:lastRenderedPageBreak/>
         <w:t xml:space="preserve">O procedimento Heapify vale </w:t>
       </w:r>
       <m:oMath>
@@ -3545,7 +4109,7 @@
           <w:sz w:val="24"/>
           <w:szCs w:val="24"/>
         </w:rPr>
-        <w:t>, é</w:t>
+        <w:t>, sendo</w:t>
       </w:r>
       <w:r>
         <w:rPr>
@@ -3949,6 +4513,7 @@
           <w:sz w:val="24"/>
           <w:szCs w:val="24"/>
         </w:rPr>
+        <w:lastRenderedPageBreak/>
         <w:t>O custo para a c</w:t>
       </w:r>
       <w:r>
@@ -4187,7 +4752,6 @@
           <w:sz w:val="24"/>
           <w:szCs w:val="24"/>
         </w:rPr>
-        <w:lastRenderedPageBreak/>
         <w:t>Após cada</w:t>
       </w:r>
       <w:r>
@@ -4687,86 +5251,58 @@
     </w:p>
     <w:p>
       <w:pPr>
-        <w:pStyle w:val="PargrafodaLista"/>
         <w:spacing w:line="480" w:lineRule="auto"/>
-        <w:jc w:val="both"/>
-        <w:rPr>
-          <w:rFonts w:ascii="Times" w:eastAsiaTheme="minorEastAsia" w:hAnsi="Times" w:cs="Times"/>
-          <w:sz w:val="24"/>
-          <w:szCs w:val="24"/>
-        </w:rPr>
-      </w:pPr>
-      <m:oMathPara>
-        <m:oMath>
-          <m:r>
-            <w:rPr>
-              <w:rFonts w:ascii="Cambria Math" w:hAnsi="Cambria Math" w:cs="Times"/>
-              <w:sz w:val="24"/>
-              <w:szCs w:val="24"/>
-            </w:rPr>
-            <m:t>= O</m:t>
-          </m:r>
-          <m:r>
-            <w:rPr>
-              <w:rFonts w:ascii="Cambria Math" w:hAnsi="Times" w:cs="Times"/>
-              <w:sz w:val="24"/>
-              <w:szCs w:val="24"/>
-            </w:rPr>
-            <m:t>(</m:t>
-          </m:r>
-          <m:r>
-            <w:rPr>
-              <w:rFonts w:ascii="Cambria Math" w:hAnsi="Cambria Math" w:cs="Times"/>
-              <w:sz w:val="24"/>
-              <w:szCs w:val="24"/>
-            </w:rPr>
-            <m:t>n</m:t>
-          </m:r>
-          <m:func>
-            <m:funcPr>
-              <m:ctrlPr>
-                <w:rPr>
-                  <w:rFonts w:ascii="Cambria Math" w:hAnsi="Times" w:cs="Times"/>
-                  <w:i/>
-                  <w:sz w:val="24"/>
-                  <w:szCs w:val="24"/>
-                </w:rPr>
-              </m:ctrlPr>
-            </m:funcPr>
-            <m:fName>
-              <m:r>
-                <m:rPr>
-                  <m:sty m:val="p"/>
-                </m:rPr>
-                <w:rPr>
-                  <w:rFonts w:ascii="Cambria Math" w:hAnsi="Times" w:cs="Times"/>
-                  <w:sz w:val="24"/>
-                  <w:szCs w:val="24"/>
-                </w:rPr>
-                <m:t>log</m:t>
-              </m:r>
-            </m:fName>
-            <m:e>
-              <m:r>
-                <w:rPr>
-                  <w:rFonts w:ascii="Cambria Math" w:hAnsi="Cambria Math" w:cs="Times"/>
-                  <w:sz w:val="24"/>
-                  <w:szCs w:val="24"/>
-                </w:rPr>
-                <m:t>n</m:t>
-              </m:r>
-              <m:r>
-                <w:rPr>
-                  <w:rFonts w:ascii="Cambria Math" w:hAnsi="Times" w:cs="Times"/>
-                  <w:sz w:val="24"/>
-                  <w:szCs w:val="24"/>
-                </w:rPr>
-                <m:t>)</m:t>
-              </m:r>
-            </m:e>
-          </m:func>
-        </m:oMath>
-      </m:oMathPara>
+        <w:jc w:val="center"/>
+        <w:rPr>
+          <w:rFonts w:ascii="Times" w:eastAsiaTheme="minorEastAsia" w:hAnsi="Times" w:cs="Times"/>
+          <w:sz w:val="24"/>
+          <w:szCs w:val="24"/>
+        </w:rPr>
+      </w:pPr>
+      <w:r>
+        <w:rPr>
+          <w:rFonts w:ascii="Times" w:eastAsiaTheme="minorEastAsia" w:hAnsi="Times" w:cs="Times"/>
+          <w:noProof/>
+          <w:sz w:val="24"/>
+          <w:szCs w:val="24"/>
+          <w:lang w:eastAsia="pt-BR"/>
+        </w:rPr>
+        <w:drawing>
+          <wp:inline distT="0" distB="0" distL="0" distR="0">
+            <wp:extent cx="1028789" cy="647756"/>
+            <wp:effectExtent l="19050" t="0" r="0" b="0"/>
+            <wp:docPr id="4" name="Imagem 3" descr="formula_resultado_heapsort.PNG"/>
+            <wp:cNvGraphicFramePr>
+              <a:graphicFrameLocks xmlns:a="http://schemas.openxmlformats.org/drawingml/2006/main" noChangeAspect="1"/>
+            </wp:cNvGraphicFramePr>
+            <a:graphic xmlns:a="http://schemas.openxmlformats.org/drawingml/2006/main">
+              <a:graphicData uri="http://schemas.openxmlformats.org/drawingml/2006/picture">
+                <pic:pic xmlns:pic="http://schemas.openxmlformats.org/drawingml/2006/picture">
+                  <pic:nvPicPr>
+                    <pic:cNvPr id="0" name="formula_resultado_heapsort.PNG"/>
+                    <pic:cNvPicPr/>
+                  </pic:nvPicPr>
+                  <pic:blipFill>
+                    <a:blip r:embed="rId9"/>
+                    <a:stretch>
+                      <a:fillRect/>
+                    </a:stretch>
+                  </pic:blipFill>
+                  <pic:spPr>
+                    <a:xfrm>
+                      <a:off x="0" y="0"/>
+                      <a:ext cx="1028789" cy="647756"/>
+                    </a:xfrm>
+                    <a:prstGeom prst="rect">
+                      <a:avLst/>
+                    </a:prstGeom>
+                  </pic:spPr>
+                </pic:pic>
+              </a:graphicData>
+            </a:graphic>
+          </wp:inline>
+        </w:drawing>
+      </w:r>
     </w:p>
     <w:p>
       <w:pPr>
@@ -4778,7 +5314,7 @@
           <w:szCs w:val="24"/>
         </w:rPr>
       </w:pPr>
-      <w:bookmarkStart w:id="7" w:name="_Toc200093198"/>
+      <w:bookmarkStart w:id="7" w:name="_Toc200142118"/>
       <w:r>
         <w:rPr>
           <w:rFonts w:ascii="Times" w:hAnsi="Times" w:cs="Times"/>
@@ -4944,7 +5480,7 @@
           <w:szCs w:val="24"/>
         </w:rPr>
       </w:pPr>
-      <w:bookmarkStart w:id="8" w:name="_Toc200093199"/>
+      <w:bookmarkStart w:id="8" w:name="_Toc200142119"/>
       <w:r>
         <w:rPr>
           <w:rFonts w:ascii="Times" w:hAnsi="Times" w:cs="Times"/>
@@ -5144,7 +5680,7 @@
           <w:szCs w:val="24"/>
         </w:rPr>
       </w:pPr>
-      <w:bookmarkStart w:id="9" w:name="_Toc200093200"/>
+      <w:bookmarkStart w:id="9" w:name="_Toc200142120"/>
       <w:r>
         <w:rPr>
           <w:rFonts w:ascii="Times" w:hAnsi="Times" w:cs="Times"/>
@@ -5284,6 +5820,7 @@
           <w:sz w:val="24"/>
           <w:szCs w:val="24"/>
         </w:rPr>
+        <w:lastRenderedPageBreak/>
         <w:t xml:space="preserve">O tempo consumido pelo Heapsort é proporcional ao número de comparações entre os elementos do array, e tal custo proporcional é </w:t>
       </w:r>
       <m:oMath>
@@ -5350,7 +5887,7 @@
           <w:szCs w:val="24"/>
         </w:rPr>
       </w:pPr>
-      <w:bookmarkStart w:id="10" w:name="_Toc200093201"/>
+      <w:bookmarkStart w:id="10" w:name="_Toc200142121"/>
       <w:r>
         <w:rPr>
           <w:rFonts w:ascii="Times" w:hAnsi="Times" w:cs="Times"/>
@@ -5388,14 +5925,13 @@
           <w:szCs w:val="24"/>
         </w:rPr>
       </w:pPr>
-      <w:bookmarkStart w:id="11" w:name="_Toc200093202"/>
-      <w:r>
-        <w:rPr>
-          <w:rFonts w:ascii="Times" w:hAnsi="Times" w:cs="Times"/>
-          <w:sz w:val="24"/>
-          <w:szCs w:val="24"/>
-        </w:rPr>
-        <w:lastRenderedPageBreak/>
+      <w:bookmarkStart w:id="11" w:name="_Toc200142122"/>
+      <w:r>
+        <w:rPr>
+          <w:rFonts w:ascii="Times" w:hAnsi="Times" w:cs="Times"/>
+          <w:sz w:val="24"/>
+          <w:szCs w:val="24"/>
+        </w:rPr>
         <w:t>Implementação e Testes</w:t>
       </w:r>
       <w:bookmarkEnd w:id="11"/>
@@ -5410,7 +5946,7 @@
           <w:szCs w:val="24"/>
         </w:rPr>
       </w:pPr>
-      <w:bookmarkStart w:id="12" w:name="_Toc200093203"/>
+      <w:bookmarkStart w:id="12" w:name="_Toc200142123"/>
       <w:r>
         <w:rPr>
           <w:rFonts w:ascii="Times" w:hAnsi="Times" w:cs="Times"/>
@@ -5439,7 +5975,6 @@
           <w:szCs w:val="24"/>
         </w:rPr>
       </w:pPr>
-      <w:bookmarkStart w:id="13" w:name="_Toc200093204"/>
       <w:r>
         <w:rPr>
           <w:rFonts w:ascii="Times" w:hAnsi="Times" w:cs="Times"/>
@@ -5606,6 +6141,7 @@
           <w:szCs w:val="24"/>
         </w:rPr>
       </w:pPr>
+      <w:bookmarkStart w:id="13" w:name="_Toc200142124"/>
       <w:r>
         <w:rPr>
           <w:rFonts w:ascii="Times" w:hAnsi="Times" w:cs="Times"/>
@@ -5614,6 +6150,7 @@
         </w:rPr>
         <w:t>PQINSERT</w:t>
       </w:r>
+      <w:bookmarkEnd w:id="13"/>
     </w:p>
     <w:p>
       <w:pPr>
@@ -5959,7 +6496,39 @@
           <w:sz w:val="24"/>
           <w:szCs w:val="24"/>
         </w:rPr>
-        <w:t xml:space="preserve"> será introduzido, de forma imediata, antes deste mesmo elemento neste percurso(isto é, </w:t>
+        <w:t xml:space="preserve"> será introduzido, de forma imediata, antes </w:t>
+      </w:r>
+      <w:r>
+        <w:rPr>
+          <w:rFonts w:ascii="Times" w:eastAsiaTheme="minorEastAsia" w:hAnsi="Times" w:cs="Times"/>
+          <w:sz w:val="24"/>
+          <w:szCs w:val="24"/>
+        </w:rPr>
+        <w:t>do</w:t>
+      </w:r>
+      <w:r>
+        <w:rPr>
+          <w:rFonts w:ascii="Times" w:eastAsiaTheme="minorEastAsia" w:hAnsi="Times" w:cs="Times"/>
+          <w:sz w:val="24"/>
+          <w:szCs w:val="24"/>
+        </w:rPr>
+        <w:t xml:space="preserve"> mesmo neste percurso</w:t>
+      </w:r>
+      <w:r>
+        <w:rPr>
+          <w:rFonts w:ascii="Times" w:eastAsiaTheme="minorEastAsia" w:hAnsi="Times" w:cs="Times"/>
+          <w:sz w:val="24"/>
+          <w:szCs w:val="24"/>
+        </w:rPr>
+        <w:t xml:space="preserve"> </w:t>
+      </w:r>
+      <w:r>
+        <w:rPr>
+          <w:rFonts w:ascii="Times" w:eastAsiaTheme="minorEastAsia" w:hAnsi="Times" w:cs="Times"/>
+          <w:sz w:val="24"/>
+          <w:szCs w:val="24"/>
+        </w:rPr>
+        <w:t xml:space="preserve">(isto é, </w:t>
       </w:r>
       <w:r>
         <w:rPr>
@@ -6147,6 +6716,7 @@
           <w:sz w:val="20"/>
           <w:szCs w:val="24"/>
         </w:rPr>
+        <w:lastRenderedPageBreak/>
         <w:t>{</w:t>
       </w:r>
     </w:p>
@@ -6245,7 +6815,6 @@
           <w:sz w:val="20"/>
           <w:szCs w:val="24"/>
         </w:rPr>
-        <w:lastRenderedPageBreak/>
         <w:t xml:space="preserve">        dpq[s] = dpq[f];</w:t>
       </w:r>
     </w:p>
@@ -6503,6 +7072,7 @@
           <w:szCs w:val="24"/>
         </w:rPr>
       </w:pPr>
+      <w:bookmarkStart w:id="14" w:name="_Toc200142125"/>
       <w:r>
         <w:rPr>
           <w:rFonts w:ascii="Times" w:hAnsi="Times" w:cs="Times"/>
@@ -6511,6 +7081,7 @@
         </w:rPr>
         <w:t>PQMAXDELETE</w:t>
       </w:r>
+      <w:bookmarkEnd w:id="14"/>
     </w:p>
     <w:p>
       <w:pPr>
@@ -6972,6 +7543,38 @@
     </w:p>
     <w:p>
       <w:pPr>
+        <w:pStyle w:val="Codigo"/>
+      </w:pPr>
+      <w:r>
+        <w:t xml:space="preserve">    int p = dpq[0];</w:t>
+      </w:r>
+    </w:p>
+    <w:p>
+      <w:pPr>
+        <w:pStyle w:val="Codigo"/>
+      </w:pPr>
+      <w:r>
+        <w:t xml:space="preserve">    dpq[0] = dpq[k - 1];</w:t>
+      </w:r>
+    </w:p>
+    <w:p>
+      <w:pPr>
+        <w:pStyle w:val="Codigo"/>
+      </w:pPr>
+      <w:r>
+        <w:t xml:space="preserve">    adjustheap(dpq, 0, k - 1);</w:t>
+      </w:r>
+    </w:p>
+    <w:p>
+      <w:pPr>
+        <w:pStyle w:val="Codigo"/>
+      </w:pPr>
+      <w:r>
+        <w:t xml:space="preserve">    return p;</w:t>
+      </w:r>
+    </w:p>
+    <w:p>
+      <w:pPr>
         <w:jc w:val="both"/>
         <w:rPr>
           <w:rFonts w:ascii="Courier New" w:eastAsiaTheme="minorEastAsia" w:hAnsi="Courier New" w:cs="Courier New"/>
@@ -6985,98 +7588,18 @@
           <w:sz w:val="20"/>
           <w:szCs w:val="24"/>
         </w:rPr>
-        <w:t xml:space="preserve">    int p = dpq[0];</w:t>
-      </w:r>
-    </w:p>
-    <w:p>
-      <w:pPr>
-        <w:jc w:val="both"/>
-        <w:rPr>
-          <w:rFonts w:ascii="Courier New" w:eastAsiaTheme="minorEastAsia" w:hAnsi="Courier New" w:cs="Courier New"/>
-          <w:sz w:val="20"/>
-          <w:szCs w:val="24"/>
-        </w:rPr>
-      </w:pPr>
-      <w:r>
-        <w:rPr>
-          <w:rFonts w:ascii="Courier New" w:eastAsiaTheme="minorEastAsia" w:hAnsi="Courier New" w:cs="Courier New"/>
-          <w:sz w:val="20"/>
-          <w:szCs w:val="24"/>
-        </w:rPr>
-        <w:t xml:space="preserve">    dpq[0] = dpq[k - 1];</w:t>
-      </w:r>
-    </w:p>
-    <w:p>
-      <w:pPr>
-        <w:jc w:val="both"/>
-        <w:rPr>
-          <w:rFonts w:ascii="Courier New" w:eastAsiaTheme="minorEastAsia" w:hAnsi="Courier New" w:cs="Courier New"/>
-          <w:sz w:val="20"/>
-          <w:szCs w:val="24"/>
-        </w:rPr>
-      </w:pPr>
-      <w:r>
-        <w:rPr>
-          <w:rFonts w:ascii="Courier New" w:eastAsiaTheme="minorEastAsia" w:hAnsi="Courier New" w:cs="Courier New"/>
-          <w:sz w:val="20"/>
-          <w:szCs w:val="24"/>
-        </w:rPr>
-        <w:t xml:space="preserve">    adjustheap(dpq, 0, k - 1);</w:t>
-      </w:r>
-    </w:p>
-    <w:p>
-      <w:pPr>
-        <w:jc w:val="both"/>
-        <w:rPr>
-          <w:rFonts w:ascii="Courier New" w:eastAsiaTheme="minorEastAsia" w:hAnsi="Courier New" w:cs="Courier New"/>
-          <w:sz w:val="20"/>
-          <w:szCs w:val="24"/>
-        </w:rPr>
-      </w:pPr>
-      <w:r>
-        <w:rPr>
-          <w:rFonts w:ascii="Courier New" w:eastAsiaTheme="minorEastAsia" w:hAnsi="Courier New" w:cs="Courier New"/>
-          <w:sz w:val="20"/>
-          <w:szCs w:val="24"/>
-        </w:rPr>
-        <w:t xml:space="preserve">    return p;</w:t>
-      </w:r>
-    </w:p>
-    <w:p>
-      <w:pPr>
-        <w:jc w:val="both"/>
-        <w:rPr>
-          <w:rFonts w:ascii="Courier New" w:eastAsiaTheme="minorEastAsia" w:hAnsi="Courier New" w:cs="Courier New"/>
-          <w:sz w:val="20"/>
-          <w:szCs w:val="24"/>
-        </w:rPr>
-      </w:pPr>
-      <w:r>
-        <w:rPr>
-          <w:rFonts w:ascii="Courier New" w:eastAsiaTheme="minorEastAsia" w:hAnsi="Courier New" w:cs="Courier New"/>
-          <w:sz w:val="20"/>
-          <w:szCs w:val="24"/>
-        </w:rPr>
         <w:t>}</w:t>
       </w:r>
     </w:p>
     <w:p>
       <w:pPr>
-        <w:pStyle w:val="Ttulo3"/>
-        <w:rPr>
-          <w:rFonts w:ascii="Times" w:hAnsi="Times" w:cs="Times"/>
-          <w:sz w:val="24"/>
-          <w:szCs w:val="24"/>
-        </w:rPr>
-      </w:pPr>
-      <w:r>
-        <w:rPr>
-          <w:rFonts w:ascii="Times" w:hAnsi="Times" w:cs="Times"/>
-          <w:sz w:val="24"/>
-          <w:szCs w:val="24"/>
-        </w:rPr>
+        <w:pStyle w:val="Titulo3Relatorio"/>
+      </w:pPr>
+      <w:bookmarkStart w:id="15" w:name="_Toc200142126"/>
+      <w:r>
         <w:t>ADJUSTHEAP</w:t>
       </w:r>
+      <w:bookmarkEnd w:id="15"/>
     </w:p>
     <w:p>
       <w:pPr>
@@ -7094,7 +7617,162 @@
           <w:sz w:val="24"/>
           <w:szCs w:val="24"/>
         </w:rPr>
-        <w:t>HHDHUEUHDUEHDEUFHUEHRUEH</w:t>
+        <w:t xml:space="preserve">Para o procedimento </w:t>
+      </w:r>
+      <w:r>
+        <w:rPr>
+          <w:rFonts w:ascii="Times" w:hAnsi="Times" w:cs="Times"/>
+          <w:i/>
+          <w:sz w:val="24"/>
+          <w:szCs w:val="24"/>
+        </w:rPr>
+        <w:t>adjustheap</w:t>
+      </w:r>
+      <w:r>
+        <w:rPr>
+          <w:rFonts w:ascii="Times" w:hAnsi="Times" w:cs="Times"/>
+          <w:sz w:val="24"/>
+          <w:szCs w:val="24"/>
+        </w:rPr>
+        <w:t xml:space="preserve">, observa-se que o elemento máximo sempre está na posição-raiz de um heap descendente de </w:t>
+      </w:r>
+      <m:oMath>
+        <m:r>
+          <w:rPr>
+            <w:rFonts w:ascii="Cambria Math" w:hAnsi="Cambria Math" w:cs="Times"/>
+            <w:sz w:val="24"/>
+            <w:szCs w:val="24"/>
+          </w:rPr>
+          <m:t>k</m:t>
+        </m:r>
+      </m:oMath>
+      <w:r>
+        <w:rPr>
+          <w:rFonts w:ascii="Times" w:eastAsiaTheme="minorEastAsia" w:hAnsi="Times" w:cs="Times"/>
+          <w:sz w:val="24"/>
+          <w:szCs w:val="24"/>
+        </w:rPr>
+        <w:t xml:space="preserve"> elementos. Quando este mesmo elemento é removido, os </w:t>
+      </w:r>
+      <m:oMath>
+        <m:r>
+          <w:rPr>
+            <w:rFonts w:ascii="Cambria Math" w:eastAsiaTheme="minorEastAsia" w:hAnsi="Cambria Math" w:cs="Times"/>
+            <w:sz w:val="24"/>
+            <w:szCs w:val="24"/>
+          </w:rPr>
+          <m:t>k-1</m:t>
+        </m:r>
+      </m:oMath>
+      <w:r>
+        <w:rPr>
+          <w:rFonts w:ascii="Times" w:eastAsiaTheme="minorEastAsia" w:hAnsi="Times" w:cs="Times"/>
+          <w:sz w:val="24"/>
+          <w:szCs w:val="24"/>
+        </w:rPr>
+        <w:t xml:space="preserve"> elementos restantes nas posições 1 a </w:t>
+      </w:r>
+      <m:oMath>
+        <m:r>
+          <w:rPr>
+            <w:rFonts w:ascii="Cambria Math" w:eastAsiaTheme="minorEastAsia" w:hAnsi="Cambria Math" w:cs="Times"/>
+            <w:sz w:val="24"/>
+            <w:szCs w:val="24"/>
+          </w:rPr>
+          <m:t>k-1</m:t>
+        </m:r>
+      </m:oMath>
+      <w:r>
+        <w:rPr>
+          <w:rFonts w:ascii="Times" w:eastAsiaTheme="minorEastAsia" w:hAnsi="Times" w:cs="Times"/>
+          <w:sz w:val="24"/>
+          <w:szCs w:val="24"/>
+        </w:rPr>
+        <w:t xml:space="preserve"> precisam ser redistribuídos </w:t>
+      </w:r>
+      <w:r>
+        <w:rPr>
+          <w:rFonts w:ascii="Times" w:eastAsiaTheme="minorEastAsia" w:hAnsi="Times" w:cs="Times"/>
+          <w:sz w:val="24"/>
+          <w:szCs w:val="24"/>
+        </w:rPr>
+        <w:lastRenderedPageBreak/>
+        <w:t xml:space="preserve">nas posições 0 até </w:t>
+      </w:r>
+      <m:oMath>
+        <m:r>
+          <w:rPr>
+            <w:rFonts w:ascii="Cambria Math" w:eastAsiaTheme="minorEastAsia" w:hAnsi="Cambria Math" w:cs="Times"/>
+            <w:sz w:val="24"/>
+            <w:szCs w:val="24"/>
+          </w:rPr>
+          <m:t>k-2</m:t>
+        </m:r>
+      </m:oMath>
+      <w:r>
+        <w:rPr>
+          <w:rFonts w:ascii="Times" w:eastAsiaTheme="minorEastAsia" w:hAnsi="Times" w:cs="Times"/>
+          <w:sz w:val="24"/>
+          <w:szCs w:val="24"/>
+        </w:rPr>
+        <w:t xml:space="preserve"> a fim do segmento de vetor resultante de </w:t>
+      </w:r>
+      <w:r>
+        <w:rPr>
+          <w:rFonts w:ascii="Times" w:eastAsiaTheme="minorEastAsia" w:hAnsi="Times" w:cs="Times"/>
+          <w:i/>
+          <w:sz w:val="24"/>
+          <w:szCs w:val="24"/>
+        </w:rPr>
+        <w:t>dpq</w:t>
+      </w:r>
+      <m:oMath>
+        <m:r>
+          <m:rPr>
+            <m:sty m:val="p"/>
+          </m:rPr>
+          <w:rPr>
+            <w:rFonts w:ascii="Cambria Math" w:eastAsiaTheme="minorEastAsia" w:hAnsi="Cambria Math" w:cs="Times"/>
+            <w:sz w:val="24"/>
+            <w:szCs w:val="24"/>
+          </w:rPr>
+          <m:t xml:space="preserve">[0] </m:t>
+        </m:r>
+      </m:oMath>
+      <w:r>
+        <w:rPr>
+          <w:rFonts w:ascii="Times" w:eastAsiaTheme="minorEastAsia" w:hAnsi="Times" w:cs="Times"/>
+          <w:sz w:val="24"/>
+          <w:szCs w:val="24"/>
+        </w:rPr>
+        <w:t xml:space="preserve">até </w:t>
+      </w:r>
+      <w:r>
+        <w:rPr>
+          <w:rFonts w:ascii="Times" w:eastAsiaTheme="minorEastAsia" w:hAnsi="Times" w:cs="Times"/>
+          <w:i/>
+          <w:sz w:val="24"/>
+          <w:szCs w:val="24"/>
+        </w:rPr>
+        <w:t>dpq</w:t>
+      </w:r>
+      <m:oMath>
+        <m:r>
+          <w:rPr>
+            <w:rFonts w:ascii="Cambria Math" w:eastAsiaTheme="minorEastAsia" w:hAnsi="Cambria Math" w:cs="Times"/>
+            <w:sz w:val="24"/>
+            <w:szCs w:val="24"/>
+          </w:rPr>
+          <m:t>[k-2]</m:t>
+        </m:r>
+      </m:oMath>
+      <w:r>
+        <w:rPr>
+          <w:rFonts w:ascii="Times" w:eastAsiaTheme="minorEastAsia" w:hAnsi="Times" w:cs="Times"/>
+          <w:sz w:val="24"/>
+          <w:szCs w:val="24"/>
+        </w:rPr>
+        <w:t xml:space="preserve"> continue um heap descendente.</w:t>
       </w:r>
     </w:p>
     <w:p>
@@ -7106,6 +7784,7 @@
           <w:szCs w:val="24"/>
         </w:rPr>
       </w:pPr>
+      <w:bookmarkStart w:id="16" w:name="_Toc200142127"/>
       <w:r>
         <w:rPr>
           <w:rFonts w:ascii="Times" w:hAnsi="Times" w:cs="Times"/>
@@ -7114,6 +7793,7 @@
         </w:rPr>
         <w:t>LARGESON</w:t>
       </w:r>
+      <w:bookmarkEnd w:id="16"/>
     </w:p>
     <w:p>
       <w:pPr>
@@ -7131,7 +7811,153 @@
           <w:sz w:val="24"/>
           <w:szCs w:val="24"/>
         </w:rPr>
-        <w:t>HHDHUEUHDUEHDEUFHUEHRUEH</w:t>
+        <w:t xml:space="preserve">Para o procedimento </w:t>
+      </w:r>
+      <w:r>
+        <w:rPr>
+          <w:rFonts w:ascii="Times" w:hAnsi="Times" w:cs="Times"/>
+          <w:i/>
+          <w:sz w:val="24"/>
+          <w:szCs w:val="24"/>
+        </w:rPr>
+        <w:t>largeson</w:t>
+      </w:r>
+      <w:r>
+        <w:rPr>
+          <w:rFonts w:ascii="Times" w:hAnsi="Times" w:cs="Times"/>
+          <w:sz w:val="24"/>
+          <w:szCs w:val="24"/>
+        </w:rPr>
+        <w:t xml:space="preserve">, observa-se que o elemento máximo sempre está na posição-raiz de um heap descendente de </w:t>
+      </w:r>
+      <m:oMath>
+        <m:r>
+          <w:rPr>
+            <w:rFonts w:ascii="Cambria Math" w:hAnsi="Cambria Math" w:cs="Times"/>
+            <w:sz w:val="24"/>
+            <w:szCs w:val="24"/>
+          </w:rPr>
+          <m:t>k</m:t>
+        </m:r>
+      </m:oMath>
+      <w:r>
+        <w:rPr>
+          <w:rFonts w:ascii="Times" w:eastAsiaTheme="minorEastAsia" w:hAnsi="Times" w:cs="Times"/>
+          <w:sz w:val="24"/>
+          <w:szCs w:val="24"/>
+        </w:rPr>
+        <w:t xml:space="preserve"> elementos. Quando este mesmo elemento é removido, os </w:t>
+      </w:r>
+      <m:oMath>
+        <m:r>
+          <w:rPr>
+            <w:rFonts w:ascii="Cambria Math" w:eastAsiaTheme="minorEastAsia" w:hAnsi="Cambria Math" w:cs="Times"/>
+            <w:sz w:val="24"/>
+            <w:szCs w:val="24"/>
+          </w:rPr>
+          <m:t>k-1</m:t>
+        </m:r>
+      </m:oMath>
+      <w:r>
+        <w:rPr>
+          <w:rFonts w:ascii="Times" w:eastAsiaTheme="minorEastAsia" w:hAnsi="Times" w:cs="Times"/>
+          <w:sz w:val="24"/>
+          <w:szCs w:val="24"/>
+        </w:rPr>
+        <w:t xml:space="preserve"> elementos restantes nas posições 1 a </w:t>
+      </w:r>
+      <m:oMath>
+        <m:r>
+          <w:rPr>
+            <w:rFonts w:ascii="Cambria Math" w:eastAsiaTheme="minorEastAsia" w:hAnsi="Cambria Math" w:cs="Times"/>
+            <w:sz w:val="24"/>
+            <w:szCs w:val="24"/>
+          </w:rPr>
+          <m:t>k-1</m:t>
+        </m:r>
+      </m:oMath>
+      <w:r>
+        <w:rPr>
+          <w:rFonts w:ascii="Times" w:eastAsiaTheme="minorEastAsia" w:hAnsi="Times" w:cs="Times"/>
+          <w:sz w:val="24"/>
+          <w:szCs w:val="24"/>
+        </w:rPr>
+        <w:t xml:space="preserve"> precisam ser redistribuídos nas posições 0 até </w:t>
+      </w:r>
+      <m:oMath>
+        <m:r>
+          <w:rPr>
+            <w:rFonts w:ascii="Cambria Math" w:eastAsiaTheme="minorEastAsia" w:hAnsi="Cambria Math" w:cs="Times"/>
+            <w:sz w:val="24"/>
+            <w:szCs w:val="24"/>
+          </w:rPr>
+          <m:t>k-2</m:t>
+        </m:r>
+      </m:oMath>
+      <w:r>
+        <w:rPr>
+          <w:rFonts w:ascii="Times" w:eastAsiaTheme="minorEastAsia" w:hAnsi="Times" w:cs="Times"/>
+          <w:sz w:val="24"/>
+          <w:szCs w:val="24"/>
+        </w:rPr>
+        <w:t xml:space="preserve"> a fim do segmento de vetor resultante de </w:t>
+      </w:r>
+      <w:r>
+        <w:rPr>
+          <w:rFonts w:ascii="Times" w:eastAsiaTheme="minorEastAsia" w:hAnsi="Times" w:cs="Times"/>
+          <w:i/>
+          <w:sz w:val="24"/>
+          <w:szCs w:val="24"/>
+        </w:rPr>
+        <w:t>dpq</w:t>
+      </w:r>
+      <m:oMath>
+        <m:r>
+          <m:rPr>
+            <m:sty m:val="p"/>
+          </m:rPr>
+          <w:rPr>
+            <w:rFonts w:ascii="Cambria Math" w:eastAsiaTheme="minorEastAsia" w:hAnsi="Cambria Math" w:cs="Times"/>
+            <w:sz w:val="24"/>
+            <w:szCs w:val="24"/>
+          </w:rPr>
+          <m:t xml:space="preserve">[0] </m:t>
+        </m:r>
+      </m:oMath>
+      <w:r>
+        <w:rPr>
+          <w:rFonts w:ascii="Times" w:eastAsiaTheme="minorEastAsia" w:hAnsi="Times" w:cs="Times"/>
+          <w:sz w:val="24"/>
+          <w:szCs w:val="24"/>
+        </w:rPr>
+        <w:t xml:space="preserve">até </w:t>
+      </w:r>
+      <w:r>
+        <w:rPr>
+          <w:rFonts w:ascii="Times" w:eastAsiaTheme="minorEastAsia" w:hAnsi="Times" w:cs="Times"/>
+          <w:i/>
+          <w:sz w:val="24"/>
+          <w:szCs w:val="24"/>
+        </w:rPr>
+        <w:t>dpq</w:t>
+      </w:r>
+      <m:oMath>
+        <m:r>
+          <w:rPr>
+            <w:rFonts w:ascii="Cambria Math" w:eastAsiaTheme="minorEastAsia" w:hAnsi="Cambria Math" w:cs="Times"/>
+            <w:sz w:val="24"/>
+            <w:szCs w:val="24"/>
+          </w:rPr>
+          <m:t>[k-2]</m:t>
+        </m:r>
+      </m:oMath>
+      <w:r>
+        <w:rPr>
+          <w:rFonts w:ascii="Times" w:eastAsiaTheme="minorEastAsia" w:hAnsi="Times" w:cs="Times"/>
+          <w:sz w:val="24"/>
+          <w:szCs w:val="24"/>
+        </w:rPr>
+        <w:t xml:space="preserve"> continue um heap descendente.</w:t>
       </w:r>
     </w:p>
     <w:p>
@@ -7143,6 +7969,7 @@
           <w:szCs w:val="24"/>
         </w:rPr>
       </w:pPr>
+      <w:bookmarkStart w:id="17" w:name="_Toc200142128"/>
       <w:r>
         <w:rPr>
           <w:rFonts w:ascii="Times" w:hAnsi="Times" w:cs="Times"/>
@@ -7151,6 +7978,7 @@
         </w:rPr>
         <w:t>HEAPSORT</w:t>
       </w:r>
+      <w:bookmarkEnd w:id="17"/>
     </w:p>
     <w:p>
       <w:pPr>
@@ -7180,6 +8008,7 @@
           <w:szCs w:val="24"/>
         </w:rPr>
       </w:pPr>
+      <w:bookmarkStart w:id="18" w:name="_Toc200142129"/>
       <w:r>
         <w:rPr>
           <w:rFonts w:ascii="Times" w:hAnsi="Times" w:cs="Times"/>
@@ -7188,6 +8017,7 @@
         </w:rPr>
         <w:t>PRINTARRAY</w:t>
       </w:r>
+      <w:bookmarkEnd w:id="18"/>
     </w:p>
     <w:p>
       <w:pPr>
@@ -7270,6 +8100,19 @@
     </w:p>
     <w:p>
       <w:pPr>
+        <w:pStyle w:val="Titulo2Relatorio"/>
+      </w:pPr>
+      <w:bookmarkStart w:id="19" w:name="_Toc200142130"/>
+      <w:r>
+        <w:t>Tabelas e/ou gráficos deverão ser utilizados para apresentação dos resultados dos testes.</w:t>
+      </w:r>
+      <w:bookmarkEnd w:id="19"/>
+      <w:r>
+        <w:t xml:space="preserve"> </w:t>
+      </w:r>
+    </w:p>
+    <w:p>
+      <w:pPr>
         <w:pStyle w:val="Ttulo2"/>
         <w:jc w:val="both"/>
         <w:rPr>
@@ -7278,48 +8121,105 @@
           <w:szCs w:val="24"/>
         </w:rPr>
       </w:pPr>
-      <w:r>
-        <w:rPr>
-          <w:rFonts w:ascii="Times" w:hAnsi="Times" w:cs="Times"/>
-          <w:sz w:val="24"/>
-          <w:szCs w:val="24"/>
-        </w:rPr>
-        <w:t>Tabelas e/ou gráficos deverão ser utilizados para apresentação dos resultados dos testes.</w:t>
-      </w:r>
-      <w:bookmarkEnd w:id="13"/>
-      <w:r>
-        <w:rPr>
-          <w:rFonts w:ascii="Times" w:hAnsi="Times" w:cs="Times"/>
-          <w:sz w:val="24"/>
-          <w:szCs w:val="24"/>
-        </w:rPr>
-        <w:t xml:space="preserve"> </w:t>
-      </w:r>
-    </w:p>
-    <w:p>
-      <w:pPr>
-        <w:pStyle w:val="Ttulo2"/>
+      <w:bookmarkStart w:id="20" w:name="_Toc200142131"/>
+      <w:r>
+        <w:rPr>
+          <w:rFonts w:ascii="Times" w:hAnsi="Times" w:cs="Times"/>
+          <w:sz w:val="24"/>
+          <w:szCs w:val="24"/>
+        </w:rPr>
+        <w:t>Incluir detalhes da configuração do computador usado para testes: sistema Operacional, quantidade de RAM, velocidade da CPU (Hz).</w:t>
+      </w:r>
+      <w:bookmarkEnd w:id="20"/>
+    </w:p>
+    <w:p>
+      <w:pPr>
+        <w:pStyle w:val="NormalRelatorio"/>
+      </w:pPr>
+      <w:r>
+        <w:t xml:space="preserve">Dentre </w:t>
+      </w:r>
+      <w:r>
+        <w:t xml:space="preserve">s configurações do computador utilizado </w:t>
+      </w:r>
+      <w:r>
+        <w:t xml:space="preserve">para executar </w:t>
+      </w:r>
+      <w:r>
+        <w:t>os testes comparativos dos algoritmos de ordenação</w:t>
+      </w:r>
+      <w:r>
+        <w:t>, incluem-se</w:t>
+      </w:r>
+      <w:r>
+        <w:t>:</w:t>
+      </w:r>
+    </w:p>
+    <w:p>
+      <w:pPr>
+        <w:pStyle w:val="Ttulo3"/>
+      </w:pPr>
+      <w:bookmarkStart w:id="21" w:name="_Toc200142132"/>
+      <w:r>
+        <w:t>Sistema Operacional</w:t>
+      </w:r>
+      <w:bookmarkEnd w:id="21"/>
+    </w:p>
+    <w:p/>
+    <w:p>
+      <w:pPr>
+        <w:keepNext/>
         <w:jc w:val="both"/>
-        <w:rPr>
-          <w:rFonts w:ascii="Times" w:hAnsi="Times" w:cs="Times"/>
-          <w:sz w:val="24"/>
-          <w:szCs w:val="24"/>
-        </w:rPr>
-      </w:pPr>
-      <w:bookmarkStart w:id="14" w:name="_Toc200093205"/>
-      <w:r>
-        <w:rPr>
-          <w:rFonts w:ascii="Times" w:hAnsi="Times" w:cs="Times"/>
-          <w:sz w:val="24"/>
-          <w:szCs w:val="24"/>
-        </w:rPr>
-        <w:t>Incluir detalhes da configuração do computador usado para testes: sistema Operacional, quantidade de RAM, velocidade da CPU (Hz).</w:t>
-      </w:r>
-      <w:bookmarkEnd w:id="14"/>
-    </w:p>
-    <w:p>
-      <w:pPr>
-        <w:ind w:firstLine="708"/>
+      </w:pPr>
+      <w:r>
+        <w:rPr>
+          <w:rFonts w:ascii="Times" w:eastAsiaTheme="minorEastAsia" w:hAnsi="Times" w:cs="Times"/>
+          <w:noProof/>
+          <w:sz w:val="24"/>
+          <w:szCs w:val="24"/>
+          <w:lang w:eastAsia="pt-BR"/>
+        </w:rPr>
+        <w:lastRenderedPageBreak/>
+        <w:drawing>
+          <wp:inline distT="0" distB="0" distL="0" distR="0">
+            <wp:extent cx="5731510" cy="3074670"/>
+            <wp:effectExtent l="19050" t="0" r="2540" b="0"/>
+            <wp:docPr id="2" name="Imagem 1" descr="Sistema_Operacional.PNG"/>
+            <wp:cNvGraphicFramePr>
+              <a:graphicFrameLocks xmlns:a="http://schemas.openxmlformats.org/drawingml/2006/main" noChangeAspect="1"/>
+            </wp:cNvGraphicFramePr>
+            <a:graphic xmlns:a="http://schemas.openxmlformats.org/drawingml/2006/main">
+              <a:graphicData uri="http://schemas.openxmlformats.org/drawingml/2006/picture">
+                <pic:pic xmlns:pic="http://schemas.openxmlformats.org/drawingml/2006/picture">
+                  <pic:nvPicPr>
+                    <pic:cNvPr id="0" name="Sistema_Operacional.PNG"/>
+                    <pic:cNvPicPr/>
+                  </pic:nvPicPr>
+                  <pic:blipFill>
+                    <a:blip r:embed="rId10"/>
+                    <a:stretch>
+                      <a:fillRect/>
+                    </a:stretch>
+                  </pic:blipFill>
+                  <pic:spPr>
+                    <a:xfrm>
+                      <a:off x="0" y="0"/>
+                      <a:ext cx="5731510" cy="3074670"/>
+                    </a:xfrm>
+                    <a:prstGeom prst="rect">
+                      <a:avLst/>
+                    </a:prstGeom>
+                  </pic:spPr>
+                </pic:pic>
+              </a:graphicData>
+            </a:graphic>
+          </wp:inline>
+        </w:drawing>
+      </w:r>
+    </w:p>
+    <w:p>
+      <w:pPr>
+        <w:pStyle w:val="Legenda"/>
         <w:jc w:val="both"/>
         <w:rPr>
           <w:rFonts w:ascii="Times" w:eastAsiaTheme="minorEastAsia" w:hAnsi="Times" w:cs="Times"/>
@@ -7328,12 +8228,110 @@
         </w:rPr>
       </w:pPr>
       <w:r>
-        <w:rPr>
-          <w:rFonts w:ascii="Times" w:hAnsi="Times" w:cs="Times"/>
-          <w:sz w:val="24"/>
-          <w:szCs w:val="24"/>
-        </w:rPr>
-        <w:t>As configurações do computador utilizado nos testes de comparativos dos algoritmos de ordenação:</w:t>
+        <w:t xml:space="preserve">Figura </w:t>
+      </w:r>
+      <w:fldSimple w:instr=" SEQ Figura \* ARABIC ">
+        <w:r>
+          <w:rPr>
+            <w:noProof/>
+          </w:rPr>
+          <w:t>1</w:t>
+        </w:r>
+      </w:fldSimple>
+      <w:r>
+        <w:t xml:space="preserve"> - Consultando Sistema Operacional através da interface Informações do Sistema.</w:t>
+      </w:r>
+    </w:p>
+    <w:p>
+      <w:pPr>
+        <w:pStyle w:val="Ttulo3"/>
+        <w:rPr>
+          <w:rFonts w:eastAsiaTheme="minorEastAsia"/>
+        </w:rPr>
+      </w:pPr>
+      <w:bookmarkStart w:id="22" w:name="_Toc200142133"/>
+      <w:r>
+        <w:rPr>
+          <w:rFonts w:eastAsiaTheme="minorEastAsia"/>
+        </w:rPr>
+        <w:t>RAM</w:t>
+      </w:r>
+      <w:bookmarkEnd w:id="22"/>
+    </w:p>
+    <w:p>
+      <w:pPr>
+        <w:pStyle w:val="Titulo2Relatorio"/>
+      </w:pPr>
+      <w:r>
+        <w:rPr>
+          <w:rFonts w:eastAsiaTheme="minorEastAsia"/>
+          <w:noProof/>
+          <w:lang w:eastAsia="pt-BR"/>
+        </w:rPr>
+        <w:drawing>
+          <wp:inline distT="0" distB="0" distL="0" distR="0">
+            <wp:extent cx="5731510" cy="3074670"/>
+            <wp:effectExtent l="19050" t="0" r="2540" b="0"/>
+            <wp:docPr id="3" name="Imagem 2" descr="RAM.PNG"/>
+            <wp:cNvGraphicFramePr>
+              <a:graphicFrameLocks xmlns:a="http://schemas.openxmlformats.org/drawingml/2006/main" noChangeAspect="1"/>
+            </wp:cNvGraphicFramePr>
+            <a:graphic xmlns:a="http://schemas.openxmlformats.org/drawingml/2006/main">
+              <a:graphicData uri="http://schemas.openxmlformats.org/drawingml/2006/picture">
+                <pic:pic xmlns:pic="http://schemas.openxmlformats.org/drawingml/2006/picture">
+                  <pic:nvPicPr>
+                    <pic:cNvPr id="0" name="RAM.PNG"/>
+                    <pic:cNvPicPr/>
+                  </pic:nvPicPr>
+                  <pic:blipFill>
+                    <a:blip r:embed="rId11"/>
+                    <a:stretch>
+                      <a:fillRect/>
+                    </a:stretch>
+                  </pic:blipFill>
+                  <pic:spPr>
+                    <a:xfrm>
+                      <a:off x="0" y="0"/>
+                      <a:ext cx="5731510" cy="3074670"/>
+                    </a:xfrm>
+                    <a:prstGeom prst="rect">
+                      <a:avLst/>
+                    </a:prstGeom>
+                  </pic:spPr>
+                </pic:pic>
+              </a:graphicData>
+            </a:graphic>
+          </wp:inline>
+        </w:drawing>
+      </w:r>
+    </w:p>
+    <w:p>
+      <w:pPr>
+        <w:pStyle w:val="Legenda"/>
+        <w:jc w:val="both"/>
+      </w:pPr>
+      <w:r>
+        <w:t xml:space="preserve">Figura </w:t>
+      </w:r>
+      <w:fldSimple w:instr=" SEQ Figura \* ARABIC ">
+        <w:r>
+          <w:rPr>
+            <w:noProof/>
+          </w:rPr>
+          <w:t>2</w:t>
+        </w:r>
+      </w:fldSimple>
+      <w:r>
+        <w:t xml:space="preserve"> - </w:t>
+      </w:r>
+      <w:r>
+        <w:t xml:space="preserve">Consultando </w:t>
+      </w:r>
+      <w:r>
+        <w:t>Memória RAM</w:t>
+      </w:r>
+      <w:r>
+        <w:t xml:space="preserve"> através da interface Informações do Sistema.</w:t>
       </w:r>
     </w:p>
     <w:p>
@@ -7350,7 +8348,7 @@
           <w:szCs w:val="24"/>
         </w:rPr>
       </w:pPr>
-      <w:bookmarkStart w:id="15" w:name="_Toc200093206"/>
+      <w:bookmarkStart w:id="23" w:name="_Toc200142134"/>
       <w:r>
         <w:rPr>
           <w:rFonts w:ascii="Times" w:hAnsi="Times" w:cs="Times"/>
@@ -7359,7 +8357,7 @@
         </w:rPr>
         <w:t>Conclusão</w:t>
       </w:r>
-      <w:bookmarkEnd w:id="15"/>
+      <w:bookmarkEnd w:id="23"/>
     </w:p>
     <w:p>
       <w:pPr>
@@ -7371,7 +8369,7 @@
           <w:szCs w:val="24"/>
         </w:rPr>
       </w:pPr>
-      <w:bookmarkStart w:id="16" w:name="_Toc200093207"/>
+      <w:bookmarkStart w:id="24" w:name="_Toc200142135"/>
       <w:r>
         <w:rPr>
           <w:rFonts w:ascii="Times" w:hAnsi="Times" w:cs="Times"/>
@@ -7380,7 +8378,7 @@
         </w:rPr>
         <w:t>Analisar os pontos fortes e fracos do algoritmo em comparação com outros algoritmos.</w:t>
       </w:r>
-      <w:bookmarkEnd w:id="16"/>
+      <w:bookmarkEnd w:id="24"/>
       <w:r>
         <w:rPr>
           <w:rFonts w:ascii="Times" w:hAnsi="Times" w:cs="Times"/>
@@ -7388,6 +8386,33 @@
           <w:szCs w:val="24"/>
         </w:rPr>
         <w:t xml:space="preserve"> </w:t>
+      </w:r>
+    </w:p>
+    <w:p>
+      <w:pPr>
+        <w:pStyle w:val="PargrafodaLista"/>
+        <w:numPr>
+          <w:ilvl w:val="0"/>
+          <w:numId w:val="10"/>
+        </w:numPr>
+      </w:pPr>
+      <w:r>
+        <w:t>Mesma Grandeza em todos os casos.</w:t>
+      </w:r>
+    </w:p>
+    <w:p>
+      <w:pPr>
+        <w:pStyle w:val="PargrafodaLista"/>
+        <w:numPr>
+          <w:ilvl w:val="0"/>
+          <w:numId w:val="10"/>
+        </w:numPr>
+      </w:pPr>
+      <w:r>
+        <w:t>Versão melhorada do algoritmo de ordenação Selection Sort</w:t>
+      </w:r>
+      <w:r>
+        <w:t>.</w:t>
       </w:r>
     </w:p>
     <w:p>
@@ -7400,16 +8425,148 @@
           <w:szCs w:val="24"/>
         </w:rPr>
       </w:pPr>
-      <w:bookmarkStart w:id="17" w:name="_Toc200093208"/>
-      <w:r>
-        <w:rPr>
-          <w:rFonts w:ascii="Times" w:hAnsi="Times" w:cs="Times"/>
-          <w:sz w:val="24"/>
-          <w:szCs w:val="24"/>
-        </w:rPr>
+      <w:bookmarkStart w:id="25" w:name="_Toc200142136"/>
+      <w:r>
+        <w:rPr>
+          <w:rFonts w:ascii="Times" w:hAnsi="Times" w:cs="Times"/>
+          <w:sz w:val="24"/>
+          <w:szCs w:val="24"/>
+        </w:rPr>
+        <w:lastRenderedPageBreak/>
         <w:t>Avaliar o desempenho do algoritmo em comparação com a implementação do Quicksort disponível na linguagem C.</w:t>
       </w:r>
-      <w:bookmarkEnd w:id="17"/>
+      <w:bookmarkEnd w:id="25"/>
+    </w:p>
+    <w:p/>
+    <w:p>
+      <w:r>
+        <w:rPr>
+          <w:noProof/>
+          <w:lang w:eastAsia="pt-BR"/>
+        </w:rPr>
+        <w:drawing>
+          <wp:inline distT="0" distB="0" distL="0" distR="0">
+            <wp:extent cx="4458087" cy="3795089"/>
+            <wp:effectExtent l="19050" t="0" r="0" b="0"/>
+            <wp:docPr id="5" name="Imagem 4" descr="ordered_input.PNG"/>
+            <wp:cNvGraphicFramePr>
+              <a:graphicFrameLocks xmlns:a="http://schemas.openxmlformats.org/drawingml/2006/main" noChangeAspect="1"/>
+            </wp:cNvGraphicFramePr>
+            <a:graphic xmlns:a="http://schemas.openxmlformats.org/drawingml/2006/main">
+              <a:graphicData uri="http://schemas.openxmlformats.org/drawingml/2006/picture">
+                <pic:pic xmlns:pic="http://schemas.openxmlformats.org/drawingml/2006/picture">
+                  <pic:nvPicPr>
+                    <pic:cNvPr id="0" name="ordered_input.PNG"/>
+                    <pic:cNvPicPr/>
+                  </pic:nvPicPr>
+                  <pic:blipFill>
+                    <a:blip r:embed="rId12"/>
+                    <a:stretch>
+                      <a:fillRect/>
+                    </a:stretch>
+                  </pic:blipFill>
+                  <pic:spPr>
+                    <a:xfrm>
+                      <a:off x="0" y="0"/>
+                      <a:ext cx="4458087" cy="3795089"/>
+                    </a:xfrm>
+                    <a:prstGeom prst="rect">
+                      <a:avLst/>
+                    </a:prstGeom>
+                  </pic:spPr>
+                </pic:pic>
+              </a:graphicData>
+            </a:graphic>
+          </wp:inline>
+        </w:drawing>
+      </w:r>
+    </w:p>
+    <w:p>
+      <w:r>
+        <w:rPr>
+          <w:noProof/>
+          <w:lang w:eastAsia="pt-BR"/>
+        </w:rPr>
+        <w:drawing>
+          <wp:inline distT="0" distB="0" distL="0" distR="0">
+            <wp:extent cx="4366639" cy="3833192"/>
+            <wp:effectExtent l="19050" t="0" r="0" b="0"/>
+            <wp:docPr id="6" name="Imagem 5" descr="reversed_input.PNG"/>
+            <wp:cNvGraphicFramePr>
+              <a:graphicFrameLocks xmlns:a="http://schemas.openxmlformats.org/drawingml/2006/main" noChangeAspect="1"/>
+            </wp:cNvGraphicFramePr>
+            <a:graphic xmlns:a="http://schemas.openxmlformats.org/drawingml/2006/main">
+              <a:graphicData uri="http://schemas.openxmlformats.org/drawingml/2006/picture">
+                <pic:pic xmlns:pic="http://schemas.openxmlformats.org/drawingml/2006/picture">
+                  <pic:nvPicPr>
+                    <pic:cNvPr id="0" name="reversed_input.PNG"/>
+                    <pic:cNvPicPr/>
+                  </pic:nvPicPr>
+                  <pic:blipFill>
+                    <a:blip r:embed="rId13"/>
+                    <a:stretch>
+                      <a:fillRect/>
+                    </a:stretch>
+                  </pic:blipFill>
+                  <pic:spPr>
+                    <a:xfrm>
+                      <a:off x="0" y="0"/>
+                      <a:ext cx="4366639" cy="3833192"/>
+                    </a:xfrm>
+                    <a:prstGeom prst="rect">
+                      <a:avLst/>
+                    </a:prstGeom>
+                  </pic:spPr>
+                </pic:pic>
+              </a:graphicData>
+            </a:graphic>
+          </wp:inline>
+        </w:drawing>
+      </w:r>
+    </w:p>
+    <w:p>
+      <w:r>
+        <w:rPr>
+          <w:noProof/>
+          <w:lang w:eastAsia="pt-BR"/>
+        </w:rPr>
+        <w:lastRenderedPageBreak/>
+        <w:drawing>
+          <wp:inline distT="0" distB="0" distL="0" distR="0">
+            <wp:extent cx="3733447" cy="4136267"/>
+            <wp:effectExtent l="19050" t="0" r="353" b="0"/>
+            <wp:docPr id="7" name="Imagem 6" descr="uniform_input.PNG"/>
+            <wp:cNvGraphicFramePr>
+              <a:graphicFrameLocks xmlns:a="http://schemas.openxmlformats.org/drawingml/2006/main" noChangeAspect="1"/>
+            </wp:cNvGraphicFramePr>
+            <a:graphic xmlns:a="http://schemas.openxmlformats.org/drawingml/2006/main">
+              <a:graphicData uri="http://schemas.openxmlformats.org/drawingml/2006/picture">
+                <pic:pic xmlns:pic="http://schemas.openxmlformats.org/drawingml/2006/picture">
+                  <pic:nvPicPr>
+                    <pic:cNvPr id="0" name="uniform_input.PNG"/>
+                    <pic:cNvPicPr/>
+                  </pic:nvPicPr>
+                  <pic:blipFill>
+                    <a:blip r:embed="rId14"/>
+                    <a:stretch>
+                      <a:fillRect/>
+                    </a:stretch>
+                  </pic:blipFill>
+                  <pic:spPr>
+                    <a:xfrm>
+                      <a:off x="0" y="0"/>
+                      <a:ext cx="3738473" cy="4141835"/>
+                    </a:xfrm>
+                    <a:prstGeom prst="rect">
+                      <a:avLst/>
+                    </a:prstGeom>
+                  </pic:spPr>
+                </pic:pic>
+              </a:graphicData>
+            </a:graphic>
+          </wp:inline>
+        </w:drawing>
+      </w:r>
     </w:p>
     <w:p>
       <w:pPr>
@@ -7430,7 +8587,7 @@
           <w:szCs w:val="24"/>
         </w:rPr>
       </w:pPr>
-      <w:bookmarkStart w:id="18" w:name="_Toc200093209"/>
+      <w:bookmarkStart w:id="26" w:name="_Toc200142137"/>
       <w:r>
         <w:rPr>
           <w:rFonts w:ascii="Times" w:hAnsi="Times" w:cs="Times"/>
@@ -7439,7 +8596,7 @@
         </w:rPr>
         <w:t>Referências</w:t>
       </w:r>
-      <w:bookmarkEnd w:id="18"/>
+      <w:bookmarkEnd w:id="26"/>
     </w:p>
     <w:p>
       <w:pPr>
@@ -7484,7 +8641,7 @@
           <w:szCs w:val="24"/>
         </w:rPr>
       </w:pPr>
-      <w:hyperlink r:id="rId9" w:history="1">
+      <w:hyperlink r:id="rId15" w:history="1">
         <w:r>
           <w:rPr>
             <w:rStyle w:val="Hyperlink"/>
@@ -7507,7 +8664,7 @@
           <w:szCs w:val="24"/>
         </w:rPr>
       </w:pPr>
-      <w:hyperlink r:id="rId10" w:history="1">
+      <w:hyperlink r:id="rId16" w:history="1">
         <w:r>
           <w:rPr>
             <w:rStyle w:val="Hyperlink"/>
@@ -7530,7 +8687,7 @@
           <w:szCs w:val="24"/>
         </w:rPr>
       </w:pPr>
-      <w:hyperlink r:id="rId11" w:history="1">
+      <w:hyperlink r:id="rId17" w:history="1">
         <w:r>
           <w:rPr>
             <w:rStyle w:val="Hyperlink"/>
@@ -7553,7 +8710,7 @@
           <w:szCs w:val="24"/>
         </w:rPr>
       </w:pPr>
-      <w:hyperlink r:id="rId12" w:history="1">
+      <w:hyperlink r:id="rId18" w:history="1">
         <w:r>
           <w:rPr>
             <w:rStyle w:val="Hyperlink"/>
@@ -7605,7 +8762,7 @@
       </w:r>
     </w:p>
     <w:sectPr>
-      <w:footerReference w:type="default" r:id="rId13"/>
+      <w:footerReference w:type="default" r:id="rId19"/>
       <w:pgSz w:w="11906" w:h="16838" w:code="9"/>
       <w:pgMar w:top="1440" w:right="1440" w:bottom="1440" w:left="1440" w:header="709" w:footer="709" w:gutter="0"/>
       <w:cols w:space="708"/>
@@ -7662,7 +8819,7 @@
             <w:rPr>
               <w:noProof/>
             </w:rPr>
-            <w:t>7</w:t>
+            <w:t>6</w:t>
           </w:r>
         </w:fldSimple>
       </w:p>
@@ -9162,6 +10319,142 @@
       <w:color w:val="4F81BD" w:themeColor="accent1"/>
     </w:rPr>
   </w:style>
+  <w:style w:type="paragraph" w:customStyle="1" w:styleId="Titulo2Relatorio">
+    <w:name w:val="Titulo 2 Relatorio"/>
+    <w:basedOn w:val="Ttulo2"/>
+    <w:link w:val="Titulo2RelatorioChar"/>
+    <w:qFormat/>
+    <w:rsid w:val="00B039C1"/>
+    <w:pPr>
+      <w:jc w:val="both"/>
+    </w:pPr>
+    <w:rPr>
+      <w:rFonts w:ascii="Times" w:hAnsi="Times" w:cs="Times"/>
+      <w:sz w:val="24"/>
+      <w:szCs w:val="24"/>
+    </w:rPr>
+  </w:style>
+  <w:style w:type="paragraph" w:customStyle="1" w:styleId="NormalRelatorio">
+    <w:name w:val="Normal Relatorio"/>
+    <w:basedOn w:val="Normal"/>
+    <w:link w:val="NormalRelatorioChar"/>
+    <w:qFormat/>
+    <w:rsid w:val="00B039C1"/>
+    <w:pPr>
+      <w:ind w:firstLine="708"/>
+      <w:jc w:val="both"/>
+    </w:pPr>
+    <w:rPr>
+      <w:rFonts w:ascii="Times" w:hAnsi="Times" w:cs="Times"/>
+      <w:sz w:val="24"/>
+      <w:szCs w:val="24"/>
+    </w:rPr>
+  </w:style>
+  <w:style w:type="character" w:customStyle="1" w:styleId="Titulo2RelatorioChar">
+    <w:name w:val="Titulo 2 Relatorio Char"/>
+    <w:basedOn w:val="Ttulo2Char"/>
+    <w:link w:val="Titulo2Relatorio"/>
+    <w:rsid w:val="00B039C1"/>
+    <w:rPr>
+      <w:rFonts w:ascii="Times" w:hAnsi="Times" w:cs="Times"/>
+      <w:b/>
+      <w:bCs/>
+      <w:sz w:val="24"/>
+      <w:szCs w:val="24"/>
+    </w:rPr>
+  </w:style>
+  <w:style w:type="paragraph" w:customStyle="1" w:styleId="Titulo3Relatorio">
+    <w:name w:val="Titulo 3 Relatorio"/>
+    <w:basedOn w:val="Ttulo3"/>
+    <w:link w:val="Titulo3RelatorioChar"/>
+    <w:qFormat/>
+    <w:rsid w:val="00B039C1"/>
+    <w:rPr>
+      <w:rFonts w:ascii="Times" w:hAnsi="Times" w:cs="Times"/>
+      <w:sz w:val="24"/>
+      <w:szCs w:val="24"/>
+    </w:rPr>
+  </w:style>
+  <w:style w:type="character" w:customStyle="1" w:styleId="NormalRelatorioChar">
+    <w:name w:val="Normal Relatorio Char"/>
+    <w:basedOn w:val="Fontepargpadro"/>
+    <w:link w:val="NormalRelatorio"/>
+    <w:rsid w:val="00B039C1"/>
+    <w:rPr>
+      <w:rFonts w:ascii="Times" w:hAnsi="Times" w:cs="Times"/>
+      <w:sz w:val="24"/>
+      <w:szCs w:val="24"/>
+    </w:rPr>
+  </w:style>
+  <w:style w:type="paragraph" w:customStyle="1" w:styleId="Codigo">
+    <w:name w:val="Codigo"/>
+    <w:basedOn w:val="Normal"/>
+    <w:link w:val="CodigoChar"/>
+    <w:qFormat/>
+    <w:rsid w:val="00B039C1"/>
+    <w:pPr>
+      <w:jc w:val="both"/>
+    </w:pPr>
+    <w:rPr>
+      <w:rFonts w:ascii="Courier New" w:eastAsiaTheme="minorEastAsia" w:hAnsi="Courier New" w:cs="Courier New"/>
+      <w:sz w:val="20"/>
+      <w:szCs w:val="24"/>
+    </w:rPr>
+  </w:style>
+  <w:style w:type="character" w:customStyle="1" w:styleId="Titulo3RelatorioChar">
+    <w:name w:val="Titulo 3 Relatorio Char"/>
+    <w:basedOn w:val="Ttulo3Char"/>
+    <w:link w:val="Titulo3Relatorio"/>
+    <w:rsid w:val="00B039C1"/>
+    <w:rPr>
+      <w:rFonts w:ascii="Times" w:hAnsi="Times" w:cs="Times"/>
+      <w:sz w:val="24"/>
+      <w:szCs w:val="24"/>
+    </w:rPr>
+  </w:style>
+  <w:style w:type="paragraph" w:styleId="Legenda">
+    <w:name w:val="caption"/>
+    <w:basedOn w:val="Normal"/>
+    <w:next w:val="Normal"/>
+    <w:uiPriority w:val="35"/>
+    <w:unhideWhenUsed/>
+    <w:qFormat/>
+    <w:rsid w:val="00B039C1"/>
+    <w:pPr>
+      <w:spacing w:line="240" w:lineRule="auto"/>
+    </w:pPr>
+    <w:rPr>
+      <w:b/>
+      <w:bCs/>
+      <w:color w:val="4F81BD" w:themeColor="accent1"/>
+      <w:sz w:val="18"/>
+      <w:szCs w:val="18"/>
+    </w:rPr>
+  </w:style>
+  <w:style w:type="character" w:customStyle="1" w:styleId="CodigoChar">
+    <w:name w:val="Codigo Char"/>
+    <w:basedOn w:val="Fontepargpadro"/>
+    <w:link w:val="Codigo"/>
+    <w:rsid w:val="00B039C1"/>
+    <w:rPr>
+      <w:rFonts w:ascii="Courier New" w:eastAsiaTheme="minorEastAsia" w:hAnsi="Courier New" w:cs="Courier New"/>
+      <w:sz w:val="20"/>
+      <w:szCs w:val="24"/>
+    </w:rPr>
+  </w:style>
+  <w:style w:type="paragraph" w:styleId="Sumrio3">
+    <w:name w:val="toc 3"/>
+    <w:basedOn w:val="Normal"/>
+    <w:next w:val="Normal"/>
+    <w:autoRedefine/>
+    <w:uiPriority w:val="39"/>
+    <w:unhideWhenUsed/>
+    <w:rsid w:val="00B039C1"/>
+    <w:pPr>
+      <w:spacing w:after="100"/>
+      <w:ind w:left="440"/>
+    </w:pPr>
+  </w:style>
 </w:styles>
 </file>
 
@@ -9257,7 +10550,6 @@
   </w:compat>
   <w:rsids>
     <w:rsidRoot w:val="00DE5764"/>
-    <w:rsid w:val="00232ED1"/>
     <w:rsid w:val="00DE5764"/>
   </w:rsids>
   <m:mathPr>

</xml_diff>

<commit_message>
Adicionando detalhes de funcionamento
</commit_message>
<xml_diff>
--- a/Relatorio_Equipe_HeapSort.docx
+++ b/Relatorio_Equipe_HeapSort.docx
@@ -3941,6 +3941,17 @@
           <w:szCs w:val="24"/>
         </w:rPr>
       </w:pPr>
+    </w:p>
+    <w:p>
+      <w:pPr>
+        <w:spacing w:line="480" w:lineRule="auto"/>
+        <w:jc w:val="both"/>
+        <w:rPr>
+          <w:rFonts w:ascii="Times" w:eastAsiaTheme="minorEastAsia" w:hAnsi="Times" w:cs="Times"/>
+          <w:sz w:val="24"/>
+          <w:szCs w:val="24"/>
+        </w:rPr>
+      </w:pPr>
       <w:r>
         <w:rPr>
           <w:rFonts w:ascii="Times" w:eastAsiaTheme="minorEastAsia" w:hAnsi="Times" w:cs="Times"/>
@@ -4449,6 +4460,7 @@
           <w:sz w:val="24"/>
           <w:szCs w:val="24"/>
         </w:rPr>
+        <w:lastRenderedPageBreak/>
         <w:t xml:space="preserve">Todavia, </w:t>
       </w:r>
       <w:r>
@@ -4513,7 +4525,6 @@
           <w:sz w:val="24"/>
           <w:szCs w:val="24"/>
         </w:rPr>
-        <w:lastRenderedPageBreak/>
         <w:t>O custo para a c</w:t>
       </w:r>
       <w:r>
@@ -5777,6 +5788,7 @@
           <w:sz w:val="24"/>
           <w:szCs w:val="24"/>
         </w:rPr>
+        <w:lastRenderedPageBreak/>
         <w:t>Não Ideal para Conjuntos de Dados Pequenos</w:t>
       </w:r>
     </w:p>
@@ -5820,7 +5832,6 @@
           <w:sz w:val="24"/>
           <w:szCs w:val="24"/>
         </w:rPr>
-        <w:lastRenderedPageBreak/>
         <w:t xml:space="preserve">O tempo consumido pelo Heapsort é proporcional ao número de comparações entre os elementos do array, e tal custo proporcional é </w:t>
       </w:r>
       <m:oMath>
@@ -6168,7 +6179,15 @@
           <w:sz w:val="24"/>
           <w:szCs w:val="24"/>
         </w:rPr>
-        <w:t xml:space="preserve">Para o procedimento </w:t>
+        <w:t>Supomos que p</w:t>
+      </w:r>
+      <w:r>
+        <w:rPr>
+          <w:rFonts w:ascii="Times" w:hAnsi="Times" w:cs="Times"/>
+          <w:sz w:val="24"/>
+          <w:szCs w:val="24"/>
+        </w:rPr>
+        <w:t xml:space="preserve">ara o procedimento </w:t>
       </w:r>
       <w:r>
         <w:rPr>
@@ -6185,7 +6204,7 @@
           <w:sz w:val="24"/>
           <w:szCs w:val="24"/>
         </w:rPr>
-        <w:t xml:space="preserve">, suponha um vetor denominado </w:t>
+        <w:t xml:space="preserve">, um vetor denominado </w:t>
       </w:r>
       <w:r>
         <w:rPr>
@@ -6254,7 +6273,15 @@
           <w:sz w:val="24"/>
           <w:szCs w:val="24"/>
         </w:rPr>
-        <w:t xml:space="preserve">, teremos que incluir </w:t>
+        <w:t>, teríamos</w:t>
+      </w:r>
+      <w:r>
+        <w:rPr>
+          <w:rFonts w:ascii="Times" w:eastAsiaTheme="minorEastAsia" w:hAnsi="Times" w:cs="Times"/>
+          <w:sz w:val="24"/>
+          <w:szCs w:val="24"/>
+        </w:rPr>
+        <w:t xml:space="preserve"> que incluir </w:t>
       </w:r>
       <w:r>
         <w:rPr>
@@ -6288,7 +6315,23 @@
           <w:sz w:val="24"/>
           <w:szCs w:val="24"/>
         </w:rPr>
-        <w:t xml:space="preserve"> poderá ser implementado, bastanto inserir </w:t>
+        <w:t xml:space="preserve"> poderá ser implementado, </w:t>
+      </w:r>
+      <w:r>
+        <w:rPr>
+          <w:rFonts w:ascii="Times" w:hAnsi="Times" w:cs="Times"/>
+          <w:sz w:val="24"/>
+          <w:szCs w:val="24"/>
+        </w:rPr>
+        <w:t>bastando</w:t>
+      </w:r>
+      <w:r>
+        <w:rPr>
+          <w:rFonts w:ascii="Times" w:hAnsi="Times" w:cs="Times"/>
+          <w:sz w:val="24"/>
+          <w:szCs w:val="24"/>
+        </w:rPr>
+        <w:t xml:space="preserve"> inserir </w:t>
       </w:r>
       <w:r>
         <w:rPr>
@@ -6314,15 +6357,7 @@
             <w:sz w:val="24"/>
             <w:szCs w:val="24"/>
           </w:rPr>
-          <m:t>dpq</m:t>
-        </m:r>
-        <m:r>
-          <w:rPr>
-            <w:rFonts w:ascii="Cambria Math" w:hAnsi="Cambria Math" w:cs="Times"/>
-            <w:sz w:val="24"/>
-            <w:szCs w:val="24"/>
-          </w:rPr>
-          <m:t>[0]</m:t>
+          <m:t>dpq[0]</m:t>
         </m:r>
       </m:oMath>
       <w:r>
@@ -6621,7 +6656,39 @@
           <w:sz w:val="24"/>
           <w:szCs w:val="24"/>
         </w:rPr>
-        <w:t xml:space="preserve">** Esse deslocamento é necessário, pois nesse exemplo de algoritmo presente na obra, está sendo utilizada uma representação seqüencial ao invés de uma representação </w:t>
+        <w:t xml:space="preserve">** Esse deslocamento é necessário, pois nesse exemplo de algoritmo </w:t>
+      </w:r>
+      <w:r>
+        <w:rPr>
+          <w:rFonts w:ascii="Times" w:eastAsiaTheme="minorEastAsia" w:hAnsi="Times" w:cs="Times"/>
+          <w:sz w:val="24"/>
+          <w:szCs w:val="24"/>
+        </w:rPr>
+        <w:t xml:space="preserve">da </w:t>
+      </w:r>
+      <w:r>
+        <w:rPr>
+          <w:rFonts w:ascii="Times" w:eastAsiaTheme="minorEastAsia" w:hAnsi="Times" w:cs="Times"/>
+          <w:sz w:val="24"/>
+          <w:szCs w:val="24"/>
+        </w:rPr>
+        <w:t>obra</w:t>
+      </w:r>
+      <w:r>
+        <w:rPr>
+          <w:rFonts w:ascii="Times" w:eastAsiaTheme="minorEastAsia" w:hAnsi="Times" w:cs="Times"/>
+          <w:sz w:val="24"/>
+          <w:szCs w:val="24"/>
+        </w:rPr>
+        <w:t xml:space="preserve"> “Estrutura de Dados Usando C”</w:t>
+      </w:r>
+      <w:r>
+        <w:rPr>
+          <w:rFonts w:ascii="Times" w:eastAsiaTheme="minorEastAsia" w:hAnsi="Times" w:cs="Times"/>
+          <w:sz w:val="24"/>
+          <w:szCs w:val="24"/>
+        </w:rPr>
+        <w:t xml:space="preserve">, está sendo utilizada uma representação seqüencial ao invés de uma representação </w:t>
       </w:r>
       <w:r>
         <w:rPr>
@@ -6680,6 +6747,7 @@
           <w:sz w:val="24"/>
           <w:szCs w:val="24"/>
         </w:rPr>
+        <w:lastRenderedPageBreak/>
         <w:t>O seguinte algoritmo deverá ser implementado:</w:t>
       </w:r>
     </w:p>
@@ -6716,7 +6784,6 @@
           <w:sz w:val="20"/>
           <w:szCs w:val="24"/>
         </w:rPr>
-        <w:lastRenderedPageBreak/>
         <w:t>{</w:t>
       </w:r>
     </w:p>
@@ -6926,27 +6993,15 @@
     </w:p>
     <w:p>
       <w:pPr>
-        <w:jc w:val="both"/>
-        <w:rPr>
-          <w:rFonts w:ascii="Times" w:eastAsiaTheme="minorEastAsia" w:hAnsi="Times" w:cs="Times"/>
-          <w:sz w:val="24"/>
-          <w:szCs w:val="24"/>
-        </w:rPr>
-      </w:pPr>
-      <w:r>
-        <w:rPr>
-          <w:rFonts w:ascii="Times" w:eastAsiaTheme="minorEastAsia" w:hAnsi="Times" w:cs="Times"/>
-          <w:sz w:val="24"/>
-          <w:szCs w:val="24"/>
-        </w:rPr>
+        <w:pStyle w:val="NormalRelatorio"/>
+      </w:pPr>
+      <w:r>
         <w:t xml:space="preserve">A inserção deste exemplo é </w:t>
       </w:r>
       <m:oMath>
         <m:r>
           <w:rPr>
-            <w:rFonts w:ascii="Cambria Math" w:eastAsiaTheme="minorEastAsia" w:hAnsi="Cambria Math" w:cs="Times"/>
-            <w:sz w:val="24"/>
-            <w:szCs w:val="24"/>
+            <w:rFonts w:ascii="Cambria Math" w:hAnsi="Cambria Math"/>
           </w:rPr>
           <m:t>O(</m:t>
         </m:r>
@@ -6954,10 +7009,8 @@
           <m:funcPr>
             <m:ctrlPr>
               <w:rPr>
-                <w:rFonts w:ascii="Cambria Math" w:eastAsiaTheme="minorEastAsia" w:hAnsi="Cambria Math" w:cs="Times"/>
+                <w:rFonts w:ascii="Cambria Math" w:hAnsi="Cambria Math"/>
                 <w:i/>
-                <w:sz w:val="24"/>
-                <w:szCs w:val="24"/>
               </w:rPr>
             </m:ctrlPr>
           </m:funcPr>
@@ -6967,9 +7020,7 @@
                 <m:sty m:val="p"/>
               </m:rPr>
               <w:rPr>
-                <w:rFonts w:ascii="Cambria Math" w:eastAsiaTheme="minorEastAsia" w:hAnsi="Cambria Math" w:cs="Times"/>
-                <w:sz w:val="24"/>
-                <w:szCs w:val="24"/>
+                <w:rFonts w:ascii="Cambria Math" w:hAnsi="Cambria Math"/>
               </w:rPr>
               <m:t>log</m:t>
             </m:r>
@@ -6977,9 +7028,7 @@
           <m:e>
             <m:r>
               <w:rPr>
-                <w:rFonts w:ascii="Cambria Math" w:eastAsiaTheme="minorEastAsia" w:hAnsi="Cambria Math" w:cs="Times"/>
-                <w:sz w:val="24"/>
-                <w:szCs w:val="24"/>
+                <w:rFonts w:ascii="Cambria Math" w:hAnsi="Cambria Math"/>
               </w:rPr>
               <m:t>n)</m:t>
             </m:r>
@@ -6987,29 +7036,17 @@
         </m:func>
       </m:oMath>
       <w:r>
-        <w:rPr>
-          <w:rFonts w:ascii="Times" w:eastAsiaTheme="minorEastAsia" w:hAnsi="Times" w:cs="Times"/>
-          <w:sz w:val="24"/>
-          <w:szCs w:val="24"/>
-        </w:rPr>
         <w:t xml:space="preserve"> pois uma árvore binária quase completa com </w:t>
       </w:r>
       <m:oMath>
         <m:r>
           <w:rPr>
-            <w:rFonts w:ascii="Cambria Math" w:eastAsiaTheme="minorEastAsia" w:hAnsi="Cambria Math" w:cs="Times"/>
-            <w:sz w:val="24"/>
-            <w:szCs w:val="24"/>
+            <w:rFonts w:ascii="Cambria Math" w:hAnsi="Cambria Math"/>
           </w:rPr>
           <m:t>n</m:t>
         </m:r>
       </m:oMath>
       <w:r>
-        <w:rPr>
-          <w:rFonts w:ascii="Times" w:eastAsiaTheme="minorEastAsia" w:hAnsi="Times" w:cs="Times"/>
-          <w:sz w:val="24"/>
-          <w:szCs w:val="24"/>
-        </w:rPr>
         <w:t xml:space="preserve"> nós tem </w:t>
       </w:r>
       <m:oMath>
@@ -7017,19 +7054,15 @@
           <m:sSubPr>
             <m:ctrlPr>
               <w:rPr>
-                <w:rFonts w:ascii="Cambria Math" w:eastAsiaTheme="minorEastAsia" w:hAnsi="Cambria Math" w:cs="Times"/>
+                <w:rFonts w:ascii="Cambria Math" w:hAnsi="Cambria Math"/>
                 <w:i/>
-                <w:sz w:val="24"/>
-                <w:szCs w:val="24"/>
               </w:rPr>
             </m:ctrlPr>
           </m:sSubPr>
           <m:e>
             <m:r>
               <w:rPr>
-                <w:rFonts w:ascii="Cambria Math" w:eastAsiaTheme="minorEastAsia" w:hAnsi="Cambria Math" w:cs="Times"/>
-                <w:sz w:val="24"/>
-                <w:szCs w:val="24"/>
+                <w:rFonts w:ascii="Cambria Math" w:hAnsi="Cambria Math"/>
               </w:rPr>
               <m:t>log</m:t>
             </m:r>
@@ -7037,9 +7070,7 @@
           <m:sub>
             <m:r>
               <w:rPr>
-                <w:rFonts w:ascii="Cambria Math" w:eastAsiaTheme="minorEastAsia" w:hAnsi="Cambria Math" w:cs="Times"/>
-                <w:sz w:val="24"/>
-                <w:szCs w:val="24"/>
+                <w:rFonts w:ascii="Cambria Math" w:hAnsi="Cambria Math"/>
               </w:rPr>
               <m:t xml:space="preserve">2 </m:t>
             </m:r>
@@ -7047,20 +7078,570 @@
         </m:sSub>
         <m:r>
           <w:rPr>
-            <w:rFonts w:ascii="Cambria Math" w:eastAsiaTheme="minorEastAsia" w:hAnsi="Cambria Math" w:cs="Times"/>
-            <w:sz w:val="24"/>
-            <w:szCs w:val="24"/>
+            <w:rFonts w:ascii="Cambria Math" w:hAnsi="Cambria Math"/>
           </w:rPr>
           <m:t>n+1</m:t>
         </m:r>
       </m:oMath>
       <w:r>
-        <w:rPr>
-          <w:rFonts w:ascii="Times" w:eastAsiaTheme="minorEastAsia" w:hAnsi="Times" w:cs="Times"/>
-          <w:sz w:val="24"/>
-          <w:szCs w:val="24"/>
-        </w:rPr>
         <w:t xml:space="preserve"> níveis,  e no máximo um nó por cada nível é acessado.</w:t>
+      </w:r>
+    </w:p>
+    <w:p>
+      <w:pPr>
+        <w:pStyle w:val="NormalRelatorio"/>
+      </w:pPr>
+      <w:r>
+        <w:t xml:space="preserve">Agora esta implementação de </w:t>
+      </w:r>
+      <w:r>
+        <w:rPr>
+          <w:i/>
+        </w:rPr>
+        <w:t>pq</w:t>
+      </w:r>
+      <w:r>
+        <w:rPr>
+          <w:i/>
+        </w:rPr>
+        <w:t>maxdelete</w:t>
+      </w:r>
+      <m:oMath>
+        <m:r>
+          <w:rPr>
+            <w:rFonts w:ascii="Cambria Math" w:hAnsi="Cambria Math"/>
+          </w:rPr>
+          <m:t>(dpq,k)</m:t>
+        </m:r>
+      </m:oMath>
+      <w:r>
+        <w:rPr>
+          <w:rFonts w:eastAsiaTheme="minorEastAsia"/>
+        </w:rPr>
+        <w:t xml:space="preserve"> para um heap descendente de tamanho </w:t>
+      </w:r>
+      <m:oMath>
+        <m:r>
+          <w:rPr>
+            <w:rFonts w:ascii="Cambria Math" w:eastAsiaTheme="minorEastAsia" w:hAnsi="Cambria Math"/>
+          </w:rPr>
+          <m:t>k</m:t>
+        </m:r>
+      </m:oMath>
+      <w:r>
+        <w:rPr>
+          <w:rFonts w:eastAsiaTheme="minorEastAsia"/>
+        </w:rPr>
+        <w:t>.</w:t>
+      </w:r>
+      <w:r>
+        <w:rPr>
+          <w:rFonts w:eastAsiaTheme="minorEastAsia"/>
+        </w:rPr>
+        <w:t xml:space="preserve"> Primeiramente, defina-se </w:t>
+      </w:r>
+      <w:r>
+        <w:rPr>
+          <w:rFonts w:eastAsiaTheme="minorEastAsia"/>
+          <w:i/>
+        </w:rPr>
+        <w:t>subtree</w:t>
+      </w:r>
+      <m:oMath>
+        <m:r>
+          <w:rPr>
+            <w:rFonts w:ascii="Cambria Math" w:eastAsiaTheme="minorEastAsia" w:hAnsi="Cambria Math"/>
+          </w:rPr>
+          <m:t>(p,m)</m:t>
+        </m:r>
+      </m:oMath>
+      <w:r>
+        <w:rPr>
+          <w:rFonts w:eastAsiaTheme="minorEastAsia"/>
+        </w:rPr>
+        <w:t xml:space="preserve"> onde </w:t>
+      </w:r>
+      <m:oMath>
+        <m:r>
+          <w:rPr>
+            <w:rFonts w:ascii="Cambria Math" w:eastAsiaTheme="minorEastAsia" w:hAnsi="Cambria Math"/>
+          </w:rPr>
+          <m:t>m</m:t>
+        </m:r>
+      </m:oMath>
+      <w:r>
+        <w:rPr>
+          <w:rFonts w:eastAsiaTheme="minorEastAsia"/>
+        </w:rPr>
+        <w:t xml:space="preserve"> é maior que </w:t>
+      </w:r>
+      <m:oMath>
+        <m:r>
+          <w:rPr>
+            <w:rFonts w:ascii="Cambria Math" w:eastAsiaTheme="minorEastAsia" w:hAnsi="Cambria Math"/>
+          </w:rPr>
+          <m:t>p</m:t>
+        </m:r>
+      </m:oMath>
+      <w:r>
+        <w:rPr>
+          <w:rFonts w:eastAsiaTheme="minorEastAsia"/>
+        </w:rPr>
+        <w:t xml:space="preserve">, como a subárvore (do heap descendente) enraizada na posição </w:t>
+      </w:r>
+      <m:oMath>
+        <m:r>
+          <w:rPr>
+            <w:rFonts w:ascii="Cambria Math" w:eastAsiaTheme="minorEastAsia" w:hAnsi="Cambria Math"/>
+          </w:rPr>
+          <m:t>p</m:t>
+        </m:r>
+      </m:oMath>
+      <w:r>
+        <w:rPr>
+          <w:rFonts w:eastAsiaTheme="minorEastAsia"/>
+        </w:rPr>
+        <w:t xml:space="preserve"> dentro dos elementos </w:t>
+      </w:r>
+      <w:r>
+        <w:rPr>
+          <w:rFonts w:eastAsiaTheme="minorEastAsia"/>
+          <w:i/>
+        </w:rPr>
+        <w:t>dpq</w:t>
+      </w:r>
+      <m:oMath>
+        <m:r>
+          <w:rPr>
+            <w:rFonts w:ascii="Cambria Math" w:eastAsiaTheme="minorEastAsia" w:hAnsi="Cambria Math"/>
+          </w:rPr>
+          <m:t>[p]</m:t>
+        </m:r>
+      </m:oMath>
+      <w:r>
+        <w:rPr>
+          <w:rFonts w:eastAsiaTheme="minorEastAsia"/>
+        </w:rPr>
+        <w:t xml:space="preserve"> a </w:t>
+      </w:r>
+      <w:r>
+        <w:rPr>
+          <w:rFonts w:eastAsiaTheme="minorEastAsia"/>
+          <w:i/>
+        </w:rPr>
+        <w:t>dpq</w:t>
+      </w:r>
+      <m:oMath>
+        <m:r>
+          <w:rPr>
+            <w:rFonts w:ascii="Cambria Math" w:eastAsiaTheme="minorEastAsia" w:hAnsi="Cambria Math"/>
+          </w:rPr>
+          <m:t>[m]</m:t>
+        </m:r>
+      </m:oMath>
+      <w:r>
+        <w:rPr>
+          <w:rFonts w:eastAsiaTheme="minorEastAsia"/>
+        </w:rPr>
+        <w:t xml:space="preserve">. Por exemplo, a </w:t>
+      </w:r>
+      <w:r>
+        <w:rPr>
+          <w:rFonts w:eastAsiaTheme="minorEastAsia"/>
+          <w:i/>
+        </w:rPr>
+        <w:t>subtree</w:t>
+      </w:r>
+      <m:oMath>
+        <m:r>
+          <w:rPr>
+            <w:rFonts w:ascii="Cambria Math" w:eastAsiaTheme="minorEastAsia" w:hAnsi="Cambria Math"/>
+          </w:rPr>
+          <m:t>(3,10)</m:t>
+        </m:r>
+      </m:oMath>
+      <w:r>
+        <w:rPr>
+          <w:rFonts w:eastAsiaTheme="minorEastAsia"/>
+        </w:rPr>
+        <w:t xml:space="preserve"> consiste na raiz </w:t>
+      </w:r>
+      <w:r>
+        <w:rPr>
+          <w:rFonts w:eastAsiaTheme="minorEastAsia"/>
+          <w:i/>
+        </w:rPr>
+        <w:t>dpq</w:t>
+      </w:r>
+      <m:oMath>
+        <m:r>
+          <w:rPr>
+            <w:rFonts w:ascii="Cambria Math" w:eastAsiaTheme="minorEastAsia" w:hAnsi="Cambria Math"/>
+          </w:rPr>
+          <m:t>[3]</m:t>
+        </m:r>
+      </m:oMath>
+      <w:r>
+        <w:rPr>
+          <w:rFonts w:eastAsiaTheme="minorEastAsia"/>
+        </w:rPr>
+        <w:t xml:space="preserve"> e os seus dois filhos: </w:t>
+      </w:r>
+      <w:r>
+        <w:rPr>
+          <w:rFonts w:eastAsiaTheme="minorEastAsia"/>
+          <w:i/>
+        </w:rPr>
+        <w:t>dpq</w:t>
+      </w:r>
+      <m:oMath>
+        <m:r>
+          <w:rPr>
+            <w:rFonts w:ascii="Cambria Math" w:eastAsiaTheme="minorEastAsia" w:hAnsi="Cambria Math"/>
+          </w:rPr>
+          <m:t>[7]</m:t>
+        </m:r>
+      </m:oMath>
+      <w:r>
+        <w:rPr>
+          <w:rFonts w:eastAsiaTheme="minorEastAsia"/>
+        </w:rPr>
+        <w:t xml:space="preserve"> a </w:t>
+      </w:r>
+      <w:r>
+        <w:rPr>
+          <w:rFonts w:eastAsiaTheme="minorEastAsia"/>
+          <w:i/>
+        </w:rPr>
+        <w:t>dpq</w:t>
+      </w:r>
+      <m:oMath>
+        <m:r>
+          <w:rPr>
+            <w:rFonts w:ascii="Cambria Math" w:eastAsiaTheme="minorEastAsia" w:hAnsi="Cambria Math"/>
+          </w:rPr>
+          <m:t>[8]</m:t>
+        </m:r>
+      </m:oMath>
+      <w:r>
+        <w:rPr>
+          <w:rFonts w:eastAsiaTheme="minorEastAsia"/>
+        </w:rPr>
+        <w:t xml:space="preserve">. Já a </w:t>
+      </w:r>
+      <w:r>
+        <w:rPr>
+          <w:rFonts w:eastAsiaTheme="minorEastAsia"/>
+          <w:i/>
+        </w:rPr>
+        <w:t>subtree</w:t>
+      </w:r>
+      <m:oMath>
+        <m:r>
+          <w:rPr>
+            <w:rFonts w:ascii="Cambria Math" w:eastAsiaTheme="minorEastAsia" w:hAnsi="Cambria Math"/>
+          </w:rPr>
+          <m:t>(3,17)</m:t>
+        </m:r>
+      </m:oMath>
+      <w:r>
+        <w:rPr>
+          <w:rFonts w:eastAsiaTheme="minorEastAsia"/>
+        </w:rPr>
+        <w:t xml:space="preserve"> consiste em </w:t>
+      </w:r>
+      <w:r>
+        <w:rPr>
+          <w:rFonts w:eastAsiaTheme="minorEastAsia"/>
+          <w:i/>
+        </w:rPr>
+        <w:t>dpq</w:t>
+      </w:r>
+      <m:oMath>
+        <m:r>
+          <w:rPr>
+            <w:rFonts w:ascii="Cambria Math" w:eastAsiaTheme="minorEastAsia" w:hAnsi="Cambria Math"/>
+          </w:rPr>
+          <m:t>[3]</m:t>
+        </m:r>
+      </m:oMath>
+      <w:r>
+        <w:rPr>
+          <w:rFonts w:eastAsiaTheme="minorEastAsia"/>
+        </w:rPr>
+        <w:t xml:space="preserve">, </w:t>
+      </w:r>
+      <w:r>
+        <w:rPr>
+          <w:rFonts w:eastAsiaTheme="minorEastAsia"/>
+          <w:i/>
+        </w:rPr>
+        <w:t>dpq</w:t>
+      </w:r>
+      <m:oMath>
+        <m:r>
+          <w:rPr>
+            <w:rFonts w:ascii="Cambria Math" w:eastAsiaTheme="minorEastAsia" w:hAnsi="Cambria Math"/>
+          </w:rPr>
+          <m:t>[7]</m:t>
+        </m:r>
+      </m:oMath>
+      <w:r>
+        <w:rPr>
+          <w:rFonts w:eastAsiaTheme="minorEastAsia"/>
+        </w:rPr>
+        <w:t xml:space="preserve">, </w:t>
+      </w:r>
+      <w:r>
+        <w:rPr>
+          <w:rFonts w:eastAsiaTheme="minorEastAsia"/>
+          <w:i/>
+        </w:rPr>
+        <w:t>dpq</w:t>
+      </w:r>
+      <m:oMath>
+        <m:r>
+          <w:rPr>
+            <w:rFonts w:ascii="Cambria Math" w:eastAsiaTheme="minorEastAsia" w:hAnsi="Cambria Math"/>
+          </w:rPr>
+          <m:t>[8]</m:t>
+        </m:r>
+      </m:oMath>
+      <w:r>
+        <w:rPr>
+          <w:rFonts w:eastAsiaTheme="minorEastAsia"/>
+        </w:rPr>
+        <w:t xml:space="preserve">, </w:t>
+      </w:r>
+      <w:r>
+        <w:rPr>
+          <w:rFonts w:eastAsiaTheme="minorEastAsia"/>
+          <w:i/>
+        </w:rPr>
+        <w:t>dpq</w:t>
+      </w:r>
+      <m:oMath>
+        <m:r>
+          <w:rPr>
+            <w:rFonts w:ascii="Cambria Math" w:eastAsiaTheme="minorEastAsia" w:hAnsi="Cambria Math"/>
+          </w:rPr>
+          <m:t>[15]</m:t>
+        </m:r>
+      </m:oMath>
+      <w:r>
+        <w:rPr>
+          <w:rFonts w:eastAsiaTheme="minorEastAsia"/>
+        </w:rPr>
+        <w:t xml:space="preserve">, </w:t>
+      </w:r>
+      <w:r>
+        <w:rPr>
+          <w:rFonts w:eastAsiaTheme="minorEastAsia"/>
+          <w:i/>
+        </w:rPr>
+        <w:t>dpq</w:t>
+      </w:r>
+      <m:oMath>
+        <m:r>
+          <w:rPr>
+            <w:rFonts w:ascii="Cambria Math" w:eastAsiaTheme="minorEastAsia" w:hAnsi="Cambria Math"/>
+          </w:rPr>
+          <m:t>[16]</m:t>
+        </m:r>
+      </m:oMath>
+      <w:r>
+        <w:rPr>
+          <w:rFonts w:eastAsiaTheme="minorEastAsia"/>
+        </w:rPr>
+        <w:t xml:space="preserve"> e </w:t>
+      </w:r>
+      <w:r>
+        <w:rPr>
+          <w:rFonts w:eastAsiaTheme="minorEastAsia"/>
+          <w:i/>
+        </w:rPr>
+        <w:t>dpq</w:t>
+      </w:r>
+      <m:oMath>
+        <m:r>
+          <w:rPr>
+            <w:rFonts w:ascii="Cambria Math" w:eastAsiaTheme="minorEastAsia" w:hAnsi="Cambria Math"/>
+          </w:rPr>
+          <m:t>[17]</m:t>
+        </m:r>
+      </m:oMath>
+      <w:r>
+        <w:rPr>
+          <w:rFonts w:eastAsiaTheme="minorEastAsia"/>
+        </w:rPr>
+        <w:t xml:space="preserve">. </w:t>
+      </w:r>
+      <w:r>
+        <w:rPr>
+          <w:rFonts w:eastAsiaTheme="minorEastAsia"/>
+        </w:rPr>
+        <w:t xml:space="preserve">Se </w:t>
+      </w:r>
+      <w:r>
+        <w:rPr>
+          <w:rFonts w:eastAsiaTheme="minorEastAsia"/>
+          <w:i/>
+        </w:rPr>
+        <w:t>dpq</w:t>
+      </w:r>
+      <m:oMath>
+        <m:r>
+          <w:rPr>
+            <w:rFonts w:ascii="Cambria Math" w:eastAsiaTheme="minorEastAsia" w:hAnsi="Cambria Math"/>
+          </w:rPr>
+          <m:t>[i]</m:t>
+        </m:r>
+      </m:oMath>
+      <w:r>
+        <w:rPr>
+          <w:rFonts w:eastAsiaTheme="minorEastAsia"/>
+        </w:rPr>
+        <w:t xml:space="preserve"> estiver incluso na </w:t>
+      </w:r>
+      <w:r>
+        <w:rPr>
+          <w:rFonts w:eastAsiaTheme="minorEastAsia"/>
+          <w:i/>
+        </w:rPr>
+        <w:t>subtree</w:t>
+      </w:r>
+      <m:oMath>
+        <m:r>
+          <w:rPr>
+            <w:rFonts w:ascii="Cambria Math" w:eastAsiaTheme="minorEastAsia" w:hAnsi="Cambria Math"/>
+          </w:rPr>
+          <m:t>(p,m)</m:t>
+        </m:r>
+      </m:oMath>
+      <w:r>
+        <w:rPr>
+          <w:rFonts w:eastAsiaTheme="minorEastAsia"/>
+        </w:rPr>
+        <w:t xml:space="preserve">, </w:t>
+      </w:r>
+      <w:r>
+        <w:rPr>
+          <w:rFonts w:eastAsiaTheme="minorEastAsia"/>
+          <w:i/>
+        </w:rPr>
+        <w:t>dpq</w:t>
+      </w:r>
+      <m:oMath>
+        <m:r>
+          <w:rPr>
+            <w:rFonts w:ascii="Cambria Math" w:eastAsiaTheme="minorEastAsia" w:hAnsi="Cambria Math"/>
+          </w:rPr>
+          <m:t>[2*i+1]</m:t>
+        </m:r>
+      </m:oMath>
+      <w:r>
+        <w:rPr>
+          <w:rFonts w:eastAsiaTheme="minorEastAsia"/>
+        </w:rPr>
+        <w:t xml:space="preserve"> também estará incluso se e somente se </w:t>
+      </w:r>
+      <m:oMath>
+        <m:r>
+          <w:rPr>
+            <w:rFonts w:ascii="Cambria Math" w:eastAsiaTheme="minorEastAsia" w:hAnsi="Cambria Math"/>
+          </w:rPr>
+          <m:t>2*i+1&lt;=m</m:t>
+        </m:r>
+      </m:oMath>
+      <w:r>
+        <w:rPr>
+          <w:rFonts w:eastAsiaTheme="minorEastAsia"/>
+        </w:rPr>
+        <w:t xml:space="preserve">, e </w:t>
+      </w:r>
+      <w:r>
+        <w:rPr>
+          <w:rFonts w:eastAsiaTheme="minorEastAsia"/>
+          <w:i/>
+        </w:rPr>
+        <w:t>dpq</w:t>
+      </w:r>
+      <m:oMath>
+        <m:r>
+          <w:rPr>
+            <w:rFonts w:ascii="Cambria Math" w:eastAsiaTheme="minorEastAsia" w:hAnsi="Cambria Math"/>
+          </w:rPr>
+          <m:t>[2*i+2]</m:t>
+        </m:r>
+      </m:oMath>
+      <w:r>
+        <w:rPr>
+          <w:rFonts w:eastAsiaTheme="minorEastAsia"/>
+        </w:rPr>
+        <w:t xml:space="preserve"> estará incluso se e somente se </w:t>
+      </w:r>
+      <m:oMath>
+        <m:r>
+          <w:rPr>
+            <w:rFonts w:ascii="Cambria Math" w:eastAsiaTheme="minorEastAsia" w:hAnsi="Cambria Math"/>
+          </w:rPr>
+          <m:t>2*i+2&lt;=m</m:t>
+        </m:r>
+      </m:oMath>
+      <w:r>
+        <w:rPr>
+          <w:rFonts w:eastAsiaTheme="minorEastAsia"/>
+        </w:rPr>
+        <w:t xml:space="preserve">. Se </w:t>
+      </w:r>
+      <m:oMath>
+        <m:r>
+          <w:rPr>
+            <w:rFonts w:ascii="Cambria Math" w:eastAsiaTheme="minorEastAsia" w:hAnsi="Cambria Math"/>
+          </w:rPr>
+          <m:t>m</m:t>
+        </m:r>
+      </m:oMath>
+      <w:r>
+        <w:rPr>
+          <w:rFonts w:eastAsiaTheme="minorEastAsia"/>
+        </w:rPr>
+        <w:t xml:space="preserve"> for considerado menor que </w:t>
+      </w:r>
+      <m:oMath>
+        <m:r>
+          <w:rPr>
+            <w:rFonts w:ascii="Cambria Math" w:eastAsiaTheme="minorEastAsia" w:hAnsi="Cambria Math"/>
+          </w:rPr>
+          <m:t>p</m:t>
+        </m:r>
+      </m:oMath>
+      <w:r>
+        <w:rPr>
+          <w:rFonts w:eastAsiaTheme="minorEastAsia"/>
+        </w:rPr>
+        <w:t xml:space="preserve">, a </w:t>
+      </w:r>
+      <w:r>
+        <w:rPr>
+          <w:rFonts w:eastAsiaTheme="minorEastAsia"/>
+          <w:i/>
+        </w:rPr>
+        <w:t>subtree</w:t>
+      </w:r>
+      <m:oMath>
+        <m:r>
+          <w:rPr>
+            <w:rFonts w:ascii="Cambria Math" w:eastAsiaTheme="minorEastAsia" w:hAnsi="Cambria Math"/>
+          </w:rPr>
+          <m:t>(p,m)</m:t>
+        </m:r>
+      </m:oMath>
+      <w:r>
+        <w:rPr>
+          <w:rFonts w:eastAsiaTheme="minorEastAsia"/>
+        </w:rPr>
+        <w:t xml:space="preserve"> será definida como uma árvore vazia.</w:t>
       </w:r>
     </w:p>
     <w:p>
@@ -7546,6 +8127,7 @@
         <w:pStyle w:val="Codigo"/>
       </w:pPr>
       <w:r>
+        <w:lastRenderedPageBreak/>
         <w:t xml:space="preserve">    int p = dpq[0];</w:t>
       </w:r>
     </w:p>
@@ -7593,11 +8175,302 @@
     </w:p>
     <w:p>
       <w:pPr>
-        <w:pStyle w:val="Titulo3Relatorio"/>
-      </w:pPr>
-      <w:bookmarkStart w:id="15" w:name="_Toc200142126"/>
-      <w:r>
-        <w:t>ADJUSTHEAP</w:t>
+        <w:pStyle w:val="NormalRelatorio"/>
+      </w:pPr>
+      <w:bookmarkStart w:id="15" w:name="_Toc200142127"/>
+      <w:r>
+        <w:t xml:space="preserve">Em um heap descendente, tanto o elemento-raiz e um outro elemento posicionado em qualquer posição </w:t>
+      </w:r>
+      <m:oMath>
+        <m:r>
+          <w:rPr>
+            <w:rFonts w:ascii="Cambria Math" w:hAnsi="Cambria Math"/>
+          </w:rPr>
+          <m:t>p</m:t>
+        </m:r>
+      </m:oMath>
+      <w:r>
+        <w:rPr>
+          <w:rFonts w:eastAsiaTheme="minorEastAsia"/>
+        </w:rPr>
+        <w:t xml:space="preserve"> devem ser considerados como o maior elemento em </w:t>
+      </w:r>
+      <w:r>
+        <w:rPr>
+          <w:rFonts w:eastAsiaTheme="minorEastAsia"/>
+          <w:i/>
+        </w:rPr>
+        <w:t>subtree</w:t>
+      </w:r>
+      <m:oMath>
+        <m:d>
+          <m:dPr>
+            <m:ctrlPr>
+              <w:rPr>
+                <w:rFonts w:ascii="Cambria Math" w:eastAsiaTheme="minorEastAsia" w:hAnsi="Cambria Math"/>
+                <w:i/>
+              </w:rPr>
+            </m:ctrlPr>
+          </m:dPr>
+          <m:e>
+            <m:r>
+              <w:rPr>
+                <w:rFonts w:ascii="Cambria Math" w:eastAsiaTheme="minorEastAsia" w:hAnsi="Cambria Math"/>
+              </w:rPr>
+              <m:t>p,k</m:t>
+            </m:r>
+          </m:e>
+        </m:d>
+      </m:oMath>
+      <w:r>
+        <w:rPr>
+          <w:rFonts w:eastAsiaTheme="minorEastAsia"/>
+        </w:rPr>
+        <w:t xml:space="preserve">. Todavia, agora </w:t>
+      </w:r>
+      <w:r>
+        <w:rPr>
+          <w:rFonts w:eastAsiaTheme="minorEastAsia"/>
+          <w:i/>
+        </w:rPr>
+        <w:t>subtree</w:t>
+      </w:r>
+      <m:oMath>
+        <m:d>
+          <m:dPr>
+            <m:ctrlPr>
+              <w:rPr>
+                <w:rFonts w:ascii="Cambria Math" w:eastAsiaTheme="minorEastAsia" w:hAnsi="Cambria Math"/>
+                <w:i/>
+              </w:rPr>
+            </m:ctrlPr>
+          </m:dPr>
+          <m:e>
+            <m:r>
+              <w:rPr>
+                <w:rFonts w:ascii="Cambria Math" w:eastAsiaTheme="minorEastAsia" w:hAnsi="Cambria Math"/>
+              </w:rPr>
+              <m:t>p,k</m:t>
+            </m:r>
+          </m:e>
+        </m:d>
+      </m:oMath>
+      <w:r>
+        <w:rPr>
+          <w:rFonts w:eastAsiaTheme="minorEastAsia"/>
+        </w:rPr>
+        <w:t xml:space="preserve"> é constituída por três grupos elementares: a raiz dpq[p], subárvore esquerda </w:t>
+      </w:r>
+      <w:r>
+        <w:rPr>
+          <w:rFonts w:eastAsiaTheme="minorEastAsia"/>
+          <w:i/>
+        </w:rPr>
+        <w:t>subtree</w:t>
+      </w:r>
+      <m:oMath>
+        <m:d>
+          <m:dPr>
+            <m:ctrlPr>
+              <w:rPr>
+                <w:rFonts w:ascii="Cambria Math" w:eastAsiaTheme="minorEastAsia" w:hAnsi="Cambria Math"/>
+                <w:i/>
+              </w:rPr>
+            </m:ctrlPr>
+          </m:dPr>
+          <m:e>
+            <m:r>
+              <w:rPr>
+                <w:rFonts w:ascii="Cambria Math" w:eastAsiaTheme="minorEastAsia" w:hAnsi="Cambria Math"/>
+              </w:rPr>
+              <m:t>2*p+1,k</m:t>
+            </m:r>
+          </m:e>
+        </m:d>
+      </m:oMath>
+      <w:r>
+        <w:rPr>
+          <w:rFonts w:eastAsiaTheme="minorEastAsia"/>
+        </w:rPr>
+        <w:t xml:space="preserve"> e a subárvore direita </w:t>
+      </w:r>
+      <w:r>
+        <w:rPr>
+          <w:rFonts w:eastAsiaTheme="minorEastAsia"/>
+          <w:i/>
+        </w:rPr>
+        <w:t>subtree</w:t>
+      </w:r>
+      <m:oMath>
+        <m:d>
+          <m:dPr>
+            <m:ctrlPr>
+              <w:rPr>
+                <w:rFonts w:ascii="Cambria Math" w:eastAsiaTheme="minorEastAsia" w:hAnsi="Cambria Math"/>
+                <w:i/>
+              </w:rPr>
+            </m:ctrlPr>
+          </m:dPr>
+          <m:e>
+            <m:r>
+              <w:rPr>
+                <w:rFonts w:ascii="Cambria Math" w:eastAsiaTheme="minorEastAsia" w:hAnsi="Cambria Math"/>
+              </w:rPr>
+              <m:t>2*p+2,k</m:t>
+            </m:r>
+          </m:e>
+        </m:d>
+      </m:oMath>
+      <w:r>
+        <w:rPr>
+          <w:rFonts w:eastAsiaTheme="minorEastAsia"/>
+        </w:rPr>
+        <w:t xml:space="preserve">. O filho esquerdo da raiz </w:t>
+      </w:r>
+      <w:r>
+        <w:rPr>
+          <w:rFonts w:eastAsiaTheme="minorEastAsia"/>
+          <w:i/>
+        </w:rPr>
+        <w:t>dpq</w:t>
+      </w:r>
+      <m:oMath>
+        <m:r>
+          <w:rPr>
+            <w:rFonts w:ascii="Cambria Math" w:eastAsiaTheme="minorEastAsia" w:hAnsi="Cambria Math"/>
+          </w:rPr>
+          <m:t>[2*p+</m:t>
+        </m:r>
+        <m:r>
+          <w:rPr>
+            <w:rFonts w:ascii="Cambria Math" w:eastAsiaTheme="minorEastAsia" w:hAnsi="Cambria Math"/>
+          </w:rPr>
+          <m:t>1</m:t>
+        </m:r>
+        <m:r>
+          <w:rPr>
+            <w:rFonts w:ascii="Cambria Math" w:eastAsiaTheme="minorEastAsia" w:hAnsi="Cambria Math"/>
+          </w:rPr>
+          <m:t>]</m:t>
+        </m:r>
+      </m:oMath>
+      <w:r>
+        <w:rPr>
+          <w:rFonts w:eastAsiaTheme="minorEastAsia"/>
+        </w:rPr>
+        <w:t>,</w:t>
+      </w:r>
+      <w:r>
+        <w:rPr>
+          <w:rFonts w:eastAsiaTheme="minorEastAsia"/>
+        </w:rPr>
+        <w:t xml:space="preserve"> é o maior elemento da subárvore esquerda e o filho direito da raiz </w:t>
+      </w:r>
+      <w:r>
+        <w:rPr>
+          <w:rFonts w:eastAsiaTheme="minorEastAsia"/>
+          <w:i/>
+        </w:rPr>
+        <w:t>dpq</w:t>
+      </w:r>
+      <m:oMath>
+        <m:r>
+          <w:rPr>
+            <w:rFonts w:ascii="Cambria Math" w:eastAsiaTheme="minorEastAsia" w:hAnsi="Cambria Math"/>
+          </w:rPr>
+          <m:t>[2*p+2]</m:t>
+        </m:r>
+        <m:r>
+          <w:rPr>
+            <w:rFonts w:ascii="Cambria Math" w:eastAsiaTheme="minorEastAsia" w:hAnsi="Cambria Math"/>
+          </w:rPr>
+          <m:t xml:space="preserve"> </m:t>
+        </m:r>
+      </m:oMath>
+      <w:r>
+        <w:rPr>
+          <w:rFonts w:eastAsiaTheme="minorEastAsia"/>
+        </w:rPr>
+        <w:t xml:space="preserve">, é o maior elemento da subárvore direita. Quando a raiz </w:t>
+      </w:r>
+      <w:r>
+        <w:rPr>
+          <w:rFonts w:eastAsiaTheme="minorEastAsia"/>
+          <w:i/>
+        </w:rPr>
+        <w:t>dpq</w:t>
+      </w:r>
+      <m:oMath>
+        <m:r>
+          <w:rPr>
+            <w:rFonts w:ascii="Cambria Math" w:eastAsiaTheme="minorEastAsia" w:hAnsi="Cambria Math"/>
+          </w:rPr>
+          <m:t>[p]</m:t>
+        </m:r>
+      </m:oMath>
+      <w:r>
+        <w:rPr>
+          <w:rFonts w:eastAsiaTheme="minorEastAsia"/>
+        </w:rPr>
+        <w:t xml:space="preserve"> é eliminada, conseqüentemente o maior de seus dois filhos precisa-se deslocar-se para cima afim de ocupar seu lugar como o novo maior elemento de </w:t>
+      </w:r>
+      <w:r>
+        <w:rPr>
+          <w:rFonts w:eastAsiaTheme="minorEastAsia"/>
+          <w:i/>
+        </w:rPr>
+        <w:t>subtree</w:t>
+      </w:r>
+      <m:oMath>
+        <m:d>
+          <m:dPr>
+            <m:ctrlPr>
+              <w:rPr>
+                <w:rFonts w:ascii="Cambria Math" w:eastAsiaTheme="minorEastAsia" w:hAnsi="Cambria Math"/>
+                <w:i/>
+              </w:rPr>
+            </m:ctrlPr>
+          </m:dPr>
+          <m:e>
+            <m:r>
+              <w:rPr>
+                <w:rFonts w:ascii="Cambria Math" w:eastAsiaTheme="minorEastAsia" w:hAnsi="Cambria Math"/>
+              </w:rPr>
+              <m:t>p,k</m:t>
+            </m:r>
+          </m:e>
+        </m:d>
+      </m:oMath>
+      <w:r>
+        <w:rPr>
+          <w:rFonts w:eastAsiaTheme="minorEastAsia"/>
+          <w:i/>
+        </w:rPr>
+        <w:t>.</w:t>
+      </w:r>
+      <w:r>
+        <w:rPr>
+          <w:rFonts w:eastAsiaTheme="minorEastAsia"/>
+        </w:rPr>
+        <w:t xml:space="preserve"> Tal que a subárvore enraizada na posição do maior elemento deslocado para cima, deverá ser reajustada sucessivamente.</w:t>
+      </w:r>
+    </w:p>
+    <w:p>
+      <w:pPr>
+        <w:pStyle w:val="Ttulo3"/>
+        <w:rPr>
+          <w:rFonts w:ascii="Times" w:hAnsi="Times" w:cs="Times"/>
+          <w:sz w:val="24"/>
+          <w:szCs w:val="24"/>
+        </w:rPr>
+      </w:pPr>
+      <w:r>
+        <w:rPr>
+          <w:rFonts w:ascii="Times" w:hAnsi="Times" w:cs="Times"/>
+          <w:sz w:val="24"/>
+          <w:szCs w:val="24"/>
+        </w:rPr>
+        <w:t>LARGESON</w:t>
       </w:r>
       <w:bookmarkEnd w:id="15"/>
     </w:p>
@@ -7626,7 +8499,7 @@
           <w:sz w:val="24"/>
           <w:szCs w:val="24"/>
         </w:rPr>
-        <w:t>adjustheap</w:t>
+        <w:t>largeson</w:t>
       </w:r>
       <w:r>
         <w:rPr>
@@ -7688,16 +8561,7 @@
           <w:sz w:val="24"/>
           <w:szCs w:val="24"/>
         </w:rPr>
-        <w:t xml:space="preserve"> precisam ser redistribuídos </w:t>
-      </w:r>
-      <w:r>
-        <w:rPr>
-          <w:rFonts w:ascii="Times" w:eastAsiaTheme="minorEastAsia" w:hAnsi="Times" w:cs="Times"/>
-          <w:sz w:val="24"/>
-          <w:szCs w:val="24"/>
-        </w:rPr>
-        <w:lastRenderedPageBreak/>
-        <w:t xml:space="preserve">nas posições 0 até </w:t>
+        <w:t xml:space="preserve"> precisam ser redistribuídos nas posições 0 até </w:t>
       </w:r>
       <m:oMath>
         <m:r>
@@ -7777,23 +8641,14 @@
     </w:p>
     <w:p>
       <w:pPr>
-        <w:pStyle w:val="Ttulo3"/>
-        <w:rPr>
-          <w:rFonts w:ascii="Times" w:hAnsi="Times" w:cs="Times"/>
-          <w:sz w:val="24"/>
-          <w:szCs w:val="24"/>
-        </w:rPr>
-      </w:pPr>
-      <w:bookmarkStart w:id="16" w:name="_Toc200142127"/>
-      <w:r>
-        <w:rPr>
-          <w:rFonts w:ascii="Times" w:hAnsi="Times" w:cs="Times"/>
-          <w:sz w:val="24"/>
-          <w:szCs w:val="24"/>
-        </w:rPr>
-        <w:t>LARGESON</w:t>
-      </w:r>
-      <w:bookmarkEnd w:id="16"/>
+        <w:pStyle w:val="Titulo3Relatorio"/>
+      </w:pPr>
+      <w:bookmarkStart w:id="16" w:name="_Toc200142128"/>
+      <w:bookmarkStart w:id="17" w:name="_Toc200142126"/>
+      <w:r>
+        <w:t>ADJUSTHEAP</w:t>
+      </w:r>
+      <w:bookmarkEnd w:id="17"/>
     </w:p>
     <w:p>
       <w:pPr>
@@ -7820,7 +8675,7 @@
           <w:sz w:val="24"/>
           <w:szCs w:val="24"/>
         </w:rPr>
-        <w:t>largeson</w:t>
+        <w:t>adjustheap</w:t>
       </w:r>
       <w:r>
         <w:rPr>
@@ -7969,7 +8824,6 @@
           <w:szCs w:val="24"/>
         </w:rPr>
       </w:pPr>
-      <w:bookmarkStart w:id="17" w:name="_Toc200142128"/>
       <w:r>
         <w:rPr>
           <w:rFonts w:ascii="Times" w:hAnsi="Times" w:cs="Times"/>
@@ -7978,7 +8832,7 @@
         </w:rPr>
         <w:t>HEAPSORT</w:t>
       </w:r>
-      <w:bookmarkEnd w:id="17"/>
+      <w:bookmarkEnd w:id="16"/>
     </w:p>
     <w:p>
       <w:pPr>
@@ -8179,7 +9033,6 @@
           <w:szCs w:val="24"/>
           <w:lang w:eastAsia="pt-BR"/>
         </w:rPr>
-        <w:lastRenderedPageBreak/>
         <w:drawing>
           <wp:inline distT="0" distB="0" distL="0" distR="0">
             <wp:extent cx="5731510" cy="3074670"/>
@@ -8254,6 +9107,7 @@
         <w:rPr>
           <w:rFonts w:eastAsiaTheme="minorEastAsia"/>
         </w:rPr>
+        <w:lastRenderedPageBreak/>
         <w:t>RAM</w:t>
       </w:r>
       <w:bookmarkEnd w:id="22"/>
@@ -8432,7 +9286,6 @@
           <w:sz w:val="24"/>
           <w:szCs w:val="24"/>
         </w:rPr>
-        <w:lastRenderedPageBreak/>
         <w:t>Avaliar o desempenho do algoritmo em comparação com a implementação do Quicksort disponível na linguagem C.</w:t>
       </w:r>
       <w:bookmarkEnd w:id="25"/>
@@ -8444,6 +9297,7 @@
           <w:noProof/>
           <w:lang w:eastAsia="pt-BR"/>
         </w:rPr>
+        <w:lastRenderedPageBreak/>
         <w:drawing>
           <wp:inline distT="0" distB="0" distL="0" distR="0">
             <wp:extent cx="4458087" cy="3795089"/>
@@ -10526,8 +11380,9 @@
     <w:panose1 w:val="020B0604030504040204"/>
     <w:charset w:val="00"/>
     <w:family w:val="swiss"/>
+    <w:notTrueType/>
     <w:pitch w:val="variable"/>
-    <w:sig w:usb0="E1002EFF" w:usb1="C000605B" w:usb2="00000029" w:usb3="00000000" w:csb0="000101FF" w:csb1="00000000"/>
+    <w:sig w:usb0="00000003" w:usb1="00000000" w:usb2="00000000" w:usb3="00000000" w:csb0="00000001" w:csb1="00000000"/>
   </w:font>
   <w:font w:name="Cambria Math">
     <w:panose1 w:val="02040503050406030204"/>
@@ -10551,6 +11406,7 @@
   <w:rsids>
     <w:rsidRoot w:val="00DE5764"/>
     <w:rsid w:val="00DE5764"/>
+    <w:rsid w:val="00EC412D"/>
   </w:rsids>
   <m:mathPr>
     <m:mathFont m:val="Cambria Math"/>
@@ -10731,6 +11587,7 @@
   <w:style w:type="paragraph" w:default="1" w:styleId="Normal">
     <w:name w:val="Normal"/>
     <w:qFormat/>
+    <w:rsid w:val="00EC412D"/>
   </w:style>
   <w:style w:type="character" w:default="1" w:styleId="Fontepargpadro">
     <w:name w:val="Default Paragraph Font"/>
@@ -10765,7 +11622,7 @@
     <w:basedOn w:val="Fontepargpadro"/>
     <w:uiPriority w:val="99"/>
     <w:semiHidden/>
-    <w:rsid w:val="00DE5764"/>
+    <w:rsid w:val="00EC412D"/>
     <w:rPr>
       <w:color w:val="808080"/>
     </w:rPr>

</xml_diff>

<commit_message>
Adicionando detalhes de funcionamento codigo Programmiz
</commit_message>
<xml_diff>
--- a/Relatorio_Equipe_HeapSort.docx
+++ b/Relatorio_Equipe_HeapSort.docx
@@ -333,7 +333,7 @@
             </w:rPr>
             <w:fldChar w:fldCharType="separate"/>
           </w:r>
-          <w:hyperlink w:anchor="_Toc200142111" w:history="1">
+          <w:hyperlink w:anchor="_Toc200230206" w:history="1">
             <w:r>
               <w:rPr>
                 <w:rStyle w:val="Hyperlink"/>
@@ -377,7 +377,7 @@
                 <w:noProof/>
                 <w:webHidden/>
               </w:rPr>
-              <w:instrText xml:space="preserve"> PAGEREF _Toc200142111 \h </w:instrText>
+              <w:instrText xml:space="preserve"> PAGEREF _Toc200230206 \h </w:instrText>
             </w:r>
             <w:r>
               <w:rPr>
@@ -420,7 +420,7 @@
               <w:lang w:eastAsia="pt-BR"/>
             </w:rPr>
           </w:pPr>
-          <w:hyperlink w:anchor="_Toc200142112" w:history="1">
+          <w:hyperlink w:anchor="_Toc200230207" w:history="1">
             <w:r>
               <w:rPr>
                 <w:rStyle w:val="Hyperlink"/>
@@ -448,7 +448,7 @@
                 <w:noProof/>
                 <w:webHidden/>
               </w:rPr>
-              <w:instrText xml:space="preserve"> PAGEREF _Toc200142112 \h </w:instrText>
+              <w:instrText xml:space="preserve"> PAGEREF _Toc200230207 \h </w:instrText>
             </w:r>
             <w:r>
               <w:rPr>
@@ -491,7 +491,7 @@
               <w:lang w:eastAsia="pt-BR"/>
             </w:rPr>
           </w:pPr>
-          <w:hyperlink w:anchor="_Toc200142113" w:history="1">
+          <w:hyperlink w:anchor="_Toc200230208" w:history="1">
             <w:r>
               <w:rPr>
                 <w:rStyle w:val="Hyperlink"/>
@@ -519,7 +519,7 @@
                 <w:noProof/>
                 <w:webHidden/>
               </w:rPr>
-              <w:instrText xml:space="preserve"> PAGEREF _Toc200142113 \h </w:instrText>
+              <w:instrText xml:space="preserve"> PAGEREF _Toc200230208 \h </w:instrText>
             </w:r>
             <w:r>
               <w:rPr>
@@ -562,7 +562,7 @@
               <w:lang w:eastAsia="pt-BR"/>
             </w:rPr>
           </w:pPr>
-          <w:hyperlink w:anchor="_Toc200142114" w:history="1">
+          <w:hyperlink w:anchor="_Toc200230209" w:history="1">
             <w:r>
               <w:rPr>
                 <w:rStyle w:val="Hyperlink"/>
@@ -590,7 +590,7 @@
                 <w:noProof/>
                 <w:webHidden/>
               </w:rPr>
-              <w:instrText xml:space="preserve"> PAGEREF _Toc200142114 \h </w:instrText>
+              <w:instrText xml:space="preserve"> PAGEREF _Toc200230209 \h </w:instrText>
             </w:r>
             <w:r>
               <w:rPr>
@@ -634,7 +634,7 @@
               <w:lang w:eastAsia="pt-BR"/>
             </w:rPr>
           </w:pPr>
-          <w:hyperlink w:anchor="_Toc200142115" w:history="1">
+          <w:hyperlink w:anchor="_Toc200230210" w:history="1">
             <w:r>
               <w:rPr>
                 <w:rStyle w:val="Hyperlink"/>
@@ -678,7 +678,7 @@
                 <w:noProof/>
                 <w:webHidden/>
               </w:rPr>
-              <w:instrText xml:space="preserve"> PAGEREF _Toc200142115 \h </w:instrText>
+              <w:instrText xml:space="preserve"> PAGEREF _Toc200230210 \h </w:instrText>
             </w:r>
             <w:r>
               <w:rPr>
@@ -721,7 +721,7 @@
               <w:lang w:eastAsia="pt-BR"/>
             </w:rPr>
           </w:pPr>
-          <w:hyperlink w:anchor="_Toc200142116" w:history="1">
+          <w:hyperlink w:anchor="_Toc200230211" w:history="1">
             <w:r>
               <w:rPr>
                 <w:rStyle w:val="Hyperlink"/>
@@ -749,7 +749,7 @@
                 <w:noProof/>
                 <w:webHidden/>
               </w:rPr>
-              <w:instrText xml:space="preserve"> PAGEREF _Toc200142116 \h </w:instrText>
+              <w:instrText xml:space="preserve"> PAGEREF _Toc200230211 \h </w:instrText>
             </w:r>
             <w:r>
               <w:rPr>
@@ -792,7 +792,7 @@
               <w:lang w:eastAsia="pt-BR"/>
             </w:rPr>
           </w:pPr>
-          <w:hyperlink w:anchor="_Toc200142117" w:history="1">
+          <w:hyperlink w:anchor="_Toc200230212" w:history="1">
             <w:r>
               <w:rPr>
                 <w:rStyle w:val="Hyperlink"/>
@@ -820,7 +820,7 @@
                 <w:noProof/>
                 <w:webHidden/>
               </w:rPr>
-              <w:instrText xml:space="preserve"> PAGEREF _Toc200142117 \h </w:instrText>
+              <w:instrText xml:space="preserve"> PAGEREF _Toc200230212 \h </w:instrText>
             </w:r>
             <w:r>
               <w:rPr>
@@ -863,7 +863,7 @@
               <w:lang w:eastAsia="pt-BR"/>
             </w:rPr>
           </w:pPr>
-          <w:hyperlink w:anchor="_Toc200142118" w:history="1">
+          <w:hyperlink w:anchor="_Toc200230213" w:history="1">
             <w:r>
               <w:rPr>
                 <w:rStyle w:val="Hyperlink"/>
@@ -891,7 +891,7 @@
                 <w:noProof/>
                 <w:webHidden/>
               </w:rPr>
-              <w:instrText xml:space="preserve"> PAGEREF _Toc200142118 \h </w:instrText>
+              <w:instrText xml:space="preserve"> PAGEREF _Toc200230213 \h </w:instrText>
             </w:r>
             <w:r>
               <w:rPr>
@@ -934,7 +934,7 @@
               <w:lang w:eastAsia="pt-BR"/>
             </w:rPr>
           </w:pPr>
-          <w:hyperlink w:anchor="_Toc200142119" w:history="1">
+          <w:hyperlink w:anchor="_Toc200230214" w:history="1">
             <w:r>
               <w:rPr>
                 <w:rStyle w:val="Hyperlink"/>
@@ -962,7 +962,7 @@
                 <w:noProof/>
                 <w:webHidden/>
               </w:rPr>
-              <w:instrText xml:space="preserve"> PAGEREF _Toc200142119 \h </w:instrText>
+              <w:instrText xml:space="preserve"> PAGEREF _Toc200230214 \h </w:instrText>
             </w:r>
             <w:r>
               <w:rPr>
@@ -1005,7 +1005,7 @@
               <w:lang w:eastAsia="pt-BR"/>
             </w:rPr>
           </w:pPr>
-          <w:hyperlink w:anchor="_Toc200142120" w:history="1">
+          <w:hyperlink w:anchor="_Toc200230215" w:history="1">
             <w:r>
               <w:rPr>
                 <w:rStyle w:val="Hyperlink"/>
@@ -1033,7 +1033,7 @@
                 <w:noProof/>
                 <w:webHidden/>
               </w:rPr>
-              <w:instrText xml:space="preserve"> PAGEREF _Toc200142120 \h </w:instrText>
+              <w:instrText xml:space="preserve"> PAGEREF _Toc200230215 \h </w:instrText>
             </w:r>
             <w:r>
               <w:rPr>
@@ -1076,7 +1076,7 @@
               <w:lang w:eastAsia="pt-BR"/>
             </w:rPr>
           </w:pPr>
-          <w:hyperlink w:anchor="_Toc200142121" w:history="1">
+          <w:hyperlink w:anchor="_Toc200230216" w:history="1">
             <w:r>
               <w:rPr>
                 <w:rStyle w:val="Hyperlink"/>
@@ -1104,7 +1104,7 @@
                 <w:noProof/>
                 <w:webHidden/>
               </w:rPr>
-              <w:instrText xml:space="preserve"> PAGEREF _Toc200142121 \h </w:instrText>
+              <w:instrText xml:space="preserve"> PAGEREF _Toc200230216 \h </w:instrText>
             </w:r>
             <w:r>
               <w:rPr>
@@ -1148,7 +1148,7 @@
               <w:lang w:eastAsia="pt-BR"/>
             </w:rPr>
           </w:pPr>
-          <w:hyperlink w:anchor="_Toc200142122" w:history="1">
+          <w:hyperlink w:anchor="_Toc200230217" w:history="1">
             <w:r>
               <w:rPr>
                 <w:rStyle w:val="Hyperlink"/>
@@ -1192,7 +1192,7 @@
                 <w:noProof/>
                 <w:webHidden/>
               </w:rPr>
-              <w:instrText xml:space="preserve"> PAGEREF _Toc200142122 \h </w:instrText>
+              <w:instrText xml:space="preserve"> PAGEREF _Toc200230217 \h </w:instrText>
             </w:r>
             <w:r>
               <w:rPr>
@@ -1235,7 +1235,7 @@
               <w:lang w:eastAsia="pt-BR"/>
             </w:rPr>
           </w:pPr>
-          <w:hyperlink w:anchor="_Toc200142123" w:history="1">
+          <w:hyperlink w:anchor="_Toc200230218" w:history="1">
             <w:r>
               <w:rPr>
                 <w:rStyle w:val="Hyperlink"/>
@@ -1263,7 +1263,7 @@
                 <w:noProof/>
                 <w:webHidden/>
               </w:rPr>
-              <w:instrText xml:space="preserve"> PAGEREF _Toc200142123 \h </w:instrText>
+              <w:instrText xml:space="preserve"> PAGEREF _Toc200230218 \h </w:instrText>
             </w:r>
             <w:r>
               <w:rPr>
@@ -1306,14 +1306,13 @@
               <w:lang w:eastAsia="pt-BR"/>
             </w:rPr>
           </w:pPr>
-          <w:hyperlink w:anchor="_Toc200142124" w:history="1">
+          <w:hyperlink w:anchor="_Toc200230219" w:history="1">
             <w:r>
               <w:rPr>
                 <w:rStyle w:val="Hyperlink"/>
-                <w:rFonts w:ascii="Times" w:hAnsi="Times" w:cs="Times"/>
-                <w:noProof/>
-              </w:rPr>
-              <w:t>PQINSERT</w:t>
+                <w:noProof/>
+              </w:rPr>
+              <w:t>Algoritmo da obra Estrutura de Dados Usando C</w:t>
             </w:r>
             <w:r>
               <w:rPr>
@@ -1334,7 +1333,7 @@
                 <w:noProof/>
                 <w:webHidden/>
               </w:rPr>
-              <w:instrText xml:space="preserve"> PAGEREF _Toc200142124 \h </w:instrText>
+              <w:instrText xml:space="preserve"> PAGEREF _Toc200230219 \h </w:instrText>
             </w:r>
             <w:r>
               <w:rPr>
@@ -1377,14 +1376,154 @@
               <w:lang w:eastAsia="pt-BR"/>
             </w:rPr>
           </w:pPr>
-          <w:hyperlink w:anchor="_Toc200142125" w:history="1">
+          <w:hyperlink w:anchor="_Toc200230220" w:history="1">
+            <w:r>
+              <w:rPr>
+                <w:rStyle w:val="Hyperlink"/>
+                <w:noProof/>
+              </w:rPr>
+              <w:t>Algoritmo do site Programmiz</w:t>
+            </w:r>
+            <w:r>
+              <w:rPr>
+                <w:noProof/>
+                <w:webHidden/>
+              </w:rPr>
+              <w:tab/>
+            </w:r>
+            <w:r>
+              <w:rPr>
+                <w:noProof/>
+                <w:webHidden/>
+              </w:rPr>
+              <w:fldChar w:fldCharType="begin"/>
+            </w:r>
+            <w:r>
+              <w:rPr>
+                <w:noProof/>
+                <w:webHidden/>
+              </w:rPr>
+              <w:instrText xml:space="preserve"> PAGEREF _Toc200230220 \h </w:instrText>
+            </w:r>
+            <w:r>
+              <w:rPr>
+                <w:noProof/>
+                <w:webHidden/>
+              </w:rPr>
+            </w:r>
+            <w:r>
+              <w:rPr>
+                <w:noProof/>
+                <w:webHidden/>
+              </w:rPr>
+              <w:fldChar w:fldCharType="separate"/>
+            </w:r>
+            <w:r>
+              <w:rPr>
+                <w:noProof/>
+                <w:webHidden/>
+              </w:rPr>
+              <w:t>7</w:t>
+            </w:r>
+            <w:r>
+              <w:rPr>
+                <w:noProof/>
+                <w:webHidden/>
+              </w:rPr>
+              <w:fldChar w:fldCharType="end"/>
+            </w:r>
+          </w:hyperlink>
+        </w:p>
+        <w:p>
+          <w:pPr>
+            <w:pStyle w:val="Sumrio2"/>
+            <w:tabs>
+              <w:tab w:val="right" w:leader="dot" w:pos="9016"/>
+            </w:tabs>
+            <w:rPr>
+              <w:rFonts w:eastAsiaTheme="minorEastAsia"/>
+              <w:noProof/>
+              <w:lang w:eastAsia="pt-BR"/>
+            </w:rPr>
+          </w:pPr>
+          <w:hyperlink w:anchor="_Toc200230221" w:history="1">
+            <w:r>
+              <w:rPr>
+                <w:rStyle w:val="Hyperlink"/>
+                <w:noProof/>
+              </w:rPr>
+              <w:t>Tabelas e/ou gráficos deverão ser utilizados para apresentação dos resultados dos testes.</w:t>
+            </w:r>
+            <w:r>
+              <w:rPr>
+                <w:noProof/>
+                <w:webHidden/>
+              </w:rPr>
+              <w:tab/>
+            </w:r>
+            <w:r>
+              <w:rPr>
+                <w:noProof/>
+                <w:webHidden/>
+              </w:rPr>
+              <w:fldChar w:fldCharType="begin"/>
+            </w:r>
+            <w:r>
+              <w:rPr>
+                <w:noProof/>
+                <w:webHidden/>
+              </w:rPr>
+              <w:instrText xml:space="preserve"> PAGEREF _Toc200230221 \h </w:instrText>
+            </w:r>
+            <w:r>
+              <w:rPr>
+                <w:noProof/>
+                <w:webHidden/>
+              </w:rPr>
+            </w:r>
+            <w:r>
+              <w:rPr>
+                <w:noProof/>
+                <w:webHidden/>
+              </w:rPr>
+              <w:fldChar w:fldCharType="separate"/>
+            </w:r>
+            <w:r>
+              <w:rPr>
+                <w:noProof/>
+                <w:webHidden/>
+              </w:rPr>
+              <w:t>10</w:t>
+            </w:r>
+            <w:r>
+              <w:rPr>
+                <w:noProof/>
+                <w:webHidden/>
+              </w:rPr>
+              <w:fldChar w:fldCharType="end"/>
+            </w:r>
+          </w:hyperlink>
+        </w:p>
+        <w:p>
+          <w:pPr>
+            <w:pStyle w:val="Sumrio2"/>
+            <w:tabs>
+              <w:tab w:val="right" w:leader="dot" w:pos="9016"/>
+            </w:tabs>
+            <w:rPr>
+              <w:rFonts w:eastAsiaTheme="minorEastAsia"/>
+              <w:noProof/>
+              <w:lang w:eastAsia="pt-BR"/>
+            </w:rPr>
+          </w:pPr>
+          <w:hyperlink w:anchor="_Toc200230222" w:history="1">
             <w:r>
               <w:rPr>
                 <w:rStyle w:val="Hyperlink"/>
                 <w:rFonts w:ascii="Times" w:hAnsi="Times" w:cs="Times"/>
                 <w:noProof/>
               </w:rPr>
-              <w:t>PQMAXDELETE</w:t>
+              <w:t>Incluir detalhes da configuração do computador usado para testes: sistema Operacional, quantidade de RAM, velocidade da CPU (Hz).</w:t>
             </w:r>
             <w:r>
               <w:rPr>
@@ -1405,7 +1544,7 @@
                 <w:noProof/>
                 <w:webHidden/>
               </w:rPr>
-              <w:instrText xml:space="preserve"> PAGEREF _Toc200142125 \h </w:instrText>
+              <w:instrText xml:space="preserve"> PAGEREF _Toc200230222 \h </w:instrText>
             </w:r>
             <w:r>
               <w:rPr>
@@ -1425,7 +1564,7 @@
                 <w:noProof/>
                 <w:webHidden/>
               </w:rPr>
-              <w:t>6</w:t>
+              <w:t>10</w:t>
             </w:r>
             <w:r>
               <w:rPr>
@@ -1448,13 +1587,13 @@
               <w:lang w:eastAsia="pt-BR"/>
             </w:rPr>
           </w:pPr>
-          <w:hyperlink w:anchor="_Toc200142126" w:history="1">
+          <w:hyperlink w:anchor="_Toc200230223" w:history="1">
             <w:r>
               <w:rPr>
                 <w:rStyle w:val="Hyperlink"/>
                 <w:noProof/>
               </w:rPr>
-              <w:t>ADJUSTHEAP</w:t>
+              <w:t>Sistema Operacional</w:t>
             </w:r>
             <w:r>
               <w:rPr>
@@ -1475,7 +1614,7 @@
                 <w:noProof/>
                 <w:webHidden/>
               </w:rPr>
-              <w:instrText xml:space="preserve"> PAGEREF _Toc200142126 \h </w:instrText>
+              <w:instrText xml:space="preserve"> PAGEREF _Toc200230223 \h </w:instrText>
             </w:r>
             <w:r>
               <w:rPr>
@@ -1495,7 +1634,7 @@
                 <w:noProof/>
                 <w:webHidden/>
               </w:rPr>
-              <w:t>6</w:t>
+              <w:t>10</w:t>
             </w:r>
             <w:r>
               <w:rPr>
@@ -1518,14 +1657,13 @@
               <w:lang w:eastAsia="pt-BR"/>
             </w:rPr>
           </w:pPr>
-          <w:hyperlink w:anchor="_Toc200142127" w:history="1">
+          <w:hyperlink w:anchor="_Toc200230224" w:history="1">
             <w:r>
               <w:rPr>
                 <w:rStyle w:val="Hyperlink"/>
-                <w:rFonts w:ascii="Times" w:hAnsi="Times" w:cs="Times"/>
-                <w:noProof/>
-              </w:rPr>
-              <w:t>LARGESON</w:t>
+                <w:noProof/>
+              </w:rPr>
+              <w:t>RAM</w:t>
             </w:r>
             <w:r>
               <w:rPr>
@@ -1546,7 +1684,7 @@
                 <w:noProof/>
                 <w:webHidden/>
               </w:rPr>
-              <w:instrText xml:space="preserve"> PAGEREF _Toc200142127 \h </w:instrText>
+              <w:instrText xml:space="preserve"> PAGEREF _Toc200230224 \h </w:instrText>
             </w:r>
             <w:r>
               <w:rPr>
@@ -1566,430 +1704,7 @@
                 <w:noProof/>
                 <w:webHidden/>
               </w:rPr>
-              <w:t>7</w:t>
-            </w:r>
-            <w:r>
-              <w:rPr>
-                <w:noProof/>
-                <w:webHidden/>
-              </w:rPr>
-              <w:fldChar w:fldCharType="end"/>
-            </w:r>
-          </w:hyperlink>
-        </w:p>
-        <w:p>
-          <w:pPr>
-            <w:pStyle w:val="Sumrio3"/>
-            <w:tabs>
-              <w:tab w:val="right" w:leader="dot" w:pos="9016"/>
-            </w:tabs>
-            <w:rPr>
-              <w:rFonts w:eastAsiaTheme="minorEastAsia"/>
-              <w:noProof/>
-              <w:lang w:eastAsia="pt-BR"/>
-            </w:rPr>
-          </w:pPr>
-          <w:hyperlink w:anchor="_Toc200142128" w:history="1">
-            <w:r>
-              <w:rPr>
-                <w:rStyle w:val="Hyperlink"/>
-                <w:rFonts w:ascii="Times" w:hAnsi="Times" w:cs="Times"/>
-                <w:noProof/>
-              </w:rPr>
-              <w:t>HEAPSORT</w:t>
-            </w:r>
-            <w:r>
-              <w:rPr>
-                <w:noProof/>
-                <w:webHidden/>
-              </w:rPr>
-              <w:tab/>
-            </w:r>
-            <w:r>
-              <w:rPr>
-                <w:noProof/>
-                <w:webHidden/>
-              </w:rPr>
-              <w:fldChar w:fldCharType="begin"/>
-            </w:r>
-            <w:r>
-              <w:rPr>
-                <w:noProof/>
-                <w:webHidden/>
-              </w:rPr>
-              <w:instrText xml:space="preserve"> PAGEREF _Toc200142128 \h </w:instrText>
-            </w:r>
-            <w:r>
-              <w:rPr>
-                <w:noProof/>
-                <w:webHidden/>
-              </w:rPr>
-            </w:r>
-            <w:r>
-              <w:rPr>
-                <w:noProof/>
-                <w:webHidden/>
-              </w:rPr>
-              <w:fldChar w:fldCharType="separate"/>
-            </w:r>
-            <w:r>
-              <w:rPr>
-                <w:noProof/>
-                <w:webHidden/>
-              </w:rPr>
-              <w:t>7</w:t>
-            </w:r>
-            <w:r>
-              <w:rPr>
-                <w:noProof/>
-                <w:webHidden/>
-              </w:rPr>
-              <w:fldChar w:fldCharType="end"/>
-            </w:r>
-          </w:hyperlink>
-        </w:p>
-        <w:p>
-          <w:pPr>
-            <w:pStyle w:val="Sumrio3"/>
-            <w:tabs>
-              <w:tab w:val="right" w:leader="dot" w:pos="9016"/>
-            </w:tabs>
-            <w:rPr>
-              <w:rFonts w:eastAsiaTheme="minorEastAsia"/>
-              <w:noProof/>
-              <w:lang w:eastAsia="pt-BR"/>
-            </w:rPr>
-          </w:pPr>
-          <w:hyperlink w:anchor="_Toc200142129" w:history="1">
-            <w:r>
-              <w:rPr>
-                <w:rStyle w:val="Hyperlink"/>
-                <w:rFonts w:ascii="Times" w:hAnsi="Times" w:cs="Times"/>
-                <w:noProof/>
-              </w:rPr>
-              <w:t>PRINTARRAY</w:t>
-            </w:r>
-            <w:r>
-              <w:rPr>
-                <w:noProof/>
-                <w:webHidden/>
-              </w:rPr>
-              <w:tab/>
-            </w:r>
-            <w:r>
-              <w:rPr>
-                <w:noProof/>
-                <w:webHidden/>
-              </w:rPr>
-              <w:fldChar w:fldCharType="begin"/>
-            </w:r>
-            <w:r>
-              <w:rPr>
-                <w:noProof/>
-                <w:webHidden/>
-              </w:rPr>
-              <w:instrText xml:space="preserve"> PAGEREF _Toc200142129 \h </w:instrText>
-            </w:r>
-            <w:r>
-              <w:rPr>
-                <w:noProof/>
-                <w:webHidden/>
-              </w:rPr>
-            </w:r>
-            <w:r>
-              <w:rPr>
-                <w:noProof/>
-                <w:webHidden/>
-              </w:rPr>
-              <w:fldChar w:fldCharType="separate"/>
-            </w:r>
-            <w:r>
-              <w:rPr>
-                <w:noProof/>
-                <w:webHidden/>
-              </w:rPr>
-              <w:t>7</w:t>
-            </w:r>
-            <w:r>
-              <w:rPr>
-                <w:noProof/>
-                <w:webHidden/>
-              </w:rPr>
-              <w:fldChar w:fldCharType="end"/>
-            </w:r>
-          </w:hyperlink>
-        </w:p>
-        <w:p>
-          <w:pPr>
-            <w:pStyle w:val="Sumrio2"/>
-            <w:tabs>
-              <w:tab w:val="right" w:leader="dot" w:pos="9016"/>
-            </w:tabs>
-            <w:rPr>
-              <w:rFonts w:eastAsiaTheme="minorEastAsia"/>
-              <w:noProof/>
-              <w:lang w:eastAsia="pt-BR"/>
-            </w:rPr>
-          </w:pPr>
-          <w:hyperlink w:anchor="_Toc200142130" w:history="1">
-            <w:r>
-              <w:rPr>
-                <w:rStyle w:val="Hyperlink"/>
-                <w:noProof/>
-              </w:rPr>
-              <w:t>Tabelas e/ou gráficos deverão ser utilizados para apresentação dos resultados dos testes.</w:t>
-            </w:r>
-            <w:r>
-              <w:rPr>
-                <w:noProof/>
-                <w:webHidden/>
-              </w:rPr>
-              <w:tab/>
-            </w:r>
-            <w:r>
-              <w:rPr>
-                <w:noProof/>
-                <w:webHidden/>
-              </w:rPr>
-              <w:fldChar w:fldCharType="begin"/>
-            </w:r>
-            <w:r>
-              <w:rPr>
-                <w:noProof/>
-                <w:webHidden/>
-              </w:rPr>
-              <w:instrText xml:space="preserve"> PAGEREF _Toc200142130 \h </w:instrText>
-            </w:r>
-            <w:r>
-              <w:rPr>
-                <w:noProof/>
-                <w:webHidden/>
-              </w:rPr>
-            </w:r>
-            <w:r>
-              <w:rPr>
-                <w:noProof/>
-                <w:webHidden/>
-              </w:rPr>
-              <w:fldChar w:fldCharType="separate"/>
-            </w:r>
-            <w:r>
-              <w:rPr>
-                <w:noProof/>
-                <w:webHidden/>
-              </w:rPr>
-              <w:t>7</w:t>
-            </w:r>
-            <w:r>
-              <w:rPr>
-                <w:noProof/>
-                <w:webHidden/>
-              </w:rPr>
-              <w:fldChar w:fldCharType="end"/>
-            </w:r>
-          </w:hyperlink>
-        </w:p>
-        <w:p>
-          <w:pPr>
-            <w:pStyle w:val="Sumrio2"/>
-            <w:tabs>
-              <w:tab w:val="right" w:leader="dot" w:pos="9016"/>
-            </w:tabs>
-            <w:rPr>
-              <w:rFonts w:eastAsiaTheme="minorEastAsia"/>
-              <w:noProof/>
-              <w:lang w:eastAsia="pt-BR"/>
-            </w:rPr>
-          </w:pPr>
-          <w:hyperlink w:anchor="_Toc200142131" w:history="1">
-            <w:r>
-              <w:rPr>
-                <w:rStyle w:val="Hyperlink"/>
-                <w:rFonts w:ascii="Times" w:hAnsi="Times" w:cs="Times"/>
-                <w:noProof/>
-              </w:rPr>
-              <w:t>Incluir detalhes da configuração do computador usado para testes: sistema Operacional, quantidade de RAM, velocidade da CPU (Hz).</w:t>
-            </w:r>
-            <w:r>
-              <w:rPr>
-                <w:noProof/>
-                <w:webHidden/>
-              </w:rPr>
-              <w:tab/>
-            </w:r>
-            <w:r>
-              <w:rPr>
-                <w:noProof/>
-                <w:webHidden/>
-              </w:rPr>
-              <w:fldChar w:fldCharType="begin"/>
-            </w:r>
-            <w:r>
-              <w:rPr>
-                <w:noProof/>
-                <w:webHidden/>
-              </w:rPr>
-              <w:instrText xml:space="preserve"> PAGEREF _Toc200142131 \h </w:instrText>
-            </w:r>
-            <w:r>
-              <w:rPr>
-                <w:noProof/>
-                <w:webHidden/>
-              </w:rPr>
-            </w:r>
-            <w:r>
-              <w:rPr>
-                <w:noProof/>
-                <w:webHidden/>
-              </w:rPr>
-              <w:fldChar w:fldCharType="separate"/>
-            </w:r>
-            <w:r>
-              <w:rPr>
-                <w:noProof/>
-                <w:webHidden/>
-              </w:rPr>
-              <w:t>7</w:t>
-            </w:r>
-            <w:r>
-              <w:rPr>
-                <w:noProof/>
-                <w:webHidden/>
-              </w:rPr>
-              <w:fldChar w:fldCharType="end"/>
-            </w:r>
-          </w:hyperlink>
-        </w:p>
-        <w:p>
-          <w:pPr>
-            <w:pStyle w:val="Sumrio3"/>
-            <w:tabs>
-              <w:tab w:val="right" w:leader="dot" w:pos="9016"/>
-            </w:tabs>
-            <w:rPr>
-              <w:rFonts w:eastAsiaTheme="minorEastAsia"/>
-              <w:noProof/>
-              <w:lang w:eastAsia="pt-BR"/>
-            </w:rPr>
-          </w:pPr>
-          <w:hyperlink w:anchor="_Toc200142132" w:history="1">
-            <w:r>
-              <w:rPr>
-                <w:rStyle w:val="Hyperlink"/>
-                <w:noProof/>
-              </w:rPr>
-              <w:t>Sistema Operacional</w:t>
-            </w:r>
-            <w:r>
-              <w:rPr>
-                <w:noProof/>
-                <w:webHidden/>
-              </w:rPr>
-              <w:tab/>
-            </w:r>
-            <w:r>
-              <w:rPr>
-                <w:noProof/>
-                <w:webHidden/>
-              </w:rPr>
-              <w:fldChar w:fldCharType="begin"/>
-            </w:r>
-            <w:r>
-              <w:rPr>
-                <w:noProof/>
-                <w:webHidden/>
-              </w:rPr>
-              <w:instrText xml:space="preserve"> PAGEREF _Toc200142132 \h </w:instrText>
-            </w:r>
-            <w:r>
-              <w:rPr>
-                <w:noProof/>
-                <w:webHidden/>
-              </w:rPr>
-            </w:r>
-            <w:r>
-              <w:rPr>
-                <w:noProof/>
-                <w:webHidden/>
-              </w:rPr>
-              <w:fldChar w:fldCharType="separate"/>
-            </w:r>
-            <w:r>
-              <w:rPr>
-                <w:noProof/>
-                <w:webHidden/>
-              </w:rPr>
-              <w:t>7</w:t>
-            </w:r>
-            <w:r>
-              <w:rPr>
-                <w:noProof/>
-                <w:webHidden/>
-              </w:rPr>
-              <w:fldChar w:fldCharType="end"/>
-            </w:r>
-          </w:hyperlink>
-        </w:p>
-        <w:p>
-          <w:pPr>
-            <w:pStyle w:val="Sumrio3"/>
-            <w:tabs>
-              <w:tab w:val="right" w:leader="dot" w:pos="9016"/>
-            </w:tabs>
-            <w:rPr>
-              <w:rFonts w:eastAsiaTheme="minorEastAsia"/>
-              <w:noProof/>
-              <w:lang w:eastAsia="pt-BR"/>
-            </w:rPr>
-          </w:pPr>
-          <w:hyperlink w:anchor="_Toc200142133" w:history="1">
-            <w:r>
-              <w:rPr>
-                <w:rStyle w:val="Hyperlink"/>
-                <w:noProof/>
-              </w:rPr>
-              <w:t>RAM</w:t>
-            </w:r>
-            <w:r>
-              <w:rPr>
-                <w:noProof/>
-                <w:webHidden/>
-              </w:rPr>
-              <w:tab/>
-            </w:r>
-            <w:r>
-              <w:rPr>
-                <w:noProof/>
-                <w:webHidden/>
-              </w:rPr>
-              <w:fldChar w:fldCharType="begin"/>
-            </w:r>
-            <w:r>
-              <w:rPr>
-                <w:noProof/>
-                <w:webHidden/>
-              </w:rPr>
-              <w:instrText xml:space="preserve"> PAGEREF _Toc200142133 \h </w:instrText>
-            </w:r>
-            <w:r>
-              <w:rPr>
-                <w:noProof/>
-                <w:webHidden/>
-              </w:rPr>
-            </w:r>
-            <w:r>
-              <w:rPr>
-                <w:noProof/>
-                <w:webHidden/>
-              </w:rPr>
-              <w:fldChar w:fldCharType="separate"/>
-            </w:r>
-            <w:r>
-              <w:rPr>
-                <w:noProof/>
-                <w:webHidden/>
-              </w:rPr>
-              <w:t>8</w:t>
+              <w:t>11</w:t>
             </w:r>
             <w:r>
               <w:rPr>
@@ -2013,7 +1728,7 @@
               <w:lang w:eastAsia="pt-BR"/>
             </w:rPr>
           </w:pPr>
-          <w:hyperlink w:anchor="_Toc200142134" w:history="1">
+          <w:hyperlink w:anchor="_Toc200230225" w:history="1">
             <w:r>
               <w:rPr>
                 <w:rStyle w:val="Hyperlink"/>
@@ -2057,7 +1772,7 @@
                 <w:noProof/>
                 <w:webHidden/>
               </w:rPr>
-              <w:instrText xml:space="preserve"> PAGEREF _Toc200142134 \h </w:instrText>
+              <w:instrText xml:space="preserve"> PAGEREF _Toc200230225 \h </w:instrText>
             </w:r>
             <w:r>
               <w:rPr>
@@ -2077,7 +1792,7 @@
                 <w:noProof/>
                 <w:webHidden/>
               </w:rPr>
-              <w:t>8</w:t>
+              <w:t>11</w:t>
             </w:r>
             <w:r>
               <w:rPr>
@@ -2100,7 +1815,7 @@
               <w:lang w:eastAsia="pt-BR"/>
             </w:rPr>
           </w:pPr>
-          <w:hyperlink w:anchor="_Toc200142135" w:history="1">
+          <w:hyperlink w:anchor="_Toc200230226" w:history="1">
             <w:r>
               <w:rPr>
                 <w:rStyle w:val="Hyperlink"/>
@@ -2128,7 +1843,7 @@
                 <w:noProof/>
                 <w:webHidden/>
               </w:rPr>
-              <w:instrText xml:space="preserve"> PAGEREF _Toc200142135 \h </w:instrText>
+              <w:instrText xml:space="preserve"> PAGEREF _Toc200230226 \h </w:instrText>
             </w:r>
             <w:r>
               <w:rPr>
@@ -2148,7 +1863,7 @@
                 <w:noProof/>
                 <w:webHidden/>
               </w:rPr>
-              <w:t>8</w:t>
+              <w:t>11</w:t>
             </w:r>
             <w:r>
               <w:rPr>
@@ -2171,7 +1886,7 @@
               <w:lang w:eastAsia="pt-BR"/>
             </w:rPr>
           </w:pPr>
-          <w:hyperlink w:anchor="_Toc200142136" w:history="1">
+          <w:hyperlink w:anchor="_Toc200230227" w:history="1">
             <w:r>
               <w:rPr>
                 <w:rStyle w:val="Hyperlink"/>
@@ -2199,7 +1914,7 @@
                 <w:noProof/>
                 <w:webHidden/>
               </w:rPr>
-              <w:instrText xml:space="preserve"> PAGEREF _Toc200142136 \h </w:instrText>
+              <w:instrText xml:space="preserve"> PAGEREF _Toc200230227 \h </w:instrText>
             </w:r>
             <w:r>
               <w:rPr>
@@ -2219,7 +1934,7 @@
                 <w:noProof/>
                 <w:webHidden/>
               </w:rPr>
-              <w:t>9</w:t>
+              <w:t>12</w:t>
             </w:r>
             <w:r>
               <w:rPr>
@@ -2243,7 +1958,7 @@
               <w:lang w:eastAsia="pt-BR"/>
             </w:rPr>
           </w:pPr>
-          <w:hyperlink w:anchor="_Toc200142137" w:history="1">
+          <w:hyperlink w:anchor="_Toc200230228" w:history="1">
             <w:r>
               <w:rPr>
                 <w:rStyle w:val="Hyperlink"/>
@@ -2287,7 +2002,7 @@
                 <w:noProof/>
                 <w:webHidden/>
               </w:rPr>
-              <w:instrText xml:space="preserve"> PAGEREF _Toc200142137 \h </w:instrText>
+              <w:instrText xml:space="preserve"> PAGEREF _Toc200230228 \h </w:instrText>
             </w:r>
             <w:r>
               <w:rPr>
@@ -2307,7 +2022,7 @@
                 <w:noProof/>
                 <w:webHidden/>
               </w:rPr>
-              <w:t>10</w:t>
+              <w:t>13</w:t>
             </w:r>
             <w:r>
               <w:rPr>
@@ -2333,6 +2048,7 @@
               <w:sz w:val="24"/>
               <w:szCs w:val="24"/>
             </w:rPr>
+            <w:lastRenderedPageBreak/>
             <w:fldChar w:fldCharType="end"/>
           </w:r>
         </w:p>
@@ -2363,7 +2079,7 @@
           <w:szCs w:val="24"/>
         </w:rPr>
       </w:pPr>
-      <w:bookmarkStart w:id="0" w:name="_Toc200142111"/>
+      <w:bookmarkStart w:id="0" w:name="_Toc200230206"/>
       <w:r>
         <w:rPr>
           <w:rFonts w:ascii="Times" w:hAnsi="Times" w:cs="Times"/>
@@ -2384,7 +2100,7 @@
           <w:szCs w:val="24"/>
         </w:rPr>
       </w:pPr>
-      <w:bookmarkStart w:id="1" w:name="_Toc200142112"/>
+      <w:bookmarkStart w:id="1" w:name="_Toc200230207"/>
       <w:r>
         <w:rPr>
           <w:rFonts w:ascii="Times" w:hAnsi="Times" w:cs="Times"/>
@@ -2413,7 +2129,7 @@
           <w:szCs w:val="24"/>
         </w:rPr>
       </w:pPr>
-      <w:bookmarkStart w:id="2" w:name="_Toc200142113"/>
+      <w:bookmarkStart w:id="2" w:name="_Toc200230208"/>
       <w:r>
         <w:rPr>
           <w:rFonts w:ascii="Times" w:hAnsi="Times" w:cs="Times"/>
@@ -2442,7 +2158,7 @@
           <w:szCs w:val="24"/>
         </w:rPr>
       </w:pPr>
-      <w:bookmarkStart w:id="3" w:name="_Toc200142114"/>
+      <w:bookmarkStart w:id="3" w:name="_Toc200230209"/>
       <w:r>
         <w:rPr>
           <w:rFonts w:ascii="Times" w:hAnsi="Times" w:cs="Times"/>
@@ -2494,7 +2210,7 @@
           <w:szCs w:val="24"/>
         </w:rPr>
       </w:pPr>
-      <w:bookmarkStart w:id="4" w:name="_Toc200142115"/>
+      <w:bookmarkStart w:id="4" w:name="_Toc200230210"/>
       <w:r>
         <w:rPr>
           <w:rFonts w:ascii="Times" w:hAnsi="Times" w:cs="Times"/>
@@ -2523,7 +2239,7 @@
           <w:szCs w:val="24"/>
         </w:rPr>
       </w:pPr>
-      <w:bookmarkStart w:id="5" w:name="_Toc200142116"/>
+      <w:bookmarkStart w:id="5" w:name="_Toc200230211"/>
       <w:r>
         <w:rPr>
           <w:rFonts w:ascii="Times" w:hAnsi="Times" w:cs="Times"/>
@@ -2689,7 +2405,7 @@
         </w:rPr>
         <w:t xml:space="preserve"> </w:t>
       </w:r>
-      <w:bookmarkStart w:id="6" w:name="_Toc200142117"/>
+      <w:bookmarkStart w:id="6" w:name="_Toc200230212"/>
       <w:r>
         <w:rPr>
           <w:rFonts w:ascii="Times" w:hAnsi="Times" w:cs="Times"/>
@@ -2918,7 +2634,6 @@
           <w:sz w:val="24"/>
           <w:szCs w:val="24"/>
         </w:rPr>
-        <w:lastRenderedPageBreak/>
         <w:t xml:space="preserve">A Construção do Heap vale </w:t>
       </w:r>
       <m:oMath>
@@ -3001,6 +2716,7 @@
           <w:sz w:val="24"/>
           <w:szCs w:val="24"/>
         </w:rPr>
+        <w:lastRenderedPageBreak/>
         <w:t>Heapify:</w:t>
       </w:r>
     </w:p>
@@ -4460,7 +4176,6 @@
           <w:sz w:val="24"/>
           <w:szCs w:val="24"/>
         </w:rPr>
-        <w:lastRenderedPageBreak/>
         <w:t xml:space="preserve">Todavia, </w:t>
       </w:r>
       <w:r>
@@ -4525,6 +4240,7 @@
           <w:sz w:val="24"/>
           <w:szCs w:val="24"/>
         </w:rPr>
+        <w:lastRenderedPageBreak/>
         <w:t>O custo para a c</w:t>
       </w:r>
       <w:r>
@@ -5325,7 +5041,7 @@
           <w:szCs w:val="24"/>
         </w:rPr>
       </w:pPr>
-      <w:bookmarkStart w:id="7" w:name="_Toc200142118"/>
+      <w:bookmarkStart w:id="7" w:name="_Toc200230213"/>
       <w:r>
         <w:rPr>
           <w:rFonts w:ascii="Times" w:hAnsi="Times" w:cs="Times"/>
@@ -5491,7 +5207,7 @@
           <w:szCs w:val="24"/>
         </w:rPr>
       </w:pPr>
-      <w:bookmarkStart w:id="8" w:name="_Toc200142119"/>
+      <w:bookmarkStart w:id="8" w:name="_Toc200230214"/>
       <w:r>
         <w:rPr>
           <w:rFonts w:ascii="Times" w:hAnsi="Times" w:cs="Times"/>
@@ -5691,7 +5407,7 @@
           <w:szCs w:val="24"/>
         </w:rPr>
       </w:pPr>
-      <w:bookmarkStart w:id="9" w:name="_Toc200142120"/>
+      <w:bookmarkStart w:id="9" w:name="_Toc200230215"/>
       <w:r>
         <w:rPr>
           <w:rFonts w:ascii="Times" w:hAnsi="Times" w:cs="Times"/>
@@ -5788,7 +5504,6 @@
           <w:sz w:val="24"/>
           <w:szCs w:val="24"/>
         </w:rPr>
-        <w:lastRenderedPageBreak/>
         <w:t>Não Ideal para Conjuntos de Dados Pequenos</w:t>
       </w:r>
     </w:p>
@@ -5812,6 +5527,7 @@
           <w:sz w:val="24"/>
           <w:szCs w:val="24"/>
         </w:rPr>
+        <w:lastRenderedPageBreak/>
         <w:t>Mesma Grandeza: Pior, Médio e Melhor Caso</w:t>
       </w:r>
     </w:p>
@@ -5898,7 +5614,7 @@
           <w:szCs w:val="24"/>
         </w:rPr>
       </w:pPr>
-      <w:bookmarkStart w:id="10" w:name="_Toc200142121"/>
+      <w:bookmarkStart w:id="10" w:name="_Toc200230216"/>
       <w:r>
         <w:rPr>
           <w:rFonts w:ascii="Times" w:hAnsi="Times" w:cs="Times"/>
@@ -5936,7 +5652,7 @@
           <w:szCs w:val="24"/>
         </w:rPr>
       </w:pPr>
-      <w:bookmarkStart w:id="11" w:name="_Toc200142122"/>
+      <w:bookmarkStart w:id="11" w:name="_Toc200230217"/>
       <w:r>
         <w:rPr>
           <w:rFonts w:ascii="Times" w:hAnsi="Times" w:cs="Times"/>
@@ -5957,7 +5673,7 @@
           <w:szCs w:val="24"/>
         </w:rPr>
       </w:pPr>
-      <w:bookmarkStart w:id="12" w:name="_Toc200142123"/>
+      <w:bookmarkStart w:id="12" w:name="_Toc200230218"/>
       <w:r>
         <w:rPr>
           <w:rFonts w:ascii="Times" w:hAnsi="Times" w:cs="Times"/>
@@ -5975,6 +5691,17 @@
         </w:rPr>
         <w:t xml:space="preserve"> </w:t>
       </w:r>
+    </w:p>
+    <w:p/>
+    <w:p>
+      <w:pPr>
+        <w:pStyle w:val="Titulo3Relatorio"/>
+      </w:pPr>
+      <w:bookmarkStart w:id="13" w:name="_Toc200230219"/>
+      <w:r>
+        <w:t>Algoritmo da obra Estrutura de Dados Usando C</w:t>
+      </w:r>
+      <w:bookmarkEnd w:id="13"/>
     </w:p>
     <w:p>
       <w:pPr>
@@ -6145,23 +5872,11 @@
     </w:p>
     <w:p>
       <w:pPr>
-        <w:pStyle w:val="Ttulo3"/>
-        <w:rPr>
-          <w:rFonts w:ascii="Times" w:hAnsi="Times" w:cs="Times"/>
-          <w:sz w:val="24"/>
-          <w:szCs w:val="24"/>
-        </w:rPr>
-      </w:pPr>
-      <w:bookmarkStart w:id="13" w:name="_Toc200142124"/>
-      <w:r>
-        <w:rPr>
-          <w:rFonts w:ascii="Times" w:hAnsi="Times" w:cs="Times"/>
-          <w:sz w:val="24"/>
-          <w:szCs w:val="24"/>
-        </w:rPr>
+        <w:pStyle w:val="Titulo4Relatorio"/>
+      </w:pPr>
+      <w:r>
         <w:t>PQINSERT</w:t>
       </w:r>
-      <w:bookmarkEnd w:id="13"/>
     </w:p>
     <w:p>
       <w:pPr>
@@ -6712,7 +6427,16 @@
           <w:sz w:val="24"/>
           <w:szCs w:val="24"/>
         </w:rPr>
-        <w:t xml:space="preserve"> Contudo, um novo elemento não pode ser inserido entre dois elementos já existentes sem deslocar/reposicionar elementos existentes com </w:t>
+        <w:t xml:space="preserve"> Contudo, um novo elemento não pode ser inserido </w:t>
+      </w:r>
+      <w:r>
+        <w:rPr>
+          <w:rFonts w:ascii="Times" w:eastAsiaTheme="minorEastAsia" w:hAnsi="Times" w:cs="Times"/>
+          <w:sz w:val="24"/>
+          <w:szCs w:val="24"/>
+        </w:rPr>
+        <w:lastRenderedPageBreak/>
+        <w:t xml:space="preserve">entre dois elementos já existentes sem deslocar/reposicionar elementos existentes com </w:t>
       </w:r>
       <w:r>
         <w:rPr>
@@ -6747,7 +6471,6 @@
           <w:sz w:val="24"/>
           <w:szCs w:val="24"/>
         </w:rPr>
-        <w:lastRenderedPageBreak/>
         <w:t>O seguinte algoritmo deverá ser implementado:</w:t>
       </w:r>
     </w:p>
@@ -7646,23 +7369,11 @@
     </w:p>
     <w:p>
       <w:pPr>
-        <w:pStyle w:val="Ttulo3"/>
-        <w:rPr>
-          <w:rFonts w:ascii="Times" w:hAnsi="Times" w:cs="Times"/>
-          <w:sz w:val="24"/>
-          <w:szCs w:val="24"/>
-        </w:rPr>
-      </w:pPr>
-      <w:bookmarkStart w:id="14" w:name="_Toc200142125"/>
-      <w:r>
-        <w:rPr>
-          <w:rFonts w:ascii="Times" w:hAnsi="Times" w:cs="Times"/>
-          <w:sz w:val="24"/>
-          <w:szCs w:val="24"/>
-        </w:rPr>
+        <w:pStyle w:val="Titulo4Relatorio"/>
+      </w:pPr>
+      <w:r>
         <w:t>PQMAXDELETE</w:t>
       </w:r>
-      <w:bookmarkEnd w:id="14"/>
     </w:p>
     <w:p>
       <w:pPr>
@@ -7854,6 +7565,7 @@
           <w:sz w:val="24"/>
           <w:szCs w:val="24"/>
         </w:rPr>
+        <w:lastRenderedPageBreak/>
         <w:t xml:space="preserve">Seja </w:t>
       </w:r>
       <w:r>
@@ -8127,7 +7839,6 @@
         <w:pStyle w:val="Codigo"/>
       </w:pPr>
       <w:r>
-        <w:lastRenderedPageBreak/>
         <w:t xml:space="preserve">    int p = dpq[0];</w:t>
       </w:r>
     </w:p>
@@ -8177,7 +7888,6 @@
       <w:pPr>
         <w:pStyle w:val="NormalRelatorio"/>
       </w:pPr>
-      <w:bookmarkStart w:id="15" w:name="_Toc200142127"/>
       <w:r>
         <w:t xml:space="preserve">Em um heap descendente, tanto o elemento-raiz e um outro elemento posicionado em qualquer posição </w:t>
       </w:r>
@@ -8339,19 +8049,7 @@
           <w:rPr>
             <w:rFonts w:ascii="Cambria Math" w:eastAsiaTheme="minorEastAsia" w:hAnsi="Cambria Math"/>
           </w:rPr>
-          <m:t>[2*p+</m:t>
-        </m:r>
-        <m:r>
-          <w:rPr>
-            <w:rFonts w:ascii="Cambria Math" w:eastAsiaTheme="minorEastAsia" w:hAnsi="Cambria Math"/>
-          </w:rPr>
-          <m:t>1</m:t>
-        </m:r>
-        <m:r>
-          <w:rPr>
-            <w:rFonts w:ascii="Cambria Math" w:eastAsiaTheme="minorEastAsia" w:hAnsi="Cambria Math"/>
-          </w:rPr>
-          <m:t>]</m:t>
+          <m:t>[2*p+1]</m:t>
         </m:r>
       </m:oMath>
       <w:r>
@@ -8378,13 +8076,7 @@
           <w:rPr>
             <w:rFonts w:ascii="Cambria Math" w:eastAsiaTheme="minorEastAsia" w:hAnsi="Cambria Math"/>
           </w:rPr>
-          <m:t>[2*p+2]</m:t>
-        </m:r>
-        <m:r>
-          <w:rPr>
-            <w:rFonts w:ascii="Cambria Math" w:eastAsiaTheme="minorEastAsia" w:hAnsi="Cambria Math"/>
-          </w:rPr>
-          <m:t xml:space="preserve"> </m:t>
+          <m:t xml:space="preserve">[2*p+2] </m:t>
         </m:r>
       </m:oMath>
       <w:r>
@@ -8457,22 +8149,11 @@
     </w:p>
     <w:p>
       <w:pPr>
-        <w:pStyle w:val="Ttulo3"/>
-        <w:rPr>
-          <w:rFonts w:ascii="Times" w:hAnsi="Times" w:cs="Times"/>
-          <w:sz w:val="24"/>
-          <w:szCs w:val="24"/>
-        </w:rPr>
-      </w:pPr>
-      <w:r>
-        <w:rPr>
-          <w:rFonts w:ascii="Times" w:hAnsi="Times" w:cs="Times"/>
-          <w:sz w:val="24"/>
-          <w:szCs w:val="24"/>
-        </w:rPr>
+        <w:pStyle w:val="Titulo4Relatorio"/>
+      </w:pPr>
+      <w:r>
         <w:t>LARGESON</w:t>
       </w:r>
-      <w:bookmarkEnd w:id="15"/>
     </w:p>
     <w:p>
       <w:pPr>
@@ -8641,14 +8322,11 @@
     </w:p>
     <w:p>
       <w:pPr>
-        <w:pStyle w:val="Titulo3Relatorio"/>
-      </w:pPr>
-      <w:bookmarkStart w:id="16" w:name="_Toc200142128"/>
-      <w:bookmarkStart w:id="17" w:name="_Toc200142126"/>
+        <w:pStyle w:val="Titulo4Relatorio"/>
+      </w:pPr>
       <w:r>
         <w:t>ADJUSTHEAP</w:t>
       </w:r>
-      <w:bookmarkEnd w:id="17"/>
     </w:p>
     <w:p>
       <w:pPr>
@@ -8817,22 +8495,11 @@
     </w:p>
     <w:p>
       <w:pPr>
-        <w:pStyle w:val="Ttulo3"/>
-        <w:rPr>
-          <w:rFonts w:ascii="Times" w:hAnsi="Times" w:cs="Times"/>
-          <w:sz w:val="24"/>
-          <w:szCs w:val="24"/>
-        </w:rPr>
-      </w:pPr>
-      <w:r>
-        <w:rPr>
-          <w:rFonts w:ascii="Times" w:hAnsi="Times" w:cs="Times"/>
-          <w:sz w:val="24"/>
-          <w:szCs w:val="24"/>
-        </w:rPr>
+        <w:pStyle w:val="Titulo4Relatorio"/>
+      </w:pPr>
+      <w:r>
         <w:t>HEAPSORT</w:t>
       </w:r>
-      <w:bookmarkEnd w:id="16"/>
     </w:p>
     <w:p>
       <w:pPr>
@@ -8855,30 +8522,19 @@
     </w:p>
     <w:p>
       <w:pPr>
-        <w:pStyle w:val="Ttulo3"/>
-        <w:rPr>
-          <w:rFonts w:ascii="Times" w:hAnsi="Times" w:cs="Times"/>
-          <w:sz w:val="24"/>
-          <w:szCs w:val="24"/>
-        </w:rPr>
-      </w:pPr>
-      <w:bookmarkStart w:id="18" w:name="_Toc200142129"/>
-      <w:r>
-        <w:rPr>
-          <w:rFonts w:ascii="Times" w:hAnsi="Times" w:cs="Times"/>
-          <w:sz w:val="24"/>
-          <w:szCs w:val="24"/>
-        </w:rPr>
+        <w:pStyle w:val="Titulo4Relatorio"/>
+      </w:pPr>
+      <w:r>
+        <w:lastRenderedPageBreak/>
         <w:t>PRINTARRAY</w:t>
       </w:r>
-      <w:bookmarkEnd w:id="18"/>
     </w:p>
     <w:p>
       <w:pPr>
         <w:ind w:firstLine="708"/>
         <w:jc w:val="both"/>
         <w:rPr>
-          <w:rFonts w:ascii="Times" w:eastAsiaTheme="minorEastAsia" w:hAnsi="Times" w:cs="Times"/>
+          <w:rFonts w:ascii="Times" w:hAnsi="Times" w:cs="Times"/>
           <w:sz w:val="24"/>
           <w:szCs w:val="24"/>
         </w:rPr>
@@ -8897,6 +8553,26 @@
         <w:jc w:val="both"/>
         <w:rPr>
           <w:rFonts w:ascii="Times" w:hAnsi="Times" w:cs="Times"/>
+          <w:sz w:val="24"/>
+          <w:szCs w:val="24"/>
+        </w:rPr>
+      </w:pPr>
+    </w:p>
+    <w:p>
+      <w:pPr>
+        <w:jc w:val="both"/>
+        <w:rPr>
+          <w:rFonts w:ascii="Times" w:eastAsiaTheme="minorEastAsia" w:hAnsi="Times" w:cs="Times"/>
+          <w:sz w:val="24"/>
+          <w:szCs w:val="24"/>
+        </w:rPr>
+      </w:pPr>
+    </w:p>
+    <w:p>
+      <w:pPr>
+        <w:jc w:val="both"/>
+        <w:rPr>
+          <w:rFonts w:ascii="Times" w:hAnsi="Times" w:cs="Times"/>
           <w:sz w:val="20"/>
           <w:szCs w:val="24"/>
         </w:rPr>
@@ -8904,7 +8580,1735 @@
     </w:p>
     <w:p>
       <w:pPr>
+        <w:pStyle w:val="Titulo3Relatorio"/>
+      </w:pPr>
+      <w:bookmarkStart w:id="14" w:name="_Toc200230220"/>
+      <w:r>
+        <w:t>Algoritmo do site Programmiz</w:t>
+      </w:r>
+      <w:bookmarkEnd w:id="14"/>
+    </w:p>
+    <w:p>
+      <w:pPr>
+        <w:pStyle w:val="NormalRelatorio"/>
+      </w:pPr>
+      <w:r>
+        <w:t>Segundamente, a fim de dar mais clareza e menos complexidade de implementação, o modelo de algoritmo em C sugerido pelo site Programmiz foi considerado. Pois em sua estrutura, foram implementados os seguintes procedimentos</w:t>
+      </w:r>
+    </w:p>
+    <w:p>
+      <w:pPr>
+        <w:pStyle w:val="PargrafodaLista"/>
+        <w:numPr>
+          <w:ilvl w:val="0"/>
+          <w:numId w:val="10"/>
+        </w:numPr>
         <w:jc w:val="both"/>
+      </w:pPr>
+      <w:r>
+        <w:rPr>
+          <w:rFonts w:ascii="Times" w:hAnsi="Times" w:cs="Times"/>
+          <w:i/>
+          <w:sz w:val="24"/>
+          <w:szCs w:val="24"/>
+        </w:rPr>
+        <w:t>swap</w:t>
+      </w:r>
+    </w:p>
+    <w:p>
+      <w:pPr>
+        <w:pStyle w:val="PargrafodaLista"/>
+        <w:numPr>
+          <w:ilvl w:val="0"/>
+          <w:numId w:val="10"/>
+        </w:numPr>
+        <w:jc w:val="both"/>
+      </w:pPr>
+      <w:r>
+        <w:rPr>
+          <w:rFonts w:ascii="Times" w:hAnsi="Times" w:cs="Times"/>
+          <w:i/>
+          <w:sz w:val="24"/>
+          <w:szCs w:val="24"/>
+        </w:rPr>
+        <w:t>heapify</w:t>
+      </w:r>
+    </w:p>
+    <w:p>
+      <w:pPr>
+        <w:pStyle w:val="PargrafodaLista"/>
+        <w:numPr>
+          <w:ilvl w:val="0"/>
+          <w:numId w:val="10"/>
+        </w:numPr>
+        <w:jc w:val="both"/>
+      </w:pPr>
+      <w:r>
+        <w:rPr>
+          <w:rFonts w:ascii="Times" w:hAnsi="Times" w:cs="Times"/>
+          <w:i/>
+          <w:sz w:val="24"/>
+          <w:szCs w:val="24"/>
+        </w:rPr>
+        <w:t>heapsort</w:t>
+      </w:r>
+    </w:p>
+    <w:p>
+      <w:pPr>
+        <w:pStyle w:val="Titulo4Relatorio"/>
+      </w:pPr>
+      <w:r>
+        <w:t>SWAP</w:t>
+      </w:r>
+    </w:p>
+    <w:p>
+      <w:pPr>
+        <w:ind w:firstLine="708"/>
+        <w:jc w:val="both"/>
+        <w:rPr>
+          <w:rFonts w:ascii="Times" w:eastAsiaTheme="minorEastAsia" w:hAnsi="Times" w:cs="Times"/>
+          <w:sz w:val="24"/>
+          <w:szCs w:val="24"/>
+        </w:rPr>
+      </w:pPr>
+      <w:r>
+        <w:rPr>
+          <w:rFonts w:ascii="Times" w:hAnsi="Times" w:cs="Times"/>
+          <w:sz w:val="24"/>
+          <w:szCs w:val="24"/>
+        </w:rPr>
+        <w:t xml:space="preserve">Para o procedimento </w:t>
+      </w:r>
+      <w:r>
+        <w:rPr>
+          <w:rFonts w:ascii="Times" w:hAnsi="Times" w:cs="Times"/>
+          <w:i/>
+          <w:sz w:val="24"/>
+          <w:szCs w:val="24"/>
+        </w:rPr>
+        <w:t>swap</w:t>
+      </w:r>
+      <w:r>
+        <w:rPr>
+          <w:rFonts w:ascii="Times" w:hAnsi="Times" w:cs="Times"/>
+          <w:sz w:val="24"/>
+          <w:szCs w:val="24"/>
+        </w:rPr>
+        <w:t>(</w:t>
+      </w:r>
+      <w:r>
+        <w:rPr>
+          <w:rFonts w:ascii="Times" w:hAnsi="Times" w:cs="Times"/>
+          <w:i/>
+          <w:sz w:val="24"/>
+          <w:szCs w:val="24"/>
+        </w:rPr>
+        <w:t>double *a, double *b</w:t>
+      </w:r>
+      <w:r>
+        <w:rPr>
+          <w:rFonts w:ascii="Times" w:hAnsi="Times" w:cs="Times"/>
+          <w:sz w:val="24"/>
+          <w:szCs w:val="24"/>
+        </w:rPr>
+        <w:t>)</w:t>
+      </w:r>
+      <w:r>
+        <w:rPr>
+          <w:rFonts w:ascii="Times" w:hAnsi="Times" w:cs="Times"/>
+          <w:sz w:val="24"/>
+          <w:szCs w:val="24"/>
+        </w:rPr>
+        <w:t xml:space="preserve">, observa-se </w:t>
+      </w:r>
+      <w:r>
+        <w:rPr>
+          <w:rFonts w:ascii="Times" w:eastAsiaTheme="minorEastAsia" w:hAnsi="Times" w:cs="Times"/>
+          <w:sz w:val="24"/>
+          <w:szCs w:val="24"/>
+        </w:rPr>
+        <w:t xml:space="preserve">que em seus parâmetros são </w:t>
+      </w:r>
+      <w:r>
+        <w:rPr>
+          <w:rFonts w:ascii="Times" w:eastAsiaTheme="minorEastAsia" w:hAnsi="Times" w:cs="Times"/>
+          <w:sz w:val="24"/>
+          <w:szCs w:val="24"/>
+        </w:rPr>
+        <w:t xml:space="preserve">utilizados </w:t>
+      </w:r>
+      <w:r>
+        <w:rPr>
+          <w:rFonts w:ascii="Times" w:eastAsiaTheme="minorEastAsia" w:hAnsi="Times" w:cs="Times"/>
+          <w:sz w:val="24"/>
+          <w:szCs w:val="24"/>
+        </w:rPr>
+        <w:t>dois ponteiros do tipo double,</w:t>
+      </w:r>
+      <w:r>
+        <w:rPr>
+          <w:rFonts w:ascii="Times" w:eastAsiaTheme="minorEastAsia" w:hAnsi="Times" w:cs="Times"/>
+          <w:sz w:val="24"/>
+          <w:szCs w:val="24"/>
+        </w:rPr>
+        <w:t xml:space="preserve"> a fim de realizar a alternância das futuras posições dos elementos-raiz e o último elemento da árvore.</w:t>
+      </w:r>
+    </w:p>
+    <w:p>
+      <w:pPr>
+        <w:ind w:firstLine="708"/>
+        <w:jc w:val="both"/>
+        <w:rPr>
+          <w:rFonts w:ascii="Times" w:eastAsiaTheme="minorEastAsia" w:hAnsi="Times" w:cs="Times"/>
+          <w:sz w:val="24"/>
+          <w:szCs w:val="24"/>
+        </w:rPr>
+      </w:pPr>
+      <w:r>
+        <w:rPr>
+          <w:rFonts w:ascii="Times" w:eastAsiaTheme="minorEastAsia" w:hAnsi="Times" w:cs="Times"/>
+          <w:sz w:val="24"/>
+          <w:szCs w:val="24"/>
+        </w:rPr>
+        <w:t>Em seguida, dentro desse procedimento t</w:t>
+      </w:r>
+      <w:r>
+        <w:rPr>
+          <w:rFonts w:ascii="Times" w:eastAsiaTheme="minorEastAsia" w:hAnsi="Times" w:cs="Times"/>
+          <w:sz w:val="24"/>
+          <w:szCs w:val="24"/>
+        </w:rPr>
+        <w:t>er</w:t>
+      </w:r>
+      <w:r>
+        <w:rPr>
+          <w:rFonts w:ascii="Times" w:eastAsiaTheme="minorEastAsia" w:hAnsi="Times" w:cs="Times"/>
+          <w:sz w:val="24"/>
+          <w:szCs w:val="24"/>
+        </w:rPr>
+        <w:t xml:space="preserve">emos a variável temporária do tipo double chamada </w:t>
+      </w:r>
+      <w:r>
+        <w:rPr>
+          <w:rFonts w:ascii="Times" w:eastAsiaTheme="minorEastAsia" w:hAnsi="Times" w:cs="Times"/>
+          <w:i/>
+          <w:sz w:val="24"/>
+          <w:szCs w:val="24"/>
+        </w:rPr>
+        <w:t>temp</w:t>
+      </w:r>
+      <w:r>
+        <w:rPr>
+          <w:rFonts w:ascii="Times" w:eastAsiaTheme="minorEastAsia" w:hAnsi="Times" w:cs="Times"/>
+          <w:sz w:val="24"/>
+          <w:szCs w:val="24"/>
+        </w:rPr>
+        <w:t>, onde o valor do ponteiro *a será armazenado.</w:t>
+      </w:r>
+      <w:r>
+        <w:rPr>
+          <w:rFonts w:ascii="Times" w:eastAsiaTheme="minorEastAsia" w:hAnsi="Times" w:cs="Times"/>
+          <w:sz w:val="24"/>
+          <w:szCs w:val="24"/>
+        </w:rPr>
+        <w:t xml:space="preserve"> Dentre as operações que serão realizadas dentro desta função, será efetuada a transferência do valor do endereço do ponteiro </w:t>
+      </w:r>
+      <w:r>
+        <w:rPr>
+          <w:rFonts w:ascii="Times" w:eastAsiaTheme="minorEastAsia" w:hAnsi="Times" w:cs="Times"/>
+          <w:i/>
+          <w:sz w:val="24"/>
+          <w:szCs w:val="24"/>
+        </w:rPr>
+        <w:t>a</w:t>
+      </w:r>
+      <w:r>
+        <w:rPr>
+          <w:rFonts w:ascii="Times" w:eastAsiaTheme="minorEastAsia" w:hAnsi="Times" w:cs="Times"/>
+          <w:sz w:val="24"/>
+          <w:szCs w:val="24"/>
+        </w:rPr>
+        <w:t xml:space="preserve"> para o ponteiro *</w:t>
+      </w:r>
+      <w:r>
+        <w:rPr>
+          <w:rFonts w:ascii="Times" w:eastAsiaTheme="minorEastAsia" w:hAnsi="Times" w:cs="Times"/>
+          <w:i/>
+          <w:sz w:val="24"/>
+          <w:szCs w:val="24"/>
+        </w:rPr>
+        <w:t>b</w:t>
+      </w:r>
+      <w:r>
+        <w:rPr>
+          <w:rFonts w:ascii="Times" w:eastAsiaTheme="minorEastAsia" w:hAnsi="Times" w:cs="Times"/>
+          <w:sz w:val="24"/>
+          <w:szCs w:val="24"/>
+        </w:rPr>
+        <w:t>. Enquanto o valor armazenado em *</w:t>
+      </w:r>
+      <w:r>
+        <w:rPr>
+          <w:rFonts w:ascii="Times" w:eastAsiaTheme="minorEastAsia" w:hAnsi="Times" w:cs="Times"/>
+          <w:i/>
+          <w:sz w:val="24"/>
+          <w:szCs w:val="24"/>
+        </w:rPr>
+        <w:t>a</w:t>
+      </w:r>
+      <w:r>
+        <w:rPr>
+          <w:rFonts w:ascii="Times" w:eastAsiaTheme="minorEastAsia" w:hAnsi="Times" w:cs="Times"/>
+          <w:sz w:val="24"/>
+          <w:szCs w:val="24"/>
+        </w:rPr>
+        <w:t xml:space="preserve"> é passado para *</w:t>
+      </w:r>
+      <w:r>
+        <w:rPr>
+          <w:rFonts w:ascii="Times" w:eastAsiaTheme="minorEastAsia" w:hAnsi="Times" w:cs="Times"/>
+          <w:i/>
+          <w:sz w:val="24"/>
+          <w:szCs w:val="24"/>
+        </w:rPr>
+        <w:t>b</w:t>
+      </w:r>
+      <w:r>
+        <w:rPr>
+          <w:rFonts w:ascii="Times" w:eastAsiaTheme="minorEastAsia" w:hAnsi="Times" w:cs="Times"/>
+          <w:sz w:val="24"/>
+          <w:szCs w:val="24"/>
+        </w:rPr>
+        <w:t xml:space="preserve">, tal valor posteriormente será transmitido para </w:t>
+      </w:r>
+      <w:r>
+        <w:rPr>
+          <w:rFonts w:ascii="Times" w:eastAsiaTheme="minorEastAsia" w:hAnsi="Times" w:cs="Times"/>
+          <w:i/>
+          <w:sz w:val="24"/>
+          <w:szCs w:val="24"/>
+        </w:rPr>
+        <w:t>temp</w:t>
+      </w:r>
+      <w:r>
+        <w:rPr>
+          <w:rFonts w:ascii="Times" w:eastAsiaTheme="minorEastAsia" w:hAnsi="Times" w:cs="Times"/>
+          <w:sz w:val="24"/>
+          <w:szCs w:val="24"/>
+        </w:rPr>
+        <w:t xml:space="preserve"> ao fim da função.</w:t>
+      </w:r>
+    </w:p>
+    <w:p>
+      <w:pPr>
+        <w:jc w:val="both"/>
+        <w:rPr>
+          <w:rFonts w:ascii="Times" w:eastAsiaTheme="minorEastAsia" w:hAnsi="Times" w:cs="Times"/>
+          <w:sz w:val="24"/>
+          <w:szCs w:val="24"/>
+        </w:rPr>
+      </w:pPr>
+      <w:r>
+        <w:rPr>
+          <w:rFonts w:ascii="Times" w:eastAsiaTheme="minorEastAsia" w:hAnsi="Times" w:cs="Times"/>
+          <w:sz w:val="24"/>
+          <w:szCs w:val="24"/>
+        </w:rPr>
+        <w:t xml:space="preserve">Quanto ao código-fonte fornecido pela plataforma Programmiz, tivemos de adaptar os parâmetros e os seus tipos para o código fornecido em aula, em breve tais adaptações estarão mais evidentes: </w:t>
+      </w:r>
+    </w:p>
+    <w:p>
+      <w:pPr>
+        <w:pStyle w:val="Codigo"/>
+      </w:pPr>
+      <w:r>
+        <w:t>//funcao para alternar a posicao de dois elementos(swap)</w:t>
+      </w:r>
+    </w:p>
+    <w:p>
+      <w:pPr>
+        <w:pStyle w:val="Codigo"/>
+      </w:pPr>
+      <w:r>
+        <w:t>void swap(double *a, double *b)</w:t>
+      </w:r>
+    </w:p>
+    <w:p>
+      <w:pPr>
+        <w:pStyle w:val="Codigo"/>
+      </w:pPr>
+      <w:r>
+        <w:t>{</w:t>
+      </w:r>
+    </w:p>
+    <w:p>
+      <w:pPr>
+        <w:pStyle w:val="Codigo"/>
+      </w:pPr>
+      <w:r>
+        <w:t xml:space="preserve">    //temp eh uma variavel para armazenar um valor temporario</w:t>
+      </w:r>
+    </w:p>
+    <w:p>
+      <w:pPr>
+        <w:pStyle w:val="Codigo"/>
+      </w:pPr>
+      <w:r>
+        <w:t xml:space="preserve">    //*a eh um apontador que representa uma posicao</w:t>
+      </w:r>
+    </w:p>
+    <w:p>
+      <w:pPr>
+        <w:pStyle w:val="Codigo"/>
+      </w:pPr>
+      <w:r>
+        <w:t xml:space="preserve">    //*b eh um apontador que representa uma outra posicao</w:t>
+      </w:r>
+    </w:p>
+    <w:p>
+      <w:pPr>
+        <w:pStyle w:val="Codigo"/>
+      </w:pPr>
+    </w:p>
+    <w:p>
+      <w:pPr>
+        <w:pStyle w:val="Codigo"/>
+      </w:pPr>
+      <w:r>
+        <w:t xml:space="preserve">    //o valor de *a ficara em temp</w:t>
+      </w:r>
+    </w:p>
+    <w:p>
+      <w:pPr>
+        <w:pStyle w:val="Codigo"/>
+      </w:pPr>
+      <w:r>
+        <w:t xml:space="preserve">    double temp = *a;</w:t>
+      </w:r>
+    </w:p>
+    <w:p>
+      <w:pPr>
+        <w:pStyle w:val="Codigo"/>
+      </w:pPr>
+    </w:p>
+    <w:p>
+      <w:pPr>
+        <w:pStyle w:val="Codigo"/>
+      </w:pPr>
+      <w:r>
+        <w:t xml:space="preserve">    //os ponteiros *a e *b trocara dois elementos</w:t>
+      </w:r>
+    </w:p>
+    <w:p>
+      <w:pPr>
+        <w:pStyle w:val="Codigo"/>
+      </w:pPr>
+      <w:r>
+        <w:t xml:space="preserve">    //*a sera igual o valor de *b, ja *b vai sera igual temp(onde o valor estara armazenado)</w:t>
+      </w:r>
+    </w:p>
+    <w:p>
+      <w:pPr>
+        <w:pStyle w:val="Codigo"/>
+      </w:pPr>
+      <w:r>
+        <w:t xml:space="preserve">    *a = *b;</w:t>
+      </w:r>
+    </w:p>
+    <w:p>
+      <w:pPr>
+        <w:pStyle w:val="Codigo"/>
+      </w:pPr>
+      <w:r>
+        <w:t xml:space="preserve">    *b = temp;</w:t>
+      </w:r>
+    </w:p>
+    <w:p>
+      <w:pPr>
+        <w:pStyle w:val="Codigo"/>
+      </w:pPr>
+      <w:r>
+        <w:t>}</w:t>
+      </w:r>
+    </w:p>
+    <w:p>
+      <w:pPr>
+        <w:pStyle w:val="Titulo4Relatorio"/>
+      </w:pPr>
+      <w:r>
+        <w:t>HEAPIFY</w:t>
+      </w:r>
+    </w:p>
+    <w:p>
+      <w:pPr>
+        <w:ind w:firstLine="708"/>
+        <w:jc w:val="both"/>
+        <w:rPr>
+          <w:rFonts w:ascii="Times" w:eastAsiaTheme="minorEastAsia" w:hAnsi="Times" w:cs="Times"/>
+          <w:sz w:val="24"/>
+          <w:szCs w:val="24"/>
+        </w:rPr>
+      </w:pPr>
+      <w:r>
+        <w:rPr>
+          <w:rFonts w:ascii="Times" w:hAnsi="Times" w:cs="Times"/>
+          <w:sz w:val="24"/>
+          <w:szCs w:val="24"/>
+        </w:rPr>
+        <w:t xml:space="preserve">Para o procedimento </w:t>
+      </w:r>
+      <w:r>
+        <w:rPr>
+          <w:rFonts w:ascii="Times" w:hAnsi="Times" w:cs="Times"/>
+          <w:i/>
+          <w:sz w:val="24"/>
+          <w:szCs w:val="24"/>
+        </w:rPr>
+        <w:t>heapify</w:t>
+      </w:r>
+      <w:r>
+        <w:rPr>
+          <w:rFonts w:ascii="Times" w:hAnsi="Times" w:cs="Times"/>
+          <w:sz w:val="24"/>
+          <w:szCs w:val="24"/>
+        </w:rPr>
+        <w:t>(</w:t>
+      </w:r>
+      <w:r>
+        <w:rPr>
+          <w:rFonts w:ascii="Times" w:hAnsi="Times" w:cs="Times"/>
+          <w:sz w:val="24"/>
+          <w:szCs w:val="24"/>
+        </w:rPr>
+        <w:t>double* arr, long n, long i</w:t>
+      </w:r>
+      <w:r>
+        <w:rPr>
+          <w:rFonts w:ascii="Times" w:hAnsi="Times" w:cs="Times"/>
+          <w:sz w:val="24"/>
+          <w:szCs w:val="24"/>
+        </w:rPr>
+        <w:t>)</w:t>
+      </w:r>
+      <w:r>
+        <w:rPr>
+          <w:rFonts w:ascii="Times" w:hAnsi="Times" w:cs="Times"/>
+          <w:sz w:val="24"/>
+          <w:szCs w:val="24"/>
+        </w:rPr>
+        <w:t xml:space="preserve">, observa-se </w:t>
+      </w:r>
+      <w:r>
+        <w:rPr>
+          <w:rFonts w:ascii="Times" w:eastAsiaTheme="minorEastAsia" w:hAnsi="Times" w:cs="Times"/>
+          <w:sz w:val="24"/>
+          <w:szCs w:val="24"/>
+        </w:rPr>
+        <w:t>que em seus parâmetros são utilizados: um ponteiro do tipo double para o array de números de entrada,  uma variável do tipo long para indicar o número total de elementos do heap</w:t>
+      </w:r>
+      <w:r>
+        <w:rPr>
+          <w:rFonts w:ascii="Times" w:eastAsiaTheme="minorEastAsia" w:hAnsi="Times" w:cs="Times"/>
+          <w:sz w:val="24"/>
+          <w:szCs w:val="24"/>
+        </w:rPr>
+        <w:t xml:space="preserve"> atual</w:t>
+      </w:r>
+      <w:r>
+        <w:rPr>
+          <w:rFonts w:ascii="Times" w:eastAsiaTheme="minorEastAsia" w:hAnsi="Times" w:cs="Times"/>
+          <w:sz w:val="24"/>
+          <w:szCs w:val="24"/>
+        </w:rPr>
+        <w:t>,</w:t>
+      </w:r>
+      <w:r>
+        <w:rPr>
+          <w:rFonts w:ascii="Times" w:eastAsiaTheme="minorEastAsia" w:hAnsi="Times" w:cs="Times"/>
+          <w:sz w:val="24"/>
+          <w:szCs w:val="24"/>
+        </w:rPr>
+        <w:t xml:space="preserve"> e outra variável do mesmo tipo para indicar o índice para garantir que a subárvore com raiz </w:t>
+      </w:r>
+      <m:oMath>
+        <m:r>
+          <w:rPr>
+            <w:rFonts w:ascii="Cambria Math" w:eastAsiaTheme="minorEastAsia" w:hAnsi="Cambria Math" w:cs="Times"/>
+            <w:sz w:val="24"/>
+            <w:szCs w:val="24"/>
+          </w:rPr>
+          <m:t>i</m:t>
+        </m:r>
+      </m:oMath>
+      <w:r>
+        <w:rPr>
+          <w:rFonts w:ascii="Times" w:eastAsiaTheme="minorEastAsia" w:hAnsi="Times" w:cs="Times"/>
+          <w:sz w:val="24"/>
+          <w:szCs w:val="24"/>
+        </w:rPr>
+        <w:t xml:space="preserve"> esteja obedecendo a propriedade do heap (verificando a hierarquia “pai é maior que seus filhos?” do elemento-pai com os seus elementos primogênitos).</w:t>
+      </w:r>
+    </w:p>
+    <w:p>
+      <w:pPr>
+        <w:ind w:firstLine="708"/>
+        <w:jc w:val="both"/>
+        <w:rPr>
+          <w:rFonts w:ascii="Times" w:eastAsiaTheme="minorEastAsia" w:hAnsi="Times" w:cs="Times"/>
+          <w:sz w:val="24"/>
+          <w:szCs w:val="24"/>
+        </w:rPr>
+      </w:pPr>
+      <w:r>
+        <w:rPr>
+          <w:rFonts w:ascii="Times" w:eastAsiaTheme="minorEastAsia" w:hAnsi="Times" w:cs="Times"/>
+          <w:sz w:val="24"/>
+          <w:szCs w:val="24"/>
+        </w:rPr>
+        <w:t>Em seguida, dentro desse procedimento teremos a</w:t>
+      </w:r>
+      <w:r>
+        <w:rPr>
+          <w:rFonts w:ascii="Times" w:eastAsiaTheme="minorEastAsia" w:hAnsi="Times" w:cs="Times"/>
+          <w:sz w:val="24"/>
+          <w:szCs w:val="24"/>
+        </w:rPr>
+        <w:t>s</w:t>
+      </w:r>
+      <w:r>
+        <w:rPr>
+          <w:rFonts w:ascii="Times" w:eastAsiaTheme="minorEastAsia" w:hAnsi="Times" w:cs="Times"/>
+          <w:sz w:val="24"/>
+          <w:szCs w:val="24"/>
+        </w:rPr>
+        <w:t xml:space="preserve"> variáve</w:t>
+      </w:r>
+      <w:r>
+        <w:rPr>
+          <w:rFonts w:ascii="Times" w:eastAsiaTheme="minorEastAsia" w:hAnsi="Times" w:cs="Times"/>
+          <w:sz w:val="24"/>
+          <w:szCs w:val="24"/>
+        </w:rPr>
+        <w:t xml:space="preserve">is, </w:t>
+      </w:r>
+      <w:r>
+        <w:rPr>
+          <w:rFonts w:ascii="Times" w:eastAsiaTheme="minorEastAsia" w:hAnsi="Times" w:cs="Times"/>
+          <w:i/>
+          <w:sz w:val="24"/>
+          <w:szCs w:val="24"/>
+        </w:rPr>
+        <w:t>temp</w:t>
+      </w:r>
+      <w:r>
+        <w:rPr>
+          <w:rFonts w:ascii="Times" w:eastAsiaTheme="minorEastAsia" w:hAnsi="Times" w:cs="Times"/>
+          <w:sz w:val="24"/>
+          <w:szCs w:val="24"/>
+        </w:rPr>
+        <w:t xml:space="preserve"> do tipo double; e as demais do tipo long: </w:t>
+      </w:r>
+      <w:r>
+        <w:rPr>
+          <w:rFonts w:ascii="Times" w:eastAsiaTheme="minorEastAsia" w:hAnsi="Times" w:cs="Times"/>
+          <w:i/>
+          <w:sz w:val="24"/>
+          <w:szCs w:val="24"/>
+        </w:rPr>
+        <w:t xml:space="preserve">valor_maximo, posicao_esq </w:t>
+      </w:r>
+      <w:r>
+        <w:rPr>
+          <w:rFonts w:ascii="Times" w:eastAsiaTheme="minorEastAsia" w:hAnsi="Times" w:cs="Times"/>
+          <w:sz w:val="24"/>
+          <w:szCs w:val="24"/>
+        </w:rPr>
+        <w:t xml:space="preserve">e </w:t>
+      </w:r>
+      <w:r>
+        <w:rPr>
+          <w:rFonts w:ascii="Times" w:eastAsiaTheme="minorEastAsia" w:hAnsi="Times" w:cs="Times"/>
+          <w:i/>
+          <w:sz w:val="24"/>
+          <w:szCs w:val="24"/>
+        </w:rPr>
+        <w:t>posicao_dir</w:t>
+      </w:r>
+      <w:r>
+        <w:rPr>
+          <w:rFonts w:ascii="Times" w:eastAsiaTheme="minorEastAsia" w:hAnsi="Times" w:cs="Times"/>
+          <w:sz w:val="24"/>
+          <w:szCs w:val="24"/>
+        </w:rPr>
+        <w:t>.</w:t>
+      </w:r>
+      <w:r>
+        <w:rPr>
+          <w:rFonts w:ascii="Times" w:eastAsiaTheme="minorEastAsia" w:hAnsi="Times" w:cs="Times"/>
+          <w:sz w:val="24"/>
+          <w:szCs w:val="24"/>
+        </w:rPr>
+        <w:t xml:space="preserve"> A variável </w:t>
+      </w:r>
+      <w:r>
+        <w:rPr>
+          <w:rFonts w:ascii="Times" w:eastAsiaTheme="minorEastAsia" w:hAnsi="Times" w:cs="Times"/>
+          <w:i/>
+          <w:sz w:val="24"/>
+          <w:szCs w:val="24"/>
+        </w:rPr>
+        <w:t>valor_maximo</w:t>
+      </w:r>
+      <w:r>
+        <w:rPr>
+          <w:rFonts w:ascii="Times" w:eastAsiaTheme="minorEastAsia" w:hAnsi="Times" w:cs="Times"/>
+          <w:sz w:val="24"/>
+          <w:szCs w:val="24"/>
+        </w:rPr>
+        <w:t xml:space="preserve"> valerá </w:t>
+      </w:r>
+      <w:r>
+        <w:rPr>
+          <w:rFonts w:ascii="Times" w:eastAsiaTheme="minorEastAsia" w:hAnsi="Times" w:cs="Times"/>
+          <w:i/>
+          <w:sz w:val="24"/>
+          <w:szCs w:val="24"/>
+        </w:rPr>
+        <w:t>i</w:t>
+      </w:r>
+      <w:r>
+        <w:rPr>
+          <w:rFonts w:ascii="Times" w:eastAsiaTheme="minorEastAsia" w:hAnsi="Times" w:cs="Times"/>
+          <w:sz w:val="24"/>
+          <w:szCs w:val="24"/>
+        </w:rPr>
+        <w:t xml:space="preserve">, </w:t>
+      </w:r>
+      <w:r>
+        <w:rPr>
+          <w:rFonts w:ascii="Times" w:eastAsiaTheme="minorEastAsia" w:hAnsi="Times" w:cs="Times"/>
+          <w:i/>
+          <w:sz w:val="24"/>
+          <w:szCs w:val="24"/>
+        </w:rPr>
+        <w:t>posição_esq</w:t>
+      </w:r>
+      <w:r>
+        <w:rPr>
+          <w:rFonts w:ascii="Times" w:eastAsiaTheme="minorEastAsia" w:hAnsi="Times" w:cs="Times"/>
+          <w:sz w:val="24"/>
+          <w:szCs w:val="24"/>
+        </w:rPr>
+        <w:t xml:space="preserve"> valerá a equação </w:t>
+      </w:r>
+      <m:oMath>
+        <m:r>
+          <w:rPr>
+            <w:rFonts w:ascii="Cambria Math" w:eastAsiaTheme="minorEastAsia" w:hAnsi="Cambria Math" w:cs="Times"/>
+            <w:sz w:val="24"/>
+            <w:szCs w:val="24"/>
+          </w:rPr>
+          <m:t>2*i+1</m:t>
+        </m:r>
+      </m:oMath>
+      <w:r>
+        <w:rPr>
+          <w:rFonts w:ascii="Times" w:eastAsiaTheme="minorEastAsia" w:hAnsi="Times" w:cs="Times"/>
+          <w:sz w:val="24"/>
+          <w:szCs w:val="24"/>
+        </w:rPr>
+        <w:t xml:space="preserve"> e </w:t>
+      </w:r>
+      <w:r>
+        <w:rPr>
+          <w:rFonts w:ascii="Times" w:eastAsiaTheme="minorEastAsia" w:hAnsi="Times" w:cs="Times"/>
+          <w:i/>
+          <w:sz w:val="24"/>
+          <w:szCs w:val="24"/>
+        </w:rPr>
+        <w:t>posicao_dir</w:t>
+      </w:r>
+      <w:r>
+        <w:rPr>
+          <w:rFonts w:ascii="Times" w:eastAsiaTheme="minorEastAsia" w:hAnsi="Times" w:cs="Times"/>
+          <w:sz w:val="24"/>
+          <w:szCs w:val="24"/>
+        </w:rPr>
+        <w:t xml:space="preserve"> valerá a equação </w:t>
+      </w:r>
+      <m:oMath>
+        <m:r>
+          <w:rPr>
+            <w:rFonts w:ascii="Cambria Math" w:eastAsiaTheme="minorEastAsia" w:hAnsi="Cambria Math" w:cs="Times"/>
+            <w:sz w:val="24"/>
+            <w:szCs w:val="24"/>
+          </w:rPr>
+          <m:t>2*i+2</m:t>
+        </m:r>
+      </m:oMath>
+      <w:r>
+        <w:rPr>
+          <w:rFonts w:ascii="Times" w:eastAsiaTheme="minorEastAsia" w:hAnsi="Times" w:cs="Times"/>
+          <w:sz w:val="24"/>
+          <w:szCs w:val="24"/>
+        </w:rPr>
+        <w:t>.</w:t>
+      </w:r>
+      <w:r>
+        <w:rPr>
+          <w:rFonts w:ascii="Times" w:eastAsiaTheme="minorEastAsia" w:hAnsi="Times" w:cs="Times"/>
+          <w:sz w:val="24"/>
+          <w:szCs w:val="24"/>
+        </w:rPr>
+        <w:t xml:space="preserve"> Tais equações são necessárias para emergir a árvore, ou seja</w:t>
+      </w:r>
+      <w:r>
+        <w:rPr>
+          <w:rFonts w:ascii="Times" w:eastAsiaTheme="minorEastAsia" w:hAnsi="Times" w:cs="Times"/>
+          <w:sz w:val="24"/>
+          <w:szCs w:val="24"/>
+        </w:rPr>
+        <w:t>,</w:t>
+      </w:r>
+      <w:r>
+        <w:rPr>
+          <w:rFonts w:ascii="Times" w:eastAsiaTheme="minorEastAsia" w:hAnsi="Times" w:cs="Times"/>
+          <w:sz w:val="24"/>
+          <w:szCs w:val="24"/>
+        </w:rPr>
+        <w:t xml:space="preserve"> para estruturar as posições em ramificações da árvore.</w:t>
+      </w:r>
+    </w:p>
+    <w:p>
+      <w:pPr>
+        <w:pStyle w:val="NormalRelatorio"/>
+      </w:pPr>
+      <w:r>
+        <w:rPr>
+          <w:rFonts w:eastAsiaTheme="minorEastAsia"/>
+        </w:rPr>
+        <w:t>Dentre as condicionais conseguintes, a primeira condição checa se</w:t>
+      </w:r>
+      <w:r>
+        <w:t xml:space="preserve"> o valor da </w:t>
+      </w:r>
+      <w:r>
+        <w:rPr>
+          <w:i/>
+        </w:rPr>
+        <w:t>posicao_esq</w:t>
+      </w:r>
+      <w:r>
+        <w:t xml:space="preserve"> está dentro do array</w:t>
+      </w:r>
+      <w:r>
+        <w:t xml:space="preserve"> </w:t>
+      </w:r>
+      <w:r>
+        <w:t>(sendo menor que o tamanho deste array) e</w:t>
+      </w:r>
+      <w:r>
+        <w:t xml:space="preserve"> se</w:t>
+      </w:r>
+      <w:r>
+        <w:t xml:space="preserve"> tal </w:t>
+      </w:r>
+      <w:r>
+        <w:rPr>
+          <w:i/>
+        </w:rPr>
+        <w:t>posicao_esq</w:t>
+      </w:r>
+      <w:r>
+        <w:t xml:space="preserve"> nesse array (representado por </w:t>
+      </w:r>
+      <w:r>
+        <w:rPr>
+          <w:i/>
+        </w:rPr>
+        <w:t>arr</w:t>
+      </w:r>
+      <w:r>
+        <w:t>[</w:t>
+      </w:r>
+      <w:r>
+        <w:rPr>
+          <w:i/>
+        </w:rPr>
+        <w:t>posicao_esq</w:t>
+      </w:r>
+      <w:r>
+        <w:t>])</w:t>
+      </w:r>
+      <w:r>
+        <w:rPr>
+          <w:i/>
+        </w:rPr>
+        <w:t xml:space="preserve"> </w:t>
+      </w:r>
+      <w:r>
+        <w:t>for</w:t>
+      </w:r>
+      <w:r>
+        <w:t xml:space="preserve"> maior que</w:t>
+      </w:r>
+      <w:r>
+        <w:t xml:space="preserve"> </w:t>
+      </w:r>
+      <w:r>
+        <w:rPr>
+          <w:i/>
+        </w:rPr>
+        <w:t>valor_maximo</w:t>
+      </w:r>
+      <w:r>
+        <w:t xml:space="preserve"> nesse array (representado por </w:t>
+      </w:r>
+      <w:r>
+        <w:rPr>
+          <w:i/>
+        </w:rPr>
+        <w:t>arr</w:t>
+      </w:r>
+      <w:r>
+        <w:t>[</w:t>
+      </w:r>
+      <w:r>
+        <w:rPr>
+          <w:i/>
+        </w:rPr>
+        <w:t>valor_maximo</w:t>
+      </w:r>
+      <w:r>
+        <w:t xml:space="preserve">]). No fim, quando atendida, </w:t>
+      </w:r>
+      <w:r>
+        <w:rPr>
+          <w:i/>
+        </w:rPr>
+        <w:t>valor_maximo</w:t>
+      </w:r>
+      <w:r>
+        <w:t xml:space="preserve"> será o valor de </w:t>
+      </w:r>
+      <w:r>
+        <w:rPr>
+          <w:i/>
+        </w:rPr>
+        <w:t>posicao_esq</w:t>
+      </w:r>
+      <w:r>
+        <w:t>.</w:t>
+      </w:r>
+    </w:p>
+    <w:p>
+      <w:pPr>
+        <w:pStyle w:val="NormalRelatorio"/>
+      </w:pPr>
+      <w:r>
+        <w:rPr>
+          <w:rFonts w:eastAsiaTheme="minorEastAsia"/>
+        </w:rPr>
+        <w:t>Prosseguindo, a segunda condição checa se</w:t>
+      </w:r>
+      <w:r>
+        <w:t xml:space="preserve"> o valor da </w:t>
+      </w:r>
+      <w:r>
+        <w:rPr>
+          <w:i/>
+        </w:rPr>
+        <w:t>posicao_</w:t>
+      </w:r>
+      <w:r>
+        <w:rPr>
+          <w:i/>
+        </w:rPr>
+        <w:t>dir</w:t>
+      </w:r>
+      <w:r>
+        <w:t xml:space="preserve"> está dentro do array (sendo menor que o tamanho deste array) e se tal </w:t>
+      </w:r>
+      <w:r>
+        <w:rPr>
+          <w:i/>
+        </w:rPr>
+        <w:t>posicao_</w:t>
+      </w:r>
+      <w:r>
+        <w:rPr>
+          <w:i/>
+        </w:rPr>
+        <w:t>dir</w:t>
+      </w:r>
+      <w:r>
+        <w:t xml:space="preserve"> nesse array (representado por </w:t>
+      </w:r>
+      <w:r>
+        <w:rPr>
+          <w:i/>
+        </w:rPr>
+        <w:t>arr</w:t>
+      </w:r>
+      <w:r>
+        <w:t>[</w:t>
+      </w:r>
+      <w:r>
+        <w:rPr>
+          <w:i/>
+        </w:rPr>
+        <w:t>posicao_</w:t>
+      </w:r>
+      <w:r>
+        <w:rPr>
+          <w:i/>
+        </w:rPr>
+        <w:t>dir</w:t>
+      </w:r>
+      <w:r>
+        <w:t>])</w:t>
+      </w:r>
+      <w:r>
+        <w:rPr>
+          <w:i/>
+        </w:rPr>
+        <w:t xml:space="preserve"> </w:t>
+      </w:r>
+      <w:r>
+        <w:t>for</w:t>
+      </w:r>
+      <w:r>
+        <w:t xml:space="preserve"> maior que </w:t>
+      </w:r>
+      <w:r>
+        <w:rPr>
+          <w:i/>
+        </w:rPr>
+        <w:t>valor_maximo</w:t>
+      </w:r>
+      <w:r>
+        <w:t xml:space="preserve"> nesse array (representado por </w:t>
+      </w:r>
+      <w:r>
+        <w:rPr>
+          <w:i/>
+        </w:rPr>
+        <w:t>arr</w:t>
+      </w:r>
+      <w:r>
+        <w:t>[</w:t>
+      </w:r>
+      <w:r>
+        <w:rPr>
+          <w:i/>
+        </w:rPr>
+        <w:t>valor_maximo</w:t>
+      </w:r>
+      <w:r>
+        <w:t xml:space="preserve">]). No fim, quando atendida, </w:t>
+      </w:r>
+      <w:r>
+        <w:rPr>
+          <w:i/>
+        </w:rPr>
+        <w:t>valor_maximo</w:t>
+      </w:r>
+      <w:r>
+        <w:t xml:space="preserve"> será o valor de </w:t>
+      </w:r>
+      <w:r>
+        <w:rPr>
+          <w:i/>
+        </w:rPr>
+        <w:t>posicao_</w:t>
+      </w:r>
+      <w:r>
+        <w:rPr>
+          <w:i/>
+        </w:rPr>
+        <w:t>dir</w:t>
+      </w:r>
+      <w:r>
+        <w:t>.</w:t>
+      </w:r>
+    </w:p>
+    <w:p>
+      <w:pPr>
+        <w:pStyle w:val="NormalRelatorio"/>
+      </w:pPr>
+      <w:r>
+        <w:t xml:space="preserve">Por último, </w:t>
+      </w:r>
+      <w:r>
+        <w:rPr>
+          <w:rFonts w:eastAsiaTheme="minorEastAsia"/>
+        </w:rPr>
+        <w:t xml:space="preserve">a última condição checa se </w:t>
+      </w:r>
+      <w:r>
+        <w:rPr>
+          <w:rFonts w:eastAsiaTheme="minorEastAsia"/>
+          <w:i/>
+        </w:rPr>
+        <w:t>valor_maximo</w:t>
+      </w:r>
+      <w:r>
+        <w:rPr>
+          <w:rFonts w:eastAsiaTheme="minorEastAsia"/>
+        </w:rPr>
+        <w:t xml:space="preserve"> é diferente d</w:t>
+      </w:r>
+      <w:r>
+        <w:rPr>
+          <w:rFonts w:eastAsiaTheme="minorEastAsia"/>
+        </w:rPr>
+        <w:t>a</w:t>
+      </w:r>
+      <w:r>
+        <w:rPr>
+          <w:rFonts w:eastAsiaTheme="minorEastAsia"/>
+        </w:rPr>
+        <w:t xml:space="preserve"> posição </w:t>
+      </w:r>
+      <m:oMath>
+        <m:r>
+          <w:rPr>
+            <w:rFonts w:ascii="Cambria Math" w:eastAsiaTheme="minorEastAsia" w:hAnsi="Cambria Math"/>
+          </w:rPr>
+          <m:t>i</m:t>
+        </m:r>
+      </m:oMath>
+      <w:r>
+        <w:t>, em outras palavras, se o valor da a raiz nao for o maior elemento(valor_maximo), prosseguir com swap(alternancia) e heapify(filtragem).</w:t>
+      </w:r>
+      <w:r>
+        <w:t xml:space="preserve"> </w:t>
+      </w:r>
+      <w:r>
+        <w:t xml:space="preserve">No fim, quando atendida, </w:t>
+      </w:r>
+      <w:r>
+        <w:rPr>
+          <w:i/>
+        </w:rPr>
+        <w:t>temp</w:t>
+      </w:r>
+      <w:r>
+        <w:t xml:space="preserve"> valerá uma determinada posição nesse array (representada por </w:t>
+      </w:r>
+      <w:r>
+        <w:rPr>
+          <w:i/>
+        </w:rPr>
+        <w:t>arr</w:t>
+      </w:r>
+      <w:r>
+        <w:t>[</w:t>
+      </w:r>
+      <m:oMath>
+        <m:r>
+          <w:rPr>
+            <w:rFonts w:ascii="Cambria Math" w:hAnsi="Cambria Math"/>
+          </w:rPr>
+          <m:t>i</m:t>
+        </m:r>
+      </m:oMath>
+      <w:r>
+        <w:t xml:space="preserve">]), e o procedimento de </w:t>
+      </w:r>
+      <w:r>
+        <w:rPr>
+          <w:i/>
+        </w:rPr>
+        <w:t>swap</w:t>
+      </w:r>
+      <w:r>
+        <w:t xml:space="preserve"> é executado considerando os endereços de </w:t>
+      </w:r>
+      <w:r>
+        <w:rPr>
+          <w:i/>
+        </w:rPr>
+        <w:t>arr</w:t>
+      </w:r>
+      <w:r>
+        <w:t>[</w:t>
+      </w:r>
+      <m:oMath>
+        <m:r>
+          <w:rPr>
+            <w:rFonts w:ascii="Cambria Math" w:hAnsi="Cambria Math"/>
+          </w:rPr>
+          <m:t>i</m:t>
+        </m:r>
+      </m:oMath>
+      <w:r>
+        <w:t xml:space="preserve">] e </w:t>
+      </w:r>
+      <w:r>
+        <w:rPr>
+          <w:i/>
+        </w:rPr>
+        <w:t>arr</w:t>
+      </w:r>
+      <w:r>
+        <w:t>[</w:t>
+      </w:r>
+      <w:r>
+        <w:rPr>
+          <w:rFonts w:eastAsiaTheme="minorEastAsia"/>
+          <w:i/>
+        </w:rPr>
+        <w:t>valor_maximo</w:t>
+      </w:r>
+      <w:r>
+        <w:t>], representado por:</w:t>
+      </w:r>
+      <w:r>
+        <w:t xml:space="preserve"> </w:t>
+      </w:r>
+      <w:r>
+        <w:t>&amp;</w:t>
+      </w:r>
+      <w:r>
+        <w:rPr>
+          <w:i/>
+        </w:rPr>
+        <w:t>arr</w:t>
+      </w:r>
+      <w:r>
+        <w:t>[</w:t>
+      </w:r>
+      <m:oMath>
+        <m:r>
+          <w:rPr>
+            <w:rFonts w:ascii="Cambria Math" w:hAnsi="Cambria Math"/>
+          </w:rPr>
+          <m:t>i</m:t>
+        </m:r>
+      </m:oMath>
+      <w:r>
+        <w:t>] e &amp;</w:t>
+      </w:r>
+      <w:r>
+        <w:rPr>
+          <w:i/>
+        </w:rPr>
+        <w:t>arr</w:t>
+      </w:r>
+      <w:r>
+        <w:t>[</w:t>
+      </w:r>
+      <w:r>
+        <w:rPr>
+          <w:rFonts w:eastAsiaTheme="minorEastAsia"/>
+          <w:i/>
+        </w:rPr>
+        <w:t>valor_maximo</w:t>
+      </w:r>
+      <w:r>
+        <w:t>].</w:t>
+      </w:r>
+      <w:r>
+        <w:t xml:space="preserve"> Em seguida, após alternar os valores dos endereços de </w:t>
+      </w:r>
+      <w:r>
+        <w:rPr>
+          <w:i/>
+        </w:rPr>
+        <w:t>arr</w:t>
+      </w:r>
+      <w:r>
+        <w:t>[</w:t>
+      </w:r>
+      <m:oMath>
+        <m:r>
+          <w:rPr>
+            <w:rFonts w:ascii="Cambria Math" w:hAnsi="Cambria Math"/>
+          </w:rPr>
+          <m:t>i</m:t>
+        </m:r>
+      </m:oMath>
+      <w:r>
+        <w:t xml:space="preserve">] e </w:t>
+      </w:r>
+      <w:r>
+        <w:rPr>
+          <w:i/>
+        </w:rPr>
+        <w:t>arr</w:t>
+      </w:r>
+      <w:r>
+        <w:t>[</w:t>
+      </w:r>
+      <w:r>
+        <w:rPr>
+          <w:rFonts w:eastAsiaTheme="minorEastAsia"/>
+          <w:i/>
+        </w:rPr>
+        <w:t>valor_maximo</w:t>
+      </w:r>
+      <w:r>
+        <w:t xml:space="preserve">], </w:t>
+      </w:r>
+      <w:r>
+        <w:t>o procedimento</w:t>
+      </w:r>
+      <w:r>
+        <w:t xml:space="preserve"> recursivo</w:t>
+      </w:r>
+      <w:r>
+        <w:t xml:space="preserve"> </w:t>
+      </w:r>
+      <w:r>
+        <w:rPr>
+          <w:i/>
+        </w:rPr>
+        <w:t>heapify</w:t>
+      </w:r>
+      <w:r>
+        <w:t>(</w:t>
+      </w:r>
+      <w:r>
+        <w:rPr>
+          <w:i/>
+        </w:rPr>
+        <w:t>arr, n, valor_maximo</w:t>
+      </w:r>
+      <w:r>
+        <w:t>)</w:t>
+      </w:r>
+      <w:r>
+        <w:t xml:space="preserve"> vai receber: </w:t>
+      </w:r>
+      <w:r>
+        <w:t>o array</w:t>
+      </w:r>
+      <w:r>
+        <w:t xml:space="preserve"> </w:t>
+      </w:r>
+      <m:oMath>
+        <m:r>
+          <w:rPr>
+            <w:rFonts w:ascii="Cambria Math" w:hAnsi="Cambria Math"/>
+          </w:rPr>
+          <m:t>arr</m:t>
+        </m:r>
+      </m:oMath>
+      <w:r>
+        <w:t>, o seu tamanho</w:t>
+      </w:r>
+      <w:r>
+        <w:t xml:space="preserve"> </w:t>
+      </w:r>
+      <m:oMath>
+        <m:r>
+          <w:rPr>
+            <w:rFonts w:ascii="Cambria Math" w:hAnsi="Cambria Math"/>
+          </w:rPr>
+          <m:t>n</m:t>
+        </m:r>
+      </m:oMath>
+      <w:r>
+        <w:t xml:space="preserve"> e </w:t>
+      </w:r>
+      <w:r>
+        <w:t>o valor do elemento-</w:t>
+      </w:r>
+      <w:r>
+        <w:t xml:space="preserve">raiz </w:t>
+      </w:r>
+      <w:r>
+        <w:t xml:space="preserve">em </w:t>
+      </w:r>
+      <w:r>
+        <w:rPr>
+          <w:i/>
+        </w:rPr>
+        <w:t>valor</w:t>
+      </w:r>
+      <w:r>
+        <w:rPr>
+          <w:i/>
+        </w:rPr>
+        <w:t>_maximo</w:t>
+      </w:r>
+      <w:r>
+        <w:t>. Finalmente, o</w:t>
+      </w:r>
+      <w:r>
+        <w:t xml:space="preserve"> </w:t>
+      </w:r>
+      <w:r>
+        <w:lastRenderedPageBreak/>
+        <w:t xml:space="preserve">chamado recursivo de </w:t>
+      </w:r>
+      <w:r>
+        <w:rPr>
+          <w:i/>
+        </w:rPr>
+        <w:t>heapify</w:t>
+      </w:r>
+      <w:r>
+        <w:t>(</w:t>
+      </w:r>
+      <w:r>
+        <w:rPr>
+          <w:i/>
+        </w:rPr>
+        <w:t>arr, n, valor_maximo</w:t>
+      </w:r>
+      <w:r>
+        <w:t>)</w:t>
+      </w:r>
+      <w:r>
+        <w:t xml:space="preserve"> </w:t>
+      </w:r>
+      <w:r>
+        <w:t>utilizará tais parâmetros para reestruturar o heap</w:t>
+      </w:r>
+      <w:r>
+        <w:t>,</w:t>
+      </w:r>
+      <w:r>
+        <w:t xml:space="preserve"> quando necessário.</w:t>
+      </w:r>
+      <w:r>
+        <w:t xml:space="preserve"> Podendo ser implementado</w:t>
+      </w:r>
+      <w:r>
+        <w:t xml:space="preserve"> através</w:t>
+      </w:r>
+      <w:r>
+        <w:t xml:space="preserve"> deste formato:</w:t>
+      </w:r>
+    </w:p>
+    <w:p>
+      <w:pPr>
+        <w:pStyle w:val="Codigo"/>
+      </w:pPr>
+      <w:r>
+        <w:t>//funcao da filtragem(heapify)</w:t>
+      </w:r>
+    </w:p>
+    <w:p>
+      <w:pPr>
+        <w:pStyle w:val="Codigo"/>
+      </w:pPr>
+      <w:r>
+        <w:t>void heapify(double* arr, long n, long i)</w:t>
+      </w:r>
+    </w:p>
+    <w:p>
+      <w:pPr>
+        <w:pStyle w:val="Codigo"/>
+      </w:pPr>
+      <w:r>
+        <w:t>{</w:t>
+      </w:r>
+    </w:p>
+    <w:p>
+      <w:pPr>
+        <w:pStyle w:val="Codigo"/>
+      </w:pPr>
+      <w:r>
+        <w:t xml:space="preserve">    //arr eh o array</w:t>
+      </w:r>
+    </w:p>
+    <w:p>
+      <w:pPr>
+        <w:pStyle w:val="Codigo"/>
+      </w:pPr>
+      <w:r>
+        <w:t xml:space="preserve">    //i eh a posicao</w:t>
+      </w:r>
+    </w:p>
+    <w:p>
+      <w:pPr>
+        <w:pStyle w:val="Codigo"/>
+      </w:pPr>
+      <w:r>
+        <w:t xml:space="preserve">    //n eh a enesima posicao(tamanho do array/qntde de elementos no array)</w:t>
+      </w:r>
+    </w:p>
+    <w:p>
+      <w:pPr>
+        <w:pStyle w:val="Codigo"/>
+      </w:pPr>
+    </w:p>
+    <w:p>
+      <w:pPr>
+        <w:pStyle w:val="Codigo"/>
+      </w:pPr>
+      <w:r>
+        <w:t xml:space="preserve">    //encontrando o maior valor(valor_maximo) entre a raiz, posicao_esq e posicao_dir</w:t>
+      </w:r>
+    </w:p>
+    <w:p>
+      <w:pPr>
+        <w:pStyle w:val="Codigo"/>
+      </w:pPr>
+      <w:r>
+        <w:t xml:space="preserve">    double temp;</w:t>
+      </w:r>
+    </w:p>
+    <w:p>
+      <w:pPr>
+        <w:pStyle w:val="Codigo"/>
+      </w:pPr>
+      <w:r>
+        <w:t xml:space="preserve">    long valor_maximo, posicao_esq, posicao_dir;</w:t>
+      </w:r>
+    </w:p>
+    <w:p>
+      <w:pPr>
+        <w:pStyle w:val="Codigo"/>
+      </w:pPr>
+    </w:p>
+    <w:p>
+      <w:pPr>
+        <w:pStyle w:val="Codigo"/>
+      </w:pPr>
+      <w:r>
+        <w:t xml:space="preserve">    valor_maximo = i;</w:t>
+      </w:r>
+    </w:p>
+    <w:p>
+      <w:pPr>
+        <w:pStyle w:val="Codigo"/>
+      </w:pPr>
+      <w:r>
+        <w:t xml:space="preserve">    posicao_esq = 2 * i + 1;</w:t>
+      </w:r>
+    </w:p>
+    <w:p>
+      <w:pPr>
+        <w:pStyle w:val="Codigo"/>
+      </w:pPr>
+      <w:r>
+        <w:t xml:space="preserve">    posicao_dir = 2 * i + 2;</w:t>
+      </w:r>
+    </w:p>
+    <w:p>
+      <w:pPr>
+        <w:pStyle w:val="Codigo"/>
+      </w:pPr>
+    </w:p>
+    <w:p>
+      <w:pPr>
+        <w:pStyle w:val="Codigo"/>
+      </w:pPr>
+      <w:r>
+        <w:t xml:space="preserve">    //se o valor da posicao_esq existir/for menor que o tamanho do array(enesima posicao)</w:t>
+      </w:r>
+    </w:p>
+    <w:p>
+      <w:pPr>
+        <w:pStyle w:val="Codigo"/>
+      </w:pPr>
+      <w:r>
+        <w:t xml:space="preserve">    //e for maior que a raiz do array</w:t>
+      </w:r>
+    </w:p>
+    <w:p>
+      <w:pPr>
+        <w:pStyle w:val="Codigo"/>
+      </w:pPr>
+      <w:r>
+        <w:t xml:space="preserve">    if (posicao_esq &lt; n &amp;&amp; arr[posicao_esq] &gt; arr[valor_maximo])</w:t>
+      </w:r>
+    </w:p>
+    <w:p>
+      <w:pPr>
+        <w:pStyle w:val="Codigo"/>
+      </w:pPr>
+    </w:p>
+    <w:p>
+      <w:pPr>
+        <w:pStyle w:val="Codigo"/>
+      </w:pPr>
+      <w:r>
+        <w:t xml:space="preserve">        //a raiz da arvore sera atualizada pelo valor da posicao_esq</w:t>
+      </w:r>
+    </w:p>
+    <w:p>
+      <w:pPr>
+        <w:pStyle w:val="Codigo"/>
+      </w:pPr>
+      <w:r>
+        <w:t xml:space="preserve">        valor_maximo = posicao_esq;</w:t>
+      </w:r>
+    </w:p>
+    <w:p>
+      <w:pPr>
+        <w:pStyle w:val="Codigo"/>
+      </w:pPr>
+    </w:p>
+    <w:p>
+      <w:pPr>
+        <w:pStyle w:val="Codigo"/>
+      </w:pPr>
+      <w:r>
+        <w:t xml:space="preserve">    //se o valor da posicao_dir existir/for menor que enesima posicao/o tamanho do array</w:t>
+      </w:r>
+    </w:p>
+    <w:p>
+      <w:pPr>
+        <w:pStyle w:val="Codigo"/>
+      </w:pPr>
+      <w:r>
+        <w:t xml:space="preserve">    //e for maior que a raiz do array</w:t>
+      </w:r>
+    </w:p>
+    <w:p>
+      <w:pPr>
+        <w:pStyle w:val="Codigo"/>
+      </w:pPr>
+      <w:r>
+        <w:t xml:space="preserve">    if (posicao_dir &lt; n &amp;&amp; arr[posicao_dir] &gt; arr[valor_maximo])</w:t>
+      </w:r>
+    </w:p>
+    <w:p>
+      <w:pPr>
+        <w:pStyle w:val="Codigo"/>
+      </w:pPr>
+    </w:p>
+    <w:p>
+      <w:pPr>
+        <w:pStyle w:val="Codigo"/>
+      </w:pPr>
+      <w:r>
+        <w:lastRenderedPageBreak/>
+        <w:t xml:space="preserve">        //a raiz da arvore sera atualizada pelo valor da posicao_dir</w:t>
+      </w:r>
+    </w:p>
+    <w:p>
+      <w:pPr>
+        <w:pStyle w:val="Codigo"/>
+      </w:pPr>
+      <w:r>
+        <w:t xml:space="preserve">        valor_maximo = posicao_dir;</w:t>
+      </w:r>
+    </w:p>
+    <w:p>
+      <w:pPr>
+        <w:pStyle w:val="Codigo"/>
+      </w:pPr>
+    </w:p>
+    <w:p>
+      <w:pPr>
+        <w:pStyle w:val="Codigo"/>
+      </w:pPr>
+      <w:r>
+        <w:t xml:space="preserve">    //se a raiz nao for o maior elemento(valor_maximo), prosseguir com swap(alternancia) e heapify(filtragem).</w:t>
+      </w:r>
+    </w:p>
+    <w:p>
+      <w:pPr>
+        <w:pStyle w:val="Codigo"/>
+      </w:pPr>
+      <w:r>
+        <w:t xml:space="preserve">    if (valor_maximo != i) {</w:t>
+      </w:r>
+    </w:p>
+    <w:p>
+      <w:pPr>
+        <w:pStyle w:val="Codigo"/>
+      </w:pPr>
+    </w:p>
+    <w:p>
+      <w:pPr>
+        <w:pStyle w:val="Codigo"/>
+      </w:pPr>
+      <w:r>
+        <w:t xml:space="preserve">        //temp valera uma determinada posicao do array</w:t>
+      </w:r>
+    </w:p>
+    <w:p>
+      <w:pPr>
+        <w:pStyle w:val="Codigo"/>
+      </w:pPr>
+      <w:r>
+        <w:t xml:space="preserve">        temp = arr[i];</w:t>
+      </w:r>
+    </w:p>
+    <w:p>
+      <w:pPr>
+        <w:pStyle w:val="Codigo"/>
+      </w:pPr>
+    </w:p>
+    <w:p>
+      <w:pPr>
+        <w:pStyle w:val="Codigo"/>
+      </w:pPr>
+      <w:r>
+        <w:t xml:space="preserve">        //alternara essa determinada posicao do array com a raiz</w:t>
+      </w:r>
+    </w:p>
+    <w:p>
+      <w:pPr>
+        <w:pStyle w:val="Codigo"/>
+      </w:pPr>
+      <w:r>
+        <w:t xml:space="preserve">        swap(&amp;arr[i], &amp;arr[valor_maximo]);</w:t>
+      </w:r>
+    </w:p>
+    <w:p>
+      <w:pPr>
+        <w:pStyle w:val="Codigo"/>
+      </w:pPr>
+    </w:p>
+    <w:p>
+      <w:pPr>
+        <w:pStyle w:val="Codigo"/>
+      </w:pPr>
+      <w:r>
+        <w:t xml:space="preserve">        //e passara o array, o seu tamanho e raiz para filtrar</w:t>
+      </w:r>
+    </w:p>
+    <w:p>
+      <w:pPr>
+        <w:pStyle w:val="Codigo"/>
+      </w:pPr>
+      <w:r>
+        <w:t xml:space="preserve">        heapify(arr, n, valor_maximo);</w:t>
+      </w:r>
+    </w:p>
+    <w:p>
+      <w:pPr>
+        <w:pStyle w:val="Codigo"/>
+      </w:pPr>
+      <w:r>
+        <w:t xml:space="preserve">    }</w:t>
+      </w:r>
+    </w:p>
+    <w:p>
+      <w:pPr>
+        <w:pStyle w:val="Codigo"/>
+      </w:pPr>
+      <w:r>
+        <w:t>}</w:t>
+      </w:r>
+    </w:p>
+    <w:p>
+      <w:pPr>
+        <w:pStyle w:val="Titulo4Relatorio"/>
+      </w:pPr>
+      <w:r>
+        <w:t>HEAPSORT</w:t>
+      </w:r>
+    </w:p>
+    <w:p>
+      <w:pPr>
+        <w:pStyle w:val="NormalRelatorio"/>
+      </w:pPr>
+      <w:r>
+        <w:t>sdfsfs</w:t>
+      </w:r>
+    </w:p>
+    <w:p>
+      <w:pPr>
+        <w:jc w:val="both"/>
         <w:rPr>
           <w:rFonts w:ascii="Times" w:hAnsi="Times" w:cs="Times"/>
           <w:sz w:val="20"/>
@@ -8914,53 +10318,13 @@
     </w:p>
     <w:p>
       <w:pPr>
-        <w:jc w:val="both"/>
-        <w:rPr>
-          <w:rFonts w:ascii="Times" w:hAnsi="Times" w:cs="Times"/>
-          <w:sz w:val="20"/>
-          <w:szCs w:val="24"/>
-        </w:rPr>
-      </w:pPr>
-    </w:p>
-    <w:p>
-      <w:pPr>
-        <w:jc w:val="both"/>
-        <w:rPr>
-          <w:rFonts w:ascii="Times" w:hAnsi="Times" w:cs="Times"/>
-          <w:sz w:val="20"/>
-          <w:szCs w:val="24"/>
-        </w:rPr>
-      </w:pPr>
-    </w:p>
-    <w:p>
-      <w:pPr>
-        <w:jc w:val="both"/>
-        <w:rPr>
-          <w:rFonts w:ascii="Times" w:hAnsi="Times" w:cs="Times"/>
-          <w:sz w:val="20"/>
-          <w:szCs w:val="24"/>
-        </w:rPr>
-      </w:pPr>
-    </w:p>
-    <w:p>
-      <w:pPr>
-        <w:jc w:val="both"/>
-        <w:rPr>
-          <w:rFonts w:ascii="Times" w:hAnsi="Times" w:cs="Times"/>
-          <w:sz w:val="20"/>
-          <w:szCs w:val="24"/>
-        </w:rPr>
-      </w:pPr>
-    </w:p>
-    <w:p>
-      <w:pPr>
         <w:pStyle w:val="Titulo2Relatorio"/>
       </w:pPr>
-      <w:bookmarkStart w:id="19" w:name="_Toc200142130"/>
+      <w:bookmarkStart w:id="15" w:name="_Toc200230221"/>
       <w:r>
         <w:t>Tabelas e/ou gráficos deverão ser utilizados para apresentação dos resultados dos testes.</w:t>
       </w:r>
-      <w:bookmarkEnd w:id="19"/>
+      <w:bookmarkEnd w:id="15"/>
       <w:r>
         <w:t xml:space="preserve"> </w:t>
       </w:r>
@@ -8975,7 +10339,7 @@
           <w:szCs w:val="24"/>
         </w:rPr>
       </w:pPr>
-      <w:bookmarkStart w:id="20" w:name="_Toc200142131"/>
+      <w:bookmarkStart w:id="16" w:name="_Toc200230222"/>
       <w:r>
         <w:rPr>
           <w:rFonts w:ascii="Times" w:hAnsi="Times" w:cs="Times"/>
@@ -8984,7 +10348,7 @@
         </w:rPr>
         <w:t>Incluir detalhes da configuração do computador usado para testes: sistema Operacional, quantidade de RAM, velocidade da CPU (Hz).</w:t>
       </w:r>
-      <w:bookmarkEnd w:id="20"/>
+      <w:bookmarkEnd w:id="16"/>
     </w:p>
     <w:p>
       <w:pPr>
@@ -8994,6 +10358,9 @@
         <w:t xml:space="preserve">Dentre </w:t>
       </w:r>
       <w:r>
+        <w:t>a</w:t>
+      </w:r>
+      <w:r>
         <w:t xml:space="preserve">s configurações do computador utilizado </w:t>
       </w:r>
       <w:r>
@@ -9013,11 +10380,11 @@
       <w:pPr>
         <w:pStyle w:val="Ttulo3"/>
       </w:pPr>
-      <w:bookmarkStart w:id="21" w:name="_Toc200142132"/>
+      <w:bookmarkStart w:id="17" w:name="_Toc200230223"/>
       <w:r>
         <w:t>Sistema Operacional</w:t>
       </w:r>
-      <w:bookmarkEnd w:id="21"/>
+      <w:bookmarkEnd w:id="17"/>
     </w:p>
     <w:p/>
     <w:p>
@@ -9033,6 +10400,7 @@
           <w:szCs w:val="24"/>
           <w:lang w:eastAsia="pt-BR"/>
         </w:rPr>
+        <w:lastRenderedPageBreak/>
         <w:drawing>
           <wp:inline distT="0" distB="0" distL="0" distR="0">
             <wp:extent cx="5731510" cy="3074670"/>
@@ -9102,15 +10470,14 @@
           <w:rFonts w:eastAsiaTheme="minorEastAsia"/>
         </w:rPr>
       </w:pPr>
-      <w:bookmarkStart w:id="22" w:name="_Toc200142133"/>
+      <w:bookmarkStart w:id="18" w:name="_Toc200230224"/>
       <w:r>
         <w:rPr>
           <w:rFonts w:eastAsiaTheme="minorEastAsia"/>
         </w:rPr>
-        <w:lastRenderedPageBreak/>
         <w:t>RAM</w:t>
       </w:r>
-      <w:bookmarkEnd w:id="22"/>
+      <w:bookmarkEnd w:id="18"/>
     </w:p>
     <w:p>
       <w:pPr>
@@ -9202,7 +10569,7 @@
           <w:szCs w:val="24"/>
         </w:rPr>
       </w:pPr>
-      <w:bookmarkStart w:id="23" w:name="_Toc200142134"/>
+      <w:bookmarkStart w:id="19" w:name="_Toc200230225"/>
       <w:r>
         <w:rPr>
           <w:rFonts w:ascii="Times" w:hAnsi="Times" w:cs="Times"/>
@@ -9211,7 +10578,7 @@
         </w:rPr>
         <w:t>Conclusão</w:t>
       </w:r>
-      <w:bookmarkEnd w:id="23"/>
+      <w:bookmarkEnd w:id="19"/>
     </w:p>
     <w:p>
       <w:pPr>
@@ -9223,7 +10590,7 @@
           <w:szCs w:val="24"/>
         </w:rPr>
       </w:pPr>
-      <w:bookmarkStart w:id="24" w:name="_Toc200142135"/>
+      <w:bookmarkStart w:id="20" w:name="_Toc200230226"/>
       <w:r>
         <w:rPr>
           <w:rFonts w:ascii="Times" w:hAnsi="Times" w:cs="Times"/>
@@ -9232,7 +10599,7 @@
         </w:rPr>
         <w:t>Analisar os pontos fortes e fracos do algoritmo em comparação com outros algoritmos.</w:t>
       </w:r>
-      <w:bookmarkEnd w:id="24"/>
+      <w:bookmarkEnd w:id="20"/>
       <w:r>
         <w:rPr>
           <w:rFonts w:ascii="Times" w:hAnsi="Times" w:cs="Times"/>
@@ -9279,16 +10646,17 @@
           <w:szCs w:val="24"/>
         </w:rPr>
       </w:pPr>
-      <w:bookmarkStart w:id="25" w:name="_Toc200142136"/>
-      <w:r>
-        <w:rPr>
-          <w:rFonts w:ascii="Times" w:hAnsi="Times" w:cs="Times"/>
-          <w:sz w:val="24"/>
-          <w:szCs w:val="24"/>
-        </w:rPr>
+      <w:bookmarkStart w:id="21" w:name="_Toc200230227"/>
+      <w:r>
+        <w:rPr>
+          <w:rFonts w:ascii="Times" w:hAnsi="Times" w:cs="Times"/>
+          <w:sz w:val="24"/>
+          <w:szCs w:val="24"/>
+        </w:rPr>
+        <w:lastRenderedPageBreak/>
         <w:t>Avaliar o desempenho do algoritmo em comparação com a implementação do Quicksort disponível na linguagem C.</w:t>
       </w:r>
-      <w:bookmarkEnd w:id="25"/>
+      <w:bookmarkEnd w:id="21"/>
     </w:p>
     <w:p/>
     <w:p>
@@ -9297,7 +10665,6 @@
           <w:noProof/>
           <w:lang w:eastAsia="pt-BR"/>
         </w:rPr>
-        <w:lastRenderedPageBreak/>
         <w:drawing>
           <wp:inline distT="0" distB="0" distL="0" distR="0">
             <wp:extent cx="4458087" cy="3795089"/>
@@ -9441,7 +10808,7 @@
           <w:szCs w:val="24"/>
         </w:rPr>
       </w:pPr>
-      <w:bookmarkStart w:id="26" w:name="_Toc200142137"/>
+      <w:bookmarkStart w:id="22" w:name="_Toc200230228"/>
       <w:r>
         <w:rPr>
           <w:rFonts w:ascii="Times" w:hAnsi="Times" w:cs="Times"/>
@@ -9450,7 +10817,7 @@
         </w:rPr>
         <w:t>Referências</w:t>
       </w:r>
-      <w:bookmarkEnd w:id="26"/>
+      <w:bookmarkEnd w:id="22"/>
     </w:p>
     <w:p>
       <w:pPr>
@@ -9606,17 +10973,67 @@
           <w:szCs w:val="24"/>
         </w:rPr>
       </w:pPr>
-      <w:r>
-        <w:rPr>
-          <w:rFonts w:ascii="Times" w:hAnsi="Times" w:cs="Times"/>
-          <w:sz w:val="24"/>
-          <w:szCs w:val="24"/>
-        </w:rPr>
-        <w:t>https://www.overleaf.com/read/pgbjkmsbdkkc#1725d7</w:t>
-      </w:r>
+      <w:hyperlink r:id="rId19" w:anchor="1725d7" w:history="1">
+        <w:r>
+          <w:rPr>
+            <w:rStyle w:val="Hyperlink"/>
+            <w:rFonts w:ascii="Times" w:hAnsi="Times" w:cs="Times"/>
+            <w:sz w:val="24"/>
+            <w:szCs w:val="24"/>
+          </w:rPr>
+          <w:t>https://www.overleaf.com/read/pgbjkmsbdkkc#1725d7</w:t>
+        </w:r>
+      </w:hyperlink>
+    </w:p>
+    <w:p>
+      <w:pPr>
+        <w:pStyle w:val="PargrafodaLista"/>
+        <w:jc w:val="both"/>
+      </w:pPr>
+      <w:hyperlink r:id="rId20" w:anchor="C" w:history="1">
+        <w:r>
+          <w:rPr>
+            <w:rStyle w:val="Hyperlink"/>
+          </w:rPr>
+          <w:t>Sorting algorithms/Heapsort - Rosetta Code</w:t>
+        </w:r>
+      </w:hyperlink>
+    </w:p>
+    <w:p>
+      <w:pPr>
+        <w:pStyle w:val="PargrafodaLista"/>
+        <w:jc w:val="both"/>
+      </w:pPr>
+      <w:hyperlink r:id="rId21" w:history="1">
+        <w:r>
+          <w:rPr>
+            <w:rStyle w:val="Hyperlink"/>
+          </w:rPr>
+          <w:t>Heapsort algorithm: correctness and performance analysis</w:t>
+        </w:r>
+      </w:hyperlink>
+    </w:p>
+    <w:p>
+      <w:pPr>
+        <w:pStyle w:val="PargrafodaLista"/>
+        <w:jc w:val="both"/>
+        <w:rPr>
+          <w:rFonts w:ascii="Times" w:hAnsi="Times" w:cs="Times"/>
+          <w:sz w:val="24"/>
+          <w:szCs w:val="24"/>
+        </w:rPr>
+      </w:pPr>
+      <w:hyperlink r:id="rId22" w:history="1">
+        <w:r>
+          <w:rPr>
+            <w:rStyle w:val="Hyperlink"/>
+          </w:rPr>
+          <w:t>AEDS2.13 Heapsort.pdf</w:t>
+        </w:r>
+      </w:hyperlink>
     </w:p>
     <w:sectPr>
-      <w:footerReference w:type="default" r:id="rId19"/>
+      <w:footerReference w:type="default" r:id="rId23"/>
       <w:pgSz w:w="11906" w:h="16838" w:code="9"/>
       <w:pgMar w:top="1440" w:right="1440" w:bottom="1440" w:left="1440" w:header="709" w:footer="709" w:gutter="0"/>
       <w:cols w:space="708"/>
@@ -9673,7 +11090,7 @@
             <w:rPr>
               <w:noProof/>
             </w:rPr>
-            <w:t>6</w:t>
+            <w:t>9</w:t>
           </w:r>
         </w:fldSimple>
       </w:p>
@@ -9683,6 +11100,48 @@
     <w:pPr>
       <w:pStyle w:val="Rodap"/>
     </w:pPr>
+    <w:r>
+      <w:rPr>
+        <w:noProof/>
+        <w:lang w:eastAsia="pt-BR"/>
+      </w:rPr>
+      <w:drawing>
+        <wp:inline distT="0" distB="0" distL="0" distR="0">
+          <wp:extent cx="1584960" cy="633984"/>
+          <wp:effectExtent l="0" t="0" r="0" b="0"/>
+          <wp:docPr id="8" name="Imagem 7" descr="unibrasil_logo.png"/>
+          <wp:cNvGraphicFramePr>
+            <a:graphicFrameLocks xmlns:a="http://schemas.openxmlformats.org/drawingml/2006/main" noChangeAspect="1"/>
+          </wp:cNvGraphicFramePr>
+          <a:graphic xmlns:a="http://schemas.openxmlformats.org/drawingml/2006/main">
+            <a:graphicData uri="http://schemas.openxmlformats.org/drawingml/2006/picture">
+              <pic:pic xmlns:pic="http://schemas.openxmlformats.org/drawingml/2006/picture">
+                <pic:nvPicPr>
+                  <pic:cNvPr id="0" name="unibrasil_logo.png"/>
+                  <pic:cNvPicPr/>
+                </pic:nvPicPr>
+                <pic:blipFill>
+                  <a:blip r:embed="rId1"/>
+                  <a:srcRect t="32400" b="27600"/>
+                  <a:stretch>
+                    <a:fillRect/>
+                  </a:stretch>
+                </pic:blipFill>
+                <pic:spPr>
+                  <a:xfrm>
+                    <a:off x="0" y="0"/>
+                    <a:ext cx="1590243" cy="636097"/>
+                  </a:xfrm>
+                  <a:prstGeom prst="rect">
+                    <a:avLst/>
+                  </a:prstGeom>
+                </pic:spPr>
+              </pic:pic>
+            </a:graphicData>
+          </a:graphic>
+        </wp:inline>
+      </w:drawing>
+    </w:r>
   </w:p>
 </w:ftr>
 </file>
@@ -10927,6 +12386,30 @@
       <w:rFonts w:asciiTheme="majorHAnsi" w:eastAsiaTheme="majorEastAsia" w:hAnsiTheme="majorHAnsi" w:cstheme="majorBidi"/>
       <w:b/>
       <w:bCs/>
+      <w:color w:val="4F81BD" w:themeColor="accent1"/>
+    </w:rPr>
+  </w:style>
+  <w:style w:type="paragraph" w:styleId="Ttulo4">
+    <w:name w:val="heading 4"/>
+    <w:basedOn w:val="Normal"/>
+    <w:next w:val="Normal"/>
+    <w:link w:val="Ttulo4Char"/>
+    <w:uiPriority w:val="9"/>
+    <w:unhideWhenUsed/>
+    <w:qFormat/>
+    <w:rsid w:val="0090106E"/>
+    <w:pPr>
+      <w:keepNext/>
+      <w:keepLines/>
+      <w:spacing w:before="200" w:after="0"/>
+      <w:outlineLvl w:val="3"/>
+    </w:pPr>
+    <w:rPr>
+      <w:rFonts w:asciiTheme="majorHAnsi" w:eastAsiaTheme="majorEastAsia" w:hAnsiTheme="majorHAnsi" w:cstheme="majorBidi"/>
+      <w:b/>
+      <w:bCs/>
+      <w:i/>
+      <w:iCs/>
       <w:color w:val="4F81BD" w:themeColor="accent1"/>
     </w:rPr>
   </w:style>
@@ -11309,6 +12792,44 @@
       <w:ind w:left="440"/>
     </w:pPr>
   </w:style>
+  <w:style w:type="character" w:customStyle="1" w:styleId="Ttulo4Char">
+    <w:name w:val="Título 4 Char"/>
+    <w:basedOn w:val="Fontepargpadro"/>
+    <w:link w:val="Ttulo4"/>
+    <w:uiPriority w:val="9"/>
+    <w:rsid w:val="0090106E"/>
+    <w:rPr>
+      <w:rFonts w:asciiTheme="majorHAnsi" w:eastAsiaTheme="majorEastAsia" w:hAnsiTheme="majorHAnsi" w:cstheme="majorBidi"/>
+      <w:b/>
+      <w:bCs/>
+      <w:i/>
+      <w:iCs/>
+      <w:color w:val="4F81BD" w:themeColor="accent1"/>
+    </w:rPr>
+  </w:style>
+  <w:style w:type="paragraph" w:customStyle="1" w:styleId="Titulo4Relatorio">
+    <w:name w:val="Titulo 4 Relatorio"/>
+    <w:basedOn w:val="Ttulo4"/>
+    <w:link w:val="Titulo4RelatorioChar"/>
+    <w:qFormat/>
+    <w:rsid w:val="0090106E"/>
+    <w:rPr>
+      <w:rFonts w:ascii="Times" w:hAnsi="Times" w:cs="Times"/>
+      <w:sz w:val="24"/>
+      <w:szCs w:val="24"/>
+    </w:rPr>
+  </w:style>
+  <w:style w:type="character" w:customStyle="1" w:styleId="Titulo4RelatorioChar">
+    <w:name w:val="Titulo 4 Relatorio Char"/>
+    <w:basedOn w:val="Ttulo4Char"/>
+    <w:link w:val="Titulo4Relatorio"/>
+    <w:rsid w:val="0090106E"/>
+    <w:rPr>
+      <w:rFonts w:ascii="Times" w:hAnsi="Times" w:cs="Times"/>
+      <w:sz w:val="24"/>
+      <w:szCs w:val="24"/>
+    </w:rPr>
+  </w:style>
 </w:styles>
 </file>
 
@@ -11380,9 +12901,8 @@
     <w:panose1 w:val="020B0604030504040204"/>
     <w:charset w:val="00"/>
     <w:family w:val="swiss"/>
-    <w:notTrueType/>
     <w:pitch w:val="variable"/>
-    <w:sig w:usb0="00000003" w:usb1="00000000" w:usb2="00000000" w:usb3="00000000" w:csb0="00000001" w:csb1="00000000"/>
+    <w:sig w:usb0="E1002EFF" w:usb1="C000605B" w:usb2="00000029" w:usb3="00000000" w:csb0="000101FF" w:csb1="00000000"/>
   </w:font>
   <w:font w:name="Cambria Math">
     <w:panose1 w:val="02040503050406030204"/>
@@ -11405,6 +12925,7 @@
   </w:compat>
   <w:rsids>
     <w:rsidRoot w:val="00DE5764"/>
+    <w:rsid w:val="00673B9C"/>
     <w:rsid w:val="00DE5764"/>
     <w:rsid w:val="00EC412D"/>
   </w:rsids>
@@ -11622,7 +13143,7 @@
     <w:basedOn w:val="Fontepargpadro"/>
     <w:uiPriority w:val="99"/>
     <w:semiHidden/>
-    <w:rsid w:val="00EC412D"/>
+    <w:rsid w:val="00673B9C"/>
     <w:rPr>
       <w:color w:val="808080"/>
     </w:rPr>

</xml_diff>

<commit_message>
Adicionando arquivos e comparativos
</commit_message>
<xml_diff>
--- a/Relatorio_Equipe_HeapSort.docx
+++ b/Relatorio_Equipe_HeapSort.docx
@@ -333,7 +333,7 @@
             </w:rPr>
             <w:fldChar w:fldCharType="separate"/>
           </w:r>
-          <w:hyperlink w:anchor="_Toc200230206" w:history="1">
+          <w:hyperlink w:anchor="_Toc200292928" w:history="1">
             <w:r>
               <w:rPr>
                 <w:rStyle w:val="Hyperlink"/>
@@ -377,7 +377,7 @@
                 <w:noProof/>
                 <w:webHidden/>
               </w:rPr>
-              <w:instrText xml:space="preserve"> PAGEREF _Toc200230206 \h </w:instrText>
+              <w:instrText xml:space="preserve"> PAGEREF _Toc200292928 \h </w:instrText>
             </w:r>
             <w:r>
               <w:rPr>
@@ -420,7 +420,7 @@
               <w:lang w:eastAsia="pt-BR"/>
             </w:rPr>
           </w:pPr>
-          <w:hyperlink w:anchor="_Toc200230207" w:history="1">
+          <w:hyperlink w:anchor="_Toc200292929" w:history="1">
             <w:r>
               <w:rPr>
                 <w:rStyle w:val="Hyperlink"/>
@@ -448,7 +448,7 @@
                 <w:noProof/>
                 <w:webHidden/>
               </w:rPr>
-              <w:instrText xml:space="preserve"> PAGEREF _Toc200230207 \h </w:instrText>
+              <w:instrText xml:space="preserve"> PAGEREF _Toc200292929 \h </w:instrText>
             </w:r>
             <w:r>
               <w:rPr>
@@ -491,7 +491,7 @@
               <w:lang w:eastAsia="pt-BR"/>
             </w:rPr>
           </w:pPr>
-          <w:hyperlink w:anchor="_Toc200230208" w:history="1">
+          <w:hyperlink w:anchor="_Toc200292930" w:history="1">
             <w:r>
               <w:rPr>
                 <w:rStyle w:val="Hyperlink"/>
@@ -519,7 +519,7 @@
                 <w:noProof/>
                 <w:webHidden/>
               </w:rPr>
-              <w:instrText xml:space="preserve"> PAGEREF _Toc200230208 \h </w:instrText>
+              <w:instrText xml:space="preserve"> PAGEREF _Toc200292930 \h </w:instrText>
             </w:r>
             <w:r>
               <w:rPr>
@@ -562,7 +562,7 @@
               <w:lang w:eastAsia="pt-BR"/>
             </w:rPr>
           </w:pPr>
-          <w:hyperlink w:anchor="_Toc200230209" w:history="1">
+          <w:hyperlink w:anchor="_Toc200292931" w:history="1">
             <w:r>
               <w:rPr>
                 <w:rStyle w:val="Hyperlink"/>
@@ -590,7 +590,7 @@
                 <w:noProof/>
                 <w:webHidden/>
               </w:rPr>
-              <w:instrText xml:space="preserve"> PAGEREF _Toc200230209 \h </w:instrText>
+              <w:instrText xml:space="preserve"> PAGEREF _Toc200292931 \h </w:instrText>
             </w:r>
             <w:r>
               <w:rPr>
@@ -634,7 +634,7 @@
               <w:lang w:eastAsia="pt-BR"/>
             </w:rPr>
           </w:pPr>
-          <w:hyperlink w:anchor="_Toc200230210" w:history="1">
+          <w:hyperlink w:anchor="_Toc200292932" w:history="1">
             <w:r>
               <w:rPr>
                 <w:rStyle w:val="Hyperlink"/>
@@ -678,7 +678,7 @@
                 <w:noProof/>
                 <w:webHidden/>
               </w:rPr>
-              <w:instrText xml:space="preserve"> PAGEREF _Toc200230210 \h </w:instrText>
+              <w:instrText xml:space="preserve"> PAGEREF _Toc200292932 \h </w:instrText>
             </w:r>
             <w:r>
               <w:rPr>
@@ -721,7 +721,7 @@
               <w:lang w:eastAsia="pt-BR"/>
             </w:rPr>
           </w:pPr>
-          <w:hyperlink w:anchor="_Toc200230211" w:history="1">
+          <w:hyperlink w:anchor="_Toc200292933" w:history="1">
             <w:r>
               <w:rPr>
                 <w:rStyle w:val="Hyperlink"/>
@@ -749,7 +749,7 @@
                 <w:noProof/>
                 <w:webHidden/>
               </w:rPr>
-              <w:instrText xml:space="preserve"> PAGEREF _Toc200230211 \h </w:instrText>
+              <w:instrText xml:space="preserve"> PAGEREF _Toc200292933 \h </w:instrText>
             </w:r>
             <w:r>
               <w:rPr>
@@ -792,7 +792,7 @@
               <w:lang w:eastAsia="pt-BR"/>
             </w:rPr>
           </w:pPr>
-          <w:hyperlink w:anchor="_Toc200230212" w:history="1">
+          <w:hyperlink w:anchor="_Toc200292934" w:history="1">
             <w:r>
               <w:rPr>
                 <w:rStyle w:val="Hyperlink"/>
@@ -820,7 +820,7 @@
                 <w:noProof/>
                 <w:webHidden/>
               </w:rPr>
-              <w:instrText xml:space="preserve"> PAGEREF _Toc200230212 \h </w:instrText>
+              <w:instrText xml:space="preserve"> PAGEREF _Toc200292934 \h </w:instrText>
             </w:r>
             <w:r>
               <w:rPr>
@@ -863,7 +863,7 @@
               <w:lang w:eastAsia="pt-BR"/>
             </w:rPr>
           </w:pPr>
-          <w:hyperlink w:anchor="_Toc200230213" w:history="1">
+          <w:hyperlink w:anchor="_Toc200292935" w:history="1">
             <w:r>
               <w:rPr>
                 <w:rStyle w:val="Hyperlink"/>
@@ -891,7 +891,7 @@
                 <w:noProof/>
                 <w:webHidden/>
               </w:rPr>
-              <w:instrText xml:space="preserve"> PAGEREF _Toc200230213 \h </w:instrText>
+              <w:instrText xml:space="preserve"> PAGEREF _Toc200292935 \h </w:instrText>
             </w:r>
             <w:r>
               <w:rPr>
@@ -934,7 +934,7 @@
               <w:lang w:eastAsia="pt-BR"/>
             </w:rPr>
           </w:pPr>
-          <w:hyperlink w:anchor="_Toc200230214" w:history="1">
+          <w:hyperlink w:anchor="_Toc200292936" w:history="1">
             <w:r>
               <w:rPr>
                 <w:rStyle w:val="Hyperlink"/>
@@ -962,7 +962,7 @@
                 <w:noProof/>
                 <w:webHidden/>
               </w:rPr>
-              <w:instrText xml:space="preserve"> PAGEREF _Toc200230214 \h </w:instrText>
+              <w:instrText xml:space="preserve"> PAGEREF _Toc200292936 \h </w:instrText>
             </w:r>
             <w:r>
               <w:rPr>
@@ -1005,7 +1005,7 @@
               <w:lang w:eastAsia="pt-BR"/>
             </w:rPr>
           </w:pPr>
-          <w:hyperlink w:anchor="_Toc200230215" w:history="1">
+          <w:hyperlink w:anchor="_Toc200292937" w:history="1">
             <w:r>
               <w:rPr>
                 <w:rStyle w:val="Hyperlink"/>
@@ -1033,7 +1033,7 @@
                 <w:noProof/>
                 <w:webHidden/>
               </w:rPr>
-              <w:instrText xml:space="preserve"> PAGEREF _Toc200230215 \h </w:instrText>
+              <w:instrText xml:space="preserve"> PAGEREF _Toc200292937 \h </w:instrText>
             </w:r>
             <w:r>
               <w:rPr>
@@ -1076,7 +1076,7 @@
               <w:lang w:eastAsia="pt-BR"/>
             </w:rPr>
           </w:pPr>
-          <w:hyperlink w:anchor="_Toc200230216" w:history="1">
+          <w:hyperlink w:anchor="_Toc200292938" w:history="1">
             <w:r>
               <w:rPr>
                 <w:rStyle w:val="Hyperlink"/>
@@ -1104,7 +1104,7 @@
                 <w:noProof/>
                 <w:webHidden/>
               </w:rPr>
-              <w:instrText xml:space="preserve"> PAGEREF _Toc200230216 \h </w:instrText>
+              <w:instrText xml:space="preserve"> PAGEREF _Toc200292938 \h </w:instrText>
             </w:r>
             <w:r>
               <w:rPr>
@@ -1148,7 +1148,7 @@
               <w:lang w:eastAsia="pt-BR"/>
             </w:rPr>
           </w:pPr>
-          <w:hyperlink w:anchor="_Toc200230217" w:history="1">
+          <w:hyperlink w:anchor="_Toc200292939" w:history="1">
             <w:r>
               <w:rPr>
                 <w:rStyle w:val="Hyperlink"/>
@@ -1192,7 +1192,7 @@
                 <w:noProof/>
                 <w:webHidden/>
               </w:rPr>
-              <w:instrText xml:space="preserve"> PAGEREF _Toc200230217 \h </w:instrText>
+              <w:instrText xml:space="preserve"> PAGEREF _Toc200292939 \h </w:instrText>
             </w:r>
             <w:r>
               <w:rPr>
@@ -1235,7 +1235,7 @@
               <w:lang w:eastAsia="pt-BR"/>
             </w:rPr>
           </w:pPr>
-          <w:hyperlink w:anchor="_Toc200230218" w:history="1">
+          <w:hyperlink w:anchor="_Toc200292940" w:history="1">
             <w:r>
               <w:rPr>
                 <w:rStyle w:val="Hyperlink"/>
@@ -1263,7 +1263,7 @@
                 <w:noProof/>
                 <w:webHidden/>
               </w:rPr>
-              <w:instrText xml:space="preserve"> PAGEREF _Toc200230218 \h </w:instrText>
+              <w:instrText xml:space="preserve"> PAGEREF _Toc200292940 \h </w:instrText>
             </w:r>
             <w:r>
               <w:rPr>
@@ -1306,7 +1306,7 @@
               <w:lang w:eastAsia="pt-BR"/>
             </w:rPr>
           </w:pPr>
-          <w:hyperlink w:anchor="_Toc200230219" w:history="1">
+          <w:hyperlink w:anchor="_Toc200292941" w:history="1">
             <w:r>
               <w:rPr>
                 <w:rStyle w:val="Hyperlink"/>
@@ -1333,7 +1333,7 @@
                 <w:noProof/>
                 <w:webHidden/>
               </w:rPr>
-              <w:instrText xml:space="preserve"> PAGEREF _Toc200230219 \h </w:instrText>
+              <w:instrText xml:space="preserve"> PAGEREF _Toc200292941 \h </w:instrText>
             </w:r>
             <w:r>
               <w:rPr>
@@ -1376,7 +1376,7 @@
               <w:lang w:eastAsia="pt-BR"/>
             </w:rPr>
           </w:pPr>
-          <w:hyperlink w:anchor="_Toc200230220" w:history="1">
+          <w:hyperlink w:anchor="_Toc200292942" w:history="1">
             <w:r>
               <w:rPr>
                 <w:rStyle w:val="Hyperlink"/>
@@ -1403,7 +1403,7 @@
                 <w:noProof/>
                 <w:webHidden/>
               </w:rPr>
-              <w:instrText xml:space="preserve"> PAGEREF _Toc200230220 \h </w:instrText>
+              <w:instrText xml:space="preserve"> PAGEREF _Toc200292942 \h </w:instrText>
             </w:r>
             <w:r>
               <w:rPr>
@@ -1423,7 +1423,7 @@
                 <w:noProof/>
                 <w:webHidden/>
               </w:rPr>
-              <w:t>7</w:t>
+              <w:t>8</w:t>
             </w:r>
             <w:r>
               <w:rPr>
@@ -1446,13 +1446,27 @@
               <w:lang w:eastAsia="pt-BR"/>
             </w:rPr>
           </w:pPr>
-          <w:hyperlink w:anchor="_Toc200230221" w:history="1">
+          <w:hyperlink w:anchor="_Toc200292943" w:history="1">
             <w:r>
               <w:rPr>
                 <w:rStyle w:val="Hyperlink"/>
                 <w:noProof/>
               </w:rPr>
-              <w:t>Tabelas e/ou gráficos deverão ser utilizados para apresentação dos resultados dos testes.</w:t>
+              <w:t>RESU</w:t>
+            </w:r>
+            <w:r>
+              <w:rPr>
+                <w:rStyle w:val="Hyperlink"/>
+                <w:noProof/>
+              </w:rPr>
+              <w:t>L</w:t>
+            </w:r>
+            <w:r>
+              <w:rPr>
+                <w:rStyle w:val="Hyperlink"/>
+                <w:noProof/>
+              </w:rPr>
+              <w:t>TADOS DOS TESTES</w:t>
             </w:r>
             <w:r>
               <w:rPr>
@@ -1473,7 +1487,7 @@
                 <w:noProof/>
                 <w:webHidden/>
               </w:rPr>
-              <w:instrText xml:space="preserve"> PAGEREF _Toc200230221 \h </w:instrText>
+              <w:instrText xml:space="preserve"> PAGEREF _Toc200292943 \h </w:instrText>
             </w:r>
             <w:r>
               <w:rPr>
@@ -1493,7 +1507,217 @@
                 <w:noProof/>
                 <w:webHidden/>
               </w:rPr>
-              <w:t>10</w:t>
+              <w:t>13</w:t>
+            </w:r>
+            <w:r>
+              <w:rPr>
+                <w:noProof/>
+                <w:webHidden/>
+              </w:rPr>
+              <w:fldChar w:fldCharType="end"/>
+            </w:r>
+          </w:hyperlink>
+        </w:p>
+        <w:p>
+          <w:pPr>
+            <w:pStyle w:val="Sumrio3"/>
+            <w:tabs>
+              <w:tab w:val="right" w:leader="dot" w:pos="9016"/>
+            </w:tabs>
+            <w:rPr>
+              <w:rFonts w:eastAsiaTheme="minorEastAsia"/>
+              <w:noProof/>
+              <w:lang w:eastAsia="pt-BR"/>
+            </w:rPr>
+          </w:pPr>
+          <w:hyperlink w:anchor="_Toc200292944" w:history="1">
+            <w:r>
+              <w:rPr>
+                <w:rStyle w:val="Hyperlink"/>
+                <w:noProof/>
+              </w:rPr>
+              <w:t>ORDERED INPUT</w:t>
+            </w:r>
+            <w:r>
+              <w:rPr>
+                <w:noProof/>
+                <w:webHidden/>
+              </w:rPr>
+              <w:tab/>
+            </w:r>
+            <w:r>
+              <w:rPr>
+                <w:noProof/>
+                <w:webHidden/>
+              </w:rPr>
+              <w:fldChar w:fldCharType="begin"/>
+            </w:r>
+            <w:r>
+              <w:rPr>
+                <w:noProof/>
+                <w:webHidden/>
+              </w:rPr>
+              <w:instrText xml:space="preserve"> PAGEREF _Toc200292944 \h </w:instrText>
+            </w:r>
+            <w:r>
+              <w:rPr>
+                <w:noProof/>
+                <w:webHidden/>
+              </w:rPr>
+            </w:r>
+            <w:r>
+              <w:rPr>
+                <w:noProof/>
+                <w:webHidden/>
+              </w:rPr>
+              <w:fldChar w:fldCharType="separate"/>
+            </w:r>
+            <w:r>
+              <w:rPr>
+                <w:noProof/>
+                <w:webHidden/>
+              </w:rPr>
+              <w:t>13</w:t>
+            </w:r>
+            <w:r>
+              <w:rPr>
+                <w:noProof/>
+                <w:webHidden/>
+              </w:rPr>
+              <w:fldChar w:fldCharType="end"/>
+            </w:r>
+          </w:hyperlink>
+        </w:p>
+        <w:p>
+          <w:pPr>
+            <w:pStyle w:val="Sumrio3"/>
+            <w:tabs>
+              <w:tab w:val="right" w:leader="dot" w:pos="9016"/>
+            </w:tabs>
+            <w:rPr>
+              <w:rFonts w:eastAsiaTheme="minorEastAsia"/>
+              <w:noProof/>
+              <w:lang w:eastAsia="pt-BR"/>
+            </w:rPr>
+          </w:pPr>
+          <w:hyperlink w:anchor="_Toc200292945" w:history="1">
+            <w:r>
+              <w:rPr>
+                <w:rStyle w:val="Hyperlink"/>
+                <w:noProof/>
+              </w:rPr>
+              <w:t>REVERSE ORDERED INPUT</w:t>
+            </w:r>
+            <w:r>
+              <w:rPr>
+                <w:noProof/>
+                <w:webHidden/>
+              </w:rPr>
+              <w:tab/>
+            </w:r>
+            <w:r>
+              <w:rPr>
+                <w:noProof/>
+                <w:webHidden/>
+              </w:rPr>
+              <w:fldChar w:fldCharType="begin"/>
+            </w:r>
+            <w:r>
+              <w:rPr>
+                <w:noProof/>
+                <w:webHidden/>
+              </w:rPr>
+              <w:instrText xml:space="preserve"> PAGEREF _Toc200292945 \h </w:instrText>
+            </w:r>
+            <w:r>
+              <w:rPr>
+                <w:noProof/>
+                <w:webHidden/>
+              </w:rPr>
+            </w:r>
+            <w:r>
+              <w:rPr>
+                <w:noProof/>
+                <w:webHidden/>
+              </w:rPr>
+              <w:fldChar w:fldCharType="separate"/>
+            </w:r>
+            <w:r>
+              <w:rPr>
+                <w:noProof/>
+                <w:webHidden/>
+              </w:rPr>
+              <w:t>14</w:t>
+            </w:r>
+            <w:r>
+              <w:rPr>
+                <w:noProof/>
+                <w:webHidden/>
+              </w:rPr>
+              <w:fldChar w:fldCharType="end"/>
+            </w:r>
+          </w:hyperlink>
+        </w:p>
+        <w:p>
+          <w:pPr>
+            <w:pStyle w:val="Sumrio3"/>
+            <w:tabs>
+              <w:tab w:val="right" w:leader="dot" w:pos="9016"/>
+            </w:tabs>
+            <w:rPr>
+              <w:rFonts w:eastAsiaTheme="minorEastAsia"/>
+              <w:noProof/>
+              <w:lang w:eastAsia="pt-BR"/>
+            </w:rPr>
+          </w:pPr>
+          <w:hyperlink w:anchor="_Toc200292946" w:history="1">
+            <w:r>
+              <w:rPr>
+                <w:rStyle w:val="Hyperlink"/>
+                <w:noProof/>
+              </w:rPr>
+              <w:t>UNIFORM INPUT</w:t>
+            </w:r>
+            <w:r>
+              <w:rPr>
+                <w:noProof/>
+                <w:webHidden/>
+              </w:rPr>
+              <w:tab/>
+            </w:r>
+            <w:r>
+              <w:rPr>
+                <w:noProof/>
+                <w:webHidden/>
+              </w:rPr>
+              <w:fldChar w:fldCharType="begin"/>
+            </w:r>
+            <w:r>
+              <w:rPr>
+                <w:noProof/>
+                <w:webHidden/>
+              </w:rPr>
+              <w:instrText xml:space="preserve"> PAGEREF _Toc200292946 \h </w:instrText>
+            </w:r>
+            <w:r>
+              <w:rPr>
+                <w:noProof/>
+                <w:webHidden/>
+              </w:rPr>
+            </w:r>
+            <w:r>
+              <w:rPr>
+                <w:noProof/>
+                <w:webHidden/>
+              </w:rPr>
+              <w:fldChar w:fldCharType="separate"/>
+            </w:r>
+            <w:r>
+              <w:rPr>
+                <w:noProof/>
+                <w:webHidden/>
+              </w:rPr>
+              <w:t>14</w:t>
             </w:r>
             <w:r>
               <w:rPr>
@@ -1516,14 +1740,14 @@
               <w:lang w:eastAsia="pt-BR"/>
             </w:rPr>
           </w:pPr>
-          <w:hyperlink w:anchor="_Toc200230222" w:history="1">
+          <w:hyperlink w:anchor="_Toc200292947" w:history="1">
             <w:r>
               <w:rPr>
                 <w:rStyle w:val="Hyperlink"/>
                 <w:rFonts w:ascii="Times" w:hAnsi="Times" w:cs="Times"/>
                 <w:noProof/>
               </w:rPr>
-              <w:t>Incluir detalhes da configuração do computador usado para testes: sistema Operacional, quantidade de RAM, velocidade da CPU (Hz).</w:t>
+              <w:t>Detalhes da Configuração do Computador Utilizado</w:t>
             </w:r>
             <w:r>
               <w:rPr>
@@ -1544,7 +1768,7 @@
                 <w:noProof/>
                 <w:webHidden/>
               </w:rPr>
-              <w:instrText xml:space="preserve"> PAGEREF _Toc200230222 \h </w:instrText>
+              <w:instrText xml:space="preserve"> PAGEREF _Toc200292947 \h </w:instrText>
             </w:r>
             <w:r>
               <w:rPr>
@@ -1564,7 +1788,7 @@
                 <w:noProof/>
                 <w:webHidden/>
               </w:rPr>
-              <w:t>10</w:t>
+              <w:t>15</w:t>
             </w:r>
             <w:r>
               <w:rPr>
@@ -1587,7 +1811,7 @@
               <w:lang w:eastAsia="pt-BR"/>
             </w:rPr>
           </w:pPr>
-          <w:hyperlink w:anchor="_Toc200230223" w:history="1">
+          <w:hyperlink w:anchor="_Toc200292948" w:history="1">
             <w:r>
               <w:rPr>
                 <w:rStyle w:val="Hyperlink"/>
@@ -1614,7 +1838,7 @@
                 <w:noProof/>
                 <w:webHidden/>
               </w:rPr>
-              <w:instrText xml:space="preserve"> PAGEREF _Toc200230223 \h </w:instrText>
+              <w:instrText xml:space="preserve"> PAGEREF _Toc200292948 \h </w:instrText>
             </w:r>
             <w:r>
               <w:rPr>
@@ -1634,7 +1858,7 @@
                 <w:noProof/>
                 <w:webHidden/>
               </w:rPr>
-              <w:t>10</w:t>
+              <w:t>16</w:t>
             </w:r>
             <w:r>
               <w:rPr>
@@ -1657,7 +1881,7 @@
               <w:lang w:eastAsia="pt-BR"/>
             </w:rPr>
           </w:pPr>
-          <w:hyperlink w:anchor="_Toc200230224" w:history="1">
+          <w:hyperlink w:anchor="_Toc200292949" w:history="1">
             <w:r>
               <w:rPr>
                 <w:rStyle w:val="Hyperlink"/>
@@ -1684,7 +1908,7 @@
                 <w:noProof/>
                 <w:webHidden/>
               </w:rPr>
-              <w:instrText xml:space="preserve"> PAGEREF _Toc200230224 \h </w:instrText>
+              <w:instrText xml:space="preserve"> PAGEREF _Toc200292949 \h </w:instrText>
             </w:r>
             <w:r>
               <w:rPr>
@@ -1704,7 +1928,7 @@
                 <w:noProof/>
                 <w:webHidden/>
               </w:rPr>
-              <w:t>11</w:t>
+              <w:t>16</w:t>
             </w:r>
             <w:r>
               <w:rPr>
@@ -1728,7 +1952,7 @@
               <w:lang w:eastAsia="pt-BR"/>
             </w:rPr>
           </w:pPr>
-          <w:hyperlink w:anchor="_Toc200230225" w:history="1">
+          <w:hyperlink w:anchor="_Toc200292950" w:history="1">
             <w:r>
               <w:rPr>
                 <w:rStyle w:val="Hyperlink"/>
@@ -1772,7 +1996,7 @@
                 <w:noProof/>
                 <w:webHidden/>
               </w:rPr>
-              <w:instrText xml:space="preserve"> PAGEREF _Toc200230225 \h </w:instrText>
+              <w:instrText xml:space="preserve"> PAGEREF _Toc200292950 \h </w:instrText>
             </w:r>
             <w:r>
               <w:rPr>
@@ -1792,7 +2016,7 @@
                 <w:noProof/>
                 <w:webHidden/>
               </w:rPr>
-              <w:t>11</w:t>
+              <w:t>17</w:t>
             </w:r>
             <w:r>
               <w:rPr>
@@ -1815,7 +2039,7 @@
               <w:lang w:eastAsia="pt-BR"/>
             </w:rPr>
           </w:pPr>
-          <w:hyperlink w:anchor="_Toc200230226" w:history="1">
+          <w:hyperlink w:anchor="_Toc200292951" w:history="1">
             <w:r>
               <w:rPr>
                 <w:rStyle w:val="Hyperlink"/>
@@ -1843,7 +2067,7 @@
                 <w:noProof/>
                 <w:webHidden/>
               </w:rPr>
-              <w:instrText xml:space="preserve"> PAGEREF _Toc200230226 \h </w:instrText>
+              <w:instrText xml:space="preserve"> PAGEREF _Toc200292951 \h </w:instrText>
             </w:r>
             <w:r>
               <w:rPr>
@@ -1863,7 +2087,7 @@
                 <w:noProof/>
                 <w:webHidden/>
               </w:rPr>
-              <w:t>11</w:t>
+              <w:t>17</w:t>
             </w:r>
             <w:r>
               <w:rPr>
@@ -1886,7 +2110,7 @@
               <w:lang w:eastAsia="pt-BR"/>
             </w:rPr>
           </w:pPr>
-          <w:hyperlink w:anchor="_Toc200230227" w:history="1">
+          <w:hyperlink w:anchor="_Toc200292952" w:history="1">
             <w:r>
               <w:rPr>
                 <w:rStyle w:val="Hyperlink"/>
@@ -1914,7 +2138,7 @@
                 <w:noProof/>
                 <w:webHidden/>
               </w:rPr>
-              <w:instrText xml:space="preserve"> PAGEREF _Toc200230227 \h </w:instrText>
+              <w:instrText xml:space="preserve"> PAGEREF _Toc200292952 \h </w:instrText>
             </w:r>
             <w:r>
               <w:rPr>
@@ -1934,7 +2158,7 @@
                 <w:noProof/>
                 <w:webHidden/>
               </w:rPr>
-              <w:t>12</w:t>
+              <w:t>17</w:t>
             </w:r>
             <w:r>
               <w:rPr>
@@ -1958,7 +2182,7 @@
               <w:lang w:eastAsia="pt-BR"/>
             </w:rPr>
           </w:pPr>
-          <w:hyperlink w:anchor="_Toc200230228" w:history="1">
+          <w:hyperlink w:anchor="_Toc200292953" w:history="1">
             <w:r>
               <w:rPr>
                 <w:rStyle w:val="Hyperlink"/>
@@ -2002,7 +2226,7 @@
                 <w:noProof/>
                 <w:webHidden/>
               </w:rPr>
-              <w:instrText xml:space="preserve"> PAGEREF _Toc200230228 \h </w:instrText>
+              <w:instrText xml:space="preserve"> PAGEREF _Toc200292953 \h </w:instrText>
             </w:r>
             <w:r>
               <w:rPr>
@@ -2022,7 +2246,7 @@
                 <w:noProof/>
                 <w:webHidden/>
               </w:rPr>
-              <w:t>13</w:t>
+              <w:t>19</w:t>
             </w:r>
             <w:r>
               <w:rPr>
@@ -2048,7 +2272,6 @@
               <w:sz w:val="24"/>
               <w:szCs w:val="24"/>
             </w:rPr>
-            <w:lastRenderedPageBreak/>
             <w:fldChar w:fldCharType="end"/>
           </w:r>
         </w:p>
@@ -2079,7 +2302,7 @@
           <w:szCs w:val="24"/>
         </w:rPr>
       </w:pPr>
-      <w:bookmarkStart w:id="0" w:name="_Toc200230206"/>
+      <w:bookmarkStart w:id="0" w:name="_Toc200292928"/>
       <w:r>
         <w:rPr>
           <w:rFonts w:ascii="Times" w:hAnsi="Times" w:cs="Times"/>
@@ -2100,7 +2323,7 @@
           <w:szCs w:val="24"/>
         </w:rPr>
       </w:pPr>
-      <w:bookmarkStart w:id="1" w:name="_Toc200230207"/>
+      <w:bookmarkStart w:id="1" w:name="_Toc200292929"/>
       <w:r>
         <w:rPr>
           <w:rFonts w:ascii="Times" w:hAnsi="Times" w:cs="Times"/>
@@ -2129,7 +2352,7 @@
           <w:szCs w:val="24"/>
         </w:rPr>
       </w:pPr>
-      <w:bookmarkStart w:id="2" w:name="_Toc200230208"/>
+      <w:bookmarkStart w:id="2" w:name="_Toc200292930"/>
       <w:r>
         <w:rPr>
           <w:rFonts w:ascii="Times" w:hAnsi="Times" w:cs="Times"/>
@@ -2158,7 +2381,7 @@
           <w:szCs w:val="24"/>
         </w:rPr>
       </w:pPr>
-      <w:bookmarkStart w:id="3" w:name="_Toc200230209"/>
+      <w:bookmarkStart w:id="3" w:name="_Toc200292931"/>
       <w:r>
         <w:rPr>
           <w:rFonts w:ascii="Times" w:hAnsi="Times" w:cs="Times"/>
@@ -2210,7 +2433,7 @@
           <w:szCs w:val="24"/>
         </w:rPr>
       </w:pPr>
-      <w:bookmarkStart w:id="4" w:name="_Toc200230210"/>
+      <w:bookmarkStart w:id="4" w:name="_Toc200292932"/>
       <w:r>
         <w:rPr>
           <w:rFonts w:ascii="Times" w:hAnsi="Times" w:cs="Times"/>
@@ -2239,7 +2462,7 @@
           <w:szCs w:val="24"/>
         </w:rPr>
       </w:pPr>
-      <w:bookmarkStart w:id="5" w:name="_Toc200230211"/>
+      <w:bookmarkStart w:id="5" w:name="_Toc200292933"/>
       <w:r>
         <w:rPr>
           <w:rFonts w:ascii="Times" w:hAnsi="Times" w:cs="Times"/>
@@ -2405,7 +2628,7 @@
         </w:rPr>
         <w:t xml:space="preserve"> </w:t>
       </w:r>
-      <w:bookmarkStart w:id="6" w:name="_Toc200230212"/>
+      <w:bookmarkStart w:id="6" w:name="_Toc200292934"/>
       <w:r>
         <w:rPr>
           <w:rFonts w:ascii="Times" w:hAnsi="Times" w:cs="Times"/>
@@ -2634,6 +2857,7 @@
           <w:sz w:val="24"/>
           <w:szCs w:val="24"/>
         </w:rPr>
+        <w:lastRenderedPageBreak/>
         <w:t xml:space="preserve">A Construção do Heap vale </w:t>
       </w:r>
       <m:oMath>
@@ -2716,7 +2940,6 @@
           <w:sz w:val="24"/>
           <w:szCs w:val="24"/>
         </w:rPr>
-        <w:lastRenderedPageBreak/>
         <w:t>Heapify:</w:t>
       </w:r>
     </w:p>
@@ -4086,6 +4309,7 @@
           <w:sz w:val="24"/>
           <w:szCs w:val="24"/>
         </w:rPr>
+        <w:lastRenderedPageBreak/>
         <w:t>No fim eliminando a</w:t>
       </w:r>
       <w:r>
@@ -4240,7 +4464,6 @@
           <w:sz w:val="24"/>
           <w:szCs w:val="24"/>
         </w:rPr>
-        <w:lastRenderedPageBreak/>
         <w:t>O custo para a c</w:t>
       </w:r>
       <w:r>
@@ -5041,7 +5264,7 @@
           <w:szCs w:val="24"/>
         </w:rPr>
       </w:pPr>
-      <w:bookmarkStart w:id="7" w:name="_Toc200230213"/>
+      <w:bookmarkStart w:id="7" w:name="_Toc200292935"/>
       <w:r>
         <w:rPr>
           <w:rFonts w:ascii="Times" w:hAnsi="Times" w:cs="Times"/>
@@ -5207,7 +5430,7 @@
           <w:szCs w:val="24"/>
         </w:rPr>
       </w:pPr>
-      <w:bookmarkStart w:id="8" w:name="_Toc200230214"/>
+      <w:bookmarkStart w:id="8" w:name="_Toc200292936"/>
       <w:r>
         <w:rPr>
           <w:rFonts w:ascii="Times" w:hAnsi="Times" w:cs="Times"/>
@@ -5407,7 +5630,7 @@
           <w:szCs w:val="24"/>
         </w:rPr>
       </w:pPr>
-      <w:bookmarkStart w:id="9" w:name="_Toc200230215"/>
+      <w:bookmarkStart w:id="9" w:name="_Toc200292937"/>
       <w:r>
         <w:rPr>
           <w:rFonts w:ascii="Times" w:hAnsi="Times" w:cs="Times"/>
@@ -5465,6 +5688,7 @@
           <w:sz w:val="24"/>
           <w:szCs w:val="24"/>
         </w:rPr>
+        <w:lastRenderedPageBreak/>
         <w:t xml:space="preserve">Como já foi mencionado anteriormente, o algoritmo de ordenação Heapsort é considerado instável, pois quando há valores iguais as posições são trocadas, </w:t>
       </w:r>
       <w:r>
@@ -5527,7 +5751,6 @@
           <w:sz w:val="24"/>
           <w:szCs w:val="24"/>
         </w:rPr>
-        <w:lastRenderedPageBreak/>
         <w:t>Mesma Grandeza: Pior, Médio e Melhor Caso</w:t>
       </w:r>
     </w:p>
@@ -5614,7 +5837,7 @@
           <w:szCs w:val="24"/>
         </w:rPr>
       </w:pPr>
-      <w:bookmarkStart w:id="10" w:name="_Toc200230216"/>
+      <w:bookmarkStart w:id="10" w:name="_Toc200292938"/>
       <w:r>
         <w:rPr>
           <w:rFonts w:ascii="Times" w:hAnsi="Times" w:cs="Times"/>
@@ -5652,7 +5875,7 @@
           <w:szCs w:val="24"/>
         </w:rPr>
       </w:pPr>
-      <w:bookmarkStart w:id="11" w:name="_Toc200230217"/>
+      <w:bookmarkStart w:id="11" w:name="_Toc200292939"/>
       <w:r>
         <w:rPr>
           <w:rFonts w:ascii="Times" w:hAnsi="Times" w:cs="Times"/>
@@ -5673,7 +5896,7 @@
           <w:szCs w:val="24"/>
         </w:rPr>
       </w:pPr>
-      <w:bookmarkStart w:id="12" w:name="_Toc200230218"/>
+      <w:bookmarkStart w:id="12" w:name="_Toc200292940"/>
       <w:r>
         <w:rPr>
           <w:rFonts w:ascii="Times" w:hAnsi="Times" w:cs="Times"/>
@@ -5697,7 +5920,7 @@
       <w:pPr>
         <w:pStyle w:val="Titulo3Relatorio"/>
       </w:pPr>
-      <w:bookmarkStart w:id="13" w:name="_Toc200230219"/>
+      <w:bookmarkStart w:id="13" w:name="_Toc200292941"/>
       <w:r>
         <w:t>Algoritmo da obra Estrutura de Dados Usando C</w:t>
       </w:r>
@@ -6295,7 +6518,16 @@
           <w:sz w:val="24"/>
           <w:szCs w:val="24"/>
         </w:rPr>
-        <w:t xml:space="preserve"> é inserido como seu elemento filho). À medida que cada elemento menor que </w:t>
+        <w:t xml:space="preserve"> é inserido como seu elemento filho). À medida que cada elemento menor </w:t>
+      </w:r>
+      <w:r>
+        <w:rPr>
+          <w:rFonts w:ascii="Times" w:eastAsiaTheme="minorEastAsia" w:hAnsi="Times" w:cs="Times"/>
+          <w:sz w:val="24"/>
+          <w:szCs w:val="24"/>
+        </w:rPr>
+        <w:lastRenderedPageBreak/>
+        <w:t xml:space="preserve">que </w:t>
       </w:r>
       <w:r>
         <w:rPr>
@@ -6427,16 +6659,7 @@
           <w:sz w:val="24"/>
           <w:szCs w:val="24"/>
         </w:rPr>
-        <w:t xml:space="preserve"> Contudo, um novo elemento não pode ser inserido </w:t>
-      </w:r>
-      <w:r>
-        <w:rPr>
-          <w:rFonts w:ascii="Times" w:eastAsiaTheme="minorEastAsia" w:hAnsi="Times" w:cs="Times"/>
-          <w:sz w:val="24"/>
-          <w:szCs w:val="24"/>
-        </w:rPr>
-        <w:lastRenderedPageBreak/>
-        <w:t xml:space="preserve">entre dois elementos já existentes sem deslocar/reposicionar elementos existentes com </w:t>
+        <w:t xml:space="preserve"> Contudo, um novo elemento não pode ser inserido entre dois elementos já existentes sem deslocar/reposicionar elementos existentes com </w:t>
       </w:r>
       <w:r>
         <w:rPr>
@@ -7435,7 +7658,16 @@
           <w:sz w:val="24"/>
           <w:szCs w:val="24"/>
         </w:rPr>
-        <w:t xml:space="preserve"> elementos. Quando este mesmo elemento é removido, os </w:t>
+        <w:t xml:space="preserve"> elementos. Quando este mesmo elemento é </w:t>
+      </w:r>
+      <w:r>
+        <w:rPr>
+          <w:rFonts w:ascii="Times" w:eastAsiaTheme="minorEastAsia" w:hAnsi="Times" w:cs="Times"/>
+          <w:sz w:val="24"/>
+          <w:szCs w:val="24"/>
+        </w:rPr>
+        <w:lastRenderedPageBreak/>
+        <w:t xml:space="preserve">removido, os </w:t>
       </w:r>
       <m:oMath>
         <m:r>
@@ -7565,7 +7797,6 @@
           <w:sz w:val="24"/>
           <w:szCs w:val="24"/>
         </w:rPr>
-        <w:lastRenderedPageBreak/>
         <w:t xml:space="preserve">Seja </w:t>
       </w:r>
       <w:r>
@@ -8498,6 +8729,7 @@
         <w:pStyle w:val="Titulo4Relatorio"/>
       </w:pPr>
       <w:r>
+        <w:lastRenderedPageBreak/>
         <w:t>HEAPSORT</w:t>
       </w:r>
     </w:p>
@@ -8525,7 +8757,6 @@
         <w:pStyle w:val="Titulo4Relatorio"/>
       </w:pPr>
       <w:r>
-        <w:lastRenderedPageBreak/>
         <w:t>PRINTARRAY</w:t>
       </w:r>
     </w:p>
@@ -8553,26 +8784,6 @@
         <w:jc w:val="both"/>
         <w:rPr>
           <w:rFonts w:ascii="Times" w:hAnsi="Times" w:cs="Times"/>
-          <w:sz w:val="24"/>
-          <w:szCs w:val="24"/>
-        </w:rPr>
-      </w:pPr>
-    </w:p>
-    <w:p>
-      <w:pPr>
-        <w:jc w:val="both"/>
-        <w:rPr>
-          <w:rFonts w:ascii="Times" w:eastAsiaTheme="minorEastAsia" w:hAnsi="Times" w:cs="Times"/>
-          <w:sz w:val="24"/>
-          <w:szCs w:val="24"/>
-        </w:rPr>
-      </w:pPr>
-    </w:p>
-    <w:p>
-      <w:pPr>
-        <w:jc w:val="both"/>
-        <w:rPr>
-          <w:rFonts w:ascii="Times" w:hAnsi="Times" w:cs="Times"/>
           <w:sz w:val="20"/>
           <w:szCs w:val="24"/>
         </w:rPr>
@@ -8582,7 +8793,7 @@
       <w:pPr>
         <w:pStyle w:val="Titulo3Relatorio"/>
       </w:pPr>
-      <w:bookmarkStart w:id="14" w:name="_Toc200230220"/>
+      <w:bookmarkStart w:id="14" w:name="_Toc200292942"/>
       <w:r>
         <w:t>Algoritmo do site Programmiz</w:t>
       </w:r>
@@ -9033,6 +9244,11 @@
     </w:p>
     <w:p>
       <w:pPr>
+        <w:pStyle w:val="Codigo"/>
+      </w:pPr>
+    </w:p>
+    <w:p>
+      <w:pPr>
         <w:pStyle w:val="Titulo4Relatorio"/>
       </w:pPr>
       <w:r>
@@ -9064,31 +9280,7 @@
           <w:sz w:val="24"/>
           <w:szCs w:val="24"/>
         </w:rPr>
-        <w:t>heapify</w:t>
-      </w:r>
-      <w:r>
-        <w:rPr>
-          <w:rFonts w:ascii="Times" w:hAnsi="Times" w:cs="Times"/>
-          <w:sz w:val="24"/>
-          <w:szCs w:val="24"/>
-        </w:rPr>
-        <w:t>(</w:t>
-      </w:r>
-      <w:r>
-        <w:rPr>
-          <w:rFonts w:ascii="Times" w:hAnsi="Times" w:cs="Times"/>
-          <w:sz w:val="24"/>
-          <w:szCs w:val="24"/>
-        </w:rPr>
-        <w:t>double* arr, long n, long i</w:t>
-      </w:r>
-      <w:r>
-        <w:rPr>
-          <w:rFonts w:ascii="Times" w:hAnsi="Times" w:cs="Times"/>
-          <w:sz w:val="24"/>
-          <w:szCs w:val="24"/>
-        </w:rPr>
-        <w:t>)</w:t>
+        <w:t>heapify(double* arr, long n, long i)</w:t>
       </w:r>
       <w:r>
         <w:rPr>
@@ -9882,7 +10074,11 @@
         <w:t xml:space="preserve"> vai receber: </w:t>
       </w:r>
       <w:r>
-        <w:t>o array</w:t>
+        <w:t xml:space="preserve">o </w:t>
+      </w:r>
+      <w:r>
+        <w:lastRenderedPageBreak/>
+        <w:t>array</w:t>
       </w:r>
       <w:r>
         <w:t xml:space="preserve"> </w:t>
@@ -9940,7 +10136,1128 @@
         <w:t xml:space="preserve"> </w:t>
       </w:r>
       <w:r>
+        <w:t xml:space="preserve">chamado recursivo de </w:t>
+      </w:r>
+      <w:r>
+        <w:rPr>
+          <w:i/>
+        </w:rPr>
+        <w:t>heapify</w:t>
+      </w:r>
+      <w:r>
+        <w:t>(</w:t>
+      </w:r>
+      <w:r>
+        <w:rPr>
+          <w:i/>
+        </w:rPr>
+        <w:t>arr, n, valor_maximo</w:t>
+      </w:r>
+      <w:r>
+        <w:t>)</w:t>
+      </w:r>
+      <w:r>
+        <w:t xml:space="preserve"> </w:t>
+      </w:r>
+      <w:r>
+        <w:t>utilizará tais parâmetros para reestruturar o heap</w:t>
+      </w:r>
+      <w:r>
+        <w:t>,</w:t>
+      </w:r>
+      <w:r>
+        <w:t xml:space="preserve"> quando necessário.</w:t>
+      </w:r>
+      <w:r>
+        <w:t xml:space="preserve"> Podendo ser implementado</w:t>
+      </w:r>
+      <w:r>
+        <w:t xml:space="preserve"> através</w:t>
+      </w:r>
+      <w:r>
+        <w:t xml:space="preserve"> deste formato:</w:t>
+      </w:r>
+    </w:p>
+    <w:p>
+      <w:pPr>
+        <w:pStyle w:val="Codigo"/>
+      </w:pPr>
+      <w:r>
+        <w:t>//funcao da filtragem(heapify)</w:t>
+      </w:r>
+    </w:p>
+    <w:p>
+      <w:pPr>
+        <w:pStyle w:val="Codigo"/>
+      </w:pPr>
+      <w:r>
+        <w:t>void heapify(double* arr, long n, long i)</w:t>
+      </w:r>
+    </w:p>
+    <w:p>
+      <w:pPr>
+        <w:pStyle w:val="Codigo"/>
+      </w:pPr>
+      <w:r>
+        <w:t>{</w:t>
+      </w:r>
+    </w:p>
+    <w:p>
+      <w:pPr>
+        <w:pStyle w:val="Codigo"/>
+      </w:pPr>
+      <w:r>
+        <w:t xml:space="preserve">    //arr eh o array</w:t>
+      </w:r>
+    </w:p>
+    <w:p>
+      <w:pPr>
+        <w:pStyle w:val="Codigo"/>
+      </w:pPr>
+      <w:r>
+        <w:t xml:space="preserve">    //i eh a posicao</w:t>
+      </w:r>
+    </w:p>
+    <w:p>
+      <w:pPr>
+        <w:pStyle w:val="Codigo"/>
+      </w:pPr>
+      <w:r>
+        <w:t xml:space="preserve">    //n eh a enesima posicao(tamanho do array/qntde de elementos no array)</w:t>
+      </w:r>
+    </w:p>
+    <w:p>
+      <w:pPr>
+        <w:pStyle w:val="Codigo"/>
+      </w:pPr>
+    </w:p>
+    <w:p>
+      <w:pPr>
+        <w:pStyle w:val="Codigo"/>
+      </w:pPr>
+      <w:r>
+        <w:t xml:space="preserve">    //encontrando o maior valor(valor_maximo) entre a raiz, posicao_esq e posicao_dir</w:t>
+      </w:r>
+    </w:p>
+    <w:p>
+      <w:pPr>
+        <w:pStyle w:val="Codigo"/>
+      </w:pPr>
+      <w:r>
+        <w:t xml:space="preserve">    double temp;</w:t>
+      </w:r>
+    </w:p>
+    <w:p>
+      <w:pPr>
+        <w:pStyle w:val="Codigo"/>
+      </w:pPr>
+      <w:r>
+        <w:t xml:space="preserve">    long valor_maximo, posicao_esq, posicao_dir;</w:t>
+      </w:r>
+    </w:p>
+    <w:p>
+      <w:pPr>
+        <w:pStyle w:val="Codigo"/>
+      </w:pPr>
+    </w:p>
+    <w:p>
+      <w:pPr>
+        <w:pStyle w:val="Codigo"/>
+      </w:pPr>
+      <w:r>
+        <w:t xml:space="preserve">    valor_maximo = i;</w:t>
+      </w:r>
+    </w:p>
+    <w:p>
+      <w:pPr>
+        <w:pStyle w:val="Codigo"/>
+      </w:pPr>
+      <w:r>
+        <w:t xml:space="preserve">    posicao_esq = 2 * i + 1;</w:t>
+      </w:r>
+    </w:p>
+    <w:p>
+      <w:pPr>
+        <w:pStyle w:val="Codigo"/>
+      </w:pPr>
+      <w:r>
+        <w:t xml:space="preserve">    posicao_dir = 2 * i + 2;</w:t>
+      </w:r>
+    </w:p>
+    <w:p>
+      <w:pPr>
+        <w:pStyle w:val="Codigo"/>
+      </w:pPr>
+    </w:p>
+    <w:p>
+      <w:pPr>
+        <w:pStyle w:val="Codigo"/>
+      </w:pPr>
+      <w:r>
+        <w:t xml:space="preserve">    //se o valor da posicao_esq existir/for menor que o tamanho do array(enesima posicao)</w:t>
+      </w:r>
+    </w:p>
+    <w:p>
+      <w:pPr>
+        <w:pStyle w:val="Codigo"/>
+      </w:pPr>
+      <w:r>
+        <w:t xml:space="preserve">    //e for maior que a raiz do array</w:t>
+      </w:r>
+    </w:p>
+    <w:p>
+      <w:pPr>
+        <w:pStyle w:val="Codigo"/>
+      </w:pPr>
+      <w:r>
+        <w:t xml:space="preserve">    if (posicao_esq &lt; n &amp;&amp; arr[posicao_esq] &gt; arr[valor_maximo])</w:t>
+      </w:r>
+    </w:p>
+    <w:p>
+      <w:pPr>
+        <w:pStyle w:val="Codigo"/>
+      </w:pPr>
+    </w:p>
+    <w:p>
+      <w:pPr>
+        <w:pStyle w:val="Codigo"/>
+      </w:pPr>
+      <w:r>
+        <w:t xml:space="preserve">        //a raiz da arvore sera atualizada pelo valor da posicao_esq</w:t>
+      </w:r>
+    </w:p>
+    <w:p>
+      <w:pPr>
+        <w:pStyle w:val="Codigo"/>
+      </w:pPr>
+      <w:r>
+        <w:t xml:space="preserve">        valor_maximo = posicao_esq;</w:t>
+      </w:r>
+    </w:p>
+    <w:p>
+      <w:pPr>
+        <w:pStyle w:val="Codigo"/>
+      </w:pPr>
+    </w:p>
+    <w:p>
+      <w:pPr>
+        <w:pStyle w:val="Codigo"/>
+      </w:pPr>
+      <w:r>
+        <w:t xml:space="preserve">    //se o valor da posicao_dir existir/for menor que enesima posicao/o tamanho do array</w:t>
+      </w:r>
+    </w:p>
+    <w:p>
+      <w:pPr>
+        <w:pStyle w:val="Codigo"/>
+      </w:pPr>
+      <w:r>
+        <w:t xml:space="preserve">    //e for maior que a raiz do array</w:t>
+      </w:r>
+    </w:p>
+    <w:p>
+      <w:pPr>
+        <w:pStyle w:val="Codigo"/>
+      </w:pPr>
+      <w:r>
+        <w:t xml:space="preserve">    if (posicao_dir &lt; n &amp;&amp; arr[posicao_dir] &gt; arr[valor_maximo])</w:t>
+      </w:r>
+    </w:p>
+    <w:p>
+      <w:pPr>
+        <w:pStyle w:val="Codigo"/>
+      </w:pPr>
+    </w:p>
+    <w:p>
+      <w:pPr>
+        <w:pStyle w:val="Codigo"/>
+      </w:pPr>
+      <w:r>
+        <w:t xml:space="preserve">        //a raiz da arvore sera atualizada pelo valor da posicao_dir</w:t>
+      </w:r>
+    </w:p>
+    <w:p>
+      <w:pPr>
+        <w:pStyle w:val="Codigo"/>
+      </w:pPr>
+      <w:r>
+        <w:t xml:space="preserve">        valor_maximo = posicao_dir;</w:t>
+      </w:r>
+    </w:p>
+    <w:p>
+      <w:pPr>
+        <w:pStyle w:val="Codigo"/>
+      </w:pPr>
+    </w:p>
+    <w:p>
+      <w:pPr>
+        <w:pStyle w:val="Codigo"/>
+      </w:pPr>
+      <w:r>
+        <w:t xml:space="preserve">    //se a raiz nao for o maior elemento(valor_maximo), prosseguir com swap(alternancia) e heapify(filtragem).</w:t>
+      </w:r>
+    </w:p>
+    <w:p>
+      <w:pPr>
+        <w:pStyle w:val="Codigo"/>
+      </w:pPr>
+      <w:r>
+        <w:t xml:space="preserve">    if (valor_maximo != i) {</w:t>
+      </w:r>
+    </w:p>
+    <w:p>
+      <w:pPr>
+        <w:pStyle w:val="Codigo"/>
+      </w:pPr>
+    </w:p>
+    <w:p>
+      <w:pPr>
+        <w:pStyle w:val="Codigo"/>
+      </w:pPr>
+      <w:r>
+        <w:t xml:space="preserve">        //temp valera uma determinada posicao do array</w:t>
+      </w:r>
+    </w:p>
+    <w:p>
+      <w:pPr>
+        <w:pStyle w:val="Codigo"/>
+      </w:pPr>
+      <w:r>
+        <w:t xml:space="preserve">        temp = arr[i];</w:t>
+      </w:r>
+    </w:p>
+    <w:p>
+      <w:pPr>
+        <w:pStyle w:val="Codigo"/>
+      </w:pPr>
+    </w:p>
+    <w:p>
+      <w:pPr>
+        <w:pStyle w:val="Codigo"/>
+      </w:pPr>
+      <w:r>
+        <w:t xml:space="preserve">        //alternara essa determinada posicao do array com a raiz</w:t>
+      </w:r>
+    </w:p>
+    <w:p>
+      <w:pPr>
+        <w:pStyle w:val="Codigo"/>
+      </w:pPr>
+      <w:r>
+        <w:t xml:space="preserve">        swap(&amp;arr[i], &amp;arr[valor_maximo]);</w:t>
+      </w:r>
+    </w:p>
+    <w:p>
+      <w:pPr>
+        <w:pStyle w:val="Codigo"/>
+      </w:pPr>
+    </w:p>
+    <w:p>
+      <w:pPr>
+        <w:pStyle w:val="Codigo"/>
+      </w:pPr>
+      <w:r>
+        <w:t xml:space="preserve">        //e passara o array, o seu tamanho e raiz para filtrar</w:t>
+      </w:r>
+    </w:p>
+    <w:p>
+      <w:pPr>
+        <w:pStyle w:val="Codigo"/>
+      </w:pPr>
+      <w:r>
+        <w:t xml:space="preserve">        heapify(arr, n, valor_maximo);</w:t>
+      </w:r>
+    </w:p>
+    <w:p>
+      <w:pPr>
+        <w:pStyle w:val="Codigo"/>
+      </w:pPr>
+      <w:r>
+        <w:t xml:space="preserve">    }</w:t>
+      </w:r>
+    </w:p>
+    <w:p>
+      <w:pPr>
+        <w:pStyle w:val="Codigo"/>
+      </w:pPr>
+      <w:r>
+        <w:t>}</w:t>
+      </w:r>
+    </w:p>
+    <w:p>
+      <w:pPr>
+        <w:pStyle w:val="Titulo4Relatorio"/>
+      </w:pPr>
+      <w:r>
+        <w:t>HEAPSORT</w:t>
+      </w:r>
+    </w:p>
+    <w:p>
+      <w:pPr>
+        <w:ind w:firstLine="708"/>
+        <w:jc w:val="both"/>
+        <w:rPr>
+          <w:rFonts w:ascii="Times" w:eastAsiaTheme="minorEastAsia" w:hAnsi="Times" w:cs="Times"/>
+          <w:sz w:val="24"/>
+          <w:szCs w:val="24"/>
+        </w:rPr>
+      </w:pPr>
+      <w:r>
+        <w:rPr>
+          <w:rFonts w:ascii="Times" w:hAnsi="Times" w:cs="Times"/>
+          <w:sz w:val="24"/>
+          <w:szCs w:val="24"/>
+        </w:rPr>
+        <w:t xml:space="preserve">Para o procedimento </w:t>
+      </w:r>
+      <w:r>
+        <w:rPr>
+          <w:rFonts w:ascii="Times" w:hAnsi="Times" w:cs="Times"/>
+          <w:i/>
+          <w:sz w:val="24"/>
+          <w:szCs w:val="24"/>
+        </w:rPr>
+        <w:t>heapsort</w:t>
+      </w:r>
+      <w:r>
+        <w:rPr>
+          <w:rFonts w:ascii="Times" w:hAnsi="Times" w:cs="Times"/>
+          <w:i/>
+          <w:sz w:val="24"/>
+          <w:szCs w:val="24"/>
+        </w:rPr>
+        <w:t xml:space="preserve">(double* arr, long </w:t>
+      </w:r>
+      <w:r>
+        <w:rPr>
+          <w:rFonts w:ascii="Times" w:hAnsi="Times" w:cs="Times"/>
+          <w:i/>
+          <w:sz w:val="24"/>
+          <w:szCs w:val="24"/>
+        </w:rPr>
+        <w:t>arr_size</w:t>
+      </w:r>
+      <w:r>
+        <w:rPr>
+          <w:rFonts w:ascii="Times" w:hAnsi="Times" w:cs="Times"/>
+          <w:i/>
+          <w:sz w:val="24"/>
+          <w:szCs w:val="24"/>
+        </w:rPr>
+        <w:t>)</w:t>
+      </w:r>
+      <w:r>
+        <w:rPr>
+          <w:rFonts w:ascii="Times" w:hAnsi="Times" w:cs="Times"/>
+          <w:sz w:val="24"/>
+          <w:szCs w:val="24"/>
+        </w:rPr>
+        <w:t xml:space="preserve">, observa-se </w:t>
+      </w:r>
+      <w:r>
+        <w:rPr>
+          <w:rFonts w:ascii="Times" w:eastAsiaTheme="minorEastAsia" w:hAnsi="Times" w:cs="Times"/>
+          <w:sz w:val="24"/>
+          <w:szCs w:val="24"/>
+        </w:rPr>
+        <w:t xml:space="preserve">que em seus parâmetros são utilizados: um ponteiro do tipo </w:t>
+      </w:r>
+      <w:r>
+        <w:rPr>
+          <w:rFonts w:ascii="Times" w:eastAsiaTheme="minorEastAsia" w:hAnsi="Times" w:cs="Times"/>
+          <w:i/>
+          <w:sz w:val="24"/>
+          <w:szCs w:val="24"/>
+        </w:rPr>
+        <w:t>double</w:t>
+      </w:r>
+      <w:r>
+        <w:rPr>
+          <w:rFonts w:ascii="Times" w:eastAsiaTheme="minorEastAsia" w:hAnsi="Times" w:cs="Times"/>
+          <w:sz w:val="24"/>
+          <w:szCs w:val="24"/>
+        </w:rPr>
+        <w:t xml:space="preserve"> para o array de números de entrada e  uma variável do tipo </w:t>
+      </w:r>
+      <w:r>
+        <w:rPr>
+          <w:rFonts w:ascii="Times" w:eastAsiaTheme="minorEastAsia" w:hAnsi="Times" w:cs="Times"/>
+          <w:i/>
+          <w:sz w:val="24"/>
+          <w:szCs w:val="24"/>
+        </w:rPr>
+        <w:t>long</w:t>
+      </w:r>
+      <w:r>
+        <w:rPr>
+          <w:rFonts w:ascii="Times" w:eastAsiaTheme="minorEastAsia" w:hAnsi="Times" w:cs="Times"/>
+          <w:sz w:val="24"/>
+          <w:szCs w:val="24"/>
+        </w:rPr>
+        <w:t xml:space="preserve"> para receber o tamanho do array.</w:t>
+      </w:r>
+    </w:p>
+    <w:p>
+      <w:pPr>
+        <w:pStyle w:val="NormalRelatorio"/>
+      </w:pPr>
+      <w:r>
+        <w:rPr>
+          <w:rFonts w:eastAsiaTheme="minorEastAsia"/>
+        </w:rPr>
+        <w:t xml:space="preserve">Dentre os laços de repetições conseguintes, o primeiro </w:t>
+      </w:r>
+      <w:r>
+        <w:rPr>
+          <w:rFonts w:eastAsiaTheme="minorEastAsia"/>
+          <w:i/>
+        </w:rPr>
+        <w:t>for</w:t>
+      </w:r>
+      <w:r>
+        <w:rPr>
+          <w:rFonts w:eastAsiaTheme="minorEastAsia"/>
+        </w:rPr>
+        <w:t xml:space="preserve"> define uma variável temporária </w:t>
+      </w:r>
+      <m:oMath>
+        <m:r>
+          <w:rPr>
+            <w:rFonts w:ascii="Cambria Math" w:eastAsiaTheme="minorEastAsia" w:hAnsi="Cambria Math"/>
+          </w:rPr>
+          <m:t>i</m:t>
+        </m:r>
+      </m:oMath>
+      <w:r>
+        <w:rPr>
+          <w:rFonts w:eastAsiaTheme="minorEastAsia"/>
+        </w:rPr>
+        <w:t xml:space="preserve"> do tipo </w:t>
+      </w:r>
+      <w:r>
+        <w:rPr>
+          <w:rFonts w:eastAsiaTheme="minorEastAsia"/>
+          <w:i/>
+        </w:rPr>
+        <w:t>int</w:t>
+      </w:r>
+      <w:r>
+        <w:rPr>
+          <w:rFonts w:eastAsiaTheme="minorEastAsia"/>
+        </w:rPr>
+        <w:t xml:space="preserve"> </w:t>
+      </w:r>
+      <w:r>
+        <w:rPr>
+          <w:rFonts w:eastAsiaTheme="minorEastAsia"/>
+        </w:rPr>
+        <w:t>com o resultado</w:t>
+      </w:r>
+      <w:r>
+        <w:rPr>
+          <w:rFonts w:eastAsiaTheme="minorEastAsia"/>
+        </w:rPr>
+        <w:t xml:space="preserve"> </w:t>
+      </w:r>
+      <w:r>
+        <w:rPr>
+          <w:rFonts w:eastAsiaTheme="minorEastAsia"/>
+        </w:rPr>
+        <w:t xml:space="preserve">da equação: </w:t>
+      </w:r>
+      <w:r>
+        <w:rPr>
+          <w:rFonts w:eastAsiaTheme="minorEastAsia"/>
+          <w:i/>
+        </w:rPr>
+        <w:t>arr_size</w:t>
+      </w:r>
+      <w:r>
+        <w:rPr>
+          <w:rFonts w:eastAsiaTheme="minorEastAsia"/>
+        </w:rPr>
+        <w:t xml:space="preserve"> / 2 – 1. Já em sua condição intermediária, o laço será executado enquanto </w:t>
+      </w:r>
+      <m:oMath>
+        <m:r>
+          <w:rPr>
+            <w:rFonts w:ascii="Cambria Math" w:eastAsiaTheme="minorEastAsia" w:hAnsi="Cambria Math"/>
+          </w:rPr>
+          <m:t>i≥0</m:t>
+        </m:r>
+      </m:oMath>
+      <w:r>
+        <w:rPr>
+          <w:rFonts w:eastAsiaTheme="minorEastAsia"/>
+        </w:rPr>
+        <w:t xml:space="preserve">. E o contador </w:t>
+      </w:r>
+      <m:oMath>
+        <m:r>
+          <w:rPr>
+            <w:rFonts w:ascii="Cambria Math" w:eastAsiaTheme="minorEastAsia" w:hAnsi="Cambria Math"/>
+          </w:rPr>
+          <m:t>i</m:t>
+        </m:r>
+      </m:oMath>
+      <w:r>
+        <w:rPr>
+          <w:rFonts w:eastAsiaTheme="minorEastAsia"/>
+        </w:rPr>
+        <w:t xml:space="preserve"> irá decrementar/subtrair a posição a cada execução.</w:t>
+      </w:r>
+    </w:p>
+    <w:p>
+      <w:pPr>
+        <w:pStyle w:val="NormalRelatorio"/>
+        <w:rPr>
+          <w:rFonts w:eastAsiaTheme="minorEastAsia"/>
+        </w:rPr>
+      </w:pPr>
+      <w:r>
+        <w:rPr>
+          <w:rFonts w:eastAsiaTheme="minorEastAsia"/>
+        </w:rPr>
+        <w:t xml:space="preserve">Prosseguindo, </w:t>
+      </w:r>
+      <w:r>
+        <w:rPr>
+          <w:rFonts w:eastAsiaTheme="minorEastAsia"/>
+        </w:rPr>
+        <w:t xml:space="preserve">o primeiro </w:t>
+      </w:r>
+      <w:r>
+        <w:rPr>
+          <w:rFonts w:eastAsiaTheme="minorEastAsia"/>
+          <w:i/>
+        </w:rPr>
+        <w:t>for</w:t>
+      </w:r>
+      <w:r>
+        <w:rPr>
+          <w:rFonts w:eastAsiaTheme="minorEastAsia"/>
+        </w:rPr>
+        <w:t xml:space="preserve"> servirá para construir o </w:t>
+      </w:r>
+      <w:r>
+        <w:rPr>
+          <w:rFonts w:eastAsiaTheme="minorEastAsia"/>
+          <w:i/>
+        </w:rPr>
+        <w:t>max heap</w:t>
+      </w:r>
+      <w:r>
+        <w:rPr>
+          <w:rFonts w:eastAsiaTheme="minorEastAsia"/>
+        </w:rPr>
+        <w:t>,</w:t>
+      </w:r>
+      <w:r>
+        <w:rPr>
+          <w:rFonts w:eastAsiaTheme="minorEastAsia"/>
+        </w:rPr>
+        <w:t xml:space="preserve"> execultando a filtragem do </w:t>
+      </w:r>
+      <w:r>
+        <w:rPr>
+          <w:rFonts w:eastAsiaTheme="minorEastAsia"/>
+          <w:i/>
+        </w:rPr>
+        <w:t>heapify</w:t>
+      </w:r>
+      <w:r>
+        <w:rPr>
+          <w:rFonts w:eastAsiaTheme="minorEastAsia"/>
+        </w:rPr>
+        <w:t xml:space="preserve"> para reorganizar o heap</w:t>
+      </w:r>
+      <w:r>
+        <w:rPr>
+          <w:rFonts w:eastAsiaTheme="minorEastAsia"/>
+        </w:rPr>
+        <w:t xml:space="preserve"> a cada execução</w:t>
+      </w:r>
+      <w:r>
+        <w:rPr>
+          <w:rFonts w:eastAsiaTheme="minorEastAsia"/>
+        </w:rPr>
+        <w:t>.</w:t>
+      </w:r>
+      <w:r>
+        <w:rPr>
+          <w:rFonts w:eastAsiaTheme="minorEastAsia"/>
+          <w:i/>
+        </w:rPr>
+        <w:t xml:space="preserve"> </w:t>
+      </w:r>
+      <w:r>
+        <w:rPr>
+          <w:rFonts w:eastAsiaTheme="minorEastAsia"/>
+        </w:rPr>
+        <w:t>Para isso, definimos</w:t>
+      </w:r>
+      <w:r>
+        <w:rPr>
+          <w:rFonts w:eastAsiaTheme="minorEastAsia"/>
+        </w:rPr>
+        <w:t xml:space="preserve"> uma variável temporária </w:t>
+      </w:r>
+      <m:oMath>
+        <m:r>
+          <w:rPr>
+            <w:rFonts w:ascii="Cambria Math" w:eastAsiaTheme="minorEastAsia" w:hAnsi="Cambria Math"/>
+          </w:rPr>
+          <m:t>i</m:t>
+        </m:r>
+      </m:oMath>
+      <w:r>
+        <w:rPr>
+          <w:rFonts w:eastAsiaTheme="minorEastAsia"/>
+        </w:rPr>
+        <w:t xml:space="preserve"> do tipo </w:t>
+      </w:r>
+      <w:r>
+        <w:rPr>
+          <w:rFonts w:eastAsiaTheme="minorEastAsia"/>
+          <w:i/>
+        </w:rPr>
+        <w:t>int</w:t>
+      </w:r>
+      <w:r>
+        <w:rPr>
+          <w:rFonts w:eastAsiaTheme="minorEastAsia"/>
+        </w:rPr>
+        <w:t xml:space="preserve"> com o resultado da equação: </w:t>
+      </w:r>
+      <w:r>
+        <w:rPr>
+          <w:rFonts w:eastAsiaTheme="minorEastAsia"/>
+          <w:i/>
+        </w:rPr>
+        <w:t>arr_size</w:t>
+      </w:r>
+      <w:r>
+        <w:rPr>
+          <w:rFonts w:eastAsiaTheme="minorEastAsia"/>
+        </w:rPr>
+        <w:t xml:space="preserve"> / 2 – 1. Já</w:t>
+      </w:r>
+      <w:r>
+        <w:rPr>
+          <w:rFonts w:eastAsiaTheme="minorEastAsia"/>
+        </w:rPr>
+        <w:t xml:space="preserve"> que</w:t>
+      </w:r>
+      <w:r>
+        <w:rPr>
+          <w:rFonts w:eastAsiaTheme="minorEastAsia"/>
+        </w:rPr>
+        <w:t xml:space="preserve"> em sua condição intermediária, o laço será executado enquanto </w:t>
+      </w:r>
+      <m:oMath>
+        <m:r>
+          <w:rPr>
+            <w:rFonts w:ascii="Cambria Math" w:eastAsiaTheme="minorEastAsia" w:hAnsi="Cambria Math"/>
+          </w:rPr>
+          <m:t>i≥0</m:t>
+        </m:r>
+      </m:oMath>
+      <w:r>
+        <w:rPr>
+          <w:rFonts w:eastAsiaTheme="minorEastAsia"/>
+        </w:rPr>
+        <w:t xml:space="preserve">. E o contador </w:t>
+      </w:r>
+      <m:oMath>
+        <m:r>
+          <w:rPr>
+            <w:rFonts w:ascii="Cambria Math" w:eastAsiaTheme="minorEastAsia" w:hAnsi="Cambria Math"/>
+          </w:rPr>
+          <m:t>i</m:t>
+        </m:r>
+      </m:oMath>
+      <w:r>
+        <w:rPr>
+          <w:rFonts w:eastAsiaTheme="minorEastAsia"/>
+        </w:rPr>
+        <w:t xml:space="preserve"> irá decrementar, ou seja, subtrair a posição a cada execução. Em seguida, o procedimento </w:t>
+      </w:r>
+      <w:r>
+        <w:rPr>
+          <w:rFonts w:eastAsiaTheme="minorEastAsia"/>
+          <w:i/>
+        </w:rPr>
+        <w:t>heapify</w:t>
+      </w:r>
+      <w:r>
+        <w:rPr>
+          <w:rFonts w:eastAsiaTheme="minorEastAsia"/>
+          <w:i/>
+        </w:rPr>
+        <w:t xml:space="preserve"> </w:t>
+      </w:r>
+      <w:r>
+        <w:rPr>
+          <w:rFonts w:eastAsiaTheme="minorEastAsia"/>
+        </w:rPr>
+        <w:t xml:space="preserve">irá </w:t>
+      </w:r>
+      <w:r>
+        <w:rPr>
+          <w:rFonts w:eastAsiaTheme="minorEastAsia"/>
+        </w:rPr>
+        <w:t xml:space="preserve">ser executado </w:t>
+      </w:r>
+      <w:r>
+        <w:rPr>
+          <w:rFonts w:eastAsiaTheme="minorEastAsia"/>
+        </w:rPr>
+        <w:t xml:space="preserve">passando </w:t>
+      </w:r>
+      <w:r>
+        <w:rPr>
+          <w:rFonts w:eastAsiaTheme="minorEastAsia"/>
+        </w:rPr>
+        <w:t xml:space="preserve">os valores das variáveis: </w:t>
+      </w:r>
+      <w:r>
+        <w:rPr>
+          <w:rFonts w:eastAsiaTheme="minorEastAsia"/>
+          <w:i/>
+        </w:rPr>
+        <w:t>arr</w:t>
+      </w:r>
+      <w:r>
+        <w:rPr>
+          <w:rFonts w:eastAsiaTheme="minorEastAsia"/>
+        </w:rPr>
+        <w:t xml:space="preserve">, </w:t>
+      </w:r>
+      <w:r>
+        <w:rPr>
+          <w:rFonts w:eastAsiaTheme="minorEastAsia"/>
+          <w:i/>
+        </w:rPr>
+        <w:t>arr_size</w:t>
+      </w:r>
+      <w:r>
+        <w:rPr>
+          <w:rFonts w:eastAsiaTheme="minorEastAsia"/>
+        </w:rPr>
+        <w:t xml:space="preserve"> e </w:t>
+      </w:r>
+      <m:oMath>
+        <m:r>
+          <w:rPr>
+            <w:rFonts w:ascii="Cambria Math" w:eastAsiaTheme="minorEastAsia" w:hAnsi="Cambria Math"/>
+          </w:rPr>
+          <m:t>i</m:t>
+        </m:r>
+      </m:oMath>
+      <w:r>
+        <w:rPr>
+          <w:rFonts w:eastAsiaTheme="minorEastAsia"/>
+        </w:rPr>
+        <w:t>.</w:t>
+      </w:r>
+    </w:p>
+    <w:p>
+      <w:pPr>
+        <w:pStyle w:val="NormalRelatorio"/>
+      </w:pPr>
+      <w:r>
         <w:lastRenderedPageBreak/>
+        <w:t xml:space="preserve">Por último, </w:t>
+      </w:r>
+      <w:r>
+        <w:rPr>
+          <w:rFonts w:eastAsiaTheme="minorEastAsia"/>
+        </w:rPr>
+        <w:t xml:space="preserve">a última condição checa se </w:t>
+      </w:r>
+      <w:r>
+        <w:rPr>
+          <w:rFonts w:eastAsiaTheme="minorEastAsia"/>
+          <w:i/>
+        </w:rPr>
+        <w:t>valor_maximo</w:t>
+      </w:r>
+      <w:r>
+        <w:rPr>
+          <w:rFonts w:eastAsiaTheme="minorEastAsia"/>
+        </w:rPr>
+        <w:t xml:space="preserve"> é diferente d</w:t>
+      </w:r>
+      <w:r>
+        <w:rPr>
+          <w:rFonts w:eastAsiaTheme="minorEastAsia"/>
+        </w:rPr>
+        <w:t>a</w:t>
+      </w:r>
+      <w:r>
+        <w:rPr>
+          <w:rFonts w:eastAsiaTheme="minorEastAsia"/>
+        </w:rPr>
+        <w:t xml:space="preserve"> posição </w:t>
+      </w:r>
+      <m:oMath>
+        <m:r>
+          <w:rPr>
+            <w:rFonts w:ascii="Cambria Math" w:eastAsiaTheme="minorEastAsia" w:hAnsi="Cambria Math"/>
+          </w:rPr>
+          <m:t>i</m:t>
+        </m:r>
+      </m:oMath>
+      <w:r>
+        <w:t>, em outras palavras, se o valor da a raiz nao for o maior elemento(valor_maximo), prosseguir com swap(alternancia) e heapify(filtragem).</w:t>
+      </w:r>
+      <w:r>
+        <w:t xml:space="preserve"> </w:t>
+      </w:r>
+      <w:r>
+        <w:t xml:space="preserve">No fim, quando atendida, </w:t>
+      </w:r>
+      <w:r>
+        <w:rPr>
+          <w:i/>
+        </w:rPr>
+        <w:t>temp</w:t>
+      </w:r>
+      <w:r>
+        <w:t xml:space="preserve"> valerá uma determinada posição nesse array (representada por </w:t>
+      </w:r>
+      <w:r>
+        <w:rPr>
+          <w:i/>
+        </w:rPr>
+        <w:t>arr</w:t>
+      </w:r>
+      <w:r>
+        <w:t>[</w:t>
+      </w:r>
+      <m:oMath>
+        <m:r>
+          <w:rPr>
+            <w:rFonts w:ascii="Cambria Math" w:hAnsi="Cambria Math"/>
+          </w:rPr>
+          <m:t>i</m:t>
+        </m:r>
+      </m:oMath>
+      <w:r>
+        <w:t xml:space="preserve">]), e o procedimento de </w:t>
+      </w:r>
+      <w:r>
+        <w:rPr>
+          <w:i/>
+        </w:rPr>
+        <w:t>swap</w:t>
+      </w:r>
+      <w:r>
+        <w:t xml:space="preserve"> é executado considerando os endereços de </w:t>
+      </w:r>
+      <w:r>
+        <w:rPr>
+          <w:i/>
+        </w:rPr>
+        <w:t>arr</w:t>
+      </w:r>
+      <w:r>
+        <w:t>[</w:t>
+      </w:r>
+      <m:oMath>
+        <m:r>
+          <w:rPr>
+            <w:rFonts w:ascii="Cambria Math" w:hAnsi="Cambria Math"/>
+          </w:rPr>
+          <m:t>i</m:t>
+        </m:r>
+      </m:oMath>
+      <w:r>
+        <w:t xml:space="preserve">] e </w:t>
+      </w:r>
+      <w:r>
+        <w:rPr>
+          <w:i/>
+        </w:rPr>
+        <w:t>arr</w:t>
+      </w:r>
+      <w:r>
+        <w:t>[</w:t>
+      </w:r>
+      <w:r>
+        <w:rPr>
+          <w:rFonts w:eastAsiaTheme="minorEastAsia"/>
+          <w:i/>
+        </w:rPr>
+        <w:t>valor_maximo</w:t>
+      </w:r>
+      <w:r>
+        <w:t>], representado por:</w:t>
+      </w:r>
+      <w:r>
+        <w:t xml:space="preserve"> </w:t>
+      </w:r>
+      <w:r>
+        <w:t>&amp;</w:t>
+      </w:r>
+      <w:r>
+        <w:rPr>
+          <w:i/>
+        </w:rPr>
+        <w:t>arr</w:t>
+      </w:r>
+      <w:r>
+        <w:t>[</w:t>
+      </w:r>
+      <m:oMath>
+        <m:r>
+          <w:rPr>
+            <w:rFonts w:ascii="Cambria Math" w:hAnsi="Cambria Math"/>
+          </w:rPr>
+          <m:t>i</m:t>
+        </m:r>
+      </m:oMath>
+      <w:r>
+        <w:t>] e &amp;</w:t>
+      </w:r>
+      <w:r>
+        <w:rPr>
+          <w:i/>
+        </w:rPr>
+        <w:t>arr</w:t>
+      </w:r>
+      <w:r>
+        <w:t>[</w:t>
+      </w:r>
+      <w:r>
+        <w:rPr>
+          <w:rFonts w:eastAsiaTheme="minorEastAsia"/>
+          <w:i/>
+        </w:rPr>
+        <w:t>valor_maximo</w:t>
+      </w:r>
+      <w:r>
+        <w:t xml:space="preserve">]. Em seguida, após alternar os valores dos endereços de </w:t>
+      </w:r>
+      <w:r>
+        <w:rPr>
+          <w:i/>
+        </w:rPr>
+        <w:t>arr</w:t>
+      </w:r>
+      <w:r>
+        <w:t>[</w:t>
+      </w:r>
+      <m:oMath>
+        <m:r>
+          <w:rPr>
+            <w:rFonts w:ascii="Cambria Math" w:hAnsi="Cambria Math"/>
+          </w:rPr>
+          <m:t>i</m:t>
+        </m:r>
+      </m:oMath>
+      <w:r>
+        <w:t xml:space="preserve">] e </w:t>
+      </w:r>
+      <w:r>
+        <w:rPr>
+          <w:i/>
+        </w:rPr>
+        <w:t>arr</w:t>
+      </w:r>
+      <w:r>
+        <w:t>[</w:t>
+      </w:r>
+      <w:r>
+        <w:rPr>
+          <w:rFonts w:eastAsiaTheme="minorEastAsia"/>
+          <w:i/>
+        </w:rPr>
+        <w:t>valor_maximo</w:t>
+      </w:r>
+      <w:r>
+        <w:t xml:space="preserve">], o procedimento recursivo </w:t>
+      </w:r>
+      <w:r>
+        <w:rPr>
+          <w:i/>
+        </w:rPr>
+        <w:t>heapify</w:t>
+      </w:r>
+      <w:r>
+        <w:t>(</w:t>
+      </w:r>
+      <w:r>
+        <w:rPr>
+          <w:i/>
+        </w:rPr>
+        <w:t>arr, n, valor_maximo</w:t>
+      </w:r>
+      <w:r>
+        <w:t>)</w:t>
+      </w:r>
+      <w:r>
+        <w:t xml:space="preserve"> vai receber: </w:t>
+      </w:r>
+      <w:r>
+        <w:t>o array</w:t>
+      </w:r>
+      <w:r>
+        <w:t xml:space="preserve"> </w:t>
+      </w:r>
+      <m:oMath>
+        <m:r>
+          <w:rPr>
+            <w:rFonts w:ascii="Cambria Math" w:hAnsi="Cambria Math"/>
+          </w:rPr>
+          <m:t>arr</m:t>
+        </m:r>
+      </m:oMath>
+      <w:r>
+        <w:t>, o seu tamanho</w:t>
+      </w:r>
+      <w:r>
+        <w:t xml:space="preserve"> </w:t>
+      </w:r>
+      <m:oMath>
+        <m:r>
+          <w:rPr>
+            <w:rFonts w:ascii="Cambria Math" w:hAnsi="Cambria Math"/>
+          </w:rPr>
+          <m:t>n</m:t>
+        </m:r>
+      </m:oMath>
+      <w:r>
+        <w:t xml:space="preserve"> e </w:t>
+      </w:r>
+      <w:r>
+        <w:t>o valor do elemento-</w:t>
+      </w:r>
+      <w:r>
+        <w:t xml:space="preserve">raiz </w:t>
+      </w:r>
+      <w:r>
+        <w:t xml:space="preserve">em </w:t>
+      </w:r>
+      <w:r>
+        <w:rPr>
+          <w:i/>
+        </w:rPr>
+        <w:t>valor</w:t>
+      </w:r>
+      <w:r>
+        <w:rPr>
+          <w:i/>
+        </w:rPr>
+        <w:t>_maximo</w:t>
+      </w:r>
+      <w:r>
+        <w:t>. Finalmente, o</w:t>
+      </w:r>
+      <w:r>
+        <w:t xml:space="preserve"> </w:t>
+      </w:r>
+      <w:r>
         <w:t xml:space="preserve">chamado recursivo de </w:t>
       </w:r>
       <w:r>
@@ -9962,450 +11279,245 @@
         <w:t>)</w:t>
       </w:r>
       <w:r>
+        <w:t xml:space="preserve"> utilizará tais parâmetros para reestruturar o heap, quando necessário. Podendo ser implementado através deste formato:3</w:t>
+      </w:r>
+    </w:p>
+    <w:p>
+      <w:pPr>
+        <w:pStyle w:val="Codigo"/>
+      </w:pPr>
+      <w:r>
+        <w:t>//procedimento heap sort</w:t>
+      </w:r>
+    </w:p>
+    <w:p>
+      <w:pPr>
+        <w:pStyle w:val="Codigo"/>
+      </w:pPr>
+      <w:r>
+        <w:t>void heapsort(double* arr, long arr_size)</w:t>
+      </w:r>
+    </w:p>
+    <w:p>
+      <w:pPr>
+        <w:pStyle w:val="Codigo"/>
+      </w:pPr>
+      <w:r>
+        <w:t>{</w:t>
+      </w:r>
+    </w:p>
+    <w:p>
+      <w:pPr>
+        <w:pStyle w:val="Codigo"/>
+      </w:pPr>
+      <w:r>
+        <w:t xml:space="preserve">    //construindo max heap</w:t>
+      </w:r>
+    </w:p>
+    <w:p>
+      <w:pPr>
+        <w:pStyle w:val="Codigo"/>
+      </w:pPr>
+      <w:r>
+        <w:t xml:space="preserve">    for (int i = arr_size / 2 - 1; i &gt;= 0; i--) {</w:t>
+      </w:r>
+    </w:p>
+    <w:p>
+      <w:pPr>
+        <w:pStyle w:val="Codigo"/>
+      </w:pPr>
+      <w:r>
+        <w:t xml:space="preserve">        heapify(arr, arr_size, i);</w:t>
+      </w:r>
+    </w:p>
+    <w:p>
+      <w:pPr>
+        <w:pStyle w:val="Codigo"/>
+      </w:pPr>
+      <w:r>
+        <w:t xml:space="preserve">    }</w:t>
+      </w:r>
+    </w:p>
+    <w:p>
+      <w:pPr>
+        <w:pStyle w:val="Codigo"/>
+      </w:pPr>
+    </w:p>
+    <w:p>
+      <w:pPr>
+        <w:pStyle w:val="Codigo"/>
+      </w:pPr>
+      <w:r>
+        <w:t xml:space="preserve">    //realizando o heap sort</w:t>
+      </w:r>
+    </w:p>
+    <w:p>
+      <w:pPr>
+        <w:pStyle w:val="Codigo"/>
+      </w:pPr>
+      <w:r>
+        <w:t xml:space="preserve">    for (int i = arr_size - 1; i &gt;= 0; i--) {</w:t>
+      </w:r>
+    </w:p>
+    <w:p>
+      <w:pPr>
+        <w:pStyle w:val="Codigo"/>
+      </w:pPr>
+    </w:p>
+    <w:p>
+      <w:pPr>
+        <w:pStyle w:val="Codigo"/>
+      </w:pPr>
+      <w:r>
+        <w:t xml:space="preserve">        //alternando a raiz com uma determinada posicao do array</w:t>
+      </w:r>
+    </w:p>
+    <w:p>
+      <w:pPr>
+        <w:pStyle w:val="Codigo"/>
+      </w:pPr>
+      <w:r>
+        <w:t xml:space="preserve">        swap(&amp;arr[0], &amp;arr[i]);</w:t>
+      </w:r>
+    </w:p>
+    <w:p>
+      <w:pPr>
+        <w:pStyle w:val="Codigo"/>
+      </w:pPr>
+    </w:p>
+    <w:p>
+      <w:pPr>
+        <w:pStyle w:val="Codigo"/>
+      </w:pPr>
+      <w:r>
+        <w:t xml:space="preserve">        //aplicando heapify na raiz para que o maior elemento volte para a raiz.</w:t>
+      </w:r>
+    </w:p>
+    <w:p>
+      <w:pPr>
+        <w:pStyle w:val="Codigo"/>
+      </w:pPr>
+      <w:r>
+        <w:t xml:space="preserve">        heapify(arr, i, 0);</w:t>
+      </w:r>
+    </w:p>
+    <w:p>
+      <w:pPr>
+        <w:pStyle w:val="Codigo"/>
+      </w:pPr>
+      <w:r>
+        <w:t xml:space="preserve">    }</w:t>
+      </w:r>
+    </w:p>
+    <w:p>
+      <w:pPr>
+        <w:pStyle w:val="Codigo"/>
+      </w:pPr>
+      <w:r>
+        <w:t>}</w:t>
+      </w:r>
+    </w:p>
+    <w:p>
+      <w:pPr>
+        <w:pStyle w:val="Titulo2Relatorio"/>
+      </w:pPr>
+      <w:bookmarkStart w:id="15" w:name="_Toc200292943"/>
+      <w:r>
+        <w:t>R</w:t>
+      </w:r>
+      <w:r>
+        <w:t>esultados Dos Testes</w:t>
+      </w:r>
+      <w:bookmarkEnd w:id="15"/>
+    </w:p>
+    <w:p>
+      <w:pPr>
+        <w:pStyle w:val="Titulo3Relatorio"/>
+      </w:pPr>
+      <w:bookmarkStart w:id="16" w:name="_Toc200292944"/>
+      <w:r>
+        <w:t>Ordered Input</w:t>
+      </w:r>
+      <w:bookmarkEnd w:id="16"/>
+    </w:p>
+    <w:p>
+      <w:pPr>
+        <w:pStyle w:val="NormalRelatorio"/>
+      </w:pPr>
+      <w:r>
+        <w:t>Para cada arquivo de</w:t>
+      </w:r>
+      <w:r>
         <w:t xml:space="preserve"> </w:t>
       </w:r>
       <w:r>
-        <w:t>utilizará tais parâmetros para reestruturar o heap</w:t>
-      </w:r>
-      <w:r>
-        <w:t>,</w:t>
-      </w:r>
-      <w:r>
-        <w:t xml:space="preserve"> quando necessário.</w:t>
-      </w:r>
-      <w:r>
-        <w:t xml:space="preserve"> Podendo ser implementado</w:t>
-      </w:r>
-      <w:r>
-        <w:t xml:space="preserve"> através</w:t>
-      </w:r>
-      <w:r>
-        <w:t xml:space="preserve"> deste formato:</w:t>
-      </w:r>
-    </w:p>
-    <w:p>
-      <w:pPr>
-        <w:pStyle w:val="Codigo"/>
-      </w:pPr>
-      <w:r>
-        <w:t>//funcao da filtragem(heapify)</w:t>
-      </w:r>
-    </w:p>
-    <w:p>
-      <w:pPr>
-        <w:pStyle w:val="Codigo"/>
-      </w:pPr>
-      <w:r>
-        <w:t>void heapify(double* arr, long n, long i)</w:t>
-      </w:r>
-    </w:p>
-    <w:p>
-      <w:pPr>
-        <w:pStyle w:val="Codigo"/>
-      </w:pPr>
-      <w:r>
-        <w:t>{</w:t>
-      </w:r>
-    </w:p>
-    <w:p>
-      <w:pPr>
-        <w:pStyle w:val="Codigo"/>
-      </w:pPr>
-      <w:r>
-        <w:t xml:space="preserve">    //arr eh o array</w:t>
-      </w:r>
-    </w:p>
-    <w:p>
-      <w:pPr>
-        <w:pStyle w:val="Codigo"/>
-      </w:pPr>
-      <w:r>
-        <w:t xml:space="preserve">    //i eh a posicao</w:t>
-      </w:r>
-    </w:p>
-    <w:p>
-      <w:pPr>
-        <w:pStyle w:val="Codigo"/>
-      </w:pPr>
-      <w:r>
-        <w:t xml:space="preserve">    //n eh a enesima posicao(tamanho do array/qntde de elementos no array)</w:t>
-      </w:r>
-    </w:p>
-    <w:p>
-      <w:pPr>
-        <w:pStyle w:val="Codigo"/>
-      </w:pPr>
-    </w:p>
-    <w:p>
-      <w:pPr>
-        <w:pStyle w:val="Codigo"/>
-      </w:pPr>
-      <w:r>
-        <w:t xml:space="preserve">    //encontrando o maior valor(valor_maximo) entre a raiz, posicao_esq e posicao_dir</w:t>
-      </w:r>
-    </w:p>
-    <w:p>
-      <w:pPr>
-        <w:pStyle w:val="Codigo"/>
-      </w:pPr>
-      <w:r>
-        <w:t xml:space="preserve">    double temp;</w:t>
-      </w:r>
-    </w:p>
-    <w:p>
-      <w:pPr>
-        <w:pStyle w:val="Codigo"/>
-      </w:pPr>
-      <w:r>
-        <w:t xml:space="preserve">    long valor_maximo, posicao_esq, posicao_dir;</w:t>
-      </w:r>
-    </w:p>
-    <w:p>
-      <w:pPr>
-        <w:pStyle w:val="Codigo"/>
-      </w:pPr>
-    </w:p>
-    <w:p>
-      <w:pPr>
-        <w:pStyle w:val="Codigo"/>
-      </w:pPr>
-      <w:r>
-        <w:t xml:space="preserve">    valor_maximo = i;</w:t>
-      </w:r>
-    </w:p>
-    <w:p>
-      <w:pPr>
-        <w:pStyle w:val="Codigo"/>
-      </w:pPr>
-      <w:r>
-        <w:t xml:space="preserve">    posicao_esq = 2 * i + 1;</w:t>
-      </w:r>
-    </w:p>
-    <w:p>
-      <w:pPr>
-        <w:pStyle w:val="Codigo"/>
-      </w:pPr>
-      <w:r>
-        <w:t xml:space="preserve">    posicao_dir = 2 * i + 2;</w:t>
-      </w:r>
-    </w:p>
-    <w:p>
-      <w:pPr>
-        <w:pStyle w:val="Codigo"/>
-      </w:pPr>
-    </w:p>
-    <w:p>
-      <w:pPr>
-        <w:pStyle w:val="Codigo"/>
-      </w:pPr>
-      <w:r>
-        <w:t xml:space="preserve">    //se o valor da posicao_esq existir/for menor que o tamanho do array(enesima posicao)</w:t>
-      </w:r>
-    </w:p>
-    <w:p>
-      <w:pPr>
-        <w:pStyle w:val="Codigo"/>
-      </w:pPr>
-      <w:r>
-        <w:t xml:space="preserve">    //e for maior que a raiz do array</w:t>
-      </w:r>
-    </w:p>
-    <w:p>
-      <w:pPr>
-        <w:pStyle w:val="Codigo"/>
-      </w:pPr>
-      <w:r>
-        <w:t xml:space="preserve">    if (posicao_esq &lt; n &amp;&amp; arr[posicao_esq] &gt; arr[valor_maximo])</w:t>
-      </w:r>
-    </w:p>
-    <w:p>
-      <w:pPr>
-        <w:pStyle w:val="Codigo"/>
-      </w:pPr>
-    </w:p>
-    <w:p>
-      <w:pPr>
-        <w:pStyle w:val="Codigo"/>
-      </w:pPr>
-      <w:r>
-        <w:t xml:space="preserve">        //a raiz da arvore sera atualizada pelo valor da posicao_esq</w:t>
-      </w:r>
-    </w:p>
-    <w:p>
-      <w:pPr>
-        <w:pStyle w:val="Codigo"/>
-      </w:pPr>
-      <w:r>
-        <w:t xml:space="preserve">        valor_maximo = posicao_esq;</w:t>
-      </w:r>
-    </w:p>
-    <w:p>
-      <w:pPr>
-        <w:pStyle w:val="Codigo"/>
-      </w:pPr>
-    </w:p>
-    <w:p>
-      <w:pPr>
-        <w:pStyle w:val="Codigo"/>
-      </w:pPr>
-      <w:r>
-        <w:t xml:space="preserve">    //se o valor da posicao_dir existir/for menor que enesima posicao/o tamanho do array</w:t>
-      </w:r>
-    </w:p>
-    <w:p>
-      <w:pPr>
-        <w:pStyle w:val="Codigo"/>
-      </w:pPr>
-      <w:r>
-        <w:t xml:space="preserve">    //e for maior que a raiz do array</w:t>
-      </w:r>
-    </w:p>
-    <w:p>
-      <w:pPr>
-        <w:pStyle w:val="Codigo"/>
-      </w:pPr>
-      <w:r>
-        <w:t xml:space="preserve">    if (posicao_dir &lt; n &amp;&amp; arr[posicao_dir] &gt; arr[valor_maximo])</w:t>
-      </w:r>
-    </w:p>
-    <w:p>
-      <w:pPr>
-        <w:pStyle w:val="Codigo"/>
-      </w:pPr>
-    </w:p>
-    <w:p>
-      <w:pPr>
-        <w:pStyle w:val="Codigo"/>
-      </w:pPr>
+        <w:t>entrada</w:t>
+      </w:r>
+      <w:r>
+        <w:t xml:space="preserve">, foram executados os testes para ordenar vetores de tamanhos de: 10.000 a 4.000.000 de elementos. Quando foram executados, comparamos as </w:t>
+      </w:r>
       <w:r>
         <w:lastRenderedPageBreak/>
-        <w:t xml:space="preserve">        //a raiz da arvore sera atualizada pelo valor da posicao_dir</w:t>
-      </w:r>
-    </w:p>
-    <w:p>
-      <w:pPr>
-        <w:pStyle w:val="Codigo"/>
-      </w:pPr>
-      <w:r>
-        <w:t xml:space="preserve">        valor_maximo = posicao_dir;</w:t>
-      </w:r>
-    </w:p>
-    <w:p>
-      <w:pPr>
-        <w:pStyle w:val="Codigo"/>
-      </w:pPr>
-    </w:p>
-    <w:p>
-      <w:pPr>
-        <w:pStyle w:val="Codigo"/>
-      </w:pPr>
-      <w:r>
-        <w:t xml:space="preserve">    //se a raiz nao for o maior elemento(valor_maximo), prosseguir com swap(alternancia) e heapify(filtragem).</w:t>
-      </w:r>
-    </w:p>
-    <w:p>
-      <w:pPr>
-        <w:pStyle w:val="Codigo"/>
-      </w:pPr>
-      <w:r>
-        <w:t xml:space="preserve">    if (valor_maximo != i) {</w:t>
-      </w:r>
-    </w:p>
-    <w:p>
-      <w:pPr>
-        <w:pStyle w:val="Codigo"/>
-      </w:pPr>
-    </w:p>
-    <w:p>
-      <w:pPr>
-        <w:pStyle w:val="Codigo"/>
-      </w:pPr>
-      <w:r>
-        <w:t xml:space="preserve">        //temp valera uma determinada posicao do array</w:t>
-      </w:r>
-    </w:p>
-    <w:p>
-      <w:pPr>
-        <w:pStyle w:val="Codigo"/>
-      </w:pPr>
-      <w:r>
-        <w:t xml:space="preserve">        temp = arr[i];</w:t>
-      </w:r>
-    </w:p>
-    <w:p>
-      <w:pPr>
-        <w:pStyle w:val="Codigo"/>
-      </w:pPr>
-    </w:p>
-    <w:p>
-      <w:pPr>
-        <w:pStyle w:val="Codigo"/>
-      </w:pPr>
-      <w:r>
-        <w:t xml:space="preserve">        //alternara essa determinada posicao do array com a raiz</w:t>
-      </w:r>
-    </w:p>
-    <w:p>
-      <w:pPr>
-        <w:pStyle w:val="Codigo"/>
-      </w:pPr>
-      <w:r>
-        <w:t xml:space="preserve">        swap(&amp;arr[i], &amp;arr[valor_maximo]);</w:t>
-      </w:r>
-    </w:p>
-    <w:p>
-      <w:pPr>
-        <w:pStyle w:val="Codigo"/>
-      </w:pPr>
-    </w:p>
-    <w:p>
-      <w:pPr>
-        <w:pStyle w:val="Codigo"/>
-      </w:pPr>
-      <w:r>
-        <w:t xml:space="preserve">        //e passara o array, o seu tamanho e raiz para filtrar</w:t>
-      </w:r>
-    </w:p>
-    <w:p>
-      <w:pPr>
-        <w:pStyle w:val="Codigo"/>
-      </w:pPr>
-      <w:r>
-        <w:t xml:space="preserve">        heapify(arr, n, valor_maximo);</w:t>
-      </w:r>
-    </w:p>
-    <w:p>
-      <w:pPr>
-        <w:pStyle w:val="Codigo"/>
-      </w:pPr>
-      <w:r>
-        <w:t xml:space="preserve">    }</w:t>
-      </w:r>
-    </w:p>
-    <w:p>
-      <w:pPr>
-        <w:pStyle w:val="Codigo"/>
-      </w:pPr>
-      <w:r>
-        <w:t>}</w:t>
-      </w:r>
-    </w:p>
-    <w:p>
-      <w:pPr>
-        <w:pStyle w:val="Titulo4Relatorio"/>
-      </w:pPr>
-      <w:r>
-        <w:t>HEAPSORT</w:t>
-      </w:r>
-    </w:p>
-    <w:p>
-      <w:pPr>
-        <w:pStyle w:val="NormalRelatorio"/>
-      </w:pPr>
-      <w:r>
-        <w:t>sdfsfs</w:t>
-      </w:r>
-    </w:p>
-    <w:p>
-      <w:pPr>
-        <w:jc w:val="both"/>
-        <w:rPr>
-          <w:rFonts w:ascii="Times" w:hAnsi="Times" w:cs="Times"/>
-          <w:sz w:val="20"/>
-          <w:szCs w:val="24"/>
-        </w:rPr>
-      </w:pPr>
+        <w:t xml:space="preserve">execuções dos algoritmos de ordenação </w:t>
+      </w:r>
+      <w:r>
+        <w:rPr>
+          <w:b/>
+          <w:i/>
+        </w:rPr>
+        <w:t>Quicksort</w:t>
+      </w:r>
+      <w:r>
+        <w:rPr>
+          <w:i/>
+        </w:rPr>
+        <w:t xml:space="preserve">, </w:t>
+      </w:r>
+      <w:r>
+        <w:rPr>
+          <w:b/>
+          <w:i/>
+        </w:rPr>
+        <w:t>Selectionsort</w:t>
+      </w:r>
+      <w:r>
+        <w:rPr>
+          <w:i/>
+        </w:rPr>
+        <w:t xml:space="preserve"> e </w:t>
+      </w:r>
+      <w:r>
+        <w:rPr>
+          <w:b/>
+          <w:i/>
+        </w:rPr>
+        <w:t>Heapsort</w:t>
+      </w:r>
+      <w:r>
+        <w:rPr>
+          <w:i/>
+        </w:rPr>
+        <w:t xml:space="preserve">, </w:t>
+      </w:r>
+      <w:r>
+        <w:t>através dos seus tempos de execução nas tabelas e gráficos a seguir.</w:t>
+      </w:r>
     </w:p>
     <w:p>
       <w:pPr>
         <w:pStyle w:val="Titulo2Relatorio"/>
       </w:pPr>
-      <w:bookmarkStart w:id="15" w:name="_Toc200230221"/>
-      <w:r>
-        <w:t>Tabelas e/ou gráficos deverão ser utilizados para apresentação dos resultados dos testes.</w:t>
-      </w:r>
-      <w:bookmarkEnd w:id="15"/>
-      <w:r>
-        <w:t xml:space="preserve"> </w:t>
-      </w:r>
-    </w:p>
-    <w:p>
-      <w:pPr>
-        <w:pStyle w:val="Ttulo2"/>
-        <w:jc w:val="both"/>
-        <w:rPr>
-          <w:rFonts w:ascii="Times" w:hAnsi="Times" w:cs="Times"/>
-          <w:sz w:val="24"/>
-          <w:szCs w:val="24"/>
-        </w:rPr>
-      </w:pPr>
-      <w:bookmarkStart w:id="16" w:name="_Toc200230222"/>
-      <w:r>
-        <w:rPr>
-          <w:rFonts w:ascii="Times" w:hAnsi="Times" w:cs="Times"/>
-          <w:sz w:val="24"/>
-          <w:szCs w:val="24"/>
-        </w:rPr>
-        <w:t>Incluir detalhes da configuração do computador usado para testes: sistema Operacional, quantidade de RAM, velocidade da CPU (Hz).</w:t>
-      </w:r>
-      <w:bookmarkEnd w:id="16"/>
-    </w:p>
-    <w:p>
-      <w:pPr>
-        <w:pStyle w:val="NormalRelatorio"/>
-      </w:pPr>
-      <w:r>
-        <w:t xml:space="preserve">Dentre </w:t>
-      </w:r>
-      <w:r>
-        <w:t>a</w:t>
-      </w:r>
-      <w:r>
-        <w:t xml:space="preserve">s configurações do computador utilizado </w:t>
-      </w:r>
-      <w:r>
-        <w:t xml:space="preserve">para executar </w:t>
-      </w:r>
-      <w:r>
-        <w:t>os testes comparativos dos algoritmos de ordenação</w:t>
-      </w:r>
-      <w:r>
-        <w:t>, incluem-se</w:t>
-      </w:r>
-      <w:r>
-        <w:t>:</w:t>
-      </w:r>
-    </w:p>
-    <w:p>
-      <w:pPr>
-        <w:pStyle w:val="Ttulo3"/>
-      </w:pPr>
-      <w:bookmarkStart w:id="17" w:name="_Toc200230223"/>
-      <w:r>
-        <w:t>Sistema Operacional</w:t>
-      </w:r>
-      <w:bookmarkEnd w:id="17"/>
-    </w:p>
-    <w:p/>
-    <w:p>
-      <w:pPr>
-        <w:keepNext/>
-        <w:jc w:val="both"/>
-      </w:pPr>
-      <w:r>
-        <w:rPr>
-          <w:rFonts w:ascii="Times" w:eastAsiaTheme="minorEastAsia" w:hAnsi="Times" w:cs="Times"/>
+      <w:r>
+        <w:rPr>
           <w:noProof/>
-          <w:sz w:val="24"/>
-          <w:szCs w:val="24"/>
           <w:lang w:eastAsia="pt-BR"/>
         </w:rPr>
         <w:lastRenderedPageBreak/>
         <w:drawing>
           <wp:inline distT="0" distB="0" distL="0" distR="0">
-            <wp:extent cx="5731510" cy="3074670"/>
-            <wp:effectExtent l="19050" t="0" r="2540" b="0"/>
-            <wp:docPr id="2" name="Imagem 1" descr="Sistema_Operacional.PNG"/>
+            <wp:extent cx="4138019" cy="3917020"/>
+            <wp:effectExtent l="19050" t="0" r="0" b="0"/>
+            <wp:docPr id="12" name="Imagem 11" descr="ordered_input.PNG"/>
             <wp:cNvGraphicFramePr>
               <a:graphicFrameLocks xmlns:a="http://schemas.openxmlformats.org/drawingml/2006/main" noChangeAspect="1"/>
             </wp:cNvGraphicFramePr>
@@ -10413,7 +11525,7 @@
               <a:graphicData uri="http://schemas.openxmlformats.org/drawingml/2006/picture">
                 <pic:pic xmlns:pic="http://schemas.openxmlformats.org/drawingml/2006/picture">
                   <pic:nvPicPr>
-                    <pic:cNvPr id="0" name="Sistema_Operacional.PNG"/>
+                    <pic:cNvPr id="0" name="ordered_input.PNG"/>
                     <pic:cNvPicPr/>
                   </pic:nvPicPr>
                   <pic:blipFill>
@@ -10425,7 +11537,7 @@
                   <pic:spPr>
                     <a:xfrm>
                       <a:off x="0" y="0"/>
-                      <a:ext cx="5731510" cy="3074670"/>
+                      <a:ext cx="4138019" cy="3917020"/>
                     </a:xfrm>
                     <a:prstGeom prst="rect">
                       <a:avLst/>
@@ -10440,60 +11552,18 @@
     </w:p>
     <w:p>
       <w:pPr>
-        <w:pStyle w:val="Legenda"/>
-        <w:jc w:val="both"/>
-        <w:rPr>
-          <w:rFonts w:ascii="Times" w:eastAsiaTheme="minorEastAsia" w:hAnsi="Times" w:cs="Times"/>
-          <w:sz w:val="24"/>
-          <w:szCs w:val="24"/>
-        </w:rPr>
-      </w:pPr>
-      <w:r>
-        <w:t xml:space="preserve">Figura </w:t>
-      </w:r>
-      <w:fldSimple w:instr=" SEQ Figura \* ARABIC ">
-        <w:r>
-          <w:rPr>
-            <w:noProof/>
-          </w:rPr>
-          <w:t>1</w:t>
-        </w:r>
-      </w:fldSimple>
-      <w:r>
-        <w:t xml:space="preserve"> - Consultando Sistema Operacional através da interface Informações do Sistema.</w:t>
-      </w:r>
-    </w:p>
-    <w:p>
-      <w:pPr>
-        <w:pStyle w:val="Ttulo3"/>
-        <w:rPr>
-          <w:rFonts w:eastAsiaTheme="minorEastAsia"/>
-        </w:rPr>
-      </w:pPr>
-      <w:bookmarkStart w:id="18" w:name="_Toc200230224"/>
-      <w:r>
-        <w:rPr>
-          <w:rFonts w:eastAsiaTheme="minorEastAsia"/>
-        </w:rPr>
-        <w:t>RAM</w:t>
-      </w:r>
-      <w:bookmarkEnd w:id="18"/>
-    </w:p>
-    <w:p>
-      <w:pPr>
         <w:pStyle w:val="Titulo2Relatorio"/>
       </w:pPr>
       <w:r>
         <w:rPr>
-          <w:rFonts w:eastAsiaTheme="minorEastAsia"/>
           <w:noProof/>
           <w:lang w:eastAsia="pt-BR"/>
         </w:rPr>
         <w:drawing>
           <wp:inline distT="0" distB="0" distL="0" distR="0">
-            <wp:extent cx="5731510" cy="3074670"/>
+            <wp:extent cx="5731510" cy="3683000"/>
             <wp:effectExtent l="19050" t="0" r="2540" b="0"/>
-            <wp:docPr id="3" name="Imagem 2" descr="RAM.PNG"/>
+            <wp:docPr id="15" name="Imagem 14" descr="ordered_input_grafico.PNG"/>
             <wp:cNvGraphicFramePr>
               <a:graphicFrameLocks xmlns:a="http://schemas.openxmlformats.org/drawingml/2006/main" noChangeAspect="1"/>
             </wp:cNvGraphicFramePr>
@@ -10501,7 +11571,7 @@
               <a:graphicData uri="http://schemas.openxmlformats.org/drawingml/2006/picture">
                 <pic:pic xmlns:pic="http://schemas.openxmlformats.org/drawingml/2006/picture">
                   <pic:nvPicPr>
-                    <pic:cNvPr id="0" name="RAM.PNG"/>
+                    <pic:cNvPr id="0" name="ordered_input_grafico.PNG"/>
                     <pic:cNvPicPr/>
                   </pic:nvPicPr>
                   <pic:blipFill>
@@ -10513,7 +11583,7 @@
                   <pic:spPr>
                     <a:xfrm>
                       <a:off x="0" y="0"/>
-                      <a:ext cx="5731510" cy="3074670"/>
+                      <a:ext cx="5731510" cy="3683000"/>
                     </a:xfrm>
                     <a:prstGeom prst="rect">
                       <a:avLst/>
@@ -10528,148 +11598,29 @@
     </w:p>
     <w:p>
       <w:pPr>
-        <w:pStyle w:val="Legenda"/>
-        <w:jc w:val="both"/>
-      </w:pPr>
-      <w:r>
-        <w:t xml:space="preserve">Figura </w:t>
-      </w:r>
-      <w:fldSimple w:instr=" SEQ Figura \* ARABIC ">
-        <w:r>
-          <w:rPr>
-            <w:noProof/>
-          </w:rPr>
-          <w:t>2</w:t>
-        </w:r>
-      </w:fldSimple>
-      <w:r>
-        <w:t xml:space="preserve"> - </w:t>
-      </w:r>
-      <w:r>
-        <w:t xml:space="preserve">Consultando </w:t>
-      </w:r>
-      <w:r>
-        <w:t>Memória RAM</w:t>
-      </w:r>
-      <w:r>
-        <w:t xml:space="preserve"> através da interface Informações do Sistema.</w:t>
-      </w:r>
-    </w:p>
-    <w:p>
-      <w:pPr>
-        <w:pStyle w:val="Ttulo1"/>
-        <w:numPr>
-          <w:ilvl w:val="0"/>
-          <w:numId w:val="6"/>
-        </w:numPr>
-        <w:jc w:val="both"/>
-        <w:rPr>
-          <w:rFonts w:ascii="Times" w:hAnsi="Times" w:cs="Times"/>
-          <w:sz w:val="24"/>
-          <w:szCs w:val="24"/>
-        </w:rPr>
-      </w:pPr>
-      <w:bookmarkStart w:id="19" w:name="_Toc200230225"/>
-      <w:r>
-        <w:rPr>
-          <w:rFonts w:ascii="Times" w:hAnsi="Times" w:cs="Times"/>
-          <w:sz w:val="24"/>
-          <w:szCs w:val="24"/>
-        </w:rPr>
-        <w:t>Conclusão</w:t>
-      </w:r>
-      <w:bookmarkEnd w:id="19"/>
-    </w:p>
-    <w:p>
-      <w:pPr>
-        <w:pStyle w:val="Ttulo2"/>
-        <w:jc w:val="both"/>
-        <w:rPr>
-          <w:rFonts w:ascii="Times" w:hAnsi="Times" w:cs="Times"/>
-          <w:sz w:val="24"/>
-          <w:szCs w:val="24"/>
-        </w:rPr>
-      </w:pPr>
-      <w:bookmarkStart w:id="20" w:name="_Toc200230226"/>
-      <w:r>
-        <w:rPr>
-          <w:rFonts w:ascii="Times" w:hAnsi="Times" w:cs="Times"/>
-          <w:sz w:val="24"/>
-          <w:szCs w:val="24"/>
-        </w:rPr>
-        <w:t>Analisar os pontos fortes e fracos do algoritmo em comparação com outros algoritmos.</w:t>
-      </w:r>
-      <w:bookmarkEnd w:id="20"/>
-      <w:r>
-        <w:rPr>
-          <w:rFonts w:ascii="Times" w:hAnsi="Times" w:cs="Times"/>
-          <w:sz w:val="24"/>
-          <w:szCs w:val="24"/>
-        </w:rPr>
-        <w:t xml:space="preserve"> </w:t>
-      </w:r>
-    </w:p>
-    <w:p>
-      <w:pPr>
-        <w:pStyle w:val="PargrafodaLista"/>
-        <w:numPr>
-          <w:ilvl w:val="0"/>
-          <w:numId w:val="10"/>
-        </w:numPr>
-      </w:pPr>
-      <w:r>
-        <w:t>Mesma Grandeza em todos os casos.</w:t>
-      </w:r>
-    </w:p>
-    <w:p>
-      <w:pPr>
-        <w:pStyle w:val="PargrafodaLista"/>
-        <w:numPr>
-          <w:ilvl w:val="0"/>
-          <w:numId w:val="10"/>
-        </w:numPr>
-      </w:pPr>
-      <w:r>
-        <w:t>Versão melhorada do algoritmo de ordenação Selection Sort</w:t>
-      </w:r>
-      <w:r>
-        <w:t>.</w:t>
-      </w:r>
-    </w:p>
-    <w:p>
-      <w:pPr>
-        <w:pStyle w:val="Ttulo2"/>
-        <w:jc w:val="both"/>
-        <w:rPr>
-          <w:rFonts w:ascii="Times" w:hAnsi="Times" w:cs="Times"/>
-          <w:sz w:val="24"/>
-          <w:szCs w:val="24"/>
-        </w:rPr>
-      </w:pPr>
-      <w:bookmarkStart w:id="21" w:name="_Toc200230227"/>
-      <w:r>
-        <w:rPr>
-          <w:rFonts w:ascii="Times" w:hAnsi="Times" w:cs="Times"/>
-          <w:sz w:val="24"/>
-          <w:szCs w:val="24"/>
-        </w:rPr>
-        <w:lastRenderedPageBreak/>
-        <w:t>Avaliar o desempenho do algoritmo em comparação com a implementação do Quicksort disponível na linguagem C.</w:t>
-      </w:r>
-      <w:bookmarkEnd w:id="21"/>
-    </w:p>
-    <w:p/>
-    <w:p>
+        <w:pStyle w:val="Titulo3Relatorio"/>
+      </w:pPr>
+      <w:bookmarkStart w:id="17" w:name="_Toc200292945"/>
+      <w:r>
+        <w:t>Reverse Ordered Input</w:t>
+      </w:r>
+      <w:bookmarkEnd w:id="17"/>
+    </w:p>
+    <w:p>
+      <w:pPr>
+        <w:pStyle w:val="Titulo2Relatorio"/>
+      </w:pPr>
       <w:r>
         <w:rPr>
           <w:noProof/>
           <w:lang w:eastAsia="pt-BR"/>
         </w:rPr>
+        <w:lastRenderedPageBreak/>
         <w:drawing>
           <wp:inline distT="0" distB="0" distL="0" distR="0">
-            <wp:extent cx="4458087" cy="3795089"/>
-            <wp:effectExtent l="19050" t="0" r="0" b="0"/>
-            <wp:docPr id="5" name="Imagem 4" descr="ordered_input.PNG"/>
+            <wp:extent cx="4221846" cy="3993226"/>
+            <wp:effectExtent l="19050" t="0" r="7254" b="0"/>
+            <wp:docPr id="13" name="Imagem 12" descr="reversed_input.PNG"/>
             <wp:cNvGraphicFramePr>
               <a:graphicFrameLocks xmlns:a="http://schemas.openxmlformats.org/drawingml/2006/main" noChangeAspect="1"/>
             </wp:cNvGraphicFramePr>
@@ -10677,7 +11628,7 @@
               <a:graphicData uri="http://schemas.openxmlformats.org/drawingml/2006/picture">
                 <pic:pic xmlns:pic="http://schemas.openxmlformats.org/drawingml/2006/picture">
                   <pic:nvPicPr>
-                    <pic:cNvPr id="0" name="ordered_input.PNG"/>
+                    <pic:cNvPr id="0" name="reversed_input.PNG"/>
                     <pic:cNvPicPr/>
                   </pic:nvPicPr>
                   <pic:blipFill>
@@ -10689,7 +11640,7 @@
                   <pic:spPr>
                     <a:xfrm>
                       <a:off x="0" y="0"/>
-                      <a:ext cx="4458087" cy="3795089"/>
+                      <a:ext cx="4221846" cy="3993226"/>
                     </a:xfrm>
                     <a:prstGeom prst="rect">
                       <a:avLst/>
@@ -10703,6 +11654,9 @@
       </w:r>
     </w:p>
     <w:p>
+      <w:pPr>
+        <w:pStyle w:val="Titulo2Relatorio"/>
+      </w:pPr>
       <w:r>
         <w:rPr>
           <w:noProof/>
@@ -10710,9 +11664,9 @@
         </w:rPr>
         <w:drawing>
           <wp:inline distT="0" distB="0" distL="0" distR="0">
-            <wp:extent cx="4366639" cy="3833192"/>
-            <wp:effectExtent l="19050" t="0" r="0" b="0"/>
-            <wp:docPr id="6" name="Imagem 5" descr="reversed_input.PNG"/>
+            <wp:extent cx="5731510" cy="3684270"/>
+            <wp:effectExtent l="19050" t="0" r="2540" b="0"/>
+            <wp:docPr id="16" name="Imagem 15" descr="reversed_input_grafico.PNG"/>
             <wp:cNvGraphicFramePr>
               <a:graphicFrameLocks xmlns:a="http://schemas.openxmlformats.org/drawingml/2006/main" noChangeAspect="1"/>
             </wp:cNvGraphicFramePr>
@@ -10720,7 +11674,7 @@
               <a:graphicData uri="http://schemas.openxmlformats.org/drawingml/2006/picture">
                 <pic:pic xmlns:pic="http://schemas.openxmlformats.org/drawingml/2006/picture">
                   <pic:nvPicPr>
-                    <pic:cNvPr id="0" name="reversed_input.PNG"/>
+                    <pic:cNvPr id="0" name="reversed_input_grafico.PNG"/>
                     <pic:cNvPicPr/>
                   </pic:nvPicPr>
                   <pic:blipFill>
@@ -10732,7 +11686,7 @@
                   <pic:spPr>
                     <a:xfrm>
                       <a:off x="0" y="0"/>
-                      <a:ext cx="4366639" cy="3833192"/>
+                      <a:ext cx="5731510" cy="3684270"/>
                     </a:xfrm>
                     <a:prstGeom prst="rect">
                       <a:avLst/>
@@ -10746,6 +11700,19 @@
       </w:r>
     </w:p>
     <w:p>
+      <w:pPr>
+        <w:pStyle w:val="Titulo3Relatorio"/>
+      </w:pPr>
+      <w:bookmarkStart w:id="18" w:name="_Toc200292946"/>
+      <w:r>
+        <w:t>Uniform Input</w:t>
+      </w:r>
+      <w:bookmarkEnd w:id="18"/>
+    </w:p>
+    <w:p>
+      <w:pPr>
+        <w:pStyle w:val="Titulo2Relatorio"/>
+      </w:pPr>
       <w:r>
         <w:rPr>
           <w:noProof/>
@@ -10754,9 +11721,9 @@
         <w:lastRenderedPageBreak/>
         <w:drawing>
           <wp:inline distT="0" distB="0" distL="0" distR="0">
-            <wp:extent cx="3733447" cy="4136267"/>
-            <wp:effectExtent l="19050" t="0" r="353" b="0"/>
-            <wp:docPr id="7" name="Imagem 6" descr="uniform_input.PNG"/>
+            <wp:extent cx="4153260" cy="3977985"/>
+            <wp:effectExtent l="19050" t="0" r="0" b="0"/>
+            <wp:docPr id="14" name="Imagem 13" descr="uniform_input.PNG"/>
             <wp:cNvGraphicFramePr>
               <a:graphicFrameLocks xmlns:a="http://schemas.openxmlformats.org/drawingml/2006/main" noChangeAspect="1"/>
             </wp:cNvGraphicFramePr>
@@ -10776,7 +11743,7 @@
                   <pic:spPr>
                     <a:xfrm>
                       <a:off x="0" y="0"/>
-                      <a:ext cx="3738473" cy="4141835"/>
+                      <a:ext cx="4153260" cy="3977985"/>
                     </a:xfrm>
                     <a:prstGeom prst="rect">
                       <a:avLst/>
@@ -10791,8 +11758,307 @@
     </w:p>
     <w:p>
       <w:pPr>
+        <w:pStyle w:val="Titulo2Relatorio"/>
+      </w:pPr>
+      <w:r>
+        <w:rPr>
+          <w:noProof/>
+          <w:lang w:eastAsia="pt-BR"/>
+        </w:rPr>
+        <w:drawing>
+          <wp:inline distT="0" distB="0" distL="0" distR="0">
+            <wp:extent cx="5731510" cy="3684270"/>
+            <wp:effectExtent l="19050" t="0" r="2540" b="0"/>
+            <wp:docPr id="17" name="Imagem 16" descr="uniform_input_grafico.PNG"/>
+            <wp:cNvGraphicFramePr>
+              <a:graphicFrameLocks xmlns:a="http://schemas.openxmlformats.org/drawingml/2006/main" noChangeAspect="1"/>
+            </wp:cNvGraphicFramePr>
+            <a:graphic xmlns:a="http://schemas.openxmlformats.org/drawingml/2006/main">
+              <a:graphicData uri="http://schemas.openxmlformats.org/drawingml/2006/picture">
+                <pic:pic xmlns:pic="http://schemas.openxmlformats.org/drawingml/2006/picture">
+                  <pic:nvPicPr>
+                    <pic:cNvPr id="0" name="uniform_input_grafico.PNG"/>
+                    <pic:cNvPicPr/>
+                  </pic:nvPicPr>
+                  <pic:blipFill>
+                    <a:blip r:embed="rId15"/>
+                    <a:stretch>
+                      <a:fillRect/>
+                    </a:stretch>
+                  </pic:blipFill>
+                  <pic:spPr>
+                    <a:xfrm>
+                      <a:off x="0" y="0"/>
+                      <a:ext cx="5731510" cy="3684270"/>
+                    </a:xfrm>
+                    <a:prstGeom prst="rect">
+                      <a:avLst/>
+                    </a:prstGeom>
+                  </pic:spPr>
+                </pic:pic>
+              </a:graphicData>
+            </a:graphic>
+          </wp:inline>
+        </w:drawing>
+      </w:r>
+    </w:p>
+    <w:p>
+      <w:pPr>
+        <w:pStyle w:val="Ttulo2"/>
         <w:jc w:val="both"/>
-      </w:pPr>
+        <w:rPr>
+          <w:rFonts w:ascii="Times" w:hAnsi="Times" w:cs="Times"/>
+          <w:sz w:val="24"/>
+          <w:szCs w:val="24"/>
+        </w:rPr>
+      </w:pPr>
+      <w:bookmarkStart w:id="19" w:name="_Toc200292947"/>
+      <w:r>
+        <w:rPr>
+          <w:rFonts w:ascii="Times" w:hAnsi="Times" w:cs="Times"/>
+          <w:sz w:val="24"/>
+          <w:szCs w:val="24"/>
+        </w:rPr>
+        <w:t>Detalhes</w:t>
+      </w:r>
+      <w:r>
+        <w:rPr>
+          <w:rFonts w:ascii="Times" w:hAnsi="Times" w:cs="Times"/>
+          <w:sz w:val="24"/>
+          <w:szCs w:val="24"/>
+        </w:rPr>
+        <w:t xml:space="preserve"> </w:t>
+      </w:r>
+      <w:r>
+        <w:rPr>
+          <w:rFonts w:ascii="Times" w:hAnsi="Times" w:cs="Times"/>
+          <w:sz w:val="24"/>
+          <w:szCs w:val="24"/>
+        </w:rPr>
+        <w:t>da Configuração d</w:t>
+      </w:r>
+      <w:r>
+        <w:rPr>
+          <w:rFonts w:ascii="Times" w:hAnsi="Times" w:cs="Times"/>
+          <w:sz w:val="24"/>
+          <w:szCs w:val="24"/>
+        </w:rPr>
+        <w:t>o Computador U</w:t>
+      </w:r>
+      <w:r>
+        <w:rPr>
+          <w:rFonts w:ascii="Times" w:hAnsi="Times" w:cs="Times"/>
+          <w:sz w:val="24"/>
+          <w:szCs w:val="24"/>
+        </w:rPr>
+        <w:t>tilizado</w:t>
+      </w:r>
+      <w:bookmarkEnd w:id="19"/>
+    </w:p>
+    <w:p>
+      <w:pPr>
+        <w:pStyle w:val="NormalRelatorio"/>
+      </w:pPr>
+      <w:r>
+        <w:lastRenderedPageBreak/>
+        <w:t xml:space="preserve">Dentre </w:t>
+      </w:r>
+      <w:r>
+        <w:t>a</w:t>
+      </w:r>
+      <w:r>
+        <w:t xml:space="preserve">s configurações do computador utilizado </w:t>
+      </w:r>
+      <w:r>
+        <w:t xml:space="preserve">para executar </w:t>
+      </w:r>
+      <w:r>
+        <w:t>os testes comparativos dos algoritmos de ordenação</w:t>
+      </w:r>
+      <w:r>
+        <w:t>, incluem-se</w:t>
+      </w:r>
+      <w:r>
+        <w:t>:</w:t>
+      </w:r>
+    </w:p>
+    <w:p>
+      <w:pPr>
+        <w:pStyle w:val="Ttulo3"/>
+      </w:pPr>
+      <w:bookmarkStart w:id="20" w:name="_Toc200292948"/>
+      <w:r>
+        <w:t>Sistema Operacional</w:t>
+      </w:r>
+      <w:bookmarkEnd w:id="20"/>
+    </w:p>
+    <w:p/>
+    <w:p>
+      <w:pPr>
+        <w:keepNext/>
+        <w:jc w:val="both"/>
+      </w:pPr>
+      <w:r>
+        <w:rPr>
+          <w:rFonts w:ascii="Times" w:eastAsiaTheme="minorEastAsia" w:hAnsi="Times" w:cs="Times"/>
+          <w:noProof/>
+          <w:sz w:val="24"/>
+          <w:szCs w:val="24"/>
+          <w:lang w:eastAsia="pt-BR"/>
+        </w:rPr>
+        <w:drawing>
+          <wp:inline distT="0" distB="0" distL="0" distR="0">
+            <wp:extent cx="5731510" cy="3074670"/>
+            <wp:effectExtent l="19050" t="0" r="2540" b="0"/>
+            <wp:docPr id="2" name="Imagem 1" descr="Sistema_Operacional.PNG"/>
+            <wp:cNvGraphicFramePr>
+              <a:graphicFrameLocks xmlns:a="http://schemas.openxmlformats.org/drawingml/2006/main" noChangeAspect="1"/>
+            </wp:cNvGraphicFramePr>
+            <a:graphic xmlns:a="http://schemas.openxmlformats.org/drawingml/2006/main">
+              <a:graphicData uri="http://schemas.openxmlformats.org/drawingml/2006/picture">
+                <pic:pic xmlns:pic="http://schemas.openxmlformats.org/drawingml/2006/picture">
+                  <pic:nvPicPr>
+                    <pic:cNvPr id="0" name="Sistema_Operacional.PNG"/>
+                    <pic:cNvPicPr/>
+                  </pic:nvPicPr>
+                  <pic:blipFill>
+                    <a:blip r:embed="rId16"/>
+                    <a:stretch>
+                      <a:fillRect/>
+                    </a:stretch>
+                  </pic:blipFill>
+                  <pic:spPr>
+                    <a:xfrm>
+                      <a:off x="0" y="0"/>
+                      <a:ext cx="5731510" cy="3074670"/>
+                    </a:xfrm>
+                    <a:prstGeom prst="rect">
+                      <a:avLst/>
+                    </a:prstGeom>
+                  </pic:spPr>
+                </pic:pic>
+              </a:graphicData>
+            </a:graphic>
+          </wp:inline>
+        </w:drawing>
+      </w:r>
+    </w:p>
+    <w:p>
+      <w:pPr>
+        <w:pStyle w:val="Legenda"/>
+        <w:jc w:val="both"/>
+        <w:rPr>
+          <w:rFonts w:ascii="Times" w:eastAsiaTheme="minorEastAsia" w:hAnsi="Times" w:cs="Times"/>
+          <w:sz w:val="24"/>
+          <w:szCs w:val="24"/>
+        </w:rPr>
+      </w:pPr>
+      <w:r>
+        <w:t xml:space="preserve">Figura </w:t>
+      </w:r>
+      <w:fldSimple w:instr=" SEQ Figura \* ARABIC ">
+        <w:r>
+          <w:rPr>
+            <w:noProof/>
+          </w:rPr>
+          <w:t>1</w:t>
+        </w:r>
+      </w:fldSimple>
+      <w:r>
+        <w:t xml:space="preserve"> - Consultando Sistema Operacional através da interface Informações do Sistema.</w:t>
+      </w:r>
+    </w:p>
+    <w:p>
+      <w:pPr>
+        <w:pStyle w:val="Ttulo3"/>
+        <w:rPr>
+          <w:rFonts w:eastAsiaTheme="minorEastAsia"/>
+        </w:rPr>
+      </w:pPr>
+      <w:bookmarkStart w:id="21" w:name="_Toc200292949"/>
+      <w:r>
+        <w:rPr>
+          <w:rFonts w:eastAsiaTheme="minorEastAsia"/>
+        </w:rPr>
+        <w:t>RAM</w:t>
+      </w:r>
+      <w:bookmarkEnd w:id="21"/>
+    </w:p>
+    <w:p>
+      <w:pPr>
+        <w:pStyle w:val="Titulo2Relatorio"/>
+      </w:pPr>
+      <w:r>
+        <w:rPr>
+          <w:rFonts w:eastAsiaTheme="minorEastAsia"/>
+          <w:noProof/>
+          <w:lang w:eastAsia="pt-BR"/>
+        </w:rPr>
+        <w:drawing>
+          <wp:inline distT="0" distB="0" distL="0" distR="0">
+            <wp:extent cx="5731510" cy="3074670"/>
+            <wp:effectExtent l="19050" t="0" r="2540" b="0"/>
+            <wp:docPr id="3" name="Imagem 2" descr="RAM.PNG"/>
+            <wp:cNvGraphicFramePr>
+              <a:graphicFrameLocks xmlns:a="http://schemas.openxmlformats.org/drawingml/2006/main" noChangeAspect="1"/>
+            </wp:cNvGraphicFramePr>
+            <a:graphic xmlns:a="http://schemas.openxmlformats.org/drawingml/2006/main">
+              <a:graphicData uri="http://schemas.openxmlformats.org/drawingml/2006/picture">
+                <pic:pic xmlns:pic="http://schemas.openxmlformats.org/drawingml/2006/picture">
+                  <pic:nvPicPr>
+                    <pic:cNvPr id="0" name="RAM.PNG"/>
+                    <pic:cNvPicPr/>
+                  </pic:nvPicPr>
+                  <pic:blipFill>
+                    <a:blip r:embed="rId17"/>
+                    <a:stretch>
+                      <a:fillRect/>
+                    </a:stretch>
+                  </pic:blipFill>
+                  <pic:spPr>
+                    <a:xfrm>
+                      <a:off x="0" y="0"/>
+                      <a:ext cx="5731510" cy="3074670"/>
+                    </a:xfrm>
+                    <a:prstGeom prst="rect">
+                      <a:avLst/>
+                    </a:prstGeom>
+                  </pic:spPr>
+                </pic:pic>
+              </a:graphicData>
+            </a:graphic>
+          </wp:inline>
+        </w:drawing>
+      </w:r>
+    </w:p>
+    <w:p>
+      <w:pPr>
+        <w:pStyle w:val="Legenda"/>
+        <w:jc w:val="both"/>
+      </w:pPr>
+      <w:r>
+        <w:t xml:space="preserve">Figura </w:t>
+      </w:r>
+      <w:fldSimple w:instr=" SEQ Figura \* ARABIC ">
+        <w:r>
+          <w:rPr>
+            <w:noProof/>
+          </w:rPr>
+          <w:t>2</w:t>
+        </w:r>
+      </w:fldSimple>
+      <w:r>
+        <w:t xml:space="preserve"> - </w:t>
+      </w:r>
+      <w:r>
+        <w:t xml:space="preserve">Consultando </w:t>
+      </w:r>
+      <w:r>
+        <w:t>Memória RAM</w:t>
+      </w:r>
+      <w:r>
+        <w:t xml:space="preserve"> através da interface Informações do Sistema.</w:t>
+      </w:r>
     </w:p>
     <w:p>
       <w:pPr>
@@ -10808,16 +12074,256 @@
           <w:szCs w:val="24"/>
         </w:rPr>
       </w:pPr>
-      <w:bookmarkStart w:id="22" w:name="_Toc200230228"/>
-      <w:r>
-        <w:rPr>
-          <w:rFonts w:ascii="Times" w:hAnsi="Times" w:cs="Times"/>
-          <w:sz w:val="24"/>
-          <w:szCs w:val="24"/>
-        </w:rPr>
+      <w:bookmarkStart w:id="22" w:name="_Toc200292950"/>
+      <w:r>
+        <w:rPr>
+          <w:rFonts w:ascii="Times" w:hAnsi="Times" w:cs="Times"/>
+          <w:sz w:val="24"/>
+          <w:szCs w:val="24"/>
+        </w:rPr>
+        <w:lastRenderedPageBreak/>
+        <w:t>Conclusão</w:t>
+      </w:r>
+      <w:bookmarkEnd w:id="22"/>
+    </w:p>
+    <w:p>
+      <w:pPr>
+        <w:pStyle w:val="Ttulo2"/>
+        <w:jc w:val="both"/>
+        <w:rPr>
+          <w:rFonts w:ascii="Times" w:hAnsi="Times" w:cs="Times"/>
+          <w:sz w:val="24"/>
+          <w:szCs w:val="24"/>
+        </w:rPr>
+      </w:pPr>
+      <w:bookmarkStart w:id="23" w:name="_Toc200292951"/>
+      <w:r>
+        <w:rPr>
+          <w:rFonts w:ascii="Times" w:hAnsi="Times" w:cs="Times"/>
+          <w:sz w:val="24"/>
+          <w:szCs w:val="24"/>
+        </w:rPr>
+        <w:t>Analisar os pontos fortes e fracos do algoritmo em comparação com outros algoritmos.</w:t>
+      </w:r>
+      <w:bookmarkEnd w:id="23"/>
+      <w:r>
+        <w:rPr>
+          <w:rFonts w:ascii="Times" w:hAnsi="Times" w:cs="Times"/>
+          <w:sz w:val="24"/>
+          <w:szCs w:val="24"/>
+        </w:rPr>
+        <w:t xml:space="preserve"> </w:t>
+      </w:r>
+    </w:p>
+    <w:p>
+      <w:pPr>
+        <w:pStyle w:val="PargrafodaLista"/>
+        <w:numPr>
+          <w:ilvl w:val="0"/>
+          <w:numId w:val="10"/>
+        </w:numPr>
+      </w:pPr>
+      <w:r>
+        <w:t>Mesma Grandeza em todos os casos.</w:t>
+      </w:r>
+    </w:p>
+    <w:p>
+      <w:pPr>
+        <w:pStyle w:val="PargrafodaLista"/>
+        <w:numPr>
+          <w:ilvl w:val="0"/>
+          <w:numId w:val="10"/>
+        </w:numPr>
+      </w:pPr>
+      <w:r>
+        <w:t>Versão melhorada do algoritmo de ordenação Selection Sort</w:t>
+      </w:r>
+      <w:r>
+        <w:t>.</w:t>
+      </w:r>
+    </w:p>
+    <w:p>
+      <w:pPr>
+        <w:pStyle w:val="Ttulo2"/>
+        <w:jc w:val="both"/>
+        <w:rPr>
+          <w:rFonts w:ascii="Times" w:hAnsi="Times" w:cs="Times"/>
+          <w:sz w:val="24"/>
+          <w:szCs w:val="24"/>
+        </w:rPr>
+      </w:pPr>
+      <w:bookmarkStart w:id="24" w:name="_Toc200292952"/>
+      <w:r>
+        <w:rPr>
+          <w:rFonts w:ascii="Times" w:hAnsi="Times" w:cs="Times"/>
+          <w:sz w:val="24"/>
+          <w:szCs w:val="24"/>
+        </w:rPr>
+        <w:t>Avaliar o desempenho do algoritmo em comparação com a implementação do Quicksort disponível na linguagem C.</w:t>
+      </w:r>
+      <w:bookmarkEnd w:id="24"/>
+    </w:p>
+    <w:p/>
+    <w:p>
+      <w:r>
+        <w:rPr>
+          <w:noProof/>
+          <w:lang w:eastAsia="pt-BR"/>
+        </w:rPr>
+        <w:drawing>
+          <wp:inline distT="0" distB="0" distL="0" distR="0">
+            <wp:extent cx="4138019" cy="3917020"/>
+            <wp:effectExtent l="19050" t="0" r="0" b="0"/>
+            <wp:docPr id="9" name="Imagem 8" descr="ordered_input.PNG"/>
+            <wp:cNvGraphicFramePr>
+              <a:graphicFrameLocks xmlns:a="http://schemas.openxmlformats.org/drawingml/2006/main" noChangeAspect="1"/>
+            </wp:cNvGraphicFramePr>
+            <a:graphic xmlns:a="http://schemas.openxmlformats.org/drawingml/2006/main">
+              <a:graphicData uri="http://schemas.openxmlformats.org/drawingml/2006/picture">
+                <pic:pic xmlns:pic="http://schemas.openxmlformats.org/drawingml/2006/picture">
+                  <pic:nvPicPr>
+                    <pic:cNvPr id="0" name="ordered_input.PNG"/>
+                    <pic:cNvPicPr/>
+                  </pic:nvPicPr>
+                  <pic:blipFill>
+                    <a:blip r:embed="rId10"/>
+                    <a:stretch>
+                      <a:fillRect/>
+                    </a:stretch>
+                  </pic:blipFill>
+                  <pic:spPr>
+                    <a:xfrm>
+                      <a:off x="0" y="0"/>
+                      <a:ext cx="4138019" cy="3917020"/>
+                    </a:xfrm>
+                    <a:prstGeom prst="rect">
+                      <a:avLst/>
+                    </a:prstGeom>
+                  </pic:spPr>
+                </pic:pic>
+              </a:graphicData>
+            </a:graphic>
+          </wp:inline>
+        </w:drawing>
+      </w:r>
+    </w:p>
+    <w:p>
+      <w:r>
+        <w:rPr>
+          <w:noProof/>
+          <w:lang w:eastAsia="pt-BR"/>
+        </w:rPr>
+        <w:lastRenderedPageBreak/>
+        <w:drawing>
+          <wp:inline distT="0" distB="0" distL="0" distR="0">
+            <wp:extent cx="4221846" cy="3993226"/>
+            <wp:effectExtent l="19050" t="0" r="7254" b="0"/>
+            <wp:docPr id="10" name="Imagem 9" descr="reversed_input.PNG"/>
+            <wp:cNvGraphicFramePr>
+              <a:graphicFrameLocks xmlns:a="http://schemas.openxmlformats.org/drawingml/2006/main" noChangeAspect="1"/>
+            </wp:cNvGraphicFramePr>
+            <a:graphic xmlns:a="http://schemas.openxmlformats.org/drawingml/2006/main">
+              <a:graphicData uri="http://schemas.openxmlformats.org/drawingml/2006/picture">
+                <pic:pic xmlns:pic="http://schemas.openxmlformats.org/drawingml/2006/picture">
+                  <pic:nvPicPr>
+                    <pic:cNvPr id="0" name="reversed_input.PNG"/>
+                    <pic:cNvPicPr/>
+                  </pic:nvPicPr>
+                  <pic:blipFill>
+                    <a:blip r:embed="rId12"/>
+                    <a:stretch>
+                      <a:fillRect/>
+                    </a:stretch>
+                  </pic:blipFill>
+                  <pic:spPr>
+                    <a:xfrm>
+                      <a:off x="0" y="0"/>
+                      <a:ext cx="4221846" cy="3993226"/>
+                    </a:xfrm>
+                    <a:prstGeom prst="rect">
+                      <a:avLst/>
+                    </a:prstGeom>
+                  </pic:spPr>
+                </pic:pic>
+              </a:graphicData>
+            </a:graphic>
+          </wp:inline>
+        </w:drawing>
+      </w:r>
+    </w:p>
+    <w:p>
+      <w:r>
+        <w:rPr>
+          <w:noProof/>
+          <w:lang w:eastAsia="pt-BR"/>
+        </w:rPr>
+        <w:drawing>
+          <wp:inline distT="0" distB="0" distL="0" distR="0">
+            <wp:extent cx="4153260" cy="3977985"/>
+            <wp:effectExtent l="19050" t="0" r="0" b="0"/>
+            <wp:docPr id="11" name="Imagem 10" descr="uniform_input.PNG"/>
+            <wp:cNvGraphicFramePr>
+              <a:graphicFrameLocks xmlns:a="http://schemas.openxmlformats.org/drawingml/2006/main" noChangeAspect="1"/>
+            </wp:cNvGraphicFramePr>
+            <a:graphic xmlns:a="http://schemas.openxmlformats.org/drawingml/2006/main">
+              <a:graphicData uri="http://schemas.openxmlformats.org/drawingml/2006/picture">
+                <pic:pic xmlns:pic="http://schemas.openxmlformats.org/drawingml/2006/picture">
+                  <pic:nvPicPr>
+                    <pic:cNvPr id="0" name="uniform_input.PNG"/>
+                    <pic:cNvPicPr/>
+                  </pic:nvPicPr>
+                  <pic:blipFill>
+                    <a:blip r:embed="rId14"/>
+                    <a:stretch>
+                      <a:fillRect/>
+                    </a:stretch>
+                  </pic:blipFill>
+                  <pic:spPr>
+                    <a:xfrm>
+                      <a:off x="0" y="0"/>
+                      <a:ext cx="4153260" cy="3977985"/>
+                    </a:xfrm>
+                    <a:prstGeom prst="rect">
+                      <a:avLst/>
+                    </a:prstGeom>
+                  </pic:spPr>
+                </pic:pic>
+              </a:graphicData>
+            </a:graphic>
+          </wp:inline>
+        </w:drawing>
+      </w:r>
+    </w:p>
+    <w:p>
+      <w:pPr>
+        <w:jc w:val="both"/>
+      </w:pPr>
+    </w:p>
+    <w:p>
+      <w:pPr>
+        <w:pStyle w:val="Ttulo1"/>
+        <w:numPr>
+          <w:ilvl w:val="0"/>
+          <w:numId w:val="6"/>
+        </w:numPr>
+        <w:jc w:val="both"/>
+        <w:rPr>
+          <w:rFonts w:ascii="Times" w:hAnsi="Times" w:cs="Times"/>
+          <w:sz w:val="24"/>
+          <w:szCs w:val="24"/>
+        </w:rPr>
+      </w:pPr>
+      <w:bookmarkStart w:id="25" w:name="_Toc200292953"/>
+      <w:r>
+        <w:rPr>
+          <w:rFonts w:ascii="Times" w:hAnsi="Times" w:cs="Times"/>
+          <w:sz w:val="24"/>
+          <w:szCs w:val="24"/>
+        </w:rPr>
+        <w:lastRenderedPageBreak/>
         <w:t>Referências</w:t>
       </w:r>
-      <w:bookmarkEnd w:id="22"/>
+      <w:bookmarkEnd w:id="25"/>
     </w:p>
     <w:p>
       <w:pPr>
@@ -10862,7 +12368,7 @@
           <w:szCs w:val="24"/>
         </w:rPr>
       </w:pPr>
-      <w:hyperlink r:id="rId15" w:history="1">
+      <w:hyperlink r:id="rId18" w:history="1">
         <w:r>
           <w:rPr>
             <w:rStyle w:val="Hyperlink"/>
@@ -10885,7 +12391,7 @@
           <w:szCs w:val="24"/>
         </w:rPr>
       </w:pPr>
-      <w:hyperlink r:id="rId16" w:history="1">
+      <w:hyperlink r:id="rId19" w:history="1">
         <w:r>
           <w:rPr>
             <w:rStyle w:val="Hyperlink"/>
@@ -10908,7 +12414,7 @@
           <w:szCs w:val="24"/>
         </w:rPr>
       </w:pPr>
-      <w:hyperlink r:id="rId17" w:history="1">
+      <w:hyperlink r:id="rId20" w:history="1">
         <w:r>
           <w:rPr>
             <w:rStyle w:val="Hyperlink"/>
@@ -10931,7 +12437,7 @@
           <w:szCs w:val="24"/>
         </w:rPr>
       </w:pPr>
-      <w:hyperlink r:id="rId18" w:history="1">
+      <w:hyperlink r:id="rId21" w:history="1">
         <w:r>
           <w:rPr>
             <w:rStyle w:val="Hyperlink"/>
@@ -10973,7 +12479,7 @@
           <w:szCs w:val="24"/>
         </w:rPr>
       </w:pPr>
-      <w:hyperlink r:id="rId19" w:anchor="1725d7" w:history="1">
+      <w:hyperlink r:id="rId22" w:anchor="1725d7" w:history="1">
         <w:r>
           <w:rPr>
             <w:rStyle w:val="Hyperlink"/>
@@ -10990,7 +12496,7 @@
         <w:pStyle w:val="PargrafodaLista"/>
         <w:jc w:val="both"/>
       </w:pPr>
-      <w:hyperlink r:id="rId20" w:anchor="C" w:history="1">
+      <w:hyperlink r:id="rId23" w:anchor="C" w:history="1">
         <w:r>
           <w:rPr>
             <w:rStyle w:val="Hyperlink"/>
@@ -11004,7 +12510,7 @@
         <w:pStyle w:val="PargrafodaLista"/>
         <w:jc w:val="both"/>
       </w:pPr>
-      <w:hyperlink r:id="rId21" w:history="1">
+      <w:hyperlink r:id="rId24" w:history="1">
         <w:r>
           <w:rPr>
             <w:rStyle w:val="Hyperlink"/>
@@ -11023,7 +12529,7 @@
           <w:szCs w:val="24"/>
         </w:rPr>
       </w:pPr>
-      <w:hyperlink r:id="rId22" w:history="1">
+      <w:hyperlink r:id="rId25" w:history="1">
         <w:r>
           <w:rPr>
             <w:rStyle w:val="Hyperlink"/>
@@ -11033,7 +12539,7 @@
       </w:hyperlink>
     </w:p>
     <w:sectPr>
-      <w:footerReference w:type="default" r:id="rId23"/>
+      <w:footerReference w:type="default" r:id="rId26"/>
       <w:pgSz w:w="11906" w:h="16838" w:code="9"/>
       <w:pgMar w:top="1440" w:right="1440" w:bottom="1440" w:left="1440" w:header="709" w:footer="709" w:gutter="0"/>
       <w:cols w:space="708"/>
@@ -11090,7 +12596,7 @@
             <w:rPr>
               <w:noProof/>
             </w:rPr>
-            <w:t>9</w:t>
+            <w:t>12</w:t>
           </w:r>
         </w:fldSimple>
       </w:p>
@@ -12926,6 +14432,7 @@
   <w:rsids>
     <w:rsidRoot w:val="00DE5764"/>
     <w:rsid w:val="00673B9C"/>
+    <w:rsid w:val="00D573E3"/>
     <w:rsid w:val="00DE5764"/>
     <w:rsid w:val="00EC412D"/>
   </w:rsids>
@@ -13143,7 +14650,7 @@
     <w:basedOn w:val="Fontepargpadro"/>
     <w:uiPriority w:val="99"/>
     <w:semiHidden/>
-    <w:rsid w:val="00673B9C"/>
+    <w:rsid w:val="00D573E3"/>
     <w:rPr>
       <w:color w:val="808080"/>
     </w:rPr>

</xml_diff>

<commit_message>
Detalhando informaçoes do sistema
</commit_message>
<xml_diff>
--- a/Relatorio_Equipe_HeapSort.docx
+++ b/Relatorio_Equipe_HeapSort.docx
@@ -11432,29 +11432,10 @@
     </w:p>
     <w:p>
       <w:pPr>
-        <w:pStyle w:val="Titulo3Relatorio"/>
-      </w:pPr>
-      <w:bookmarkStart w:id="16" w:name="_Toc200292944"/>
-      <w:r>
-        <w:t>Ordered Input</w:t>
-      </w:r>
-      <w:bookmarkEnd w:id="16"/>
-    </w:p>
-    <w:p>
-      <w:pPr>
         <w:pStyle w:val="NormalRelatorio"/>
       </w:pPr>
       <w:r>
-        <w:t>Para cada arquivo de</w:t>
-      </w:r>
-      <w:r>
-        <w:t xml:space="preserve"> </w:t>
-      </w:r>
-      <w:r>
-        <w:t>entrada</w:t>
-      </w:r>
-      <w:r>
-        <w:t xml:space="preserve">, foram executados os testes para ordenar vetores de tamanhos de: 10.000 a 4.000.000 de elementos. Quando foram executados, comparamos as </w:t>
+        <w:t xml:space="preserve">Para cada arquivo de entrada, foram executados os testes para ordenar vetores de tamanhos de: 10.000 a 4.000.000 de elementos. Quando foram executados, comparamos as </w:t>
       </w:r>
       <w:r>
         <w:lastRenderedPageBreak/>
@@ -11505,6 +11486,17 @@
     </w:p>
     <w:p>
       <w:pPr>
+        <w:pStyle w:val="Titulo3Relatorio"/>
+      </w:pPr>
+      <w:bookmarkStart w:id="16" w:name="_Toc200292944"/>
+      <w:r>
+        <w:lastRenderedPageBreak/>
+        <w:t>Ordered Input</w:t>
+      </w:r>
+      <w:bookmarkEnd w:id="16"/>
+    </w:p>
+    <w:p>
+      <w:pPr>
         <w:pStyle w:val="Titulo2Relatorio"/>
       </w:pPr>
       <w:r>
@@ -11512,7 +11504,6 @@
           <w:noProof/>
           <w:lang w:eastAsia="pt-BR"/>
         </w:rPr>
-        <w:lastRenderedPageBreak/>
         <w:drawing>
           <wp:inline distT="0" distB="0" distL="0" distR="0">
             <wp:extent cx="4138019" cy="3917020"/>
@@ -11598,10 +11589,16 @@
     </w:p>
     <w:p>
       <w:pPr>
+        <w:pStyle w:val="Titulo2Relatorio"/>
+      </w:pPr>
+    </w:p>
+    <w:p>
+      <w:pPr>
         <w:pStyle w:val="Titulo3Relatorio"/>
       </w:pPr>
       <w:bookmarkStart w:id="17" w:name="_Toc200292945"/>
       <w:r>
+        <w:lastRenderedPageBreak/>
         <w:t>Reverse Ordered Input</w:t>
       </w:r>
       <w:bookmarkEnd w:id="17"/>
@@ -11615,7 +11612,6 @@
           <w:noProof/>
           <w:lang w:eastAsia="pt-BR"/>
         </w:rPr>
-        <w:lastRenderedPageBreak/>
         <w:drawing>
           <wp:inline distT="0" distB="0" distL="0" distR="0">
             <wp:extent cx="4221846" cy="3993226"/>
@@ -11804,6 +11800,16 @@
     </w:p>
     <w:p>
       <w:pPr>
+        <w:pStyle w:val="Titulo2Relatorio"/>
+      </w:pPr>
+    </w:p>
+    <w:p>
+      <w:pPr>
+        <w:pStyle w:val="Titulo2Relatorio"/>
+      </w:pPr>
+    </w:p>
+    <w:p>
+      <w:pPr>
         <w:pStyle w:val="Ttulo2"/>
         <w:jc w:val="both"/>
         <w:rPr>
@@ -11819,6 +11825,7 @@
           <w:sz w:val="24"/>
           <w:szCs w:val="24"/>
         </w:rPr>
+        <w:lastRenderedPageBreak/>
         <w:t>Detalhes</w:t>
       </w:r>
       <w:r>
@@ -11860,7 +11867,6 @@
         <w:pStyle w:val="NormalRelatorio"/>
       </w:pPr>
       <w:r>
-        <w:lastRenderedPageBreak/>
         <w:t xml:space="preserve">Dentre </w:t>
       </w:r>
       <w:r>
@@ -11892,7 +11898,44 @@
       </w:r>
       <w:bookmarkEnd w:id="20"/>
     </w:p>
-    <w:p/>
+    <w:p>
+      <w:pPr>
+        <w:pStyle w:val="NormalRelatorio"/>
+      </w:pPr>
+      <w:r>
+        <w:t xml:space="preserve">O sistema operacional do computador utilizado para os testes, é o </w:t>
+      </w:r>
+      <w:r>
+        <w:rPr>
+          <w:b/>
+        </w:rPr>
+        <w:t xml:space="preserve">Microsoft Windows 10 Home Single Language </w:t>
+      </w:r>
+      <w:r>
+        <w:rPr>
+          <w:b/>
+        </w:rPr>
+        <w:t xml:space="preserve">Versão: </w:t>
+      </w:r>
+      <w:r>
+        <w:rPr>
+          <w:b/>
+        </w:rPr>
+        <w:t>10.0.19045 Compilação 19045</w:t>
+      </w:r>
+      <w:r>
+        <w:t>.</w:t>
+      </w:r>
+      <w:r>
+        <w:t xml:space="preserve"> Para identificá-lo, acessamos o programa “Informações do sistema”</w:t>
+      </w:r>
+      <w:r>
+        <w:t xml:space="preserve"> na barra de pesquisa do Menu Iniciar</w:t>
+      </w:r>
+      <w:r>
+        <w:t xml:space="preserve"> e consultamos o nome do sistema operacional na aba “Resumo do Sistema”.</w:t>
+      </w:r>
+    </w:p>
     <w:p>
       <w:pPr>
         <w:keepNext/>
@@ -11945,31 +11988,6 @@
     </w:p>
     <w:p>
       <w:pPr>
-        <w:pStyle w:val="Legenda"/>
-        <w:jc w:val="both"/>
-        <w:rPr>
-          <w:rFonts w:ascii="Times" w:eastAsiaTheme="minorEastAsia" w:hAnsi="Times" w:cs="Times"/>
-          <w:sz w:val="24"/>
-          <w:szCs w:val="24"/>
-        </w:rPr>
-      </w:pPr>
-      <w:r>
-        <w:t xml:space="preserve">Figura </w:t>
-      </w:r>
-      <w:fldSimple w:instr=" SEQ Figura \* ARABIC ">
-        <w:r>
-          <w:rPr>
-            <w:noProof/>
-          </w:rPr>
-          <w:t>1</w:t>
-        </w:r>
-      </w:fldSimple>
-      <w:r>
-        <w:t xml:space="preserve"> - Consultando Sistema Operacional através da interface Informações do Sistema.</w:t>
-      </w:r>
-    </w:p>
-    <w:p>
-      <w:pPr>
         <w:pStyle w:val="Ttulo3"/>
         <w:rPr>
           <w:rFonts w:eastAsiaTheme="minorEastAsia"/>
@@ -11983,6 +12001,29 @@
         <w:t>RAM</w:t>
       </w:r>
       <w:bookmarkEnd w:id="21"/>
+    </w:p>
+    <w:p>
+      <w:pPr>
+        <w:pStyle w:val="NormalRelatorio"/>
+      </w:pPr>
+      <w:r>
+        <w:t xml:space="preserve">A quantidade da Memória RAM do computador utilizado para os testes, é de </w:t>
+      </w:r>
+      <w:r>
+        <w:rPr>
+          <w:b/>
+        </w:rPr>
+        <w:t>4,00 GB</w:t>
+      </w:r>
+      <w:r>
+        <w:t xml:space="preserve">. Para identificá-lo, acessamos o programa “Informações do sistema” na barra de pesquisa do Menu Iniciar e consultamos </w:t>
+      </w:r>
+      <w:r>
+        <w:t xml:space="preserve">a Memória RAM </w:t>
+      </w:r>
+      <w:r>
+        <w:t>na aba “Resumo do Sistema”.</w:t>
+      </w:r>
     </w:p>
     <w:p>
       <w:pPr>
@@ -11994,6 +12035,7 @@
           <w:noProof/>
           <w:lang w:eastAsia="pt-BR"/>
         </w:rPr>
+        <w:lastRenderedPageBreak/>
         <w:drawing>
           <wp:inline distT="0" distB="0" distL="0" distR="0">
             <wp:extent cx="5731510" cy="3074670"/>
@@ -12081,7 +12123,6 @@
           <w:sz w:val="24"/>
           <w:szCs w:val="24"/>
         </w:rPr>
-        <w:lastRenderedPageBreak/>
         <w:t>Conclusão</w:t>
       </w:r>
       <w:bookmarkEnd w:id="22"/>
@@ -12170,6 +12211,7 @@
           <w:noProof/>
           <w:lang w:eastAsia="pt-BR"/>
         </w:rPr>
+        <w:lastRenderedPageBreak/>
         <w:drawing>
           <wp:inline distT="0" distB="0" distL="0" distR="0">
             <wp:extent cx="4138019" cy="3917020"/>
@@ -12213,7 +12255,6 @@
           <w:noProof/>
           <w:lang w:eastAsia="pt-BR"/>
         </w:rPr>
-        <w:lastRenderedPageBreak/>
         <w:drawing>
           <wp:inline distT="0" distB="0" distL="0" distR="0">
             <wp:extent cx="4221846" cy="3993226"/>
@@ -12257,6 +12298,7 @@
           <w:noProof/>
           <w:lang w:eastAsia="pt-BR"/>
         </w:rPr>
+        <w:lastRenderedPageBreak/>
         <w:drawing>
           <wp:inline distT="0" distB="0" distL="0" distR="0">
             <wp:extent cx="4153260" cy="3977985"/>
@@ -12320,7 +12362,6 @@
           <w:sz w:val="24"/>
           <w:szCs w:val="24"/>
         </w:rPr>
-        <w:lastRenderedPageBreak/>
         <w:t>Referências</w:t>
       </w:r>
       <w:bookmarkEnd w:id="25"/>
@@ -12596,7 +12637,7 @@
             <w:rPr>
               <w:noProof/>
             </w:rPr>
-            <w:t>12</w:t>
+            <w:t>17</w:t>
           </w:r>
         </w:fldSimple>
       </w:p>

</xml_diff>

<commit_message>
Adicionando modificações em vários tópicos
</commit_message>
<xml_diff>
--- a/Relatorio_Equipe_HeapSort.docx
+++ b/Relatorio_Equipe_HeapSort.docx
@@ -333,7 +333,7 @@
             </w:rPr>
             <w:fldChar w:fldCharType="separate"/>
           </w:r>
-          <w:hyperlink w:anchor="_Toc200292928" w:history="1">
+          <w:hyperlink w:anchor="_Toc200304470" w:history="1">
             <w:r>
               <w:rPr>
                 <w:rStyle w:val="Hyperlink"/>
@@ -377,7 +377,7 @@
                 <w:noProof/>
                 <w:webHidden/>
               </w:rPr>
-              <w:instrText xml:space="preserve"> PAGEREF _Toc200292928 \h </w:instrText>
+              <w:instrText xml:space="preserve"> PAGEREF _Toc200304470 \h </w:instrText>
             </w:r>
             <w:r>
               <w:rPr>
@@ -420,7 +420,7 @@
               <w:lang w:eastAsia="pt-BR"/>
             </w:rPr>
           </w:pPr>
-          <w:hyperlink w:anchor="_Toc200292929" w:history="1">
+          <w:hyperlink w:anchor="_Toc200304471" w:history="1">
             <w:r>
               <w:rPr>
                 <w:rStyle w:val="Hyperlink"/>
@@ -448,7 +448,7 @@
                 <w:noProof/>
                 <w:webHidden/>
               </w:rPr>
-              <w:instrText xml:space="preserve"> PAGEREF _Toc200292929 \h </w:instrText>
+              <w:instrText xml:space="preserve"> PAGEREF _Toc200304471 \h </w:instrText>
             </w:r>
             <w:r>
               <w:rPr>
@@ -491,7 +491,7 @@
               <w:lang w:eastAsia="pt-BR"/>
             </w:rPr>
           </w:pPr>
-          <w:hyperlink w:anchor="_Toc200292930" w:history="1">
+          <w:hyperlink w:anchor="_Toc200304472" w:history="1">
             <w:r>
               <w:rPr>
                 <w:rStyle w:val="Hyperlink"/>
@@ -519,7 +519,7 @@
                 <w:noProof/>
                 <w:webHidden/>
               </w:rPr>
-              <w:instrText xml:space="preserve"> PAGEREF _Toc200292930 \h </w:instrText>
+              <w:instrText xml:space="preserve"> PAGEREF _Toc200304472 \h </w:instrText>
             </w:r>
             <w:r>
               <w:rPr>
@@ -562,7 +562,7 @@
               <w:lang w:eastAsia="pt-BR"/>
             </w:rPr>
           </w:pPr>
-          <w:hyperlink w:anchor="_Toc200292931" w:history="1">
+          <w:hyperlink w:anchor="_Toc200304473" w:history="1">
             <w:r>
               <w:rPr>
                 <w:rStyle w:val="Hyperlink"/>
@@ -590,7 +590,7 @@
                 <w:noProof/>
                 <w:webHidden/>
               </w:rPr>
-              <w:instrText xml:space="preserve"> PAGEREF _Toc200292931 \h </w:instrText>
+              <w:instrText xml:space="preserve"> PAGEREF _Toc200304473 \h </w:instrText>
             </w:r>
             <w:r>
               <w:rPr>
@@ -634,7 +634,7 @@
               <w:lang w:eastAsia="pt-BR"/>
             </w:rPr>
           </w:pPr>
-          <w:hyperlink w:anchor="_Toc200292932" w:history="1">
+          <w:hyperlink w:anchor="_Toc200304474" w:history="1">
             <w:r>
               <w:rPr>
                 <w:rStyle w:val="Hyperlink"/>
@@ -678,7 +678,7 @@
                 <w:noProof/>
                 <w:webHidden/>
               </w:rPr>
-              <w:instrText xml:space="preserve"> PAGEREF _Toc200292932 \h </w:instrText>
+              <w:instrText xml:space="preserve"> PAGEREF _Toc200304474 \h </w:instrText>
             </w:r>
             <w:r>
               <w:rPr>
@@ -721,7 +721,7 @@
               <w:lang w:eastAsia="pt-BR"/>
             </w:rPr>
           </w:pPr>
-          <w:hyperlink w:anchor="_Toc200292933" w:history="1">
+          <w:hyperlink w:anchor="_Toc200304475" w:history="1">
             <w:r>
               <w:rPr>
                 <w:rStyle w:val="Hyperlink"/>
@@ -749,7 +749,7 @@
                 <w:noProof/>
                 <w:webHidden/>
               </w:rPr>
-              <w:instrText xml:space="preserve"> PAGEREF _Toc200292933 \h </w:instrText>
+              <w:instrText xml:space="preserve"> PAGEREF _Toc200304475 \h </w:instrText>
             </w:r>
             <w:r>
               <w:rPr>
@@ -792,7 +792,7 @@
               <w:lang w:eastAsia="pt-BR"/>
             </w:rPr>
           </w:pPr>
-          <w:hyperlink w:anchor="_Toc200292934" w:history="1">
+          <w:hyperlink w:anchor="_Toc200304476" w:history="1">
             <w:r>
               <w:rPr>
                 <w:rStyle w:val="Hyperlink"/>
@@ -820,7 +820,7 @@
                 <w:noProof/>
                 <w:webHidden/>
               </w:rPr>
-              <w:instrText xml:space="preserve"> PAGEREF _Toc200292934 \h </w:instrText>
+              <w:instrText xml:space="preserve"> PAGEREF _Toc200304476 \h </w:instrText>
             </w:r>
             <w:r>
               <w:rPr>
@@ -863,7 +863,7 @@
               <w:lang w:eastAsia="pt-BR"/>
             </w:rPr>
           </w:pPr>
-          <w:hyperlink w:anchor="_Toc200292935" w:history="1">
+          <w:hyperlink w:anchor="_Toc200304477" w:history="1">
             <w:r>
               <w:rPr>
                 <w:rStyle w:val="Hyperlink"/>
@@ -891,7 +891,7 @@
                 <w:noProof/>
                 <w:webHidden/>
               </w:rPr>
-              <w:instrText xml:space="preserve"> PAGEREF _Toc200292935 \h </w:instrText>
+              <w:instrText xml:space="preserve"> PAGEREF _Toc200304477 \h </w:instrText>
             </w:r>
             <w:r>
               <w:rPr>
@@ -934,7 +934,7 @@
               <w:lang w:eastAsia="pt-BR"/>
             </w:rPr>
           </w:pPr>
-          <w:hyperlink w:anchor="_Toc200292936" w:history="1">
+          <w:hyperlink w:anchor="_Toc200304478" w:history="1">
             <w:r>
               <w:rPr>
                 <w:rStyle w:val="Hyperlink"/>
@@ -962,7 +962,7 @@
                 <w:noProof/>
                 <w:webHidden/>
               </w:rPr>
-              <w:instrText xml:space="preserve"> PAGEREF _Toc200292936 \h </w:instrText>
+              <w:instrText xml:space="preserve"> PAGEREF _Toc200304478 \h </w:instrText>
             </w:r>
             <w:r>
               <w:rPr>
@@ -1005,7 +1005,7 @@
               <w:lang w:eastAsia="pt-BR"/>
             </w:rPr>
           </w:pPr>
-          <w:hyperlink w:anchor="_Toc200292937" w:history="1">
+          <w:hyperlink w:anchor="_Toc200304479" w:history="1">
             <w:r>
               <w:rPr>
                 <w:rStyle w:val="Hyperlink"/>
@@ -1033,7 +1033,7 @@
                 <w:noProof/>
                 <w:webHidden/>
               </w:rPr>
-              <w:instrText xml:space="preserve"> PAGEREF _Toc200292937 \h </w:instrText>
+              <w:instrText xml:space="preserve"> PAGEREF _Toc200304479 \h </w:instrText>
             </w:r>
             <w:r>
               <w:rPr>
@@ -1076,7 +1076,7 @@
               <w:lang w:eastAsia="pt-BR"/>
             </w:rPr>
           </w:pPr>
-          <w:hyperlink w:anchor="_Toc200292938" w:history="1">
+          <w:hyperlink w:anchor="_Toc200304480" w:history="1">
             <w:r>
               <w:rPr>
                 <w:rStyle w:val="Hyperlink"/>
@@ -1104,7 +1104,7 @@
                 <w:noProof/>
                 <w:webHidden/>
               </w:rPr>
-              <w:instrText xml:space="preserve"> PAGEREF _Toc200292938 \h </w:instrText>
+              <w:instrText xml:space="preserve"> PAGEREF _Toc200304480 \h </w:instrText>
             </w:r>
             <w:r>
               <w:rPr>
@@ -1148,7 +1148,7 @@
               <w:lang w:eastAsia="pt-BR"/>
             </w:rPr>
           </w:pPr>
-          <w:hyperlink w:anchor="_Toc200292939" w:history="1">
+          <w:hyperlink w:anchor="_Toc200304481" w:history="1">
             <w:r>
               <w:rPr>
                 <w:rStyle w:val="Hyperlink"/>
@@ -1192,7 +1192,7 @@
                 <w:noProof/>
                 <w:webHidden/>
               </w:rPr>
-              <w:instrText xml:space="preserve"> PAGEREF _Toc200292939 \h </w:instrText>
+              <w:instrText xml:space="preserve"> PAGEREF _Toc200304481 \h </w:instrText>
             </w:r>
             <w:r>
               <w:rPr>
@@ -1235,7 +1235,7 @@
               <w:lang w:eastAsia="pt-BR"/>
             </w:rPr>
           </w:pPr>
-          <w:hyperlink w:anchor="_Toc200292940" w:history="1">
+          <w:hyperlink w:anchor="_Toc200304482" w:history="1">
             <w:r>
               <w:rPr>
                 <w:rStyle w:val="Hyperlink"/>
@@ -1263,7 +1263,7 @@
                 <w:noProof/>
                 <w:webHidden/>
               </w:rPr>
-              <w:instrText xml:space="preserve"> PAGEREF _Toc200292940 \h </w:instrText>
+              <w:instrText xml:space="preserve"> PAGEREF _Toc200304482 \h </w:instrText>
             </w:r>
             <w:r>
               <w:rPr>
@@ -1306,7 +1306,7 @@
               <w:lang w:eastAsia="pt-BR"/>
             </w:rPr>
           </w:pPr>
-          <w:hyperlink w:anchor="_Toc200292941" w:history="1">
+          <w:hyperlink w:anchor="_Toc200304483" w:history="1">
             <w:r>
               <w:rPr>
                 <w:rStyle w:val="Hyperlink"/>
@@ -1333,7 +1333,7 @@
                 <w:noProof/>
                 <w:webHidden/>
               </w:rPr>
-              <w:instrText xml:space="preserve"> PAGEREF _Toc200292941 \h </w:instrText>
+              <w:instrText xml:space="preserve"> PAGEREF _Toc200304483 \h </w:instrText>
             </w:r>
             <w:r>
               <w:rPr>
@@ -1376,7 +1376,7 @@
               <w:lang w:eastAsia="pt-BR"/>
             </w:rPr>
           </w:pPr>
-          <w:hyperlink w:anchor="_Toc200292942" w:history="1">
+          <w:hyperlink w:anchor="_Toc200304484" w:history="1">
             <w:r>
               <w:rPr>
                 <w:rStyle w:val="Hyperlink"/>
@@ -1403,7 +1403,7 @@
                 <w:noProof/>
                 <w:webHidden/>
               </w:rPr>
-              <w:instrText xml:space="preserve"> PAGEREF _Toc200292942 \h </w:instrText>
+              <w:instrText xml:space="preserve"> PAGEREF _Toc200304484 \h </w:instrText>
             </w:r>
             <w:r>
               <w:rPr>
@@ -1446,27 +1446,13 @@
               <w:lang w:eastAsia="pt-BR"/>
             </w:rPr>
           </w:pPr>
-          <w:hyperlink w:anchor="_Toc200292943" w:history="1">
+          <w:hyperlink w:anchor="_Toc200304485" w:history="1">
             <w:r>
               <w:rPr>
                 <w:rStyle w:val="Hyperlink"/>
                 <w:noProof/>
               </w:rPr>
-              <w:t>RESU</w:t>
-            </w:r>
-            <w:r>
-              <w:rPr>
-                <w:rStyle w:val="Hyperlink"/>
-                <w:noProof/>
-              </w:rPr>
-              <w:t>L</w:t>
-            </w:r>
-            <w:r>
-              <w:rPr>
-                <w:rStyle w:val="Hyperlink"/>
-                <w:noProof/>
-              </w:rPr>
-              <w:t>TADOS DOS TESTES</w:t>
+              <w:t>Resultados Dos Testes</w:t>
             </w:r>
             <w:r>
               <w:rPr>
@@ -1487,7 +1473,7 @@
                 <w:noProof/>
                 <w:webHidden/>
               </w:rPr>
-              <w:instrText xml:space="preserve"> PAGEREF _Toc200292943 \h </w:instrText>
+              <w:instrText xml:space="preserve"> PAGEREF _Toc200304485 \h </w:instrText>
             </w:r>
             <w:r>
               <w:rPr>
@@ -1507,7 +1493,7 @@
                 <w:noProof/>
                 <w:webHidden/>
               </w:rPr>
-              <w:t>13</w:t>
+              <w:t>12</w:t>
             </w:r>
             <w:r>
               <w:rPr>
@@ -1530,13 +1516,13 @@
               <w:lang w:eastAsia="pt-BR"/>
             </w:rPr>
           </w:pPr>
-          <w:hyperlink w:anchor="_Toc200292944" w:history="1">
+          <w:hyperlink w:anchor="_Toc200304486" w:history="1">
             <w:r>
               <w:rPr>
                 <w:rStyle w:val="Hyperlink"/>
                 <w:noProof/>
               </w:rPr>
-              <w:t>ORDERED INPUT</w:t>
+              <w:t>Ordered Input</w:t>
             </w:r>
             <w:r>
               <w:rPr>
@@ -1557,7 +1543,7 @@
                 <w:noProof/>
                 <w:webHidden/>
               </w:rPr>
-              <w:instrText xml:space="preserve"> PAGEREF _Toc200292944 \h </w:instrText>
+              <w:instrText xml:space="preserve"> PAGEREF _Toc200304486 \h </w:instrText>
             </w:r>
             <w:r>
               <w:rPr>
@@ -1600,13 +1586,13 @@
               <w:lang w:eastAsia="pt-BR"/>
             </w:rPr>
           </w:pPr>
-          <w:hyperlink w:anchor="_Toc200292945" w:history="1">
+          <w:hyperlink w:anchor="_Toc200304487" w:history="1">
             <w:r>
               <w:rPr>
                 <w:rStyle w:val="Hyperlink"/>
                 <w:noProof/>
               </w:rPr>
-              <w:t>REVERSE ORDERED INPUT</w:t>
+              <w:t>Reverse Ordered Input</w:t>
             </w:r>
             <w:r>
               <w:rPr>
@@ -1627,7 +1613,7 @@
                 <w:noProof/>
                 <w:webHidden/>
               </w:rPr>
-              <w:instrText xml:space="preserve"> PAGEREF _Toc200292945 \h </w:instrText>
+              <w:instrText xml:space="preserve"> PAGEREF _Toc200304487 \h </w:instrText>
             </w:r>
             <w:r>
               <w:rPr>
@@ -1670,13 +1656,13 @@
               <w:lang w:eastAsia="pt-BR"/>
             </w:rPr>
           </w:pPr>
-          <w:hyperlink w:anchor="_Toc200292946" w:history="1">
+          <w:hyperlink w:anchor="_Toc200304488" w:history="1">
             <w:r>
               <w:rPr>
                 <w:rStyle w:val="Hyperlink"/>
                 <w:noProof/>
               </w:rPr>
-              <w:t>UNIFORM INPUT</w:t>
+              <w:t>Uniform Input</w:t>
             </w:r>
             <w:r>
               <w:rPr>
@@ -1697,7 +1683,7 @@
                 <w:noProof/>
                 <w:webHidden/>
               </w:rPr>
-              <w:instrText xml:space="preserve"> PAGEREF _Toc200292946 \h </w:instrText>
+              <w:instrText xml:space="preserve"> PAGEREF _Toc200304488 \h </w:instrText>
             </w:r>
             <w:r>
               <w:rPr>
@@ -1717,7 +1703,7 @@
                 <w:noProof/>
                 <w:webHidden/>
               </w:rPr>
-              <w:t>14</w:t>
+              <w:t>16</w:t>
             </w:r>
             <w:r>
               <w:rPr>
@@ -1740,7 +1726,7 @@
               <w:lang w:eastAsia="pt-BR"/>
             </w:rPr>
           </w:pPr>
-          <w:hyperlink w:anchor="_Toc200292947" w:history="1">
+          <w:hyperlink w:anchor="_Toc200304489" w:history="1">
             <w:r>
               <w:rPr>
                 <w:rStyle w:val="Hyperlink"/>
@@ -1768,7 +1754,7 @@
                 <w:noProof/>
                 <w:webHidden/>
               </w:rPr>
-              <w:instrText xml:space="preserve"> PAGEREF _Toc200292947 \h </w:instrText>
+              <w:instrText xml:space="preserve"> PAGEREF _Toc200304489 \h </w:instrText>
             </w:r>
             <w:r>
               <w:rPr>
@@ -1788,7 +1774,7 @@
                 <w:noProof/>
                 <w:webHidden/>
               </w:rPr>
-              <w:t>15</w:t>
+              <w:t>18</w:t>
             </w:r>
             <w:r>
               <w:rPr>
@@ -1811,7 +1797,7 @@
               <w:lang w:eastAsia="pt-BR"/>
             </w:rPr>
           </w:pPr>
-          <w:hyperlink w:anchor="_Toc200292948" w:history="1">
+          <w:hyperlink w:anchor="_Toc200304490" w:history="1">
             <w:r>
               <w:rPr>
                 <w:rStyle w:val="Hyperlink"/>
@@ -1838,7 +1824,7 @@
                 <w:noProof/>
                 <w:webHidden/>
               </w:rPr>
-              <w:instrText xml:space="preserve"> PAGEREF _Toc200292948 \h </w:instrText>
+              <w:instrText xml:space="preserve"> PAGEREF _Toc200304490 \h </w:instrText>
             </w:r>
             <w:r>
               <w:rPr>
@@ -1858,7 +1844,7 @@
                 <w:noProof/>
                 <w:webHidden/>
               </w:rPr>
-              <w:t>16</w:t>
+              <w:t>18</w:t>
             </w:r>
             <w:r>
               <w:rPr>
@@ -1881,7 +1867,7 @@
               <w:lang w:eastAsia="pt-BR"/>
             </w:rPr>
           </w:pPr>
-          <w:hyperlink w:anchor="_Toc200292949" w:history="1">
+          <w:hyperlink w:anchor="_Toc200304491" w:history="1">
             <w:r>
               <w:rPr>
                 <w:rStyle w:val="Hyperlink"/>
@@ -1908,7 +1894,7 @@
                 <w:noProof/>
                 <w:webHidden/>
               </w:rPr>
-              <w:instrText xml:space="preserve"> PAGEREF _Toc200292949 \h </w:instrText>
+              <w:instrText xml:space="preserve"> PAGEREF _Toc200304491 \h </w:instrText>
             </w:r>
             <w:r>
               <w:rPr>
@@ -1928,7 +1914,7 @@
                 <w:noProof/>
                 <w:webHidden/>
               </w:rPr>
-              <w:t>16</w:t>
+              <w:t>19</w:t>
             </w:r>
             <w:r>
               <w:rPr>
@@ -1952,7 +1938,7 @@
               <w:lang w:eastAsia="pt-BR"/>
             </w:rPr>
           </w:pPr>
-          <w:hyperlink w:anchor="_Toc200292950" w:history="1">
+          <w:hyperlink w:anchor="_Toc200304492" w:history="1">
             <w:r>
               <w:rPr>
                 <w:rStyle w:val="Hyperlink"/>
@@ -1996,7 +1982,7 @@
                 <w:noProof/>
                 <w:webHidden/>
               </w:rPr>
-              <w:instrText xml:space="preserve"> PAGEREF _Toc200292950 \h </w:instrText>
+              <w:instrText xml:space="preserve"> PAGEREF _Toc200304492 \h </w:instrText>
             </w:r>
             <w:r>
               <w:rPr>
@@ -2016,7 +2002,7 @@
                 <w:noProof/>
                 <w:webHidden/>
               </w:rPr>
-              <w:t>17</w:t>
+              <w:t>19</w:t>
             </w:r>
             <w:r>
               <w:rPr>
@@ -2039,7 +2025,7 @@
               <w:lang w:eastAsia="pt-BR"/>
             </w:rPr>
           </w:pPr>
-          <w:hyperlink w:anchor="_Toc200292951" w:history="1">
+          <w:hyperlink w:anchor="_Toc200304493" w:history="1">
             <w:r>
               <w:rPr>
                 <w:rStyle w:val="Hyperlink"/>
@@ -2067,7 +2053,7 @@
                 <w:noProof/>
                 <w:webHidden/>
               </w:rPr>
-              <w:instrText xml:space="preserve"> PAGEREF _Toc200292951 \h </w:instrText>
+              <w:instrText xml:space="preserve"> PAGEREF _Toc200304493 \h </w:instrText>
             </w:r>
             <w:r>
               <w:rPr>
@@ -2087,7 +2073,7 @@
                 <w:noProof/>
                 <w:webHidden/>
               </w:rPr>
-              <w:t>17</w:t>
+              <w:t>19</w:t>
             </w:r>
             <w:r>
               <w:rPr>
@@ -2110,7 +2096,7 @@
               <w:lang w:eastAsia="pt-BR"/>
             </w:rPr>
           </w:pPr>
-          <w:hyperlink w:anchor="_Toc200292952" w:history="1">
+          <w:hyperlink w:anchor="_Toc200304494" w:history="1">
             <w:r>
               <w:rPr>
                 <w:rStyle w:val="Hyperlink"/>
@@ -2138,7 +2124,7 @@
                 <w:noProof/>
                 <w:webHidden/>
               </w:rPr>
-              <w:instrText xml:space="preserve"> PAGEREF _Toc200292952 \h </w:instrText>
+              <w:instrText xml:space="preserve"> PAGEREF _Toc200304494 \h </w:instrText>
             </w:r>
             <w:r>
               <w:rPr>
@@ -2158,7 +2144,7 @@
                 <w:noProof/>
                 <w:webHidden/>
               </w:rPr>
-              <w:t>17</w:t>
+              <w:t>20</w:t>
             </w:r>
             <w:r>
               <w:rPr>
@@ -2182,7 +2168,7 @@
               <w:lang w:eastAsia="pt-BR"/>
             </w:rPr>
           </w:pPr>
-          <w:hyperlink w:anchor="_Toc200292953" w:history="1">
+          <w:hyperlink w:anchor="_Toc200304495" w:history="1">
             <w:r>
               <w:rPr>
                 <w:rStyle w:val="Hyperlink"/>
@@ -2226,7 +2212,7 @@
                 <w:noProof/>
                 <w:webHidden/>
               </w:rPr>
-              <w:instrText xml:space="preserve"> PAGEREF _Toc200292953 \h </w:instrText>
+              <w:instrText xml:space="preserve"> PAGEREF _Toc200304495 \h </w:instrText>
             </w:r>
             <w:r>
               <w:rPr>
@@ -2246,7 +2232,7 @@
                 <w:noProof/>
                 <w:webHidden/>
               </w:rPr>
-              <w:t>19</w:t>
+              <w:t>20</w:t>
             </w:r>
             <w:r>
               <w:rPr>
@@ -2302,7 +2288,7 @@
           <w:szCs w:val="24"/>
         </w:rPr>
       </w:pPr>
-      <w:bookmarkStart w:id="0" w:name="_Toc200292928"/>
+      <w:bookmarkStart w:id="0" w:name="_Toc200304470"/>
       <w:r>
         <w:rPr>
           <w:rFonts w:ascii="Times" w:hAnsi="Times" w:cs="Times"/>
@@ -2312,6 +2298,14 @@
         <w:t>Introdução</w:t>
       </w:r>
       <w:bookmarkEnd w:id="0"/>
+      <w:r>
+        <w:rPr>
+          <w:rFonts w:ascii="Times" w:hAnsi="Times" w:cs="Times"/>
+          <w:sz w:val="24"/>
+          <w:szCs w:val="24"/>
+        </w:rPr>
+        <w:t xml:space="preserve"> - FALTA</w:t>
+      </w:r>
     </w:p>
     <w:p>
       <w:pPr>
@@ -2323,7 +2317,7 @@
           <w:szCs w:val="24"/>
         </w:rPr>
       </w:pPr>
-      <w:bookmarkStart w:id="1" w:name="_Toc200292929"/>
+      <w:bookmarkStart w:id="1" w:name="_Toc200304471"/>
       <w:r>
         <w:rPr>
           <w:rFonts w:ascii="Times" w:hAnsi="Times" w:cs="Times"/>
@@ -2352,7 +2346,7 @@
           <w:szCs w:val="24"/>
         </w:rPr>
       </w:pPr>
-      <w:bookmarkStart w:id="2" w:name="_Toc200292930"/>
+      <w:bookmarkStart w:id="2" w:name="_Toc200304472"/>
       <w:r>
         <w:rPr>
           <w:rFonts w:ascii="Times" w:hAnsi="Times" w:cs="Times"/>
@@ -2381,7 +2375,7 @@
           <w:szCs w:val="24"/>
         </w:rPr>
       </w:pPr>
-      <w:bookmarkStart w:id="3" w:name="_Toc200292931"/>
+      <w:bookmarkStart w:id="3" w:name="_Toc200304473"/>
       <w:r>
         <w:rPr>
           <w:rFonts w:ascii="Times" w:hAnsi="Times" w:cs="Times"/>
@@ -2433,7 +2427,7 @@
           <w:szCs w:val="24"/>
         </w:rPr>
       </w:pPr>
-      <w:bookmarkStart w:id="4" w:name="_Toc200292932"/>
+      <w:bookmarkStart w:id="4" w:name="_Toc200304474"/>
       <w:r>
         <w:rPr>
           <w:rFonts w:ascii="Times" w:hAnsi="Times" w:cs="Times"/>
@@ -2462,7 +2456,7 @@
           <w:szCs w:val="24"/>
         </w:rPr>
       </w:pPr>
-      <w:bookmarkStart w:id="5" w:name="_Toc200292933"/>
+      <w:bookmarkStart w:id="5" w:name="_Toc200304475"/>
       <w:r>
         <w:rPr>
           <w:rFonts w:ascii="Times" w:hAnsi="Times" w:cs="Times"/>
@@ -2628,7 +2622,7 @@
         </w:rPr>
         <w:t xml:space="preserve"> </w:t>
       </w:r>
-      <w:bookmarkStart w:id="6" w:name="_Toc200292934"/>
+      <w:bookmarkStart w:id="6" w:name="_Toc200304476"/>
       <w:r>
         <w:rPr>
           <w:rFonts w:ascii="Times" w:hAnsi="Times" w:cs="Times"/>
@@ -5264,7 +5258,7 @@
           <w:szCs w:val="24"/>
         </w:rPr>
       </w:pPr>
-      <w:bookmarkStart w:id="7" w:name="_Toc200292935"/>
+      <w:bookmarkStart w:id="7" w:name="_Toc200304477"/>
       <w:r>
         <w:rPr>
           <w:rFonts w:ascii="Times" w:hAnsi="Times" w:cs="Times"/>
@@ -5281,6 +5275,14 @@
           <w:szCs w:val="24"/>
         </w:rPr>
         <w:t xml:space="preserve"> </w:t>
+      </w:r>
+      <w:r>
+        <w:rPr>
+          <w:rFonts w:ascii="Times" w:hAnsi="Times" w:cs="Times"/>
+          <w:sz w:val="24"/>
+          <w:szCs w:val="24"/>
+        </w:rPr>
+        <w:t>- FALTA</w:t>
       </w:r>
     </w:p>
     <w:p>
@@ -5430,7 +5432,7 @@
           <w:szCs w:val="24"/>
         </w:rPr>
       </w:pPr>
-      <w:bookmarkStart w:id="8" w:name="_Toc200292936"/>
+      <w:bookmarkStart w:id="8" w:name="_Toc200304478"/>
       <w:r>
         <w:rPr>
           <w:rFonts w:ascii="Times" w:hAnsi="Times" w:cs="Times"/>
@@ -5455,6 +5457,14 @@
           <w:szCs w:val="24"/>
         </w:rPr>
         <w:t xml:space="preserve"> </w:t>
+      </w:r>
+      <w:r>
+        <w:rPr>
+          <w:rFonts w:ascii="Times" w:hAnsi="Times" w:cs="Times"/>
+          <w:sz w:val="24"/>
+          <w:szCs w:val="24"/>
+        </w:rPr>
+        <w:t>- FALTA</w:t>
       </w:r>
     </w:p>
     <w:p>
@@ -5630,7 +5640,7 @@
           <w:szCs w:val="24"/>
         </w:rPr>
       </w:pPr>
-      <w:bookmarkStart w:id="9" w:name="_Toc200292937"/>
+      <w:bookmarkStart w:id="9" w:name="_Toc200304479"/>
       <w:r>
         <w:rPr>
           <w:rFonts w:ascii="Times" w:hAnsi="Times" w:cs="Times"/>
@@ -5647,6 +5657,14 @@
           <w:szCs w:val="24"/>
         </w:rPr>
         <w:t xml:space="preserve"> </w:t>
+      </w:r>
+      <w:r>
+        <w:rPr>
+          <w:rFonts w:ascii="Times" w:hAnsi="Times" w:cs="Times"/>
+          <w:sz w:val="24"/>
+          <w:szCs w:val="24"/>
+        </w:rPr>
+        <w:t>- FALTA</w:t>
       </w:r>
     </w:p>
     <w:p>
@@ -5837,7 +5855,7 @@
           <w:szCs w:val="24"/>
         </w:rPr>
       </w:pPr>
-      <w:bookmarkStart w:id="10" w:name="_Toc200292938"/>
+      <w:bookmarkStart w:id="10" w:name="_Toc200304480"/>
       <w:r>
         <w:rPr>
           <w:rFonts w:ascii="Times" w:hAnsi="Times" w:cs="Times"/>
@@ -5854,6 +5872,14 @@
           <w:szCs w:val="24"/>
         </w:rPr>
         <w:t xml:space="preserve"> </w:t>
+      </w:r>
+      <w:r>
+        <w:rPr>
+          <w:rFonts w:ascii="Times" w:hAnsi="Times" w:cs="Times"/>
+          <w:sz w:val="24"/>
+          <w:szCs w:val="24"/>
+        </w:rPr>
+        <w:t>- FALTA</w:t>
       </w:r>
     </w:p>
     <w:p>
@@ -5875,7 +5901,7 @@
           <w:szCs w:val="24"/>
         </w:rPr>
       </w:pPr>
-      <w:bookmarkStart w:id="11" w:name="_Toc200292939"/>
+      <w:bookmarkStart w:id="11" w:name="_Toc200304481"/>
       <w:r>
         <w:rPr>
           <w:rFonts w:ascii="Times" w:hAnsi="Times" w:cs="Times"/>
@@ -5888,39 +5914,26 @@
     </w:p>
     <w:p>
       <w:pPr>
-        <w:pStyle w:val="Ttulo2"/>
-        <w:jc w:val="both"/>
-        <w:rPr>
-          <w:rFonts w:ascii="Times" w:hAnsi="Times" w:cs="Times"/>
-          <w:sz w:val="24"/>
-          <w:szCs w:val="24"/>
-        </w:rPr>
-      </w:pPr>
-      <w:bookmarkStart w:id="12" w:name="_Toc200292940"/>
-      <w:r>
-        <w:rPr>
-          <w:rFonts w:ascii="Times" w:hAnsi="Times" w:cs="Times"/>
-          <w:sz w:val="24"/>
-          <w:szCs w:val="24"/>
-        </w:rPr>
+        <w:pStyle w:val="Titulo2Relatorio"/>
+      </w:pPr>
+      <w:bookmarkStart w:id="12" w:name="_Toc200304482"/>
+      <w:r>
         <w:t>Detalhamento da implementação e decisões tomadas durante a construção do algoritmo.</w:t>
       </w:r>
       <w:bookmarkEnd w:id="12"/>
       <w:r>
-        <w:rPr>
-          <w:rFonts w:ascii="Times" w:hAnsi="Times" w:cs="Times"/>
-          <w:sz w:val="24"/>
-          <w:szCs w:val="24"/>
-        </w:rPr>
         <w:t xml:space="preserve"> </w:t>
       </w:r>
+      <w:r>
+        <w:t>- FALTA</w:t>
+      </w:r>
     </w:p>
     <w:p/>
     <w:p>
       <w:pPr>
         <w:pStyle w:val="Titulo3Relatorio"/>
       </w:pPr>
-      <w:bookmarkStart w:id="13" w:name="_Toc200292941"/>
+      <w:bookmarkStart w:id="13" w:name="_Toc200304483"/>
       <w:r>
         <w:t>Algoritmo da obra Estrutura de Dados Usando C</w:t>
       </w:r>
@@ -8793,7 +8806,7 @@
       <w:pPr>
         <w:pStyle w:val="Titulo3Relatorio"/>
       </w:pPr>
-      <w:bookmarkStart w:id="14" w:name="_Toc200292942"/>
+      <w:bookmarkStart w:id="14" w:name="_Toc200304484"/>
       <w:r>
         <w:t>Algoritmo do site Programmiz</w:t>
       </w:r>
@@ -11421,7 +11434,12 @@
       <w:pPr>
         <w:pStyle w:val="Titulo2Relatorio"/>
       </w:pPr>
-      <w:bookmarkStart w:id="15" w:name="_Toc200292943"/>
+    </w:p>
+    <w:p>
+      <w:pPr>
+        <w:pStyle w:val="Titulo2Relatorio"/>
+      </w:pPr>
+      <w:bookmarkStart w:id="15" w:name="_Toc200304485"/>
       <w:r>
         <w:t>R</w:t>
       </w:r>
@@ -11488,16 +11506,63 @@
       <w:pPr>
         <w:pStyle w:val="Titulo3Relatorio"/>
       </w:pPr>
-      <w:bookmarkStart w:id="16" w:name="_Toc200292944"/>
-      <w:r>
-        <w:lastRenderedPageBreak/>
+      <w:bookmarkStart w:id="16" w:name="_Toc200304486"/>
+      <w:r>
         <w:t>Ordered Input</w:t>
       </w:r>
       <w:bookmarkEnd w:id="16"/>
     </w:p>
     <w:p>
       <w:pPr>
+        <w:pStyle w:val="NormalRelatorio"/>
+      </w:pPr>
+      <w:r>
+        <w:t xml:space="preserve">Para o arquivo de entrada ordenada, foram ordenados vetores de tamanhos de; 10.000 a 4.000.000 de elementos. Foram executados os algoritmos de ordenação </w:t>
+      </w:r>
+      <w:r>
+        <w:rPr>
+          <w:b/>
+          <w:i/>
+        </w:rPr>
+        <w:t>Quicksort</w:t>
+      </w:r>
+      <w:r>
+        <w:rPr>
+          <w:i/>
+        </w:rPr>
+        <w:t xml:space="preserve">, </w:t>
+      </w:r>
+      <w:r>
+        <w:rPr>
+          <w:b/>
+          <w:i/>
+        </w:rPr>
+        <w:t>Selectionsort</w:t>
+      </w:r>
+      <w:r>
+        <w:rPr>
+          <w:i/>
+        </w:rPr>
+        <w:t xml:space="preserve"> e </w:t>
+      </w:r>
+      <w:r>
+        <w:rPr>
+          <w:b/>
+          <w:i/>
+        </w:rPr>
+        <w:t>Heapsort</w:t>
+      </w:r>
+      <w:r>
+        <w:t>, e o</w:t>
+      </w:r>
+      <w:r>
+        <w:t>s seus tempos de execução foram comparados na tabela a seguir:</w:t>
+      </w:r>
+    </w:p>
+    <w:p>
+      <w:pPr>
         <w:pStyle w:val="Titulo2Relatorio"/>
+        <w:jc w:val="center"/>
       </w:pPr>
       <w:r>
         <w:rPr>
@@ -11543,6 +11608,276 @@
     </w:p>
     <w:p>
       <w:pPr>
+        <w:pStyle w:val="NormalRelatorio"/>
+      </w:pPr>
+      <w:r>
+        <w:t xml:space="preserve">Notou-se que a eficiência do algoritmo </w:t>
+      </w:r>
+      <w:r>
+        <w:rPr>
+          <w:b/>
+        </w:rPr>
+        <w:t>Quicksort</w:t>
+      </w:r>
+      <w:r>
+        <w:t xml:space="preserve"> é superior aos demais algoritmos apresentados, mesmo o </w:t>
+      </w:r>
+      <w:r>
+        <w:rPr>
+          <w:b/>
+        </w:rPr>
+        <w:t>Heapsort</w:t>
+      </w:r>
+      <w:r>
+        <w:t xml:space="preserve"> mantendo a mesma complexidade </w:t>
+      </w:r>
+      <m:oMath>
+        <m:r>
+          <w:rPr>
+            <w:rFonts w:ascii="Cambria Math" w:hAnsi="Cambria Math"/>
+          </w:rPr>
+          <m:t>O(n</m:t>
+        </m:r>
+        <m:func>
+          <m:funcPr>
+            <m:ctrlPr>
+              <w:rPr>
+                <w:rFonts w:ascii="Cambria Math" w:hAnsi="Cambria Math"/>
+                <w:i/>
+              </w:rPr>
+            </m:ctrlPr>
+          </m:funcPr>
+          <m:fName>
+            <m:r>
+              <m:rPr>
+                <m:sty m:val="p"/>
+              </m:rPr>
+              <w:rPr>
+                <w:rFonts w:ascii="Cambria Math" w:hAnsi="Cambria Math"/>
+              </w:rPr>
+              <m:t>log</m:t>
+            </m:r>
+          </m:fName>
+          <m:e>
+            <m:r>
+              <w:rPr>
+                <w:rFonts w:ascii="Cambria Math" w:hAnsi="Cambria Math"/>
+              </w:rPr>
+              <m:t>n)</m:t>
+            </m:r>
+          </m:e>
+        </m:func>
+      </m:oMath>
+      <w:r>
+        <w:t xml:space="preserve"> em todos os casos. O </w:t>
+      </w:r>
+      <w:r>
+        <w:rPr>
+          <w:i/>
+        </w:rPr>
+        <w:t>heapify</w:t>
+      </w:r>
+      <w:r>
+        <w:t xml:space="preserve"> utiliza uma quantidade considerável de processamento, devido as reorganizações de todo heap, afetando na sua corrida temporal. </w:t>
+      </w:r>
+      <w:r>
+        <w:t xml:space="preserve">O </w:t>
+      </w:r>
+      <w:r>
+        <w:rPr>
+          <w:b/>
+        </w:rPr>
+        <w:t>Selectionsort</w:t>
+      </w:r>
+      <w:r>
+        <w:t xml:space="preserve"> é um algoritmo bem ineficiente, pois o seu número exagerado de comparações afeta de forma significativa o tempo de processamento</w:t>
+      </w:r>
+      <w:r>
+        <w:t xml:space="preserve">, mantendo a grandeza </w:t>
+      </w:r>
+      <m:oMath>
+        <m:r>
+          <w:rPr>
+            <w:rFonts w:ascii="Cambria Math" w:hAnsi="Cambria Math"/>
+          </w:rPr>
+          <m:t>O(</m:t>
+        </m:r>
+        <m:sSup>
+          <m:sSupPr>
+            <m:ctrlPr>
+              <w:rPr>
+                <w:rFonts w:ascii="Cambria Math" w:hAnsi="Cambria Math"/>
+                <w:i/>
+              </w:rPr>
+            </m:ctrlPr>
+          </m:sSupPr>
+          <m:e>
+            <m:r>
+              <w:rPr>
+                <w:rFonts w:ascii="Cambria Math" w:hAnsi="Cambria Math"/>
+              </w:rPr>
+              <m:t>n</m:t>
+            </m:r>
+          </m:e>
+          <m:sup>
+            <m:r>
+              <w:rPr>
+                <w:rFonts w:ascii="Cambria Math" w:hAnsi="Cambria Math"/>
+              </w:rPr>
+              <m:t>2</m:t>
+            </m:r>
+          </m:sup>
+        </m:sSup>
+        <m:r>
+          <w:rPr>
+            <w:rFonts w:ascii="Cambria Math" w:hAnsi="Cambria Math"/>
+          </w:rPr>
+          <m:t>)</m:t>
+        </m:r>
+      </m:oMath>
+      <w:r>
+        <w:rPr>
+          <w:rFonts w:eastAsiaTheme="minorEastAsia"/>
+        </w:rPr>
+        <w:t xml:space="preserve"> em todos os casos</w:t>
+      </w:r>
+      <w:r>
+        <w:t xml:space="preserve">. </w:t>
+      </w:r>
+      <w:r>
+        <w:t xml:space="preserve">Já o </w:t>
+      </w:r>
+      <w:r>
+        <w:rPr>
+          <w:b/>
+        </w:rPr>
+        <w:t>Quicksort</w:t>
+      </w:r>
+      <w:r>
+        <w:t>, é superior devido as suas operações eficientes de particionamento do vetor</w:t>
+      </w:r>
+      <w:r>
+        <w:t>, o bom uso de pivôs, menos execuções de trocas e comparações mais leve</w:t>
+      </w:r>
+      <w:r>
+        <w:t>s</w:t>
+      </w:r>
+      <w:r>
+        <w:t>.</w:t>
+      </w:r>
+      <w:r>
+        <w:t xml:space="preserve"> Atuando de forma mais efetiva </w:t>
+      </w:r>
+      <w:r>
+        <w:t>quanto a</w:t>
+      </w:r>
+      <w:r>
+        <w:t>o uso de processamento</w:t>
+      </w:r>
+      <w:r>
+        <w:t xml:space="preserve">, tendo a mesma complexidade de </w:t>
+      </w:r>
+      <w:r>
+        <w:rPr>
+          <w:b/>
+        </w:rPr>
+        <w:t>Heapsort</w:t>
+      </w:r>
+      <w:r>
+        <w:t xml:space="preserve"> </w:t>
+      </w:r>
+      <m:oMath>
+        <m:r>
+          <w:rPr>
+            <w:rFonts w:ascii="Cambria Math" w:hAnsi="Cambria Math"/>
+          </w:rPr>
+          <m:t>O(n</m:t>
+        </m:r>
+        <m:func>
+          <m:funcPr>
+            <m:ctrlPr>
+              <w:rPr>
+                <w:rFonts w:ascii="Cambria Math" w:hAnsi="Cambria Math"/>
+                <w:i/>
+              </w:rPr>
+            </m:ctrlPr>
+          </m:funcPr>
+          <m:fName>
+            <m:r>
+              <m:rPr>
+                <m:sty m:val="p"/>
+              </m:rPr>
+              <w:rPr>
+                <w:rFonts w:ascii="Cambria Math" w:hAnsi="Cambria Math"/>
+              </w:rPr>
+              <m:t>log</m:t>
+            </m:r>
+          </m:fName>
+          <m:e>
+            <m:r>
+              <w:rPr>
+                <w:rFonts w:ascii="Cambria Math" w:hAnsi="Cambria Math"/>
+              </w:rPr>
+              <m:t>n)</m:t>
+            </m:r>
+          </m:e>
+        </m:func>
+      </m:oMath>
+      <w:r>
+        <w:rPr>
+          <w:rFonts w:eastAsiaTheme="minorEastAsia"/>
+        </w:rPr>
+        <w:t xml:space="preserve"> no melhor e médio caso, sendo apenas o pior caso </w:t>
+      </w:r>
+      <m:oMath>
+        <m:r>
+          <w:rPr>
+            <w:rFonts w:ascii="Cambria Math" w:eastAsiaTheme="minorEastAsia" w:hAnsi="Cambria Math"/>
+          </w:rPr>
+          <m:t>O(</m:t>
+        </m:r>
+        <m:sSup>
+          <m:sSupPr>
+            <m:ctrlPr>
+              <w:rPr>
+                <w:rFonts w:ascii="Cambria Math" w:eastAsiaTheme="minorEastAsia" w:hAnsi="Cambria Math"/>
+                <w:i/>
+              </w:rPr>
+            </m:ctrlPr>
+          </m:sSupPr>
+          <m:e>
+            <m:r>
+              <w:rPr>
+                <w:rFonts w:ascii="Cambria Math" w:eastAsiaTheme="minorEastAsia" w:hAnsi="Cambria Math"/>
+              </w:rPr>
+              <m:t>n</m:t>
+            </m:r>
+          </m:e>
+          <m:sup>
+            <m:r>
+              <w:rPr>
+                <w:rFonts w:ascii="Cambria Math" w:eastAsiaTheme="minorEastAsia" w:hAnsi="Cambria Math"/>
+              </w:rPr>
+              <m:t>2</m:t>
+            </m:r>
+          </m:sup>
+        </m:sSup>
+        <m:r>
+          <w:rPr>
+            <w:rFonts w:ascii="Cambria Math" w:eastAsiaTheme="minorEastAsia" w:hAnsi="Cambria Math"/>
+          </w:rPr>
+          <m:t>)</m:t>
+        </m:r>
+      </m:oMath>
+      <w:r>
+        <w:t>.</w:t>
+      </w:r>
+      <w:r>
+        <w:t xml:space="preserve"> Sendo mais aparente no gráfico a seguir:</w:t>
+      </w:r>
+    </w:p>
+    <w:p>
+      <w:pPr>
         <w:pStyle w:val="Titulo2Relatorio"/>
       </w:pPr>
       <w:r>
@@ -11550,6 +11885,7 @@
           <w:noProof/>
           <w:lang w:eastAsia="pt-BR"/>
         </w:rPr>
+        <w:lastRenderedPageBreak/>
         <w:drawing>
           <wp:inline distT="0" distB="0" distL="0" distR="0">
             <wp:extent cx="5731510" cy="3683000"/>
@@ -11596,22 +11932,67 @@
       <w:pPr>
         <w:pStyle w:val="Titulo3Relatorio"/>
       </w:pPr>
-      <w:bookmarkStart w:id="17" w:name="_Toc200292945"/>
-      <w:r>
-        <w:lastRenderedPageBreak/>
+      <w:bookmarkStart w:id="17" w:name="_Toc200304487"/>
+      <w:r>
         <w:t>Reverse Ordered Input</w:t>
       </w:r>
       <w:bookmarkEnd w:id="17"/>
     </w:p>
     <w:p>
       <w:pPr>
+        <w:pStyle w:val="NormalRelatorio"/>
+      </w:pPr>
+      <w:r>
+        <w:t xml:space="preserve">Para o arquivo de entrada ordenada reversa, foram ordenados vetores de tamanhos de; 10.000 a 4.000.000 de elementos. Foram executados os algoritmos de ordenação </w:t>
+      </w:r>
+      <w:r>
+        <w:rPr>
+          <w:b/>
+          <w:i/>
+        </w:rPr>
+        <w:t>Quicksort</w:t>
+      </w:r>
+      <w:r>
+        <w:rPr>
+          <w:i/>
+        </w:rPr>
+        <w:t xml:space="preserve">, </w:t>
+      </w:r>
+      <w:r>
+        <w:rPr>
+          <w:b/>
+          <w:i/>
+        </w:rPr>
+        <w:t>Selectionsort</w:t>
+      </w:r>
+      <w:r>
+        <w:rPr>
+          <w:i/>
+        </w:rPr>
+        <w:t xml:space="preserve"> e </w:t>
+      </w:r>
+      <w:r>
+        <w:rPr>
+          <w:b/>
+          <w:i/>
+        </w:rPr>
+        <w:t>Heapsort</w:t>
+      </w:r>
+      <w:r>
+        <w:t>, e os seus tempos de execução foram comparados na tabela a seguir:</w:t>
+      </w:r>
+    </w:p>
+    <w:p>
+      <w:pPr>
         <w:pStyle w:val="Titulo2Relatorio"/>
+        <w:jc w:val="center"/>
       </w:pPr>
       <w:r>
         <w:rPr>
           <w:noProof/>
           <w:lang w:eastAsia="pt-BR"/>
         </w:rPr>
+        <w:lastRenderedPageBreak/>
         <w:drawing>
           <wp:inline distT="0" distB="0" distL="0" distR="0">
             <wp:extent cx="4221846" cy="3993226"/>
@@ -11651,6 +12032,243 @@
     </w:p>
     <w:p>
       <w:pPr>
+        <w:pStyle w:val="NormalRelatorio"/>
+      </w:pPr>
+      <w:r>
+        <w:t xml:space="preserve">Notou-se que a eficiência do algoritmo </w:t>
+      </w:r>
+      <w:r>
+        <w:rPr>
+          <w:b/>
+        </w:rPr>
+        <w:t>Quicksort</w:t>
+      </w:r>
+      <w:r>
+        <w:t xml:space="preserve"> é também superior aos demais algoritmos apresentados, mesmo o </w:t>
+      </w:r>
+      <w:r>
+        <w:rPr>
+          <w:b/>
+        </w:rPr>
+        <w:t>Heapsort</w:t>
+      </w:r>
+      <w:r>
+        <w:t xml:space="preserve"> mantendo a mesma complexidade </w:t>
+      </w:r>
+      <m:oMath>
+        <m:r>
+          <w:rPr>
+            <w:rFonts w:ascii="Cambria Math" w:hAnsi="Cambria Math"/>
+          </w:rPr>
+          <m:t>O(n</m:t>
+        </m:r>
+        <m:func>
+          <m:funcPr>
+            <m:ctrlPr>
+              <w:rPr>
+                <w:rFonts w:ascii="Cambria Math" w:hAnsi="Cambria Math"/>
+                <w:i/>
+              </w:rPr>
+            </m:ctrlPr>
+          </m:funcPr>
+          <m:fName>
+            <m:r>
+              <m:rPr>
+                <m:sty m:val="p"/>
+              </m:rPr>
+              <w:rPr>
+                <w:rFonts w:ascii="Cambria Math" w:hAnsi="Cambria Math"/>
+              </w:rPr>
+              <m:t>log</m:t>
+            </m:r>
+          </m:fName>
+          <m:e>
+            <m:r>
+              <w:rPr>
+                <w:rFonts w:ascii="Cambria Math" w:hAnsi="Cambria Math"/>
+              </w:rPr>
+              <m:t>n)</m:t>
+            </m:r>
+          </m:e>
+        </m:func>
+      </m:oMath>
+      <w:r>
+        <w:t xml:space="preserve"> em todos os casos. O </w:t>
+      </w:r>
+      <w:r>
+        <w:rPr>
+          <w:i/>
+        </w:rPr>
+        <w:t>heapify</w:t>
+      </w:r>
+      <w:r>
+        <w:t xml:space="preserve"> utiliza uma quantidade considerável de processamento, devido as reorganizações de todo heap, afetando na sua corrida temporal. O </w:t>
+      </w:r>
+      <w:r>
+        <w:rPr>
+          <w:b/>
+        </w:rPr>
+        <w:t>Selectionsort</w:t>
+      </w:r>
+      <w:r>
+        <w:t xml:space="preserve"> é um algoritmo bem ineficiente, pois o seu número exagerado de comparações afeta de forma significativa o tempo de processamento, mantendo a grandeza </w:t>
+      </w:r>
+      <m:oMath>
+        <m:r>
+          <w:rPr>
+            <w:rFonts w:ascii="Cambria Math" w:hAnsi="Cambria Math"/>
+          </w:rPr>
+          <m:t>O(</m:t>
+        </m:r>
+        <m:sSup>
+          <m:sSupPr>
+            <m:ctrlPr>
+              <w:rPr>
+                <w:rFonts w:ascii="Cambria Math" w:hAnsi="Cambria Math"/>
+                <w:i/>
+              </w:rPr>
+            </m:ctrlPr>
+          </m:sSupPr>
+          <m:e>
+            <m:r>
+              <w:rPr>
+                <w:rFonts w:ascii="Cambria Math" w:hAnsi="Cambria Math"/>
+              </w:rPr>
+              <m:t>n</m:t>
+            </m:r>
+          </m:e>
+          <m:sup>
+            <m:r>
+              <w:rPr>
+                <w:rFonts w:ascii="Cambria Math" w:hAnsi="Cambria Math"/>
+              </w:rPr>
+              <m:t>2</m:t>
+            </m:r>
+          </m:sup>
+        </m:sSup>
+        <m:r>
+          <w:rPr>
+            <w:rFonts w:ascii="Cambria Math" w:hAnsi="Cambria Math"/>
+          </w:rPr>
+          <m:t>)</m:t>
+        </m:r>
+      </m:oMath>
+      <w:r>
+        <w:rPr>
+          <w:rFonts w:eastAsiaTheme="minorEastAsia"/>
+        </w:rPr>
+        <w:t xml:space="preserve"> em todos os casos</w:t>
+      </w:r>
+      <w:r>
+        <w:t xml:space="preserve">. Já o </w:t>
+      </w:r>
+      <w:r>
+        <w:rPr>
+          <w:b/>
+        </w:rPr>
+        <w:t>Quicksort</w:t>
+      </w:r>
+      <w:r>
+        <w:t xml:space="preserve">, é superior devido as suas operações eficientes de particionamento do vetor, o bom uso de pivôs, menos execuções de trocas e comparações mais leves. Atuando de forma mais efetiva quanto ao uso de processamento, tendo a mesma complexidade de </w:t>
+      </w:r>
+      <w:r>
+        <w:rPr>
+          <w:b/>
+        </w:rPr>
+        <w:t>Heapsort</w:t>
+      </w:r>
+      <w:r>
+        <w:t xml:space="preserve"> </w:t>
+      </w:r>
+      <m:oMath>
+        <m:r>
+          <w:rPr>
+            <w:rFonts w:ascii="Cambria Math" w:hAnsi="Cambria Math"/>
+          </w:rPr>
+          <m:t>O(n</m:t>
+        </m:r>
+        <m:func>
+          <m:funcPr>
+            <m:ctrlPr>
+              <w:rPr>
+                <w:rFonts w:ascii="Cambria Math" w:hAnsi="Cambria Math"/>
+                <w:i/>
+              </w:rPr>
+            </m:ctrlPr>
+          </m:funcPr>
+          <m:fName>
+            <m:r>
+              <m:rPr>
+                <m:sty m:val="p"/>
+              </m:rPr>
+              <w:rPr>
+                <w:rFonts w:ascii="Cambria Math" w:hAnsi="Cambria Math"/>
+              </w:rPr>
+              <m:t>log</m:t>
+            </m:r>
+          </m:fName>
+          <m:e>
+            <m:r>
+              <w:rPr>
+                <w:rFonts w:ascii="Cambria Math" w:hAnsi="Cambria Math"/>
+              </w:rPr>
+              <m:t>n)</m:t>
+            </m:r>
+          </m:e>
+        </m:func>
+      </m:oMath>
+      <w:r>
+        <w:rPr>
+          <w:rFonts w:eastAsiaTheme="minorEastAsia"/>
+        </w:rPr>
+        <w:t xml:space="preserve"> no melhor e médio caso, sendo apenas o pior caso </w:t>
+      </w:r>
+      <m:oMath>
+        <m:r>
+          <w:rPr>
+            <w:rFonts w:ascii="Cambria Math" w:eastAsiaTheme="minorEastAsia" w:hAnsi="Cambria Math"/>
+          </w:rPr>
+          <m:t>O(</m:t>
+        </m:r>
+        <m:sSup>
+          <m:sSupPr>
+            <m:ctrlPr>
+              <w:rPr>
+                <w:rFonts w:ascii="Cambria Math" w:eastAsiaTheme="minorEastAsia" w:hAnsi="Cambria Math"/>
+                <w:i/>
+              </w:rPr>
+            </m:ctrlPr>
+          </m:sSupPr>
+          <m:e>
+            <m:r>
+              <w:rPr>
+                <w:rFonts w:ascii="Cambria Math" w:eastAsiaTheme="minorEastAsia" w:hAnsi="Cambria Math"/>
+              </w:rPr>
+              <m:t>n</m:t>
+            </m:r>
+          </m:e>
+          <m:sup>
+            <m:r>
+              <w:rPr>
+                <w:rFonts w:ascii="Cambria Math" w:eastAsiaTheme="minorEastAsia" w:hAnsi="Cambria Math"/>
+              </w:rPr>
+              <m:t>2</m:t>
+            </m:r>
+          </m:sup>
+        </m:sSup>
+        <m:r>
+          <w:rPr>
+            <w:rFonts w:ascii="Cambria Math" w:eastAsiaTheme="minorEastAsia" w:hAnsi="Cambria Math"/>
+          </w:rPr>
+          <m:t>)</m:t>
+        </m:r>
+      </m:oMath>
+      <w:r>
+        <w:t>. Sendo mais aparente no gráfico a seguir:</w:t>
+      </w:r>
+    </w:p>
+    <w:p>
+      <w:pPr>
         <w:pStyle w:val="Titulo2Relatorio"/>
       </w:pPr>
       <w:r>
@@ -11658,6 +12276,7 @@
           <w:noProof/>
           <w:lang w:eastAsia="pt-BR"/>
         </w:rPr>
+        <w:lastRenderedPageBreak/>
         <w:drawing>
           <wp:inline distT="0" distB="0" distL="0" distR="0">
             <wp:extent cx="5731510" cy="3684270"/>
@@ -11699,7 +12318,7 @@
       <w:pPr>
         <w:pStyle w:val="Titulo3Relatorio"/>
       </w:pPr>
-      <w:bookmarkStart w:id="18" w:name="_Toc200292946"/>
+      <w:bookmarkStart w:id="18" w:name="_Toc200304488"/>
       <w:r>
         <w:t>Uniform Input</w:t>
       </w:r>
@@ -11707,7 +12326,52 @@
     </w:p>
     <w:p>
       <w:pPr>
+        <w:pStyle w:val="NormalRelatorio"/>
+      </w:pPr>
+      <w:r>
+        <w:t xml:space="preserve">Para o arquivo de entrada ordenada uniforme, foram ordenados vetores de tamanhos de; 10.000 a 4.000.000 de elementos. Foram executados os algoritmos de ordenação </w:t>
+      </w:r>
+      <w:r>
+        <w:rPr>
+          <w:b/>
+          <w:i/>
+        </w:rPr>
+        <w:t>Quicksort</w:t>
+      </w:r>
+      <w:r>
+        <w:rPr>
+          <w:i/>
+        </w:rPr>
+        <w:t xml:space="preserve">, </w:t>
+      </w:r>
+      <w:r>
+        <w:rPr>
+          <w:b/>
+          <w:i/>
+        </w:rPr>
+        <w:t>Selectionsort</w:t>
+      </w:r>
+      <w:r>
+        <w:rPr>
+          <w:i/>
+        </w:rPr>
+        <w:t xml:space="preserve"> e </w:t>
+      </w:r>
+      <w:r>
+        <w:rPr>
+          <w:b/>
+          <w:i/>
+        </w:rPr>
+        <w:t>Heapsort</w:t>
+      </w:r>
+      <w:r>
+        <w:t>, e os seus tempos de execução foram comparados na tabela a seguir:</w:t>
+      </w:r>
+    </w:p>
+    <w:p>
+      <w:pPr>
         <w:pStyle w:val="Titulo2Relatorio"/>
+        <w:jc w:val="center"/>
       </w:pPr>
       <w:r>
         <w:rPr>
@@ -11754,6 +12418,243 @@
     </w:p>
     <w:p>
       <w:pPr>
+        <w:pStyle w:val="NormalRelatorio"/>
+      </w:pPr>
+      <w:r>
+        <w:t xml:space="preserve">Notou-se que a eficiência do algoritmo </w:t>
+      </w:r>
+      <w:r>
+        <w:rPr>
+          <w:b/>
+        </w:rPr>
+        <w:t>Quicksort</w:t>
+      </w:r>
+      <w:r>
+        <w:t xml:space="preserve"> permaneceu superior aos demais algoritmos apresentados, mesmo o </w:t>
+      </w:r>
+      <w:r>
+        <w:rPr>
+          <w:b/>
+        </w:rPr>
+        <w:t>Heapsort</w:t>
+      </w:r>
+      <w:r>
+        <w:t xml:space="preserve"> mantendo a mesma complexidade </w:t>
+      </w:r>
+      <m:oMath>
+        <m:r>
+          <w:rPr>
+            <w:rFonts w:ascii="Cambria Math" w:hAnsi="Cambria Math"/>
+          </w:rPr>
+          <m:t>O(n</m:t>
+        </m:r>
+        <m:func>
+          <m:funcPr>
+            <m:ctrlPr>
+              <w:rPr>
+                <w:rFonts w:ascii="Cambria Math" w:hAnsi="Cambria Math"/>
+                <w:i/>
+              </w:rPr>
+            </m:ctrlPr>
+          </m:funcPr>
+          <m:fName>
+            <m:r>
+              <m:rPr>
+                <m:sty m:val="p"/>
+              </m:rPr>
+              <w:rPr>
+                <w:rFonts w:ascii="Cambria Math" w:hAnsi="Cambria Math"/>
+              </w:rPr>
+              <m:t>log</m:t>
+            </m:r>
+          </m:fName>
+          <m:e>
+            <m:r>
+              <w:rPr>
+                <w:rFonts w:ascii="Cambria Math" w:hAnsi="Cambria Math"/>
+              </w:rPr>
+              <m:t>n)</m:t>
+            </m:r>
+          </m:e>
+        </m:func>
+      </m:oMath>
+      <w:r>
+        <w:t xml:space="preserve"> em todos os casos. O </w:t>
+      </w:r>
+      <w:r>
+        <w:rPr>
+          <w:i/>
+        </w:rPr>
+        <w:t>heapify</w:t>
+      </w:r>
+      <w:r>
+        <w:t xml:space="preserve"> utiliza uma quantidade considerável de processamento, devido as reorganizações de todo heap, afetando na sua corrida temporal. O </w:t>
+      </w:r>
+      <w:r>
+        <w:rPr>
+          <w:b/>
+        </w:rPr>
+        <w:t>Selectionsort</w:t>
+      </w:r>
+      <w:r>
+        <w:t xml:space="preserve"> é um algoritmo bem ineficiente, pois o seu número exagerado de comparações afeta de forma significativa o tempo de processamento, mantendo a grandeza </w:t>
+      </w:r>
+      <m:oMath>
+        <m:r>
+          <w:rPr>
+            <w:rFonts w:ascii="Cambria Math" w:hAnsi="Cambria Math"/>
+          </w:rPr>
+          <m:t>O(</m:t>
+        </m:r>
+        <m:sSup>
+          <m:sSupPr>
+            <m:ctrlPr>
+              <w:rPr>
+                <w:rFonts w:ascii="Cambria Math" w:hAnsi="Cambria Math"/>
+                <w:i/>
+              </w:rPr>
+            </m:ctrlPr>
+          </m:sSupPr>
+          <m:e>
+            <m:r>
+              <w:rPr>
+                <w:rFonts w:ascii="Cambria Math" w:hAnsi="Cambria Math"/>
+              </w:rPr>
+              <m:t>n</m:t>
+            </m:r>
+          </m:e>
+          <m:sup>
+            <m:r>
+              <w:rPr>
+                <w:rFonts w:ascii="Cambria Math" w:hAnsi="Cambria Math"/>
+              </w:rPr>
+              <m:t>2</m:t>
+            </m:r>
+          </m:sup>
+        </m:sSup>
+        <m:r>
+          <w:rPr>
+            <w:rFonts w:ascii="Cambria Math" w:hAnsi="Cambria Math"/>
+          </w:rPr>
+          <m:t>)</m:t>
+        </m:r>
+      </m:oMath>
+      <w:r>
+        <w:rPr>
+          <w:rFonts w:eastAsiaTheme="minorEastAsia"/>
+        </w:rPr>
+        <w:t xml:space="preserve"> em todos os casos</w:t>
+      </w:r>
+      <w:r>
+        <w:t xml:space="preserve">. Já o </w:t>
+      </w:r>
+      <w:r>
+        <w:rPr>
+          <w:b/>
+        </w:rPr>
+        <w:t>Quicksort</w:t>
+      </w:r>
+      <w:r>
+        <w:t xml:space="preserve">, é superior devido as suas operações eficientes de particionamento do vetor, o bom uso de pivôs, menos execuções de trocas e comparações mais leves. Atuando de forma mais efetiva quanto ao uso de processamento, tendo a mesma complexidade de </w:t>
+      </w:r>
+      <w:r>
+        <w:rPr>
+          <w:b/>
+        </w:rPr>
+        <w:t>Heapsort</w:t>
+      </w:r>
+      <w:r>
+        <w:t xml:space="preserve"> </w:t>
+      </w:r>
+      <m:oMath>
+        <m:r>
+          <w:rPr>
+            <w:rFonts w:ascii="Cambria Math" w:hAnsi="Cambria Math"/>
+          </w:rPr>
+          <m:t>O(n</m:t>
+        </m:r>
+        <m:func>
+          <m:funcPr>
+            <m:ctrlPr>
+              <w:rPr>
+                <w:rFonts w:ascii="Cambria Math" w:hAnsi="Cambria Math"/>
+                <w:i/>
+              </w:rPr>
+            </m:ctrlPr>
+          </m:funcPr>
+          <m:fName>
+            <m:r>
+              <m:rPr>
+                <m:sty m:val="p"/>
+              </m:rPr>
+              <w:rPr>
+                <w:rFonts w:ascii="Cambria Math" w:hAnsi="Cambria Math"/>
+              </w:rPr>
+              <m:t>log</m:t>
+            </m:r>
+          </m:fName>
+          <m:e>
+            <m:r>
+              <w:rPr>
+                <w:rFonts w:ascii="Cambria Math" w:hAnsi="Cambria Math"/>
+              </w:rPr>
+              <m:t>n)</m:t>
+            </m:r>
+          </m:e>
+        </m:func>
+      </m:oMath>
+      <w:r>
+        <w:rPr>
+          <w:rFonts w:eastAsiaTheme="minorEastAsia"/>
+        </w:rPr>
+        <w:t xml:space="preserve"> no melhor e médio caso, sendo apenas o pior caso </w:t>
+      </w:r>
+      <m:oMath>
+        <m:r>
+          <w:rPr>
+            <w:rFonts w:ascii="Cambria Math" w:eastAsiaTheme="minorEastAsia" w:hAnsi="Cambria Math"/>
+          </w:rPr>
+          <m:t>O(</m:t>
+        </m:r>
+        <m:sSup>
+          <m:sSupPr>
+            <m:ctrlPr>
+              <w:rPr>
+                <w:rFonts w:ascii="Cambria Math" w:eastAsiaTheme="minorEastAsia" w:hAnsi="Cambria Math"/>
+                <w:i/>
+              </w:rPr>
+            </m:ctrlPr>
+          </m:sSupPr>
+          <m:e>
+            <m:r>
+              <w:rPr>
+                <w:rFonts w:ascii="Cambria Math" w:eastAsiaTheme="minorEastAsia" w:hAnsi="Cambria Math"/>
+              </w:rPr>
+              <m:t>n</m:t>
+            </m:r>
+          </m:e>
+          <m:sup>
+            <m:r>
+              <w:rPr>
+                <w:rFonts w:ascii="Cambria Math" w:eastAsiaTheme="minorEastAsia" w:hAnsi="Cambria Math"/>
+              </w:rPr>
+              <m:t>2</m:t>
+            </m:r>
+          </m:sup>
+        </m:sSup>
+        <m:r>
+          <w:rPr>
+            <w:rFonts w:ascii="Cambria Math" w:eastAsiaTheme="minorEastAsia" w:hAnsi="Cambria Math"/>
+          </w:rPr>
+          <m:t>)</m:t>
+        </m:r>
+      </m:oMath>
+      <w:r>
+        <w:t>. Sendo mais aparente no gráfico a seguir:</w:t>
+      </w:r>
+    </w:p>
+    <w:p>
+      <w:pPr>
         <w:pStyle w:val="Titulo2Relatorio"/>
       </w:pPr>
       <w:r>
@@ -11761,6 +12662,7 @@
           <w:noProof/>
           <w:lang w:eastAsia="pt-BR"/>
         </w:rPr>
+        <w:lastRenderedPageBreak/>
         <w:drawing>
           <wp:inline distT="0" distB="0" distL="0" distR="0">
             <wp:extent cx="5731510" cy="3684270"/>
@@ -11805,11 +12707,6 @@
     </w:p>
     <w:p>
       <w:pPr>
-        <w:pStyle w:val="Titulo2Relatorio"/>
-      </w:pPr>
-    </w:p>
-    <w:p>
-      <w:pPr>
         <w:pStyle w:val="Ttulo2"/>
         <w:jc w:val="both"/>
         <w:rPr>
@@ -11818,14 +12715,13 @@
           <w:szCs w:val="24"/>
         </w:rPr>
       </w:pPr>
-      <w:bookmarkStart w:id="19" w:name="_Toc200292947"/>
-      <w:r>
-        <w:rPr>
-          <w:rFonts w:ascii="Times" w:hAnsi="Times" w:cs="Times"/>
-          <w:sz w:val="24"/>
-          <w:szCs w:val="24"/>
-        </w:rPr>
-        <w:lastRenderedPageBreak/>
+      <w:bookmarkStart w:id="19" w:name="_Toc200304489"/>
+      <w:r>
+        <w:rPr>
+          <w:rFonts w:ascii="Times" w:hAnsi="Times" w:cs="Times"/>
+          <w:sz w:val="24"/>
+          <w:szCs w:val="24"/>
+        </w:rPr>
         <w:t>Detalhes</w:t>
       </w:r>
       <w:r>
@@ -11892,7 +12788,7 @@
       <w:pPr>
         <w:pStyle w:val="Ttulo3"/>
       </w:pPr>
-      <w:bookmarkStart w:id="20" w:name="_Toc200292948"/>
+      <w:bookmarkStart w:id="20" w:name="_Toc200304490"/>
       <w:r>
         <w:t>Sistema Operacional</w:t>
       </w:r>
@@ -11949,6 +12845,7 @@
           <w:szCs w:val="24"/>
           <w:lang w:eastAsia="pt-BR"/>
         </w:rPr>
+        <w:lastRenderedPageBreak/>
         <w:drawing>
           <wp:inline distT="0" distB="0" distL="0" distR="0">
             <wp:extent cx="5731510" cy="3074670"/>
@@ -11993,7 +12890,7 @@
           <w:rFonts w:eastAsiaTheme="minorEastAsia"/>
         </w:rPr>
       </w:pPr>
-      <w:bookmarkStart w:id="21" w:name="_Toc200292949"/>
+      <w:bookmarkStart w:id="21" w:name="_Toc200304491"/>
       <w:r>
         <w:rPr>
           <w:rFonts w:eastAsiaTheme="minorEastAsia"/>
@@ -12007,7 +12904,7 @@
         <w:pStyle w:val="NormalRelatorio"/>
       </w:pPr>
       <w:r>
-        <w:t xml:space="preserve">A quantidade da Memória RAM do computador utilizado para os testes, é de </w:t>
+        <w:t xml:space="preserve">A quantidade da Memória RAM do computador utilizado para os testes é de </w:t>
       </w:r>
       <w:r>
         <w:rPr>
@@ -12035,7 +12932,6 @@
           <w:noProof/>
           <w:lang w:eastAsia="pt-BR"/>
         </w:rPr>
-        <w:lastRenderedPageBreak/>
         <w:drawing>
           <wp:inline distT="0" distB="0" distL="0" distR="0">
             <wp:extent cx="5731510" cy="3074670"/>
@@ -12075,35 +12971,6 @@
     </w:p>
     <w:p>
       <w:pPr>
-        <w:pStyle w:val="Legenda"/>
-        <w:jc w:val="both"/>
-      </w:pPr>
-      <w:r>
-        <w:t xml:space="preserve">Figura </w:t>
-      </w:r>
-      <w:fldSimple w:instr=" SEQ Figura \* ARABIC ">
-        <w:r>
-          <w:rPr>
-            <w:noProof/>
-          </w:rPr>
-          <w:t>2</w:t>
-        </w:r>
-      </w:fldSimple>
-      <w:r>
-        <w:t xml:space="preserve"> - </w:t>
-      </w:r>
-      <w:r>
-        <w:t xml:space="preserve">Consultando </w:t>
-      </w:r>
-      <w:r>
-        <w:t>Memória RAM</w:t>
-      </w:r>
-      <w:r>
-        <w:t xml:space="preserve"> através da interface Informações do Sistema.</w:t>
-      </w:r>
-    </w:p>
-    <w:p>
-      <w:pPr>
         <w:pStyle w:val="Ttulo1"/>
         <w:numPr>
           <w:ilvl w:val="0"/>
@@ -12116,7 +12983,7 @@
           <w:szCs w:val="24"/>
         </w:rPr>
       </w:pPr>
-      <w:bookmarkStart w:id="22" w:name="_Toc200292950"/>
+      <w:bookmarkStart w:id="22" w:name="_Toc200304492"/>
       <w:r>
         <w:rPr>
           <w:rFonts w:ascii="Times" w:hAnsi="Times" w:cs="Times"/>
@@ -12137,7 +13004,7 @@
           <w:szCs w:val="24"/>
         </w:rPr>
       </w:pPr>
-      <w:bookmarkStart w:id="23" w:name="_Toc200292951"/>
+      <w:bookmarkStart w:id="23" w:name="_Toc200304493"/>
       <w:r>
         <w:rPr>
           <w:rFonts w:ascii="Times" w:hAnsi="Times" w:cs="Times"/>
@@ -12193,154 +13060,19 @@
           <w:szCs w:val="24"/>
         </w:rPr>
       </w:pPr>
-      <w:bookmarkStart w:id="24" w:name="_Toc200292952"/>
-      <w:r>
-        <w:rPr>
-          <w:rFonts w:ascii="Times" w:hAnsi="Times" w:cs="Times"/>
-          <w:sz w:val="24"/>
-          <w:szCs w:val="24"/>
-        </w:rPr>
+      <w:bookmarkStart w:id="24" w:name="_Toc200304494"/>
+      <w:r>
+        <w:rPr>
+          <w:rFonts w:ascii="Times" w:hAnsi="Times" w:cs="Times"/>
+          <w:sz w:val="24"/>
+          <w:szCs w:val="24"/>
+        </w:rPr>
+        <w:lastRenderedPageBreak/>
         <w:t>Avaliar o desempenho do algoritmo em comparação com a implementação do Quicksort disponível na linguagem C.</w:t>
       </w:r>
       <w:bookmarkEnd w:id="24"/>
     </w:p>
     <w:p/>
-    <w:p>
-      <w:r>
-        <w:rPr>
-          <w:noProof/>
-          <w:lang w:eastAsia="pt-BR"/>
-        </w:rPr>
-        <w:lastRenderedPageBreak/>
-        <w:drawing>
-          <wp:inline distT="0" distB="0" distL="0" distR="0">
-            <wp:extent cx="4138019" cy="3917020"/>
-            <wp:effectExtent l="19050" t="0" r="0" b="0"/>
-            <wp:docPr id="9" name="Imagem 8" descr="ordered_input.PNG"/>
-            <wp:cNvGraphicFramePr>
-              <a:graphicFrameLocks xmlns:a="http://schemas.openxmlformats.org/drawingml/2006/main" noChangeAspect="1"/>
-            </wp:cNvGraphicFramePr>
-            <a:graphic xmlns:a="http://schemas.openxmlformats.org/drawingml/2006/main">
-              <a:graphicData uri="http://schemas.openxmlformats.org/drawingml/2006/picture">
-                <pic:pic xmlns:pic="http://schemas.openxmlformats.org/drawingml/2006/picture">
-                  <pic:nvPicPr>
-                    <pic:cNvPr id="0" name="ordered_input.PNG"/>
-                    <pic:cNvPicPr/>
-                  </pic:nvPicPr>
-                  <pic:blipFill>
-                    <a:blip r:embed="rId10"/>
-                    <a:stretch>
-                      <a:fillRect/>
-                    </a:stretch>
-                  </pic:blipFill>
-                  <pic:spPr>
-                    <a:xfrm>
-                      <a:off x="0" y="0"/>
-                      <a:ext cx="4138019" cy="3917020"/>
-                    </a:xfrm>
-                    <a:prstGeom prst="rect">
-                      <a:avLst/>
-                    </a:prstGeom>
-                  </pic:spPr>
-                </pic:pic>
-              </a:graphicData>
-            </a:graphic>
-          </wp:inline>
-        </w:drawing>
-      </w:r>
-    </w:p>
-    <w:p>
-      <w:r>
-        <w:rPr>
-          <w:noProof/>
-          <w:lang w:eastAsia="pt-BR"/>
-        </w:rPr>
-        <w:drawing>
-          <wp:inline distT="0" distB="0" distL="0" distR="0">
-            <wp:extent cx="4221846" cy="3993226"/>
-            <wp:effectExtent l="19050" t="0" r="7254" b="0"/>
-            <wp:docPr id="10" name="Imagem 9" descr="reversed_input.PNG"/>
-            <wp:cNvGraphicFramePr>
-              <a:graphicFrameLocks xmlns:a="http://schemas.openxmlformats.org/drawingml/2006/main" noChangeAspect="1"/>
-            </wp:cNvGraphicFramePr>
-            <a:graphic xmlns:a="http://schemas.openxmlformats.org/drawingml/2006/main">
-              <a:graphicData uri="http://schemas.openxmlformats.org/drawingml/2006/picture">
-                <pic:pic xmlns:pic="http://schemas.openxmlformats.org/drawingml/2006/picture">
-                  <pic:nvPicPr>
-                    <pic:cNvPr id="0" name="reversed_input.PNG"/>
-                    <pic:cNvPicPr/>
-                  </pic:nvPicPr>
-                  <pic:blipFill>
-                    <a:blip r:embed="rId12"/>
-                    <a:stretch>
-                      <a:fillRect/>
-                    </a:stretch>
-                  </pic:blipFill>
-                  <pic:spPr>
-                    <a:xfrm>
-                      <a:off x="0" y="0"/>
-                      <a:ext cx="4221846" cy="3993226"/>
-                    </a:xfrm>
-                    <a:prstGeom prst="rect">
-                      <a:avLst/>
-                    </a:prstGeom>
-                  </pic:spPr>
-                </pic:pic>
-              </a:graphicData>
-            </a:graphic>
-          </wp:inline>
-        </w:drawing>
-      </w:r>
-    </w:p>
-    <w:p>
-      <w:r>
-        <w:rPr>
-          <w:noProof/>
-          <w:lang w:eastAsia="pt-BR"/>
-        </w:rPr>
-        <w:lastRenderedPageBreak/>
-        <w:drawing>
-          <wp:inline distT="0" distB="0" distL="0" distR="0">
-            <wp:extent cx="4153260" cy="3977985"/>
-            <wp:effectExtent l="19050" t="0" r="0" b="0"/>
-            <wp:docPr id="11" name="Imagem 10" descr="uniform_input.PNG"/>
-            <wp:cNvGraphicFramePr>
-              <a:graphicFrameLocks xmlns:a="http://schemas.openxmlformats.org/drawingml/2006/main" noChangeAspect="1"/>
-            </wp:cNvGraphicFramePr>
-            <a:graphic xmlns:a="http://schemas.openxmlformats.org/drawingml/2006/main">
-              <a:graphicData uri="http://schemas.openxmlformats.org/drawingml/2006/picture">
-                <pic:pic xmlns:pic="http://schemas.openxmlformats.org/drawingml/2006/picture">
-                  <pic:nvPicPr>
-                    <pic:cNvPr id="0" name="uniform_input.PNG"/>
-                    <pic:cNvPicPr/>
-                  </pic:nvPicPr>
-                  <pic:blipFill>
-                    <a:blip r:embed="rId14"/>
-                    <a:stretch>
-                      <a:fillRect/>
-                    </a:stretch>
-                  </pic:blipFill>
-                  <pic:spPr>
-                    <a:xfrm>
-                      <a:off x="0" y="0"/>
-                      <a:ext cx="4153260" cy="3977985"/>
-                    </a:xfrm>
-                    <a:prstGeom prst="rect">
-                      <a:avLst/>
-                    </a:prstGeom>
-                  </pic:spPr>
-                </pic:pic>
-              </a:graphicData>
-            </a:graphic>
-          </wp:inline>
-        </w:drawing>
-      </w:r>
-    </w:p>
-    <w:p>
-      <w:pPr>
-        <w:jc w:val="both"/>
-      </w:pPr>
-    </w:p>
     <w:p>
       <w:pPr>
         <w:pStyle w:val="Ttulo1"/>
@@ -12355,7 +13087,7 @@
           <w:szCs w:val="24"/>
         </w:rPr>
       </w:pPr>
-      <w:bookmarkStart w:id="25" w:name="_Toc200292953"/>
+      <w:bookmarkStart w:id="25" w:name="_Toc200304495"/>
       <w:r>
         <w:rPr>
           <w:rFonts w:ascii="Times" w:hAnsi="Times" w:cs="Times"/>
@@ -12637,7 +13369,7 @@
             <w:rPr>
               <w:noProof/>
             </w:rPr>
-            <w:t>17</w:t>
+            <w:t>13</w:t>
           </w:r>
         </w:fldSimple>
       </w:p>

</xml_diff>

<commit_message>
Adicionando exemplo de execucao no relatório.
</commit_message>
<xml_diff>
--- a/Relatorio_Equipe_HeapSort.docx
+++ b/Relatorio_Equipe_HeapSort.docx
@@ -351,7 +351,7 @@
             </w:rPr>
             <w:fldChar w:fldCharType="separate"/>
           </w:r>
-          <w:hyperlink w:anchor="_Toc200357394" w:history="1">
+          <w:hyperlink w:anchor="_Toc200360940" w:history="1">
             <w:r>
               <w:rPr>
                 <w:rStyle w:val="Hyperlink"/>
@@ -374,23 +374,7 @@
                 <w:rFonts w:ascii="Times" w:hAnsi="Times" w:cs="Times"/>
                 <w:noProof/>
               </w:rPr>
-              <w:t>Intro</w:t>
-            </w:r>
-            <w:r>
-              <w:rPr>
-                <w:rStyle w:val="Hyperlink"/>
-                <w:rFonts w:ascii="Times" w:hAnsi="Times" w:cs="Times"/>
-                <w:noProof/>
-              </w:rPr>
-              <w:t>d</w:t>
-            </w:r>
-            <w:r>
-              <w:rPr>
-                <w:rStyle w:val="Hyperlink"/>
-                <w:rFonts w:ascii="Times" w:hAnsi="Times" w:cs="Times"/>
-                <w:noProof/>
-              </w:rPr>
-              <w:t>ução</w:t>
+              <w:t>Introdução</w:t>
             </w:r>
             <w:r>
               <w:rPr>
@@ -411,7 +395,7 @@
                 <w:noProof/>
                 <w:webHidden/>
               </w:rPr>
-              <w:instrText xml:space="preserve"> PAGEREF _Toc200357394 \h </w:instrText>
+              <w:instrText xml:space="preserve"> PAGEREF _Toc200360940 \h </w:instrText>
             </w:r>
             <w:r>
               <w:rPr>
@@ -454,7 +438,7 @@
               <w:lang w:eastAsia="pt-BR"/>
             </w:rPr>
           </w:pPr>
-          <w:hyperlink w:anchor="_Toc200357395" w:history="1">
+          <w:hyperlink w:anchor="_Toc200360941" w:history="1">
             <w:r>
               <w:rPr>
                 <w:rStyle w:val="Hyperlink"/>
@@ -482,7 +466,7 @@
                 <w:noProof/>
                 <w:webHidden/>
               </w:rPr>
-              <w:instrText xml:space="preserve"> PAGEREF _Toc200357395 \h </w:instrText>
+              <w:instrText xml:space="preserve"> PAGEREF _Toc200360941 \h </w:instrText>
             </w:r>
             <w:r>
               <w:rPr>
@@ -525,7 +509,7 @@
               <w:lang w:eastAsia="pt-BR"/>
             </w:rPr>
           </w:pPr>
-          <w:hyperlink w:anchor="_Toc200357396" w:history="1">
+          <w:hyperlink w:anchor="_Toc200360942" w:history="1">
             <w:r>
               <w:rPr>
                 <w:rStyle w:val="Hyperlink"/>
@@ -553,7 +537,7 @@
                 <w:noProof/>
                 <w:webHidden/>
               </w:rPr>
-              <w:instrText xml:space="preserve"> PAGEREF _Toc200357396 \h </w:instrText>
+              <w:instrText xml:space="preserve"> PAGEREF _Toc200360942 \h </w:instrText>
             </w:r>
             <w:r>
               <w:rPr>
@@ -573,7 +557,7 @@
                 <w:noProof/>
                 <w:webHidden/>
               </w:rPr>
-              <w:t>2</w:t>
+              <w:t>3</w:t>
             </w:r>
             <w:r>
               <w:rPr>
@@ -596,7 +580,7 @@
               <w:lang w:eastAsia="pt-BR"/>
             </w:rPr>
           </w:pPr>
-          <w:hyperlink w:anchor="_Toc200357397" w:history="1">
+          <w:hyperlink w:anchor="_Toc200360943" w:history="1">
             <w:r>
               <w:rPr>
                 <w:rStyle w:val="Hyperlink"/>
@@ -624,7 +608,7 @@
                 <w:noProof/>
                 <w:webHidden/>
               </w:rPr>
-              <w:instrText xml:space="preserve"> PAGEREF _Toc200357397 \h </w:instrText>
+              <w:instrText xml:space="preserve"> PAGEREF _Toc200360943 \h </w:instrText>
             </w:r>
             <w:r>
               <w:rPr>
@@ -644,7 +628,7 @@
                 <w:noProof/>
                 <w:webHidden/>
               </w:rPr>
-              <w:t>2</w:t>
+              <w:t>3</w:t>
             </w:r>
             <w:r>
               <w:rPr>
@@ -668,7 +652,7 @@
               <w:lang w:eastAsia="pt-BR"/>
             </w:rPr>
           </w:pPr>
-          <w:hyperlink w:anchor="_Toc200357398" w:history="1">
+          <w:hyperlink w:anchor="_Toc200360944" w:history="1">
             <w:r>
               <w:rPr>
                 <w:rStyle w:val="Hyperlink"/>
@@ -712,7 +696,7 @@
                 <w:noProof/>
                 <w:webHidden/>
               </w:rPr>
-              <w:instrText xml:space="preserve"> PAGEREF _Toc200357398 \h </w:instrText>
+              <w:instrText xml:space="preserve"> PAGEREF _Toc200360944 \h </w:instrText>
             </w:r>
             <w:r>
               <w:rPr>
@@ -732,7 +716,7 @@
                 <w:noProof/>
                 <w:webHidden/>
               </w:rPr>
-              <w:t>2</w:t>
+              <w:t>3</w:t>
             </w:r>
             <w:r>
               <w:rPr>
@@ -755,7 +739,7 @@
               <w:lang w:eastAsia="pt-BR"/>
             </w:rPr>
           </w:pPr>
-          <w:hyperlink w:anchor="_Toc200357399" w:history="1">
+          <w:hyperlink w:anchor="_Toc200360945" w:history="1">
             <w:r>
               <w:rPr>
                 <w:rStyle w:val="Hyperlink"/>
@@ -783,7 +767,7 @@
                 <w:noProof/>
                 <w:webHidden/>
               </w:rPr>
-              <w:instrText xml:space="preserve"> PAGEREF _Toc200357399 \h </w:instrText>
+              <w:instrText xml:space="preserve"> PAGEREF _Toc200360945 \h </w:instrText>
             </w:r>
             <w:r>
               <w:rPr>
@@ -803,7 +787,7 @@
                 <w:noProof/>
                 <w:webHidden/>
               </w:rPr>
-              <w:t>2</w:t>
+              <w:t>3</w:t>
             </w:r>
             <w:r>
               <w:rPr>
@@ -826,7 +810,7 @@
               <w:lang w:eastAsia="pt-BR"/>
             </w:rPr>
           </w:pPr>
-          <w:hyperlink w:anchor="_Toc200357400" w:history="1">
+          <w:hyperlink w:anchor="_Toc200360946" w:history="1">
             <w:r>
               <w:rPr>
                 <w:rStyle w:val="Hyperlink"/>
@@ -854,7 +838,7 @@
                 <w:noProof/>
                 <w:webHidden/>
               </w:rPr>
-              <w:instrText xml:space="preserve"> PAGEREF _Toc200357400 \h </w:instrText>
+              <w:instrText xml:space="preserve"> PAGEREF _Toc200360946 \h </w:instrText>
             </w:r>
             <w:r>
               <w:rPr>
@@ -874,7 +858,7 @@
                 <w:noProof/>
                 <w:webHidden/>
               </w:rPr>
-              <w:t>2</w:t>
+              <w:t>3</w:t>
             </w:r>
             <w:r>
               <w:rPr>
@@ -897,7 +881,7 @@
               <w:lang w:eastAsia="pt-BR"/>
             </w:rPr>
           </w:pPr>
-          <w:hyperlink w:anchor="_Toc200357401" w:history="1">
+          <w:hyperlink w:anchor="_Toc200360947" w:history="1">
             <w:r>
               <w:rPr>
                 <w:rStyle w:val="Hyperlink"/>
@@ -924,7 +908,7 @@
                 <w:noProof/>
                 <w:webHidden/>
               </w:rPr>
-              <w:instrText xml:space="preserve"> PAGEREF _Toc200357401 \h </w:instrText>
+              <w:instrText xml:space="preserve"> PAGEREF _Toc200360947 \h </w:instrText>
             </w:r>
             <w:r>
               <w:rPr>
@@ -944,7 +928,7 @@
                 <w:noProof/>
                 <w:webHidden/>
               </w:rPr>
-              <w:t>4</w:t>
+              <w:t>5</w:t>
             </w:r>
             <w:r>
               <w:rPr>
@@ -967,7 +951,7 @@
               <w:lang w:eastAsia="pt-BR"/>
             </w:rPr>
           </w:pPr>
-          <w:hyperlink w:anchor="_Toc200357402" w:history="1">
+          <w:hyperlink w:anchor="_Toc200360948" w:history="1">
             <w:r>
               <w:rPr>
                 <w:rStyle w:val="Hyperlink"/>
@@ -994,7 +978,7 @@
                 <w:noProof/>
                 <w:webHidden/>
               </w:rPr>
-              <w:instrText xml:space="preserve"> PAGEREF _Toc200357402 \h </w:instrText>
+              <w:instrText xml:space="preserve"> PAGEREF _Toc200360948 \h </w:instrText>
             </w:r>
             <w:r>
               <w:rPr>
@@ -1014,7 +998,7 @@
                 <w:noProof/>
                 <w:webHidden/>
               </w:rPr>
-              <w:t>5</w:t>
+              <w:t>6</w:t>
             </w:r>
             <w:r>
               <w:rPr>
@@ -1037,7 +1021,7 @@
               <w:lang w:eastAsia="pt-BR"/>
             </w:rPr>
           </w:pPr>
-          <w:hyperlink w:anchor="_Toc200357403" w:history="1">
+          <w:hyperlink w:anchor="_Toc200360949" w:history="1">
             <w:r>
               <w:rPr>
                 <w:rStyle w:val="Hyperlink"/>
@@ -1064,7 +1048,7 @@
                 <w:noProof/>
                 <w:webHidden/>
               </w:rPr>
-              <w:instrText xml:space="preserve"> PAGEREF _Toc200357403 \h </w:instrText>
+              <w:instrText xml:space="preserve"> PAGEREF _Toc200360949 \h </w:instrText>
             </w:r>
             <w:r>
               <w:rPr>
@@ -1084,7 +1068,7 @@
                 <w:noProof/>
                 <w:webHidden/>
               </w:rPr>
-              <w:t>5</w:t>
+              <w:t>6</w:t>
             </w:r>
             <w:r>
               <w:rPr>
@@ -1107,7 +1091,7 @@
               <w:lang w:eastAsia="pt-BR"/>
             </w:rPr>
           </w:pPr>
-          <w:hyperlink w:anchor="_Toc200357404" w:history="1">
+          <w:hyperlink w:anchor="_Toc200360950" w:history="1">
             <w:r>
               <w:rPr>
                 <w:rStyle w:val="Hyperlink"/>
@@ -1134,7 +1118,7 @@
                 <w:noProof/>
                 <w:webHidden/>
               </w:rPr>
-              <w:instrText xml:space="preserve"> PAGEREF _Toc200357404 \h </w:instrText>
+              <w:instrText xml:space="preserve"> PAGEREF _Toc200360950 \h </w:instrText>
             </w:r>
             <w:r>
               <w:rPr>
@@ -1154,7 +1138,7 @@
                 <w:noProof/>
                 <w:webHidden/>
               </w:rPr>
-              <w:t>5</w:t>
+              <w:t>6</w:t>
             </w:r>
             <w:r>
               <w:rPr>
@@ -1177,7 +1161,7 @@
               <w:lang w:eastAsia="pt-BR"/>
             </w:rPr>
           </w:pPr>
-          <w:hyperlink w:anchor="_Toc200357405" w:history="1">
+          <w:hyperlink w:anchor="_Toc200360951" w:history="1">
             <w:r>
               <w:rPr>
                 <w:rStyle w:val="Hyperlink"/>
@@ -1204,7 +1188,7 @@
                 <w:noProof/>
                 <w:webHidden/>
               </w:rPr>
-              <w:instrText xml:space="preserve"> PAGEREF _Toc200357405 \h </w:instrText>
+              <w:instrText xml:space="preserve"> PAGEREF _Toc200360951 \h </w:instrText>
             </w:r>
             <w:r>
               <w:rPr>
@@ -1224,7 +1208,7 @@
                 <w:noProof/>
                 <w:webHidden/>
               </w:rPr>
-              <w:t>5</w:t>
+              <w:t>6</w:t>
             </w:r>
             <w:r>
               <w:rPr>
@@ -1247,7 +1231,7 @@
               <w:lang w:eastAsia="pt-BR"/>
             </w:rPr>
           </w:pPr>
-          <w:hyperlink w:anchor="_Toc200357406" w:history="1">
+          <w:hyperlink w:anchor="_Toc200360952" w:history="1">
             <w:r>
               <w:rPr>
                 <w:rStyle w:val="Hyperlink"/>
@@ -1274,7 +1258,7 @@
                 <w:noProof/>
                 <w:webHidden/>
               </w:rPr>
-              <w:instrText xml:space="preserve"> PAGEREF _Toc200357406 \h </w:instrText>
+              <w:instrText xml:space="preserve"> PAGEREF _Toc200360952 \h </w:instrText>
             </w:r>
             <w:r>
               <w:rPr>
@@ -1294,7 +1278,7 @@
                 <w:noProof/>
                 <w:webHidden/>
               </w:rPr>
-              <w:t>5</w:t>
+              <w:t>6</w:t>
             </w:r>
             <w:r>
               <w:rPr>
@@ -1317,7 +1301,7 @@
               <w:lang w:eastAsia="pt-BR"/>
             </w:rPr>
           </w:pPr>
-          <w:hyperlink w:anchor="_Toc200357407" w:history="1">
+          <w:hyperlink w:anchor="_Toc200360953" w:history="1">
             <w:r>
               <w:rPr>
                 <w:rStyle w:val="Hyperlink"/>
@@ -1344,7 +1328,7 @@
                 <w:noProof/>
                 <w:webHidden/>
               </w:rPr>
-              <w:instrText xml:space="preserve"> PAGEREF _Toc200357407 \h </w:instrText>
+              <w:instrText xml:space="preserve"> PAGEREF _Toc200360953 \h </w:instrText>
             </w:r>
             <w:r>
               <w:rPr>
@@ -1364,7 +1348,7 @@
                 <w:noProof/>
                 <w:webHidden/>
               </w:rPr>
-              <w:t>5</w:t>
+              <w:t>6</w:t>
             </w:r>
             <w:r>
               <w:rPr>
@@ -1387,7 +1371,7 @@
               <w:lang w:eastAsia="pt-BR"/>
             </w:rPr>
           </w:pPr>
-          <w:hyperlink w:anchor="_Toc200357408" w:history="1">
+          <w:hyperlink w:anchor="_Toc200360954" w:history="1">
             <w:r>
               <w:rPr>
                 <w:rStyle w:val="Hyperlink"/>
@@ -1415,7 +1399,7 @@
                 <w:noProof/>
                 <w:webHidden/>
               </w:rPr>
-              <w:instrText xml:space="preserve"> PAGEREF _Toc200357408 \h </w:instrText>
+              <w:instrText xml:space="preserve"> PAGEREF _Toc200360954 \h </w:instrText>
             </w:r>
             <w:r>
               <w:rPr>
@@ -1435,7 +1419,7 @@
                 <w:noProof/>
                 <w:webHidden/>
               </w:rPr>
-              <w:t>5</w:t>
+              <w:t>6</w:t>
             </w:r>
             <w:r>
               <w:rPr>
@@ -1458,7 +1442,7 @@
               <w:lang w:eastAsia="pt-BR"/>
             </w:rPr>
           </w:pPr>
-          <w:hyperlink w:anchor="_Toc200357409" w:history="1">
+          <w:hyperlink w:anchor="_Toc200360955" w:history="1">
             <w:r>
               <w:rPr>
                 <w:rStyle w:val="Hyperlink"/>
@@ -1486,7 +1470,7 @@
                 <w:noProof/>
                 <w:webHidden/>
               </w:rPr>
-              <w:instrText xml:space="preserve"> PAGEREF _Toc200357409 \h </w:instrText>
+              <w:instrText xml:space="preserve"> PAGEREF _Toc200360955 \h </w:instrText>
             </w:r>
             <w:r>
               <w:rPr>
@@ -1506,7 +1490,7 @@
                 <w:noProof/>
                 <w:webHidden/>
               </w:rPr>
-              <w:t>5</w:t>
+              <w:t>6</w:t>
             </w:r>
             <w:r>
               <w:rPr>
@@ -1529,14 +1513,30 @@
               <w:lang w:eastAsia="pt-BR"/>
             </w:rPr>
           </w:pPr>
-          <w:hyperlink w:anchor="_Toc200357410" w:history="1">
+          <w:hyperlink w:anchor="_Toc200360956" w:history="1">
             <w:r>
               <w:rPr>
                 <w:rStyle w:val="Hyperlink"/>
                 <w:rFonts w:ascii="Times" w:hAnsi="Times" w:cs="Times"/>
                 <w:noProof/>
               </w:rPr>
-              <w:t>Exemplos de como o processo de ordenação acontece. - FALTA</w:t>
+              <w:t>Exemplos de como o p</w:t>
+            </w:r>
+            <w:r>
+              <w:rPr>
+                <w:rStyle w:val="Hyperlink"/>
+                <w:rFonts w:ascii="Times" w:hAnsi="Times" w:cs="Times"/>
+                <w:noProof/>
+              </w:rPr>
+              <w:t>r</w:t>
+            </w:r>
+            <w:r>
+              <w:rPr>
+                <w:rStyle w:val="Hyperlink"/>
+                <w:rFonts w:ascii="Times" w:hAnsi="Times" w:cs="Times"/>
+                <w:noProof/>
+              </w:rPr>
+              <w:t>ocesso de ordenação acontece. - FALTA</w:t>
             </w:r>
             <w:r>
               <w:rPr>
@@ -1557,7 +1557,7 @@
                 <w:noProof/>
                 <w:webHidden/>
               </w:rPr>
-              <w:instrText xml:space="preserve"> PAGEREF _Toc200357410 \h </w:instrText>
+              <w:instrText xml:space="preserve"> PAGEREF _Toc200360956 \h </w:instrText>
             </w:r>
             <w:r>
               <w:rPr>
@@ -1577,7 +1577,7 @@
                 <w:noProof/>
                 <w:webHidden/>
               </w:rPr>
-              <w:t>5</w:t>
+              <w:t>6</w:t>
             </w:r>
             <w:r>
               <w:rPr>
@@ -1601,7 +1601,7 @@
               <w:lang w:eastAsia="pt-BR"/>
             </w:rPr>
           </w:pPr>
-          <w:hyperlink w:anchor="_Toc200357411" w:history="1">
+          <w:hyperlink w:anchor="_Toc200360957" w:history="1">
             <w:r>
               <w:rPr>
                 <w:rStyle w:val="Hyperlink"/>
@@ -1645,7 +1645,7 @@
                 <w:noProof/>
                 <w:webHidden/>
               </w:rPr>
-              <w:instrText xml:space="preserve"> PAGEREF _Toc200357411 \h </w:instrText>
+              <w:instrText xml:space="preserve"> PAGEREF _Toc200360957 \h </w:instrText>
             </w:r>
             <w:r>
               <w:rPr>
@@ -1665,7 +1665,7 @@
                 <w:noProof/>
                 <w:webHidden/>
               </w:rPr>
-              <w:t>6</w:t>
+              <w:t>7</w:t>
             </w:r>
             <w:r>
               <w:rPr>
@@ -1688,7 +1688,7 @@
               <w:lang w:eastAsia="pt-BR"/>
             </w:rPr>
           </w:pPr>
-          <w:hyperlink w:anchor="_Toc200357412" w:history="1">
+          <w:hyperlink w:anchor="_Toc200360958" w:history="1">
             <w:r>
               <w:rPr>
                 <w:rStyle w:val="Hyperlink"/>
@@ -1715,7 +1715,7 @@
                 <w:noProof/>
                 <w:webHidden/>
               </w:rPr>
-              <w:instrText xml:space="preserve"> PAGEREF _Toc200357412 \h </w:instrText>
+              <w:instrText xml:space="preserve"> PAGEREF _Toc200360958 \h </w:instrText>
             </w:r>
             <w:r>
               <w:rPr>
@@ -1735,7 +1735,7 @@
                 <w:noProof/>
                 <w:webHidden/>
               </w:rPr>
-              <w:t>6</w:t>
+              <w:t>7</w:t>
             </w:r>
             <w:r>
               <w:rPr>
@@ -1758,7 +1758,7 @@
               <w:lang w:eastAsia="pt-BR"/>
             </w:rPr>
           </w:pPr>
-          <w:hyperlink w:anchor="_Toc200357413" w:history="1">
+          <w:hyperlink w:anchor="_Toc200360959" w:history="1">
             <w:r>
               <w:rPr>
                 <w:rStyle w:val="Hyperlink"/>
@@ -1785,7 +1785,7 @@
                 <w:noProof/>
                 <w:webHidden/>
               </w:rPr>
-              <w:instrText xml:space="preserve"> PAGEREF _Toc200357413 \h </w:instrText>
+              <w:instrText xml:space="preserve"> PAGEREF _Toc200360959 \h </w:instrText>
             </w:r>
             <w:r>
               <w:rPr>
@@ -1805,7 +1805,7 @@
                 <w:noProof/>
                 <w:webHidden/>
               </w:rPr>
-              <w:t>6</w:t>
+              <w:t>7</w:t>
             </w:r>
             <w:r>
               <w:rPr>
@@ -1828,7 +1828,7 @@
               <w:lang w:eastAsia="pt-BR"/>
             </w:rPr>
           </w:pPr>
-          <w:hyperlink w:anchor="_Toc200357414" w:history="1">
+          <w:hyperlink w:anchor="_Toc200360960" w:history="1">
             <w:r>
               <w:rPr>
                 <w:rStyle w:val="Hyperlink"/>
@@ -1855,7 +1855,7 @@
                 <w:noProof/>
                 <w:webHidden/>
               </w:rPr>
-              <w:instrText xml:space="preserve"> PAGEREF _Toc200357414 \h </w:instrText>
+              <w:instrText xml:space="preserve"> PAGEREF _Toc200360960 \h </w:instrText>
             </w:r>
             <w:r>
               <w:rPr>
@@ -1875,7 +1875,7 @@
                 <w:noProof/>
                 <w:webHidden/>
               </w:rPr>
-              <w:t>10</w:t>
+              <w:t>11</w:t>
             </w:r>
             <w:r>
               <w:rPr>
@@ -1898,7 +1898,7 @@
               <w:lang w:eastAsia="pt-BR"/>
             </w:rPr>
           </w:pPr>
-          <w:hyperlink w:anchor="_Toc200357415" w:history="1">
+          <w:hyperlink w:anchor="_Toc200360961" w:history="1">
             <w:r>
               <w:rPr>
                 <w:rStyle w:val="Hyperlink"/>
@@ -1925,7 +1925,7 @@
                 <w:noProof/>
                 <w:webHidden/>
               </w:rPr>
-              <w:instrText xml:space="preserve"> PAGEREF _Toc200357415 \h </w:instrText>
+              <w:instrText xml:space="preserve"> PAGEREF _Toc200360961 \h </w:instrText>
             </w:r>
             <w:r>
               <w:rPr>
@@ -1945,7 +1945,7 @@
                 <w:noProof/>
                 <w:webHidden/>
               </w:rPr>
-              <w:t>15</w:t>
+              <w:t>16</w:t>
             </w:r>
             <w:r>
               <w:rPr>
@@ -1968,7 +1968,7 @@
               <w:lang w:eastAsia="pt-BR"/>
             </w:rPr>
           </w:pPr>
-          <w:hyperlink w:anchor="_Toc200357416" w:history="1">
+          <w:hyperlink w:anchor="_Toc200360962" w:history="1">
             <w:r>
               <w:rPr>
                 <w:rStyle w:val="Hyperlink"/>
@@ -1995,7 +1995,7 @@
                 <w:noProof/>
                 <w:webHidden/>
               </w:rPr>
-              <w:instrText xml:space="preserve"> PAGEREF _Toc200357416 \h </w:instrText>
+              <w:instrText xml:space="preserve"> PAGEREF _Toc200360962 \h </w:instrText>
             </w:r>
             <w:r>
               <w:rPr>
@@ -2015,7 +2015,7 @@
                 <w:noProof/>
                 <w:webHidden/>
               </w:rPr>
-              <w:t>15</w:t>
+              <w:t>16</w:t>
             </w:r>
             <w:r>
               <w:rPr>
@@ -2038,7 +2038,7 @@
               <w:lang w:eastAsia="pt-BR"/>
             </w:rPr>
           </w:pPr>
-          <w:hyperlink w:anchor="_Toc200357417" w:history="1">
+          <w:hyperlink w:anchor="_Toc200360963" w:history="1">
             <w:r>
               <w:rPr>
                 <w:rStyle w:val="Hyperlink"/>
@@ -2065,7 +2065,7 @@
                 <w:noProof/>
                 <w:webHidden/>
               </w:rPr>
-              <w:instrText xml:space="preserve"> PAGEREF _Toc200357417 \h </w:instrText>
+              <w:instrText xml:space="preserve"> PAGEREF _Toc200360963 \h </w:instrText>
             </w:r>
             <w:r>
               <w:rPr>
@@ -2085,7 +2085,7 @@
                 <w:noProof/>
                 <w:webHidden/>
               </w:rPr>
-              <w:t>17</w:t>
+              <w:t>18</w:t>
             </w:r>
             <w:r>
               <w:rPr>
@@ -2108,7 +2108,7 @@
               <w:lang w:eastAsia="pt-BR"/>
             </w:rPr>
           </w:pPr>
-          <w:hyperlink w:anchor="_Toc200357418" w:history="1">
+          <w:hyperlink w:anchor="_Toc200360964" w:history="1">
             <w:r>
               <w:rPr>
                 <w:rStyle w:val="Hyperlink"/>
@@ -2135,7 +2135,7 @@
                 <w:noProof/>
                 <w:webHidden/>
               </w:rPr>
-              <w:instrText xml:space="preserve"> PAGEREF _Toc200357418 \h </w:instrText>
+              <w:instrText xml:space="preserve"> PAGEREF _Toc200360964 \h </w:instrText>
             </w:r>
             <w:r>
               <w:rPr>
@@ -2155,7 +2155,7 @@
                 <w:noProof/>
                 <w:webHidden/>
               </w:rPr>
-              <w:t>19</w:t>
+              <w:t>20</w:t>
             </w:r>
             <w:r>
               <w:rPr>
@@ -2178,7 +2178,7 @@
               <w:lang w:eastAsia="pt-BR"/>
             </w:rPr>
           </w:pPr>
-          <w:hyperlink w:anchor="_Toc200357419" w:history="1">
+          <w:hyperlink w:anchor="_Toc200360965" w:history="1">
             <w:r>
               <w:rPr>
                 <w:rStyle w:val="Hyperlink"/>
@@ -2206,7 +2206,7 @@
                 <w:noProof/>
                 <w:webHidden/>
               </w:rPr>
-              <w:instrText xml:space="preserve"> PAGEREF _Toc200357419 \h </w:instrText>
+              <w:instrText xml:space="preserve"> PAGEREF _Toc200360965 \h </w:instrText>
             </w:r>
             <w:r>
               <w:rPr>
@@ -2226,7 +2226,7 @@
                 <w:noProof/>
                 <w:webHidden/>
               </w:rPr>
-              <w:t>21</w:t>
+              <w:t>22</w:t>
             </w:r>
             <w:r>
               <w:rPr>
@@ -2249,7 +2249,7 @@
               <w:lang w:eastAsia="pt-BR"/>
             </w:rPr>
           </w:pPr>
-          <w:hyperlink w:anchor="_Toc200357420" w:history="1">
+          <w:hyperlink w:anchor="_Toc200360966" w:history="1">
             <w:r>
               <w:rPr>
                 <w:rStyle w:val="Hyperlink"/>
@@ -2276,7 +2276,7 @@
                 <w:noProof/>
                 <w:webHidden/>
               </w:rPr>
-              <w:instrText xml:space="preserve"> PAGEREF _Toc200357420 \h </w:instrText>
+              <w:instrText xml:space="preserve"> PAGEREF _Toc200360966 \h </w:instrText>
             </w:r>
             <w:r>
               <w:rPr>
@@ -2296,7 +2296,7 @@
                 <w:noProof/>
                 <w:webHidden/>
               </w:rPr>
-              <w:t>21</w:t>
+              <w:t>22</w:t>
             </w:r>
             <w:r>
               <w:rPr>
@@ -2319,7 +2319,7 @@
               <w:lang w:eastAsia="pt-BR"/>
             </w:rPr>
           </w:pPr>
-          <w:hyperlink w:anchor="_Toc200357421" w:history="1">
+          <w:hyperlink w:anchor="_Toc200360967" w:history="1">
             <w:r>
               <w:rPr>
                 <w:rStyle w:val="Hyperlink"/>
@@ -2346,7 +2346,7 @@
                 <w:noProof/>
                 <w:webHidden/>
               </w:rPr>
-              <w:instrText xml:space="preserve"> PAGEREF _Toc200357421 \h </w:instrText>
+              <w:instrText xml:space="preserve"> PAGEREF _Toc200360967 \h </w:instrText>
             </w:r>
             <w:r>
               <w:rPr>
@@ -2366,7 +2366,7 @@
                 <w:noProof/>
                 <w:webHidden/>
               </w:rPr>
-              <w:t>22</w:t>
+              <w:t>23</w:t>
             </w:r>
             <w:r>
               <w:rPr>
@@ -2390,7 +2390,7 @@
               <w:lang w:eastAsia="pt-BR"/>
             </w:rPr>
           </w:pPr>
-          <w:hyperlink w:anchor="_Toc200357422" w:history="1">
+          <w:hyperlink w:anchor="_Toc200360968" w:history="1">
             <w:r>
               <w:rPr>
                 <w:rStyle w:val="Hyperlink"/>
@@ -2434,7 +2434,7 @@
                 <w:noProof/>
                 <w:webHidden/>
               </w:rPr>
-              <w:instrText xml:space="preserve"> PAGEREF _Toc200357422 \h </w:instrText>
+              <w:instrText xml:space="preserve"> PAGEREF _Toc200360968 \h </w:instrText>
             </w:r>
             <w:r>
               <w:rPr>
@@ -2454,7 +2454,7 @@
                 <w:noProof/>
                 <w:webHidden/>
               </w:rPr>
-              <w:t>22</w:t>
+              <w:t>23</w:t>
             </w:r>
             <w:r>
               <w:rPr>
@@ -2477,7 +2477,7 @@
               <w:lang w:eastAsia="pt-BR"/>
             </w:rPr>
           </w:pPr>
-          <w:hyperlink w:anchor="_Toc200357423" w:history="1">
+          <w:hyperlink w:anchor="_Toc200360969" w:history="1">
             <w:r>
               <w:rPr>
                 <w:rStyle w:val="Hyperlink"/>
@@ -2505,7 +2505,7 @@
                 <w:noProof/>
                 <w:webHidden/>
               </w:rPr>
-              <w:instrText xml:space="preserve"> PAGEREF _Toc200357423 \h </w:instrText>
+              <w:instrText xml:space="preserve"> PAGEREF _Toc200360969 \h </w:instrText>
             </w:r>
             <w:r>
               <w:rPr>
@@ -2525,7 +2525,7 @@
                 <w:noProof/>
                 <w:webHidden/>
               </w:rPr>
-              <w:t>22</w:t>
+              <w:t>23</w:t>
             </w:r>
             <w:r>
               <w:rPr>
@@ -2548,7 +2548,7 @@
               <w:lang w:eastAsia="pt-BR"/>
             </w:rPr>
           </w:pPr>
-          <w:hyperlink w:anchor="_Toc200357424" w:history="1">
+          <w:hyperlink w:anchor="_Toc200360970" w:history="1">
             <w:r>
               <w:rPr>
                 <w:rStyle w:val="Hyperlink"/>
@@ -2576,7 +2576,7 @@
                 <w:noProof/>
                 <w:webHidden/>
               </w:rPr>
-              <w:instrText xml:space="preserve"> PAGEREF _Toc200357424 \h </w:instrText>
+              <w:instrText xml:space="preserve"> PAGEREF _Toc200360970 \h </w:instrText>
             </w:r>
             <w:r>
               <w:rPr>
@@ -2596,7 +2596,7 @@
                 <w:noProof/>
                 <w:webHidden/>
               </w:rPr>
-              <w:t>23</w:t>
+              <w:t>24</w:t>
             </w:r>
             <w:r>
               <w:rPr>
@@ -2620,7 +2620,7 @@
               <w:lang w:eastAsia="pt-BR"/>
             </w:rPr>
           </w:pPr>
-          <w:hyperlink w:anchor="_Toc200357425" w:history="1">
+          <w:hyperlink w:anchor="_Toc200360971" w:history="1">
             <w:r>
               <w:rPr>
                 <w:rStyle w:val="Hyperlink"/>
@@ -2664,7 +2664,7 @@
                 <w:noProof/>
                 <w:webHidden/>
               </w:rPr>
-              <w:instrText xml:space="preserve"> PAGEREF _Toc200357425 \h </w:instrText>
+              <w:instrText xml:space="preserve"> PAGEREF _Toc200360971 \h </w:instrText>
             </w:r>
             <w:r>
               <w:rPr>
@@ -2684,7 +2684,7 @@
                 <w:noProof/>
                 <w:webHidden/>
               </w:rPr>
-              <w:t>23</w:t>
+              <w:t>24</w:t>
             </w:r>
             <w:r>
               <w:rPr>
@@ -2740,7 +2740,7 @@
           <w:szCs w:val="24"/>
         </w:rPr>
       </w:pPr>
-      <w:bookmarkStart w:id="0" w:name="_Toc200357394"/>
+      <w:bookmarkStart w:id="0" w:name="_Toc200360940"/>
       <w:r>
         <w:rPr>
           <w:rFonts w:ascii="Times" w:hAnsi="Times" w:cs="Times"/>
@@ -2761,7 +2761,7 @@
           <w:szCs w:val="24"/>
         </w:rPr>
       </w:pPr>
-      <w:bookmarkStart w:id="1" w:name="_Toc200357395"/>
+      <w:bookmarkStart w:id="1" w:name="_Toc200360941"/>
       <w:r>
         <w:rPr>
           <w:rFonts w:ascii="Times" w:hAnsi="Times" w:cs="Times"/>
@@ -2771,6 +2771,375 @@
         <w:t>Descrição do problema de ordenação em memória primária,</w:t>
       </w:r>
       <w:bookmarkEnd w:id="1"/>
+    </w:p>
+    <w:p>
+      <w:pPr>
+        <w:pStyle w:val="NormalRelatorio"/>
+      </w:pPr>
+      <w:r>
+        <w:t xml:space="preserve"> </w:t>
+      </w:r>
+      <w:r>
+        <w:t xml:space="preserve">A memória RAM (Random Access Memory), é </w:t>
+      </w:r>
+      <w:r>
+        <w:t xml:space="preserve">por sua vez </w:t>
+      </w:r>
+      <w:r>
+        <w:t xml:space="preserve">utilizada </w:t>
+      </w:r>
+      <w:r>
+        <w:t>a fim de armazenar</w:t>
+      </w:r>
+      <w:r>
+        <w:t xml:space="preserve"> dados te</w:t>
+      </w:r>
+      <w:r>
+        <w:t xml:space="preserve">mporários enquanto </w:t>
+      </w:r>
+      <w:r>
+        <w:t>a CPU (Central Processing Unit)</w:t>
+      </w:r>
+      <w:r>
+        <w:t xml:space="preserve"> é executada</w:t>
+      </w:r>
+      <w:r>
+        <w:t xml:space="preserve">, </w:t>
+      </w:r>
+      <w:r>
+        <w:t>ela</w:t>
+      </w:r>
+      <w:r>
+        <w:t xml:space="preserve"> é </w:t>
+      </w:r>
+      <w:r>
+        <w:t xml:space="preserve">utilizada para garantir </w:t>
+      </w:r>
+      <w:r>
+        <w:t xml:space="preserve">acesso rápido a informações </w:t>
+      </w:r>
+      <w:r>
+        <w:t>baseando-se na execução de programas e processos executados n</w:t>
+      </w:r>
+      <w:r>
+        <w:t xml:space="preserve">o próprio sistema, </w:t>
+      </w:r>
+      <w:r>
+        <w:t>a sua função possui um problema existente em relação a sua ordenação de processos</w:t>
+      </w:r>
+      <w:r>
+        <w:t xml:space="preserve">, </w:t>
+      </w:r>
+      <w:r>
+        <w:t>quando</w:t>
+      </w:r>
+      <w:r>
+        <w:t xml:space="preserve"> ordenar arquivos ou dados </w:t>
+      </w:r>
+      <w:r>
+        <w:t xml:space="preserve">internos é </w:t>
+      </w:r>
+      <w:r>
+        <w:t>necessário</w:t>
+      </w:r>
+      <w:r>
+        <w:t>, pois fisicamente há um limite dentro da CPU, ao consider</w:t>
+      </w:r>
+      <w:r>
+        <w:t xml:space="preserve"> </w:t>
+      </w:r>
+      <w:r>
+        <w:t xml:space="preserve">o tempo </w:t>
+      </w:r>
+      <w:r>
+        <w:t>de comunicação e arm</w:t>
+      </w:r>
+      <w:r>
+        <w:t>azenamento de dados na RAM, ou durante o processamento da</w:t>
+      </w:r>
+      <w:r>
+        <w:t xml:space="preserve"> ordenação </w:t>
+      </w:r>
+      <w:r>
+        <w:t>com o auxílio do processador da placa-mãe.</w:t>
+      </w:r>
+    </w:p>
+    <w:p>
+      <w:pPr>
+        <w:pStyle w:val="NormalRelatorio"/>
+      </w:pPr>
+      <w:r>
+        <w:t>Tais limitações, apresentam</w:t>
+      </w:r>
+      <w:r>
+        <w:t xml:space="preserve"> problemas em aplicações dentro de sistemas, como </w:t>
+      </w:r>
+      <w:r>
+        <w:t>tanto no ramo comercial de componentes</w:t>
+      </w:r>
+      <w:r>
+        <w:t xml:space="preserve"> eletrônicos, onde </w:t>
+      </w:r>
+      <w:r>
+        <w:t>é plausível</w:t>
+      </w:r>
+      <w:r>
+        <w:t xml:space="preserve"> ordenar listas por popularidade</w:t>
+      </w:r>
+      <w:r>
+        <w:t xml:space="preserve"> alta</w:t>
+      </w:r>
+      <w:r>
+        <w:t xml:space="preserve"> ou preço</w:t>
+      </w:r>
+      <w:r>
+        <w:t xml:space="preserve"> alto</w:t>
+      </w:r>
+      <w:r>
+        <w:t xml:space="preserve">, e </w:t>
+      </w:r>
+      <w:r>
+        <w:t>dentro de</w:t>
+      </w:r>
+      <w:r>
+        <w:t xml:space="preserve"> um sistema operacional, para inicializar </w:t>
+      </w:r>
+      <w:r>
+        <w:t xml:space="preserve">os procedimentos na CPU, deve </w:t>
+      </w:r>
+      <w:r>
+        <w:t>haver uma ordem pa</w:t>
+      </w:r>
+      <w:r>
+        <w:t xml:space="preserve">ra inicializar os programas </w:t>
+      </w:r>
+      <w:r>
+        <w:t>mais import</w:t>
+      </w:r>
+      <w:r>
+        <w:t>antes</w:t>
+      </w:r>
+      <w:r>
+        <w:t xml:space="preserve">. Além disso, </w:t>
+      </w:r>
+      <w:r>
+        <w:t>a definição</w:t>
+      </w:r>
+      <w:r>
+        <w:t xml:space="preserve"> </w:t>
+      </w:r>
+      <w:r>
+        <w:t>d</w:t>
+      </w:r>
+      <w:r>
+        <w:t>o que está em primeiro</w:t>
+      </w:r>
+      <w:r>
+        <w:t>, segundo ou terceiro plano é estritamente necessária</w:t>
+      </w:r>
+      <w:r>
+        <w:t>.</w:t>
+      </w:r>
+    </w:p>
+    <w:p>
+      <w:pPr>
+        <w:pStyle w:val="NormalRelatorio"/>
+      </w:pPr>
+      <w:r>
+        <w:t>A fim de facilitar a resolução destes problemas específicos</w:t>
+      </w:r>
+      <w:r>
+        <w:t>,</w:t>
+      </w:r>
+      <w:r>
+        <w:t xml:space="preserve"> ao longo da história</w:t>
+      </w:r>
+      <w:r>
+        <w:t xml:space="preserve"> </w:t>
+      </w:r>
+      <w:r>
+        <w:t xml:space="preserve">engenheiros, cientistas de dados e </w:t>
+      </w:r>
+      <w:r>
+        <w:t>e</w:t>
+      </w:r>
+      <w:r>
+        <w:t>ntusiasta</w:t>
+      </w:r>
+      <w:r>
+        <w:t xml:space="preserve">s da computação criaram algoritmos </w:t>
+      </w:r>
+      <w:r>
+        <w:t>capazes de</w:t>
+      </w:r>
+      <w:r>
+        <w:t xml:space="preserve"> </w:t>
+      </w:r>
+      <w:r>
+        <w:t>auxili</w:t>
+      </w:r>
+      <w:r>
+        <w:t>ar</w:t>
+      </w:r>
+      <w:r>
+        <w:t xml:space="preserve"> e</w:t>
+      </w:r>
+      <w:r>
+        <w:t xml:space="preserve"> tornar eficientes </w:t>
+      </w:r>
+      <w:r>
+        <w:t>a manipulação e conceituação d</w:t>
+      </w:r>
+      <w:r>
+        <w:t xml:space="preserve">essas ordenações, como o algoritmo </w:t>
+      </w:r>
+      <w:r>
+        <w:t>Heapsort</w:t>
+      </w:r>
+      <w:r>
+        <w:t xml:space="preserve">, </w:t>
+      </w:r>
+      <w:r>
+        <w:t xml:space="preserve">foi </w:t>
+      </w:r>
+      <w:r>
+        <w:t>inicialmente conceituado e publicado</w:t>
+      </w:r>
+      <w:r>
+        <w:t xml:space="preserve"> por Robert W. Floyd em 1962 sob o nome Treesort </w:t>
+      </w:r>
+      <w:r>
+        <w:t xml:space="preserve">e posteriormente melhorado e nomeado como Treesort 3 </w:t>
+      </w:r>
+      <w:r>
+        <w:t xml:space="preserve">por </w:t>
+      </w:r>
+      <w:r>
+        <w:t xml:space="preserve">John William Joseph (Bill) Williams </w:t>
+      </w:r>
+      <w:r>
+        <w:t>em 1964</w:t>
+      </w:r>
+      <w:r>
+        <w:t>.</w:t>
+      </w:r>
+    </w:p>
+    <w:p>
+      <w:pPr>
+        <w:pStyle w:val="NormalRelatorio"/>
+        <w:keepNext/>
+        <w:jc w:val="center"/>
+      </w:pPr>
+      <w:r>
+        <w:rPr>
+          <w:noProof/>
+          <w:lang w:eastAsia="pt-BR"/>
+        </w:rPr>
+        <w:lastRenderedPageBreak/>
+        <w:drawing>
+          <wp:inline distT="0" distB="0" distL="0" distR="0">
+            <wp:extent cx="2223806" cy="3278603"/>
+            <wp:effectExtent l="19050" t="0" r="5044" b="0"/>
+            <wp:docPr id="7" name="Imagem 7"/>
+            <wp:cNvGraphicFramePr>
+              <a:graphicFrameLocks xmlns:a="http://schemas.openxmlformats.org/drawingml/2006/main" noChangeAspect="1"/>
+            </wp:cNvGraphicFramePr>
+            <a:graphic xmlns:a="http://schemas.openxmlformats.org/drawingml/2006/main">
+              <a:graphicData uri="http://schemas.openxmlformats.org/drawingml/2006/picture">
+                <pic:pic xmlns:pic="http://schemas.openxmlformats.org/drawingml/2006/picture">
+                  <pic:nvPicPr>
+                    <pic:cNvPr id="0" name="Picture 7"/>
+                    <pic:cNvPicPr>
+                      <a:picLocks noChangeAspect="1" noChangeArrowheads="1"/>
+                    </pic:cNvPicPr>
+                  </pic:nvPicPr>
+                  <pic:blipFill>
+                    <a:blip r:embed="rId8"/>
+                    <a:srcRect/>
+                    <a:stretch>
+                      <a:fillRect/>
+                    </a:stretch>
+                  </pic:blipFill>
+                  <pic:spPr bwMode="auto">
+                    <a:xfrm>
+                      <a:off x="0" y="0"/>
+                      <a:ext cx="2227170" cy="3283563"/>
+                    </a:xfrm>
+                    <a:prstGeom prst="rect">
+                      <a:avLst/>
+                    </a:prstGeom>
+                    <a:noFill/>
+                    <a:ln w="9525">
+                      <a:noFill/>
+                      <a:miter lim="800000"/>
+                      <a:headEnd/>
+                      <a:tailEnd/>
+                    </a:ln>
+                  </pic:spPr>
+                </pic:pic>
+              </a:graphicData>
+            </a:graphic>
+          </wp:inline>
+        </w:drawing>
+      </w:r>
+      <w:r>
+        <w:rPr>
+          <w:noProof/>
+          <w:lang w:eastAsia="pt-BR"/>
+        </w:rPr>
+        <w:t xml:space="preserve"> </w:t>
+      </w:r>
+      <w:r>
+        <w:rPr>
+          <w:noProof/>
+          <w:lang w:eastAsia="pt-BR"/>
+        </w:rPr>
+        <w:drawing>
+          <wp:inline distT="0" distB="0" distL="0" distR="0">
+            <wp:extent cx="2011680" cy="1851660"/>
+            <wp:effectExtent l="19050" t="0" r="7620" b="0"/>
+            <wp:docPr id="6" name="Imagem 4"/>
+            <wp:cNvGraphicFramePr>
+              <a:graphicFrameLocks xmlns:a="http://schemas.openxmlformats.org/drawingml/2006/main" noChangeAspect="1"/>
+            </wp:cNvGraphicFramePr>
+            <a:graphic xmlns:a="http://schemas.openxmlformats.org/drawingml/2006/main">
+              <a:graphicData uri="http://schemas.openxmlformats.org/drawingml/2006/picture">
+                <pic:pic xmlns:pic="http://schemas.openxmlformats.org/drawingml/2006/picture">
+                  <pic:nvPicPr>
+                    <pic:cNvPr id="0" name="Picture 4"/>
+                    <pic:cNvPicPr>
+                      <a:picLocks noChangeAspect="1" noChangeArrowheads="1"/>
+                    </pic:cNvPicPr>
+                  </pic:nvPicPr>
+                  <pic:blipFill>
+                    <a:blip r:embed="rId9"/>
+                    <a:srcRect/>
+                    <a:stretch>
+                      <a:fillRect/>
+                    </a:stretch>
+                  </pic:blipFill>
+                  <pic:spPr bwMode="auto">
+                    <a:xfrm>
+                      <a:off x="0" y="0"/>
+                      <a:ext cx="2011680" cy="1851660"/>
+                    </a:xfrm>
+                    <a:prstGeom prst="rect">
+                      <a:avLst/>
+                    </a:prstGeom>
+                    <a:noFill/>
+                    <a:ln w="9525">
+                      <a:noFill/>
+                      <a:miter lim="800000"/>
+                      <a:headEnd/>
+                      <a:tailEnd/>
+                    </a:ln>
+                  </pic:spPr>
+                </pic:pic>
+              </a:graphicData>
+            </a:graphic>
+          </wp:inline>
+        </w:drawing>
+      </w:r>
     </w:p>
     <w:p>
       <w:pPr>
@@ -2782,6 +3151,16 @@
           <w:szCs w:val="24"/>
         </w:rPr>
       </w:pPr>
+      <w:bookmarkStart w:id="2" w:name="_Toc200360942"/>
+      <w:r>
+        <w:rPr>
+          <w:rFonts w:ascii="Times" w:hAnsi="Times" w:cs="Times"/>
+          <w:sz w:val="24"/>
+          <w:szCs w:val="24"/>
+        </w:rPr>
+        <w:t>exemplos de aplicações onde o problema pode ser encontrado,</w:t>
+      </w:r>
+      <w:bookmarkEnd w:id="2"/>
       <w:r>
         <w:rPr>
           <w:rFonts w:ascii="Times" w:hAnsi="Times" w:cs="Times"/>
@@ -2801,24 +3180,6 @@
           <w:szCs w:val="24"/>
         </w:rPr>
       </w:pPr>
-      <w:bookmarkStart w:id="2" w:name="_Toc200357396"/>
-      <w:r>
-        <w:rPr>
-          <w:rFonts w:ascii="Times" w:hAnsi="Times" w:cs="Times"/>
-          <w:sz w:val="24"/>
-          <w:szCs w:val="24"/>
-        </w:rPr>
-        <w:t>exemplos de aplicações onde o problema pode ser encontrado,</w:t>
-      </w:r>
-      <w:bookmarkEnd w:id="2"/>
-      <w:r>
-        <w:rPr>
-          <w:rFonts w:ascii="Times" w:hAnsi="Times" w:cs="Times"/>
-          <w:sz w:val="24"/>
-          <w:szCs w:val="24"/>
-        </w:rPr>
-        <w:t xml:space="preserve"> </w:t>
-      </w:r>
     </w:p>
     <w:p>
       <w:pPr>
@@ -2830,18 +3191,7 @@
           <w:szCs w:val="24"/>
         </w:rPr>
       </w:pPr>
-    </w:p>
-    <w:p>
-      <w:pPr>
-        <w:pStyle w:val="Ttulo2"/>
-        <w:jc w:val="both"/>
-        <w:rPr>
-          <w:rFonts w:ascii="Times" w:hAnsi="Times" w:cs="Times"/>
-          <w:sz w:val="24"/>
-          <w:szCs w:val="24"/>
-        </w:rPr>
-      </w:pPr>
-      <w:bookmarkStart w:id="3" w:name="_Toc200357397"/>
+      <w:bookmarkStart w:id="3" w:name="_Toc200360943"/>
       <w:r>
         <w:rPr>
           <w:rFonts w:ascii="Times" w:hAnsi="Times" w:cs="Times"/>
@@ -2893,7 +3243,7 @@
           <w:szCs w:val="24"/>
         </w:rPr>
       </w:pPr>
-      <w:bookmarkStart w:id="4" w:name="_Toc200357398"/>
+      <w:bookmarkStart w:id="4" w:name="_Toc200360944"/>
       <w:r>
         <w:rPr>
           <w:rFonts w:ascii="Times" w:hAnsi="Times" w:cs="Times"/>
@@ -2938,7 +3288,7 @@
           <w:szCs w:val="24"/>
         </w:rPr>
       </w:pPr>
-      <w:bookmarkStart w:id="5" w:name="_Toc200357399"/>
+      <w:bookmarkStart w:id="5" w:name="_Toc200360945"/>
       <w:r>
         <w:rPr>
           <w:rFonts w:ascii="Times" w:hAnsi="Times" w:cs="Times"/>
@@ -3259,10 +3609,9 @@
           <w:sz w:val="24"/>
           <w:szCs w:val="24"/>
         </w:rPr>
-        <w:lastRenderedPageBreak/>
         <w:t xml:space="preserve"> </w:t>
       </w:r>
-      <w:bookmarkStart w:id="6" w:name="_Toc200357400"/>
+      <w:bookmarkStart w:id="6" w:name="_Toc200360946"/>
       <w:r>
         <w:rPr>
           <w:rFonts w:ascii="Times" w:hAnsi="Times" w:cs="Times"/>
@@ -3424,6 +3773,7 @@
           <w:sz w:val="24"/>
           <w:szCs w:val="24"/>
         </w:rPr>
+        <w:lastRenderedPageBreak/>
         <w:t>Para chegar a esse resultado, devemos considerar</w:t>
       </w:r>
       <w:r>
@@ -4796,6 +5146,7 @@
           <w:sz w:val="24"/>
           <w:szCs w:val="24"/>
         </w:rPr>
+        <w:lastRenderedPageBreak/>
         <w:t xml:space="preserve">O </w:t>
       </w:r>
       <w:r>
@@ -6015,7 +6366,7 @@
                     <pic:cNvPicPr/>
                   </pic:nvPicPr>
                   <pic:blipFill>
-                    <a:blip r:embed="rId8"/>
+                    <a:blip r:embed="rId10"/>
                     <a:srcRect r="12515"/>
                     <a:stretch>
                       <a:fillRect/>
@@ -6071,7 +6422,7 @@
                     <pic:cNvPicPr/>
                   </pic:nvPicPr>
                   <pic:blipFill>
-                    <a:blip r:embed="rId9"/>
+                    <a:blip r:embed="rId11"/>
                     <a:stretch>
                       <a:fillRect/>
                     </a:stretch>
@@ -6096,7 +6447,7 @@
       <w:pPr>
         <w:pStyle w:val="Titulo2Relatorio"/>
       </w:pPr>
-      <w:bookmarkStart w:id="7" w:name="_Toc200357401"/>
+      <w:bookmarkStart w:id="7" w:name="_Toc200360947"/>
       <w:r>
         <w:t xml:space="preserve">Melhores </w:t>
       </w:r>
@@ -6185,7 +6536,6 @@
           <w:sz w:val="24"/>
           <w:szCs w:val="24"/>
         </w:rPr>
-        <w:lastRenderedPageBreak/>
         <w:t>Implementação de filas de prioridade.</w:t>
       </w:r>
     </w:p>
@@ -6259,8 +6609,9 @@
       <w:pPr>
         <w:pStyle w:val="Titulo3Relatorio"/>
       </w:pPr>
-      <w:bookmarkStart w:id="8" w:name="_Toc200357402"/>
-      <w:r>
+      <w:bookmarkStart w:id="8" w:name="_Toc200360948"/>
+      <w:r>
+        <w:lastRenderedPageBreak/>
         <w:t>Aplicações com necessidade de garantia de tempo.</w:t>
       </w:r>
       <w:bookmarkEnd w:id="8"/>
@@ -6329,7 +6680,7 @@
       <w:pPr>
         <w:pStyle w:val="Titulo3Relatorio"/>
       </w:pPr>
-      <w:bookmarkStart w:id="9" w:name="_Toc200357403"/>
+      <w:bookmarkStart w:id="9" w:name="_Toc200360949"/>
       <w:r>
         <w:t>Ambientes com restrições de memória.</w:t>
       </w:r>
@@ -6395,37 +6746,46 @@
       <w:pPr>
         <w:pStyle w:val="Titulo3Relatorio"/>
       </w:pPr>
-      <w:bookmarkStart w:id="10" w:name="_Toc200357404"/>
+      <w:bookmarkStart w:id="10" w:name="_Toc200360950"/>
       <w:r>
         <w:t>Implementação de filas de prioridade.</w:t>
       </w:r>
       <w:bookmarkEnd w:id="10"/>
+      <w:r>
+        <w:t xml:space="preserve"> - F</w:t>
+      </w:r>
     </w:p>
     <w:p>
       <w:pPr>
         <w:pStyle w:val="Titulo3Relatorio"/>
       </w:pPr>
-      <w:bookmarkStart w:id="11" w:name="_Toc200357405"/>
+      <w:bookmarkStart w:id="11" w:name="_Toc200360951"/>
       <w:r>
         <w:t>Processamento de dados em fluxo</w:t>
       </w:r>
       <w:bookmarkEnd w:id="11"/>
+      <w:r>
+        <w:t xml:space="preserve"> - F</w:t>
+      </w:r>
     </w:p>
     <w:p>
       <w:pPr>
         <w:pStyle w:val="Titulo3Relatorio"/>
       </w:pPr>
-      <w:bookmarkStart w:id="12" w:name="_Toc200357406"/>
+      <w:bookmarkStart w:id="12" w:name="_Toc200360952"/>
       <w:r>
         <w:t>Sistemas críticos</w:t>
       </w:r>
       <w:bookmarkEnd w:id="12"/>
+      <w:r>
+        <w:t xml:space="preserve"> - F</w:t>
+      </w:r>
     </w:p>
     <w:p>
       <w:pPr>
         <w:pStyle w:val="Titulo3Relatorio"/>
       </w:pPr>
-      <w:bookmarkStart w:id="13" w:name="_Toc200357407"/>
+      <w:bookmarkStart w:id="13" w:name="_Toc200360953"/>
       <w:r>
         <w:t>Grandes volumes de dados</w:t>
       </w:r>
@@ -6473,7 +6833,7 @@
           <w:szCs w:val="24"/>
         </w:rPr>
       </w:pPr>
-      <w:bookmarkStart w:id="14" w:name="_Toc200357408"/>
+      <w:bookmarkStart w:id="14" w:name="_Toc200360954"/>
       <w:r>
         <w:rPr>
           <w:rFonts w:ascii="Times" w:hAnsi="Times" w:cs="Times"/>
@@ -6674,7 +7034,7 @@
           <w:szCs w:val="24"/>
         </w:rPr>
       </w:pPr>
-      <w:bookmarkStart w:id="15" w:name="_Toc200357409"/>
+      <w:bookmarkStart w:id="15" w:name="_Toc200360955"/>
       <w:r>
         <w:rPr>
           <w:rFonts w:ascii="Times" w:hAnsi="Times" w:cs="Times"/>
@@ -6954,30 +7314,366 @@
           <w:szCs w:val="24"/>
         </w:rPr>
       </w:pPr>
-      <w:bookmarkStart w:id="16" w:name="_Toc200357410"/>
-      <w:r>
-        <w:rPr>
-          <w:rFonts w:ascii="Times" w:hAnsi="Times" w:cs="Times"/>
-          <w:sz w:val="24"/>
-          <w:szCs w:val="24"/>
-        </w:rPr>
+      <w:bookmarkStart w:id="16" w:name="_Toc200360956"/>
+      <w:r>
+        <w:rPr>
+          <w:rFonts w:ascii="Times" w:hAnsi="Times" w:cs="Times"/>
+          <w:sz w:val="24"/>
+          <w:szCs w:val="24"/>
+        </w:rPr>
+        <w:t xml:space="preserve">Exemplos </w:t>
+      </w:r>
+      <w:r>
+        <w:rPr>
+          <w:rFonts w:ascii="Times" w:hAnsi="Times" w:cs="Times"/>
+          <w:sz w:val="24"/>
+          <w:szCs w:val="24"/>
+        </w:rPr>
+        <w:t>de Como O Processo d</w:t>
+      </w:r>
+      <w:r>
+        <w:rPr>
+          <w:rFonts w:ascii="Times" w:hAnsi="Times" w:cs="Times"/>
+          <w:sz w:val="24"/>
+          <w:szCs w:val="24"/>
+        </w:rPr>
+        <w:t>e Ordenação Acontece.</w:t>
+      </w:r>
+      <w:bookmarkEnd w:id="16"/>
+    </w:p>
+    <w:p>
+      <w:pPr>
+        <w:pStyle w:val="NormalRelatorio"/>
+      </w:pPr>
+      <w:r>
+        <w:t xml:space="preserve">O </w:t>
+      </w:r>
+      <w:r>
+        <w:rPr>
+          <w:b/>
+        </w:rPr>
+        <w:t>Heapsort</w:t>
+      </w:r>
+      <w:r>
+        <w:t xml:space="preserve"> </w:t>
+      </w:r>
+      <w:r>
+        <w:t>faz o uso de</w:t>
+      </w:r>
+      <w:r>
+        <w:t xml:space="preserve"> </w:t>
+      </w:r>
+      <w:r>
+        <w:t xml:space="preserve">uma estrutura de dados denominada como </w:t>
+      </w:r>
+      <w:r>
+        <w:rPr>
+          <w:i/>
+        </w:rPr>
+        <w:t>heap</w:t>
+      </w:r>
+      <w:r>
+        <w:t xml:space="preserve"> para ordenar os elementos a medida que os in</w:t>
+      </w:r>
+      <w:r>
+        <w:t>sere na estrutura. Assim, ao finalizar as inserções, este</w:t>
+      </w:r>
+      <w:r>
+        <w:t xml:space="preserve">s elementos podem ser sucessivamente removidos da raiz da </w:t>
+      </w:r>
+      <w:r>
+        <w:rPr>
+          <w:i/>
+        </w:rPr>
+        <w:t>heap</w:t>
+      </w:r>
+      <w:r>
+        <w:t>, na ordem desejada, sendo essencial</w:t>
+      </w:r>
+      <w:r>
+        <w:t>mente necessário</w:t>
+      </w:r>
+      <w:r>
+        <w:t xml:space="preserve"> que a propriedade </w:t>
+      </w:r>
+      <w:r>
+        <w:rPr>
+          <w:i/>
+        </w:rPr>
+        <w:t>max-heap</w:t>
+      </w:r>
+      <w:r>
+        <w:t xml:space="preserve"> seja mantida. </w:t>
+      </w:r>
+      <w:r>
+        <w:t>Tal medida,</w:t>
+      </w:r>
+      <w:r>
+        <w:t xml:space="preserve"> </w:t>
+      </w:r>
+      <w:r>
+        <w:t xml:space="preserve">faz com </w:t>
+      </w:r>
+      <w:r>
         <w:lastRenderedPageBreak/>
-        <w:t xml:space="preserve">Exemplos de como o processo de ordenação acontece. </w:t>
-      </w:r>
-      <w:r>
-        <w:rPr>
-          <w:rFonts w:ascii="Times" w:hAnsi="Times" w:cs="Times"/>
-          <w:sz w:val="24"/>
-          <w:szCs w:val="24"/>
-        </w:rPr>
-        <w:t>- FALTA</w:t>
-      </w:r>
-      <w:bookmarkEnd w:id="16"/>
+        <w:t>que esta propriedade garanta que o valor de todos os nós sejam</w:t>
+      </w:r>
+      <w:r>
+        <w:t xml:space="preserve"> menores que os de seus respectivos pais.</w:t>
+      </w:r>
+    </w:p>
+    <w:p>
+      <w:pPr>
+        <w:pStyle w:val="NormalRelatorio"/>
+        <w:ind w:firstLine="0"/>
+        <w:jc w:val="center"/>
+      </w:pPr>
+      <w:r>
+        <w:rPr>
+          <w:noProof/>
+          <w:lang w:eastAsia="pt-BR"/>
+        </w:rPr>
+        <w:drawing>
+          <wp:inline distT="0" distB="0" distL="0" distR="0">
+            <wp:extent cx="2727960" cy="2331647"/>
+            <wp:effectExtent l="19050" t="0" r="0" b="0"/>
+            <wp:docPr id="10" name="Imagem 10"/>
+            <wp:cNvGraphicFramePr>
+              <a:graphicFrameLocks xmlns:a="http://schemas.openxmlformats.org/drawingml/2006/main" noChangeAspect="1"/>
+            </wp:cNvGraphicFramePr>
+            <a:graphic xmlns:a="http://schemas.openxmlformats.org/drawingml/2006/main">
+              <a:graphicData uri="http://schemas.openxmlformats.org/drawingml/2006/picture">
+                <pic:pic xmlns:pic="http://schemas.openxmlformats.org/drawingml/2006/picture">
+                  <pic:nvPicPr>
+                    <pic:cNvPr id="0" name="Picture 10"/>
+                    <pic:cNvPicPr>
+                      <a:picLocks noChangeAspect="1" noChangeArrowheads="1"/>
+                    </pic:cNvPicPr>
+                  </pic:nvPicPr>
+                  <pic:blipFill>
+                    <a:blip r:embed="rId12"/>
+                    <a:srcRect/>
+                    <a:stretch>
+                      <a:fillRect/>
+                    </a:stretch>
+                  </pic:blipFill>
+                  <pic:spPr bwMode="auto">
+                    <a:xfrm>
+                      <a:off x="0" y="0"/>
+                      <a:ext cx="2731267" cy="2334473"/>
+                    </a:xfrm>
+                    <a:prstGeom prst="rect">
+                      <a:avLst/>
+                    </a:prstGeom>
+                    <a:noFill/>
+                    <a:ln w="9525">
+                      <a:noFill/>
+                      <a:miter lim="800000"/>
+                      <a:headEnd/>
+                      <a:tailEnd/>
+                    </a:ln>
+                  </pic:spPr>
+                </pic:pic>
+              </a:graphicData>
+            </a:graphic>
+          </wp:inline>
+        </w:drawing>
+      </w:r>
+    </w:p>
+    <w:p>
+      <w:pPr>
+        <w:pStyle w:val="NormalRelatorio"/>
+      </w:pPr>
+      <w:r>
+        <w:t xml:space="preserve">A estrutura </w:t>
+      </w:r>
+      <w:r>
+        <w:rPr>
+          <w:i/>
+        </w:rPr>
+        <w:t>heap</w:t>
+      </w:r>
+      <w:r>
+        <w:t xml:space="preserve"> pode ser representada</w:t>
+      </w:r>
+      <w:r>
+        <w:t>, tanto como uma árvore</w:t>
+      </w:r>
+      <w:r>
+        <w:t xml:space="preserve"> binária</w:t>
+      </w:r>
+      <w:r>
+        <w:t xml:space="preserve"> especial</w:t>
+      </w:r>
+      <w:r>
+        <w:t xml:space="preserve"> ou como um vetor. </w:t>
+      </w:r>
+      <w:r>
+        <w:t>Tais idealizações, podem ser visualizadas nas imagens a seguir</w:t>
+      </w:r>
+      <w:r>
+        <w:t>:</w:t>
+      </w:r>
     </w:p>
     <w:p>
       <w:pPr>
         <w:jc w:val="both"/>
       </w:pPr>
+      <w:r>
+        <w:rPr>
+          <w:noProof/>
+          <w:lang w:eastAsia="pt-BR"/>
+        </w:rPr>
+        <w:drawing>
+          <wp:inline distT="0" distB="0" distL="0" distR="0">
+            <wp:extent cx="6234649" cy="1888466"/>
+            <wp:effectExtent l="19050" t="0" r="0" b="0"/>
+            <wp:docPr id="9" name="Imagem 13"/>
+            <wp:cNvGraphicFramePr>
+              <a:graphicFrameLocks xmlns:a="http://schemas.openxmlformats.org/drawingml/2006/main" noChangeAspect="1"/>
+            </wp:cNvGraphicFramePr>
+            <a:graphic xmlns:a="http://schemas.openxmlformats.org/drawingml/2006/main">
+              <a:graphicData uri="http://schemas.openxmlformats.org/drawingml/2006/picture">
+                <pic:pic xmlns:pic="http://schemas.openxmlformats.org/drawingml/2006/picture">
+                  <pic:nvPicPr>
+                    <pic:cNvPr id="0" name="Picture 13"/>
+                    <pic:cNvPicPr>
+                      <a:picLocks noChangeAspect="1" noChangeArrowheads="1"/>
+                    </pic:cNvPicPr>
+                  </pic:nvPicPr>
+                  <pic:blipFill>
+                    <a:blip r:embed="rId13"/>
+                    <a:srcRect/>
+                    <a:stretch>
+                      <a:fillRect/>
+                    </a:stretch>
+                  </pic:blipFill>
+                  <pic:spPr bwMode="auto">
+                    <a:xfrm>
+                      <a:off x="0" y="0"/>
+                      <a:ext cx="6234649" cy="1888466"/>
+                    </a:xfrm>
+                    <a:prstGeom prst="rect">
+                      <a:avLst/>
+                    </a:prstGeom>
+                    <a:noFill/>
+                    <a:ln w="9525">
+                      <a:noFill/>
+                      <a:miter lim="800000"/>
+                      <a:headEnd/>
+                      <a:tailEnd/>
+                    </a:ln>
+                  </pic:spPr>
+                </pic:pic>
+              </a:graphicData>
+            </a:graphic>
+          </wp:inline>
+        </w:drawing>
+      </w:r>
+    </w:p>
+    <w:p>
+      <w:pPr>
+        <w:pStyle w:val="NormalRelatorio"/>
+      </w:pPr>
+      <w:r>
+        <w:t xml:space="preserve">Na abordagem em que o </w:t>
+      </w:r>
+      <w:r>
+        <w:rPr>
+          <w:i/>
+        </w:rPr>
+        <w:t>h</w:t>
+      </w:r>
+      <w:r>
+        <w:rPr>
+          <w:i/>
+        </w:rPr>
+        <w:t>eap</w:t>
+      </w:r>
+      <w:r>
+        <w:t xml:space="preserve"> é um vetor, pode</w:t>
+      </w:r>
+      <w:r>
+        <w:t>re</w:t>
+      </w:r>
+      <w:r>
+        <w:t>mos resumir o funcionamento do algoritmo ut</w:t>
+      </w:r>
+      <w:r>
+        <w:t>ilizando as seguintes considerações:</w:t>
+      </w:r>
+    </w:p>
+    <w:p>
+      <w:pPr>
+        <w:pStyle w:val="NormalRelatorio"/>
+      </w:pPr>
+      <w:r>
+        <w:t>1. Seleçã</w:t>
+      </w:r>
+      <w:r>
+        <w:t>o</w:t>
+      </w:r>
+      <w:r>
+        <w:t xml:space="preserve"> do</w:t>
+      </w:r>
+      <w:r>
+        <w:t xml:space="preserve"> menor item </w:t>
+      </w:r>
+      <w:r>
+        <w:t>presente n</w:t>
+      </w:r>
+      <w:r>
+        <w:t>o vetor.</w:t>
+      </w:r>
+    </w:p>
+    <w:p>
+      <w:pPr>
+        <w:pStyle w:val="NormalRelatorio"/>
+      </w:pPr>
+      <w:r>
+        <w:t xml:space="preserve">2. </w:t>
+      </w:r>
+      <w:r>
+        <w:t>Alterne-o</w:t>
+      </w:r>
+      <w:r>
+        <w:t xml:space="preserve"> com o ite</w:t>
+      </w:r>
+      <w:r>
+        <w:t xml:space="preserve">m da primeira posição do vetor (procedimento </w:t>
+      </w:r>
+      <w:r>
+        <w:rPr>
+          <w:i/>
+        </w:rPr>
+        <w:t>swap</w:t>
+      </w:r>
+      <w:r>
+        <w:t>).</w:t>
+      </w:r>
+    </w:p>
+    <w:p>
+      <w:pPr>
+        <w:pStyle w:val="NormalRelatorio"/>
+      </w:pPr>
+      <w:r>
+        <w:t>3. Repita estas operações com os (n – 1) itens restantes, depois com os (n – 2) itens, e assim sucessivamente</w:t>
+      </w:r>
+      <w:r>
+        <w:t xml:space="preserve"> (procedimento </w:t>
+      </w:r>
+      <w:r>
+        <w:rPr>
+          <w:i/>
+        </w:rPr>
+        <w:t>heapify</w:t>
+      </w:r>
+      <w:r>
+        <w:t>)</w:t>
+      </w:r>
+      <w:r>
+        <w:t>.</w:t>
+      </w:r>
     </w:p>
     <w:p>
       <w:pPr>
@@ -6993,7 +7689,7 @@
           <w:szCs w:val="24"/>
         </w:rPr>
       </w:pPr>
-      <w:bookmarkStart w:id="17" w:name="_Toc200357411"/>
+      <w:bookmarkStart w:id="17" w:name="_Toc200360957"/>
       <w:r>
         <w:rPr>
           <w:rFonts w:ascii="Times" w:hAnsi="Times" w:cs="Times"/>
@@ -7008,7 +7704,7 @@
       <w:pPr>
         <w:pStyle w:val="Titulo2Relatorio"/>
       </w:pPr>
-      <w:bookmarkStart w:id="18" w:name="_Toc200357412"/>
+      <w:bookmarkStart w:id="18" w:name="_Toc200360958"/>
       <w:r>
         <w:t>Detalhamento da implementação e decisões tomadas durante a construção do algoritmo.</w:t>
       </w:r>
@@ -7038,8 +7734,9 @@
       <w:pPr>
         <w:pStyle w:val="Titulo3Relatorio"/>
       </w:pPr>
-      <w:bookmarkStart w:id="19" w:name="_Toc200357413"/>
-      <w:r>
+      <w:bookmarkStart w:id="19" w:name="_Toc200360959"/>
+      <w:r>
+        <w:lastRenderedPageBreak/>
         <w:t>Algoritmo da obra Estrutura de Dados Usando C</w:t>
       </w:r>
       <w:bookmarkEnd w:id="19"/>
@@ -7881,157 +8578,157 @@
           <w:sz w:val="24"/>
           <w:szCs w:val="24"/>
         </w:rPr>
+        <w:t>Com isso, o</w:t>
+      </w:r>
+      <w:r>
+        <w:rPr>
+          <w:rFonts w:ascii="Times" w:eastAsiaTheme="minorEastAsia" w:hAnsi="Times" w:cs="Times"/>
+          <w:sz w:val="24"/>
+          <w:szCs w:val="24"/>
+        </w:rPr>
+        <w:t xml:space="preserve"> seguinte algoritmo </w:t>
+      </w:r>
+      <w:r>
+        <w:rPr>
+          <w:rFonts w:ascii="Times" w:eastAsiaTheme="minorEastAsia" w:hAnsi="Times" w:cs="Times"/>
+          <w:sz w:val="24"/>
+          <w:szCs w:val="24"/>
+        </w:rPr>
+        <w:t>foi</w:t>
+      </w:r>
+      <w:r>
+        <w:rPr>
+          <w:rFonts w:ascii="Times" w:eastAsiaTheme="minorEastAsia" w:hAnsi="Times" w:cs="Times"/>
+          <w:sz w:val="24"/>
+          <w:szCs w:val="24"/>
+        </w:rPr>
+        <w:t xml:space="preserve"> implementado:</w:t>
+      </w:r>
+    </w:p>
+    <w:p>
+      <w:pPr>
+        <w:jc w:val="both"/>
+        <w:rPr>
+          <w:rFonts w:ascii="Courier New" w:eastAsiaTheme="minorEastAsia" w:hAnsi="Courier New" w:cs="Courier New"/>
+          <w:sz w:val="16"/>
+          <w:szCs w:val="24"/>
+        </w:rPr>
+      </w:pPr>
+      <w:r>
+        <w:rPr>
+          <w:rFonts w:ascii="Courier New" w:eastAsiaTheme="minorEastAsia" w:hAnsi="Courier New" w:cs="Courier New"/>
+          <w:sz w:val="16"/>
+          <w:szCs w:val="24"/>
+        </w:rPr>
+        <w:t>void pqinsert(int dpq[], int k, int elt)</w:t>
+      </w:r>
+    </w:p>
+    <w:p>
+      <w:pPr>
+        <w:jc w:val="both"/>
+        <w:rPr>
+          <w:rFonts w:ascii="Courier New" w:eastAsiaTheme="minorEastAsia" w:hAnsi="Courier New" w:cs="Courier New"/>
+          <w:sz w:val="16"/>
+          <w:szCs w:val="24"/>
+        </w:rPr>
+      </w:pPr>
+      <w:r>
+        <w:rPr>
+          <w:rFonts w:ascii="Courier New" w:eastAsiaTheme="minorEastAsia" w:hAnsi="Courier New" w:cs="Courier New"/>
+          <w:sz w:val="16"/>
+          <w:szCs w:val="24"/>
+        </w:rPr>
+        <w:t>{</w:t>
+      </w:r>
+    </w:p>
+    <w:p>
+      <w:pPr>
+        <w:jc w:val="both"/>
+        <w:rPr>
+          <w:rFonts w:ascii="Courier New" w:eastAsiaTheme="minorEastAsia" w:hAnsi="Courier New" w:cs="Courier New"/>
+          <w:sz w:val="16"/>
+          <w:szCs w:val="24"/>
+        </w:rPr>
+      </w:pPr>
+      <w:r>
+        <w:rPr>
+          <w:rFonts w:ascii="Courier New" w:eastAsiaTheme="minorEastAsia" w:hAnsi="Courier New" w:cs="Courier New"/>
+          <w:sz w:val="16"/>
+          <w:szCs w:val="24"/>
+        </w:rPr>
+        <w:t xml:space="preserve">    int s = k;</w:t>
+      </w:r>
+    </w:p>
+    <w:p>
+      <w:pPr>
+        <w:jc w:val="both"/>
+        <w:rPr>
+          <w:rFonts w:ascii="Courier New" w:eastAsiaTheme="minorEastAsia" w:hAnsi="Courier New" w:cs="Courier New"/>
+          <w:sz w:val="16"/>
+          <w:szCs w:val="24"/>
+        </w:rPr>
+      </w:pPr>
+      <w:r>
+        <w:rPr>
+          <w:rFonts w:ascii="Courier New" w:eastAsiaTheme="minorEastAsia" w:hAnsi="Courier New" w:cs="Courier New"/>
+          <w:sz w:val="16"/>
+          <w:szCs w:val="24"/>
+        </w:rPr>
+        <w:t xml:space="preserve">    int f = (s - 1) / 2; /* f eh o pai de s */</w:t>
+      </w:r>
+    </w:p>
+    <w:p>
+      <w:pPr>
+        <w:jc w:val="both"/>
+        <w:rPr>
+          <w:rFonts w:ascii="Courier New" w:eastAsiaTheme="minorEastAsia" w:hAnsi="Courier New" w:cs="Courier New"/>
+          <w:sz w:val="16"/>
+          <w:szCs w:val="24"/>
+        </w:rPr>
+      </w:pPr>
+      <w:r>
+        <w:rPr>
+          <w:rFonts w:ascii="Courier New" w:eastAsiaTheme="minorEastAsia" w:hAnsi="Courier New" w:cs="Courier New"/>
+          <w:sz w:val="16"/>
+          <w:szCs w:val="24"/>
+        </w:rPr>
+        <w:t xml:space="preserve">    while (s &gt; 0 &amp;&amp; dpq[f] &lt; elt)</w:t>
+      </w:r>
+    </w:p>
+    <w:p>
+      <w:pPr>
+        <w:jc w:val="both"/>
+        <w:rPr>
+          <w:rFonts w:ascii="Courier New" w:eastAsiaTheme="minorEastAsia" w:hAnsi="Courier New" w:cs="Courier New"/>
+          <w:sz w:val="16"/>
+          <w:szCs w:val="24"/>
+        </w:rPr>
+      </w:pPr>
+      <w:r>
+        <w:rPr>
+          <w:rFonts w:ascii="Courier New" w:eastAsiaTheme="minorEastAsia" w:hAnsi="Courier New" w:cs="Courier New"/>
+          <w:sz w:val="16"/>
+          <w:szCs w:val="24"/>
+        </w:rPr>
+        <w:t xml:space="preserve">    {</w:t>
+      </w:r>
+    </w:p>
+    <w:p>
+      <w:pPr>
+        <w:jc w:val="both"/>
+        <w:rPr>
+          <w:rFonts w:ascii="Courier New" w:eastAsiaTheme="minorEastAsia" w:hAnsi="Courier New" w:cs="Courier New"/>
+          <w:sz w:val="16"/>
+          <w:szCs w:val="24"/>
+        </w:rPr>
+      </w:pPr>
+      <w:r>
+        <w:rPr>
+          <w:rFonts w:ascii="Courier New" w:eastAsiaTheme="minorEastAsia" w:hAnsi="Courier New" w:cs="Courier New"/>
+          <w:sz w:val="16"/>
+          <w:szCs w:val="24"/>
+        </w:rPr>
         <w:lastRenderedPageBreak/>
-        <w:t>Com isso, o</w:t>
-      </w:r>
-      <w:r>
-        <w:rPr>
-          <w:rFonts w:ascii="Times" w:eastAsiaTheme="minorEastAsia" w:hAnsi="Times" w:cs="Times"/>
-          <w:sz w:val="24"/>
-          <w:szCs w:val="24"/>
-        </w:rPr>
-        <w:t xml:space="preserve"> seguinte algoritmo </w:t>
-      </w:r>
-      <w:r>
-        <w:rPr>
-          <w:rFonts w:ascii="Times" w:eastAsiaTheme="minorEastAsia" w:hAnsi="Times" w:cs="Times"/>
-          <w:sz w:val="24"/>
-          <w:szCs w:val="24"/>
-        </w:rPr>
-        <w:t>foi</w:t>
-      </w:r>
-      <w:r>
-        <w:rPr>
-          <w:rFonts w:ascii="Times" w:eastAsiaTheme="minorEastAsia" w:hAnsi="Times" w:cs="Times"/>
-          <w:sz w:val="24"/>
-          <w:szCs w:val="24"/>
-        </w:rPr>
-        <w:t xml:space="preserve"> implementado:</w:t>
-      </w:r>
-    </w:p>
-    <w:p>
-      <w:pPr>
-        <w:jc w:val="both"/>
-        <w:rPr>
-          <w:rFonts w:ascii="Courier New" w:eastAsiaTheme="minorEastAsia" w:hAnsi="Courier New" w:cs="Courier New"/>
-          <w:sz w:val="16"/>
-          <w:szCs w:val="24"/>
-        </w:rPr>
-      </w:pPr>
-      <w:r>
-        <w:rPr>
-          <w:rFonts w:ascii="Courier New" w:eastAsiaTheme="minorEastAsia" w:hAnsi="Courier New" w:cs="Courier New"/>
-          <w:sz w:val="16"/>
-          <w:szCs w:val="24"/>
-        </w:rPr>
-        <w:t>void pqinsert(int dpq[], int k, int elt)</w:t>
-      </w:r>
-    </w:p>
-    <w:p>
-      <w:pPr>
-        <w:jc w:val="both"/>
-        <w:rPr>
-          <w:rFonts w:ascii="Courier New" w:eastAsiaTheme="minorEastAsia" w:hAnsi="Courier New" w:cs="Courier New"/>
-          <w:sz w:val="16"/>
-          <w:szCs w:val="24"/>
-        </w:rPr>
-      </w:pPr>
-      <w:r>
-        <w:rPr>
-          <w:rFonts w:ascii="Courier New" w:eastAsiaTheme="minorEastAsia" w:hAnsi="Courier New" w:cs="Courier New"/>
-          <w:sz w:val="16"/>
-          <w:szCs w:val="24"/>
-        </w:rPr>
-        <w:t>{</w:t>
-      </w:r>
-    </w:p>
-    <w:p>
-      <w:pPr>
-        <w:jc w:val="both"/>
-        <w:rPr>
-          <w:rFonts w:ascii="Courier New" w:eastAsiaTheme="minorEastAsia" w:hAnsi="Courier New" w:cs="Courier New"/>
-          <w:sz w:val="16"/>
-          <w:szCs w:val="24"/>
-        </w:rPr>
-      </w:pPr>
-      <w:r>
-        <w:rPr>
-          <w:rFonts w:ascii="Courier New" w:eastAsiaTheme="minorEastAsia" w:hAnsi="Courier New" w:cs="Courier New"/>
-          <w:sz w:val="16"/>
-          <w:szCs w:val="24"/>
-        </w:rPr>
-        <w:t xml:space="preserve">    int s = k;</w:t>
-      </w:r>
-    </w:p>
-    <w:p>
-      <w:pPr>
-        <w:jc w:val="both"/>
-        <w:rPr>
-          <w:rFonts w:ascii="Courier New" w:eastAsiaTheme="minorEastAsia" w:hAnsi="Courier New" w:cs="Courier New"/>
-          <w:sz w:val="16"/>
-          <w:szCs w:val="24"/>
-        </w:rPr>
-      </w:pPr>
-      <w:r>
-        <w:rPr>
-          <w:rFonts w:ascii="Courier New" w:eastAsiaTheme="minorEastAsia" w:hAnsi="Courier New" w:cs="Courier New"/>
-          <w:sz w:val="16"/>
-          <w:szCs w:val="24"/>
-        </w:rPr>
-        <w:t xml:space="preserve">    int f = (s - 1) / 2; /* f eh o pai de s */</w:t>
-      </w:r>
-    </w:p>
-    <w:p>
-      <w:pPr>
-        <w:jc w:val="both"/>
-        <w:rPr>
-          <w:rFonts w:ascii="Courier New" w:eastAsiaTheme="minorEastAsia" w:hAnsi="Courier New" w:cs="Courier New"/>
-          <w:sz w:val="16"/>
-          <w:szCs w:val="24"/>
-        </w:rPr>
-      </w:pPr>
-      <w:r>
-        <w:rPr>
-          <w:rFonts w:ascii="Courier New" w:eastAsiaTheme="minorEastAsia" w:hAnsi="Courier New" w:cs="Courier New"/>
-          <w:sz w:val="16"/>
-          <w:szCs w:val="24"/>
-        </w:rPr>
-        <w:t xml:space="preserve">    while (s &gt; 0 &amp;&amp; dpq[f] &lt; elt)</w:t>
-      </w:r>
-    </w:p>
-    <w:p>
-      <w:pPr>
-        <w:jc w:val="both"/>
-        <w:rPr>
-          <w:rFonts w:ascii="Courier New" w:eastAsiaTheme="minorEastAsia" w:hAnsi="Courier New" w:cs="Courier New"/>
-          <w:sz w:val="16"/>
-          <w:szCs w:val="24"/>
-        </w:rPr>
-      </w:pPr>
-      <w:r>
-        <w:rPr>
-          <w:rFonts w:ascii="Courier New" w:eastAsiaTheme="minorEastAsia" w:hAnsi="Courier New" w:cs="Courier New"/>
-          <w:sz w:val="16"/>
-          <w:szCs w:val="24"/>
-        </w:rPr>
-        <w:t xml:space="preserve">    {</w:t>
-      </w:r>
-    </w:p>
-    <w:p>
-      <w:pPr>
-        <w:jc w:val="both"/>
-        <w:rPr>
-          <w:rFonts w:ascii="Courier New" w:eastAsiaTheme="minorEastAsia" w:hAnsi="Courier New" w:cs="Courier New"/>
-          <w:sz w:val="16"/>
-          <w:szCs w:val="24"/>
-        </w:rPr>
-      </w:pPr>
-      <w:r>
-        <w:rPr>
-          <w:rFonts w:ascii="Courier New" w:eastAsiaTheme="minorEastAsia" w:hAnsi="Courier New" w:cs="Courier New"/>
-          <w:sz w:val="16"/>
-          <w:szCs w:val="24"/>
-        </w:rPr>
         <w:t xml:space="preserve">        dpq[s] = dpq[f];</w:t>
       </w:r>
     </w:p>
@@ -9389,7 +10086,6 @@
         <w:rPr>
           <w:sz w:val="16"/>
         </w:rPr>
-        <w:lastRenderedPageBreak/>
         <w:t xml:space="preserve">    dpq[0] = dpq[k - 1];</w:t>
       </w:r>
     </w:p>
@@ -9542,7 +10238,14 @@
         <w:rPr>
           <w:rFonts w:eastAsiaTheme="minorEastAsia"/>
         </w:rPr>
-        <w:t xml:space="preserve"> é constituída por três grupos elementares: a raiz dpq[p], subárvore esquerda </w:t>
+        <w:t xml:space="preserve"> é constituída por três grupos elementares: a raiz dpq[p], </w:t>
+      </w:r>
+      <w:r>
+        <w:rPr>
+          <w:rFonts w:eastAsiaTheme="minorEastAsia"/>
+        </w:rPr>
+        <w:lastRenderedPageBreak/>
+        <w:t xml:space="preserve">subárvore esquerda </w:t>
       </w:r>
       <w:r>
         <w:rPr>
@@ -10188,7 +10891,6 @@
         <w:rPr>
           <w:sz w:val="16"/>
         </w:rPr>
-        <w:lastRenderedPageBreak/>
         <w:t>}</w:t>
       </w:r>
     </w:p>
@@ -10444,6 +11146,7 @@
         <w:rPr>
           <w:sz w:val="16"/>
         </w:rPr>
+        <w:lastRenderedPageBreak/>
         <w:t>{</w:t>
       </w:r>
     </w:p>
@@ -11209,7 +11912,6 @@
         <w:rPr>
           <w:sz w:val="18"/>
         </w:rPr>
-        <w:lastRenderedPageBreak/>
         <w:t>{</w:t>
       </w:r>
     </w:p>
@@ -11695,7 +12397,7 @@
       <w:pPr>
         <w:pStyle w:val="Titulo3Relatorio"/>
       </w:pPr>
-      <w:bookmarkStart w:id="20" w:name="_Toc200357414"/>
+      <w:bookmarkStart w:id="20" w:name="_Toc200360960"/>
       <w:r>
         <w:t>Algoritmo do site Programmiz</w:t>
       </w:r>
@@ -11725,7 +12427,6 @@
           <w:sz w:val="24"/>
           <w:szCs w:val="24"/>
         </w:rPr>
-        <w:lastRenderedPageBreak/>
         <w:t>swap</w:t>
       </w:r>
     </w:p>
@@ -11902,6 +12603,7 @@
           <w:sz w:val="24"/>
           <w:szCs w:val="24"/>
         </w:rPr>
+        <w:lastRenderedPageBreak/>
         <w:t>Em seguida, dentro desse procedimento t</w:t>
       </w:r>
       <w:r>
@@ -12346,16 +13048,7 @@
           <w:sz w:val="24"/>
           <w:szCs w:val="24"/>
         </w:rPr>
-        <w:t xml:space="preserve"> e outra </w:t>
-      </w:r>
-      <w:r>
-        <w:rPr>
-          <w:rFonts w:ascii="Times" w:eastAsiaTheme="minorEastAsia" w:hAnsi="Times" w:cs="Times"/>
-          <w:sz w:val="24"/>
-          <w:szCs w:val="24"/>
-        </w:rPr>
-        <w:lastRenderedPageBreak/>
-        <w:t xml:space="preserve">variável do mesmo tipo para indicar o índice para garantir que a subárvore com raiz </w:t>
+        <w:t xml:space="preserve"> e outra variável do mesmo tipo para indicar o índice para garantir que a subárvore com raiz </w:t>
       </w:r>
       <m:oMath>
         <m:r>
@@ -12604,7 +13297,16 @@
           <w:sz w:val="24"/>
           <w:szCs w:val="24"/>
         </w:rPr>
-        <w:t xml:space="preserve"> Tais equações são necessárias para emergir a árvore, ou seja</w:t>
+        <w:t xml:space="preserve"> </w:t>
+      </w:r>
+      <w:r>
+        <w:rPr>
+          <w:rFonts w:ascii="Times" w:eastAsiaTheme="minorEastAsia" w:hAnsi="Times" w:cs="Times"/>
+          <w:sz w:val="24"/>
+          <w:szCs w:val="24"/>
+        </w:rPr>
+        <w:lastRenderedPageBreak/>
+        <w:t>Tais equações são necessárias para emergir a árvore, ou seja</w:t>
       </w:r>
       <w:r>
         <w:rPr>
@@ -13410,8 +14112,80 @@
         <w:rPr>
           <w:sz w:val="16"/>
         </w:rPr>
+        <w:t xml:space="preserve">    long valor_maximo, posicao_esq, posicao_dir;</w:t>
+      </w:r>
+    </w:p>
+    <w:p>
+      <w:pPr>
+        <w:pStyle w:val="Codigo"/>
+        <w:rPr>
+          <w:sz w:val="16"/>
+        </w:rPr>
+      </w:pPr>
+    </w:p>
+    <w:p>
+      <w:pPr>
+        <w:pStyle w:val="Codigo"/>
+        <w:rPr>
+          <w:sz w:val="16"/>
+        </w:rPr>
+      </w:pPr>
+      <w:r>
+        <w:rPr>
+          <w:sz w:val="16"/>
+        </w:rPr>
+        <w:t xml:space="preserve">    valor_maximo = i;</w:t>
+      </w:r>
+    </w:p>
+    <w:p>
+      <w:pPr>
+        <w:pStyle w:val="Codigo"/>
+        <w:rPr>
+          <w:sz w:val="16"/>
+        </w:rPr>
+      </w:pPr>
+      <w:r>
+        <w:rPr>
+          <w:sz w:val="16"/>
+        </w:rPr>
+        <w:t xml:space="preserve">    posicao_esq = 2 * i + 1;</w:t>
+      </w:r>
+    </w:p>
+    <w:p>
+      <w:pPr>
+        <w:pStyle w:val="Codigo"/>
+        <w:rPr>
+          <w:sz w:val="16"/>
+        </w:rPr>
+      </w:pPr>
+      <w:r>
+        <w:rPr>
+          <w:sz w:val="16"/>
+        </w:rPr>
+        <w:t xml:space="preserve">    posicao_dir = 2 * i + 2;</w:t>
+      </w:r>
+    </w:p>
+    <w:p>
+      <w:pPr>
+        <w:pStyle w:val="Codigo"/>
+        <w:rPr>
+          <w:sz w:val="16"/>
+        </w:rPr>
+      </w:pPr>
+    </w:p>
+    <w:p>
+      <w:pPr>
+        <w:pStyle w:val="Codigo"/>
+        <w:rPr>
+          <w:sz w:val="16"/>
+        </w:rPr>
+      </w:pPr>
+      <w:r>
+        <w:rPr>
+          <w:sz w:val="16"/>
+        </w:rPr>
         <w:lastRenderedPageBreak/>
-        <w:t xml:space="preserve">    long valor_maximo, posicao_esq, posicao_dir;</w:t>
+        <w:t xml:space="preserve">    //se o valor da posicao_esq existir/for menor que o tamanho do array(enesima posicao)</w:t>
       </w:r>
     </w:p>
     <w:p>
@@ -13421,6 +14195,12 @@
           <w:sz w:val="16"/>
         </w:rPr>
       </w:pPr>
+      <w:r>
+        <w:rPr>
+          <w:sz w:val="16"/>
+        </w:rPr>
+        <w:t xml:space="preserve">    //e for maior que a raiz do array</w:t>
+      </w:r>
     </w:p>
     <w:p>
       <w:pPr>
@@ -13433,7 +14213,7 @@
         <w:rPr>
           <w:sz w:val="16"/>
         </w:rPr>
-        <w:t xml:space="preserve">    valor_maximo = i;</w:t>
+        <w:t xml:space="preserve">    if (posicao_esq &lt; n &amp;&amp; arr[posicao_esq] &gt; arr[valor_maximo])</w:t>
       </w:r>
     </w:p>
     <w:p>
@@ -13443,12 +14223,6 @@
           <w:sz w:val="16"/>
         </w:rPr>
       </w:pPr>
-      <w:r>
-        <w:rPr>
-          <w:sz w:val="16"/>
-        </w:rPr>
-        <w:t xml:space="preserve">    posicao_esq = 2 * i + 1;</w:t>
-      </w:r>
     </w:p>
     <w:p>
       <w:pPr>
@@ -13461,7 +14235,7 @@
         <w:rPr>
           <w:sz w:val="16"/>
         </w:rPr>
-        <w:t xml:space="preserve">    posicao_dir = 2 * i + 2;</w:t>
+        <w:t xml:space="preserve">        //a raiz da arvore sera atualizada pelo valor da posicao_esq</w:t>
       </w:r>
     </w:p>
     <w:p>
@@ -13471,6 +14245,12 @@
           <w:sz w:val="16"/>
         </w:rPr>
       </w:pPr>
+      <w:r>
+        <w:rPr>
+          <w:sz w:val="16"/>
+        </w:rPr>
+        <w:t xml:space="preserve">        valor_maximo = posicao_esq;</w:t>
+      </w:r>
     </w:p>
     <w:p>
       <w:pPr>
@@ -13479,12 +14259,6 @@
           <w:sz w:val="16"/>
         </w:rPr>
       </w:pPr>
-      <w:r>
-        <w:rPr>
-          <w:sz w:val="16"/>
-        </w:rPr>
-        <w:t xml:space="preserve">    //se o valor da posicao_esq existir/for menor que o tamanho do array(enesima posicao)</w:t>
-      </w:r>
     </w:p>
     <w:p>
       <w:pPr>
@@ -13497,6 +14271,20 @@
         <w:rPr>
           <w:sz w:val="16"/>
         </w:rPr>
+        <w:t xml:space="preserve">    //se o valor da posicao_dir existir/for menor que enesima posicao/o tamanho do array</w:t>
+      </w:r>
+    </w:p>
+    <w:p>
+      <w:pPr>
+        <w:pStyle w:val="Codigo"/>
+        <w:rPr>
+          <w:sz w:val="16"/>
+        </w:rPr>
+      </w:pPr>
+      <w:r>
+        <w:rPr>
+          <w:sz w:val="16"/>
+        </w:rPr>
         <w:t xml:space="preserve">    //e for maior que a raiz do array</w:t>
       </w:r>
     </w:p>
@@ -13511,7 +14299,7 @@
         <w:rPr>
           <w:sz w:val="16"/>
         </w:rPr>
-        <w:t xml:space="preserve">    if (posicao_esq &lt; n &amp;&amp; arr[posicao_esq] &gt; arr[valor_maximo])</w:t>
+        <w:t xml:space="preserve">    if (posicao_dir &lt; n &amp;&amp; arr[posicao_dir] &gt; arr[valor_maximo])</w:t>
       </w:r>
     </w:p>
     <w:p>
@@ -13533,7 +14321,7 @@
         <w:rPr>
           <w:sz w:val="16"/>
         </w:rPr>
-        <w:t xml:space="preserve">        //a raiz da arvore sera atualizada pelo valor da posicao_esq</w:t>
+        <w:t xml:space="preserve">        //a raiz da arvore sera atualizada pelo valor da posicao_dir</w:t>
       </w:r>
     </w:p>
     <w:p>
@@ -13547,7 +14335,7 @@
         <w:rPr>
           <w:sz w:val="16"/>
         </w:rPr>
-        <w:t xml:space="preserve">        valor_maximo = posicao_esq;</w:t>
+        <w:t xml:space="preserve">        valor_maximo = posicao_dir;</w:t>
       </w:r>
     </w:p>
     <w:p>
@@ -13569,7 +14357,20 @@
         <w:rPr>
           <w:sz w:val="16"/>
         </w:rPr>
-        <w:t xml:space="preserve">    //se o valor da posicao_dir existir/for menor que enesima posicao/o tamanho do array</w:t>
+        <w:t xml:space="preserve">    //se a raiz nao for o maior elemento(valor_maximo), prosseguir com swap(alternancia) e </w:t>
+      </w:r>
+      <w:r>
+        <w:rPr>
+          <w:i/>
+          <w:sz w:val="16"/>
+        </w:rPr>
+        <w:t>heap</w:t>
+      </w:r>
+      <w:r>
+        <w:rPr>
+          <w:sz w:val="16"/>
+        </w:rPr>
+        <w:t>ify(filtragem).</w:t>
       </w:r>
     </w:p>
     <w:p>
@@ -13583,7 +14384,7 @@
         <w:rPr>
           <w:sz w:val="16"/>
         </w:rPr>
-        <w:t xml:space="preserve">    //e for maior que a raiz do array</w:t>
+        <w:t xml:space="preserve">    if (valor_maximo != i) {</w:t>
       </w:r>
     </w:p>
     <w:p>
@@ -13593,12 +14394,6 @@
           <w:sz w:val="16"/>
         </w:rPr>
       </w:pPr>
-      <w:r>
-        <w:rPr>
-          <w:sz w:val="16"/>
-        </w:rPr>
-        <w:t xml:space="preserve">    if (posicao_dir &lt; n &amp;&amp; arr[posicao_dir] &gt; arr[valor_maximo])</w:t>
-      </w:r>
     </w:p>
     <w:p>
       <w:pPr>
@@ -13607,6 +14402,12 @@
           <w:sz w:val="16"/>
         </w:rPr>
       </w:pPr>
+      <w:r>
+        <w:rPr>
+          <w:sz w:val="16"/>
+        </w:rPr>
+        <w:t xml:space="preserve">        //temp valera uma determinada posicao do array</w:t>
+      </w:r>
     </w:p>
     <w:p>
       <w:pPr>
@@ -13619,7 +14420,7 @@
         <w:rPr>
           <w:sz w:val="16"/>
         </w:rPr>
-        <w:t xml:space="preserve">        //a raiz da arvore sera atualizada pelo valor da posicao_dir</w:t>
+        <w:t xml:space="preserve">        temp = arr[i];</w:t>
       </w:r>
     </w:p>
     <w:p>
@@ -13629,12 +14430,6 @@
           <w:sz w:val="16"/>
         </w:rPr>
       </w:pPr>
-      <w:r>
-        <w:rPr>
-          <w:sz w:val="16"/>
-        </w:rPr>
-        <w:t xml:space="preserve">        valor_maximo = posicao_dir;</w:t>
-      </w:r>
     </w:p>
     <w:p>
       <w:pPr>
@@ -13643,6 +14438,12 @@
           <w:sz w:val="16"/>
         </w:rPr>
       </w:pPr>
+      <w:r>
+        <w:rPr>
+          <w:sz w:val="16"/>
+        </w:rPr>
+        <w:t xml:space="preserve">        //alternara essa determinada posicao do array com a raiz</w:t>
+      </w:r>
     </w:p>
     <w:p>
       <w:pPr>
@@ -13655,7 +14456,43 @@
         <w:rPr>
           <w:sz w:val="16"/>
         </w:rPr>
-        <w:t xml:space="preserve">    //se a raiz nao for o maior elemento(valor_maximo), prosseguir com swap(alternancia) e </w:t>
+        <w:t xml:space="preserve">        swap(&amp;arr[i], &amp;arr[valor_maximo]);</w:t>
+      </w:r>
+    </w:p>
+    <w:p>
+      <w:pPr>
+        <w:pStyle w:val="Codigo"/>
+        <w:rPr>
+          <w:sz w:val="16"/>
+        </w:rPr>
+      </w:pPr>
+    </w:p>
+    <w:p>
+      <w:pPr>
+        <w:pStyle w:val="Codigo"/>
+        <w:rPr>
+          <w:sz w:val="16"/>
+        </w:rPr>
+      </w:pPr>
+      <w:r>
+        <w:rPr>
+          <w:sz w:val="16"/>
+        </w:rPr>
+        <w:t xml:space="preserve">        //e passara o array, o seu tamanho e raiz para filtrar</w:t>
+      </w:r>
+    </w:p>
+    <w:p>
+      <w:pPr>
+        <w:pStyle w:val="Codigo"/>
+        <w:rPr>
+          <w:sz w:val="16"/>
+        </w:rPr>
+      </w:pPr>
+      <w:r>
+        <w:rPr>
+          <w:sz w:val="16"/>
+        </w:rPr>
+        <w:t xml:space="preserve">        </w:t>
       </w:r>
       <w:r>
         <w:rPr>
@@ -13668,7 +14505,7 @@
         <w:rPr>
           <w:sz w:val="16"/>
         </w:rPr>
-        <w:t>ify(filtragem).</w:t>
+        <w:t>ify(arr, n, valor_maximo);</w:t>
       </w:r>
     </w:p>
     <w:p>
@@ -13682,7 +14519,7 @@
         <w:rPr>
           <w:sz w:val="16"/>
         </w:rPr>
-        <w:t xml:space="preserve">    if (valor_maximo != i) {</w:t>
+        <w:t xml:space="preserve">    }</w:t>
       </w:r>
     </w:p>
     <w:p>
@@ -13692,146 +14529,10 @@
           <w:sz w:val="16"/>
         </w:rPr>
       </w:pPr>
-    </w:p>
-    <w:p>
-      <w:pPr>
-        <w:pStyle w:val="Codigo"/>
-        <w:rPr>
-          <w:sz w:val="16"/>
-        </w:rPr>
-      </w:pPr>
-      <w:r>
-        <w:rPr>
-          <w:sz w:val="16"/>
-        </w:rPr>
-        <w:t xml:space="preserve">        //temp valera uma determinada posicao do array</w:t>
-      </w:r>
-    </w:p>
-    <w:p>
-      <w:pPr>
-        <w:pStyle w:val="Codigo"/>
-        <w:rPr>
-          <w:sz w:val="16"/>
-        </w:rPr>
-      </w:pPr>
-      <w:r>
-        <w:rPr>
-          <w:sz w:val="16"/>
-        </w:rPr>
-        <w:t xml:space="preserve">        temp = arr[i];</w:t>
-      </w:r>
-    </w:p>
-    <w:p>
-      <w:pPr>
-        <w:pStyle w:val="Codigo"/>
-        <w:rPr>
-          <w:sz w:val="16"/>
-        </w:rPr>
-      </w:pPr>
-    </w:p>
-    <w:p>
-      <w:pPr>
-        <w:pStyle w:val="Codigo"/>
-        <w:rPr>
-          <w:sz w:val="16"/>
-        </w:rPr>
-      </w:pPr>
-      <w:r>
-        <w:rPr>
-          <w:sz w:val="16"/>
-        </w:rPr>
-        <w:t xml:space="preserve">        //alternara essa determinada posicao do array com a raiz</w:t>
-      </w:r>
-    </w:p>
-    <w:p>
-      <w:pPr>
-        <w:pStyle w:val="Codigo"/>
-        <w:rPr>
-          <w:sz w:val="16"/>
-        </w:rPr>
-      </w:pPr>
-      <w:r>
-        <w:rPr>
-          <w:sz w:val="16"/>
-        </w:rPr>
-        <w:t xml:space="preserve">        swap(&amp;arr[i], &amp;arr[valor_maximo]);</w:t>
-      </w:r>
-    </w:p>
-    <w:p>
-      <w:pPr>
-        <w:pStyle w:val="Codigo"/>
-        <w:rPr>
-          <w:sz w:val="16"/>
-        </w:rPr>
-      </w:pPr>
-    </w:p>
-    <w:p>
-      <w:pPr>
-        <w:pStyle w:val="Codigo"/>
-        <w:rPr>
-          <w:sz w:val="16"/>
-        </w:rPr>
-      </w:pPr>
-      <w:r>
-        <w:rPr>
-          <w:sz w:val="16"/>
-        </w:rPr>
-        <w:t xml:space="preserve">        //e passara o array, o seu tamanho e raiz para filtrar</w:t>
-      </w:r>
-    </w:p>
-    <w:p>
-      <w:pPr>
-        <w:pStyle w:val="Codigo"/>
-        <w:rPr>
-          <w:sz w:val="16"/>
-        </w:rPr>
-      </w:pPr>
-      <w:r>
-        <w:rPr>
-          <w:sz w:val="16"/>
-        </w:rPr>
-        <w:t xml:space="preserve">        </w:t>
-      </w:r>
-      <w:r>
-        <w:rPr>
-          <w:i/>
-          <w:sz w:val="16"/>
-        </w:rPr>
-        <w:t>heap</w:t>
-      </w:r>
-      <w:r>
-        <w:rPr>
-          <w:sz w:val="16"/>
-        </w:rPr>
-        <w:t>ify(arr, n, valor_maximo);</w:t>
-      </w:r>
-    </w:p>
-    <w:p>
-      <w:pPr>
-        <w:pStyle w:val="Codigo"/>
-        <w:rPr>
-          <w:sz w:val="16"/>
-        </w:rPr>
-      </w:pPr>
-      <w:r>
-        <w:rPr>
-          <w:sz w:val="16"/>
-        </w:rPr>
-        <w:t xml:space="preserve">    }</w:t>
-      </w:r>
-    </w:p>
-    <w:p>
-      <w:pPr>
-        <w:pStyle w:val="Codigo"/>
-        <w:rPr>
-          <w:sz w:val="16"/>
-        </w:rPr>
-      </w:pPr>
-      <w:r>
-        <w:rPr>
-          <w:sz w:val="16"/>
-        </w:rPr>
-        <w:lastRenderedPageBreak/>
+      <w:r>
+        <w:rPr>
+          <w:sz w:val="16"/>
+        </w:rPr>
         <w:t>}</w:t>
       </w:r>
     </w:p>
@@ -14039,7 +14740,14 @@
         <w:rPr>
           <w:rFonts w:eastAsiaTheme="minorEastAsia"/>
         </w:rPr>
-        <w:t xml:space="preserve"> / 2 – 1. Já em sua condição intermediária, o laço será executado enquanto </w:t>
+        <w:t xml:space="preserve"> / 2 – 1. Já em sua condição </w:t>
+      </w:r>
+      <w:r>
+        <w:rPr>
+          <w:rFonts w:eastAsiaTheme="minorEastAsia"/>
+        </w:rPr>
+        <w:lastRenderedPageBreak/>
+        <w:t xml:space="preserve">intermediária, o laço será executado enquanto </w:t>
       </w:r>
       <m:oMath>
         <m:r>
@@ -14917,111 +15625,111 @@
         <w:rPr>
           <w:sz w:val="16"/>
         </w:rPr>
+        <w:t xml:space="preserve">        //alternando a raiz com uma determinada posicao do array</w:t>
+      </w:r>
+    </w:p>
+    <w:p>
+      <w:pPr>
+        <w:pStyle w:val="Codigo"/>
+        <w:rPr>
+          <w:sz w:val="16"/>
+        </w:rPr>
+      </w:pPr>
+      <w:r>
+        <w:rPr>
+          <w:sz w:val="16"/>
+        </w:rPr>
+        <w:t xml:space="preserve">        swap(&amp;arr[0], &amp;arr[i]);</w:t>
+      </w:r>
+    </w:p>
+    <w:p>
+      <w:pPr>
+        <w:pStyle w:val="Codigo"/>
+        <w:rPr>
+          <w:sz w:val="16"/>
+        </w:rPr>
+      </w:pPr>
+    </w:p>
+    <w:p>
+      <w:pPr>
+        <w:pStyle w:val="Codigo"/>
+        <w:rPr>
+          <w:sz w:val="16"/>
+        </w:rPr>
+      </w:pPr>
+      <w:r>
+        <w:rPr>
+          <w:sz w:val="16"/>
+        </w:rPr>
+        <w:t xml:space="preserve">        //aplicando </w:t>
+      </w:r>
+      <w:r>
+        <w:rPr>
+          <w:i/>
+          <w:sz w:val="16"/>
+        </w:rPr>
+        <w:t>heap</w:t>
+      </w:r>
+      <w:r>
+        <w:rPr>
+          <w:sz w:val="16"/>
+        </w:rPr>
+        <w:t>ify na raiz para que o maior elemento volte para a raiz.</w:t>
+      </w:r>
+    </w:p>
+    <w:p>
+      <w:pPr>
+        <w:pStyle w:val="Codigo"/>
+        <w:rPr>
+          <w:sz w:val="16"/>
+        </w:rPr>
+      </w:pPr>
+      <w:r>
+        <w:rPr>
+          <w:sz w:val="16"/>
+        </w:rPr>
+        <w:t xml:space="preserve">        </w:t>
+      </w:r>
+      <w:r>
+        <w:rPr>
+          <w:i/>
+          <w:sz w:val="16"/>
+        </w:rPr>
+        <w:t>heap</w:t>
+      </w:r>
+      <w:r>
+        <w:rPr>
+          <w:sz w:val="16"/>
+        </w:rPr>
+        <w:t>ify(arr, i, 0);</w:t>
+      </w:r>
+    </w:p>
+    <w:p>
+      <w:pPr>
+        <w:pStyle w:val="Codigo"/>
+        <w:rPr>
+          <w:sz w:val="16"/>
+        </w:rPr>
+      </w:pPr>
+      <w:r>
+        <w:rPr>
+          <w:sz w:val="16"/>
+        </w:rPr>
+        <w:t xml:space="preserve">    }</w:t>
+      </w:r>
+    </w:p>
+    <w:p>
+      <w:pPr>
+        <w:pStyle w:val="Codigo"/>
+        <w:rPr>
+          <w:sz w:val="16"/>
+        </w:rPr>
+      </w:pPr>
+      <w:r>
+        <w:rPr>
+          <w:sz w:val="16"/>
+        </w:rPr>
         <w:lastRenderedPageBreak/>
-        <w:t xml:space="preserve">        //alternando a raiz com uma determinada posicao do array</w:t>
-      </w:r>
-    </w:p>
-    <w:p>
-      <w:pPr>
-        <w:pStyle w:val="Codigo"/>
-        <w:rPr>
-          <w:sz w:val="16"/>
-        </w:rPr>
-      </w:pPr>
-      <w:r>
-        <w:rPr>
-          <w:sz w:val="16"/>
-        </w:rPr>
-        <w:t xml:space="preserve">        swap(&amp;arr[0], &amp;arr[i]);</w:t>
-      </w:r>
-    </w:p>
-    <w:p>
-      <w:pPr>
-        <w:pStyle w:val="Codigo"/>
-        <w:rPr>
-          <w:sz w:val="16"/>
-        </w:rPr>
-      </w:pPr>
-    </w:p>
-    <w:p>
-      <w:pPr>
-        <w:pStyle w:val="Codigo"/>
-        <w:rPr>
-          <w:sz w:val="16"/>
-        </w:rPr>
-      </w:pPr>
-      <w:r>
-        <w:rPr>
-          <w:sz w:val="16"/>
-        </w:rPr>
-        <w:t xml:space="preserve">        //aplicando </w:t>
-      </w:r>
-      <w:r>
-        <w:rPr>
-          <w:i/>
-          <w:sz w:val="16"/>
-        </w:rPr>
-        <w:t>heap</w:t>
-      </w:r>
-      <w:r>
-        <w:rPr>
-          <w:sz w:val="16"/>
-        </w:rPr>
-        <w:t>ify na raiz para que o maior elemento volte para a raiz.</w:t>
-      </w:r>
-    </w:p>
-    <w:p>
-      <w:pPr>
-        <w:pStyle w:val="Codigo"/>
-        <w:rPr>
-          <w:sz w:val="16"/>
-        </w:rPr>
-      </w:pPr>
-      <w:r>
-        <w:rPr>
-          <w:sz w:val="16"/>
-        </w:rPr>
-        <w:t xml:space="preserve">        </w:t>
-      </w:r>
-      <w:r>
-        <w:rPr>
-          <w:i/>
-          <w:sz w:val="16"/>
-        </w:rPr>
-        <w:t>heap</w:t>
-      </w:r>
-      <w:r>
-        <w:rPr>
-          <w:sz w:val="16"/>
-        </w:rPr>
-        <w:t>ify(arr, i, 0);</w:t>
-      </w:r>
-    </w:p>
-    <w:p>
-      <w:pPr>
-        <w:pStyle w:val="Codigo"/>
-        <w:rPr>
-          <w:sz w:val="16"/>
-        </w:rPr>
-      </w:pPr>
-      <w:r>
-        <w:rPr>
-          <w:sz w:val="16"/>
-        </w:rPr>
-        <w:t xml:space="preserve">    }</w:t>
-      </w:r>
-    </w:p>
-    <w:p>
-      <w:pPr>
-        <w:pStyle w:val="Codigo"/>
-        <w:rPr>
-          <w:sz w:val="16"/>
-        </w:rPr>
-      </w:pPr>
-      <w:r>
-        <w:rPr>
-          <w:sz w:val="16"/>
-        </w:rPr>
         <w:t>}</w:t>
       </w:r>
     </w:p>
@@ -15034,7 +15742,7 @@
       <w:pPr>
         <w:pStyle w:val="Titulo2Relatorio"/>
       </w:pPr>
-      <w:bookmarkStart w:id="21" w:name="_Toc200357415"/>
+      <w:bookmarkStart w:id="21" w:name="_Toc200360961"/>
       <w:r>
         <w:t>R</w:t>
       </w:r>
@@ -15104,7 +15812,7 @@
       <w:pPr>
         <w:pStyle w:val="Titulo3Relatorio"/>
       </w:pPr>
-      <w:bookmarkStart w:id="22" w:name="_Toc200357416"/>
+      <w:bookmarkStart w:id="22" w:name="_Toc200360962"/>
       <w:r>
         <w:t>Ordered Input</w:t>
       </w:r>
@@ -15180,7 +15888,6 @@
           <w:noProof/>
           <w:lang w:eastAsia="pt-BR"/>
         </w:rPr>
-        <w:lastRenderedPageBreak/>
         <w:drawing>
           <wp:inline distT="0" distB="0" distL="0" distR="0">
             <wp:extent cx="4138019" cy="3917020"/>
@@ -15197,7 +15904,7 @@
                     <pic:cNvPicPr/>
                   </pic:nvPicPr>
                   <pic:blipFill>
-                    <a:blip r:embed="rId10"/>
+                    <a:blip r:embed="rId14"/>
                     <a:stretch>
                       <a:fillRect/>
                     </a:stretch>
@@ -15400,7 +16107,11 @@
         <w:t>.</w:t>
       </w:r>
       <w:r>
-        <w:t xml:space="preserve"> Atuando de forma mais efetiva </w:t>
+        <w:t xml:space="preserve"> Atuando de forma </w:t>
+      </w:r>
+      <w:r>
+        <w:lastRenderedPageBreak/>
+        <w:t xml:space="preserve">mais efetiva </w:t>
       </w:r>
       <w:r>
         <w:t>quanto a</w:t>
@@ -15526,7 +16237,6 @@
           <w:noProof/>
           <w:lang w:eastAsia="pt-BR"/>
         </w:rPr>
-        <w:lastRenderedPageBreak/>
         <w:drawing>
           <wp:inline distT="0" distB="0" distL="0" distR="0">
             <wp:extent cx="5731510" cy="3683000"/>
@@ -15543,7 +16253,7 @@
                     <pic:cNvPicPr/>
                   </pic:nvPicPr>
                   <pic:blipFill>
-                    <a:blip r:embed="rId11"/>
+                    <a:blip r:embed="rId15"/>
                     <a:stretch>
                       <a:fillRect/>
                     </a:stretch>
@@ -15573,7 +16283,7 @@
       <w:pPr>
         <w:pStyle w:val="Titulo3Relatorio"/>
       </w:pPr>
-      <w:bookmarkStart w:id="23" w:name="_Toc200357417"/>
+      <w:bookmarkStart w:id="23" w:name="_Toc200360963"/>
       <w:r>
         <w:t>Reverse Ordered Input</w:t>
       </w:r>
@@ -15663,7 +16373,7 @@
                     <pic:cNvPicPr/>
                   </pic:nvPicPr>
                   <pic:blipFill>
-                    <a:blip r:embed="rId12"/>
+                    <a:blip r:embed="rId16"/>
                     <a:stretch>
                       <a:fillRect/>
                     </a:stretch>
@@ -15974,7 +16684,7 @@
                     <pic:cNvPicPr/>
                   </pic:nvPicPr>
                   <pic:blipFill>
-                    <a:blip r:embed="rId13"/>
+                    <a:blip r:embed="rId17"/>
                     <a:stretch>
                       <a:fillRect/>
                     </a:stretch>
@@ -15999,7 +16709,7 @@
       <w:pPr>
         <w:pStyle w:val="Titulo3Relatorio"/>
       </w:pPr>
-      <w:bookmarkStart w:id="24" w:name="_Toc200357418"/>
+      <w:bookmarkStart w:id="24" w:name="_Toc200360964"/>
       <w:r>
         <w:t>Uniform Input</w:t>
       </w:r>
@@ -16089,7 +16799,7 @@
                     <pic:cNvPicPr/>
                   </pic:nvPicPr>
                   <pic:blipFill>
-                    <a:blip r:embed="rId14"/>
+                    <a:blip r:embed="rId18"/>
                     <a:stretch>
                       <a:fillRect/>
                     </a:stretch>
@@ -16402,7 +17112,7 @@
                     <pic:cNvPicPr/>
                   </pic:nvPicPr>
                   <pic:blipFill>
-                    <a:blip r:embed="rId15"/>
+                    <a:blip r:embed="rId19"/>
                     <a:stretch>
                       <a:fillRect/>
                     </a:stretch>
@@ -16438,7 +17148,7 @@
           <w:szCs w:val="24"/>
         </w:rPr>
       </w:pPr>
-      <w:bookmarkStart w:id="25" w:name="_Toc200357419"/>
+      <w:bookmarkStart w:id="25" w:name="_Toc200360965"/>
       <w:r>
         <w:rPr>
           <w:rFonts w:ascii="Times" w:hAnsi="Times" w:cs="Times"/>
@@ -16565,7 +17275,7 @@
       <w:pPr>
         <w:pStyle w:val="Ttulo3"/>
       </w:pPr>
-      <w:bookmarkStart w:id="26" w:name="_Toc200357420"/>
+      <w:bookmarkStart w:id="26" w:name="_Toc200360966"/>
       <w:r>
         <w:t>Sistema Operacional</w:t>
       </w:r>
@@ -16648,7 +17358,7 @@
                     <pic:cNvPicPr/>
                   </pic:nvPicPr>
                   <pic:blipFill>
-                    <a:blip r:embed="rId16"/>
+                    <a:blip r:embed="rId20"/>
                     <a:stretch>
                       <a:fillRect/>
                     </a:stretch>
@@ -16676,7 +17386,7 @@
           <w:rFonts w:eastAsiaTheme="minorEastAsia"/>
         </w:rPr>
       </w:pPr>
-      <w:bookmarkStart w:id="27" w:name="_Toc200357421"/>
+      <w:bookmarkStart w:id="27" w:name="_Toc200360967"/>
       <w:r>
         <w:rPr>
           <w:rFonts w:eastAsiaTheme="minorEastAsia"/>
@@ -16746,7 +17456,7 @@
                     <pic:cNvPicPr/>
                   </pic:nvPicPr>
                   <pic:blipFill>
-                    <a:blip r:embed="rId17"/>
+                    <a:blip r:embed="rId21"/>
                     <a:stretch>
                       <a:fillRect/>
                     </a:stretch>
@@ -16781,7 +17491,7 @@
           <w:szCs w:val="24"/>
         </w:rPr>
       </w:pPr>
-      <w:bookmarkStart w:id="28" w:name="_Toc200357422"/>
+      <w:bookmarkStart w:id="28" w:name="_Toc200360968"/>
       <w:r>
         <w:rPr>
           <w:rFonts w:ascii="Times" w:hAnsi="Times" w:cs="Times"/>
@@ -16802,7 +17512,7 @@
           <w:szCs w:val="24"/>
         </w:rPr>
       </w:pPr>
-      <w:bookmarkStart w:id="29" w:name="_Toc200357423"/>
+      <w:bookmarkStart w:id="29" w:name="_Toc200360969"/>
       <w:r>
         <w:rPr>
           <w:rFonts w:ascii="Times" w:hAnsi="Times" w:cs="Times"/>
@@ -16858,7 +17568,7 @@
           <w:szCs w:val="24"/>
         </w:rPr>
       </w:pPr>
-      <w:bookmarkStart w:id="30" w:name="_Toc200357424"/>
+      <w:bookmarkStart w:id="30" w:name="_Toc200360970"/>
       <w:r>
         <w:rPr>
           <w:rFonts w:ascii="Times" w:hAnsi="Times" w:cs="Times"/>
@@ -16885,7 +17595,7 @@
           <w:szCs w:val="24"/>
         </w:rPr>
       </w:pPr>
-      <w:bookmarkStart w:id="31" w:name="_Toc200357425"/>
+      <w:bookmarkStart w:id="31" w:name="_Toc200360971"/>
       <w:r>
         <w:rPr>
           <w:rFonts w:ascii="Times" w:hAnsi="Times" w:cs="Times"/>
@@ -16939,7 +17649,7 @@
           <w:szCs w:val="24"/>
         </w:rPr>
       </w:pPr>
-      <w:hyperlink r:id="rId18" w:history="1">
+      <w:hyperlink r:id="rId22" w:history="1">
         <w:r>
           <w:rPr>
             <w:rStyle w:val="Hyperlink"/>
@@ -16972,7 +17682,7 @@
           <w:szCs w:val="24"/>
         </w:rPr>
       </w:pPr>
-      <w:hyperlink r:id="rId19" w:history="1">
+      <w:hyperlink r:id="rId23" w:history="1">
         <w:r>
           <w:rPr>
             <w:rStyle w:val="Hyperlink"/>
@@ -17014,7 +17724,7 @@
           <w:szCs w:val="24"/>
         </w:rPr>
       </w:pPr>
-      <w:hyperlink r:id="rId20" w:history="1">
+      <w:hyperlink r:id="rId24" w:history="1">
         <w:r>
           <w:rPr>
             <w:rStyle w:val="Hyperlink"/>
@@ -17056,7 +17766,7 @@
           <w:szCs w:val="24"/>
         </w:rPr>
       </w:pPr>
-      <w:hyperlink r:id="rId21" w:history="1">
+      <w:hyperlink r:id="rId25" w:history="1">
         <w:r>
           <w:rPr>
             <w:rStyle w:val="Hyperlink"/>
@@ -17125,7 +17835,7 @@
           <w:szCs w:val="24"/>
         </w:rPr>
       </w:pPr>
-      <w:hyperlink r:id="rId22" w:anchor="1725d7" w:history="1">
+      <w:hyperlink r:id="rId26" w:anchor="1725d7" w:history="1">
         <w:r>
           <w:rPr>
             <w:rStyle w:val="Hyperlink"/>
@@ -17142,7 +17852,7 @@
         <w:pStyle w:val="PargrafodaLista"/>
         <w:jc w:val="both"/>
       </w:pPr>
-      <w:hyperlink r:id="rId23" w:anchor="C" w:history="1">
+      <w:hyperlink r:id="rId27" w:anchor="C" w:history="1">
         <w:r>
           <w:rPr>
             <w:rStyle w:val="Hyperlink"/>
@@ -17169,7 +17879,7 @@
         <w:pStyle w:val="PargrafodaLista"/>
         <w:jc w:val="both"/>
       </w:pPr>
-      <w:hyperlink r:id="rId24" w:history="1">
+      <w:hyperlink r:id="rId28" w:history="1">
         <w:r>
           <w:rPr>
             <w:rStyle w:val="Hyperlink"/>
@@ -17190,7 +17900,7 @@
         <w:pStyle w:val="PargrafodaLista"/>
         <w:jc w:val="both"/>
       </w:pPr>
-      <w:hyperlink r:id="rId25" w:history="1">
+      <w:hyperlink r:id="rId29" w:history="1">
         <w:r>
           <w:rPr>
             <w:rStyle w:val="Hyperlink"/>
@@ -17216,13 +17926,8 @@
       <w:pPr>
         <w:pStyle w:val="PargrafodaLista"/>
         <w:jc w:val="both"/>
-        <w:rPr>
-          <w:rFonts w:ascii="Times" w:hAnsi="Times" w:cs="Times"/>
-          <w:sz w:val="24"/>
-          <w:szCs w:val="24"/>
-        </w:rPr>
-      </w:pPr>
-      <w:hyperlink r:id="rId26" w:history="1">
+      </w:pPr>
+      <w:hyperlink r:id="rId30" w:history="1">
         <w:r>
           <w:rPr>
             <w:rStyle w:val="Hyperlink"/>
@@ -17231,8 +17936,99 @@
         </w:r>
       </w:hyperlink>
     </w:p>
+    <w:p>
+      <w:pPr>
+        <w:pStyle w:val="PargrafodaLista"/>
+        <w:jc w:val="both"/>
+      </w:pPr>
+      <w:hyperlink r:id="rId31" w:history="1">
+        <w:r>
+          <w:rPr>
+            <w:rStyle w:val="Hyperlink"/>
+          </w:rPr>
+          <w:t>História da Computação | PETNews - O Algoritmo HeapSort</w:t>
+        </w:r>
+      </w:hyperlink>
+    </w:p>
+    <w:p>
+      <w:pPr>
+        <w:pStyle w:val="PargrafodaLista"/>
+        <w:jc w:val="both"/>
+        <w:rPr>
+          <w:rFonts w:ascii="Times" w:hAnsi="Times" w:cs="Times"/>
+          <w:sz w:val="24"/>
+          <w:szCs w:val="24"/>
+        </w:rPr>
+      </w:pPr>
+      <w:hyperlink r:id="rId32" w:history="1">
+        <w:r>
+          <w:rPr>
+            <w:rStyle w:val="Hyperlink"/>
+            <w:rFonts w:ascii="Times" w:hAnsi="Times" w:cs="Times"/>
+            <w:sz w:val="24"/>
+            <w:szCs w:val="24"/>
+          </w:rPr>
+          <w:t>http://www.dsc.ufcg.edu.br/~pet/jornal/maio2013/materias/historia_da_computacao.html</w:t>
+        </w:r>
+      </w:hyperlink>
+    </w:p>
+    <w:p>
+      <w:pPr>
+        <w:pStyle w:val="PargrafodaLista"/>
+        <w:jc w:val="both"/>
+        <w:rPr>
+          <w:rFonts w:ascii="Times" w:hAnsi="Times" w:cs="Times"/>
+          <w:sz w:val="24"/>
+          <w:szCs w:val="24"/>
+        </w:rPr>
+      </w:pPr>
+      <w:hyperlink r:id="rId33" w:history="1">
+        <w:r>
+          <w:rPr>
+            <w:rStyle w:val="Hyperlink"/>
+            <w:rFonts w:ascii="Times" w:hAnsi="Times" w:cs="Times"/>
+            <w:sz w:val="24"/>
+            <w:szCs w:val="24"/>
+          </w:rPr>
+          <w:t>http://www.dsc.ufcg.edu.br/~pet/jornal/maio2013/materias/historia_da_computacao.html</w:t>
+        </w:r>
+      </w:hyperlink>
+    </w:p>
+    <w:p>
+      <w:pPr>
+        <w:pStyle w:val="PargrafodaLista"/>
+        <w:jc w:val="both"/>
+        <w:rPr>
+          <w:rFonts w:ascii="Times" w:hAnsi="Times" w:cs="Times"/>
+          <w:sz w:val="24"/>
+          <w:szCs w:val="24"/>
+        </w:rPr>
+      </w:pPr>
+      <w:hyperlink r:id="rId34" w:history="1">
+        <w:r>
+          <w:rPr>
+            <w:rStyle w:val="Hyperlink"/>
+            <w:rFonts w:ascii="Times" w:hAnsi="Times" w:cs="Times"/>
+            <w:sz w:val="24"/>
+            <w:szCs w:val="24"/>
+          </w:rPr>
+          <w:t>http://www.dsc.ufcg.edu.br/~pet/jornal/maio2013/materias/historia_da_computacao.html</w:t>
+        </w:r>
+      </w:hyperlink>
+    </w:p>
+    <w:p>
+      <w:pPr>
+        <w:pStyle w:val="PargrafodaLista"/>
+        <w:jc w:val="both"/>
+        <w:rPr>
+          <w:rFonts w:ascii="Times" w:hAnsi="Times" w:cs="Times"/>
+          <w:sz w:val="24"/>
+          <w:szCs w:val="24"/>
+        </w:rPr>
+      </w:pPr>
+    </w:p>
     <w:sectPr>
-      <w:footerReference w:type="default" r:id="rId27"/>
+      <w:footerReference w:type="default" r:id="rId35"/>
       <w:pgSz w:w="11906" w:h="16838" w:code="9"/>
       <w:pgMar w:top="1440" w:right="1440" w:bottom="1440" w:left="1440" w:header="709" w:footer="709" w:gutter="0"/>
       <w:cols w:space="708"/>
@@ -17289,7 +18085,7 @@
             <w:rPr>
               <w:noProof/>
             </w:rPr>
-            <w:t>23</w:t>
+            <w:t>6</w:t>
           </w:r>
         </w:fldSimple>
       </w:p>
@@ -19100,9 +19896,8 @@
     <w:panose1 w:val="020B0604030504040204"/>
     <w:charset w:val="00"/>
     <w:family w:val="swiss"/>
-    <w:notTrueType/>
     <w:pitch w:val="variable"/>
-    <w:sig w:usb0="00000003" w:usb1="00000000" w:usb2="00000000" w:usb3="00000000" w:csb0="00000001" w:csb1="00000000"/>
+    <w:sig w:usb0="E1002EFF" w:usb1="C000605B" w:usb2="00000029" w:usb3="00000000" w:csb0="000101FF" w:csb1="00000000"/>
   </w:font>
   <w:font w:name="Cambria Math">
     <w:panose1 w:val="02040503050406030204"/>
@@ -19125,8 +19920,8 @@
   </w:compat>
   <w:rsids>
     <w:rsidRoot w:val="00915251"/>
-    <w:rsid w:val="000B6675"/>
     <w:rsid w:val="00915251"/>
+    <w:rsid w:val="00DC742F"/>
   </w:rsids>
   <m:mathPr>
     <m:mathFont m:val="Cambria Math"/>

</xml_diff>

<commit_message>
Alterando gráficos e tabelas do relatório.
</commit_message>
<xml_diff>
--- a/Relatorio_Equipe_HeapSort.docx
+++ b/Relatorio_Equipe_HeapSort.docx
@@ -351,7 +351,7 @@
             </w:rPr>
             <w:fldChar w:fldCharType="separate"/>
           </w:r>
-          <w:hyperlink w:anchor="_Toc200360940" w:history="1">
+          <w:hyperlink w:anchor="_Toc200362925" w:history="1">
             <w:r>
               <w:rPr>
                 <w:rStyle w:val="Hyperlink"/>
@@ -395,7 +395,7 @@
                 <w:noProof/>
                 <w:webHidden/>
               </w:rPr>
-              <w:instrText xml:space="preserve"> PAGEREF _Toc200360940 \h </w:instrText>
+              <w:instrText xml:space="preserve"> PAGEREF _Toc200362925 \h </w:instrText>
             </w:r>
             <w:r>
               <w:rPr>
@@ -438,7 +438,7 @@
               <w:lang w:eastAsia="pt-BR"/>
             </w:rPr>
           </w:pPr>
-          <w:hyperlink w:anchor="_Toc200360941" w:history="1">
+          <w:hyperlink w:anchor="_Toc200362926" w:history="1">
             <w:r>
               <w:rPr>
                 <w:rStyle w:val="Hyperlink"/>
@@ -466,7 +466,7 @@
                 <w:noProof/>
                 <w:webHidden/>
               </w:rPr>
-              <w:instrText xml:space="preserve"> PAGEREF _Toc200360941 \h </w:instrText>
+              <w:instrText xml:space="preserve"> PAGEREF _Toc200362926 \h </w:instrText>
             </w:r>
             <w:r>
               <w:rPr>
@@ -509,7 +509,7 @@
               <w:lang w:eastAsia="pt-BR"/>
             </w:rPr>
           </w:pPr>
-          <w:hyperlink w:anchor="_Toc200360942" w:history="1">
+          <w:hyperlink w:anchor="_Toc200362927" w:history="1">
             <w:r>
               <w:rPr>
                 <w:rStyle w:val="Hyperlink"/>
@@ -537,7 +537,7 @@
                 <w:noProof/>
                 <w:webHidden/>
               </w:rPr>
-              <w:instrText xml:space="preserve"> PAGEREF _Toc200360942 \h </w:instrText>
+              <w:instrText xml:space="preserve"> PAGEREF _Toc200362927 \h </w:instrText>
             </w:r>
             <w:r>
               <w:rPr>
@@ -580,7 +580,7 @@
               <w:lang w:eastAsia="pt-BR"/>
             </w:rPr>
           </w:pPr>
-          <w:hyperlink w:anchor="_Toc200360943" w:history="1">
+          <w:hyperlink w:anchor="_Toc200362928" w:history="1">
             <w:r>
               <w:rPr>
                 <w:rStyle w:val="Hyperlink"/>
@@ -608,7 +608,7 @@
                 <w:noProof/>
                 <w:webHidden/>
               </w:rPr>
-              <w:instrText xml:space="preserve"> PAGEREF _Toc200360943 \h </w:instrText>
+              <w:instrText xml:space="preserve"> PAGEREF _Toc200362928 \h </w:instrText>
             </w:r>
             <w:r>
               <w:rPr>
@@ -652,7 +652,7 @@
               <w:lang w:eastAsia="pt-BR"/>
             </w:rPr>
           </w:pPr>
-          <w:hyperlink w:anchor="_Toc200360944" w:history="1">
+          <w:hyperlink w:anchor="_Toc200362929" w:history="1">
             <w:r>
               <w:rPr>
                 <w:rStyle w:val="Hyperlink"/>
@@ -696,7 +696,7 @@
                 <w:noProof/>
                 <w:webHidden/>
               </w:rPr>
-              <w:instrText xml:space="preserve"> PAGEREF _Toc200360944 \h </w:instrText>
+              <w:instrText xml:space="preserve"> PAGEREF _Toc200362929 \h </w:instrText>
             </w:r>
             <w:r>
               <w:rPr>
@@ -739,7 +739,7 @@
               <w:lang w:eastAsia="pt-BR"/>
             </w:rPr>
           </w:pPr>
-          <w:hyperlink w:anchor="_Toc200360945" w:history="1">
+          <w:hyperlink w:anchor="_Toc200362930" w:history="1">
             <w:r>
               <w:rPr>
                 <w:rStyle w:val="Hyperlink"/>
@@ -767,7 +767,7 @@
                 <w:noProof/>
                 <w:webHidden/>
               </w:rPr>
-              <w:instrText xml:space="preserve"> PAGEREF _Toc200360945 \h </w:instrText>
+              <w:instrText xml:space="preserve"> PAGEREF _Toc200362930 \h </w:instrText>
             </w:r>
             <w:r>
               <w:rPr>
@@ -810,7 +810,7 @@
               <w:lang w:eastAsia="pt-BR"/>
             </w:rPr>
           </w:pPr>
-          <w:hyperlink w:anchor="_Toc200360946" w:history="1">
+          <w:hyperlink w:anchor="_Toc200362931" w:history="1">
             <w:r>
               <w:rPr>
                 <w:rStyle w:val="Hyperlink"/>
@@ -838,7 +838,7 @@
                 <w:noProof/>
                 <w:webHidden/>
               </w:rPr>
-              <w:instrText xml:space="preserve"> PAGEREF _Toc200360946 \h </w:instrText>
+              <w:instrText xml:space="preserve"> PAGEREF _Toc200362931 \h </w:instrText>
             </w:r>
             <w:r>
               <w:rPr>
@@ -881,7 +881,7 @@
               <w:lang w:eastAsia="pt-BR"/>
             </w:rPr>
           </w:pPr>
-          <w:hyperlink w:anchor="_Toc200360947" w:history="1">
+          <w:hyperlink w:anchor="_Toc200362932" w:history="1">
             <w:r>
               <w:rPr>
                 <w:rStyle w:val="Hyperlink"/>
@@ -908,7 +908,7 @@
                 <w:noProof/>
                 <w:webHidden/>
               </w:rPr>
-              <w:instrText xml:space="preserve"> PAGEREF _Toc200360947 \h </w:instrText>
+              <w:instrText xml:space="preserve"> PAGEREF _Toc200362932 \h </w:instrText>
             </w:r>
             <w:r>
               <w:rPr>
@@ -951,7 +951,7 @@
               <w:lang w:eastAsia="pt-BR"/>
             </w:rPr>
           </w:pPr>
-          <w:hyperlink w:anchor="_Toc200360948" w:history="1">
+          <w:hyperlink w:anchor="_Toc200362933" w:history="1">
             <w:r>
               <w:rPr>
                 <w:rStyle w:val="Hyperlink"/>
@@ -978,7 +978,7 @@
                 <w:noProof/>
                 <w:webHidden/>
               </w:rPr>
-              <w:instrText xml:space="preserve"> PAGEREF _Toc200360948 \h </w:instrText>
+              <w:instrText xml:space="preserve"> PAGEREF _Toc200362933 \h </w:instrText>
             </w:r>
             <w:r>
               <w:rPr>
@@ -1021,7 +1021,7 @@
               <w:lang w:eastAsia="pt-BR"/>
             </w:rPr>
           </w:pPr>
-          <w:hyperlink w:anchor="_Toc200360949" w:history="1">
+          <w:hyperlink w:anchor="_Toc200362934" w:history="1">
             <w:r>
               <w:rPr>
                 <w:rStyle w:val="Hyperlink"/>
@@ -1048,7 +1048,7 @@
                 <w:noProof/>
                 <w:webHidden/>
               </w:rPr>
-              <w:instrText xml:space="preserve"> PAGEREF _Toc200360949 \h </w:instrText>
+              <w:instrText xml:space="preserve"> PAGEREF _Toc200362934 \h </w:instrText>
             </w:r>
             <w:r>
               <w:rPr>
@@ -1091,13 +1091,13 @@
               <w:lang w:eastAsia="pt-BR"/>
             </w:rPr>
           </w:pPr>
-          <w:hyperlink w:anchor="_Toc200360950" w:history="1">
+          <w:hyperlink w:anchor="_Toc200362935" w:history="1">
             <w:r>
               <w:rPr>
                 <w:rStyle w:val="Hyperlink"/>
                 <w:noProof/>
               </w:rPr>
-              <w:t>Implementação de filas de prioridade.</w:t>
+              <w:t>Implementação de filas de prioridade. - F</w:t>
             </w:r>
             <w:r>
               <w:rPr>
@@ -1118,7 +1118,7 @@
                 <w:noProof/>
                 <w:webHidden/>
               </w:rPr>
-              <w:instrText xml:space="preserve"> PAGEREF _Toc200360950 \h </w:instrText>
+              <w:instrText xml:space="preserve"> PAGEREF _Toc200362935 \h </w:instrText>
             </w:r>
             <w:r>
               <w:rPr>
@@ -1161,13 +1161,13 @@
               <w:lang w:eastAsia="pt-BR"/>
             </w:rPr>
           </w:pPr>
-          <w:hyperlink w:anchor="_Toc200360951" w:history="1">
+          <w:hyperlink w:anchor="_Toc200362936" w:history="1">
             <w:r>
               <w:rPr>
                 <w:rStyle w:val="Hyperlink"/>
                 <w:noProof/>
               </w:rPr>
-              <w:t>Processamento de dados em fluxo</w:t>
+              <w:t>Processamento de dados em fluxo - F</w:t>
             </w:r>
             <w:r>
               <w:rPr>
@@ -1188,7 +1188,7 @@
                 <w:noProof/>
                 <w:webHidden/>
               </w:rPr>
-              <w:instrText xml:space="preserve"> PAGEREF _Toc200360951 \h </w:instrText>
+              <w:instrText xml:space="preserve"> PAGEREF _Toc200362936 \h </w:instrText>
             </w:r>
             <w:r>
               <w:rPr>
@@ -1231,13 +1231,13 @@
               <w:lang w:eastAsia="pt-BR"/>
             </w:rPr>
           </w:pPr>
-          <w:hyperlink w:anchor="_Toc200360952" w:history="1">
+          <w:hyperlink w:anchor="_Toc200362937" w:history="1">
             <w:r>
               <w:rPr>
                 <w:rStyle w:val="Hyperlink"/>
                 <w:noProof/>
               </w:rPr>
-              <w:t>Sistemas críticos</w:t>
+              <w:t>Sistemas críticos - F</w:t>
             </w:r>
             <w:r>
               <w:rPr>
@@ -1258,7 +1258,7 @@
                 <w:noProof/>
                 <w:webHidden/>
               </w:rPr>
-              <w:instrText xml:space="preserve"> PAGEREF _Toc200360952 \h </w:instrText>
+              <w:instrText xml:space="preserve"> PAGEREF _Toc200362937 \h </w:instrText>
             </w:r>
             <w:r>
               <w:rPr>
@@ -1301,7 +1301,7 @@
               <w:lang w:eastAsia="pt-BR"/>
             </w:rPr>
           </w:pPr>
-          <w:hyperlink w:anchor="_Toc200360953" w:history="1">
+          <w:hyperlink w:anchor="_Toc200362938" w:history="1">
             <w:r>
               <w:rPr>
                 <w:rStyle w:val="Hyperlink"/>
@@ -1328,7 +1328,7 @@
                 <w:noProof/>
                 <w:webHidden/>
               </w:rPr>
-              <w:instrText xml:space="preserve"> PAGEREF _Toc200360953 \h </w:instrText>
+              <w:instrText xml:space="preserve"> PAGEREF _Toc200362938 \h </w:instrText>
             </w:r>
             <w:r>
               <w:rPr>
@@ -1371,7 +1371,7 @@
               <w:lang w:eastAsia="pt-BR"/>
             </w:rPr>
           </w:pPr>
-          <w:hyperlink w:anchor="_Toc200360954" w:history="1">
+          <w:hyperlink w:anchor="_Toc200362939" w:history="1">
             <w:r>
               <w:rPr>
                 <w:rStyle w:val="Hyperlink"/>
@@ -1399,7 +1399,7 @@
                 <w:noProof/>
                 <w:webHidden/>
               </w:rPr>
-              <w:instrText xml:space="preserve"> PAGEREF _Toc200360954 \h </w:instrText>
+              <w:instrText xml:space="preserve"> PAGEREF _Toc200362939 \h </w:instrText>
             </w:r>
             <w:r>
               <w:rPr>
@@ -1442,7 +1442,7 @@
               <w:lang w:eastAsia="pt-BR"/>
             </w:rPr>
           </w:pPr>
-          <w:hyperlink w:anchor="_Toc200360955" w:history="1">
+          <w:hyperlink w:anchor="_Toc200362940" w:history="1">
             <w:r>
               <w:rPr>
                 <w:rStyle w:val="Hyperlink"/>
@@ -1470,7 +1470,7 @@
                 <w:noProof/>
                 <w:webHidden/>
               </w:rPr>
-              <w:instrText xml:space="preserve"> PAGEREF _Toc200360955 \h </w:instrText>
+              <w:instrText xml:space="preserve"> PAGEREF _Toc200362940 \h </w:instrText>
             </w:r>
             <w:r>
               <w:rPr>
@@ -1513,30 +1513,14 @@
               <w:lang w:eastAsia="pt-BR"/>
             </w:rPr>
           </w:pPr>
-          <w:hyperlink w:anchor="_Toc200360956" w:history="1">
+          <w:hyperlink w:anchor="_Toc200362941" w:history="1">
             <w:r>
               <w:rPr>
                 <w:rStyle w:val="Hyperlink"/>
                 <w:rFonts w:ascii="Times" w:hAnsi="Times" w:cs="Times"/>
                 <w:noProof/>
               </w:rPr>
-              <w:t>Exemplos de como o p</w:t>
-            </w:r>
-            <w:r>
-              <w:rPr>
-                <w:rStyle w:val="Hyperlink"/>
-                <w:rFonts w:ascii="Times" w:hAnsi="Times" w:cs="Times"/>
-                <w:noProof/>
-              </w:rPr>
-              <w:t>r</w:t>
-            </w:r>
-            <w:r>
-              <w:rPr>
-                <w:rStyle w:val="Hyperlink"/>
-                <w:rFonts w:ascii="Times" w:hAnsi="Times" w:cs="Times"/>
-                <w:noProof/>
-              </w:rPr>
-              <w:t>ocesso de ordenação acontece. - FALTA</w:t>
+              <w:t>Exemplos de Como O Processo de Ordenação Acontece.</w:t>
             </w:r>
             <w:r>
               <w:rPr>
@@ -1557,7 +1541,7 @@
                 <w:noProof/>
                 <w:webHidden/>
               </w:rPr>
-              <w:instrText xml:space="preserve"> PAGEREF _Toc200360956 \h </w:instrText>
+              <w:instrText xml:space="preserve"> PAGEREF _Toc200362941 \h </w:instrText>
             </w:r>
             <w:r>
               <w:rPr>
@@ -1601,7 +1585,7 @@
               <w:lang w:eastAsia="pt-BR"/>
             </w:rPr>
           </w:pPr>
-          <w:hyperlink w:anchor="_Toc200360957" w:history="1">
+          <w:hyperlink w:anchor="_Toc200362942" w:history="1">
             <w:r>
               <w:rPr>
                 <w:rStyle w:val="Hyperlink"/>
@@ -1645,7 +1629,7 @@
                 <w:noProof/>
                 <w:webHidden/>
               </w:rPr>
-              <w:instrText xml:space="preserve"> PAGEREF _Toc200360957 \h </w:instrText>
+              <w:instrText xml:space="preserve"> PAGEREF _Toc200362942 \h </w:instrText>
             </w:r>
             <w:r>
               <w:rPr>
@@ -1688,7 +1672,7 @@
               <w:lang w:eastAsia="pt-BR"/>
             </w:rPr>
           </w:pPr>
-          <w:hyperlink w:anchor="_Toc200360958" w:history="1">
+          <w:hyperlink w:anchor="_Toc200362943" w:history="1">
             <w:r>
               <w:rPr>
                 <w:rStyle w:val="Hyperlink"/>
@@ -1715,7 +1699,7 @@
                 <w:noProof/>
                 <w:webHidden/>
               </w:rPr>
-              <w:instrText xml:space="preserve"> PAGEREF _Toc200360958 \h </w:instrText>
+              <w:instrText xml:space="preserve"> PAGEREF _Toc200362943 \h </w:instrText>
             </w:r>
             <w:r>
               <w:rPr>
@@ -1758,7 +1742,7 @@
               <w:lang w:eastAsia="pt-BR"/>
             </w:rPr>
           </w:pPr>
-          <w:hyperlink w:anchor="_Toc200360959" w:history="1">
+          <w:hyperlink w:anchor="_Toc200362944" w:history="1">
             <w:r>
               <w:rPr>
                 <w:rStyle w:val="Hyperlink"/>
@@ -1785,7 +1769,7 @@
                 <w:noProof/>
                 <w:webHidden/>
               </w:rPr>
-              <w:instrText xml:space="preserve"> PAGEREF _Toc200360959 \h </w:instrText>
+              <w:instrText xml:space="preserve"> PAGEREF _Toc200362944 \h </w:instrText>
             </w:r>
             <w:r>
               <w:rPr>
@@ -1805,7 +1789,7 @@
                 <w:noProof/>
                 <w:webHidden/>
               </w:rPr>
-              <w:t>7</w:t>
+              <w:t>8</w:t>
             </w:r>
             <w:r>
               <w:rPr>
@@ -1828,7 +1812,7 @@
               <w:lang w:eastAsia="pt-BR"/>
             </w:rPr>
           </w:pPr>
-          <w:hyperlink w:anchor="_Toc200360960" w:history="1">
+          <w:hyperlink w:anchor="_Toc200362945" w:history="1">
             <w:r>
               <w:rPr>
                 <w:rStyle w:val="Hyperlink"/>
@@ -1855,7 +1839,7 @@
                 <w:noProof/>
                 <w:webHidden/>
               </w:rPr>
-              <w:instrText xml:space="preserve"> PAGEREF _Toc200360960 \h </w:instrText>
+              <w:instrText xml:space="preserve"> PAGEREF _Toc200362945 \h </w:instrText>
             </w:r>
             <w:r>
               <w:rPr>
@@ -1875,7 +1859,7 @@
                 <w:noProof/>
                 <w:webHidden/>
               </w:rPr>
-              <w:t>11</w:t>
+              <w:t>12</w:t>
             </w:r>
             <w:r>
               <w:rPr>
@@ -1898,7 +1882,7 @@
               <w:lang w:eastAsia="pt-BR"/>
             </w:rPr>
           </w:pPr>
-          <w:hyperlink w:anchor="_Toc200360961" w:history="1">
+          <w:hyperlink w:anchor="_Toc200362946" w:history="1">
             <w:r>
               <w:rPr>
                 <w:rStyle w:val="Hyperlink"/>
@@ -1925,7 +1909,7 @@
                 <w:noProof/>
                 <w:webHidden/>
               </w:rPr>
-              <w:instrText xml:space="preserve"> PAGEREF _Toc200360961 \h </w:instrText>
+              <w:instrText xml:space="preserve"> PAGEREF _Toc200362946 \h </w:instrText>
             </w:r>
             <w:r>
               <w:rPr>
@@ -1945,7 +1929,7 @@
                 <w:noProof/>
                 <w:webHidden/>
               </w:rPr>
-              <w:t>16</w:t>
+              <w:t>17</w:t>
             </w:r>
             <w:r>
               <w:rPr>
@@ -1968,7 +1952,7 @@
               <w:lang w:eastAsia="pt-BR"/>
             </w:rPr>
           </w:pPr>
-          <w:hyperlink w:anchor="_Toc200360962" w:history="1">
+          <w:hyperlink w:anchor="_Toc200362947" w:history="1">
             <w:r>
               <w:rPr>
                 <w:rStyle w:val="Hyperlink"/>
@@ -1995,7 +1979,7 @@
                 <w:noProof/>
                 <w:webHidden/>
               </w:rPr>
-              <w:instrText xml:space="preserve"> PAGEREF _Toc200360962 \h </w:instrText>
+              <w:instrText xml:space="preserve"> PAGEREF _Toc200362947 \h </w:instrText>
             </w:r>
             <w:r>
               <w:rPr>
@@ -2015,7 +1999,7 @@
                 <w:noProof/>
                 <w:webHidden/>
               </w:rPr>
-              <w:t>16</w:t>
+              <w:t>17</w:t>
             </w:r>
             <w:r>
               <w:rPr>
@@ -2038,7 +2022,7 @@
               <w:lang w:eastAsia="pt-BR"/>
             </w:rPr>
           </w:pPr>
-          <w:hyperlink w:anchor="_Toc200360963" w:history="1">
+          <w:hyperlink w:anchor="_Toc200362948" w:history="1">
             <w:r>
               <w:rPr>
                 <w:rStyle w:val="Hyperlink"/>
@@ -2065,7 +2049,7 @@
                 <w:noProof/>
                 <w:webHidden/>
               </w:rPr>
-              <w:instrText xml:space="preserve"> PAGEREF _Toc200360963 \h </w:instrText>
+              <w:instrText xml:space="preserve"> PAGEREF _Toc200362948 \h </w:instrText>
             </w:r>
             <w:r>
               <w:rPr>
@@ -2108,7 +2092,7 @@
               <w:lang w:eastAsia="pt-BR"/>
             </w:rPr>
           </w:pPr>
-          <w:hyperlink w:anchor="_Toc200360964" w:history="1">
+          <w:hyperlink w:anchor="_Toc200362949" w:history="1">
             <w:r>
               <w:rPr>
                 <w:rStyle w:val="Hyperlink"/>
@@ -2135,7 +2119,7 @@
                 <w:noProof/>
                 <w:webHidden/>
               </w:rPr>
-              <w:instrText xml:space="preserve"> PAGEREF _Toc200360964 \h </w:instrText>
+              <w:instrText xml:space="preserve"> PAGEREF _Toc200362949 \h </w:instrText>
             </w:r>
             <w:r>
               <w:rPr>
@@ -2178,7 +2162,7 @@
               <w:lang w:eastAsia="pt-BR"/>
             </w:rPr>
           </w:pPr>
-          <w:hyperlink w:anchor="_Toc200360965" w:history="1">
+          <w:hyperlink w:anchor="_Toc200362950" w:history="1">
             <w:r>
               <w:rPr>
                 <w:rStyle w:val="Hyperlink"/>
@@ -2206,7 +2190,7 @@
                 <w:noProof/>
                 <w:webHidden/>
               </w:rPr>
-              <w:instrText xml:space="preserve"> PAGEREF _Toc200360965 \h </w:instrText>
+              <w:instrText xml:space="preserve"> PAGEREF _Toc200362950 \h </w:instrText>
             </w:r>
             <w:r>
               <w:rPr>
@@ -2249,7 +2233,7 @@
               <w:lang w:eastAsia="pt-BR"/>
             </w:rPr>
           </w:pPr>
-          <w:hyperlink w:anchor="_Toc200360966" w:history="1">
+          <w:hyperlink w:anchor="_Toc200362951" w:history="1">
             <w:r>
               <w:rPr>
                 <w:rStyle w:val="Hyperlink"/>
@@ -2276,7 +2260,7 @@
                 <w:noProof/>
                 <w:webHidden/>
               </w:rPr>
-              <w:instrText xml:space="preserve"> PAGEREF _Toc200360966 \h </w:instrText>
+              <w:instrText xml:space="preserve"> PAGEREF _Toc200362951 \h </w:instrText>
             </w:r>
             <w:r>
               <w:rPr>
@@ -2319,7 +2303,7 @@
               <w:lang w:eastAsia="pt-BR"/>
             </w:rPr>
           </w:pPr>
-          <w:hyperlink w:anchor="_Toc200360967" w:history="1">
+          <w:hyperlink w:anchor="_Toc200362952" w:history="1">
             <w:r>
               <w:rPr>
                 <w:rStyle w:val="Hyperlink"/>
@@ -2346,7 +2330,7 @@
                 <w:noProof/>
                 <w:webHidden/>
               </w:rPr>
-              <w:instrText xml:space="preserve"> PAGEREF _Toc200360967 \h </w:instrText>
+              <w:instrText xml:space="preserve"> PAGEREF _Toc200362952 \h </w:instrText>
             </w:r>
             <w:r>
               <w:rPr>
@@ -2390,7 +2374,7 @@
               <w:lang w:eastAsia="pt-BR"/>
             </w:rPr>
           </w:pPr>
-          <w:hyperlink w:anchor="_Toc200360968" w:history="1">
+          <w:hyperlink w:anchor="_Toc200362953" w:history="1">
             <w:r>
               <w:rPr>
                 <w:rStyle w:val="Hyperlink"/>
@@ -2434,7 +2418,7 @@
                 <w:noProof/>
                 <w:webHidden/>
               </w:rPr>
-              <w:instrText xml:space="preserve"> PAGEREF _Toc200360968 \h </w:instrText>
+              <w:instrText xml:space="preserve"> PAGEREF _Toc200362953 \h </w:instrText>
             </w:r>
             <w:r>
               <w:rPr>
@@ -2477,7 +2461,7 @@
               <w:lang w:eastAsia="pt-BR"/>
             </w:rPr>
           </w:pPr>
-          <w:hyperlink w:anchor="_Toc200360969" w:history="1">
+          <w:hyperlink w:anchor="_Toc200362954" w:history="1">
             <w:r>
               <w:rPr>
                 <w:rStyle w:val="Hyperlink"/>
@@ -2505,7 +2489,7 @@
                 <w:noProof/>
                 <w:webHidden/>
               </w:rPr>
-              <w:instrText xml:space="preserve"> PAGEREF _Toc200360969 \h </w:instrText>
+              <w:instrText xml:space="preserve"> PAGEREF _Toc200362954 \h </w:instrText>
             </w:r>
             <w:r>
               <w:rPr>
@@ -2548,7 +2532,7 @@
               <w:lang w:eastAsia="pt-BR"/>
             </w:rPr>
           </w:pPr>
-          <w:hyperlink w:anchor="_Toc200360970" w:history="1">
+          <w:hyperlink w:anchor="_Toc200362955" w:history="1">
             <w:r>
               <w:rPr>
                 <w:rStyle w:val="Hyperlink"/>
@@ -2576,7 +2560,7 @@
                 <w:noProof/>
                 <w:webHidden/>
               </w:rPr>
-              <w:instrText xml:space="preserve"> PAGEREF _Toc200360970 \h </w:instrText>
+              <w:instrText xml:space="preserve"> PAGEREF _Toc200362955 \h </w:instrText>
             </w:r>
             <w:r>
               <w:rPr>
@@ -2620,7 +2604,7 @@
               <w:lang w:eastAsia="pt-BR"/>
             </w:rPr>
           </w:pPr>
-          <w:hyperlink w:anchor="_Toc200360971" w:history="1">
+          <w:hyperlink w:anchor="_Toc200362956" w:history="1">
             <w:r>
               <w:rPr>
                 <w:rStyle w:val="Hyperlink"/>
@@ -2664,7 +2648,7 @@
                 <w:noProof/>
                 <w:webHidden/>
               </w:rPr>
-              <w:instrText xml:space="preserve"> PAGEREF _Toc200360971 \h </w:instrText>
+              <w:instrText xml:space="preserve"> PAGEREF _Toc200362956 \h </w:instrText>
             </w:r>
             <w:r>
               <w:rPr>
@@ -2740,7 +2724,7 @@
           <w:szCs w:val="24"/>
         </w:rPr>
       </w:pPr>
-      <w:bookmarkStart w:id="0" w:name="_Toc200360940"/>
+      <w:bookmarkStart w:id="0" w:name="_Toc200362925"/>
       <w:r>
         <w:rPr>
           <w:rFonts w:ascii="Times" w:hAnsi="Times" w:cs="Times"/>
@@ -2761,7 +2745,7 @@
           <w:szCs w:val="24"/>
         </w:rPr>
       </w:pPr>
-      <w:bookmarkStart w:id="1" w:name="_Toc200360941"/>
+      <w:bookmarkStart w:id="1" w:name="_Toc200362926"/>
       <w:r>
         <w:rPr>
           <w:rFonts w:ascii="Times" w:hAnsi="Times" w:cs="Times"/>
@@ -2780,236 +2764,179 @@
         <w:t xml:space="preserve"> </w:t>
       </w:r>
       <w:r>
-        <w:t xml:space="preserve">A memória RAM (Random Access Memory), é </w:t>
-      </w:r>
-      <w:r>
-        <w:t xml:space="preserve">por sua vez </w:t>
-      </w:r>
-      <w:r>
-        <w:t xml:space="preserve">utilizada </w:t>
-      </w:r>
-      <w:r>
-        <w:t>a fim de armazenar</w:t>
-      </w:r>
-      <w:r>
-        <w:t xml:space="preserve"> dados te</w:t>
-      </w:r>
-      <w:r>
-        <w:t xml:space="preserve">mporários enquanto </w:t>
-      </w:r>
-      <w:r>
-        <w:t>a CPU (Central Processing Unit)</w:t>
-      </w:r>
-      <w:r>
-        <w:t xml:space="preserve"> é executada</w:t>
+        <w:t xml:space="preserve">A memória RAM (Random Access Memory), </w:t>
+      </w:r>
+      <w:r>
+        <w:t>tamb</w:t>
+      </w:r>
+      <w:r>
+        <w:t>é</w:t>
+      </w:r>
+      <w:r>
+        <w:t>m conhecida como memória primária, é</w:t>
+      </w:r>
+      <w:r>
+        <w:t xml:space="preserve"> por sua vez utilizada a fim de armazenar dados temporários enquanto a CPU (Central Processing Unit) é executada, ela é utilizada para garantir acesso rápido a informações baseando-se na execução de programas e processos executados no próprio sistema, a sua função possui um problema existente em relação a sua ordenação de processos, quando ordenar arquivos ou dados internos é necessário, pois fisicamente há um limite dentro da CPU, ao consider o tempo de comunicação e armazenamento de dados na RAM, ou durante o processamento da ordenação com o auxílio do processador da placa-mãe.</w:t>
+      </w:r>
+    </w:p>
+    <w:p>
+      <w:pPr>
+        <w:pStyle w:val="NormalRelatorio"/>
+      </w:pPr>
+      <w:r>
+        <w:t>Tais limitações, apresentam</w:t>
+      </w:r>
+      <w:r>
+        <w:t xml:space="preserve"> problemas em aplicações dentro de sistemas, como </w:t>
+      </w:r>
+      <w:r>
+        <w:t>tanto no ramo comercial de componentes</w:t>
+      </w:r>
+      <w:r>
+        <w:t xml:space="preserve"> eletrônicos, onde </w:t>
+      </w:r>
+      <w:r>
+        <w:t>é plausível</w:t>
+      </w:r>
+      <w:r>
+        <w:t xml:space="preserve"> ordenar listas por popularidade</w:t>
+      </w:r>
+      <w:r>
+        <w:t xml:space="preserve"> alta</w:t>
+      </w:r>
+      <w:r>
+        <w:t xml:space="preserve"> ou preço</w:t>
+      </w:r>
+      <w:r>
+        <w:t xml:space="preserve"> alto</w:t>
+      </w:r>
+      <w:r>
+        <w:t xml:space="preserve">, e </w:t>
+      </w:r>
+      <w:r>
+        <w:t>dentro de</w:t>
+      </w:r>
+      <w:r>
+        <w:t xml:space="preserve"> um sistema operacional, para inicializar </w:t>
+      </w:r>
+      <w:r>
+        <w:t xml:space="preserve">os procedimentos na CPU, deve </w:t>
+      </w:r>
+      <w:r>
+        <w:t>haver uma ordem pa</w:t>
+      </w:r>
+      <w:r>
+        <w:t xml:space="preserve">ra inicializar os programas </w:t>
+      </w:r>
+      <w:r>
+        <w:t>mais import</w:t>
+      </w:r>
+      <w:r>
+        <w:t>antes</w:t>
+      </w:r>
+      <w:r>
+        <w:t xml:space="preserve">. Além disso, </w:t>
+      </w:r>
+      <w:r>
+        <w:t>a definição</w:t>
+      </w:r>
+      <w:r>
+        <w:t xml:space="preserve"> </w:t>
+      </w:r>
+      <w:r>
+        <w:t>d</w:t>
+      </w:r>
+      <w:r>
+        <w:t>o que está em primeiro</w:t>
+      </w:r>
+      <w:r>
+        <w:t>, segundo ou terceiro plano é estritamente necessária</w:t>
+      </w:r>
+      <w:r>
+        <w:t>.</w:t>
+      </w:r>
+    </w:p>
+    <w:p>
+      <w:pPr>
+        <w:pStyle w:val="NormalRelatorio"/>
+      </w:pPr>
+      <w:r>
+        <w:t>A fim de facilitar a resolução destes problemas específicos</w:t>
+      </w:r>
+      <w:r>
+        <w:t>,</w:t>
+      </w:r>
+      <w:r>
+        <w:t xml:space="preserve"> ao longo da história</w:t>
+      </w:r>
+      <w:r>
+        <w:t xml:space="preserve"> </w:t>
+      </w:r>
+      <w:r>
+        <w:t xml:space="preserve">engenheiros, cientistas de dados e </w:t>
+      </w:r>
+      <w:r>
+        <w:t>e</w:t>
+      </w:r>
+      <w:r>
+        <w:t>ntusiasta</w:t>
+      </w:r>
+      <w:r>
+        <w:t xml:space="preserve">s da computação criaram algoritmos </w:t>
+      </w:r>
+      <w:r>
+        <w:t>capazes de</w:t>
+      </w:r>
+      <w:r>
+        <w:t xml:space="preserve"> </w:t>
+      </w:r>
+      <w:r>
+        <w:t>auxili</w:t>
+      </w:r>
+      <w:r>
+        <w:t>ar</w:t>
+      </w:r>
+      <w:r>
+        <w:t xml:space="preserve"> e</w:t>
+      </w:r>
+      <w:r>
+        <w:t xml:space="preserve"> tornar eficientes </w:t>
+      </w:r>
+      <w:r>
+        <w:t>a manipulação e conceituação d</w:t>
+      </w:r>
+      <w:r>
+        <w:t xml:space="preserve">essas ordenações, como o algoritmo </w:t>
+      </w:r>
+      <w:r>
+        <w:t>Heapsort</w:t>
       </w:r>
       <w:r>
         <w:t xml:space="preserve">, </w:t>
       </w:r>
       <w:r>
-        <w:t>ela</w:t>
-      </w:r>
-      <w:r>
-        <w:t xml:space="preserve"> é </w:t>
-      </w:r>
-      <w:r>
-        <w:t xml:space="preserve">utilizada para garantir </w:t>
-      </w:r>
-      <w:r>
-        <w:t xml:space="preserve">acesso rápido a informações </w:t>
-      </w:r>
-      <w:r>
-        <w:t>baseando-se na execução de programas e processos executados n</w:t>
-      </w:r>
-      <w:r>
-        <w:t xml:space="preserve">o próprio sistema, </w:t>
-      </w:r>
-      <w:r>
-        <w:t>a sua função possui um problema existente em relação a sua ordenação de processos</w:t>
-      </w:r>
-      <w:r>
-        <w:t xml:space="preserve">, </w:t>
-      </w:r>
-      <w:r>
-        <w:t>quando</w:t>
-      </w:r>
-      <w:r>
-        <w:t xml:space="preserve"> ordenar arquivos ou dados </w:t>
-      </w:r>
-      <w:r>
-        <w:t xml:space="preserve">internos é </w:t>
-      </w:r>
-      <w:r>
-        <w:t>necessário</w:t>
-      </w:r>
-      <w:r>
-        <w:t>, pois fisicamente há um limite dentro da CPU, ao consider</w:t>
+        <w:t>inicialmente conceituado e publicado</w:t>
+      </w:r>
+      <w:r>
+        <w:t xml:space="preserve"> por Robert W. Floyd em 1962 sob o nome Treesort</w:t>
+      </w:r>
+      <w:r>
+        <w:t>,</w:t>
       </w:r>
       <w:r>
         <w:t xml:space="preserve"> </w:t>
       </w:r>
       <w:r>
-        <w:t xml:space="preserve">o tempo </w:t>
-      </w:r>
-      <w:r>
-        <w:t>de comunicação e arm</w:t>
-      </w:r>
-      <w:r>
-        <w:t>azenamento de dados na RAM, ou durante o processamento da</w:t>
-      </w:r>
-      <w:r>
-        <w:t xml:space="preserve"> ordenação </w:t>
-      </w:r>
-      <w:r>
-        <w:t>com o auxílio do processador da placa-mãe.</w:t>
-      </w:r>
-    </w:p>
-    <w:p>
-      <w:pPr>
-        <w:pStyle w:val="NormalRelatorio"/>
-      </w:pPr>
-      <w:r>
-        <w:t>Tais limitações, apresentam</w:t>
-      </w:r>
-      <w:r>
-        <w:t xml:space="preserve"> problemas em aplicações dentro de sistemas, como </w:t>
-      </w:r>
-      <w:r>
-        <w:t>tanto no ramo comercial de componentes</w:t>
-      </w:r>
-      <w:r>
-        <w:t xml:space="preserve"> eletrônicos, onde </w:t>
-      </w:r>
-      <w:r>
-        <w:t>é plausível</w:t>
-      </w:r>
-      <w:r>
-        <w:t xml:space="preserve"> ordenar listas por popularidade</w:t>
-      </w:r>
-      <w:r>
-        <w:t xml:space="preserve"> alta</w:t>
-      </w:r>
-      <w:r>
-        <w:t xml:space="preserve"> ou preço</w:t>
-      </w:r>
-      <w:r>
-        <w:t xml:space="preserve"> alto</w:t>
-      </w:r>
-      <w:r>
-        <w:t xml:space="preserve">, e </w:t>
-      </w:r>
-      <w:r>
-        <w:t>dentro de</w:t>
-      </w:r>
-      <w:r>
-        <w:t xml:space="preserve"> um sistema operacional, para inicializar </w:t>
-      </w:r>
-      <w:r>
-        <w:t xml:space="preserve">os procedimentos na CPU, deve </w:t>
-      </w:r>
-      <w:r>
-        <w:t>haver uma ordem pa</w:t>
-      </w:r>
-      <w:r>
-        <w:t xml:space="preserve">ra inicializar os programas </w:t>
-      </w:r>
-      <w:r>
-        <w:t>mais import</w:t>
-      </w:r>
-      <w:r>
-        <w:t>antes</w:t>
-      </w:r>
-      <w:r>
-        <w:t xml:space="preserve">. Além disso, </w:t>
-      </w:r>
-      <w:r>
-        <w:t>a definição</w:t>
-      </w:r>
-      <w:r>
-        <w:t xml:space="preserve"> </w:t>
-      </w:r>
-      <w:r>
-        <w:t>d</w:t>
-      </w:r>
-      <w:r>
-        <w:t>o que está em primeiro</w:t>
-      </w:r>
-      <w:r>
-        <w:t>, segundo ou terceiro plano é estritamente necessária</w:t>
-      </w:r>
-      <w:r>
-        <w:t>.</w:t>
-      </w:r>
-    </w:p>
-    <w:p>
-      <w:pPr>
-        <w:pStyle w:val="NormalRelatorio"/>
-      </w:pPr>
-      <w:r>
-        <w:t>A fim de facilitar a resolução destes problemas específicos</w:t>
-      </w:r>
-      <w:r>
-        <w:t>,</w:t>
-      </w:r>
-      <w:r>
-        <w:t xml:space="preserve"> ao longo da história</w:t>
-      </w:r>
-      <w:r>
-        <w:t xml:space="preserve"> </w:t>
-      </w:r>
-      <w:r>
-        <w:t xml:space="preserve">engenheiros, cientistas de dados e </w:t>
+        <w:t>s</w:t>
       </w:r>
       <w:r>
         <w:t>e</w:t>
       </w:r>
       <w:r>
-        <w:t>ntusiasta</w:t>
-      </w:r>
-      <w:r>
-        <w:t xml:space="preserve">s da computação criaram algoritmos </w:t>
-      </w:r>
-      <w:r>
-        <w:t>capazes de</w:t>
-      </w:r>
-      <w:r>
-        <w:t xml:space="preserve"> </w:t>
-      </w:r>
-      <w:r>
-        <w:t>auxili</w:t>
-      </w:r>
-      <w:r>
-        <w:t>ar</w:t>
-      </w:r>
-      <w:r>
-        <w:t xml:space="preserve"> e</w:t>
-      </w:r>
-      <w:r>
-        <w:t xml:space="preserve"> tornar eficientes </w:t>
-      </w:r>
-      <w:r>
-        <w:t>a manipulação e conceituação d</w:t>
-      </w:r>
-      <w:r>
-        <w:t xml:space="preserve">essas ordenações, como o algoritmo </w:t>
-      </w:r>
-      <w:r>
-        <w:t>Heapsort</w:t>
-      </w:r>
-      <w:r>
-        <w:t xml:space="preserve">, </w:t>
-      </w:r>
-      <w:r>
-        <w:t xml:space="preserve">foi </w:t>
-      </w:r>
-      <w:r>
-        <w:t>inicialmente conceituado e publicado</w:t>
-      </w:r>
-      <w:r>
-        <w:t xml:space="preserve"> por Robert W. Floyd em 1962 sob o nome Treesort </w:t>
-      </w:r>
-      <w:r>
-        <w:t xml:space="preserve">e posteriormente melhorado e nomeado como Treesort 3 </w:t>
+        <w:t>ndo</w:t>
+      </w:r>
+      <w:r>
+        <w:t xml:space="preserve"> posteriormente melhorado e nomeado como Treesort 3 </w:t>
       </w:r>
       <w:r>
         <w:t xml:space="preserve">por </w:t>
@@ -3151,7 +3078,7 @@
           <w:szCs w:val="24"/>
         </w:rPr>
       </w:pPr>
-      <w:bookmarkStart w:id="2" w:name="_Toc200360942"/>
+      <w:bookmarkStart w:id="2" w:name="_Toc200362927"/>
       <w:r>
         <w:rPr>
           <w:rFonts w:ascii="Times" w:hAnsi="Times" w:cs="Times"/>
@@ -3191,7 +3118,7 @@
           <w:szCs w:val="24"/>
         </w:rPr>
       </w:pPr>
-      <w:bookmarkStart w:id="3" w:name="_Toc200360943"/>
+      <w:bookmarkStart w:id="3" w:name="_Toc200362928"/>
       <w:r>
         <w:rPr>
           <w:rFonts w:ascii="Times" w:hAnsi="Times" w:cs="Times"/>
@@ -3243,7 +3170,7 @@
           <w:szCs w:val="24"/>
         </w:rPr>
       </w:pPr>
-      <w:bookmarkStart w:id="4" w:name="_Toc200360944"/>
+      <w:bookmarkStart w:id="4" w:name="_Toc200362929"/>
       <w:r>
         <w:rPr>
           <w:rFonts w:ascii="Times" w:hAnsi="Times" w:cs="Times"/>
@@ -3288,7 +3215,7 @@
           <w:szCs w:val="24"/>
         </w:rPr>
       </w:pPr>
-      <w:bookmarkStart w:id="5" w:name="_Toc200360945"/>
+      <w:bookmarkStart w:id="5" w:name="_Toc200362930"/>
       <w:r>
         <w:rPr>
           <w:rFonts w:ascii="Times" w:hAnsi="Times" w:cs="Times"/>
@@ -3611,7 +3538,7 @@
         </w:rPr>
         <w:t xml:space="preserve"> </w:t>
       </w:r>
-      <w:bookmarkStart w:id="6" w:name="_Toc200360946"/>
+      <w:bookmarkStart w:id="6" w:name="_Toc200362931"/>
       <w:r>
         <w:rPr>
           <w:rFonts w:ascii="Times" w:hAnsi="Times" w:cs="Times"/>
@@ -6447,7 +6374,7 @@
       <w:pPr>
         <w:pStyle w:val="Titulo2Relatorio"/>
       </w:pPr>
-      <w:bookmarkStart w:id="7" w:name="_Toc200360947"/>
+      <w:bookmarkStart w:id="7" w:name="_Toc200362932"/>
       <w:r>
         <w:t xml:space="preserve">Melhores </w:t>
       </w:r>
@@ -6609,7 +6536,7 @@
       <w:pPr>
         <w:pStyle w:val="Titulo3Relatorio"/>
       </w:pPr>
-      <w:bookmarkStart w:id="8" w:name="_Toc200360948"/>
+      <w:bookmarkStart w:id="8" w:name="_Toc200362933"/>
       <w:r>
         <w:lastRenderedPageBreak/>
         <w:t>Aplicações com necessidade de garantia de tempo.</w:t>
@@ -6680,7 +6607,7 @@
       <w:pPr>
         <w:pStyle w:val="Titulo3Relatorio"/>
       </w:pPr>
-      <w:bookmarkStart w:id="9" w:name="_Toc200360949"/>
+      <w:bookmarkStart w:id="9" w:name="_Toc200362934"/>
       <w:r>
         <w:t>Ambientes com restrições de memória.</w:t>
       </w:r>
@@ -6746,46 +6673,46 @@
       <w:pPr>
         <w:pStyle w:val="Titulo3Relatorio"/>
       </w:pPr>
-      <w:bookmarkStart w:id="10" w:name="_Toc200360950"/>
+      <w:bookmarkStart w:id="10" w:name="_Toc200362935"/>
       <w:r>
         <w:t>Implementação de filas de prioridade.</w:t>
       </w:r>
+      <w:r>
+        <w:t xml:space="preserve"> - F</w:t>
+      </w:r>
       <w:bookmarkEnd w:id="10"/>
+    </w:p>
+    <w:p>
+      <w:pPr>
+        <w:pStyle w:val="Titulo3Relatorio"/>
+      </w:pPr>
+      <w:bookmarkStart w:id="11" w:name="_Toc200362936"/>
+      <w:r>
+        <w:t>Processamento de dados em fluxo</w:t>
+      </w:r>
       <w:r>
         <w:t xml:space="preserve"> - F</w:t>
       </w:r>
+      <w:bookmarkEnd w:id="11"/>
     </w:p>
     <w:p>
       <w:pPr>
         <w:pStyle w:val="Titulo3Relatorio"/>
       </w:pPr>
-      <w:bookmarkStart w:id="11" w:name="_Toc200360951"/>
-      <w:r>
-        <w:t>Processamento de dados em fluxo</w:t>
-      </w:r>
-      <w:bookmarkEnd w:id="11"/>
+      <w:bookmarkStart w:id="12" w:name="_Toc200362937"/>
+      <w:r>
+        <w:t>Sistemas críticos</w:t>
+      </w:r>
       <w:r>
         <w:t xml:space="preserve"> - F</w:t>
       </w:r>
+      <w:bookmarkEnd w:id="12"/>
     </w:p>
     <w:p>
       <w:pPr>
         <w:pStyle w:val="Titulo3Relatorio"/>
       </w:pPr>
-      <w:bookmarkStart w:id="12" w:name="_Toc200360952"/>
-      <w:r>
-        <w:t>Sistemas críticos</w:t>
-      </w:r>
-      <w:bookmarkEnd w:id="12"/>
-      <w:r>
-        <w:t xml:space="preserve"> - F</w:t>
-      </w:r>
-    </w:p>
-    <w:p>
-      <w:pPr>
-        <w:pStyle w:val="Titulo3Relatorio"/>
-      </w:pPr>
-      <w:bookmarkStart w:id="13" w:name="_Toc200360953"/>
+      <w:bookmarkStart w:id="13" w:name="_Toc200362938"/>
       <w:r>
         <w:t>Grandes volumes de dados</w:t>
       </w:r>
@@ -6833,7 +6760,7 @@
           <w:szCs w:val="24"/>
         </w:rPr>
       </w:pPr>
-      <w:bookmarkStart w:id="14" w:name="_Toc200360954"/>
+      <w:bookmarkStart w:id="14" w:name="_Toc200362939"/>
       <w:r>
         <w:rPr>
           <w:rFonts w:ascii="Times" w:hAnsi="Times" w:cs="Times"/>
@@ -7034,7 +6961,7 @@
           <w:szCs w:val="24"/>
         </w:rPr>
       </w:pPr>
-      <w:bookmarkStart w:id="15" w:name="_Toc200360955"/>
+      <w:bookmarkStart w:id="15" w:name="_Toc200362940"/>
       <w:r>
         <w:rPr>
           <w:rFonts w:ascii="Times" w:hAnsi="Times" w:cs="Times"/>
@@ -7314,7 +7241,7 @@
           <w:szCs w:val="24"/>
         </w:rPr>
       </w:pPr>
-      <w:bookmarkStart w:id="16" w:name="_Toc200360956"/>
+      <w:bookmarkStart w:id="16" w:name="_Toc200362941"/>
       <w:r>
         <w:rPr>
           <w:rFonts w:ascii="Times" w:hAnsi="Times" w:cs="Times"/>
@@ -7582,25 +7509,10 @@
         <w:rPr>
           <w:i/>
         </w:rPr>
-        <w:t>h</w:t>
-      </w:r>
-      <w:r>
-        <w:rPr>
-          <w:i/>
-        </w:rPr>
-        <w:t>eap</w:t>
-      </w:r>
-      <w:r>
-        <w:t xml:space="preserve"> é um vetor, pode</w:t>
-      </w:r>
-      <w:r>
-        <w:t>re</w:t>
-      </w:r>
-      <w:r>
-        <w:t>mos resumir o funcionamento do algoritmo ut</w:t>
-      </w:r>
-      <w:r>
-        <w:t>ilizando as seguintes considerações:</w:t>
+        <w:t>heap</w:t>
+      </w:r>
+      <w:r>
+        <w:t xml:space="preserve"> é um vetor, poderemos resumir o funcionamento do algoritmo utilizando as seguintes considerações:</w:t>
       </w:r>
     </w:p>
     <w:p>
@@ -7637,10 +7549,7 @@
         <w:t>Alterne-o</w:t>
       </w:r>
       <w:r>
-        <w:t xml:space="preserve"> com o ite</w:t>
-      </w:r>
-      <w:r>
-        <w:t xml:space="preserve">m da primeira posição do vetor (procedimento </w:t>
+        <w:t xml:space="preserve"> com o item da primeira posição do vetor (procedimento </w:t>
       </w:r>
       <w:r>
         <w:rPr>
@@ -7657,10 +7566,7 @@
         <w:pStyle w:val="NormalRelatorio"/>
       </w:pPr>
       <w:r>
-        <w:t>3. Repita estas operações com os (n – 1) itens restantes, depois com os (n – 2) itens, e assim sucessivamente</w:t>
-      </w:r>
-      <w:r>
-        <w:t xml:space="preserve"> (procedimento </w:t>
+        <w:t xml:space="preserve">3. Repita estas operações com os (n – 1) itens restantes, depois com os (n – 2) itens, e assim sucessivamente (procedimento </w:t>
       </w:r>
       <w:r>
         <w:rPr>
@@ -7669,10 +7575,7 @@
         <w:t>heapify</w:t>
       </w:r>
       <w:r>
-        <w:t>)</w:t>
-      </w:r>
-      <w:r>
-        <w:t>.</w:t>
+        <w:t>).</w:t>
       </w:r>
     </w:p>
     <w:p>
@@ -7689,7 +7592,7 @@
           <w:szCs w:val="24"/>
         </w:rPr>
       </w:pPr>
-      <w:bookmarkStart w:id="17" w:name="_Toc200360957"/>
+      <w:bookmarkStart w:id="17" w:name="_Toc200362942"/>
       <w:r>
         <w:rPr>
           <w:rFonts w:ascii="Times" w:hAnsi="Times" w:cs="Times"/>
@@ -7704,7 +7607,7 @@
       <w:pPr>
         <w:pStyle w:val="Titulo2Relatorio"/>
       </w:pPr>
-      <w:bookmarkStart w:id="18" w:name="_Toc200360958"/>
+      <w:bookmarkStart w:id="18" w:name="_Toc200362943"/>
       <w:r>
         <w:t>Detalhamento da implementação e decisões tomadas durante a construção do algoritmo.</w:t>
       </w:r>
@@ -7734,7 +7637,7 @@
       <w:pPr>
         <w:pStyle w:val="Titulo3Relatorio"/>
       </w:pPr>
-      <w:bookmarkStart w:id="19" w:name="_Toc200360959"/>
+      <w:bookmarkStart w:id="19" w:name="_Toc200362944"/>
       <w:r>
         <w:lastRenderedPageBreak/>
         <w:t>Algoritmo da obra Estrutura de Dados Usando C</w:t>
@@ -12397,7 +12300,7 @@
       <w:pPr>
         <w:pStyle w:val="Titulo3Relatorio"/>
       </w:pPr>
-      <w:bookmarkStart w:id="20" w:name="_Toc200360960"/>
+      <w:bookmarkStart w:id="20" w:name="_Toc200362945"/>
       <w:r>
         <w:t>Algoritmo do site Programmiz</w:t>
       </w:r>
@@ -15742,7 +15645,7 @@
       <w:pPr>
         <w:pStyle w:val="Titulo2Relatorio"/>
       </w:pPr>
-      <w:bookmarkStart w:id="21" w:name="_Toc200360961"/>
+      <w:bookmarkStart w:id="21" w:name="_Toc200362946"/>
       <w:r>
         <w:t>R</w:t>
       </w:r>
@@ -15812,7 +15715,7 @@
       <w:pPr>
         <w:pStyle w:val="Titulo3Relatorio"/>
       </w:pPr>
-      <w:bookmarkStart w:id="22" w:name="_Toc200360962"/>
+      <w:bookmarkStart w:id="22" w:name="_Toc200362947"/>
       <w:r>
         <w:t>Ordered Input</w:t>
       </w:r>
@@ -15890,7 +15793,7 @@
         </w:rPr>
         <w:drawing>
           <wp:inline distT="0" distB="0" distL="0" distR="0">
-            <wp:extent cx="4138019" cy="3917020"/>
+            <wp:extent cx="4138019" cy="3210212"/>
             <wp:effectExtent l="19050" t="0" r="0" b="0"/>
             <wp:docPr id="12" name="Imagem 11" descr="ordered_input.PNG"/>
             <wp:cNvGraphicFramePr>
@@ -15912,7 +15815,7 @@
                   <pic:spPr>
                     <a:xfrm>
                       <a:off x="0" y="0"/>
-                      <a:ext cx="4138019" cy="3917020"/>
+                      <a:ext cx="4138019" cy="3210212"/>
                     </a:xfrm>
                     <a:prstGeom prst="rect">
                       <a:avLst/>
@@ -16107,11 +16010,7 @@
         <w:t>.</w:t>
       </w:r>
       <w:r>
-        <w:t xml:space="preserve"> Atuando de forma </w:t>
-      </w:r>
-      <w:r>
-        <w:lastRenderedPageBreak/>
-        <w:t xml:space="preserve">mais efetiva </w:t>
+        <w:t xml:space="preserve"> Atuando de forma mais efetiva </w:t>
       </w:r>
       <w:r>
         <w:t>quanto a</w:t>
@@ -16237,9 +16136,10 @@
           <w:noProof/>
           <w:lang w:eastAsia="pt-BR"/>
         </w:rPr>
+        <w:lastRenderedPageBreak/>
         <w:drawing>
           <wp:inline distT="0" distB="0" distL="0" distR="0">
-            <wp:extent cx="5731510" cy="3683000"/>
+            <wp:extent cx="5731510" cy="3543983"/>
             <wp:effectExtent l="19050" t="0" r="2540" b="0"/>
             <wp:docPr id="15" name="Imagem 14" descr="ordered_input_grafico.PNG"/>
             <wp:cNvGraphicFramePr>
@@ -16261,7 +16161,7 @@
                   <pic:spPr>
                     <a:xfrm>
                       <a:off x="0" y="0"/>
-                      <a:ext cx="5731510" cy="3683000"/>
+                      <a:ext cx="5731510" cy="3543983"/>
                     </a:xfrm>
                     <a:prstGeom prst="rect">
                       <a:avLst/>
@@ -16283,7 +16183,7 @@
       <w:pPr>
         <w:pStyle w:val="Titulo3Relatorio"/>
       </w:pPr>
-      <w:bookmarkStart w:id="23" w:name="_Toc200360963"/>
+      <w:bookmarkStart w:id="23" w:name="_Toc200362948"/>
       <w:r>
         <w:t>Reverse Ordered Input</w:t>
       </w:r>
@@ -16359,7 +16259,7 @@
         <w:lastRenderedPageBreak/>
         <w:drawing>
           <wp:inline distT="0" distB="0" distL="0" distR="0">
-            <wp:extent cx="4221846" cy="3993226"/>
+            <wp:extent cx="4221846" cy="3277319"/>
             <wp:effectExtent l="19050" t="0" r="7254" b="0"/>
             <wp:docPr id="13" name="Imagem 12" descr="reversed_input.PNG"/>
             <wp:cNvGraphicFramePr>
@@ -16381,7 +16281,7 @@
                   <pic:spPr>
                     <a:xfrm>
                       <a:off x="0" y="0"/>
-                      <a:ext cx="4221846" cy="3993226"/>
+                      <a:ext cx="4221846" cy="3277319"/>
                     </a:xfrm>
                     <a:prstGeom prst="rect">
                       <a:avLst/>
@@ -16670,7 +16570,7 @@
         <w:lastRenderedPageBreak/>
         <w:drawing>
           <wp:inline distT="0" distB="0" distL="0" distR="0">
-            <wp:extent cx="5731510" cy="3684270"/>
+            <wp:extent cx="5731510" cy="3543983"/>
             <wp:effectExtent l="19050" t="0" r="2540" b="0"/>
             <wp:docPr id="16" name="Imagem 15" descr="reversed_input_grafico.PNG"/>
             <wp:cNvGraphicFramePr>
@@ -16692,7 +16592,7 @@
                   <pic:spPr>
                     <a:xfrm>
                       <a:off x="0" y="0"/>
-                      <a:ext cx="5731510" cy="3684270"/>
+                      <a:ext cx="5731510" cy="3543983"/>
                     </a:xfrm>
                     <a:prstGeom prst="rect">
                       <a:avLst/>
@@ -16709,7 +16609,7 @@
       <w:pPr>
         <w:pStyle w:val="Titulo3Relatorio"/>
       </w:pPr>
-      <w:bookmarkStart w:id="24" w:name="_Toc200360964"/>
+      <w:bookmarkStart w:id="24" w:name="_Toc200362949"/>
       <w:r>
         <w:t>Uniform Input</w:t>
       </w:r>
@@ -16782,10 +16682,9 @@
           <w:noProof/>
           <w:lang w:eastAsia="pt-BR"/>
         </w:rPr>
-        <w:lastRenderedPageBreak/>
         <w:drawing>
           <wp:inline distT="0" distB="0" distL="0" distR="0">
-            <wp:extent cx="4153260" cy="3977985"/>
+            <wp:extent cx="4153260" cy="3216434"/>
             <wp:effectExtent l="19050" t="0" r="0" b="0"/>
             <wp:docPr id="14" name="Imagem 13" descr="uniform_input.PNG"/>
             <wp:cNvGraphicFramePr>
@@ -16807,7 +16706,7 @@
                   <pic:spPr>
                     <a:xfrm>
                       <a:off x="0" y="0"/>
-                      <a:ext cx="4153260" cy="3977985"/>
+                      <a:ext cx="4153260" cy="3216434"/>
                     </a:xfrm>
                     <a:prstGeom prst="rect">
                       <a:avLst/>
@@ -16890,7 +16789,11 @@
         </m:func>
       </m:oMath>
       <w:r>
-        <w:t xml:space="preserve"> em todos os casos. O </w:t>
+        <w:t xml:space="preserve"> </w:t>
+      </w:r>
+      <w:r>
+        <w:lastRenderedPageBreak/>
+        <w:t xml:space="preserve">em todos os casos. O </w:t>
       </w:r>
       <w:r>
         <w:rPr>
@@ -17095,10 +16998,9 @@
           <w:noProof/>
           <w:lang w:eastAsia="pt-BR"/>
         </w:rPr>
-        <w:lastRenderedPageBreak/>
         <w:drawing>
           <wp:inline distT="0" distB="0" distL="0" distR="0">
-            <wp:extent cx="5731510" cy="3684270"/>
+            <wp:extent cx="5731510" cy="3543983"/>
             <wp:effectExtent l="19050" t="0" r="2540" b="0"/>
             <wp:docPr id="17" name="Imagem 16" descr="uniform_input_grafico.PNG"/>
             <wp:cNvGraphicFramePr>
@@ -17120,7 +17022,7 @@
                   <pic:spPr>
                     <a:xfrm>
                       <a:off x="0" y="0"/>
-                      <a:ext cx="5731510" cy="3684270"/>
+                      <a:ext cx="5731510" cy="3543983"/>
                     </a:xfrm>
                     <a:prstGeom prst="rect">
                       <a:avLst/>
@@ -17148,7 +17050,7 @@
           <w:szCs w:val="24"/>
         </w:rPr>
       </w:pPr>
-      <w:bookmarkStart w:id="25" w:name="_Toc200360965"/>
+      <w:bookmarkStart w:id="25" w:name="_Toc200362950"/>
       <w:r>
         <w:rPr>
           <w:rFonts w:ascii="Times" w:hAnsi="Times" w:cs="Times"/>
@@ -17275,7 +17177,7 @@
       <w:pPr>
         <w:pStyle w:val="Ttulo3"/>
       </w:pPr>
-      <w:bookmarkStart w:id="26" w:name="_Toc200360966"/>
+      <w:bookmarkStart w:id="26" w:name="_Toc200362951"/>
       <w:r>
         <w:t>Sistema Operacional</w:t>
       </w:r>
@@ -17310,7 +17212,11 @@
         <w:t>.</w:t>
       </w:r>
       <w:r>
-        <w:t xml:space="preserve"> Para identificá-lo, acessamos o programa “Informações do sistema”</w:t>
+        <w:t xml:space="preserve"> Para </w:t>
+      </w:r>
+      <w:r>
+        <w:lastRenderedPageBreak/>
+        <w:t>identificá-lo, acessamos o programa “Informações do sistema”</w:t>
       </w:r>
       <w:r>
         <w:t xml:space="preserve"> na barra de pesquisa do </w:t>
@@ -17341,7 +17247,6 @@
           <w:szCs w:val="24"/>
           <w:lang w:eastAsia="pt-BR"/>
         </w:rPr>
-        <w:lastRenderedPageBreak/>
         <w:drawing>
           <wp:inline distT="0" distB="0" distL="0" distR="0">
             <wp:extent cx="5731510" cy="3074670"/>
@@ -17386,7 +17291,7 @@
           <w:rFonts w:eastAsiaTheme="minorEastAsia"/>
         </w:rPr>
       </w:pPr>
-      <w:bookmarkStart w:id="27" w:name="_Toc200360967"/>
+      <w:bookmarkStart w:id="27" w:name="_Toc200362952"/>
       <w:r>
         <w:rPr>
           <w:rFonts w:eastAsiaTheme="minorEastAsia"/>
@@ -17440,6 +17345,7 @@
           <w:noProof/>
           <w:lang w:eastAsia="pt-BR"/>
         </w:rPr>
+        <w:lastRenderedPageBreak/>
         <w:drawing>
           <wp:inline distT="0" distB="0" distL="0" distR="0">
             <wp:extent cx="5731510" cy="3074670"/>
@@ -17491,7 +17397,7 @@
           <w:szCs w:val="24"/>
         </w:rPr>
       </w:pPr>
-      <w:bookmarkStart w:id="28" w:name="_Toc200360968"/>
+      <w:bookmarkStart w:id="28" w:name="_Toc200362953"/>
       <w:r>
         <w:rPr>
           <w:rFonts w:ascii="Times" w:hAnsi="Times" w:cs="Times"/>
@@ -17512,7 +17418,7 @@
           <w:szCs w:val="24"/>
         </w:rPr>
       </w:pPr>
-      <w:bookmarkStart w:id="29" w:name="_Toc200360969"/>
+      <w:bookmarkStart w:id="29" w:name="_Toc200362954"/>
       <w:r>
         <w:rPr>
           <w:rFonts w:ascii="Times" w:hAnsi="Times" w:cs="Times"/>
@@ -17568,19 +17474,60 @@
           <w:szCs w:val="24"/>
         </w:rPr>
       </w:pPr>
-      <w:bookmarkStart w:id="30" w:name="_Toc200360970"/>
-      <w:r>
-        <w:rPr>
-          <w:rFonts w:ascii="Times" w:hAnsi="Times" w:cs="Times"/>
-          <w:sz w:val="24"/>
-          <w:szCs w:val="24"/>
-        </w:rPr>
-        <w:lastRenderedPageBreak/>
+      <w:bookmarkStart w:id="30" w:name="_Toc200362955"/>
+      <w:r>
+        <w:rPr>
+          <w:rFonts w:ascii="Times" w:hAnsi="Times" w:cs="Times"/>
+          <w:sz w:val="24"/>
+          <w:szCs w:val="24"/>
+        </w:rPr>
         <w:t>Avaliar o desempenho do algoritmo em comparação com a implementação do Quicksort disponível na linguagem C.</w:t>
       </w:r>
       <w:bookmarkEnd w:id="30"/>
     </w:p>
-    <w:p/>
+    <w:p>
+      <w:pPr>
+        <w:pStyle w:val="NormalRelatorio"/>
+      </w:pPr>
+      <w:r>
+        <w:t>Através das tabelas e gráficos dos resultados dos testes, foi possível determinar o seguinte:</w:t>
+      </w:r>
+    </w:p>
+    <w:p>
+      <w:pPr>
+        <w:pStyle w:val="NormalRelatorio"/>
+        <w:numPr>
+          <w:ilvl w:val="0"/>
+          <w:numId w:val="10"/>
+        </w:numPr>
+      </w:pPr>
+      <w:r>
+        <w:t xml:space="preserve">Quando a entrada é ordenada, a complexidade de tempo do algoritmo de ordenação Insertionsort é </w:t>
+      </w:r>
+      <m:oMath>
+        <m:r>
+          <w:rPr>
+            <w:rFonts w:ascii="Cambria Math" w:hAnsi="Cambria Math"/>
+          </w:rPr>
+          <m:t>O(n)</m:t>
+        </m:r>
+      </m:oMath>
+      <w:r>
+        <w:rPr>
+          <w:rFonts w:eastAsiaTheme="minorEastAsia"/>
+        </w:rPr>
+        <w:t xml:space="preserve"> no melhor caso. Tornando-se um traço linear equiparado com as demais ordenações presentes no gráfico.</w:t>
+      </w:r>
+    </w:p>
+    <w:p>
+      <w:pPr>
+        <w:pStyle w:val="NormalRelatorio"/>
+        <w:numPr>
+          <w:ilvl w:val="0"/>
+          <w:numId w:val="10"/>
+        </w:numPr>
+      </w:pPr>
+    </w:p>
     <w:p>
       <w:pPr>
         <w:pStyle w:val="Ttulo1"/>
@@ -17595,7 +17542,7 @@
           <w:szCs w:val="24"/>
         </w:rPr>
       </w:pPr>
-      <w:bookmarkStart w:id="31" w:name="_Toc200360971"/>
+      <w:bookmarkStart w:id="31" w:name="_Toc200362956"/>
       <w:r>
         <w:rPr>
           <w:rFonts w:ascii="Times" w:hAnsi="Times" w:cs="Times"/>
@@ -18085,7 +18032,7 @@
             <w:rPr>
               <w:noProof/>
             </w:rPr>
-            <w:t>6</w:t>
+            <w:t>20</w:t>
           </w:r>
         </w:fldSimple>
       </w:p>
@@ -19921,7 +19868,6 @@
   <w:rsids>
     <w:rsidRoot w:val="00915251"/>
     <w:rsid w:val="00915251"/>
-    <w:rsid w:val="00DC742F"/>
   </w:rsids>
   <m:mathPr>
     <m:mathFont m:val="Cambria Math"/>

</xml_diff>

<commit_message>
Adicionando correcoes no relatório.
</commit_message>
<xml_diff>
--- a/Relatorio_Equipe_HeapSort.docx
+++ b/Relatorio_Equipe_HeapSort.docx
@@ -303,6 +303,17 @@
       <w:pPr>
         <w:spacing w:line="480" w:lineRule="auto"/>
       </w:pPr>
+    </w:p>
+    <w:p>
+      <w:r>
+        <w:br w:type="page"/>
+      </w:r>
+    </w:p>
+    <w:p>
+      <w:r>
+        <w:lastRenderedPageBreak/>
+        <w:br w:type="page"/>
+      </w:r>
     </w:p>
     <w:sdt>
       <w:sdtPr>
@@ -378,7 +389,7 @@
             </w:rPr>
             <w:fldChar w:fldCharType="separate"/>
           </w:r>
-          <w:hyperlink w:anchor="_Toc200386141" w:history="1">
+          <w:hyperlink w:anchor="_Toc200392619" w:history="1">
             <w:r>
               <w:rPr>
                 <w:rStyle w:val="Hyperlink"/>
@@ -422,7 +433,7 @@
                 <w:noProof/>
                 <w:webHidden/>
               </w:rPr>
-              <w:instrText xml:space="preserve"> PAGEREF _Toc200386141 \h </w:instrText>
+              <w:instrText xml:space="preserve"> PAGEREF _Toc200392619 \h </w:instrText>
             </w:r>
             <w:r>
               <w:rPr>
@@ -442,220 +453,7 @@
                 <w:noProof/>
                 <w:webHidden/>
               </w:rPr>
-              <w:t>2</w:t>
-            </w:r>
-            <w:r>
-              <w:rPr>
-                <w:noProof/>
-                <w:webHidden/>
-              </w:rPr>
-              <w:fldChar w:fldCharType="end"/>
-            </w:r>
-          </w:hyperlink>
-        </w:p>
-        <w:p>
-          <w:pPr>
-            <w:pStyle w:val="Sumrio2"/>
-            <w:tabs>
-              <w:tab w:val="right" w:leader="dot" w:pos="9016"/>
-            </w:tabs>
-            <w:rPr>
-              <w:rFonts w:eastAsiaTheme="minorEastAsia"/>
-              <w:noProof/>
-              <w:lang w:eastAsia="pt-BR"/>
-            </w:rPr>
-          </w:pPr>
-          <w:hyperlink w:anchor="_Toc200386142" w:history="1">
-            <w:r>
-              <w:rPr>
-                <w:rStyle w:val="Hyperlink"/>
-                <w:rFonts w:ascii="Times" w:hAnsi="Times" w:cs="Times"/>
-                <w:noProof/>
-              </w:rPr>
-              <w:t>Descrição do problema de ordenação em memória primária,</w:t>
-            </w:r>
-            <w:r>
-              <w:rPr>
-                <w:noProof/>
-                <w:webHidden/>
-              </w:rPr>
-              <w:tab/>
-            </w:r>
-            <w:r>
-              <w:rPr>
-                <w:noProof/>
-                <w:webHidden/>
-              </w:rPr>
-              <w:fldChar w:fldCharType="begin"/>
-            </w:r>
-            <w:r>
-              <w:rPr>
-                <w:noProof/>
-                <w:webHidden/>
-              </w:rPr>
-              <w:instrText xml:space="preserve"> PAGEREF _Toc200386142 \h </w:instrText>
-            </w:r>
-            <w:r>
-              <w:rPr>
-                <w:noProof/>
-                <w:webHidden/>
-              </w:rPr>
-            </w:r>
-            <w:r>
-              <w:rPr>
-                <w:noProof/>
-                <w:webHidden/>
-              </w:rPr>
-              <w:fldChar w:fldCharType="separate"/>
-            </w:r>
-            <w:r>
-              <w:rPr>
-                <w:noProof/>
-                <w:webHidden/>
-              </w:rPr>
-              <w:t>2</w:t>
-            </w:r>
-            <w:r>
-              <w:rPr>
-                <w:noProof/>
-                <w:webHidden/>
-              </w:rPr>
-              <w:fldChar w:fldCharType="end"/>
-            </w:r>
-          </w:hyperlink>
-        </w:p>
-        <w:p>
-          <w:pPr>
-            <w:pStyle w:val="Sumrio2"/>
-            <w:tabs>
-              <w:tab w:val="right" w:leader="dot" w:pos="9016"/>
-            </w:tabs>
-            <w:rPr>
-              <w:rFonts w:eastAsiaTheme="minorEastAsia"/>
-              <w:noProof/>
-              <w:lang w:eastAsia="pt-BR"/>
-            </w:rPr>
-          </w:pPr>
-          <w:hyperlink w:anchor="_Toc200386143" w:history="1">
-            <w:r>
-              <w:rPr>
-                <w:rStyle w:val="Hyperlink"/>
-                <w:rFonts w:ascii="Times" w:hAnsi="Times" w:cs="Times"/>
-                <w:noProof/>
-              </w:rPr>
-              <w:t>exemplos de aplicações onde o problema pode ser encontrado, - FALTA</w:t>
-            </w:r>
-            <w:r>
-              <w:rPr>
-                <w:noProof/>
-                <w:webHidden/>
-              </w:rPr>
-              <w:tab/>
-            </w:r>
-            <w:r>
-              <w:rPr>
-                <w:noProof/>
-                <w:webHidden/>
-              </w:rPr>
-              <w:fldChar w:fldCharType="begin"/>
-            </w:r>
-            <w:r>
-              <w:rPr>
-                <w:noProof/>
-                <w:webHidden/>
-              </w:rPr>
-              <w:instrText xml:space="preserve"> PAGEREF _Toc200386143 \h </w:instrText>
-            </w:r>
-            <w:r>
-              <w:rPr>
-                <w:noProof/>
-                <w:webHidden/>
-              </w:rPr>
-            </w:r>
-            <w:r>
-              <w:rPr>
-                <w:noProof/>
-                <w:webHidden/>
-              </w:rPr>
-              <w:fldChar w:fldCharType="separate"/>
-            </w:r>
-            <w:r>
-              <w:rPr>
-                <w:noProof/>
-                <w:webHidden/>
-              </w:rPr>
-              <w:t>3</w:t>
-            </w:r>
-            <w:r>
-              <w:rPr>
-                <w:noProof/>
-                <w:webHidden/>
-              </w:rPr>
-              <w:fldChar w:fldCharType="end"/>
-            </w:r>
-          </w:hyperlink>
-        </w:p>
-        <w:p>
-          <w:pPr>
-            <w:pStyle w:val="Sumrio2"/>
-            <w:tabs>
-              <w:tab w:val="right" w:leader="dot" w:pos="9016"/>
-            </w:tabs>
-            <w:rPr>
-              <w:rFonts w:eastAsiaTheme="minorEastAsia"/>
-              <w:noProof/>
-              <w:lang w:eastAsia="pt-BR"/>
-            </w:rPr>
-          </w:pPr>
-          <w:hyperlink w:anchor="_Toc200386144" w:history="1">
-            <w:r>
-              <w:rPr>
-                <w:rStyle w:val="Hyperlink"/>
-                <w:rFonts w:ascii="Times" w:hAnsi="Times" w:cs="Times"/>
-                <w:noProof/>
-              </w:rPr>
-              <w:t>citações dos principais algoritmos que solucionam o problema.</w:t>
-            </w:r>
-            <w:r>
-              <w:rPr>
-                <w:noProof/>
-                <w:webHidden/>
-              </w:rPr>
-              <w:tab/>
-            </w:r>
-            <w:r>
-              <w:rPr>
-                <w:noProof/>
-                <w:webHidden/>
-              </w:rPr>
-              <w:fldChar w:fldCharType="begin"/>
-            </w:r>
-            <w:r>
-              <w:rPr>
-                <w:noProof/>
-                <w:webHidden/>
-              </w:rPr>
-              <w:instrText xml:space="preserve"> PAGEREF _Toc200386144 \h </w:instrText>
-            </w:r>
-            <w:r>
-              <w:rPr>
-                <w:noProof/>
-                <w:webHidden/>
-              </w:rPr>
-            </w:r>
-            <w:r>
-              <w:rPr>
-                <w:noProof/>
-                <w:webHidden/>
-              </w:rPr>
-              <w:fldChar w:fldCharType="separate"/>
-            </w:r>
-            <w:r>
-              <w:rPr>
-                <w:noProof/>
-                <w:webHidden/>
-              </w:rPr>
-              <w:t>3</w:t>
+              <w:t>4</w:t>
             </w:r>
             <w:r>
               <w:rPr>
@@ -679,7 +477,7 @@
               <w:lang w:eastAsia="pt-BR"/>
             </w:rPr>
           </w:pPr>
-          <w:hyperlink w:anchor="_Toc200386145" w:history="1">
+          <w:hyperlink w:anchor="_Toc200392620" w:history="1">
             <w:r>
               <w:rPr>
                 <w:rStyle w:val="Hyperlink"/>
@@ -723,7 +521,7 @@
                 <w:noProof/>
                 <w:webHidden/>
               </w:rPr>
-              <w:instrText xml:space="preserve"> PAGEREF _Toc200386145 \h </w:instrText>
+              <w:instrText xml:space="preserve"> PAGEREF _Toc200392620 \h </w:instrText>
             </w:r>
             <w:r>
               <w:rPr>
@@ -743,7 +541,7 @@
                 <w:noProof/>
                 <w:webHidden/>
               </w:rPr>
-              <w:t>4</w:t>
+              <w:t>5</w:t>
             </w:r>
             <w:r>
               <w:rPr>
@@ -766,14 +564,14 @@
               <w:lang w:eastAsia="pt-BR"/>
             </w:rPr>
           </w:pPr>
-          <w:hyperlink w:anchor="_Toc200386146" w:history="1">
+          <w:hyperlink w:anchor="_Toc200392621" w:history="1">
             <w:r>
               <w:rPr>
                 <w:rStyle w:val="Hyperlink"/>
                 <w:rFonts w:ascii="Times" w:hAnsi="Times" w:cs="Times"/>
                 <w:noProof/>
               </w:rPr>
-              <w:t>Detalhamento do funcionamento do algoritmo.</w:t>
+              <w:t>Detalhamento Do Funcionamento Do Algoritmo.</w:t>
             </w:r>
             <w:r>
               <w:rPr>
@@ -794,7 +592,7 @@
                 <w:noProof/>
                 <w:webHidden/>
               </w:rPr>
-              <w:instrText xml:space="preserve"> PAGEREF _Toc200386146 \h </w:instrText>
+              <w:instrText xml:space="preserve"> PAGEREF _Toc200392621 \h </w:instrText>
             </w:r>
             <w:r>
               <w:rPr>
@@ -814,7 +612,7 @@
                 <w:noProof/>
                 <w:webHidden/>
               </w:rPr>
-              <w:t>4</w:t>
+              <w:t>5</w:t>
             </w:r>
             <w:r>
               <w:rPr>
@@ -837,14 +635,14 @@
               <w:lang w:eastAsia="pt-BR"/>
             </w:rPr>
           </w:pPr>
-          <w:hyperlink w:anchor="_Toc200386147" w:history="1">
+          <w:hyperlink w:anchor="_Toc200392622" w:history="1">
             <w:r>
               <w:rPr>
                 <w:rStyle w:val="Hyperlink"/>
                 <w:rFonts w:ascii="Times" w:hAnsi="Times" w:cs="Times"/>
                 <w:noProof/>
               </w:rPr>
-              <w:t>Análise da complexidade do algoritmo.</w:t>
+              <w:t>Análise Da Complexidade Do Algoritmo.</w:t>
             </w:r>
             <w:r>
               <w:rPr>
@@ -865,7 +663,7 @@
                 <w:noProof/>
                 <w:webHidden/>
               </w:rPr>
-              <w:instrText xml:space="preserve"> PAGEREF _Toc200386147 \h </w:instrText>
+              <w:instrText xml:space="preserve"> PAGEREF _Toc200392622 \h </w:instrText>
             </w:r>
             <w:r>
               <w:rPr>
@@ -885,7 +683,7 @@
                 <w:noProof/>
                 <w:webHidden/>
               </w:rPr>
-              <w:t>4</w:t>
+              <w:t>5</w:t>
             </w:r>
             <w:r>
               <w:rPr>
@@ -908,7 +706,7 @@
               <w:lang w:eastAsia="pt-BR"/>
             </w:rPr>
           </w:pPr>
-          <w:hyperlink w:anchor="_Toc200386148" w:history="1">
+          <w:hyperlink w:anchor="_Toc200392623" w:history="1">
             <w:r>
               <w:rPr>
                 <w:rStyle w:val="Hyperlink"/>
@@ -935,7 +733,7 @@
                 <w:noProof/>
                 <w:webHidden/>
               </w:rPr>
-              <w:instrText xml:space="preserve"> PAGEREF _Toc200386148 \h </w:instrText>
+              <w:instrText xml:space="preserve"> PAGEREF _Toc200392623 \h </w:instrText>
             </w:r>
             <w:r>
               <w:rPr>
@@ -955,7 +753,7 @@
                 <w:noProof/>
                 <w:webHidden/>
               </w:rPr>
-              <w:t>6</w:t>
+              <w:t>7</w:t>
             </w:r>
             <w:r>
               <w:rPr>
@@ -978,13 +776,13 @@
               <w:lang w:eastAsia="pt-BR"/>
             </w:rPr>
           </w:pPr>
-          <w:hyperlink w:anchor="_Toc200386149" w:history="1">
+          <w:hyperlink w:anchor="_Toc200392624" w:history="1">
             <w:r>
               <w:rPr>
                 <w:rStyle w:val="Hyperlink"/>
                 <w:noProof/>
               </w:rPr>
-              <w:t>Aplicações com necessidade de garantia de tempo.</w:t>
+              <w:t>Aplicações Com Necessidade De Garantia De Tempo.</w:t>
             </w:r>
             <w:r>
               <w:rPr>
@@ -1005,7 +803,7 @@
                 <w:noProof/>
                 <w:webHidden/>
               </w:rPr>
-              <w:instrText xml:space="preserve"> PAGEREF _Toc200386149 \h </w:instrText>
+              <w:instrText xml:space="preserve"> PAGEREF _Toc200392624 \h </w:instrText>
             </w:r>
             <w:r>
               <w:rPr>
@@ -1025,7 +823,7 @@
                 <w:noProof/>
                 <w:webHidden/>
               </w:rPr>
-              <w:t>6</w:t>
+              <w:t>8</w:t>
             </w:r>
             <w:r>
               <w:rPr>
@@ -1048,13 +846,13 @@
               <w:lang w:eastAsia="pt-BR"/>
             </w:rPr>
           </w:pPr>
-          <w:hyperlink w:anchor="_Toc200386150" w:history="1">
+          <w:hyperlink w:anchor="_Toc200392625" w:history="1">
             <w:r>
               <w:rPr>
                 <w:rStyle w:val="Hyperlink"/>
                 <w:noProof/>
               </w:rPr>
-              <w:t>Ambientes com restrições de memória.</w:t>
+              <w:t>Ambientes Com Restrições De Memória.</w:t>
             </w:r>
             <w:r>
               <w:rPr>
@@ -1075,7 +873,7 @@
                 <w:noProof/>
                 <w:webHidden/>
               </w:rPr>
-              <w:instrText xml:space="preserve"> PAGEREF _Toc200386150 \h </w:instrText>
+              <w:instrText xml:space="preserve"> PAGEREF _Toc200392625 \h </w:instrText>
             </w:r>
             <w:r>
               <w:rPr>
@@ -1095,7 +893,7 @@
                 <w:noProof/>
                 <w:webHidden/>
               </w:rPr>
-              <w:t>7</w:t>
+              <w:t>8</w:t>
             </w:r>
             <w:r>
               <w:rPr>
@@ -1118,7 +916,7 @@
               <w:lang w:eastAsia="pt-BR"/>
             </w:rPr>
           </w:pPr>
-          <w:hyperlink w:anchor="_Toc200386151" w:history="1">
+          <w:hyperlink w:anchor="_Toc200392626" w:history="1">
             <w:r>
               <w:rPr>
                 <w:rStyle w:val="Hyperlink"/>
@@ -1145,7 +943,7 @@
                 <w:noProof/>
                 <w:webHidden/>
               </w:rPr>
-              <w:instrText xml:space="preserve"> PAGEREF _Toc200386151 \h </w:instrText>
+              <w:instrText xml:space="preserve"> PAGEREF _Toc200392626 \h </w:instrText>
             </w:r>
             <w:r>
               <w:rPr>
@@ -1165,7 +963,7 @@
                 <w:noProof/>
                 <w:webHidden/>
               </w:rPr>
-              <w:t>7</w:t>
+              <w:t>8</w:t>
             </w:r>
             <w:r>
               <w:rPr>
@@ -1188,7 +986,7 @@
               <w:lang w:eastAsia="pt-BR"/>
             </w:rPr>
           </w:pPr>
-          <w:hyperlink w:anchor="_Toc200386152" w:history="1">
+          <w:hyperlink w:anchor="_Toc200392627" w:history="1">
             <w:r>
               <w:rPr>
                 <w:rStyle w:val="Hyperlink"/>
@@ -1215,7 +1013,7 @@
                 <w:noProof/>
                 <w:webHidden/>
               </w:rPr>
-              <w:instrText xml:space="preserve"> PAGEREF _Toc200386152 \h </w:instrText>
+              <w:instrText xml:space="preserve"> PAGEREF _Toc200392627 \h </w:instrText>
             </w:r>
             <w:r>
               <w:rPr>
@@ -1235,7 +1033,7 @@
                 <w:noProof/>
                 <w:webHidden/>
               </w:rPr>
-              <w:t>7</w:t>
+              <w:t>8</w:t>
             </w:r>
             <w:r>
               <w:rPr>
@@ -1258,7 +1056,7 @@
               <w:lang w:eastAsia="pt-BR"/>
             </w:rPr>
           </w:pPr>
-          <w:hyperlink w:anchor="_Toc200386153" w:history="1">
+          <w:hyperlink w:anchor="_Toc200392628" w:history="1">
             <w:r>
               <w:rPr>
                 <w:rStyle w:val="Hyperlink"/>
@@ -1285,7 +1083,7 @@
                 <w:noProof/>
                 <w:webHidden/>
               </w:rPr>
-              <w:instrText xml:space="preserve"> PAGEREF _Toc200386153 \h </w:instrText>
+              <w:instrText xml:space="preserve"> PAGEREF _Toc200392628 \h </w:instrText>
             </w:r>
             <w:r>
               <w:rPr>
@@ -1305,7 +1103,7 @@
                 <w:noProof/>
                 <w:webHidden/>
               </w:rPr>
-              <w:t>7</w:t>
+              <w:t>8</w:t>
             </w:r>
             <w:r>
               <w:rPr>
@@ -1328,13 +1126,13 @@
               <w:lang w:eastAsia="pt-BR"/>
             </w:rPr>
           </w:pPr>
-          <w:hyperlink w:anchor="_Toc200386154" w:history="1">
+          <w:hyperlink w:anchor="_Toc200392629" w:history="1">
             <w:r>
               <w:rPr>
                 <w:rStyle w:val="Hyperlink"/>
                 <w:noProof/>
               </w:rPr>
-              <w:t>Grandes volumes de dados</w:t>
+              <w:t>Grandes Volumes De Dados</w:t>
             </w:r>
             <w:r>
               <w:rPr>
@@ -1355,7 +1153,7 @@
                 <w:noProof/>
                 <w:webHidden/>
               </w:rPr>
-              <w:instrText xml:space="preserve"> PAGEREF _Toc200386154 \h </w:instrText>
+              <w:instrText xml:space="preserve"> PAGEREF _Toc200392629 \h </w:instrText>
             </w:r>
             <w:r>
               <w:rPr>
@@ -1375,7 +1173,7 @@
                 <w:noProof/>
                 <w:webHidden/>
               </w:rPr>
-              <w:t>7</w:t>
+              <w:t>8</w:t>
             </w:r>
             <w:r>
               <w:rPr>
@@ -1398,14 +1196,14 @@
               <w:lang w:eastAsia="pt-BR"/>
             </w:rPr>
           </w:pPr>
-          <w:hyperlink w:anchor="_Toc200386155" w:history="1">
+          <w:hyperlink w:anchor="_Toc200392630" w:history="1">
             <w:r>
               <w:rPr>
                 <w:rStyle w:val="Hyperlink"/>
                 <w:rFonts w:ascii="Times" w:hAnsi="Times" w:cs="Times"/>
                 <w:noProof/>
               </w:rPr>
-              <w:t>Estabilidade do algoritmo.</w:t>
+              <w:t>Estabilidade Do Algoritmo.</w:t>
             </w:r>
             <w:r>
               <w:rPr>
@@ -1426,7 +1224,7 @@
                 <w:noProof/>
                 <w:webHidden/>
               </w:rPr>
-              <w:instrText xml:space="preserve"> PAGEREF _Toc200386155 \h </w:instrText>
+              <w:instrText xml:space="preserve"> PAGEREF _Toc200392630 \h </w:instrText>
             </w:r>
             <w:r>
               <w:rPr>
@@ -1446,7 +1244,7 @@
                 <w:noProof/>
                 <w:webHidden/>
               </w:rPr>
-              <w:t>7</w:t>
+              <w:t>9</w:t>
             </w:r>
             <w:r>
               <w:rPr>
@@ -1469,14 +1267,14 @@
               <w:lang w:eastAsia="pt-BR"/>
             </w:rPr>
           </w:pPr>
-          <w:hyperlink w:anchor="_Toc200386156" w:history="1">
+          <w:hyperlink w:anchor="_Toc200392631" w:history="1">
             <w:r>
               <w:rPr>
                 <w:rStyle w:val="Hyperlink"/>
                 <w:rFonts w:ascii="Times" w:hAnsi="Times" w:cs="Times"/>
                 <w:noProof/>
               </w:rPr>
-              <w:t>Limitações do algoritmo.</w:t>
+              <w:t>Limitações Do Algoritmo.</w:t>
             </w:r>
             <w:r>
               <w:rPr>
@@ -1497,7 +1295,7 @@
                 <w:noProof/>
                 <w:webHidden/>
               </w:rPr>
-              <w:instrText xml:space="preserve"> PAGEREF _Toc200386156 \h </w:instrText>
+              <w:instrText xml:space="preserve"> PAGEREF _Toc200392631 \h </w:instrText>
             </w:r>
             <w:r>
               <w:rPr>
@@ -1517,7 +1315,7 @@
                 <w:noProof/>
                 <w:webHidden/>
               </w:rPr>
-              <w:t>7</w:t>
+              <w:t>9</w:t>
             </w:r>
             <w:r>
               <w:rPr>
@@ -1540,7 +1338,7 @@
               <w:lang w:eastAsia="pt-BR"/>
             </w:rPr>
           </w:pPr>
-          <w:hyperlink w:anchor="_Toc200386157" w:history="1">
+          <w:hyperlink w:anchor="_Toc200392632" w:history="1">
             <w:r>
               <w:rPr>
                 <w:rStyle w:val="Hyperlink"/>
@@ -1568,7 +1366,7 @@
                 <w:noProof/>
                 <w:webHidden/>
               </w:rPr>
-              <w:instrText xml:space="preserve"> PAGEREF _Toc200386157 \h </w:instrText>
+              <w:instrText xml:space="preserve"> PAGEREF _Toc200392632 \h </w:instrText>
             </w:r>
             <w:r>
               <w:rPr>
@@ -1588,7 +1386,7 @@
                 <w:noProof/>
                 <w:webHidden/>
               </w:rPr>
-              <w:t>8</w:t>
+              <w:t>9</w:t>
             </w:r>
             <w:r>
               <w:rPr>
@@ -1612,7 +1410,7 @@
               <w:lang w:eastAsia="pt-BR"/>
             </w:rPr>
           </w:pPr>
-          <w:hyperlink w:anchor="_Toc200386158" w:history="1">
+          <w:hyperlink w:anchor="_Toc200392633" w:history="1">
             <w:r>
               <w:rPr>
                 <w:rStyle w:val="Hyperlink"/>
@@ -1656,7 +1454,7 @@
                 <w:noProof/>
                 <w:webHidden/>
               </w:rPr>
-              <w:instrText xml:space="preserve"> PAGEREF _Toc200386158 \h </w:instrText>
+              <w:instrText xml:space="preserve"> PAGEREF _Toc200392633 \h </w:instrText>
             </w:r>
             <w:r>
               <w:rPr>
@@ -1676,7 +1474,7 @@
                 <w:noProof/>
                 <w:webHidden/>
               </w:rPr>
-              <w:t>9</w:t>
+              <w:t>11</w:t>
             </w:r>
             <w:r>
               <w:rPr>
@@ -1699,7 +1497,7 @@
               <w:lang w:eastAsia="pt-BR"/>
             </w:rPr>
           </w:pPr>
-          <w:hyperlink w:anchor="_Toc200386159" w:history="1">
+          <w:hyperlink w:anchor="_Toc200392634" w:history="1">
             <w:r>
               <w:rPr>
                 <w:rStyle w:val="Hyperlink"/>
@@ -1726,7 +1524,7 @@
                 <w:noProof/>
                 <w:webHidden/>
               </w:rPr>
-              <w:instrText xml:space="preserve"> PAGEREF _Toc200386159 \h </w:instrText>
+              <w:instrText xml:space="preserve"> PAGEREF _Toc200392634 \h </w:instrText>
             </w:r>
             <w:r>
               <w:rPr>
@@ -1746,7 +1544,7 @@
                 <w:noProof/>
                 <w:webHidden/>
               </w:rPr>
-              <w:t>9</w:t>
+              <w:t>11</w:t>
             </w:r>
             <w:r>
               <w:rPr>
@@ -1769,7 +1567,7 @@
               <w:lang w:eastAsia="pt-BR"/>
             </w:rPr>
           </w:pPr>
-          <w:hyperlink w:anchor="_Toc200386160" w:history="1">
+          <w:hyperlink w:anchor="_Toc200392635" w:history="1">
             <w:r>
               <w:rPr>
                 <w:rStyle w:val="Hyperlink"/>
@@ -1796,7 +1594,7 @@
                 <w:noProof/>
                 <w:webHidden/>
               </w:rPr>
-              <w:instrText xml:space="preserve"> PAGEREF _Toc200386160 \h </w:instrText>
+              <w:instrText xml:space="preserve"> PAGEREF _Toc200392635 \h </w:instrText>
             </w:r>
             <w:r>
               <w:rPr>
@@ -1816,7 +1614,7 @@
                 <w:noProof/>
                 <w:webHidden/>
               </w:rPr>
-              <w:t>9</w:t>
+              <w:t>11</w:t>
             </w:r>
             <w:r>
               <w:rPr>
@@ -1839,7 +1637,7 @@
               <w:lang w:eastAsia="pt-BR"/>
             </w:rPr>
           </w:pPr>
-          <w:hyperlink w:anchor="_Toc200386161" w:history="1">
+          <w:hyperlink w:anchor="_Toc200392636" w:history="1">
             <w:r>
               <w:rPr>
                 <w:rStyle w:val="Hyperlink"/>
@@ -1866,7 +1664,7 @@
                 <w:noProof/>
                 <w:webHidden/>
               </w:rPr>
-              <w:instrText xml:space="preserve"> PAGEREF _Toc200386161 \h </w:instrText>
+              <w:instrText xml:space="preserve"> PAGEREF _Toc200392636 \h </w:instrText>
             </w:r>
             <w:r>
               <w:rPr>
@@ -1886,7 +1684,7 @@
                 <w:noProof/>
                 <w:webHidden/>
               </w:rPr>
-              <w:t>16</w:t>
+              <w:t>18</w:t>
             </w:r>
             <w:r>
               <w:rPr>
@@ -1909,7 +1707,7 @@
               <w:lang w:eastAsia="pt-BR"/>
             </w:rPr>
           </w:pPr>
-          <w:hyperlink w:anchor="_Toc200386162" w:history="1">
+          <w:hyperlink w:anchor="_Toc200392637" w:history="1">
             <w:r>
               <w:rPr>
                 <w:rStyle w:val="Hyperlink"/>
@@ -1936,7 +1734,7 @@
                 <w:noProof/>
                 <w:webHidden/>
               </w:rPr>
-              <w:instrText xml:space="preserve"> PAGEREF _Toc200386162 \h </w:instrText>
+              <w:instrText xml:space="preserve"> PAGEREF _Toc200392637 \h </w:instrText>
             </w:r>
             <w:r>
               <w:rPr>
@@ -1979,7 +1777,7 @@
               <w:lang w:eastAsia="pt-BR"/>
             </w:rPr>
           </w:pPr>
-          <w:hyperlink w:anchor="_Toc200386163" w:history="1">
+          <w:hyperlink w:anchor="_Toc200392638" w:history="1">
             <w:r>
               <w:rPr>
                 <w:rStyle w:val="Hyperlink"/>
@@ -2006,7 +1804,7 @@
                 <w:noProof/>
                 <w:webHidden/>
               </w:rPr>
-              <w:instrText xml:space="preserve"> PAGEREF _Toc200386163 \h </w:instrText>
+              <w:instrText xml:space="preserve"> PAGEREF _Toc200392638 \h </w:instrText>
             </w:r>
             <w:r>
               <w:rPr>
@@ -2049,7 +1847,7 @@
               <w:lang w:eastAsia="pt-BR"/>
             </w:rPr>
           </w:pPr>
-          <w:hyperlink w:anchor="_Toc200386164" w:history="1">
+          <w:hyperlink w:anchor="_Toc200392639" w:history="1">
             <w:r>
               <w:rPr>
                 <w:rStyle w:val="Hyperlink"/>
@@ -2076,7 +1874,7 @@
                 <w:noProof/>
                 <w:webHidden/>
               </w:rPr>
-              <w:instrText xml:space="preserve"> PAGEREF _Toc200386164 \h </w:instrText>
+              <w:instrText xml:space="preserve"> PAGEREF _Toc200392639 \h </w:instrText>
             </w:r>
             <w:r>
               <w:rPr>
@@ -2119,7 +1917,7 @@
               <w:lang w:eastAsia="pt-BR"/>
             </w:rPr>
           </w:pPr>
-          <w:hyperlink w:anchor="_Toc200386165" w:history="1">
+          <w:hyperlink w:anchor="_Toc200392640" w:history="1">
             <w:r>
               <w:rPr>
                 <w:rStyle w:val="Hyperlink"/>
@@ -2146,7 +1944,7 @@
                 <w:noProof/>
                 <w:webHidden/>
               </w:rPr>
-              <w:instrText xml:space="preserve"> PAGEREF _Toc200386165 \h </w:instrText>
+              <w:instrText xml:space="preserve"> PAGEREF _Toc200392640 \h </w:instrText>
             </w:r>
             <w:r>
               <w:rPr>
@@ -2189,7 +1987,7 @@
               <w:lang w:eastAsia="pt-BR"/>
             </w:rPr>
           </w:pPr>
-          <w:hyperlink w:anchor="_Toc200386166" w:history="1">
+          <w:hyperlink w:anchor="_Toc200392641" w:history="1">
             <w:r>
               <w:rPr>
                 <w:rStyle w:val="Hyperlink"/>
@@ -2217,7 +2015,7 @@
                 <w:noProof/>
                 <w:webHidden/>
               </w:rPr>
-              <w:instrText xml:space="preserve"> PAGEREF _Toc200386166 \h </w:instrText>
+              <w:instrText xml:space="preserve"> PAGEREF _Toc200392641 \h </w:instrText>
             </w:r>
             <w:r>
               <w:rPr>
@@ -2260,7 +2058,7 @@
               <w:lang w:eastAsia="pt-BR"/>
             </w:rPr>
           </w:pPr>
-          <w:hyperlink w:anchor="_Toc200386167" w:history="1">
+          <w:hyperlink w:anchor="_Toc200392642" w:history="1">
             <w:r>
               <w:rPr>
                 <w:rStyle w:val="Hyperlink"/>
@@ -2287,7 +2085,7 @@
                 <w:noProof/>
                 <w:webHidden/>
               </w:rPr>
-              <w:instrText xml:space="preserve"> PAGEREF _Toc200386167 \h </w:instrText>
+              <w:instrText xml:space="preserve"> PAGEREF _Toc200392642 \h </w:instrText>
             </w:r>
             <w:r>
               <w:rPr>
@@ -2330,7 +2128,7 @@
               <w:lang w:eastAsia="pt-BR"/>
             </w:rPr>
           </w:pPr>
-          <w:hyperlink w:anchor="_Toc200386168" w:history="1">
+          <w:hyperlink w:anchor="_Toc200392643" w:history="1">
             <w:r>
               <w:rPr>
                 <w:rStyle w:val="Hyperlink"/>
@@ -2357,7 +2155,7 @@
                 <w:noProof/>
                 <w:webHidden/>
               </w:rPr>
-              <w:instrText xml:space="preserve"> PAGEREF _Toc200386168 \h </w:instrText>
+              <w:instrText xml:space="preserve"> PAGEREF _Toc200392643 \h </w:instrText>
             </w:r>
             <w:r>
               <w:rPr>
@@ -2401,7 +2199,7 @@
               <w:lang w:eastAsia="pt-BR"/>
             </w:rPr>
           </w:pPr>
-          <w:hyperlink w:anchor="_Toc200386169" w:history="1">
+          <w:hyperlink w:anchor="_Toc200392644" w:history="1">
             <w:r>
               <w:rPr>
                 <w:rStyle w:val="Hyperlink"/>
@@ -2445,7 +2243,7 @@
                 <w:noProof/>
                 <w:webHidden/>
               </w:rPr>
-              <w:instrText xml:space="preserve"> PAGEREF _Toc200386169 \h </w:instrText>
+              <w:instrText xml:space="preserve"> PAGEREF _Toc200392644 \h </w:instrText>
             </w:r>
             <w:r>
               <w:rPr>
@@ -2488,7 +2286,7 @@
               <w:lang w:eastAsia="pt-BR"/>
             </w:rPr>
           </w:pPr>
-          <w:hyperlink w:anchor="_Toc200386170" w:history="1">
+          <w:hyperlink w:anchor="_Toc200392645" w:history="1">
             <w:r>
               <w:rPr>
                 <w:rStyle w:val="Hyperlink"/>
@@ -2515,7 +2313,7 @@
                 <w:noProof/>
                 <w:webHidden/>
               </w:rPr>
-              <w:instrText xml:space="preserve"> PAGEREF _Toc200386170 \h </w:instrText>
+              <w:instrText xml:space="preserve"> PAGEREF _Toc200392645 \h </w:instrText>
             </w:r>
             <w:r>
               <w:rPr>
@@ -2558,7 +2356,7 @@
               <w:lang w:eastAsia="pt-BR"/>
             </w:rPr>
           </w:pPr>
-          <w:hyperlink w:anchor="_Toc200386171" w:history="1">
+          <w:hyperlink w:anchor="_Toc200392646" w:history="1">
             <w:r>
               <w:rPr>
                 <w:rStyle w:val="Hyperlink"/>
@@ -2585,7 +2383,77 @@
                 <w:noProof/>
                 <w:webHidden/>
               </w:rPr>
-              <w:instrText xml:space="preserve"> PAGEREF _Toc200386171 \h </w:instrText>
+              <w:instrText xml:space="preserve"> PAGEREF _Toc200392646 \h </w:instrText>
+            </w:r>
+            <w:r>
+              <w:rPr>
+                <w:noProof/>
+                <w:webHidden/>
+              </w:rPr>
+            </w:r>
+            <w:r>
+              <w:rPr>
+                <w:noProof/>
+                <w:webHidden/>
+              </w:rPr>
+              <w:fldChar w:fldCharType="separate"/>
+            </w:r>
+            <w:r>
+              <w:rPr>
+                <w:noProof/>
+                <w:webHidden/>
+              </w:rPr>
+              <w:t>31</w:t>
+            </w:r>
+            <w:r>
+              <w:rPr>
+                <w:noProof/>
+                <w:webHidden/>
+              </w:rPr>
+              <w:fldChar w:fldCharType="end"/>
+            </w:r>
+          </w:hyperlink>
+        </w:p>
+        <w:p>
+          <w:pPr>
+            <w:pStyle w:val="Sumrio3"/>
+            <w:tabs>
+              <w:tab w:val="right" w:leader="dot" w:pos="9016"/>
+            </w:tabs>
+            <w:rPr>
+              <w:rFonts w:eastAsiaTheme="minorEastAsia"/>
+              <w:noProof/>
+              <w:lang w:eastAsia="pt-BR"/>
+            </w:rPr>
+          </w:pPr>
+          <w:hyperlink w:anchor="_Toc200392647" w:history="1">
+            <w:r>
+              <w:rPr>
+                <w:rStyle w:val="Hyperlink"/>
+                <w:noProof/>
+              </w:rPr>
+              <w:t>Pontos fracos</w:t>
+            </w:r>
+            <w:r>
+              <w:rPr>
+                <w:noProof/>
+                <w:webHidden/>
+              </w:rPr>
+              <w:tab/>
+            </w:r>
+            <w:r>
+              <w:rPr>
+                <w:noProof/>
+                <w:webHidden/>
+              </w:rPr>
+              <w:fldChar w:fldCharType="begin"/>
+            </w:r>
+            <w:r>
+              <w:rPr>
+                <w:noProof/>
+                <w:webHidden/>
+              </w:rPr>
+              <w:instrText xml:space="preserve"> PAGEREF _Toc200392647 \h </w:instrText>
             </w:r>
             <w:r>
               <w:rPr>
@@ -2628,7 +2496,7 @@
               <w:lang w:eastAsia="pt-BR"/>
             </w:rPr>
           </w:pPr>
-          <w:hyperlink w:anchor="_Toc200386172" w:history="1">
+          <w:hyperlink w:anchor="_Toc200392648" w:history="1">
             <w:r>
               <w:rPr>
                 <w:rStyle w:val="Hyperlink"/>
@@ -2656,7 +2524,7 @@
                 <w:noProof/>
                 <w:webHidden/>
               </w:rPr>
-              <w:instrText xml:space="preserve"> PAGEREF _Toc200386172 \h </w:instrText>
+              <w:instrText xml:space="preserve"> PAGEREF _Toc200392648 \h </w:instrText>
             </w:r>
             <w:r>
               <w:rPr>
@@ -2676,7 +2544,7 @@
                 <w:noProof/>
                 <w:webHidden/>
               </w:rPr>
-              <w:t>31</w:t>
+              <w:t>32</w:t>
             </w:r>
             <w:r>
               <w:rPr>
@@ -2700,7 +2568,7 @@
               <w:lang w:eastAsia="pt-BR"/>
             </w:rPr>
           </w:pPr>
-          <w:hyperlink w:anchor="_Toc200386173" w:history="1">
+          <w:hyperlink w:anchor="_Toc200392649" w:history="1">
             <w:r>
               <w:rPr>
                 <w:rStyle w:val="Hyperlink"/>
@@ -2744,7 +2612,7 @@
                 <w:noProof/>
                 <w:webHidden/>
               </w:rPr>
-              <w:instrText xml:space="preserve"> PAGEREF _Toc200386173 \h </w:instrText>
+              <w:instrText xml:space="preserve"> PAGEREF _Toc200392649 \h </w:instrText>
             </w:r>
             <w:r>
               <w:rPr>
@@ -2764,7 +2632,7 @@
                 <w:noProof/>
                 <w:webHidden/>
               </w:rPr>
-              <w:t>32</w:t>
+              <w:t>33</w:t>
             </w:r>
             <w:r>
               <w:rPr>
@@ -2791,23 +2659,12 @@
               <w:sz w:val="24"/>
               <w:szCs w:val="24"/>
             </w:rPr>
+            <w:lastRenderedPageBreak/>
             <w:fldChar w:fldCharType="end"/>
           </w:r>
         </w:p>
       </w:sdtContent>
     </w:sdt>
-    <w:p>
-      <w:pPr>
-        <w:pStyle w:val="Ttulo1"/>
-        <w:spacing w:line="480" w:lineRule="auto"/>
-        <w:jc w:val="both"/>
-        <w:rPr>
-          <w:rFonts w:ascii="Times" w:hAnsi="Times" w:cs="Times"/>
-          <w:sz w:val="24"/>
-          <w:szCs w:val="24"/>
-        </w:rPr>
-      </w:pPr>
-    </w:p>
     <w:p>
       <w:pPr>
         <w:pStyle w:val="Ttulo1"/>
@@ -2823,7 +2680,7 @@
           <w:szCs w:val="24"/>
         </w:rPr>
       </w:pPr>
-      <w:bookmarkStart w:id="0" w:name="_Toc200386141"/>
+      <w:bookmarkStart w:id="0" w:name="_Toc200392619"/>
       <w:r>
         <w:rPr>
           <w:rFonts w:ascii="Times" w:hAnsi="Times" w:cs="Times"/>
@@ -2836,25 +2693,24 @@
     </w:p>
     <w:p>
       <w:pPr>
-        <w:pStyle w:val="Ttulo2"/>
+        <w:pStyle w:val="NormalRelatorio"/>
         <w:spacing w:line="480" w:lineRule="auto"/>
-        <w:jc w:val="both"/>
-        <w:rPr>
-          <w:rFonts w:ascii="Times" w:hAnsi="Times" w:cs="Times"/>
-          <w:sz w:val="24"/>
-          <w:szCs w:val="24"/>
-        </w:rPr>
-      </w:pPr>
-      <w:bookmarkStart w:id="1" w:name="_Toc200386142"/>
-      <w:r>
-        <w:rPr>
-          <w:rFonts w:ascii="Times" w:hAnsi="Times" w:cs="Times"/>
-          <w:sz w:val="24"/>
-          <w:szCs w:val="24"/>
-        </w:rPr>
-        <w:t>Descrição do problema de ordenação em memória primária,</w:t>
-      </w:r>
-      <w:bookmarkEnd w:id="1"/>
+      </w:pPr>
+      <w:r>
+        <w:t xml:space="preserve">A memória RAM (Random Access Memory), </w:t>
+      </w:r>
+      <w:r>
+        <w:t>tamb</w:t>
+      </w:r>
+      <w:r>
+        <w:t>é</w:t>
+      </w:r>
+      <w:r>
+        <w:t>m conhecida como memória primária, é</w:t>
+      </w:r>
+      <w:r>
+        <w:t xml:space="preserve"> por sua vez utilizada a fim de armazenar dados temporários enquanto a CPU (Central Processing Unit) é executada, ela é utilizada para garantir acesso rápido a informações baseando-se na execução de programas e processos executados no próprio sistema, a sua função possui um problema existente em relação a sua ordenação de processos, quando ordenar arquivos ou dados internos é necessário, pois fisicamente há um limite dentro da CPU, ao consider o tempo de comunicação e armazenamento de dados na RAM, ou durante o processamento da ordenação com o auxílio do processador da placa-mãe.</w:t>
+      </w:r>
     </w:p>
     <w:p>
       <w:pPr>
@@ -2862,30 +2718,6 @@
         <w:spacing w:line="480" w:lineRule="auto"/>
       </w:pPr>
       <w:r>
-        <w:t xml:space="preserve"> </w:t>
-      </w:r>
-      <w:r>
-        <w:t xml:space="preserve">A memória RAM (Random Access Memory), </w:t>
-      </w:r>
-      <w:r>
-        <w:t>tamb</w:t>
-      </w:r>
-      <w:r>
-        <w:t>é</w:t>
-      </w:r>
-      <w:r>
-        <w:t>m conhecida como memória primária, é</w:t>
-      </w:r>
-      <w:r>
-        <w:t xml:space="preserve"> por sua vez utilizada a fim de armazenar dados temporários enquanto a CPU (Central Processing Unit) é executada, ela é utilizada para garantir acesso rápido a informações baseando-se na execução de programas e processos executados no próprio sistema, a sua função possui um problema existente em relação a sua ordenação de processos, quando ordenar arquivos ou dados internos é necessário, pois fisicamente há um limite dentro da CPU, ao consider o tempo de comunicação e armazenamento de dados na RAM, ou durante o processamento da ordenação com o auxílio do processador da placa-mãe.</w:t>
-      </w:r>
-    </w:p>
-    <w:p>
-      <w:pPr>
-        <w:pStyle w:val="NormalRelatorio"/>
-        <w:spacing w:line="480" w:lineRule="auto"/>
-      </w:pPr>
-      <w:r>
         <w:t>Tais limitações, apresentam</w:t>
       </w:r>
       <w:r>
@@ -2901,11 +2733,7 @@
         <w:t>é plausível</w:t>
       </w:r>
       <w:r>
-        <w:t xml:space="preserve"> ordenar listas por </w:t>
-      </w:r>
-      <w:r>
-        <w:lastRenderedPageBreak/>
-        <w:t>popularidade</w:t>
+        <w:t xml:space="preserve"> ordenar listas por popularidade</w:t>
       </w:r>
       <w:r>
         <w:t xml:space="preserve"> alta</w:t>
@@ -3178,97 +3006,6 @@
     </w:p>
     <w:p>
       <w:pPr>
-        <w:pStyle w:val="Ttulo2"/>
-        <w:spacing w:line="480" w:lineRule="auto"/>
-        <w:jc w:val="both"/>
-        <w:rPr>
-          <w:rFonts w:ascii="Times" w:hAnsi="Times" w:cs="Times"/>
-          <w:sz w:val="24"/>
-          <w:szCs w:val="24"/>
-        </w:rPr>
-      </w:pPr>
-      <w:bookmarkStart w:id="2" w:name="_Toc200386143"/>
-      <w:r>
-        <w:rPr>
-          <w:rFonts w:ascii="Times" w:hAnsi="Times" w:cs="Times"/>
-          <w:sz w:val="24"/>
-          <w:szCs w:val="24"/>
-        </w:rPr>
-        <w:t xml:space="preserve">exemplos de aplicações onde o problema pode ser encontrado, </w:t>
-      </w:r>
-      <w:r>
-        <w:rPr>
-          <w:rFonts w:ascii="Times" w:hAnsi="Times" w:cs="Times"/>
-          <w:sz w:val="24"/>
-          <w:szCs w:val="24"/>
-        </w:rPr>
-        <w:t>- FALTA</w:t>
-      </w:r>
-      <w:bookmarkEnd w:id="2"/>
-    </w:p>
-    <w:p>
-      <w:pPr>
-        <w:pStyle w:val="Ttulo2"/>
-        <w:spacing w:line="480" w:lineRule="auto"/>
-        <w:jc w:val="both"/>
-        <w:rPr>
-          <w:rFonts w:ascii="Times" w:hAnsi="Times" w:cs="Times"/>
-          <w:sz w:val="24"/>
-          <w:szCs w:val="24"/>
-        </w:rPr>
-      </w:pPr>
-    </w:p>
-    <w:p>
-      <w:pPr>
-        <w:pStyle w:val="Ttulo2"/>
-        <w:spacing w:line="480" w:lineRule="auto"/>
-        <w:jc w:val="both"/>
-        <w:rPr>
-          <w:rFonts w:ascii="Times" w:hAnsi="Times" w:cs="Times"/>
-          <w:sz w:val="24"/>
-          <w:szCs w:val="24"/>
-        </w:rPr>
-      </w:pPr>
-      <w:bookmarkStart w:id="3" w:name="_Toc200386144"/>
-      <w:r>
-        <w:rPr>
-          <w:rFonts w:ascii="Times" w:hAnsi="Times" w:cs="Times"/>
-          <w:sz w:val="24"/>
-          <w:szCs w:val="24"/>
-        </w:rPr>
-        <w:t>citações dos principais algoritmos que solucionam o problema.</w:t>
-      </w:r>
-      <w:bookmarkEnd w:id="3"/>
-      <w:r>
-        <w:rPr>
-          <w:rFonts w:ascii="Times" w:hAnsi="Times" w:cs="Times"/>
-          <w:sz w:val="24"/>
-          <w:szCs w:val="24"/>
-        </w:rPr>
-        <w:t xml:space="preserve"> </w:t>
-      </w:r>
-    </w:p>
-    <w:p>
-      <w:pPr>
-        <w:spacing w:line="480" w:lineRule="auto"/>
-        <w:jc w:val="both"/>
-        <w:rPr>
-          <w:rFonts w:ascii="Times" w:hAnsi="Times" w:cs="Times"/>
-          <w:sz w:val="24"/>
-          <w:szCs w:val="24"/>
-        </w:rPr>
-      </w:pPr>
-      <w:r>
-        <w:rPr>
-          <w:rFonts w:ascii="Times" w:hAnsi="Times" w:cs="Times"/>
-          <w:sz w:val="24"/>
-          <w:szCs w:val="24"/>
-        </w:rPr>
-        <w:t>Todas as informações deverão ser referenciadas por livros ou artigos científicos.</w:t>
-      </w:r>
-    </w:p>
-    <w:p>
-      <w:pPr>
         <w:pStyle w:val="Ttulo1"/>
         <w:numPr>
           <w:ilvl w:val="0"/>
@@ -3282,7 +3019,7 @@
           <w:szCs w:val="24"/>
         </w:rPr>
       </w:pPr>
-      <w:bookmarkStart w:id="4" w:name="_Toc200386145"/>
+      <w:bookmarkStart w:id="1" w:name="_Toc200392620"/>
       <w:r>
         <w:rPr>
           <w:rFonts w:ascii="Times" w:hAnsi="Times" w:cs="Times"/>
@@ -3315,7 +3052,7 @@
         </w:rPr>
         <w:t xml:space="preserve"> Sort</w:t>
       </w:r>
-      <w:bookmarkEnd w:id="4"/>
+      <w:bookmarkEnd w:id="1"/>
     </w:p>
     <w:p>
       <w:pPr>
@@ -3328,16 +3065,24 @@
           <w:szCs w:val="24"/>
         </w:rPr>
       </w:pPr>
-      <w:bookmarkStart w:id="5" w:name="_Toc200386146"/>
-      <w:r>
-        <w:rPr>
-          <w:rFonts w:ascii="Times" w:hAnsi="Times" w:cs="Times"/>
-          <w:sz w:val="24"/>
-          <w:szCs w:val="24"/>
-        </w:rPr>
-        <w:t>Detalhamento do funcionamento do algoritmo.</w:t>
-      </w:r>
-      <w:bookmarkEnd w:id="5"/>
+      <w:bookmarkStart w:id="2" w:name="_Toc200392621"/>
+      <w:r>
+        <w:rPr>
+          <w:rFonts w:ascii="Times" w:hAnsi="Times" w:cs="Times"/>
+          <w:sz w:val="24"/>
+          <w:szCs w:val="24"/>
+        </w:rPr>
+        <w:t xml:space="preserve">Detalhamento </w:t>
+      </w:r>
+      <w:r>
+        <w:rPr>
+          <w:rFonts w:ascii="Times" w:hAnsi="Times" w:cs="Times"/>
+          <w:sz w:val="24"/>
+          <w:szCs w:val="24"/>
+        </w:rPr>
+        <w:t>Do Funcionamento Do Algoritmo.</w:t>
+      </w:r>
+      <w:bookmarkEnd w:id="2"/>
     </w:p>
     <w:p>
       <w:pPr>
@@ -3541,25 +3286,110 @@
           <w:sz w:val="24"/>
           <w:szCs w:val="24"/>
         </w:rPr>
+        <w:t xml:space="preserve"> agora p</w:t>
+      </w:r>
+      <w:r>
+        <w:rPr>
+          <w:rFonts w:ascii="Times" w:hAnsi="Times" w:cs="Times"/>
+          <w:sz w:val="24"/>
+          <w:szCs w:val="24"/>
+        </w:rPr>
+        <w:t>ara ordenação crescente constrói-se um</w:t>
+      </w:r>
+      <w:r>
+        <w:rPr>
+          <w:rFonts w:ascii="Times" w:hAnsi="Times" w:cs="Times"/>
+          <w:sz w:val="24"/>
+          <w:szCs w:val="24"/>
+        </w:rPr>
         <w:t xml:space="preserve"> </w:t>
       </w:r>
       <w:r>
         <w:rPr>
           <w:rFonts w:ascii="Times" w:hAnsi="Times" w:cs="Times"/>
-          <w:sz w:val="24"/>
-          <w:szCs w:val="24"/>
-        </w:rPr>
-        <w:lastRenderedPageBreak/>
-        <w:t>agora p</w:t>
-      </w:r>
-      <w:r>
-        <w:rPr>
-          <w:rFonts w:ascii="Times" w:hAnsi="Times" w:cs="Times"/>
-          <w:sz w:val="24"/>
-          <w:szCs w:val="24"/>
-        </w:rPr>
-        <w:t>ara ordenação crescente constrói-se um</w:t>
-      </w:r>
+          <w:i/>
+          <w:sz w:val="24"/>
+          <w:szCs w:val="24"/>
+        </w:rPr>
+        <w:t>heap</w:t>
+      </w:r>
+      <w:r>
+        <w:rPr>
+          <w:rFonts w:ascii="Times" w:hAnsi="Times" w:cs="Times"/>
+          <w:sz w:val="24"/>
+          <w:szCs w:val="24"/>
+        </w:rPr>
+        <w:t xml:space="preserve"> máximo. No </w:t>
+      </w:r>
+      <w:r>
+        <w:rPr>
+          <w:rFonts w:ascii="Times" w:hAnsi="Times" w:cs="Times"/>
+          <w:i/>
+          <w:sz w:val="24"/>
+          <w:szCs w:val="24"/>
+        </w:rPr>
+        <w:t xml:space="preserve">heap </w:t>
+      </w:r>
+      <w:r>
+        <w:rPr>
+          <w:rFonts w:ascii="Times" w:hAnsi="Times" w:cs="Times"/>
+          <w:sz w:val="24"/>
+          <w:szCs w:val="24"/>
+        </w:rPr>
+        <w:t>mínimo</w:t>
+      </w:r>
+      <w:r>
+        <w:rPr>
+          <w:rFonts w:ascii="Times" w:hAnsi="Times" w:cs="Times"/>
+          <w:sz w:val="24"/>
+          <w:szCs w:val="24"/>
+        </w:rPr>
+        <w:t xml:space="preserve"> o </w:t>
+      </w:r>
+      <w:r>
+        <w:rPr>
+          <w:rFonts w:ascii="Times" w:hAnsi="Times" w:cs="Times"/>
+          <w:sz w:val="24"/>
+          <w:szCs w:val="24"/>
+        </w:rPr>
+        <w:t xml:space="preserve">menor elemento fica na raiz e no </w:t>
+      </w:r>
+      <w:r>
+        <w:rPr>
+          <w:rFonts w:ascii="Times" w:hAnsi="Times" w:cs="Times"/>
+          <w:i/>
+          <w:sz w:val="24"/>
+          <w:szCs w:val="24"/>
+        </w:rPr>
+        <w:t>heap</w:t>
+      </w:r>
+      <w:r>
+        <w:rPr>
+          <w:rFonts w:ascii="Times" w:hAnsi="Times" w:cs="Times"/>
+          <w:sz w:val="24"/>
+          <w:szCs w:val="24"/>
+        </w:rPr>
+        <w:t xml:space="preserve"> máximo</w:t>
+      </w:r>
+      <w:r>
+        <w:rPr>
+          <w:rFonts w:ascii="Times" w:hAnsi="Times" w:cs="Times"/>
+          <w:sz w:val="24"/>
+          <w:szCs w:val="24"/>
+        </w:rPr>
+        <w:t xml:space="preserve"> o maior elemento fica na raiz</w:t>
+      </w:r>
+    </w:p>
+    <w:p>
+      <w:pPr>
+        <w:spacing w:line="480" w:lineRule="auto"/>
+        <w:jc w:val="both"/>
+        <w:rPr>
+          <w:rFonts w:ascii="Times" w:hAnsi="Times" w:cs="Times"/>
+          <w:sz w:val="24"/>
+          <w:szCs w:val="24"/>
+        </w:rPr>
+      </w:pPr>
       <w:r>
         <w:rPr>
           <w:rFonts w:ascii="Times" w:hAnsi="Times" w:cs="Times"/>
@@ -3568,81 +3398,7 @@
         </w:rPr>
         <w:t xml:space="preserve"> </w:t>
       </w:r>
-      <w:r>
-        <w:rPr>
-          <w:rFonts w:ascii="Times" w:hAnsi="Times" w:cs="Times"/>
-          <w:i/>
-          <w:sz w:val="24"/>
-          <w:szCs w:val="24"/>
-        </w:rPr>
-        <w:t>heap</w:t>
-      </w:r>
-      <w:r>
-        <w:rPr>
-          <w:rFonts w:ascii="Times" w:hAnsi="Times" w:cs="Times"/>
-          <w:sz w:val="24"/>
-          <w:szCs w:val="24"/>
-        </w:rPr>
-        <w:t xml:space="preserve"> máximo. No </w:t>
-      </w:r>
-      <w:r>
-        <w:rPr>
-          <w:rFonts w:ascii="Times" w:hAnsi="Times" w:cs="Times"/>
-          <w:i/>
-          <w:sz w:val="24"/>
-          <w:szCs w:val="24"/>
-        </w:rPr>
-        <w:t xml:space="preserve">heap </w:t>
-      </w:r>
-      <w:r>
-        <w:rPr>
-          <w:rFonts w:ascii="Times" w:hAnsi="Times" w:cs="Times"/>
-          <w:sz w:val="24"/>
-          <w:szCs w:val="24"/>
-        </w:rPr>
-        <w:t>mínimo</w:t>
-      </w:r>
-      <w:r>
-        <w:rPr>
-          <w:rFonts w:ascii="Times" w:hAnsi="Times" w:cs="Times"/>
-          <w:sz w:val="24"/>
-          <w:szCs w:val="24"/>
-        </w:rPr>
-        <w:t xml:space="preserve"> o </w:t>
-      </w:r>
-      <w:r>
-        <w:rPr>
-          <w:rFonts w:ascii="Times" w:hAnsi="Times" w:cs="Times"/>
-          <w:sz w:val="24"/>
-          <w:szCs w:val="24"/>
-        </w:rPr>
-        <w:t xml:space="preserve">menor elemento fica na raiz e no </w:t>
-      </w:r>
-      <w:r>
-        <w:rPr>
-          <w:rFonts w:ascii="Times" w:hAnsi="Times" w:cs="Times"/>
-          <w:i/>
-          <w:sz w:val="24"/>
-          <w:szCs w:val="24"/>
-        </w:rPr>
-        <w:t>heap</w:t>
-      </w:r>
-      <w:r>
-        <w:rPr>
-          <w:rFonts w:ascii="Times" w:hAnsi="Times" w:cs="Times"/>
-          <w:sz w:val="24"/>
-          <w:szCs w:val="24"/>
-        </w:rPr>
-        <w:t xml:space="preserve"> máximo</w:t>
-      </w:r>
-      <w:r>
-        <w:rPr>
-          <w:rFonts w:ascii="Times" w:hAnsi="Times" w:cs="Times"/>
-          <w:sz w:val="24"/>
-          <w:szCs w:val="24"/>
-        </w:rPr>
-        <w:t xml:space="preserve"> o maior elemento fica na raiz</w:t>
-      </w:r>
+      <w:bookmarkStart w:id="3" w:name="_Toc200392622"/>
     </w:p>
     <w:p>
       <w:pPr>
@@ -3661,15 +3417,7 @@
           <w:sz w:val="24"/>
           <w:szCs w:val="24"/>
         </w:rPr>
-        <w:t xml:space="preserve"> </w:t>
-      </w:r>
-      <w:bookmarkStart w:id="6" w:name="_Toc200386147"/>
-      <w:r>
-        <w:rPr>
-          <w:rFonts w:ascii="Times" w:hAnsi="Times" w:cs="Times"/>
-          <w:sz w:val="24"/>
-          <w:szCs w:val="24"/>
-        </w:rPr>
+        <w:lastRenderedPageBreak/>
         <w:t>Anális</w:t>
       </w:r>
       <w:r>
@@ -3678,9 +3426,17 @@
           <w:sz w:val="24"/>
           <w:szCs w:val="24"/>
         </w:rPr>
-        <w:t>e da complexidade do algoritmo.</w:t>
-      </w:r>
-      <w:bookmarkEnd w:id="6"/>
+        <w:t xml:space="preserve">e </w:t>
+      </w:r>
+      <w:r>
+        <w:rPr>
+          <w:rFonts w:ascii="Times" w:hAnsi="Times" w:cs="Times"/>
+          <w:sz w:val="24"/>
+          <w:szCs w:val="24"/>
+        </w:rPr>
+        <w:t>Da Complexidade Do Algoritmo.</w:t>
+      </w:r>
+      <w:bookmarkEnd w:id="3"/>
     </w:p>
     <w:p>
       <w:pPr>
@@ -4980,7 +4736,31 @@
           <w:sz w:val="24"/>
           <w:szCs w:val="24"/>
         </w:rPr>
-        <w:t xml:space="preserve"> e </w:t>
+        <w:t xml:space="preserve"> e concedido a sua posição com o elemento-filho com o maior valor</w:t>
+      </w:r>
+      <w:r>
+        <w:rPr>
+          <w:rFonts w:ascii="Times" w:eastAsiaTheme="minorEastAsia" w:hAnsi="Times" w:cs="Times"/>
+          <w:sz w:val="24"/>
+          <w:szCs w:val="24"/>
+        </w:rPr>
+        <w:t xml:space="preserve">, </w:t>
+      </w:r>
+      <w:r>
+        <w:rPr>
+          <w:rFonts w:ascii="Times" w:eastAsiaTheme="minorEastAsia" w:hAnsi="Times" w:cs="Times"/>
+          <w:sz w:val="24"/>
+          <w:szCs w:val="24"/>
+        </w:rPr>
+        <w:t xml:space="preserve">sendo deslocado </w:t>
+      </w:r>
+      <w:r>
+        <w:rPr>
+          <w:rFonts w:ascii="Times" w:eastAsiaTheme="minorEastAsia" w:hAnsi="Times" w:cs="Times"/>
+          <w:sz w:val="24"/>
+          <w:szCs w:val="24"/>
+        </w:rPr>
+        <w:t xml:space="preserve">até ser </w:t>
       </w:r>
       <w:r>
         <w:rPr>
@@ -4989,31 +4769,7 @@
           <w:szCs w:val="24"/>
         </w:rPr>
         <w:lastRenderedPageBreak/>
-        <w:t>concedido a sua posição com o elemento-filho com o maior valor</w:t>
-      </w:r>
-      <w:r>
-        <w:rPr>
-          <w:rFonts w:ascii="Times" w:eastAsiaTheme="minorEastAsia" w:hAnsi="Times" w:cs="Times"/>
-          <w:sz w:val="24"/>
-          <w:szCs w:val="24"/>
-        </w:rPr>
-        <w:t xml:space="preserve">, </w:t>
-      </w:r>
-      <w:r>
-        <w:rPr>
-          <w:rFonts w:ascii="Times" w:eastAsiaTheme="minorEastAsia" w:hAnsi="Times" w:cs="Times"/>
-          <w:sz w:val="24"/>
-          <w:szCs w:val="24"/>
-        </w:rPr>
-        <w:t xml:space="preserve">sendo deslocado </w:t>
-      </w:r>
-      <w:r>
-        <w:rPr>
-          <w:rFonts w:ascii="Times" w:eastAsiaTheme="minorEastAsia" w:hAnsi="Times" w:cs="Times"/>
-          <w:sz w:val="24"/>
-          <w:szCs w:val="24"/>
-        </w:rPr>
-        <w:t xml:space="preserve">até ser considerado um elemento-pai com o maior valor que seus filhos ou chegar ao fim do </w:t>
+        <w:t xml:space="preserve">considerado um elemento-pai com o maior valor que seus filhos ou chegar ao fim do </w:t>
       </w:r>
       <w:r>
         <w:rPr>
@@ -6523,7 +6279,7 @@
         <w:pStyle w:val="Titulo2Relatorio"/>
         <w:spacing w:line="480" w:lineRule="auto"/>
       </w:pPr>
-      <w:bookmarkStart w:id="7" w:name="_Toc200386148"/>
+      <w:bookmarkStart w:id="4" w:name="_Toc200392623"/>
       <w:r>
         <w:lastRenderedPageBreak/>
         <w:t xml:space="preserve">Melhores </w:t>
@@ -6531,7 +6287,7 @@
       <w:r>
         <w:t>Cenários De Uso Do Algoritmo</w:t>
       </w:r>
-      <w:bookmarkEnd w:id="7"/>
+      <w:bookmarkEnd w:id="4"/>
     </w:p>
     <w:p>
       <w:pPr>
@@ -6694,11 +6450,14 @@
         <w:pStyle w:val="Titulo3Relatorio"/>
         <w:spacing w:line="480" w:lineRule="auto"/>
       </w:pPr>
-      <w:bookmarkStart w:id="8" w:name="_Toc200386149"/>
-      <w:r>
-        <w:t>Aplicações com necessidade de garantia de tempo.</w:t>
-      </w:r>
-      <w:bookmarkEnd w:id="8"/>
+      <w:bookmarkStart w:id="5" w:name="_Toc200392624"/>
+      <w:r>
+        <w:t xml:space="preserve">Aplicações </w:t>
+      </w:r>
+      <w:r>
+        <w:t>Com Necessidade De Garantia De Tempo.</w:t>
+      </w:r>
+      <w:bookmarkEnd w:id="5"/>
     </w:p>
     <w:p>
       <w:pPr>
@@ -6766,121 +6525,127 @@
         <w:pStyle w:val="Titulo3Relatorio"/>
         <w:spacing w:line="480" w:lineRule="auto"/>
       </w:pPr>
-      <w:bookmarkStart w:id="9" w:name="_Toc200386150"/>
-      <w:r>
-        <w:t>Ambientes com restrições de memória.</w:t>
+      <w:bookmarkStart w:id="6" w:name="_Toc200392625"/>
+      <w:r>
+        <w:t xml:space="preserve">Ambientes </w:t>
+      </w:r>
+      <w:r>
+        <w:t>Com Restrições De Memória.</w:t>
+      </w:r>
+      <w:bookmarkEnd w:id="6"/>
+    </w:p>
+    <w:p>
+      <w:pPr>
+        <w:pStyle w:val="NormalRelatorio"/>
+        <w:spacing w:line="480" w:lineRule="auto"/>
+      </w:pPr>
+      <w:r>
+        <w:t xml:space="preserve">Graças a propriedade </w:t>
+      </w:r>
+      <w:r>
+        <w:rPr>
+          <w:i/>
+        </w:rPr>
+        <w:t>in-</w:t>
+      </w:r>
+      <w:r>
+        <w:rPr>
+          <w:i/>
+        </w:rPr>
+        <w:t>place</w:t>
+      </w:r>
+      <w:r>
+        <w:t xml:space="preserve"> do algoritmo de ordenação </w:t>
+      </w:r>
+      <w:r>
+        <w:rPr>
+          <w:i/>
+        </w:rPr>
+        <w:t>Heap</w:t>
+      </w:r>
+      <w:r>
+        <w:t xml:space="preserve">sort, ele </w:t>
+      </w:r>
+      <w:r>
+        <w:t>é</w:t>
+      </w:r>
+      <w:r>
+        <w:t xml:space="preserve"> bem útil para</w:t>
+      </w:r>
+      <w:r>
+        <w:t xml:space="preserve"> atuar na</w:t>
+      </w:r>
+      <w:r>
+        <w:t xml:space="preserve"> ordena</w:t>
+      </w:r>
+      <w:r>
+        <w:t>ção de</w:t>
+      </w:r>
+      <w:r>
+        <w:t xml:space="preserve"> elementos </w:t>
+      </w:r>
+      <w:r>
+        <w:t>enquanto</w:t>
+      </w:r>
+      <w:r>
+        <w:t xml:space="preserve"> a memória é limitada.</w:t>
+      </w:r>
+    </w:p>
+    <w:p>
+      <w:pPr>
+        <w:pStyle w:val="Titulo3Relatorio"/>
+        <w:spacing w:line="480" w:lineRule="auto"/>
+      </w:pPr>
+      <w:bookmarkStart w:id="7" w:name="_Toc200392626"/>
+      <w:r>
+        <w:t>Implementação de filas de prioridade.</w:t>
+      </w:r>
+      <w:r>
+        <w:t xml:space="preserve"> - F</w:t>
+      </w:r>
+      <w:bookmarkEnd w:id="7"/>
+    </w:p>
+    <w:p>
+      <w:pPr>
+        <w:pStyle w:val="Titulo3Relatorio"/>
+        <w:spacing w:line="480" w:lineRule="auto"/>
+      </w:pPr>
+      <w:bookmarkStart w:id="8" w:name="_Toc200392627"/>
+      <w:r>
+        <w:t>Processamento de dados em fluxo</w:t>
+      </w:r>
+      <w:r>
+        <w:t xml:space="preserve"> - F</w:t>
+      </w:r>
+      <w:bookmarkEnd w:id="8"/>
+    </w:p>
+    <w:p>
+      <w:pPr>
+        <w:pStyle w:val="Titulo3Relatorio"/>
+        <w:spacing w:line="480" w:lineRule="auto"/>
+      </w:pPr>
+      <w:bookmarkStart w:id="9" w:name="_Toc200392628"/>
+      <w:r>
+        <w:t>Sistemas críticos</w:t>
+      </w:r>
+      <w:r>
+        <w:t xml:space="preserve"> - F</w:t>
       </w:r>
       <w:bookmarkEnd w:id="9"/>
     </w:p>
     <w:p>
       <w:pPr>
-        <w:pStyle w:val="NormalRelatorio"/>
-        <w:spacing w:line="480" w:lineRule="auto"/>
-      </w:pPr>
-      <w:r>
-        <w:t xml:space="preserve">Graças a propriedade </w:t>
-      </w:r>
-      <w:r>
-        <w:rPr>
-          <w:i/>
-        </w:rPr>
-        <w:t>in-</w:t>
-      </w:r>
-      <w:r>
-        <w:rPr>
-          <w:i/>
-        </w:rPr>
-        <w:t>place</w:t>
-      </w:r>
-      <w:r>
-        <w:t xml:space="preserve"> do algoritmo de ordenação </w:t>
-      </w:r>
-      <w:r>
-        <w:rPr>
-          <w:i/>
-        </w:rPr>
-        <w:t>Heap</w:t>
-      </w:r>
-      <w:r>
-        <w:t xml:space="preserve">sort, ele </w:t>
-      </w:r>
-      <w:r>
-        <w:t>é</w:t>
-      </w:r>
-      <w:r>
-        <w:t xml:space="preserve"> bem útil para</w:t>
-      </w:r>
-      <w:r>
-        <w:t xml:space="preserve"> atuar na</w:t>
-      </w:r>
-      <w:r>
-        <w:t xml:space="preserve"> ordena</w:t>
-      </w:r>
-      <w:r>
-        <w:t>ção de</w:t>
-      </w:r>
-      <w:r>
-        <w:t xml:space="preserve"> elementos </w:t>
-      </w:r>
-      <w:r>
-        <w:t>enquanto</w:t>
-      </w:r>
-      <w:r>
-        <w:t xml:space="preserve"> a memória é limitada.</w:t>
-      </w:r>
-    </w:p>
-    <w:p>
-      <w:pPr>
         <w:pStyle w:val="Titulo3Relatorio"/>
         <w:spacing w:line="480" w:lineRule="auto"/>
       </w:pPr>
-      <w:bookmarkStart w:id="10" w:name="_Toc200386151"/>
-      <w:r>
-        <w:t>Implementação de filas de prioridade.</w:t>
-      </w:r>
-      <w:r>
-        <w:t xml:space="preserve"> - F</w:t>
+      <w:bookmarkStart w:id="10" w:name="_Toc200392629"/>
+      <w:r>
+        <w:t xml:space="preserve">Grandes </w:t>
+      </w:r>
+      <w:r>
+        <w:t>Volumes De Dados</w:t>
       </w:r>
       <w:bookmarkEnd w:id="10"/>
-    </w:p>
-    <w:p>
-      <w:pPr>
-        <w:pStyle w:val="Titulo3Relatorio"/>
-        <w:spacing w:line="480" w:lineRule="auto"/>
-      </w:pPr>
-      <w:bookmarkStart w:id="11" w:name="_Toc200386152"/>
-      <w:r>
-        <w:t>Processamento de dados em fluxo</w:t>
-      </w:r>
-      <w:r>
-        <w:t xml:space="preserve"> - F</w:t>
-      </w:r>
-      <w:bookmarkEnd w:id="11"/>
-    </w:p>
-    <w:p>
-      <w:pPr>
-        <w:pStyle w:val="Titulo3Relatorio"/>
-        <w:spacing w:line="480" w:lineRule="auto"/>
-      </w:pPr>
-      <w:bookmarkStart w:id="12" w:name="_Toc200386153"/>
-      <w:r>
-        <w:t>Sistemas críticos</w:t>
-      </w:r>
-      <w:r>
-        <w:t xml:space="preserve"> - F</w:t>
-      </w:r>
-      <w:bookmarkEnd w:id="12"/>
-    </w:p>
-    <w:p>
-      <w:pPr>
-        <w:pStyle w:val="Titulo3Relatorio"/>
-        <w:spacing w:line="480" w:lineRule="auto"/>
-      </w:pPr>
-      <w:bookmarkStart w:id="13" w:name="_Toc200386154"/>
-      <w:r>
-        <w:t>Grandes volumes de dados</w:t>
-      </w:r>
-      <w:bookmarkEnd w:id="13"/>
     </w:p>
     <w:p>
       <w:pPr>
@@ -6947,22 +6712,30 @@
           <w:szCs w:val="24"/>
         </w:rPr>
       </w:pPr>
-      <w:bookmarkStart w:id="14" w:name="_Toc200386155"/>
-      <w:r>
-        <w:rPr>
-          <w:rFonts w:ascii="Times" w:hAnsi="Times" w:cs="Times"/>
-          <w:sz w:val="24"/>
-          <w:szCs w:val="24"/>
-        </w:rPr>
-        <w:t>Estabilidade d</w:t>
-      </w:r>
-      <w:r>
-        <w:rPr>
-          <w:rFonts w:ascii="Times" w:hAnsi="Times" w:cs="Times"/>
-          <w:sz w:val="24"/>
-          <w:szCs w:val="24"/>
-        </w:rPr>
-        <w:t>o algoritmo</w:t>
+      <w:bookmarkStart w:id="11" w:name="_Toc200392630"/>
+      <w:r>
+        <w:rPr>
+          <w:rFonts w:ascii="Times" w:hAnsi="Times" w:cs="Times"/>
+          <w:sz w:val="24"/>
+          <w:szCs w:val="24"/>
+        </w:rPr>
+        <w:t xml:space="preserve">Estabilidade </w:t>
+      </w:r>
+      <w:r>
+        <w:rPr>
+          <w:rFonts w:ascii="Times" w:hAnsi="Times" w:cs="Times"/>
+          <w:sz w:val="24"/>
+          <w:szCs w:val="24"/>
+        </w:rPr>
+        <w:t>D</w:t>
+      </w:r>
+      <w:r>
+        <w:rPr>
+          <w:rFonts w:ascii="Times" w:hAnsi="Times" w:cs="Times"/>
+          <w:sz w:val="24"/>
+          <w:szCs w:val="24"/>
+        </w:rPr>
+        <w:t>o Algoritmo</w:t>
       </w:r>
       <w:r>
         <w:rPr>
@@ -6972,7 +6745,7 @@
         </w:rPr>
         <w:t>.</w:t>
       </w:r>
-      <w:bookmarkEnd w:id="14"/>
+      <w:bookmarkEnd w:id="11"/>
     </w:p>
     <w:p>
       <w:pPr>
@@ -7150,16 +6923,24 @@
           <w:szCs w:val="24"/>
         </w:rPr>
       </w:pPr>
-      <w:bookmarkStart w:id="15" w:name="_Toc200386156"/>
-      <w:r>
-        <w:rPr>
-          <w:rFonts w:ascii="Times" w:hAnsi="Times" w:cs="Times"/>
-          <w:sz w:val="24"/>
-          <w:szCs w:val="24"/>
-        </w:rPr>
-        <w:t>Limitações do algoritmo.</w:t>
-      </w:r>
-      <w:bookmarkEnd w:id="15"/>
+      <w:bookmarkStart w:id="12" w:name="_Toc200392631"/>
+      <w:r>
+        <w:rPr>
+          <w:rFonts w:ascii="Times" w:hAnsi="Times" w:cs="Times"/>
+          <w:sz w:val="24"/>
+          <w:szCs w:val="24"/>
+        </w:rPr>
+        <w:t xml:space="preserve">Limitações </w:t>
+      </w:r>
+      <w:r>
+        <w:rPr>
+          <w:rFonts w:ascii="Times" w:hAnsi="Times" w:cs="Times"/>
+          <w:sz w:val="24"/>
+          <w:szCs w:val="24"/>
+        </w:rPr>
+        <w:t>Do Algoritmo.</w:t>
+      </w:r>
+      <w:bookmarkEnd w:id="12"/>
     </w:p>
     <w:p>
       <w:pPr>
@@ -7435,7 +7216,7 @@
           <w:szCs w:val="24"/>
         </w:rPr>
       </w:pPr>
-      <w:bookmarkStart w:id="16" w:name="_Toc200386157"/>
+      <w:bookmarkStart w:id="13" w:name="_Toc200392632"/>
       <w:r>
         <w:rPr>
           <w:rFonts w:ascii="Times" w:hAnsi="Times" w:cs="Times"/>
@@ -7460,7 +7241,7 @@
         </w:rPr>
         <w:t>e Ordenação Acontece.</w:t>
       </w:r>
-      <w:bookmarkEnd w:id="16"/>
+      <w:bookmarkEnd w:id="13"/>
     </w:p>
     <w:p>
       <w:pPr>
@@ -7834,7 +7615,7 @@
           <w:szCs w:val="24"/>
         </w:rPr>
       </w:pPr>
-      <w:bookmarkStart w:id="17" w:name="_Toc200386158"/>
+      <w:bookmarkStart w:id="14" w:name="_Toc200392633"/>
       <w:r>
         <w:rPr>
           <w:rFonts w:ascii="Times" w:hAnsi="Times" w:cs="Times"/>
@@ -7843,18 +7624,18 @@
         </w:rPr>
         <w:t>Implementação e Testes</w:t>
       </w:r>
-      <w:bookmarkEnd w:id="17"/>
+      <w:bookmarkEnd w:id="14"/>
     </w:p>
     <w:p>
       <w:pPr>
         <w:pStyle w:val="Titulo2Relatorio"/>
         <w:spacing w:line="480" w:lineRule="auto"/>
       </w:pPr>
-      <w:bookmarkStart w:id="18" w:name="_Toc200386159"/>
+      <w:bookmarkStart w:id="15" w:name="_Toc200392634"/>
       <w:r>
         <w:t>Detalhamento da implementação e decisões tomadas durante a construção do algoritmo.</w:t>
       </w:r>
-      <w:bookmarkEnd w:id="18"/>
+      <w:bookmarkEnd w:id="15"/>
       <w:r>
         <w:t xml:space="preserve"> </w:t>
       </w:r>
@@ -7882,11 +7663,11 @@
         <w:pStyle w:val="Titulo3Relatorio"/>
         <w:spacing w:line="480" w:lineRule="auto"/>
       </w:pPr>
-      <w:bookmarkStart w:id="19" w:name="_Toc200386160"/>
+      <w:bookmarkStart w:id="16" w:name="_Toc200392635"/>
       <w:r>
         <w:t>Algoritmo da obra Estrutura de Dados Usando C</w:t>
       </w:r>
-      <w:bookmarkEnd w:id="19"/>
+      <w:bookmarkEnd w:id="16"/>
     </w:p>
     <w:p>
       <w:pPr>
@@ -12006,11 +11787,11 @@
         <w:pStyle w:val="Titulo3Relatorio"/>
         <w:spacing w:line="480" w:lineRule="auto"/>
       </w:pPr>
-      <w:bookmarkStart w:id="20" w:name="_Toc200386161"/>
+      <w:bookmarkStart w:id="17" w:name="_Toc200392636"/>
       <w:r>
         <w:t>Algoritmo do site Programmiz</w:t>
       </w:r>
-      <w:bookmarkEnd w:id="20"/>
+      <w:bookmarkEnd w:id="17"/>
     </w:p>
     <w:p>
       <w:pPr>
@@ -12352,6 +12133,7 @@
     <w:p>
       <w:pPr>
         <w:spacing w:line="480" w:lineRule="auto"/>
+        <w:ind w:firstLine="708"/>
         <w:jc w:val="both"/>
         <w:rPr>
           <w:rFonts w:ascii="Times" w:eastAsiaTheme="minorEastAsia" w:hAnsi="Times" w:cs="Times"/>
@@ -13106,7 +12888,13 @@
         </m:r>
       </m:oMath>
       <w:r>
-        <w:t xml:space="preserve">, em outras palavras, se o valor da a raiz nao for o maior elemento(valor_maximo), prosseguir com swap(alternancia) e </w:t>
+        <w:t>, em outras palavras, se o valor da a raiz nao for o maior elemento(valor_maximo),</w:t>
+      </w:r>
+      <w:r>
+        <w:t xml:space="preserve"> prosseguir com swap(alternâ</w:t>
+      </w:r>
+      <w:r>
+        <w:t xml:space="preserve">ncia) e </w:t>
       </w:r>
       <w:r>
         <w:rPr>
@@ -14449,14 +14237,14 @@
         <w:pStyle w:val="Titulo2Relatorio"/>
         <w:spacing w:line="480" w:lineRule="auto"/>
       </w:pPr>
-      <w:bookmarkStart w:id="21" w:name="_Toc200386162"/>
+      <w:bookmarkStart w:id="18" w:name="_Toc200392637"/>
       <w:r>
         <w:t>R</w:t>
       </w:r>
       <w:r>
         <w:t>esultados Dos Testes</w:t>
       </w:r>
-      <w:bookmarkEnd w:id="21"/>
+      <w:bookmarkEnd w:id="18"/>
     </w:p>
     <w:p>
       <w:pPr>
@@ -14521,11 +14309,11 @@
         <w:pStyle w:val="Titulo3Relatorio"/>
         <w:spacing w:line="480" w:lineRule="auto"/>
       </w:pPr>
-      <w:bookmarkStart w:id="22" w:name="_Toc200386163"/>
+      <w:bookmarkStart w:id="19" w:name="_Toc200392638"/>
       <w:r>
         <w:t>Ordered Input</w:t>
       </w:r>
-      <w:bookmarkEnd w:id="22"/>
+      <w:bookmarkEnd w:id="19"/>
     </w:p>
     <w:p>
       <w:pPr>
@@ -14996,11 +14784,11 @@
         <w:pStyle w:val="Titulo3Relatorio"/>
         <w:spacing w:line="480" w:lineRule="auto"/>
       </w:pPr>
-      <w:bookmarkStart w:id="23" w:name="_Toc200386164"/>
+      <w:bookmarkStart w:id="20" w:name="_Toc200392639"/>
       <w:r>
         <w:t>Reverse Ordered Input</w:t>
       </w:r>
-      <w:bookmarkEnd w:id="23"/>
+      <w:bookmarkEnd w:id="20"/>
     </w:p>
     <w:p>
       <w:pPr>
@@ -15427,11 +15215,11 @@
         <w:pStyle w:val="Titulo3Relatorio"/>
         <w:spacing w:line="480" w:lineRule="auto"/>
       </w:pPr>
-      <w:bookmarkStart w:id="24" w:name="_Toc200386165"/>
+      <w:bookmarkStart w:id="21" w:name="_Toc200392640"/>
       <w:r>
         <w:t>Uniform Input</w:t>
       </w:r>
-      <w:bookmarkEnd w:id="24"/>
+      <w:bookmarkEnd w:id="21"/>
     </w:p>
     <w:p>
       <w:pPr>
@@ -15855,12 +15643,6 @@
     </w:p>
     <w:p>
       <w:pPr>
-        <w:pStyle w:val="Titulo2Relatorio"/>
-        <w:spacing w:line="480" w:lineRule="auto"/>
-      </w:pPr>
-    </w:p>
-    <w:p>
-      <w:pPr>
         <w:pStyle w:val="Ttulo2"/>
         <w:spacing w:line="480" w:lineRule="auto"/>
         <w:jc w:val="both"/>
@@ -15870,7 +15652,7 @@
           <w:szCs w:val="24"/>
         </w:rPr>
       </w:pPr>
-      <w:bookmarkStart w:id="25" w:name="_Toc200386166"/>
+      <w:bookmarkStart w:id="22" w:name="_Toc200392641"/>
       <w:r>
         <w:rPr>
           <w:rFonts w:ascii="Times" w:hAnsi="Times" w:cs="Times"/>
@@ -15911,7 +15693,7 @@
         </w:rPr>
         <w:t>tilizado</w:t>
       </w:r>
-      <w:bookmarkEnd w:id="25"/>
+      <w:bookmarkEnd w:id="22"/>
     </w:p>
     <w:p>
       <w:pPr>
@@ -16001,11 +15783,11 @@
         <w:pStyle w:val="Ttulo3"/>
         <w:spacing w:line="480" w:lineRule="auto"/>
       </w:pPr>
-      <w:bookmarkStart w:id="26" w:name="_Toc200386167"/>
+      <w:bookmarkStart w:id="23" w:name="_Toc200392642"/>
       <w:r>
         <w:t>Sistema Operacional</w:t>
       </w:r>
-      <w:bookmarkEnd w:id="26"/>
+      <w:bookmarkEnd w:id="23"/>
     </w:p>
     <w:p>
       <w:pPr>
@@ -16115,14 +15897,14 @@
           <w:rFonts w:eastAsiaTheme="minorEastAsia"/>
         </w:rPr>
       </w:pPr>
-      <w:bookmarkStart w:id="27" w:name="_Toc200386168"/>
+      <w:bookmarkStart w:id="24" w:name="_Toc200392643"/>
       <w:r>
         <w:rPr>
           <w:rFonts w:eastAsiaTheme="minorEastAsia"/>
         </w:rPr>
         <w:t>RAM</w:t>
       </w:r>
-      <w:bookmarkEnd w:id="27"/>
+      <w:bookmarkEnd w:id="24"/>
     </w:p>
     <w:p>
       <w:pPr>
@@ -16224,7 +16006,7 @@
           <w:szCs w:val="24"/>
         </w:rPr>
       </w:pPr>
-      <w:bookmarkStart w:id="28" w:name="_Toc200386169"/>
+      <w:bookmarkStart w:id="25" w:name="_Toc200392644"/>
       <w:r>
         <w:rPr>
           <w:rFonts w:ascii="Times" w:hAnsi="Times" w:cs="Times"/>
@@ -16233,17 +16015,17 @@
         </w:rPr>
         <w:t>Conclusão</w:t>
       </w:r>
-      <w:bookmarkEnd w:id="28"/>
+      <w:bookmarkEnd w:id="25"/>
     </w:p>
     <w:p>
       <w:pPr>
         <w:pStyle w:val="Titulo2Relatorio"/>
       </w:pPr>
-      <w:bookmarkStart w:id="29" w:name="_Toc200386170"/>
+      <w:bookmarkStart w:id="26" w:name="_Toc200392645"/>
       <w:r>
         <w:t>Analisar os pontos fortes e fracos do algoritmo em comparação com outros algoritmos.</w:t>
       </w:r>
-      <w:bookmarkEnd w:id="29"/>
+      <w:bookmarkEnd w:id="26"/>
       <w:r>
         <w:t xml:space="preserve"> </w:t>
       </w:r>
@@ -16252,11 +16034,11 @@
       <w:pPr>
         <w:pStyle w:val="Titulo3Relatorio"/>
       </w:pPr>
-      <w:bookmarkStart w:id="30" w:name="_Toc200386171"/>
+      <w:bookmarkStart w:id="27" w:name="_Toc200392646"/>
       <w:r>
         <w:t>Pontos fortes</w:t>
       </w:r>
-      <w:bookmarkEnd w:id="30"/>
+      <w:bookmarkEnd w:id="27"/>
     </w:p>
     <w:p>
       <w:pPr>
@@ -16334,6 +16116,9 @@
     <w:p>
       <w:pPr>
         <w:pStyle w:val="NormalRelatorio"/>
+        <w:rPr>
+          <w:rFonts w:eastAsiaTheme="minorEastAsia"/>
+        </w:rPr>
       </w:pPr>
       <w:r>
         <w:t xml:space="preserve">O algoritmo de ordenação Heapsort geralmente é considerado uma versão melhorada do Selectionsort, pois além da sua grandeza </w:t>
@@ -16443,6 +16228,109 @@
     </w:p>
     <w:p>
       <w:pPr>
+        <w:pStyle w:val="Titulo3Relatorio"/>
+      </w:pPr>
+      <w:bookmarkStart w:id="28" w:name="_Toc200392647"/>
+      <w:r>
+        <w:t>Pontos fracos</w:t>
+      </w:r>
+      <w:bookmarkEnd w:id="28"/>
+    </w:p>
+    <w:p>
+      <w:pPr>
+        <w:pStyle w:val="Titulo4Relatorio"/>
+      </w:pPr>
+      <w:r>
+        <w:t>Instabilidade</w:t>
+      </w:r>
+    </w:p>
+    <w:p>
+      <w:pPr>
+        <w:spacing w:line="480" w:lineRule="auto"/>
+        <w:ind w:firstLine="708"/>
+        <w:jc w:val="both"/>
+        <w:rPr>
+          <w:rFonts w:ascii="Times" w:hAnsi="Times" w:cs="Times"/>
+          <w:sz w:val="24"/>
+          <w:szCs w:val="24"/>
+        </w:rPr>
+      </w:pPr>
+      <w:r>
+        <w:rPr>
+          <w:rFonts w:ascii="Times" w:hAnsi="Times" w:cs="Times"/>
+          <w:sz w:val="24"/>
+          <w:szCs w:val="24"/>
+        </w:rPr>
+        <w:t xml:space="preserve">O algoritmo de ordenação </w:t>
+      </w:r>
+      <w:r>
+        <w:rPr>
+          <w:rFonts w:ascii="Times" w:hAnsi="Times" w:cs="Times"/>
+          <w:sz w:val="24"/>
+          <w:szCs w:val="24"/>
+        </w:rPr>
+        <w:t>Heapsort</w:t>
+      </w:r>
+      <w:r>
+        <w:rPr>
+          <w:rFonts w:ascii="Times" w:hAnsi="Times" w:cs="Times"/>
+          <w:sz w:val="24"/>
+          <w:szCs w:val="24"/>
+        </w:rPr>
+        <w:t xml:space="preserve"> é considerado instável, e esse fato ocasiona a perda de dados, pois quando há valores iguais as posições são trocadas. </w:t>
+      </w:r>
+      <w:r>
+        <w:rPr>
+          <w:rFonts w:ascii="Times" w:hAnsi="Times" w:cs="Times"/>
+          <w:sz w:val="24"/>
+          <w:szCs w:val="24"/>
+        </w:rPr>
+        <w:t xml:space="preserve">Essa troca, afeta </w:t>
+      </w:r>
+      <w:r>
+        <w:rPr>
+          <w:rFonts w:ascii="Times" w:hAnsi="Times" w:cs="Times"/>
+          <w:sz w:val="24"/>
+          <w:szCs w:val="24"/>
+        </w:rPr>
+        <w:t xml:space="preserve">de forma significativa a </w:t>
+      </w:r>
+      <w:r>
+        <w:rPr>
+          <w:rFonts w:ascii="Times" w:hAnsi="Times" w:cs="Times"/>
+          <w:sz w:val="24"/>
+          <w:szCs w:val="24"/>
+        </w:rPr>
+        <w:t xml:space="preserve">ordem do </w:t>
+      </w:r>
+      <w:r>
+        <w:rPr>
+          <w:rFonts w:ascii="Times" w:hAnsi="Times" w:cs="Times"/>
+          <w:i/>
+          <w:sz w:val="24"/>
+          <w:szCs w:val="24"/>
+        </w:rPr>
+        <w:t>heap</w:t>
+      </w:r>
+      <w:r>
+        <w:rPr>
+          <w:rFonts w:ascii="Times" w:hAnsi="Times" w:cs="Times"/>
+          <w:sz w:val="24"/>
+          <w:szCs w:val="24"/>
+        </w:rPr>
+        <w:t xml:space="preserve"> original, tornando-o desfavorável em certas tomadas de decisão</w:t>
+      </w:r>
+      <w:r>
+        <w:rPr>
+          <w:rFonts w:ascii="Times" w:hAnsi="Times" w:cs="Times"/>
+          <w:sz w:val="24"/>
+          <w:szCs w:val="24"/>
+        </w:rPr>
+        <w:t>.</w:t>
+      </w:r>
+    </w:p>
+    <w:p>
+      <w:pPr>
         <w:pStyle w:val="Ttulo2"/>
         <w:spacing w:line="480" w:lineRule="auto"/>
         <w:jc w:val="both"/>
@@ -16452,13 +16340,14 @@
           <w:szCs w:val="24"/>
         </w:rPr>
       </w:pPr>
-      <w:bookmarkStart w:id="31" w:name="_Toc200386172"/>
-      <w:r>
-        <w:rPr>
-          <w:rFonts w:ascii="Times" w:hAnsi="Times" w:cs="Times"/>
-          <w:sz w:val="24"/>
-          <w:szCs w:val="24"/>
-        </w:rPr>
+      <w:bookmarkStart w:id="29" w:name="_Toc200392648"/>
+      <w:r>
+        <w:rPr>
+          <w:rFonts w:ascii="Times" w:hAnsi="Times" w:cs="Times"/>
+          <w:sz w:val="24"/>
+          <w:szCs w:val="24"/>
+        </w:rPr>
+        <w:lastRenderedPageBreak/>
         <w:t>Avaliação d</w:t>
       </w:r>
       <w:r>
@@ -16477,7 +16366,7 @@
         </w:rPr>
         <w:t>.</w:t>
       </w:r>
-      <w:bookmarkEnd w:id="31"/>
+      <w:bookmarkEnd w:id="29"/>
     </w:p>
     <w:p>
       <w:pPr>
@@ -16510,7 +16399,6 @@
         <w:spacing w:line="480" w:lineRule="auto"/>
       </w:pPr>
       <w:r>
-        <w:lastRenderedPageBreak/>
         <w:t xml:space="preserve">Quando a entrada é ordenada, a complexidade de tempo do algoritmo de ordenação Insertionsort é </w:t>
       </w:r>
       <m:oMath>
@@ -16772,6 +16660,36 @@
     </w:p>
     <w:p>
       <w:pPr>
+        <w:pStyle w:val="NormalRelatorio"/>
+        <w:spacing w:line="480" w:lineRule="auto"/>
+      </w:pPr>
+    </w:p>
+    <w:p>
+      <w:pPr>
+        <w:pStyle w:val="NormalRelatorio"/>
+        <w:spacing w:line="480" w:lineRule="auto"/>
+      </w:pPr>
+    </w:p>
+    <w:p>
+      <w:pPr>
+        <w:pStyle w:val="NormalRelatorio"/>
+        <w:spacing w:line="480" w:lineRule="auto"/>
+      </w:pPr>
+    </w:p>
+    <w:p>
+      <w:pPr>
+        <w:pStyle w:val="NormalRelatorio"/>
+        <w:spacing w:line="480" w:lineRule="auto"/>
+      </w:pPr>
+    </w:p>
+    <w:p>
+      <w:pPr>
+        <w:pStyle w:val="NormalRelatorio"/>
+        <w:spacing w:line="480" w:lineRule="auto"/>
+      </w:pPr>
+    </w:p>
+    <w:p>
+      <w:pPr>
         <w:pStyle w:val="Ttulo1"/>
         <w:numPr>
           <w:ilvl w:val="0"/>
@@ -16785,16 +16703,17 @@
           <w:szCs w:val="24"/>
         </w:rPr>
       </w:pPr>
-      <w:bookmarkStart w:id="32" w:name="_Toc200386173"/>
-      <w:r>
-        <w:rPr>
-          <w:rFonts w:ascii="Times" w:hAnsi="Times" w:cs="Times"/>
-          <w:sz w:val="24"/>
-          <w:szCs w:val="24"/>
-        </w:rPr>
+      <w:bookmarkStart w:id="30" w:name="_Toc200392649"/>
+      <w:r>
+        <w:rPr>
+          <w:rFonts w:ascii="Times" w:hAnsi="Times" w:cs="Times"/>
+          <w:sz w:val="24"/>
+          <w:szCs w:val="24"/>
+        </w:rPr>
+        <w:lastRenderedPageBreak/>
         <w:t>Referências</w:t>
       </w:r>
-      <w:bookmarkEnd w:id="32"/>
+      <w:bookmarkEnd w:id="30"/>
     </w:p>
     <w:p>
       <w:pPr>
@@ -16807,436 +16726,345 @@
           <w:szCs w:val="24"/>
         </w:rPr>
       </w:pPr>
-      <w:r>
-        <w:rPr>
-          <w:rFonts w:ascii="Times" w:hAnsi="Times" w:cs="Times"/>
-          <w:sz w:val="24"/>
-          <w:szCs w:val="24"/>
-        </w:rPr>
-        <w:t>Listagem de todas as referências (livros e artigos científicos) citados no relatório.</w:t>
-      </w:r>
     </w:p>
     <w:p>
       <w:pPr>
-        <w:pStyle w:val="PargrafodaLista"/>
-        <w:spacing w:line="480" w:lineRule="auto"/>
-        <w:jc w:val="both"/>
-        <w:rPr>
-          <w:rFonts w:ascii="Times" w:hAnsi="Times" w:cs="Times"/>
-          <w:sz w:val="24"/>
-          <w:szCs w:val="24"/>
-        </w:rPr>
-      </w:pPr>
+        <w:pStyle w:val="NormalWeb"/>
+        <w:numPr>
+          <w:ilvl w:val="0"/>
+          <w:numId w:val="12"/>
+        </w:numPr>
+        <w:spacing w:before="0" w:beforeAutospacing="0" w:after="0" w:afterAutospacing="0" w:line="360" w:lineRule="atLeast"/>
+        <w:rPr>
+          <w:rFonts w:ascii="Calibri" w:hAnsi="Calibri" w:cs="Calibri"/>
+          <w:color w:val="000000"/>
+          <w:sz w:val="22"/>
+          <w:szCs w:val="22"/>
+        </w:rPr>
+      </w:pPr>
+      <w:r>
+        <w:rPr>
+          <w:rFonts w:ascii="Calibri" w:hAnsi="Calibri" w:cs="Calibri"/>
+          <w:color w:val="000000"/>
+          <w:sz w:val="22"/>
+          <w:szCs w:val="22"/>
+        </w:rPr>
+        <w:t>PROGRAMIZ. </w:t>
+      </w:r>
+      <w:r>
+        <w:rPr>
+          <w:rFonts w:ascii="Calibri" w:hAnsi="Calibri" w:cs="Calibri"/>
+          <w:b/>
+          <w:bCs/>
+          <w:color w:val="000000"/>
+          <w:sz w:val="22"/>
+          <w:szCs w:val="22"/>
+        </w:rPr>
+        <w:t>Heap Sort Algorithm</w:t>
+      </w:r>
+      <w:r>
+        <w:rPr>
+          <w:rFonts w:ascii="Calibri" w:hAnsi="Calibri" w:cs="Calibri"/>
+          <w:color w:val="000000"/>
+          <w:sz w:val="22"/>
+          <w:szCs w:val="22"/>
+        </w:rPr>
+        <w:t>. Disponível em: &lt;https://www.programiz.com/dsa/heap-sort&gt;.</w:t>
+      </w:r>
     </w:p>
     <w:p>
       <w:pPr>
-        <w:pStyle w:val="PargrafodaLista"/>
-        <w:spacing w:line="480" w:lineRule="auto"/>
-        <w:jc w:val="both"/>
-        <w:rPr>
-          <w:rFonts w:ascii="Times" w:hAnsi="Times" w:cs="Times"/>
-          <w:sz w:val="24"/>
-          <w:szCs w:val="24"/>
-        </w:rPr>
-      </w:pPr>
-      <w:hyperlink r:id="rId32" w:history="1">
-        <w:r>
-          <w:rPr>
-            <w:rStyle w:val="Hyperlink"/>
-            <w:rFonts w:ascii="Times" w:hAnsi="Times" w:cs="Times"/>
-            <w:i/>
-            <w:sz w:val="24"/>
-            <w:szCs w:val="24"/>
-          </w:rPr>
-          <w:t>Heap</w:t>
-        </w:r>
-        <w:r>
-          <w:rPr>
-            <w:rStyle w:val="Hyperlink"/>
-            <w:rFonts w:ascii="Times" w:hAnsi="Times" w:cs="Times"/>
-            <w:sz w:val="24"/>
-            <w:szCs w:val="24"/>
-          </w:rPr>
-          <w:t xml:space="preserve"> Sort (With Code in Python, C++, Java and C)</w:t>
-        </w:r>
-      </w:hyperlink>
+        <w:pStyle w:val="NormalWeb"/>
+        <w:numPr>
+          <w:ilvl w:val="0"/>
+          <w:numId w:val="12"/>
+        </w:numPr>
+        <w:spacing w:before="0" w:beforeAutospacing="0" w:after="0" w:afterAutospacing="0" w:line="360" w:lineRule="atLeast"/>
+        <w:rPr>
+          <w:rFonts w:ascii="Calibri" w:hAnsi="Calibri" w:cs="Calibri"/>
+          <w:color w:val="000000"/>
+          <w:sz w:val="22"/>
+          <w:szCs w:val="22"/>
+        </w:rPr>
+      </w:pPr>
+      <w:r>
+        <w:rPr>
+          <w:rFonts w:ascii="Calibri" w:hAnsi="Calibri" w:cs="Calibri"/>
+          <w:color w:val="000000"/>
+          <w:sz w:val="22"/>
+          <w:szCs w:val="22"/>
+        </w:rPr>
+        <w:t>GEEKSFORGEEKS. </w:t>
+      </w:r>
+      <w:r>
+        <w:rPr>
+          <w:rFonts w:ascii="Calibri" w:hAnsi="Calibri" w:cs="Calibri"/>
+          <w:b/>
+          <w:bCs/>
+          <w:color w:val="000000"/>
+          <w:sz w:val="22"/>
+          <w:szCs w:val="22"/>
+        </w:rPr>
+        <w:t>C Program for Heap Sort</w:t>
+      </w:r>
+      <w:r>
+        <w:rPr>
+          <w:rFonts w:ascii="Calibri" w:hAnsi="Calibri" w:cs="Calibri"/>
+          <w:color w:val="000000"/>
+          <w:sz w:val="22"/>
+          <w:szCs w:val="22"/>
+        </w:rPr>
+        <w:t>. Disponível em: &lt;https://www.geeksforgeeks.org/c-program-for-heap-sort/&gt;.</w:t>
+      </w:r>
     </w:p>
     <w:p>
       <w:pPr>
-        <w:pStyle w:val="PargrafodaLista"/>
-        <w:spacing w:line="480" w:lineRule="auto"/>
-        <w:jc w:val="both"/>
-        <w:rPr>
-          <w:rFonts w:ascii="Times" w:hAnsi="Times" w:cs="Times"/>
-          <w:sz w:val="24"/>
-          <w:szCs w:val="24"/>
-        </w:rPr>
-      </w:pPr>
-      <w:hyperlink r:id="rId33" w:history="1">
-        <w:r>
-          <w:rPr>
-            <w:rStyle w:val="Hyperlink"/>
-            <w:rFonts w:ascii="Times" w:hAnsi="Times" w:cs="Times"/>
-            <w:sz w:val="24"/>
-            <w:szCs w:val="24"/>
-          </w:rPr>
-          <w:t xml:space="preserve">C Program for </w:t>
-        </w:r>
-        <w:r>
-          <w:rPr>
-            <w:rStyle w:val="Hyperlink"/>
-            <w:rFonts w:ascii="Times" w:hAnsi="Times" w:cs="Times"/>
-            <w:i/>
-            <w:sz w:val="24"/>
-            <w:szCs w:val="24"/>
-          </w:rPr>
-          <w:t>Heap</w:t>
-        </w:r>
-        <w:r>
-          <w:rPr>
-            <w:rStyle w:val="Hyperlink"/>
-            <w:rFonts w:ascii="Times" w:hAnsi="Times" w:cs="Times"/>
-            <w:sz w:val="24"/>
-            <w:szCs w:val="24"/>
-          </w:rPr>
-          <w:t xml:space="preserve"> Sort | GeeksforGeeks</w:t>
-        </w:r>
-      </w:hyperlink>
+        <w:pStyle w:val="NormalWeb"/>
+        <w:numPr>
+          <w:ilvl w:val="0"/>
+          <w:numId w:val="12"/>
+        </w:numPr>
+        <w:spacing w:before="0" w:beforeAutospacing="0" w:after="0" w:afterAutospacing="0" w:line="360" w:lineRule="atLeast"/>
+        <w:rPr>
+          <w:rFonts w:ascii="Calibri" w:hAnsi="Calibri" w:cs="Calibri"/>
+          <w:color w:val="000000"/>
+          <w:sz w:val="22"/>
+          <w:szCs w:val="22"/>
+        </w:rPr>
+      </w:pPr>
+      <w:r>
+        <w:rPr>
+          <w:rFonts w:ascii="Calibri" w:hAnsi="Calibri" w:cs="Calibri"/>
+          <w:color w:val="000000"/>
+          <w:sz w:val="22"/>
+          <w:szCs w:val="22"/>
+        </w:rPr>
+        <w:t>TENENBAUM, A. M.; LANGSAM, Y.; AUGENSTEIN, M. J. </w:t>
+      </w:r>
+      <w:r>
+        <w:rPr>
+          <w:rFonts w:ascii="Calibri" w:hAnsi="Calibri" w:cs="Calibri"/>
+          <w:b/>
+          <w:bCs/>
+          <w:color w:val="000000"/>
+          <w:sz w:val="22"/>
+          <w:szCs w:val="22"/>
+        </w:rPr>
+        <w:t>Estruturas de dados usando C</w:t>
+      </w:r>
+      <w:r>
+        <w:rPr>
+          <w:rFonts w:ascii="Calibri" w:hAnsi="Calibri" w:cs="Calibri"/>
+          <w:color w:val="000000"/>
+          <w:sz w:val="22"/>
+          <w:szCs w:val="22"/>
+        </w:rPr>
+        <w:t>. [s.l: s.n.].</w:t>
+      </w:r>
     </w:p>
     <w:p>
       <w:pPr>
-        <w:pStyle w:val="PargrafodaLista"/>
-        <w:spacing w:line="480" w:lineRule="auto"/>
-        <w:jc w:val="both"/>
-        <w:rPr>
-          <w:rFonts w:ascii="Times" w:hAnsi="Times" w:cs="Times"/>
-          <w:sz w:val="24"/>
-          <w:szCs w:val="24"/>
-        </w:rPr>
-      </w:pPr>
-      <w:hyperlink r:id="rId34" w:history="1">
-        <w:r>
-          <w:rPr>
-            <w:rStyle w:val="Hyperlink"/>
-            <w:rFonts w:ascii="Times" w:hAnsi="Times" w:cs="Times"/>
-            <w:sz w:val="24"/>
-            <w:szCs w:val="24"/>
-          </w:rPr>
-          <w:t xml:space="preserve">(11) C Program For </w:t>
-        </w:r>
-        <w:r>
-          <w:rPr>
-            <w:rStyle w:val="Hyperlink"/>
-            <w:rFonts w:ascii="Times" w:hAnsi="Times" w:cs="Times"/>
-            <w:i/>
-            <w:sz w:val="24"/>
-            <w:szCs w:val="24"/>
-          </w:rPr>
-          <w:t>Heap</w:t>
-        </w:r>
-        <w:r>
-          <w:rPr>
-            <w:rStyle w:val="Hyperlink"/>
-            <w:rFonts w:ascii="Times" w:hAnsi="Times" w:cs="Times"/>
-            <w:sz w:val="24"/>
-            <w:szCs w:val="24"/>
-          </w:rPr>
-          <w:t xml:space="preserve"> Sort Algorithm - YouTube</w:t>
-        </w:r>
-      </w:hyperlink>
+        <w:pStyle w:val="NormalWeb"/>
+        <w:numPr>
+          <w:ilvl w:val="0"/>
+          <w:numId w:val="12"/>
+        </w:numPr>
+        <w:spacing w:before="0" w:beforeAutospacing="0" w:after="0" w:afterAutospacing="0" w:line="360" w:lineRule="atLeast"/>
+        <w:rPr>
+          <w:rFonts w:ascii="Calibri" w:hAnsi="Calibri" w:cs="Calibri"/>
+          <w:color w:val="000000"/>
+          <w:sz w:val="22"/>
+          <w:szCs w:val="22"/>
+        </w:rPr>
+      </w:pPr>
+      <w:r>
+        <w:rPr>
+          <w:rFonts w:ascii="Calibri" w:hAnsi="Calibri" w:cs="Calibri"/>
+          <w:color w:val="000000"/>
+          <w:sz w:val="22"/>
+          <w:szCs w:val="22"/>
+        </w:rPr>
+        <w:t>CODE, R. </w:t>
+      </w:r>
+      <w:r>
+        <w:rPr>
+          <w:rFonts w:ascii="Calibri" w:hAnsi="Calibri" w:cs="Calibri"/>
+          <w:b/>
+          <w:bCs/>
+          <w:color w:val="000000"/>
+          <w:sz w:val="22"/>
+          <w:szCs w:val="22"/>
+        </w:rPr>
+        <w:t>Sorting algorithms/Heapsort - Rosetta Code</w:t>
+      </w:r>
+      <w:r>
+        <w:rPr>
+          <w:rFonts w:ascii="Calibri" w:hAnsi="Calibri" w:cs="Calibri"/>
+          <w:color w:val="000000"/>
+          <w:sz w:val="22"/>
+          <w:szCs w:val="22"/>
+        </w:rPr>
+        <w:t>. Disponível em: &lt;https://rosettacode.org/wiki/Sorting_algorithms/Heapsort#C&gt;. Acesso em: 6 jun. 2025.</w:t>
+      </w:r>
     </w:p>
     <w:p>
       <w:pPr>
-        <w:pStyle w:val="PargrafodaLista"/>
-        <w:spacing w:line="480" w:lineRule="auto"/>
-        <w:jc w:val="both"/>
-        <w:rPr>
-          <w:rFonts w:ascii="Times" w:hAnsi="Times" w:cs="Times"/>
-          <w:sz w:val="24"/>
-          <w:szCs w:val="24"/>
-        </w:rPr>
-      </w:pPr>
-      <w:hyperlink r:id="rId35" w:history="1">
-        <w:r>
-          <w:rPr>
-            <w:rStyle w:val="Hyperlink"/>
-            <w:rFonts w:ascii="Times" w:hAnsi="Times" w:cs="Times"/>
-            <w:sz w:val="24"/>
-            <w:szCs w:val="24"/>
-          </w:rPr>
-          <w:t xml:space="preserve">(11) </w:t>
-        </w:r>
-        <w:r>
-          <w:rPr>
-            <w:rStyle w:val="Hyperlink"/>
-            <w:rFonts w:ascii="Times" w:hAnsi="Times" w:cs="Times"/>
-            <w:i/>
-            <w:sz w:val="24"/>
-            <w:szCs w:val="24"/>
-          </w:rPr>
-          <w:t>Heap</w:t>
-        </w:r>
-        <w:r>
-          <w:rPr>
-            <w:rStyle w:val="Hyperlink"/>
-            <w:rFonts w:ascii="Times" w:hAnsi="Times" w:cs="Times"/>
-            <w:sz w:val="24"/>
-            <w:szCs w:val="24"/>
-          </w:rPr>
-          <w:t xml:space="preserve"> Sort Algorithm - YouTube</w:t>
-        </w:r>
-      </w:hyperlink>
+        <w:pStyle w:val="NormalWeb"/>
+        <w:numPr>
+          <w:ilvl w:val="0"/>
+          <w:numId w:val="12"/>
+        </w:numPr>
+        <w:spacing w:before="0" w:beforeAutospacing="0" w:after="0" w:afterAutospacing="0" w:line="360" w:lineRule="atLeast"/>
+        <w:rPr>
+          <w:rFonts w:ascii="Calibri" w:hAnsi="Calibri" w:cs="Calibri"/>
+          <w:color w:val="000000"/>
+          <w:sz w:val="22"/>
+          <w:szCs w:val="22"/>
+        </w:rPr>
+      </w:pPr>
+      <w:r>
+        <w:rPr>
+          <w:rFonts w:ascii="Calibri" w:hAnsi="Calibri" w:cs="Calibri"/>
+          <w:b/>
+          <w:bCs/>
+          <w:color w:val="000000"/>
+          <w:sz w:val="22"/>
+          <w:szCs w:val="22"/>
+        </w:rPr>
+        <w:t>Heapsort algorithm: correctness and performance analysis</w:t>
+      </w:r>
+      <w:r>
+        <w:rPr>
+          <w:rFonts w:ascii="Calibri" w:hAnsi="Calibri" w:cs="Calibri"/>
+          <w:color w:val="000000"/>
+          <w:sz w:val="22"/>
+          <w:szCs w:val="22"/>
+        </w:rPr>
+        <w:t>. Disponível em: &lt;https://www.ime.usp.br/~pf/algorithms/chapters/heapsort.html&gt;.</w:t>
+      </w:r>
+      <w:r>
+        <w:t xml:space="preserve"> </w:t>
+      </w:r>
     </w:p>
     <w:p>
       <w:pPr>
-        <w:pStyle w:val="PargrafodaLista"/>
-        <w:spacing w:line="480" w:lineRule="auto"/>
-        <w:jc w:val="both"/>
-        <w:rPr>
-          <w:rFonts w:ascii="Times" w:hAnsi="Times" w:cs="Times"/>
-          <w:sz w:val="24"/>
-          <w:szCs w:val="24"/>
-        </w:rPr>
-      </w:pPr>
-      <w:r>
-        <w:rPr>
-          <w:rFonts w:ascii="Times" w:hAnsi="Times" w:cs="Times"/>
-          <w:sz w:val="24"/>
-          <w:szCs w:val="24"/>
-        </w:rPr>
-        <w:t>Livro</w:t>
-      </w:r>
-      <w:r>
-        <w:rPr>
-          <w:rFonts w:ascii="Times" w:hAnsi="Times" w:cs="Times"/>
-          <w:sz w:val="24"/>
-          <w:szCs w:val="24"/>
-        </w:rPr>
-        <w:t xml:space="preserve"> Estrutura de Dados Usando C</w:t>
+        <w:pStyle w:val="NormalWeb"/>
+        <w:numPr>
+          <w:ilvl w:val="0"/>
+          <w:numId w:val="12"/>
+        </w:numPr>
+        <w:spacing w:before="0" w:beforeAutospacing="0" w:after="0" w:afterAutospacing="0" w:line="360" w:lineRule="atLeast"/>
+        <w:rPr>
+          <w:rFonts w:ascii="Calibri" w:hAnsi="Calibri" w:cs="Calibri"/>
+          <w:color w:val="000000"/>
+          <w:sz w:val="22"/>
+          <w:szCs w:val="22"/>
+        </w:rPr>
+      </w:pPr>
+      <w:r>
+        <w:rPr>
+          <w:rFonts w:ascii="Calibri" w:hAnsi="Calibri" w:cs="Calibri"/>
+          <w:b/>
+          <w:bCs/>
+          <w:color w:val="000000"/>
+          <w:sz w:val="22"/>
+          <w:szCs w:val="22"/>
+        </w:rPr>
+        <w:t>Analysis of String Sorting using Heapsort : Igor Stassiy : Free Download, Borrow, and Streaming : Internet Archive</w:t>
+      </w:r>
+      <w:r>
+        <w:rPr>
+          <w:rFonts w:ascii="Calibri" w:hAnsi="Calibri" w:cs="Calibri"/>
+          <w:color w:val="000000"/>
+          <w:sz w:val="22"/>
+          <w:szCs w:val="22"/>
+        </w:rPr>
+        <w:t>. Disponível em: &lt;https://archive.org/details/arxiv-1408.5422&gt;. Acesso em: 4 jun. 2025.</w:t>
       </w:r>
     </w:p>
     <w:p>
       <w:pPr>
-        <w:pStyle w:val="PargrafodaLista"/>
-        <w:spacing w:line="480" w:lineRule="auto"/>
-        <w:jc w:val="both"/>
-        <w:rPr>
-          <w:rFonts w:ascii="Times" w:hAnsi="Times" w:cs="Times"/>
-          <w:sz w:val="24"/>
-          <w:szCs w:val="24"/>
-        </w:rPr>
-      </w:pPr>
-      <w:hyperlink r:id="rId36" w:anchor="1725d7" w:history="1">
-        <w:r>
-          <w:rPr>
-            <w:rStyle w:val="Hyperlink"/>
-            <w:rFonts w:ascii="Times" w:hAnsi="Times" w:cs="Times"/>
-            <w:sz w:val="24"/>
-            <w:szCs w:val="24"/>
-          </w:rPr>
-          <w:t>https://www.overleaf.com/read/pgbjkmsbdkkc#1725d7</w:t>
-        </w:r>
-      </w:hyperlink>
+        <w:pStyle w:val="NormalWeb"/>
+        <w:numPr>
+          <w:ilvl w:val="0"/>
+          <w:numId w:val="12"/>
+        </w:numPr>
+        <w:spacing w:before="0" w:beforeAutospacing="0" w:after="0" w:afterAutospacing="0" w:line="360" w:lineRule="atLeast"/>
+        <w:rPr>
+          <w:rFonts w:ascii="Calibri" w:hAnsi="Calibri" w:cs="Calibri"/>
+          <w:color w:val="000000"/>
+          <w:sz w:val="22"/>
+          <w:szCs w:val="22"/>
+        </w:rPr>
+      </w:pPr>
+      <w:r>
+        <w:rPr>
+          <w:rFonts w:ascii="Calibri" w:hAnsi="Calibri" w:cs="Calibri"/>
+          <w:b/>
+          <w:bCs/>
+          <w:color w:val="000000"/>
+          <w:sz w:val="22"/>
+          <w:szCs w:val="22"/>
+        </w:rPr>
+        <w:t>O Algoritmo HeapSort</w:t>
+      </w:r>
+      <w:r>
+        <w:rPr>
+          <w:rFonts w:ascii="Calibri" w:hAnsi="Calibri" w:cs="Calibri"/>
+          <w:color w:val="000000"/>
+          <w:sz w:val="22"/>
+          <w:szCs w:val="22"/>
+        </w:rPr>
+        <w:t>. Disponível em: &lt;http://www.dsc.ufcg.edu.br/~pet/jornal/maio2013/materias/historia_da_computacao.html&gt;.</w:t>
+      </w:r>
     </w:p>
     <w:p>
       <w:pPr>
-        <w:pStyle w:val="PargrafodaLista"/>
-        <w:spacing w:line="480" w:lineRule="auto"/>
-        <w:jc w:val="both"/>
-      </w:pPr>
-      <w:hyperlink r:id="rId37" w:anchor="C" w:history="1">
-        <w:r>
-          <w:rPr>
-            <w:rStyle w:val="Hyperlink"/>
-          </w:rPr>
-          <w:t>Sorting algorithms/</w:t>
-        </w:r>
-        <w:r>
-          <w:rPr>
-            <w:rStyle w:val="Hyperlink"/>
-            <w:i/>
-          </w:rPr>
-          <w:t>Heap</w:t>
-        </w:r>
-        <w:r>
-          <w:rPr>
-            <w:rStyle w:val="Hyperlink"/>
-          </w:rPr>
-          <w:t>sort - Rosetta Code</w:t>
-        </w:r>
-      </w:hyperlink>
-    </w:p>
-    <w:p>
-      <w:pPr>
-        <w:pStyle w:val="PargrafodaLista"/>
-        <w:spacing w:line="480" w:lineRule="auto"/>
-        <w:jc w:val="both"/>
-      </w:pPr>
-      <w:hyperlink r:id="rId38" w:history="1">
-        <w:r>
-          <w:rPr>
-            <w:rStyle w:val="Hyperlink"/>
-            <w:i/>
-          </w:rPr>
-          <w:t>Heap</w:t>
-        </w:r>
-        <w:r>
-          <w:rPr>
-            <w:rStyle w:val="Hyperlink"/>
-          </w:rPr>
-          <w:t>sort algorithm: correctness and performance analysis</w:t>
-        </w:r>
-      </w:hyperlink>
-    </w:p>
-    <w:p>
-      <w:pPr>
-        <w:pStyle w:val="PargrafodaLista"/>
-        <w:spacing w:line="480" w:lineRule="auto"/>
-        <w:jc w:val="both"/>
-      </w:pPr>
-      <w:hyperlink r:id="rId39" w:history="1">
-        <w:r>
-          <w:rPr>
-            <w:rStyle w:val="Hyperlink"/>
-          </w:rPr>
-          <w:t xml:space="preserve">AEDS2.13 </w:t>
-        </w:r>
-        <w:r>
-          <w:rPr>
-            <w:rStyle w:val="Hyperlink"/>
-            <w:i/>
-          </w:rPr>
-          <w:t>Heap</w:t>
-        </w:r>
-        <w:r>
-          <w:rPr>
-            <w:rStyle w:val="Hyperlink"/>
-          </w:rPr>
-          <w:t>sort.pdf</w:t>
-        </w:r>
-      </w:hyperlink>
-    </w:p>
-    <w:p>
-      <w:pPr>
-        <w:pStyle w:val="PargrafodaLista"/>
-        <w:spacing w:line="480" w:lineRule="auto"/>
-        <w:jc w:val="both"/>
-      </w:pPr>
-      <w:hyperlink r:id="rId40" w:history="1">
-        <w:r>
-          <w:rPr>
-            <w:rStyle w:val="Hyperlink"/>
-          </w:rPr>
-          <w:t>Analysis of String Sorting using Heapsort : Igor Stassiy : Free Download, Borrow, and Streaming : Internet Archive</w:t>
-        </w:r>
-      </w:hyperlink>
-    </w:p>
-    <w:p>
-      <w:pPr>
-        <w:pStyle w:val="PargrafodaLista"/>
-        <w:spacing w:line="480" w:lineRule="auto"/>
-        <w:jc w:val="both"/>
-      </w:pPr>
-      <w:hyperlink r:id="rId41" w:history="1">
-        <w:r>
-          <w:rPr>
-            <w:rStyle w:val="Hyperlink"/>
-          </w:rPr>
-          <w:t>História da Computação | PETNews - O Algoritmo HeapSort</w:t>
-        </w:r>
-      </w:hyperlink>
-    </w:p>
-    <w:p>
-      <w:pPr>
-        <w:pStyle w:val="PargrafodaLista"/>
-        <w:spacing w:line="480" w:lineRule="auto"/>
-        <w:jc w:val="both"/>
-        <w:rPr>
-          <w:rFonts w:ascii="Times" w:hAnsi="Times" w:cs="Times"/>
-          <w:sz w:val="24"/>
-          <w:szCs w:val="24"/>
-        </w:rPr>
-      </w:pPr>
-      <w:hyperlink r:id="rId42" w:history="1">
-        <w:r>
-          <w:rPr>
-            <w:rStyle w:val="Hyperlink"/>
-            <w:rFonts w:ascii="Times" w:hAnsi="Times" w:cs="Times"/>
-            <w:sz w:val="24"/>
-            <w:szCs w:val="24"/>
-          </w:rPr>
-          <w:t>http://www.dsc.ufcg.edu.br/~pet/jornal/maio2013/materias/historia_da_computacao.html</w:t>
-        </w:r>
-      </w:hyperlink>
-    </w:p>
-    <w:p>
-      <w:pPr>
-        <w:pStyle w:val="PargrafodaLista"/>
-        <w:spacing w:line="480" w:lineRule="auto"/>
-        <w:jc w:val="both"/>
-        <w:rPr>
-          <w:rFonts w:ascii="Times" w:hAnsi="Times" w:cs="Times"/>
-          <w:sz w:val="24"/>
-          <w:szCs w:val="24"/>
-        </w:rPr>
-      </w:pPr>
-      <w:hyperlink r:id="rId43" w:history="1">
-        <w:r>
-          <w:rPr>
-            <w:rStyle w:val="Hyperlink"/>
-            <w:rFonts w:ascii="Times" w:hAnsi="Times" w:cs="Times"/>
-            <w:sz w:val="24"/>
-            <w:szCs w:val="24"/>
-          </w:rPr>
-          <w:t>http://www.dsc.ufcg.edu.br/~pet/jornal/maio2013/materias/historia_da_computacao.html</w:t>
-        </w:r>
-      </w:hyperlink>
-    </w:p>
-    <w:p>
-      <w:pPr>
-        <w:pStyle w:val="PargrafodaLista"/>
-        <w:spacing w:line="480" w:lineRule="auto"/>
-        <w:jc w:val="both"/>
-        <w:rPr>
-          <w:rFonts w:ascii="Times" w:hAnsi="Times" w:cs="Times"/>
-          <w:sz w:val="24"/>
-          <w:szCs w:val="24"/>
-        </w:rPr>
-      </w:pPr>
-      <w:hyperlink r:id="rId44" w:history="1">
-        <w:r>
-          <w:rPr>
-            <w:rStyle w:val="Hyperlink"/>
-            <w:rFonts w:ascii="Times" w:hAnsi="Times" w:cs="Times"/>
-            <w:sz w:val="24"/>
-            <w:szCs w:val="24"/>
-          </w:rPr>
-          <w:t>http://www.dsc.ufcg.edu.br/~pet/jornal/maio2013/materias/historia_da_computacao.html</w:t>
-        </w:r>
-      </w:hyperlink>
-    </w:p>
-    <w:p>
-      <w:pPr>
-        <w:pStyle w:val="PargrafodaLista"/>
-        <w:spacing w:line="480" w:lineRule="auto"/>
-        <w:jc w:val="both"/>
-        <w:rPr>
-          <w:rFonts w:ascii="Times" w:hAnsi="Times" w:cs="Times"/>
-          <w:sz w:val="24"/>
-          <w:szCs w:val="24"/>
-        </w:rPr>
-      </w:pPr>
-      <w:hyperlink r:id="rId45" w:history="1">
-        <w:r>
-          <w:rPr>
-            <w:rStyle w:val="Hyperlink"/>
-          </w:rPr>
-          <w:t>Analysis of String Sorting using Heapsort : Igor Stassiy : Free Download, Borrow, and Streaming : Internet Archive</w:t>
-        </w:r>
-      </w:hyperlink>
+        <w:pStyle w:val="NormalWeb"/>
+        <w:numPr>
+          <w:ilvl w:val="0"/>
+          <w:numId w:val="12"/>
+        </w:numPr>
+        <w:spacing w:before="0" w:beforeAutospacing="0" w:after="0" w:afterAutospacing="0" w:line="360" w:lineRule="atLeast"/>
+        <w:rPr>
+          <w:rFonts w:ascii="Calibri" w:hAnsi="Calibri" w:cs="Calibri"/>
+          <w:color w:val="000000"/>
+          <w:sz w:val="22"/>
+          <w:szCs w:val="22"/>
+        </w:rPr>
+      </w:pPr>
+      <w:r>
+        <w:rPr>
+          <w:rFonts w:ascii="Calibri" w:hAnsi="Calibri" w:cs="Calibri"/>
+          <w:color w:val="000000"/>
+          <w:sz w:val="22"/>
+          <w:szCs w:val="22"/>
+        </w:rPr>
+        <w:t>GEEKSFORGEEKS. </w:t>
+      </w:r>
+      <w:r>
+        <w:rPr>
+          <w:rFonts w:ascii="Calibri" w:hAnsi="Calibri" w:cs="Calibri"/>
+          <w:b/>
+          <w:bCs/>
+          <w:color w:val="000000"/>
+          <w:sz w:val="22"/>
+          <w:szCs w:val="22"/>
+        </w:rPr>
+        <w:t>Heap Sort Data Structures and Algorithms Tutorials</w:t>
+      </w:r>
+      <w:r>
+        <w:rPr>
+          <w:rFonts w:ascii="Calibri" w:hAnsi="Calibri" w:cs="Calibri"/>
+          <w:color w:val="000000"/>
+          <w:sz w:val="22"/>
+          <w:szCs w:val="22"/>
+        </w:rPr>
+        <w:t>. Disponível em: &lt;https://www.geeksforgeeks.org/heap-sort/#complexity-analysis-of-heap-sort&gt;.</w:t>
+      </w:r>
     </w:p>
     <w:sectPr>
-      <w:footerReference w:type="default" r:id="rId46"/>
+      <w:footerReference w:type="default" r:id="rId32"/>
       <w:pgSz w:w="11906" w:h="16838" w:code="9"/>
       <w:pgMar w:top="1440" w:right="1440" w:bottom="1440" w:left="1440" w:header="709" w:footer="709" w:gutter="0"/>
       <w:cols w:space="708"/>
@@ -17293,7 +17121,7 @@
             <w:rPr>
               <w:noProof/>
             </w:rPr>
-            <w:t>22</w:t>
+            <w:t>21</w:t>
           </w:r>
         </w:fldSimple>
       </w:p>
@@ -17984,6 +17812,119 @@
     </w:lvl>
   </w:abstractNum>
   <w:abstractNum w:abstractNumId="6">
+    <w:nsid w:val="38A96019"/>
+    <w:multiLevelType w:val="hybridMultilevel"/>
+    <w:tmpl w:val="CB36834A"/>
+    <w:lvl w:ilvl="0" w:tplc="04160001">
+      <w:start w:val="1"/>
+      <w:numFmt w:val="bullet"/>
+      <w:lvlText w:val=""/>
+      <w:lvlJc w:val="left"/>
+      <w:pPr>
+        <w:ind w:left="720" w:hanging="360"/>
+      </w:pPr>
+      <w:rPr>
+        <w:rFonts w:ascii="Symbol" w:hAnsi="Symbol" w:hint="default"/>
+      </w:rPr>
+    </w:lvl>
+    <w:lvl w:ilvl="1" w:tplc="04160003" w:tentative="1">
+      <w:start w:val="1"/>
+      <w:numFmt w:val="bullet"/>
+      <w:lvlText w:val="o"/>
+      <w:lvlJc w:val="left"/>
+      <w:pPr>
+        <w:ind w:left="1440" w:hanging="360"/>
+      </w:pPr>
+      <w:rPr>
+        <w:rFonts w:ascii="Courier New" w:hAnsi="Courier New" w:cs="Courier New" w:hint="default"/>
+      </w:rPr>
+    </w:lvl>
+    <w:lvl w:ilvl="2" w:tplc="04160005" w:tentative="1">
+      <w:start w:val="1"/>
+      <w:numFmt w:val="bullet"/>
+      <w:lvlText w:val=""/>
+      <w:lvlJc w:val="left"/>
+      <w:pPr>
+        <w:ind w:left="2160" w:hanging="360"/>
+      </w:pPr>
+      <w:rPr>
+        <w:rFonts w:ascii="Wingdings" w:hAnsi="Wingdings" w:hint="default"/>
+      </w:rPr>
+    </w:lvl>
+    <w:lvl w:ilvl="3" w:tplc="04160001" w:tentative="1">
+      <w:start w:val="1"/>
+      <w:numFmt w:val="bullet"/>
+      <w:lvlText w:val=""/>
+      <w:lvlJc w:val="left"/>
+      <w:pPr>
+        <w:ind w:left="2880" w:hanging="360"/>
+      </w:pPr>
+      <w:rPr>
+        <w:rFonts w:ascii="Symbol" w:hAnsi="Symbol" w:hint="default"/>
+      </w:rPr>
+    </w:lvl>
+    <w:lvl w:ilvl="4" w:tplc="04160003" w:tentative="1">
+      <w:start w:val="1"/>
+      <w:numFmt w:val="bullet"/>
+      <w:lvlText w:val="o"/>
+      <w:lvlJc w:val="left"/>
+      <w:pPr>
+        <w:ind w:left="3600" w:hanging="360"/>
+      </w:pPr>
+      <w:rPr>
+        <w:rFonts w:ascii="Courier New" w:hAnsi="Courier New" w:cs="Courier New" w:hint="default"/>
+      </w:rPr>
+    </w:lvl>
+    <w:lvl w:ilvl="5" w:tplc="04160005" w:tentative="1">
+      <w:start w:val="1"/>
+      <w:numFmt w:val="bullet"/>
+      <w:lvlText w:val=""/>
+      <w:lvlJc w:val="left"/>
+      <w:pPr>
+        <w:ind w:left="4320" w:hanging="360"/>
+      </w:pPr>
+      <w:rPr>
+        <w:rFonts w:ascii="Wingdings" w:hAnsi="Wingdings" w:hint="default"/>
+      </w:rPr>
+    </w:lvl>
+    <w:lvl w:ilvl="6" w:tplc="04160001" w:tentative="1">
+      <w:start w:val="1"/>
+      <w:numFmt w:val="bullet"/>
+      <w:lvlText w:val=""/>
+      <w:lvlJc w:val="left"/>
+      <w:pPr>
+        <w:ind w:left="5040" w:hanging="360"/>
+      </w:pPr>
+      <w:rPr>
+        <w:rFonts w:ascii="Symbol" w:hAnsi="Symbol" w:hint="default"/>
+      </w:rPr>
+    </w:lvl>
+    <w:lvl w:ilvl="7" w:tplc="04160003" w:tentative="1">
+      <w:start w:val="1"/>
+      <w:numFmt w:val="bullet"/>
+      <w:lvlText w:val="o"/>
+      <w:lvlJc w:val="left"/>
+      <w:pPr>
+        <w:ind w:left="5760" w:hanging="360"/>
+      </w:pPr>
+      <w:rPr>
+        <w:rFonts w:ascii="Courier New" w:hAnsi="Courier New" w:cs="Courier New" w:hint="default"/>
+      </w:rPr>
+    </w:lvl>
+    <w:lvl w:ilvl="8" w:tplc="04160005" w:tentative="1">
+      <w:start w:val="1"/>
+      <w:numFmt w:val="bullet"/>
+      <w:lvlText w:val=""/>
+      <w:lvlJc w:val="left"/>
+      <w:pPr>
+        <w:ind w:left="6480" w:hanging="360"/>
+      </w:pPr>
+      <w:rPr>
+        <w:rFonts w:ascii="Wingdings" w:hAnsi="Wingdings" w:hint="default"/>
+      </w:rPr>
+    </w:lvl>
+  </w:abstractNum>
+  <w:abstractNum w:abstractNumId="7">
     <w:nsid w:val="393F5EB5"/>
     <w:multiLevelType w:val="hybridMultilevel"/>
     <w:tmpl w:val="9252B894"/>
@@ -18069,7 +18010,7 @@
       </w:pPr>
     </w:lvl>
   </w:abstractNum>
-  <w:abstractNum w:abstractNumId="7">
+  <w:abstractNum w:abstractNumId="8">
     <w:nsid w:val="3C961523"/>
     <w:multiLevelType w:val="hybridMultilevel"/>
     <w:tmpl w:val="29F8812C"/>
@@ -18181,7 +18122,7 @@
       </w:rPr>
     </w:lvl>
   </w:abstractNum>
-  <w:abstractNum w:abstractNumId="8">
+  <w:abstractNum w:abstractNumId="9">
     <w:nsid w:val="3E6867CD"/>
     <w:multiLevelType w:val="hybridMultilevel"/>
     <w:tmpl w:val="9252B894"/>
@@ -18267,7 +18208,7 @@
       </w:pPr>
     </w:lvl>
   </w:abstractNum>
-  <w:abstractNum w:abstractNumId="9">
+  <w:abstractNum w:abstractNumId="10">
     <w:nsid w:val="502A13C4"/>
     <w:multiLevelType w:val="hybridMultilevel"/>
     <w:tmpl w:val="11E60866"/>
@@ -18380,7 +18321,7 @@
       </w:rPr>
     </w:lvl>
   </w:abstractNum>
-  <w:abstractNum w:abstractNumId="10">
+  <w:abstractNum w:abstractNumId="11">
     <w:nsid w:val="56583B8C"/>
     <w:multiLevelType w:val="hybridMultilevel"/>
     <w:tmpl w:val="69A4382A"/>
@@ -18467,13 +18408,13 @@
     </w:lvl>
   </w:abstractNum>
   <w:num w:numId="1">
-    <w:abstractNumId w:val="10"/>
+    <w:abstractNumId w:val="11"/>
   </w:num>
   <w:num w:numId="2">
-    <w:abstractNumId w:val="6"/>
+    <w:abstractNumId w:val="7"/>
   </w:num>
   <w:num w:numId="3">
-    <w:abstractNumId w:val="9"/>
+    <w:abstractNumId w:val="10"/>
   </w:num>
   <w:num w:numId="4">
     <w:abstractNumId w:val="3"/>
@@ -18482,7 +18423,7 @@
     <w:abstractNumId w:val="2"/>
   </w:num>
   <w:num w:numId="6">
-    <w:abstractNumId w:val="8"/>
+    <w:abstractNumId w:val="9"/>
   </w:num>
   <w:num w:numId="7">
     <w:abstractNumId w:val="0"/>
@@ -18503,13 +18444,16 @@
     <w:abstractNumId w:val="1"/>
   </w:num>
   <w:num w:numId="9">
-    <w:abstractNumId w:val="7"/>
+    <w:abstractNumId w:val="8"/>
   </w:num>
   <w:num w:numId="10">
     <w:abstractNumId w:val="4"/>
   </w:num>
   <w:num w:numId="11">
     <w:abstractNumId w:val="5"/>
+  </w:num>
+  <w:num w:numId="12">
+    <w:abstractNumId w:val="6"/>
   </w:num>
 </w:numbering>
 </file>
@@ -19185,6 +19129,22 @@
       <w:szCs w:val="24"/>
     </w:rPr>
   </w:style>
+  <w:style w:type="paragraph" w:styleId="NormalWeb">
+    <w:name w:val="Normal (Web)"/>
+    <w:basedOn w:val="Normal"/>
+    <w:uiPriority w:val="99"/>
+    <w:unhideWhenUsed/>
+    <w:rsid w:val="0076275F"/>
+    <w:pPr>
+      <w:spacing w:before="100" w:beforeAutospacing="1" w:after="100" w:afterAutospacing="1" w:line="240" w:lineRule="auto"/>
+    </w:pPr>
+    <w:rPr>
+      <w:rFonts w:ascii="Times New Roman" w:eastAsia="Times New Roman" w:hAnsi="Times New Roman" w:cs="Times New Roman"/>
+      <w:sz w:val="24"/>
+      <w:szCs w:val="24"/>
+      <w:lang w:eastAsia="pt-BR"/>
+    </w:rPr>
+  </w:style>
 </w:styles>
 </file>
 

</xml_diff>

<commit_message>
Atualizando documento para o modelo final
</commit_message>
<xml_diff>
--- a/Relatorio_Equipe_HeapSort.docx
+++ b/Relatorio_Equipe_HeapSort.docx
@@ -1,6 +1,6 @@
 
 <file path=word/document.xml><?xml version="1.0" encoding="utf-8"?>
-<w:document xmlns:ve="http://schemas.openxmlformats.org/markup-compatibility/2006" xmlns:o="urn:schemas-microsoft-com:office:office" xmlns:r="http://schemas.openxmlformats.org/officeDocument/2006/relationships" xmlns:m="http://schemas.openxmlformats.org/officeDocument/2006/math" xmlns:v="urn:schemas-microsoft-com:vml" xmlns:wp="http://schemas.openxmlformats.org/drawingml/2006/wordprocessingDrawing" xmlns:w10="urn:schemas-microsoft-com:office:word" xmlns:w="http://schemas.openxmlformats.org/wordprocessingml/2006/main" xmlns:wne="http://schemas.microsoft.com/office/word/2006/wordml">
+<w:document xmlns:wpc="http://schemas.microsoft.com/office/word/2010/wordprocessingCanvas" xmlns:cx="http://schemas.microsoft.com/office/drawing/2014/chartex" xmlns:cx1="http://schemas.microsoft.com/office/drawing/2015/9/8/chartex" xmlns:cx2="http://schemas.microsoft.com/office/drawing/2015/10/21/chartex" xmlns:cx3="http://schemas.microsoft.com/office/drawing/2016/5/9/chartex" xmlns:cx4="http://schemas.microsoft.com/office/drawing/2016/5/10/chartex" xmlns:cx5="http://schemas.microsoft.com/office/drawing/2016/5/11/chartex" xmlns:cx6="http://schemas.microsoft.com/office/drawing/2016/5/12/chartex" xmlns:cx7="http://schemas.microsoft.com/office/drawing/2016/5/13/chartex" xmlns:cx8="http://schemas.microsoft.com/office/drawing/2016/5/14/chartex" xmlns:mc="http://schemas.openxmlformats.org/markup-compatibility/2006" xmlns:aink="http://schemas.microsoft.com/office/drawing/2016/ink" xmlns:am3d="http://schemas.microsoft.com/office/drawing/2017/model3d" xmlns:o="urn:schemas-microsoft-com:office:office" xmlns:oel="http://schemas.microsoft.com/office/2019/extlst" xmlns:r="http://schemas.openxmlformats.org/officeDocument/2006/relationships" xmlns:m="http://schemas.openxmlformats.org/officeDocument/2006/math" xmlns:v="urn:schemas-microsoft-com:vml" xmlns:wp14="http://schemas.microsoft.com/office/word/2010/wordprocessingDrawing" xmlns:wp="http://schemas.openxmlformats.org/drawingml/2006/wordprocessingDrawing" xmlns:w10="urn:schemas-microsoft-com:office:word" xmlns:w="http://schemas.openxmlformats.org/wordprocessingml/2006/main" xmlns:w14="http://schemas.microsoft.com/office/word/2010/wordml" xmlns:w15="http://schemas.microsoft.com/office/word/2012/wordml" xmlns:w16cex="http://schemas.microsoft.com/office/word/2018/wordml/cex" xmlns:w16cid="http://schemas.microsoft.com/office/word/2016/wordml/cid" xmlns:w16="http://schemas.microsoft.com/office/word/2018/wordml" xmlns:w16sdtdh="http://schemas.microsoft.com/office/word/2020/wordml/sdtdatahash" xmlns:w16se="http://schemas.microsoft.com/office/word/2015/wordml/symex" xmlns:wpg="http://schemas.microsoft.com/office/word/2010/wordprocessingGroup" xmlns:wpi="http://schemas.microsoft.com/office/word/2010/wordprocessingInk" xmlns:wne="http://schemas.microsoft.com/office/word/2006/wordml" xmlns:wps="http://schemas.microsoft.com/office/word/2010/wordprocessingShape" mc:Ignorable="w14 w15 w16se w16cid w16 w16cex w16sdtdh wp14">
   <w:body>
     <w:p>
       <w:pPr>
@@ -89,7 +89,7 @@
       <w:tblPr>
         <w:tblStyle w:val="Tabelacomgrade"/>
         <w:tblW w:w="0" w:type="auto"/>
-        <w:tblLook w:val="04A0"/>
+        <w:tblLook w:val="04A0" w:firstRow="1" w:lastRow="0" w:firstColumn="1" w:lastColumn="0" w:noHBand="0" w:noVBand="1"/>
       </w:tblPr>
       <w:tblGrid>
         <w:gridCol w:w="4583"/>
@@ -2544,6 +2544,348 @@
         <w:spacing w:line="480" w:lineRule="auto"/>
       </w:pPr>
       <w:r>
+        <w:t xml:space="preserve">A ordenação de dados em memória primária </w:t>
+      </w:r>
+      <w:r>
+        <w:t>sempre foi</w:t>
+      </w:r>
+      <w:r>
+        <w:t xml:space="preserve"> um processo essencial </w:t>
+      </w:r>
+      <w:r>
+        <w:t>na era computacional</w:t>
+      </w:r>
+      <w:r>
+        <w:t>, pois</w:t>
+      </w:r>
+      <w:r>
+        <w:t xml:space="preserve"> ela</w:t>
+      </w:r>
+      <w:r>
+        <w:t xml:space="preserve"> permite organizar informações de maneira eficiente para buscas, análises e processamento de dados. Isso </w:t>
+      </w:r>
+      <w:r>
+        <w:t>a torna</w:t>
+      </w:r>
+      <w:r>
+        <w:t xml:space="preserve"> fundamental tanto em aplicações simples quanto em sistemas críticos de tempo real, onde</w:t>
+      </w:r>
+      <w:r>
+        <w:t xml:space="preserve"> a sua performance e </w:t>
+      </w:r>
+      <w:r>
+        <w:t>manipulação</w:t>
+      </w:r>
+      <w:r>
+        <w:t xml:space="preserve"> de dados,</w:t>
+      </w:r>
+      <w:r>
+        <w:t xml:space="preserve"> impacta</w:t>
+      </w:r>
+      <w:r>
+        <w:t>m</w:t>
+      </w:r>
+      <w:r>
+        <w:t xml:space="preserve"> diretamente o desempenho da aplicação.</w:t>
+      </w:r>
+    </w:p>
+    <w:p>
+      <w:pPr>
+        <w:pStyle w:val="NormalRelatorio"/>
+        <w:spacing w:line="480" w:lineRule="auto"/>
+      </w:pPr>
+      <w:r>
+        <w:t>Ao decorrer da evolução tecnológica, profissionais e entusiastas da área criaram vários métodos de ordenação essenciais para o mercado e aprendizado atual, como o algoritmo de ordenação Heapsort</w:t>
+      </w:r>
+      <w:r>
+        <w:t xml:space="preserve"> </w:t>
+      </w:r>
+      <w:r>
+        <w:t>aplicado em</w:t>
+      </w:r>
+      <w:r>
+        <w:t xml:space="preserve">: sistemas de bancos de dados que </w:t>
+      </w:r>
+      <w:r>
+        <w:t>necessitam de tal método organizacional para a exibição de</w:t>
+      </w:r>
+      <w:r>
+        <w:t xml:space="preserve"> </w:t>
+      </w:r>
+      <w:r>
+        <w:t>determinados resultados</w:t>
+      </w:r>
+      <w:r>
+        <w:t xml:space="preserve">. Na indústria </w:t>
+      </w:r>
+      <w:r>
+        <w:t>de jogos</w:t>
+      </w:r>
+      <w:r>
+        <w:t xml:space="preserve"> online competitivos, conhecidos </w:t>
+      </w:r>
+      <w:r>
+        <w:t>principalmente</w:t>
+      </w:r>
+      <w:r>
+        <w:t xml:space="preserve"> pelos gêneros de FPS (First Person Shooter)</w:t>
+      </w:r>
+      <w:r>
+        <w:t xml:space="preserve"> </w:t>
+      </w:r>
+      <w:r>
+        <w:t>e</w:t>
+      </w:r>
+      <w:r>
+        <w:t xml:space="preserve"> estratégia</w:t>
+      </w:r>
+      <w:r>
+        <w:t>,</w:t>
+      </w:r>
+      <w:r>
+        <w:t xml:space="preserve"> </w:t>
+      </w:r>
+      <w:r>
+        <w:t>rankings de partidas</w:t>
+      </w:r>
+      <w:r>
+        <w:t xml:space="preserve"> são ordenados</w:t>
+      </w:r>
+      <w:r>
+        <w:t xml:space="preserve"> através desse</w:t>
+      </w:r>
+      <w:r>
+        <w:t xml:space="preserve"> tipo de</w:t>
+      </w:r>
+      <w:r>
+        <w:t xml:space="preserve"> algoritmo de ordenação.</w:t>
+      </w:r>
+    </w:p>
+    <w:p>
+      <w:pPr>
+        <w:pStyle w:val="NormalRelatorio"/>
+        <w:spacing w:line="480" w:lineRule="auto"/>
+      </w:pPr>
+      <w:r>
+        <w:t>No decorrer da história, d</w:t>
+      </w:r>
+      <w:r>
+        <w:t xml:space="preserve">iversos algoritmos </w:t>
+      </w:r>
+      <w:r>
+        <w:t xml:space="preserve">de ordenação </w:t>
+      </w:r>
+      <w:r>
+        <w:t xml:space="preserve">foram </w:t>
+      </w:r>
+      <w:r>
+        <w:t xml:space="preserve">conceituados e </w:t>
+      </w:r>
+      <w:r>
+        <w:t>desenvolvidos para resolver problema</w:t>
+      </w:r>
+      <w:r>
+        <w:t>s específicos</w:t>
+      </w:r>
+      <w:r>
+        <w:t xml:space="preserve">, </w:t>
+      </w:r>
+      <w:r>
+        <w:t xml:space="preserve">sendo amplamente comum que </w:t>
+      </w:r>
+      <w:r>
+        <w:t xml:space="preserve">cada um </w:t>
+      </w:r>
+      <w:r>
+        <w:t>possua</w:t>
+      </w:r>
+      <w:r>
+        <w:t xml:space="preserve"> vantagens e desvantagens</w:t>
+      </w:r>
+      <w:r>
+        <w:t xml:space="preserve"> aparentes</w:t>
+      </w:r>
+      <w:r>
+        <w:t xml:space="preserve"> em determinadas situações</w:t>
+      </w:r>
+      <w:r>
+        <w:t>.</w:t>
+      </w:r>
+    </w:p>
+    <w:p>
+      <w:pPr>
+        <w:pStyle w:val="NormalRelatorio"/>
+        <w:spacing w:line="480" w:lineRule="auto"/>
+      </w:pPr>
+      <w:r>
+        <w:t>Dentre eles</w:t>
+      </w:r>
+      <w:r>
+        <w:t>,</w:t>
+      </w:r>
+      <w:r>
+        <w:t xml:space="preserve"> é válido citar o algoritmo Quicksort, </w:t>
+      </w:r>
+      <w:r>
+        <w:t>popular</w:t>
+      </w:r>
+      <w:r>
+        <w:t xml:space="preserve"> pela </w:t>
+      </w:r>
+      <w:r>
+        <w:t xml:space="preserve">sua velocidade e ótima </w:t>
+      </w:r>
+      <w:r>
+        <w:t>eficiência</w:t>
+      </w:r>
+      <w:r>
+        <w:t xml:space="preserve"> prática. Também há</w:t>
+      </w:r>
+      <w:r>
+        <w:t xml:space="preserve"> o Merge</w:t>
+      </w:r>
+      <w:r>
+        <w:t>s</w:t>
+      </w:r>
+      <w:r>
+        <w:t>ort, valorizado p</w:t>
+      </w:r>
+      <w:r>
+        <w:t>ela</w:t>
+      </w:r>
+      <w:r>
+        <w:t xml:space="preserve"> sua estabilidade e </w:t>
+      </w:r>
+      <w:r>
+        <w:t>utilidade</w:t>
+      </w:r>
+      <w:r>
+        <w:t xml:space="preserve"> em arquivos grandes</w:t>
+      </w:r>
+      <w:r>
+        <w:t>.</w:t>
+      </w:r>
+      <w:r>
+        <w:t xml:space="preserve"> </w:t>
+      </w:r>
+      <w:r>
+        <w:t>Além disso, há o</w:t>
+      </w:r>
+      <w:r>
+        <w:t xml:space="preserve"> Se</w:t>
+      </w:r>
+      <w:r>
+        <w:t>l</w:t>
+      </w:r>
+      <w:r>
+        <w:t>ection</w:t>
+      </w:r>
+      <w:r>
+        <w:t>s</w:t>
+      </w:r>
+      <w:r>
+        <w:t>ort,</w:t>
+      </w:r>
+      <w:r>
+        <w:t xml:space="preserve"> por exemplo, pode</w:t>
+      </w:r>
+      <w:r>
+        <w:t>ndo</w:t>
+      </w:r>
+      <w:r>
+        <w:t xml:space="preserve"> ser</w:t>
+      </w:r>
+      <w:r>
+        <w:t xml:space="preserve"> considerado</w:t>
+      </w:r>
+      <w:r>
+        <w:t xml:space="preserve"> até</w:t>
+      </w:r>
+      <w:r>
+        <w:t xml:space="preserve"> como</w:t>
+      </w:r>
+      <w:r>
+        <w:t xml:space="preserve"> um algoritmo simples</w:t>
+      </w:r>
+      <w:r>
+        <w:t xml:space="preserve"> de implementar</w:t>
+      </w:r>
+      <w:r>
+        <w:t>,</w:t>
+      </w:r>
+      <w:r>
+        <w:t xml:space="preserve"> </w:t>
+      </w:r>
+      <w:r>
+        <w:t>porém as suas propriedades</w:t>
+      </w:r>
+      <w:r>
+        <w:t xml:space="preserve">, bem como a sua grandeza </w:t>
+      </w:r>
+      <m:oMath>
+        <m:r>
+          <w:rPr>
+            <w:rFonts w:ascii="Cambria Math" w:hAnsi="Cambria Math"/>
+          </w:rPr>
+          <m:t>O(n²)</m:t>
+        </m:r>
+      </m:oMath>
+      <w:r>
+        <w:t>,</w:t>
+      </w:r>
+      <w:r>
+        <w:t xml:space="preserve"> </w:t>
+      </w:r>
+      <w:r>
+        <w:t>faz com que ele seja inutilizado</w:t>
+      </w:r>
+      <w:r>
+        <w:t xml:space="preserve"> no mercado, tornando-o </w:t>
+      </w:r>
+      <w:r>
+        <w:t xml:space="preserve">mais </w:t>
+      </w:r>
+      <w:r>
+        <w:t>utilizável para fins didáticos e comparativos. Adicionalmente há</w:t>
+      </w:r>
+      <w:r>
+        <w:t xml:space="preserve"> o</w:t>
+      </w:r>
+      <w:r>
+        <w:t xml:space="preserve"> algoritmo</w:t>
+      </w:r>
+      <w:r>
+        <w:t xml:space="preserve"> Heap</w:t>
+      </w:r>
+      <w:r>
+        <w:t>s</w:t>
+      </w:r>
+      <w:r>
+        <w:t xml:space="preserve">ort, </w:t>
+      </w:r>
+      <w:r>
+        <w:t xml:space="preserve">na qual </w:t>
+      </w:r>
+      <w:r>
+        <w:lastRenderedPageBreak/>
+        <w:t>exploraremos desde a</w:t>
+      </w:r>
+      <w:r>
+        <w:t>s</w:t>
+      </w:r>
+      <w:r>
+        <w:t xml:space="preserve"> suas propriedades</w:t>
+      </w:r>
+      <w:r>
+        <w:t xml:space="preserve"> e complexidade de tempo até a sua execução equiparada com outros algoritmos de ordenação.</w:t>
+      </w:r>
+    </w:p>
+    <w:p>
+      <w:pPr>
+        <w:pStyle w:val="NormalRelatorio"/>
+        <w:spacing w:line="480" w:lineRule="auto"/>
+      </w:pPr>
+      <w:r>
         <w:t xml:space="preserve">A memória RAM (Random Access Memory), </w:t>
       </w:r>
       <w:r>
@@ -2746,7 +3088,7 @@
         </w:rPr>
         <w:lastRenderedPageBreak/>
         <w:drawing>
-          <wp:inline distT="0" distB="0" distL="0" distR="0">
+          <wp:inline distT="0" distB="0" distL="0" distR="0" wp14:anchorId="0FAD4046" wp14:editId="0487752E">
             <wp:extent cx="2223806" cy="3278603"/>
             <wp:effectExtent l="19050" t="0" r="5044" b="0"/>
             <wp:docPr id="7" name="Imagem 7"/>
@@ -2804,7 +3146,7 @@
           <w:lang w:eastAsia="pt-BR"/>
         </w:rPr>
         <w:drawing>
-          <wp:inline distT="0" distB="0" distL="0" distR="0">
+          <wp:inline distT="0" distB="0" distL="0" distR="0" wp14:anchorId="5BA71E95" wp14:editId="354D0ECD">
             <wp:extent cx="2011680" cy="1851660"/>
             <wp:effectExtent l="19050" t="0" r="7620" b="0"/>
             <wp:docPr id="6" name="Imagem 4"/>
@@ -4412,7 +4754,7 @@
       <w:r>
         <w:rPr>
           <w:rFonts w:ascii="Times" w:eastAsiaTheme="minorEastAsia" w:hAnsi="Times" w:cs="Times"/>
-          <w:i/>
+          <w:iCs/>
           <w:sz w:val="24"/>
           <w:szCs w:val="24"/>
         </w:rPr>
@@ -4421,6 +4763,7 @@
       <w:r>
         <w:rPr>
           <w:rFonts w:ascii="Times" w:eastAsiaTheme="minorEastAsia" w:hAnsi="Times" w:cs="Times"/>
+          <w:iCs/>
           <w:sz w:val="24"/>
           <w:szCs w:val="24"/>
         </w:rPr>
@@ -4603,7 +4946,16 @@
           <w:sz w:val="24"/>
           <w:szCs w:val="24"/>
         </w:rPr>
-        <w:t xml:space="preserve">até ser considerado um elemento-pai com o maior valor que seus filhos ou chegar ao fim do </w:t>
+        <w:t xml:space="preserve">até ser </w:t>
+      </w:r>
+      <w:r>
+        <w:rPr>
+          <w:rFonts w:ascii="Times" w:eastAsiaTheme="minorEastAsia" w:hAnsi="Times" w:cs="Times"/>
+          <w:sz w:val="24"/>
+          <w:szCs w:val="24"/>
+        </w:rPr>
+        <w:lastRenderedPageBreak/>
+        <w:t xml:space="preserve">considerado um elemento-pai com o maior valor que seus filhos ou chegar ao fim do </w:t>
       </w:r>
       <w:r>
         <w:rPr>
@@ -4679,7 +5031,6 @@
           <w:sz w:val="24"/>
           <w:szCs w:val="24"/>
         </w:rPr>
-        <w:lastRenderedPageBreak/>
         <w:t xml:space="preserve">Contudo, o que fará a sua </w:t>
       </w:r>
       <w:r>
@@ -5799,15 +6150,7 @@
           <w:sz w:val="24"/>
           <w:szCs w:val="24"/>
         </w:rPr>
-        <w:t>calculado</w:t>
-      </w:r>
-      <w:r>
-        <w:rPr>
-          <w:rFonts w:ascii="Times" w:eastAsiaTheme="minorEastAsia" w:hAnsi="Times" w:cs="Times"/>
-          <w:sz w:val="24"/>
-          <w:szCs w:val="24"/>
-        </w:rPr>
-        <w:t>-se</w:t>
+        <w:t>calculando-se</w:t>
       </w:r>
       <w:r>
         <w:rPr>
@@ -5998,7 +6341,7 @@
     <w:p>
       <w:pPr>
         <w:spacing w:line="480" w:lineRule="auto"/>
-        <w:jc w:val="both"/>
+        <w:jc w:val="center"/>
         <w:rPr>
           <w:rFonts w:ascii="Times" w:eastAsiaTheme="minorEastAsia" w:hAnsi="Times" w:cs="Times"/>
           <w:sz w:val="24"/>
@@ -6014,7 +6357,7 @@
           <w:lang w:eastAsia="pt-BR"/>
         </w:rPr>
         <w:drawing>
-          <wp:inline distT="0" distB="0" distL="0" distR="0">
+          <wp:inline distT="0" distB="0" distL="0" distR="0" wp14:anchorId="683D8BB0" wp14:editId="1C24C824">
             <wp:extent cx="2823210" cy="541020"/>
             <wp:effectExtent l="19050" t="0" r="0" b="0"/>
             <wp:docPr id="1" name="Imagem 0" descr="formula_heapsort.PNG"/>
@@ -6054,7 +6397,7 @@
     <w:p>
       <w:pPr>
         <w:spacing w:line="480" w:lineRule="auto"/>
-        <w:jc w:val="both"/>
+        <w:jc w:val="center"/>
         <w:rPr>
           <w:rFonts w:ascii="Times" w:eastAsiaTheme="minorEastAsia" w:hAnsi="Times" w:cs="Times"/>
           <w:sz w:val="24"/>
@@ -6070,7 +6413,7 @@
           <w:lang w:eastAsia="pt-BR"/>
         </w:rPr>
         <w:drawing>
-          <wp:inline distT="0" distB="0" distL="0" distR="0">
+          <wp:inline distT="0" distB="0" distL="0" distR="0" wp14:anchorId="4A1EC174" wp14:editId="18F057B5">
             <wp:extent cx="1028789" cy="647756"/>
             <wp:effectExtent l="19050" t="0" r="0" b="0"/>
             <wp:docPr id="4" name="Imagem 3" descr="formula_resultado_heapsort.PNG"/>
@@ -6304,7 +6647,31 @@
           <w:sz w:val="24"/>
           <w:szCs w:val="24"/>
         </w:rPr>
-        <w:t>Grandes volumes de dados.</w:t>
+        <w:t>V</w:t>
+      </w:r>
+      <w:r>
+        <w:rPr>
+          <w:rFonts w:ascii="Times" w:hAnsi="Times" w:cs="Times"/>
+          <w:sz w:val="24"/>
+          <w:szCs w:val="24"/>
+        </w:rPr>
+        <w:t>olumes</w:t>
+      </w:r>
+      <w:r>
+        <w:rPr>
+          <w:rFonts w:ascii="Times" w:hAnsi="Times" w:cs="Times"/>
+          <w:sz w:val="24"/>
+          <w:szCs w:val="24"/>
+        </w:rPr>
+        <w:t xml:space="preserve"> consideráveis</w:t>
+      </w:r>
+      <w:r>
+        <w:rPr>
+          <w:rFonts w:ascii="Times" w:hAnsi="Times" w:cs="Times"/>
+          <w:sz w:val="24"/>
+          <w:szCs w:val="24"/>
+        </w:rPr>
+        <w:t xml:space="preserve"> de dados.</w:t>
       </w:r>
     </w:p>
     <w:p>
@@ -6526,19 +6893,31 @@
         <w:rPr>
           <w:color w:val="auto"/>
         </w:rPr>
-        <w:t xml:space="preserve">Ideal para </w:t>
-      </w:r>
-      <w:r>
-        <w:rPr>
-          <w:color w:val="auto"/>
-        </w:rPr>
-        <w:t xml:space="preserve">Grandes </w:t>
-      </w:r>
-      <w:r>
-        <w:rPr>
-          <w:color w:val="auto"/>
-        </w:rPr>
-        <w:t>Volumes De Dados</w:t>
+        <w:t>Ideal para</w:t>
+      </w:r>
+      <w:r>
+        <w:rPr>
+          <w:color w:val="auto"/>
+        </w:rPr>
+        <w:t xml:space="preserve"> </w:t>
+      </w:r>
+      <w:r>
+        <w:rPr>
+          <w:color w:val="auto"/>
+        </w:rPr>
+        <w:t xml:space="preserve">Volumes </w:t>
+      </w:r>
+      <w:r>
+        <w:rPr>
+          <w:color w:val="auto"/>
+        </w:rPr>
+        <w:t xml:space="preserve">Consideráveis </w:t>
+      </w:r>
+      <w:r>
+        <w:rPr>
+          <w:color w:val="auto"/>
+        </w:rPr>
+        <w:t>De Dados</w:t>
       </w:r>
       <w:bookmarkEnd w:id="7"/>
     </w:p>
@@ -6581,7 +6960,11 @@
         <w:t xml:space="preserve">e </w:t>
       </w:r>
       <w:r>
-        <w:t>a sua instabilidade (condição em que</w:t>
+        <w:t xml:space="preserve">a sua instabilidade </w:t>
+      </w:r>
+      <w:r>
+        <w:lastRenderedPageBreak/>
+        <w:t>(condição em que</w:t>
       </w:r>
       <w:r>
         <w:t xml:space="preserve"> dados iguais podem alternar de suas posições originais</w:t>
@@ -6648,7 +7031,6 @@
           <w:sz w:val="24"/>
           <w:szCs w:val="24"/>
         </w:rPr>
-        <w:lastRenderedPageBreak/>
         <w:t xml:space="preserve">Estabilidade </w:t>
       </w:r>
       <w:r>
@@ -6861,25 +7243,9 @@
     </w:p>
     <w:p>
       <w:pPr>
-        <w:pStyle w:val="PargrafodaLista"/>
-        <w:numPr>
-          <w:ilvl w:val="0"/>
-          <w:numId w:val="10"/>
-        </w:numPr>
-        <w:spacing w:line="480" w:lineRule="auto"/>
-        <w:jc w:val="both"/>
-        <w:rPr>
-          <w:rFonts w:ascii="Times" w:hAnsi="Times" w:cs="Times"/>
-          <w:sz w:val="24"/>
-          <w:szCs w:val="24"/>
-        </w:rPr>
-      </w:pPr>
-      <w:r>
-        <w:rPr>
-          <w:rFonts w:ascii="Times" w:hAnsi="Times" w:cs="Times"/>
-          <w:sz w:val="24"/>
-          <w:szCs w:val="24"/>
-        </w:rPr>
+        <w:pStyle w:val="Titulo3Relatorio"/>
+      </w:pPr>
+      <w:r>
         <w:t>Instabilidade</w:t>
       </w:r>
     </w:p>
@@ -6937,25 +7303,9 @@
     </w:p>
     <w:p>
       <w:pPr>
-        <w:pStyle w:val="PargrafodaLista"/>
-        <w:numPr>
-          <w:ilvl w:val="0"/>
-          <w:numId w:val="10"/>
-        </w:numPr>
-        <w:spacing w:line="480" w:lineRule="auto"/>
-        <w:jc w:val="both"/>
-        <w:rPr>
-          <w:rFonts w:ascii="Times" w:hAnsi="Times" w:cs="Times"/>
-          <w:sz w:val="24"/>
-          <w:szCs w:val="24"/>
-        </w:rPr>
-      </w:pPr>
-      <w:r>
-        <w:rPr>
-          <w:rFonts w:ascii="Times" w:hAnsi="Times" w:cs="Times"/>
-          <w:sz w:val="24"/>
-          <w:szCs w:val="24"/>
-        </w:rPr>
+        <w:pStyle w:val="Titulo3Relatorio"/>
+      </w:pPr>
+      <w:r>
         <w:t>Não Ideal para Conjuntos de Dados Pequenos</w:t>
       </w:r>
     </w:p>
@@ -7192,7 +7542,23 @@
         <w:t xml:space="preserve"> </w:t>
       </w:r>
       <w:r>
-        <w:t>faz com que esta propriedade garanta que o valor de todos os nós sejam menores que os de seus respectivos pais.</w:t>
+        <w:t xml:space="preserve">faz com </w:t>
+      </w:r>
+      <w:r>
+        <w:lastRenderedPageBreak/>
+        <w:t xml:space="preserve">que esta propriedade garanta que </w:t>
+      </w:r>
+      <w:r>
+        <w:t>o valor de todos os nós seja</w:t>
+      </w:r>
+      <w:r>
+        <w:t xml:space="preserve"> </w:t>
+      </w:r>
+      <w:r>
+        <w:t>inferiores</w:t>
+      </w:r>
+      <w:r>
+        <w:t xml:space="preserve"> que os de seus respectivos pais.</w:t>
       </w:r>
     </w:p>
     <w:p>
@@ -7200,15 +7566,15 @@
         <w:pStyle w:val="NormalRelatorio"/>
         <w:spacing w:line="480" w:lineRule="auto"/>
         <w:ind w:firstLine="0"/>
+        <w:jc w:val="center"/>
       </w:pPr>
       <w:r>
         <w:rPr>
           <w:noProof/>
           <w:lang w:eastAsia="pt-BR"/>
         </w:rPr>
-        <w:lastRenderedPageBreak/>
         <w:drawing>
-          <wp:inline distT="0" distB="0" distL="0" distR="0">
+          <wp:inline distT="0" distB="0" distL="0" distR="0" wp14:anchorId="5761890E" wp14:editId="53D3B0CE">
             <wp:extent cx="2727960" cy="2331647"/>
             <wp:effectExtent l="19050" t="0" r="0" b="0"/>
             <wp:docPr id="10" name="Imagem 10"/>
@@ -7284,7 +7650,7 @@
           <w:lang w:eastAsia="pt-BR"/>
         </w:rPr>
         <w:drawing>
-          <wp:inline distT="0" distB="0" distL="0" distR="0">
+          <wp:inline distT="0" distB="0" distL="0" distR="0" wp14:anchorId="7B32BD0D" wp14:editId="648BA357">
             <wp:extent cx="6234649" cy="1888466"/>
             <wp:effectExtent l="19050" t="0" r="0" b="0"/>
             <wp:docPr id="9" name="Imagem 13"/>
@@ -7402,6 +7768,7 @@
         <w:spacing w:line="480" w:lineRule="auto"/>
       </w:pPr>
       <w:r>
+        <w:lastRenderedPageBreak/>
         <w:t xml:space="preserve">3. Repita estas operações com os </w:t>
       </w:r>
       <m:oMath>
@@ -7475,7 +7842,6 @@
           <w:sz w:val="24"/>
           <w:szCs w:val="24"/>
         </w:rPr>
-        <w:lastRenderedPageBreak/>
         <w:t>Implementação e Testes</w:t>
       </w:r>
       <w:bookmarkEnd w:id="11"/>
@@ -7922,7 +8288,16 @@
           <w:sz w:val="24"/>
           <w:szCs w:val="24"/>
         </w:rPr>
-        <w:t xml:space="preserve"> como um parâmetro das operações de inserção e eliminação. Sendo assim, o procedimento </w:t>
+        <w:t xml:space="preserve"> </w:t>
+      </w:r>
+      <w:r>
+        <w:rPr>
+          <w:rFonts w:ascii="Times" w:hAnsi="Times" w:cs="Times"/>
+          <w:sz w:val="24"/>
+          <w:szCs w:val="24"/>
+        </w:rPr>
+        <w:lastRenderedPageBreak/>
+        <w:t xml:space="preserve">como um parâmetro das operações de inserção e eliminação. Sendo assim, o procedimento </w:t>
       </w:r>
       <w:r>
         <w:rPr>
@@ -8007,16 +8382,7 @@
           <w:sz w:val="24"/>
           <w:szCs w:val="24"/>
         </w:rPr>
-        <w:t xml:space="preserve">) até o ultímo </w:t>
-      </w:r>
-      <w:r>
-        <w:rPr>
-          <w:rFonts w:ascii="Times" w:eastAsiaTheme="minorEastAsia" w:hAnsi="Times" w:cs="Times"/>
-          <w:sz w:val="24"/>
-          <w:szCs w:val="24"/>
-        </w:rPr>
-        <w:lastRenderedPageBreak/>
-        <w:t xml:space="preserve">elemento/a folha </w:t>
+        <w:t xml:space="preserve">) até o ultímo elemento/a folha </w:t>
       </w:r>
       <w:r>
         <w:rPr>
@@ -8434,7 +8800,7 @@
         </w:rPr>
         <w:lastRenderedPageBreak/>
         <w:drawing>
-          <wp:inline distT="0" distB="0" distL="0" distR="0">
+          <wp:inline distT="0" distB="0" distL="0" distR="0" wp14:anchorId="5C06381D" wp14:editId="75A3A5DF">
             <wp:extent cx="5631180" cy="2781300"/>
             <wp:effectExtent l="19050" t="0" r="7620" b="0"/>
             <wp:docPr id="5" name="Imagem 1"/>
@@ -9299,7 +9665,16 @@
           <w:sz w:val="24"/>
           <w:szCs w:val="24"/>
         </w:rPr>
-        <w:t xml:space="preserve"> elementos. Quando este mesmo elemento é removido, os </w:t>
+        <w:t xml:space="preserve"> elementos. Quando este mesmo elemento é </w:t>
+      </w:r>
+      <w:r>
+        <w:rPr>
+          <w:rFonts w:ascii="Times" w:eastAsiaTheme="minorEastAsia" w:hAnsi="Times" w:cs="Times"/>
+          <w:sz w:val="24"/>
+          <w:szCs w:val="24"/>
+        </w:rPr>
+        <w:lastRenderedPageBreak/>
+        <w:t xml:space="preserve">removido, os </w:t>
       </w:r>
       <m:oMath>
         <m:r>
@@ -9335,16 +9710,7 @@
           <w:sz w:val="24"/>
           <w:szCs w:val="24"/>
         </w:rPr>
-        <w:t xml:space="preserve"> precisam ser redistribuídos </w:t>
-      </w:r>
-      <w:r>
-        <w:rPr>
-          <w:rFonts w:ascii="Times" w:eastAsiaTheme="minorEastAsia" w:hAnsi="Times" w:cs="Times"/>
-          <w:sz w:val="24"/>
-          <w:szCs w:val="24"/>
-        </w:rPr>
-        <w:lastRenderedPageBreak/>
-        <w:t xml:space="preserve">nas posições 0 até </w:t>
+        <w:t xml:space="preserve"> precisam ser redistribuídos nas posições 0 até </w:t>
       </w:r>
       <m:oMath>
         <m:r>
@@ -9452,7 +9818,7 @@
           <w:lang w:eastAsia="pt-BR"/>
         </w:rPr>
         <w:drawing>
-          <wp:inline distT="0" distB="0" distL="0" distR="0">
+          <wp:inline distT="0" distB="0" distL="0" distR="0" wp14:anchorId="221F4716" wp14:editId="24F6E033">
             <wp:extent cx="5280660" cy="3718560"/>
             <wp:effectExtent l="19050" t="0" r="0" b="0"/>
             <wp:docPr id="19" name="Imagem 10"/>
@@ -9805,7 +10171,7 @@
           <w:lang w:eastAsia="pt-BR"/>
         </w:rPr>
         <w:drawing>
-          <wp:inline distT="0" distB="0" distL="0" distR="0">
+          <wp:inline distT="0" distB="0" distL="0" distR="0" wp14:anchorId="2E03C9C3" wp14:editId="62601162">
             <wp:extent cx="5699760" cy="3002280"/>
             <wp:effectExtent l="19050" t="0" r="0" b="0"/>
             <wp:docPr id="21" name="Imagem 13"/>
@@ -10434,7 +10800,7 @@
           <w:lang w:eastAsia="pt-BR"/>
         </w:rPr>
         <w:drawing>
-          <wp:inline distT="0" distB="0" distL="0" distR="0">
+          <wp:inline distT="0" distB="0" distL="0" distR="0" wp14:anchorId="1A87CAC0" wp14:editId="6679DBAC">
             <wp:extent cx="4564380" cy="1638300"/>
             <wp:effectExtent l="19050" t="0" r="7620" b="0"/>
             <wp:docPr id="22" name="Imagem 16"/>
@@ -10971,6 +11337,7 @@
           <w:sz w:val="24"/>
           <w:szCs w:val="24"/>
         </w:rPr>
+        <w:lastRenderedPageBreak/>
         <w:t xml:space="preserve">laço </w:t>
       </w:r>
       <w:r>
@@ -11057,16 +11424,7 @@
           <w:sz w:val="24"/>
           <w:szCs w:val="24"/>
         </w:rPr>
-        <w:t xml:space="preserve">e a </w:t>
-      </w:r>
-      <w:r>
-        <w:rPr>
-          <w:rFonts w:ascii="Times" w:hAnsi="Times" w:cs="Times"/>
-          <w:sz w:val="24"/>
-          <w:szCs w:val="24"/>
-        </w:rPr>
-        <w:lastRenderedPageBreak/>
-        <w:t xml:space="preserve">posição do array </w:t>
+        <w:t xml:space="preserve">e a posição do array </w:t>
       </w:r>
       <m:oMath>
         <m:r>
@@ -11195,7 +11553,25 @@
           <w:sz w:val="24"/>
           <w:szCs w:val="24"/>
         </w:rPr>
-        <w:t>, na qual reorganiza os elementos de todo heap.</w:t>
+        <w:t xml:space="preserve">, na qual reorganiza os elementos de todo </w:t>
+      </w:r>
+      <w:r>
+        <w:rPr>
+          <w:rFonts w:ascii="Times" w:eastAsiaTheme="minorEastAsia" w:hAnsi="Times" w:cs="Times"/>
+          <w:i/>
+          <w:iCs/>
+          <w:sz w:val="24"/>
+          <w:szCs w:val="24"/>
+        </w:rPr>
+        <w:t>heap</w:t>
+      </w:r>
+      <w:r>
+        <w:rPr>
+          <w:rFonts w:ascii="Times" w:eastAsiaTheme="minorEastAsia" w:hAnsi="Times" w:cs="Times"/>
+          <w:sz w:val="24"/>
+          <w:szCs w:val="24"/>
+        </w:rPr>
+        <w:t>.</w:t>
       </w:r>
     </w:p>
     <w:p>
@@ -11406,7 +11782,7 @@
           <w:lang w:eastAsia="pt-BR"/>
         </w:rPr>
         <w:drawing>
-          <wp:inline distT="0" distB="0" distL="0" distR="0">
+          <wp:inline distT="0" distB="0" distL="0" distR="0" wp14:anchorId="6BED50F7" wp14:editId="0A47FAC3">
             <wp:extent cx="5021580" cy="3223260"/>
             <wp:effectExtent l="19050" t="0" r="7620" b="0"/>
             <wp:docPr id="23" name="Imagem 19"/>
@@ -11729,7 +12105,7 @@
           <w:lang w:eastAsia="pt-BR"/>
         </w:rPr>
         <w:drawing>
-          <wp:inline distT="0" distB="0" distL="0" distR="0">
+          <wp:inline distT="0" distB="0" distL="0" distR="0" wp14:anchorId="066BB507" wp14:editId="6D0C8B22">
             <wp:extent cx="4442460" cy="1836420"/>
             <wp:effectExtent l="19050" t="0" r="0" b="0"/>
             <wp:docPr id="24" name="Imagem 22"/>
@@ -11860,7 +12236,7 @@
         </w:rPr>
         <w:lastRenderedPageBreak/>
         <w:drawing>
-          <wp:inline distT="0" distB="0" distL="0" distR="0">
+          <wp:inline distT="0" distB="0" distL="0" distR="0" wp14:anchorId="15427D08" wp14:editId="32C3621D">
             <wp:extent cx="5731510" cy="2331118"/>
             <wp:effectExtent l="19050" t="0" r="2540" b="0"/>
             <wp:docPr id="25" name="Imagem 25"/>
@@ -12441,7 +12817,7 @@
           <w:lang w:eastAsia="pt-BR"/>
         </w:rPr>
         <w:drawing>
-          <wp:inline distT="0" distB="0" distL="0" distR="0">
+          <wp:inline distT="0" distB="0" distL="0" distR="0" wp14:anchorId="0C97D3F2" wp14:editId="37AAA37C">
             <wp:extent cx="5731510" cy="1738207"/>
             <wp:effectExtent l="19050" t="0" r="2540" b="0"/>
             <wp:docPr id="28" name="Imagem 28"/>
@@ -12717,6 +13093,7 @@
           <w:sz w:val="24"/>
           <w:szCs w:val="24"/>
         </w:rPr>
+        <w:lastRenderedPageBreak/>
         <w:t>Em seguida, dentro desse procedimento teremos a</w:t>
       </w:r>
       <w:r>
@@ -12817,16 +13194,7 @@
           <w:sz w:val="24"/>
           <w:szCs w:val="24"/>
         </w:rPr>
-        <w:t xml:space="preserve"> </w:t>
-      </w:r>
-      <w:r>
-        <w:rPr>
-          <w:rFonts w:ascii="Times" w:eastAsiaTheme="minorEastAsia" w:hAnsi="Times" w:cs="Times"/>
-          <w:sz w:val="24"/>
-          <w:szCs w:val="24"/>
-        </w:rPr>
-        <w:lastRenderedPageBreak/>
-        <w:t xml:space="preserve">valerá </w:t>
+        <w:t xml:space="preserve"> valerá </w:t>
       </w:r>
       <w:r>
         <w:rPr>
@@ -13444,6 +13812,7 @@
         <w:t xml:space="preserve">. Finalmente, o </w:t>
       </w:r>
       <w:r>
+        <w:lastRenderedPageBreak/>
         <w:t xml:space="preserve">chamado recursivo de </w:t>
       </w:r>
       <w:r>
@@ -13513,9 +13882,8 @@
           <w:color w:val="auto"/>
           <w:lang w:eastAsia="pt-BR"/>
         </w:rPr>
-        <w:lastRenderedPageBreak/>
         <w:drawing>
-          <wp:inline distT="0" distB="0" distL="0" distR="0">
+          <wp:inline distT="0" distB="0" distL="0" distR="0" wp14:anchorId="284EAB35" wp14:editId="6D0ADDF4">
             <wp:extent cx="5731510" cy="4058045"/>
             <wp:effectExtent l="19050" t="0" r="2540" b="0"/>
             <wp:docPr id="43" name="Imagem 43"/>
@@ -13847,6 +14215,7 @@
         <w:rPr>
           <w:rFonts w:eastAsiaTheme="minorEastAsia"/>
         </w:rPr>
+        <w:lastRenderedPageBreak/>
         <w:t xml:space="preserve">Prosseguindo, </w:t>
       </w:r>
       <w:r>
@@ -14002,14 +14371,7 @@
         <w:rPr>
           <w:rFonts w:eastAsiaTheme="minorEastAsia"/>
         </w:rPr>
-        <w:t xml:space="preserve"> em sua </w:t>
-      </w:r>
-      <w:r>
-        <w:rPr>
-          <w:rFonts w:eastAsiaTheme="minorEastAsia"/>
-        </w:rPr>
-        <w:lastRenderedPageBreak/>
-        <w:t xml:space="preserve">condição intermediária, o laço será executado enquanto </w:t>
+        <w:t xml:space="preserve"> em sua condição intermediária, o laço será executado enquanto </w:t>
       </w:r>
       <m:oMath>
         <m:r>
@@ -14418,8 +14780,9 @@
           <w:sz w:val="16"/>
           <w:lang w:eastAsia="pt-BR"/>
         </w:rPr>
+        <w:lastRenderedPageBreak/>
         <w:drawing>
-          <wp:inline distT="0" distB="0" distL="0" distR="0">
+          <wp:inline distT="0" distB="0" distL="0" distR="0" wp14:anchorId="54F1C157" wp14:editId="59930F6E">
             <wp:extent cx="5731510" cy="2498351"/>
             <wp:effectExtent l="19050" t="0" r="2540" b="0"/>
             <wp:docPr id="46" name="Imagem 46"/>
@@ -14728,20 +15091,15 @@
     </w:p>
     <w:p>
       <w:pPr>
-        <w:pStyle w:val="Titulo2Relatorio"/>
-        <w:spacing w:line="480" w:lineRule="auto"/>
-        <w:rPr>
-          <w:color w:val="auto"/>
-        </w:rPr>
+        <w:jc w:val="center"/>
       </w:pPr>
       <w:r>
         <w:rPr>
           <w:noProof/>
-          <w:color w:val="auto"/>
           <w:lang w:eastAsia="pt-BR"/>
         </w:rPr>
         <w:drawing>
-          <wp:inline distT="0" distB="0" distL="0" distR="0">
+          <wp:inline distT="0" distB="0" distL="0" distR="0" wp14:anchorId="79C3CD38" wp14:editId="67A4CA83">
             <wp:extent cx="4138019" cy="3210212"/>
             <wp:effectExtent l="19050" t="0" r="0" b="0"/>
             <wp:docPr id="12" name="Imagem 11" descr="ordered_input.PNG"/>
@@ -14918,7 +15276,11 @@
         </m:func>
       </m:oMath>
       <w:r>
-        <w:t xml:space="preserve"> em todos os casos. O </w:t>
+        <w:t xml:space="preserve"> em todos os </w:t>
+      </w:r>
+      <w:r>
+        <w:lastRenderedPageBreak/>
+        <w:t xml:space="preserve">casos. O </w:t>
       </w:r>
       <w:r>
         <w:rPr>
@@ -14933,11 +15295,7 @@
         <w:t>ify</w:t>
       </w:r>
       <w:r>
-        <w:t xml:space="preserve"> utiliza uma quantidade considerável de processamento, devido as </w:t>
-      </w:r>
-      <w:r>
-        <w:lastRenderedPageBreak/>
-        <w:t xml:space="preserve">reorganizações de todo </w:t>
+        <w:t xml:space="preserve"> utiliza uma quantidade considerável de processamento, devido as reorganizações de todo </w:t>
       </w:r>
       <w:r>
         <w:rPr>
@@ -15151,21 +15509,13 @@
       </w:r>
     </w:p>
     <w:p>
-      <w:pPr>
-        <w:pStyle w:val="Titulo2Relatorio"/>
-        <w:spacing w:line="480" w:lineRule="auto"/>
-        <w:rPr>
-          <w:color w:val="auto"/>
-        </w:rPr>
-      </w:pPr>
       <w:r>
         <w:rPr>
           <w:noProof/>
-          <w:color w:val="auto"/>
           <w:lang w:eastAsia="pt-BR"/>
         </w:rPr>
         <w:drawing>
-          <wp:inline distT="0" distB="0" distL="0" distR="0">
+          <wp:inline distT="0" distB="0" distL="0" distR="0" wp14:anchorId="37F9F675" wp14:editId="0B70AB71">
             <wp:extent cx="5731508" cy="3543983"/>
             <wp:effectExtent l="19050" t="0" r="2542" b="0"/>
             <wp:docPr id="15" name="Imagem 14" descr="ordered_input_grafico.PNG"/>
@@ -15250,7 +15600,19 @@
         <w:rPr>
           <w:color w:val="auto"/>
         </w:rPr>
-        <w:t xml:space="preserve"> - Gráfico comparativo das perfomances de cada algoritmo de ordenação com Entrada Ordenada.</w:t>
+        <w:t xml:space="preserve"> - Gráfico comparativo das </w:t>
+      </w:r>
+      <w:r>
+        <w:rPr>
+          <w:color w:val="auto"/>
+        </w:rPr>
+        <w:t>performances</w:t>
+      </w:r>
+      <w:r>
+        <w:rPr>
+          <w:color w:val="auto"/>
+        </w:rPr>
+        <w:t xml:space="preserve"> de cada algoritmo de ordenação com Entrada Ordenada.</w:t>
       </w:r>
     </w:p>
     <w:p>
@@ -15352,20 +15714,15 @@
     </w:p>
     <w:p>
       <w:pPr>
-        <w:pStyle w:val="Titulo2Relatorio"/>
-        <w:spacing w:line="480" w:lineRule="auto"/>
-        <w:rPr>
-          <w:color w:val="auto"/>
-        </w:rPr>
+        <w:jc w:val="center"/>
       </w:pPr>
       <w:r>
         <w:rPr>
           <w:noProof/>
-          <w:color w:val="auto"/>
           <w:lang w:eastAsia="pt-BR"/>
         </w:rPr>
         <w:drawing>
-          <wp:inline distT="0" distB="0" distL="0" distR="0">
+          <wp:inline distT="0" distB="0" distL="0" distR="0" wp14:anchorId="7C6DC5B8" wp14:editId="1A47227A">
             <wp:extent cx="4221846" cy="3277319"/>
             <wp:effectExtent l="19050" t="0" r="7254" b="0"/>
             <wp:docPr id="13" name="Imagem 12" descr="reversed_input.PNG"/>
@@ -15626,11 +15983,11 @@
         <w:t>Quicksort</w:t>
       </w:r>
       <w:r>
-        <w:t xml:space="preserve">, é superior devido as suas operações eficientes de particionamento do vetor, o bom uso de pivôs, menos execuções de trocas e comparações mais leves. Atuando de forma </w:t>
+        <w:t xml:space="preserve">, é superior devido as suas operações eficientes de particionamento do vetor, o </w:t>
       </w:r>
       <w:r>
         <w:lastRenderedPageBreak/>
-        <w:t xml:space="preserve">mais efetiva quanto ao uso de processamento, tendo a mesma complexidade de </w:t>
+        <w:t xml:space="preserve">bom uso de pivôs, menos execuções de trocas e comparações mais leves. Atuando de forma mais efetiva quanto ao uso de processamento, tendo a mesma complexidade de </w:t>
       </w:r>
       <w:r>
         <w:rPr>
@@ -15735,21 +16092,13 @@
       </w:r>
     </w:p>
     <w:p>
-      <w:pPr>
-        <w:pStyle w:val="Titulo2Relatorio"/>
-        <w:spacing w:line="480" w:lineRule="auto"/>
-        <w:rPr>
-          <w:color w:val="auto"/>
-        </w:rPr>
-      </w:pPr>
       <w:r>
         <w:rPr>
           <w:noProof/>
-          <w:color w:val="auto"/>
           <w:lang w:eastAsia="pt-BR"/>
         </w:rPr>
         <w:drawing>
-          <wp:inline distT="0" distB="0" distL="0" distR="0">
+          <wp:inline distT="0" distB="0" distL="0" distR="0" wp14:anchorId="360254E6" wp14:editId="127FC656">
             <wp:extent cx="5731508" cy="3543983"/>
             <wp:effectExtent l="19050" t="0" r="2542" b="0"/>
             <wp:docPr id="16" name="Imagem 15" descr="reversed_input_grafico.PNG"/>
@@ -15834,7 +16183,19 @@
         <w:rPr>
           <w:color w:val="auto"/>
         </w:rPr>
-        <w:t xml:space="preserve"> - Gráfico comparativo das perfomances de cada algoritmo de ordenação com Entrada Reversa.</w:t>
+        <w:t xml:space="preserve"> - Gráfico comparativo das </w:t>
+      </w:r>
+      <w:r>
+        <w:rPr>
+          <w:color w:val="auto"/>
+        </w:rPr>
+        <w:t>performances</w:t>
+      </w:r>
+      <w:r>
+        <w:rPr>
+          <w:color w:val="auto"/>
+        </w:rPr>
+        <w:t xml:space="preserve"> de cada algoritmo de ordenação com Entrada Reversa.</w:t>
       </w:r>
     </w:p>
     <w:p>
@@ -15872,64 +16233,65 @@
       <w:r>
         <w:rPr>
           <w:b/>
-          <w:i/>
+          <w:iCs/>
         </w:rPr>
         <w:t>Quicksort</w:t>
       </w:r>
       <w:r>
         <w:rPr>
-          <w:i/>
+          <w:iCs/>
         </w:rPr>
         <w:t xml:space="preserve">, </w:t>
       </w:r>
       <w:r>
         <w:rPr>
           <w:b/>
-          <w:i/>
+          <w:iCs/>
         </w:rPr>
         <w:t>Selectionsort</w:t>
       </w:r>
       <w:r>
         <w:rPr>
-          <w:i/>
+          <w:iCs/>
         </w:rPr>
         <w:t xml:space="preserve"> e </w:t>
       </w:r>
       <w:r>
         <w:rPr>
           <w:b/>
-          <w:i/>
+          <w:iCs/>
         </w:rPr>
         <w:t>Heap</w:t>
       </w:r>
       <w:r>
         <w:rPr>
           <w:b/>
-          <w:i/>
+          <w:iCs/>
         </w:rPr>
         <w:t>sort</w:t>
       </w:r>
       <w:r>
-        <w:t>, e os seus tempos de execução foram comparados na tabela a seguir:</w:t>
+        <w:rPr>
+          <w:iCs/>
+        </w:rPr>
+        <w:t>,</w:t>
+      </w:r>
+      <w:r>
+        <w:t xml:space="preserve"> e os seus tempos de execução foram comparados na tabela a seguir:</w:t>
       </w:r>
     </w:p>
     <w:p>
       <w:pPr>
-        <w:pStyle w:val="Titulo2Relatorio"/>
-        <w:spacing w:line="480" w:lineRule="auto"/>
-        <w:rPr>
-          <w:color w:val="auto"/>
-        </w:rPr>
+        <w:jc w:val="center"/>
       </w:pPr>
       <w:r>
         <w:rPr>
           <w:noProof/>
-          <w:color w:val="auto"/>
           <w:lang w:eastAsia="pt-BR"/>
         </w:rPr>
         <w:lastRenderedPageBreak/>
         <w:drawing>
-          <wp:inline distT="0" distB="0" distL="0" distR="0">
+          <wp:inline distT="0" distB="0" distL="0" distR="0" wp14:anchorId="4AE88F5B" wp14:editId="56D08626">
             <wp:extent cx="4153260" cy="3216434"/>
             <wp:effectExtent l="19050" t="0" r="0" b="0"/>
             <wp:docPr id="14" name="Imagem 13" descr="uniform_input.PNG"/>
@@ -16310,7 +16672,7 @@
           <w:lang w:eastAsia="pt-BR"/>
         </w:rPr>
         <w:drawing>
-          <wp:inline distT="0" distB="0" distL="0" distR="0">
+          <wp:inline distT="0" distB="0" distL="0" distR="0" wp14:anchorId="18B755D2" wp14:editId="4C640FFC">
             <wp:extent cx="5731508" cy="3543983"/>
             <wp:effectExtent l="19050" t="0" r="2542" b="0"/>
             <wp:docPr id="17" name="Imagem 16" descr="uniform_input_grafico.PNG"/>
@@ -16395,7 +16757,19 @@
         <w:rPr>
           <w:color w:val="auto"/>
         </w:rPr>
-        <w:t xml:space="preserve"> - Gráfico comparativo das perfomances de cada algoritmo de ordenação com Entrada Uniforme.</w:t>
+        <w:t xml:space="preserve"> - Gráfico comparativo das </w:t>
+      </w:r>
+      <w:r>
+        <w:rPr>
+          <w:color w:val="auto"/>
+        </w:rPr>
+        <w:t>performances</w:t>
+      </w:r>
+      <w:r>
+        <w:rPr>
+          <w:color w:val="auto"/>
+        </w:rPr>
+        <w:t xml:space="preserve"> de cada algoritmo de ordenação com Entrada Uniforme.</w:t>
       </w:r>
     </w:p>
     <w:p>
@@ -16507,6 +16881,46 @@
     </w:p>
     <w:p>
       <w:pPr>
+        <w:pStyle w:val="NormalRelatorio"/>
+        <w:numPr>
+          <w:ilvl w:val="0"/>
+          <w:numId w:val="10"/>
+        </w:numPr>
+        <w:spacing w:line="480" w:lineRule="auto"/>
+      </w:pPr>
+      <w:r>
+        <w:rPr>
+          <w:bCs/>
+        </w:rPr>
+        <w:t xml:space="preserve">CPU: </w:t>
+      </w:r>
+      <w:r>
+        <w:rPr>
+          <w:b/>
+        </w:rPr>
+        <w:t xml:space="preserve">2.00 GHz </w:t>
+      </w:r>
+      <w:r>
+        <w:rPr>
+          <w:b/>
+        </w:rPr>
+        <w:t>com</w:t>
+      </w:r>
+      <w:r>
+        <w:rPr>
+          <w:b/>
+        </w:rPr>
+        <w:t xml:space="preserve"> 2 Núcleos</w:t>
+      </w:r>
+      <w:r>
+        <w:rPr>
+          <w:bCs/>
+        </w:rPr>
+        <w:t>.</w:t>
+      </w:r>
+    </w:p>
+    <w:p>
+      <w:pPr>
         <w:pStyle w:val="Ttulo3"/>
         <w:spacing w:line="480" w:lineRule="auto"/>
         <w:jc w:val="both"/>
@@ -16519,6 +16933,7 @@
         <w:rPr>
           <w:color w:val="auto"/>
         </w:rPr>
+        <w:lastRenderedPageBreak/>
         <w:t>Sistema Operacional</w:t>
       </w:r>
       <w:bookmarkEnd w:id="20"/>
@@ -16553,11 +16968,7 @@
         <w:t>.</w:t>
       </w:r>
       <w:r>
-        <w:t xml:space="preserve"> Para </w:t>
-      </w:r>
-      <w:r>
-        <w:lastRenderedPageBreak/>
-        <w:t>identificá-lo, acessamos o programa “Informações do sistema”</w:t>
+        <w:t xml:space="preserve"> Para identificá-lo, acessamos o programa “Informações do sistema”</w:t>
       </w:r>
       <w:r>
         <w:t xml:space="preserve"> na barra de pesquisa do </w:t>
@@ -16590,7 +17001,7 @@
           <w:lang w:eastAsia="pt-BR"/>
         </w:rPr>
         <w:drawing>
-          <wp:inline distT="0" distB="0" distL="0" distR="0">
+          <wp:inline distT="0" distB="0" distL="0" distR="0" wp14:anchorId="35C62751" wp14:editId="0DDF1011">
             <wp:extent cx="5731510" cy="3074670"/>
             <wp:effectExtent l="19050" t="0" r="2540" b="0"/>
             <wp:docPr id="2" name="Imagem 1" descr="Sistema_Operacional.PNG"/>
@@ -16689,23 +17100,15 @@
       </w:r>
     </w:p>
     <w:p>
-      <w:pPr>
-        <w:pStyle w:val="Titulo2Relatorio"/>
-        <w:spacing w:line="480" w:lineRule="auto"/>
-        <w:rPr>
-          <w:color w:val="auto"/>
-        </w:rPr>
-      </w:pPr>
       <w:r>
         <w:rPr>
           <w:rFonts w:eastAsiaTheme="minorEastAsia"/>
           <w:noProof/>
-          <w:color w:val="auto"/>
           <w:lang w:eastAsia="pt-BR"/>
         </w:rPr>
         <w:lastRenderedPageBreak/>
         <w:drawing>
-          <wp:inline distT="0" distB="0" distL="0" distR="0">
+          <wp:inline distT="0" distB="0" distL="0" distR="0" wp14:anchorId="41781426" wp14:editId="36A9C395">
             <wp:extent cx="5731510" cy="3074670"/>
             <wp:effectExtent l="19050" t="0" r="2540" b="0"/>
             <wp:docPr id="3" name="Imagem 2" descr="RAM.PNG"/>
@@ -16797,7 +17200,7 @@
           <w:lang w:eastAsia="pt-BR"/>
         </w:rPr>
         <w:drawing>
-          <wp:inline distT="0" distB="0" distL="0" distR="0">
+          <wp:inline distT="0" distB="0" distL="0" distR="0" wp14:anchorId="29C0F370" wp14:editId="6A47CE07">
             <wp:extent cx="5731510" cy="2929255"/>
             <wp:effectExtent l="19050" t="0" r="2540" b="0"/>
             <wp:docPr id="26" name="Imagem 25" descr="CPU.PNG"/>
@@ -17238,10 +17641,22 @@
         <w:spacing w:line="480" w:lineRule="auto"/>
       </w:pPr>
       <w:r>
-        <w:t>Através das tabelas e gráficos dos resultados dos t</w:t>
-      </w:r>
-      <w:r>
-        <w:t>estes, foi possível determinar as</w:t>
+        <w:t>Através das tabelas e gráficos resulta</w:t>
+      </w:r>
+      <w:r>
+        <w:t>nte</w:t>
+      </w:r>
+      <w:r>
+        <w:t>s dos t</w:t>
+      </w:r>
+      <w:r>
+        <w:t>estes</w:t>
+      </w:r>
+      <w:r>
+        <w:t xml:space="preserve"> executados</w:t>
+      </w:r>
+      <w:r>
+        <w:t>, foi possível determinar as</w:t>
       </w:r>
       <w:r>
         <w:t xml:space="preserve"> seguinte</w:t>
@@ -17385,26 +17800,38 @@
         <w:rPr>
           <w:rFonts w:eastAsiaTheme="minorEastAsia"/>
         </w:rPr>
-        <w:t>corrida de processamento.</w:t>
+        <w:t xml:space="preserve">corrida de </w:t>
       </w:r>
       <w:r>
         <w:rPr>
           <w:rFonts w:eastAsiaTheme="minorEastAsia"/>
         </w:rPr>
-        <w:t xml:space="preserve"> Sendo superado pelo algoritmo de ordenação Quicksort, por conta </w:t>
+        <w:lastRenderedPageBreak/>
+        <w:t>processamento.</w:t>
       </w:r>
       <w:r>
         <w:rPr>
           <w:rFonts w:eastAsiaTheme="minorEastAsia"/>
         </w:rPr>
-        <w:lastRenderedPageBreak/>
-        <w:t>de suas comparações serem menos complexas</w:t>
+        <w:t xml:space="preserve"> Sendo superado pelo algoritmo de ordenação Quicksort, por conta de suas comparações serem menos complexas</w:t>
       </w:r>
       <w:r>
         <w:rPr>
           <w:rFonts w:eastAsiaTheme="minorEastAsia"/>
         </w:rPr>
-        <w:t xml:space="preserve">, nos pior e médio caso ele é </w:t>
+        <w:t xml:space="preserve">, no </w:t>
+      </w:r>
+      <w:r>
+        <w:rPr>
+          <w:rFonts w:eastAsiaTheme="minorEastAsia"/>
+        </w:rPr>
+        <w:t>melhor</w:t>
+      </w:r>
+      <w:r>
+        <w:rPr>
+          <w:rFonts w:eastAsiaTheme="minorEastAsia"/>
+        </w:rPr>
+        <w:t xml:space="preserve"> e médio caso ele é </w:t>
       </w:r>
       <m:oMath>
         <m:r>
@@ -17447,7 +17874,94 @@
         <w:rPr>
           <w:rFonts w:eastAsiaTheme="minorEastAsia"/>
         </w:rPr>
-        <w:t xml:space="preserve">, já a sua complexidade no pior caso é </w:t>
+        <w:t>, já a sua complexidade no pior caso</w:t>
+      </w:r>
+      <w:r>
+        <w:rPr>
+          <w:rFonts w:eastAsiaTheme="minorEastAsia"/>
+        </w:rPr>
+        <w:t>, dependendo do seu pivô, pode ser</w:t>
+      </w:r>
+      <w:r>
+        <w:rPr>
+          <w:rFonts w:eastAsiaTheme="minorEastAsia"/>
+        </w:rPr>
+        <w:t xml:space="preserve"> </w:t>
+      </w:r>
+      <m:oMath>
+        <m:r>
+          <w:rPr>
+            <w:rFonts w:ascii="Cambria Math" w:eastAsiaTheme="minorEastAsia" w:hAnsi="Cambria Math"/>
+          </w:rPr>
+          <m:t>O(n</m:t>
+        </m:r>
+        <m:r>
+          <w:rPr>
+            <w:rFonts w:ascii="Cambria Math" w:eastAsiaTheme="minorEastAsia" w:hAnsi="Cambria Math"/>
+          </w:rPr>
+          <m:t>²</m:t>
+        </m:r>
+        <m:r>
+          <w:rPr>
+            <w:rFonts w:ascii="Cambria Math" w:eastAsiaTheme="minorEastAsia" w:hAnsi="Cambria Math"/>
+          </w:rPr>
+          <m:t>)</m:t>
+        </m:r>
+      </m:oMath>
+      <w:r>
+        <w:rPr>
+          <w:rFonts w:eastAsiaTheme="minorEastAsia"/>
+        </w:rPr>
+        <w:t xml:space="preserve"> se mal aplicado ou se bem aplicado os seus casos mudam para</w:t>
+      </w:r>
+      <w:r>
+        <w:rPr>
+          <w:rFonts w:eastAsiaTheme="minorEastAsia"/>
+        </w:rPr>
+        <w:t xml:space="preserve"> </w:t>
+      </w:r>
+      <m:oMath>
+        <m:r>
+          <w:rPr>
+            <w:rFonts w:ascii="Cambria Math" w:eastAsiaTheme="minorEastAsia" w:hAnsi="Cambria Math"/>
+          </w:rPr>
+          <m:t>O(</m:t>
+        </m:r>
+        <m:func>
+          <m:funcPr>
+            <m:ctrlPr>
+              <w:rPr>
+                <w:rFonts w:ascii="Cambria Math" w:eastAsiaTheme="minorEastAsia" w:hAnsi="Cambria Math"/>
+                <w:i/>
+              </w:rPr>
+            </m:ctrlPr>
+          </m:funcPr>
+          <m:fName>
+            <m:r>
+              <m:rPr>
+                <m:sty m:val="p"/>
+              </m:rPr>
+              <w:rPr>
+                <w:rFonts w:ascii="Cambria Math" w:eastAsiaTheme="minorEastAsia" w:hAnsi="Cambria Math"/>
+              </w:rPr>
+              <m:t>log</m:t>
+            </m:r>
+          </m:fName>
+          <m:e>
+            <m:r>
+              <w:rPr>
+                <w:rFonts w:ascii="Cambria Math" w:eastAsiaTheme="minorEastAsia" w:hAnsi="Cambria Math"/>
+              </w:rPr>
+              <m:t>n)</m:t>
+            </m:r>
+          </m:e>
+        </m:func>
+      </m:oMath>
+      <w:r>
+        <w:rPr>
+          <w:rFonts w:eastAsiaTheme="minorEastAsia"/>
+        </w:rPr>
+        <w:t xml:space="preserve"> nos melhores e piores, e por fim o melhor será alterado para </w:t>
       </w:r>
       <m:oMath>
         <m:r>
@@ -17549,6 +18063,329 @@
     </w:p>
     <w:p>
       <w:pPr>
+        <w:pStyle w:val="NormalRelatorio"/>
+      </w:pPr>
+      <w:r>
+        <w:t>O</w:t>
+      </w:r>
+      <w:r>
+        <w:t xml:space="preserve"> </w:t>
+      </w:r>
+      <w:r>
+        <w:rPr>
+          <w:b/>
+          <w:bCs/>
+        </w:rPr>
+        <w:t>Heap</w:t>
+      </w:r>
+      <w:r>
+        <w:rPr>
+          <w:b/>
+          <w:bCs/>
+        </w:rPr>
+        <w:t>s</w:t>
+      </w:r>
+      <w:r>
+        <w:rPr>
+          <w:b/>
+          <w:bCs/>
+        </w:rPr>
+        <w:t>ort</w:t>
+      </w:r>
+      <w:r>
+        <w:t xml:space="preserve"> se mostrou um algoritmo com desempenho </w:t>
+      </w:r>
+      <w:r>
+        <w:t>estático</w:t>
+      </w:r>
+      <w:r>
+        <w:t>, mantendo</w:t>
+      </w:r>
+      <w:r>
+        <w:t xml:space="preserve">-se linear com a sua </w:t>
+      </w:r>
+      <w:r>
+        <w:t xml:space="preserve">complexidade </w:t>
+      </w:r>
+      <m:oMath>
+        <m:r>
+          <w:rPr>
+            <w:rFonts w:ascii="Cambria Math" w:hAnsi="Cambria Math"/>
+          </w:rPr>
+          <m:t>O(n</m:t>
+        </m:r>
+        <m:func>
+          <m:funcPr>
+            <m:ctrlPr>
+              <w:rPr>
+                <w:rFonts w:ascii="Cambria Math" w:hAnsi="Cambria Math"/>
+                <w:i/>
+              </w:rPr>
+            </m:ctrlPr>
+          </m:funcPr>
+          <m:fName>
+            <m:r>
+              <m:rPr>
+                <m:sty m:val="p"/>
+              </m:rPr>
+              <w:rPr>
+                <w:rFonts w:ascii="Cambria Math" w:hAnsi="Cambria Math"/>
+              </w:rPr>
+              <m:t>log</m:t>
+            </m:r>
+          </m:fName>
+          <m:e>
+            <m:r>
+              <w:rPr>
+                <w:rFonts w:ascii="Cambria Math" w:hAnsi="Cambria Math"/>
+              </w:rPr>
+              <m:t>n)</m:t>
+            </m:r>
+          </m:e>
+        </m:func>
+      </m:oMath>
+      <w:r>
+        <w:t xml:space="preserve"> em todos os casos. </w:t>
+      </w:r>
+      <w:r>
+        <w:t>Dentre os s</w:t>
+      </w:r>
+      <w:r>
+        <w:t>eu</w:t>
+      </w:r>
+      <w:r>
+        <w:t>s</w:t>
+      </w:r>
+      <w:r>
+        <w:t xml:space="preserve"> ponto</w:t>
+      </w:r>
+      <w:r>
+        <w:t>s</w:t>
+      </w:r>
+      <w:r>
+        <w:t xml:space="preserve"> forte</w:t>
+      </w:r>
+      <w:r>
+        <w:t>s,</w:t>
+      </w:r>
+      <w:r>
+        <w:t xml:space="preserve"> é </w:t>
+      </w:r>
+      <w:r>
+        <w:t xml:space="preserve">válido ressaltar </w:t>
+      </w:r>
+      <w:r>
+        <w:t xml:space="preserve">a </w:t>
+      </w:r>
+      <w:r>
+        <w:t xml:space="preserve">sua </w:t>
+      </w:r>
+      <w:r>
+        <w:t xml:space="preserve">previsibilidade e uso eficiente de memória, já que é um algoritmo </w:t>
+      </w:r>
+      <w:r>
+        <w:t xml:space="preserve">classificado como </w:t>
+      </w:r>
+      <w:r>
+        <w:rPr>
+          <w:i/>
+          <w:iCs/>
+        </w:rPr>
+        <w:t>in-place</w:t>
+      </w:r>
+      <w:r>
+        <w:t>(não necessita de memória adicional em sua execução)</w:t>
+      </w:r>
+      <w:r>
+        <w:t xml:space="preserve">. Por outro </w:t>
+      </w:r>
+      <w:r>
+        <w:t>l</w:t>
+      </w:r>
+      <w:r>
+        <w:t>ado, ele n</w:t>
+      </w:r>
+      <w:r>
+        <w:t>ã</w:t>
+      </w:r>
+      <w:r>
+        <w:t xml:space="preserve">o </w:t>
+      </w:r>
+      <w:r>
+        <w:t>pode ser considerável</w:t>
+      </w:r>
+      <w:r>
+        <w:t xml:space="preserve"> estável e, em muitos casos práticos, acaba sendo mais lento que o </w:t>
+      </w:r>
+      <w:r>
+        <w:rPr>
+          <w:b/>
+          <w:bCs/>
+        </w:rPr>
+        <w:t>Q</w:t>
+      </w:r>
+      <w:r>
+        <w:rPr>
+          <w:b/>
+          <w:bCs/>
+        </w:rPr>
+        <w:t>uicksort</w:t>
+      </w:r>
+      <w:r>
+        <w:t>, especialmente com entradas pequenas ou parcialmente ordenadas.</w:t>
+      </w:r>
+    </w:p>
+    <w:p>
+      <w:pPr>
+        <w:pStyle w:val="NormalRelatorio"/>
+      </w:pPr>
+      <w:r>
+        <w:t xml:space="preserve">Nos testes realizados, </w:t>
+      </w:r>
+      <w:r>
+        <w:t xml:space="preserve">vimos que o </w:t>
+      </w:r>
+      <w:r>
+        <w:rPr>
+          <w:b/>
+          <w:bCs/>
+        </w:rPr>
+        <w:t>Q</w:t>
+      </w:r>
+      <w:r>
+        <w:rPr>
+          <w:b/>
+          <w:bCs/>
+        </w:rPr>
+        <w:t>uicksort</w:t>
+      </w:r>
+      <w:r>
+        <w:t xml:space="preserve"> </w:t>
+      </w:r>
+      <w:r>
+        <w:t xml:space="preserve">declarado </w:t>
+      </w:r>
+      <w:r>
+        <w:t xml:space="preserve">na linguagem C apresentou desempenho superior ao </w:t>
+      </w:r>
+      <w:r>
+        <w:rPr>
+          <w:b/>
+          <w:bCs/>
+        </w:rPr>
+        <w:t>Heap</w:t>
+      </w:r>
+      <w:r>
+        <w:rPr>
+          <w:b/>
+          <w:bCs/>
+        </w:rPr>
+        <w:t>s</w:t>
+      </w:r>
+      <w:r>
+        <w:rPr>
+          <w:b/>
+          <w:bCs/>
+        </w:rPr>
+        <w:t>ort</w:t>
+      </w:r>
+      <w:r>
+        <w:t xml:space="preserve"> </w:t>
+      </w:r>
+      <w:r>
+        <w:t xml:space="preserve">e aos demais algoritmos de ordenação, </w:t>
+      </w:r>
+      <w:r>
+        <w:t>em praticamente todos os cenários.</w:t>
+      </w:r>
+    </w:p>
+    <w:p>
+      <w:pPr>
+        <w:pStyle w:val="NormalRelatorio"/>
+      </w:pPr>
+      <w:r>
+        <w:t xml:space="preserve">Isso se deve à maneira como o </w:t>
+      </w:r>
+      <w:r>
+        <w:rPr>
+          <w:b/>
+          <w:bCs/>
+        </w:rPr>
+        <w:t>Q</w:t>
+      </w:r>
+      <w:r>
+        <w:rPr>
+          <w:b/>
+          <w:bCs/>
+        </w:rPr>
+        <w:t>uicksort</w:t>
+      </w:r>
+      <w:r>
+        <w:t xml:space="preserve"> realiza </w:t>
+      </w:r>
+      <w:r>
+        <w:t>comparações</w:t>
+      </w:r>
+      <w:r>
+        <w:t xml:space="preserve"> mais </w:t>
+      </w:r>
+      <w:r>
+        <w:t>ágeis</w:t>
+      </w:r>
+      <w:r>
+        <w:t xml:space="preserve"> e eficientes. Ainda assim, </w:t>
+      </w:r>
+      <w:r>
+        <w:t>considerando que cada um dos algoritmos de ordenação demonstrados</w:t>
+      </w:r>
+      <w:r>
+        <w:t xml:space="preserve"> foram criados para finalidades específicas</w:t>
+      </w:r>
+      <w:r>
+        <w:t xml:space="preserve">, </w:t>
+      </w:r>
+      <w:r>
+        <w:t xml:space="preserve">o </w:t>
+      </w:r>
+      <w:r>
+        <w:rPr>
+          <w:b/>
+          <w:bCs/>
+        </w:rPr>
+        <w:t>Heap</w:t>
+      </w:r>
+      <w:r>
+        <w:rPr>
+          <w:b/>
+          <w:bCs/>
+        </w:rPr>
+        <w:t>s</w:t>
+      </w:r>
+      <w:r>
+        <w:rPr>
+          <w:b/>
+          <w:bCs/>
+        </w:rPr>
+        <w:t>ort</w:t>
+      </w:r>
+      <w:r>
+        <w:t xml:space="preserve"> </w:t>
+      </w:r>
+      <w:r>
+        <w:t>possui</w:t>
+      </w:r>
+      <w:r>
+        <w:t xml:space="preserve"> relevância em situações onde a previsibilidade do tempo de execução é mais importante que a velocidade média,</w:t>
+      </w:r>
+      <w:r>
+        <w:t xml:space="preserve"> </w:t>
+      </w:r>
+      <w:r>
+        <w:t>como em sistemas de tempo real.</w:t>
+      </w:r>
+    </w:p>
+    <w:p>
+      <w:pPr>
         <w:jc w:val="both"/>
         <w:rPr>
           <w:rFonts w:ascii="Times" w:eastAsiaTheme="majorEastAsia" w:hAnsi="Times" w:cs="Times"/>
@@ -17598,18 +18435,6 @@
     </w:p>
     <w:p>
       <w:pPr>
-        <w:pStyle w:val="PargrafodaLista"/>
-        <w:spacing w:line="480" w:lineRule="auto"/>
-        <w:jc w:val="both"/>
-        <w:rPr>
-          <w:rFonts w:ascii="Times" w:hAnsi="Times" w:cs="Times"/>
-          <w:sz w:val="24"/>
-          <w:szCs w:val="24"/>
-        </w:rPr>
-      </w:pPr>
-    </w:p>
-    <w:p>
-      <w:pPr>
         <w:pStyle w:val="NormalWeb"/>
         <w:numPr>
           <w:ilvl w:val="0"/>
@@ -17839,7 +18664,27 @@
           <w:sz w:val="22"/>
           <w:szCs w:val="22"/>
         </w:rPr>
-        <w:t>Analysis of String Sorting using Heapsort : Igor Stassiy : Free Download, Borrow, and Streaming : Internet Archive</w:t>
+        <w:t xml:space="preserve">Analysis of String Sorting using </w:t>
+      </w:r>
+      <w:r>
+        <w:rPr>
+          <w:rFonts w:ascii="Times" w:hAnsi="Times" w:cs="Times"/>
+          <w:b/>
+          <w:bCs/>
+          <w:sz w:val="22"/>
+          <w:szCs w:val="22"/>
+        </w:rPr>
+        <w:t>Heapsort:</w:t>
+      </w:r>
+      <w:r>
+        <w:rPr>
+          <w:rFonts w:ascii="Times" w:hAnsi="Times" w:cs="Times"/>
+          <w:b/>
+          <w:bCs/>
+          <w:sz w:val="22"/>
+          <w:szCs w:val="22"/>
+        </w:rPr>
+        <w:t xml:space="preserve"> Igor Stassiy : Free Download, Borrow, and Streaming : Internet Archive</w:t>
       </w:r>
       <w:r>
         <w:rPr>
@@ -17924,6 +18769,99 @@
           <w:szCs w:val="22"/>
         </w:rPr>
         <w:t>. Disponível em: &lt;https://www.geeksforgeeks.org/heap-sort/#complexity-analysis-of-heap-sort&gt;.</w:t>
+      </w:r>
+    </w:p>
+    <w:p>
+      <w:pPr>
+        <w:pStyle w:val="NormalWeb"/>
+        <w:numPr>
+          <w:ilvl w:val="0"/>
+          <w:numId w:val="12"/>
+        </w:numPr>
+        <w:spacing w:before="0" w:beforeAutospacing="0" w:after="0" w:afterAutospacing="0" w:line="360" w:lineRule="atLeast"/>
+        <w:jc w:val="both"/>
+        <w:rPr>
+          <w:rFonts w:ascii="Times" w:hAnsi="Times" w:cs="Times"/>
+          <w:sz w:val="22"/>
+          <w:szCs w:val="22"/>
+        </w:rPr>
+      </w:pPr>
+      <w:r>
+        <w:rPr>
+          <w:rFonts w:ascii="Times" w:hAnsi="Times" w:cs="Times"/>
+          <w:sz w:val="22"/>
+          <w:szCs w:val="22"/>
+        </w:rPr>
+        <w:t xml:space="preserve">BAELDUNG. </w:t>
+      </w:r>
+      <w:r>
+        <w:rPr>
+          <w:rFonts w:ascii="Times" w:hAnsi="Times" w:cs="Times"/>
+          <w:b/>
+          <w:bCs/>
+          <w:sz w:val="22"/>
+          <w:szCs w:val="22"/>
+        </w:rPr>
+        <w:t>Quicksort vs. Heapsort</w:t>
+      </w:r>
+      <w:r>
+        <w:rPr>
+          <w:rFonts w:ascii="Times" w:hAnsi="Times" w:cs="Times"/>
+          <w:sz w:val="22"/>
+          <w:szCs w:val="22"/>
+        </w:rPr>
+        <w:t>. Disponível em:</w:t>
+      </w:r>
+      <w:r>
+        <w:rPr>
+          <w:rFonts w:ascii="Times" w:hAnsi="Times" w:cs="Times"/>
+          <w:sz w:val="22"/>
+          <w:szCs w:val="22"/>
+        </w:rPr>
+        <w:t>&lt;</w:t>
+      </w:r>
+      <w:r>
+        <w:t xml:space="preserve"> </w:t>
+      </w:r>
+      <w:r>
+        <w:rPr>
+          <w:rFonts w:ascii="Times" w:hAnsi="Times" w:cs="Times"/>
+          <w:sz w:val="22"/>
+          <w:szCs w:val="22"/>
+        </w:rPr>
+        <w:t>https://www.baeldung.com/cs/quicksort-vs-heapsort</w:t>
+      </w:r>
+      <w:r>
+        <w:rPr>
+          <w:rFonts w:ascii="Times" w:hAnsi="Times" w:cs="Times"/>
+          <w:sz w:val="22"/>
+          <w:szCs w:val="22"/>
+        </w:rPr>
+        <w:t>&gt;</w:t>
+      </w:r>
+      <w:r>
+        <w:rPr>
+          <w:rFonts w:ascii="Times" w:hAnsi="Times" w:cs="Times"/>
+          <w:sz w:val="22"/>
+          <w:szCs w:val="22"/>
+        </w:rPr>
+        <w:t xml:space="preserve">. Acesso em: </w:t>
+      </w:r>
+      <w:r>
+        <w:rPr>
+          <w:rFonts w:ascii="Times" w:hAnsi="Times" w:cs="Times"/>
+          <w:sz w:val="22"/>
+          <w:szCs w:val="22"/>
+        </w:rPr>
+        <w:t>4</w:t>
+      </w:r>
+      <w:r>
+        <w:rPr>
+          <w:rFonts w:ascii="Times" w:hAnsi="Times" w:cs="Times"/>
+          <w:sz w:val="22"/>
+          <w:szCs w:val="22"/>
+        </w:rPr>
+        <w:t xml:space="preserve"> jun. 2025.</w:t>
       </w:r>
     </w:p>
     <w:sectPr>
@@ -17939,8 +18877,8 @@
 </file>
 
 <file path=word/endnotes.xml><?xml version="1.0" encoding="utf-8"?>
-<w:endnotes xmlns:ve="http://schemas.openxmlformats.org/markup-compatibility/2006" xmlns:o="urn:schemas-microsoft-com:office:office" xmlns:r="http://schemas.openxmlformats.org/officeDocument/2006/relationships" xmlns:m="http://schemas.openxmlformats.org/officeDocument/2006/math" xmlns:v="urn:schemas-microsoft-com:vml" xmlns:wp="http://schemas.openxmlformats.org/drawingml/2006/wordprocessingDrawing" xmlns:w10="urn:schemas-microsoft-com:office:word" xmlns:w="http://schemas.openxmlformats.org/wordprocessingml/2006/main" xmlns:wne="http://schemas.microsoft.com/office/word/2006/wordml">
-  <w:endnote w:type="separator" w:id="0">
+<w:endnotes xmlns:wpc="http://schemas.microsoft.com/office/word/2010/wordprocessingCanvas" xmlns:cx="http://schemas.microsoft.com/office/drawing/2014/chartex" xmlns:cx1="http://schemas.microsoft.com/office/drawing/2015/9/8/chartex" xmlns:cx2="http://schemas.microsoft.com/office/drawing/2015/10/21/chartex" xmlns:cx3="http://schemas.microsoft.com/office/drawing/2016/5/9/chartex" xmlns:cx4="http://schemas.microsoft.com/office/drawing/2016/5/10/chartex" xmlns:cx5="http://schemas.microsoft.com/office/drawing/2016/5/11/chartex" xmlns:cx6="http://schemas.microsoft.com/office/drawing/2016/5/12/chartex" xmlns:cx7="http://schemas.microsoft.com/office/drawing/2016/5/13/chartex" xmlns:cx8="http://schemas.microsoft.com/office/drawing/2016/5/14/chartex" xmlns:mc="http://schemas.openxmlformats.org/markup-compatibility/2006" xmlns:aink="http://schemas.microsoft.com/office/drawing/2016/ink" xmlns:am3d="http://schemas.microsoft.com/office/drawing/2017/model3d" xmlns:o="urn:schemas-microsoft-com:office:office" xmlns:oel="http://schemas.microsoft.com/office/2019/extlst" xmlns:r="http://schemas.openxmlformats.org/officeDocument/2006/relationships" xmlns:m="http://schemas.openxmlformats.org/officeDocument/2006/math" xmlns:v="urn:schemas-microsoft-com:vml" xmlns:wp14="http://schemas.microsoft.com/office/word/2010/wordprocessingDrawing" xmlns:wp="http://schemas.openxmlformats.org/drawingml/2006/wordprocessingDrawing" xmlns:w10="urn:schemas-microsoft-com:office:word" xmlns:w="http://schemas.openxmlformats.org/wordprocessingml/2006/main" xmlns:w14="http://schemas.microsoft.com/office/word/2010/wordml" xmlns:w15="http://schemas.microsoft.com/office/word/2012/wordml" xmlns:w16cex="http://schemas.microsoft.com/office/word/2018/wordml/cex" xmlns:w16cid="http://schemas.microsoft.com/office/word/2016/wordml/cid" xmlns:w16="http://schemas.microsoft.com/office/word/2018/wordml" xmlns:w16sdtdh="http://schemas.microsoft.com/office/word/2020/wordml/sdtdatahash" xmlns:w16se="http://schemas.microsoft.com/office/word/2015/wordml/symex" xmlns:wpg="http://schemas.microsoft.com/office/word/2010/wordprocessingGroup" xmlns:wpi="http://schemas.microsoft.com/office/word/2010/wordprocessingInk" xmlns:wne="http://schemas.microsoft.com/office/word/2006/wordml" xmlns:wps="http://schemas.microsoft.com/office/word/2010/wordprocessingShape" mc:Ignorable="w14 w15 w16se w16cid w16 w16cex w16sdtdh wp14">
+  <w:endnote w:type="separator" w:id="-1">
     <w:p>
       <w:pPr>
         <w:spacing w:after="0" w:line="240" w:lineRule="auto"/>
@@ -17950,7 +18888,7 @@
       </w:r>
     </w:p>
   </w:endnote>
-  <w:endnote w:type="continuationSeparator" w:id="1">
+  <w:endnote w:type="continuationSeparator" w:id="0">
     <w:p>
       <w:pPr>
         <w:spacing w:after="0" w:line="240" w:lineRule="auto"/>
@@ -17964,7 +18902,7 @@
 </file>
 
 <file path=word/footer1.xml><?xml version="1.0" encoding="utf-8"?>
-<w:ftr xmlns:ve="http://schemas.openxmlformats.org/markup-compatibility/2006" xmlns:o="urn:schemas-microsoft-com:office:office" xmlns:r="http://schemas.openxmlformats.org/officeDocument/2006/relationships" xmlns:m="http://schemas.openxmlformats.org/officeDocument/2006/math" xmlns:v="urn:schemas-microsoft-com:vml" xmlns:wp="http://schemas.openxmlformats.org/drawingml/2006/wordprocessingDrawing" xmlns:w10="urn:schemas-microsoft-com:office:word" xmlns:w="http://schemas.openxmlformats.org/wordprocessingml/2006/main" xmlns:wne="http://schemas.microsoft.com/office/word/2006/wordml">
+<w:ftr xmlns:wpc="http://schemas.microsoft.com/office/word/2010/wordprocessingCanvas" xmlns:cx="http://schemas.microsoft.com/office/drawing/2014/chartex" xmlns:cx1="http://schemas.microsoft.com/office/drawing/2015/9/8/chartex" xmlns:cx2="http://schemas.microsoft.com/office/drawing/2015/10/21/chartex" xmlns:cx3="http://schemas.microsoft.com/office/drawing/2016/5/9/chartex" xmlns:cx4="http://schemas.microsoft.com/office/drawing/2016/5/10/chartex" xmlns:cx5="http://schemas.microsoft.com/office/drawing/2016/5/11/chartex" xmlns:cx6="http://schemas.microsoft.com/office/drawing/2016/5/12/chartex" xmlns:cx7="http://schemas.microsoft.com/office/drawing/2016/5/13/chartex" xmlns:cx8="http://schemas.microsoft.com/office/drawing/2016/5/14/chartex" xmlns:mc="http://schemas.openxmlformats.org/markup-compatibility/2006" xmlns:aink="http://schemas.microsoft.com/office/drawing/2016/ink" xmlns:am3d="http://schemas.microsoft.com/office/drawing/2017/model3d" xmlns:o="urn:schemas-microsoft-com:office:office" xmlns:oel="http://schemas.microsoft.com/office/2019/extlst" xmlns:r="http://schemas.openxmlformats.org/officeDocument/2006/relationships" xmlns:m="http://schemas.openxmlformats.org/officeDocument/2006/math" xmlns:v="urn:schemas-microsoft-com:vml" xmlns:wp14="http://schemas.microsoft.com/office/word/2010/wordprocessingDrawing" xmlns:wp="http://schemas.openxmlformats.org/drawingml/2006/wordprocessingDrawing" xmlns:w10="urn:schemas-microsoft-com:office:word" xmlns:w="http://schemas.openxmlformats.org/wordprocessingml/2006/main" xmlns:w14="http://schemas.microsoft.com/office/word/2010/wordml" xmlns:w15="http://schemas.microsoft.com/office/word/2012/wordml" xmlns:w16cex="http://schemas.microsoft.com/office/word/2018/wordml/cex" xmlns:w16cid="http://schemas.microsoft.com/office/word/2016/wordml/cid" xmlns:w16="http://schemas.microsoft.com/office/word/2018/wordml" xmlns:w16sdtdh="http://schemas.microsoft.com/office/word/2020/wordml/sdtdatahash" xmlns:w16se="http://schemas.microsoft.com/office/word/2015/wordml/symex" xmlns:wpg="http://schemas.microsoft.com/office/word/2010/wordprocessingGroup" xmlns:wpi="http://schemas.microsoft.com/office/word/2010/wordprocessingInk" xmlns:wne="http://schemas.microsoft.com/office/word/2006/wordml" xmlns:wps="http://schemas.microsoft.com/office/word/2010/wordprocessingShape" mc:Ignorable="w14 w15 w16se w16cid w16 w16cex w16sdtdh wp14">
   <w:sdt>
     <w:sdtPr>
       <w:id w:val="48479722"/>
@@ -17979,14 +18917,27 @@
           <w:pStyle w:val="Rodap"/>
           <w:jc w:val="right"/>
         </w:pPr>
-        <w:fldSimple w:instr=" PAGE   \* MERGEFORMAT ">
-          <w:r>
-            <w:rPr>
-              <w:noProof/>
-            </w:rPr>
-            <w:t>23</w:t>
-          </w:r>
-        </w:fldSimple>
+        <w:r>
+          <w:fldChar w:fldCharType="begin"/>
+        </w:r>
+        <w:r>
+          <w:instrText xml:space="preserve"> PAGE   \* MERGEFORMAT </w:instrText>
+        </w:r>
+        <w:r>
+          <w:fldChar w:fldCharType="separate"/>
+        </w:r>
+        <w:r>
+          <w:rPr>
+            <w:noProof/>
+          </w:rPr>
+          <w:t>23</w:t>
+        </w:r>
+        <w:r>
+          <w:rPr>
+            <w:noProof/>
+          </w:rPr>
+          <w:fldChar w:fldCharType="end"/>
+        </w:r>
       </w:p>
     </w:sdtContent>
   </w:sdt>
@@ -18000,7 +18951,7 @@
         <w:lang w:eastAsia="pt-BR"/>
       </w:rPr>
       <w:drawing>
-        <wp:inline distT="0" distB="0" distL="0" distR="0">
+        <wp:inline distT="0" distB="0" distL="0" distR="0" wp14:anchorId="6315283A" wp14:editId="3DB5329B">
           <wp:extent cx="1584960" cy="633984"/>
           <wp:effectExtent l="0" t="0" r="0" b="0"/>
           <wp:docPr id="8" name="Imagem 7" descr="unibrasil_logo.png"/>
@@ -18037,12 +18988,13 @@
       </w:drawing>
     </w:r>
   </w:p>
+  <w:p/>
 </w:ftr>
 </file>
 
 <file path=word/footnotes.xml><?xml version="1.0" encoding="utf-8"?>
-<w:footnotes xmlns:ve="http://schemas.openxmlformats.org/markup-compatibility/2006" xmlns:o="urn:schemas-microsoft-com:office:office" xmlns:r="http://schemas.openxmlformats.org/officeDocument/2006/relationships" xmlns:m="http://schemas.openxmlformats.org/officeDocument/2006/math" xmlns:v="urn:schemas-microsoft-com:vml" xmlns:wp="http://schemas.openxmlformats.org/drawingml/2006/wordprocessingDrawing" xmlns:w10="urn:schemas-microsoft-com:office:word" xmlns:w="http://schemas.openxmlformats.org/wordprocessingml/2006/main" xmlns:wne="http://schemas.microsoft.com/office/word/2006/wordml">
-  <w:footnote w:type="separator" w:id="0">
+<w:footnotes xmlns:wpc="http://schemas.microsoft.com/office/word/2010/wordprocessingCanvas" xmlns:cx="http://schemas.microsoft.com/office/drawing/2014/chartex" xmlns:cx1="http://schemas.microsoft.com/office/drawing/2015/9/8/chartex" xmlns:cx2="http://schemas.microsoft.com/office/drawing/2015/10/21/chartex" xmlns:cx3="http://schemas.microsoft.com/office/drawing/2016/5/9/chartex" xmlns:cx4="http://schemas.microsoft.com/office/drawing/2016/5/10/chartex" xmlns:cx5="http://schemas.microsoft.com/office/drawing/2016/5/11/chartex" xmlns:cx6="http://schemas.microsoft.com/office/drawing/2016/5/12/chartex" xmlns:cx7="http://schemas.microsoft.com/office/drawing/2016/5/13/chartex" xmlns:cx8="http://schemas.microsoft.com/office/drawing/2016/5/14/chartex" xmlns:mc="http://schemas.openxmlformats.org/markup-compatibility/2006" xmlns:aink="http://schemas.microsoft.com/office/drawing/2016/ink" xmlns:am3d="http://schemas.microsoft.com/office/drawing/2017/model3d" xmlns:o="urn:schemas-microsoft-com:office:office" xmlns:oel="http://schemas.microsoft.com/office/2019/extlst" xmlns:r="http://schemas.openxmlformats.org/officeDocument/2006/relationships" xmlns:m="http://schemas.openxmlformats.org/officeDocument/2006/math" xmlns:v="urn:schemas-microsoft-com:vml" xmlns:wp14="http://schemas.microsoft.com/office/word/2010/wordprocessingDrawing" xmlns:wp="http://schemas.openxmlformats.org/drawingml/2006/wordprocessingDrawing" xmlns:w10="urn:schemas-microsoft-com:office:word" xmlns:w="http://schemas.openxmlformats.org/wordprocessingml/2006/main" xmlns:w14="http://schemas.microsoft.com/office/word/2010/wordml" xmlns:w15="http://schemas.microsoft.com/office/word/2012/wordml" xmlns:w16cex="http://schemas.microsoft.com/office/word/2018/wordml/cex" xmlns:w16cid="http://schemas.microsoft.com/office/word/2016/wordml/cid" xmlns:w16="http://schemas.microsoft.com/office/word/2018/wordml" xmlns:w16sdtdh="http://schemas.microsoft.com/office/word/2020/wordml/sdtdatahash" xmlns:w16se="http://schemas.microsoft.com/office/word/2015/wordml/symex" xmlns:wpg="http://schemas.microsoft.com/office/word/2010/wordprocessingGroup" xmlns:wpi="http://schemas.microsoft.com/office/word/2010/wordprocessingInk" xmlns:wne="http://schemas.microsoft.com/office/word/2006/wordml" xmlns:wps="http://schemas.microsoft.com/office/word/2010/wordprocessingShape" mc:Ignorable="w14 w15 w16se w16cid w16 w16cex w16sdtdh wp14">
+  <w:footnote w:type="separator" w:id="-1">
     <w:p>
       <w:pPr>
         <w:spacing w:after="0" w:line="240" w:lineRule="auto"/>
@@ -18052,7 +19004,7 @@
       </w:r>
     </w:p>
   </w:footnote>
-  <w:footnote w:type="continuationSeparator" w:id="1">
+  <w:footnote w:type="continuationSeparator" w:id="0">
     <w:p>
       <w:pPr>
         <w:spacing w:after="0" w:line="240" w:lineRule="auto"/>
@@ -18066,8 +19018,8 @@
 </file>
 
 <file path=word/numbering.xml><?xml version="1.0" encoding="utf-8"?>
-<w:numbering xmlns:ve="http://schemas.openxmlformats.org/markup-compatibility/2006" xmlns:o="urn:schemas-microsoft-com:office:office" xmlns:r="http://schemas.openxmlformats.org/officeDocument/2006/relationships" xmlns:m="http://schemas.openxmlformats.org/officeDocument/2006/math" xmlns:v="urn:schemas-microsoft-com:vml" xmlns:wp="http://schemas.openxmlformats.org/drawingml/2006/wordprocessingDrawing" xmlns:w10="urn:schemas-microsoft-com:office:word" xmlns:w="http://schemas.openxmlformats.org/wordprocessingml/2006/main" xmlns:wne="http://schemas.microsoft.com/office/word/2006/wordml">
-  <w:abstractNum w:abstractNumId="0">
+<w:numbering xmlns:wpc="http://schemas.microsoft.com/office/word/2010/wordprocessingCanvas" xmlns:cx="http://schemas.microsoft.com/office/drawing/2014/chartex" xmlns:cx1="http://schemas.microsoft.com/office/drawing/2015/9/8/chartex" xmlns:cx2="http://schemas.microsoft.com/office/drawing/2015/10/21/chartex" xmlns:cx3="http://schemas.microsoft.com/office/drawing/2016/5/9/chartex" xmlns:cx4="http://schemas.microsoft.com/office/drawing/2016/5/10/chartex" xmlns:cx5="http://schemas.microsoft.com/office/drawing/2016/5/11/chartex" xmlns:cx6="http://schemas.microsoft.com/office/drawing/2016/5/12/chartex" xmlns:cx7="http://schemas.microsoft.com/office/drawing/2016/5/13/chartex" xmlns:cx8="http://schemas.microsoft.com/office/drawing/2016/5/14/chartex" xmlns:mc="http://schemas.openxmlformats.org/markup-compatibility/2006" xmlns:aink="http://schemas.microsoft.com/office/drawing/2016/ink" xmlns:am3d="http://schemas.microsoft.com/office/drawing/2017/model3d" xmlns:o="urn:schemas-microsoft-com:office:office" xmlns:oel="http://schemas.microsoft.com/office/2019/extlst" xmlns:r="http://schemas.openxmlformats.org/officeDocument/2006/relationships" xmlns:m="http://schemas.openxmlformats.org/officeDocument/2006/math" xmlns:v="urn:schemas-microsoft-com:vml" xmlns:wp14="http://schemas.microsoft.com/office/word/2010/wordprocessingDrawing" xmlns:wp="http://schemas.openxmlformats.org/drawingml/2006/wordprocessingDrawing" xmlns:w10="urn:schemas-microsoft-com:office:word" xmlns:w="http://schemas.openxmlformats.org/wordprocessingml/2006/main" xmlns:w14="http://schemas.microsoft.com/office/word/2010/wordml" xmlns:w15="http://schemas.microsoft.com/office/word/2012/wordml" xmlns:w16cex="http://schemas.microsoft.com/office/word/2018/wordml/cex" xmlns:w16cid="http://schemas.microsoft.com/office/word/2016/wordml/cid" xmlns:w16="http://schemas.microsoft.com/office/word/2018/wordml" xmlns:w16sdtdh="http://schemas.microsoft.com/office/word/2020/wordml/sdtdatahash" xmlns:w16se="http://schemas.microsoft.com/office/word/2015/wordml/symex" xmlns:wpg="http://schemas.microsoft.com/office/word/2010/wordprocessingGroup" xmlns:wpi="http://schemas.microsoft.com/office/word/2010/wordprocessingInk" xmlns:wne="http://schemas.microsoft.com/office/word/2006/wordml" xmlns:wps="http://schemas.microsoft.com/office/word/2010/wordprocessingShape" mc:Ignorable="w14 w15 w16se w16cid w16 w16cex w16sdtdh wp14">
+  <w:abstractNum w:abstractNumId="0" w15:restartNumberingAfterBreak="0">
     <w:nsid w:val="FFFFFFFE"/>
     <w:multiLevelType w:val="singleLevel"/>
     <w:tmpl w:val="65D29B3E"/>
@@ -18077,7 +19029,7 @@
       <w:lvlJc w:val="left"/>
     </w:lvl>
   </w:abstractNum>
-  <w:abstractNum w:abstractNumId="1">
+  <w:abstractNum w:abstractNumId="1" w15:restartNumberingAfterBreak="0">
     <w:nsid w:val="14472E76"/>
     <w:multiLevelType w:val="hybridMultilevel"/>
     <w:tmpl w:val="57BA142C"/>
@@ -18189,7 +19141,7 @@
       </w:rPr>
     </w:lvl>
   </w:abstractNum>
-  <w:abstractNum w:abstractNumId="2">
+  <w:abstractNum w:abstractNumId="2" w15:restartNumberingAfterBreak="0">
     <w:nsid w:val="151735AB"/>
     <w:multiLevelType w:val="hybridMultilevel"/>
     <w:tmpl w:val="200276DA"/>
@@ -18301,7 +19253,7 @@
       </w:rPr>
     </w:lvl>
   </w:abstractNum>
-  <w:abstractNum w:abstractNumId="3">
+  <w:abstractNum w:abstractNumId="3" w15:restartNumberingAfterBreak="0">
     <w:nsid w:val="15C1326F"/>
     <w:multiLevelType w:val="hybridMultilevel"/>
     <w:tmpl w:val="FBEAE09E"/>
@@ -18413,7 +19365,7 @@
       </w:rPr>
     </w:lvl>
   </w:abstractNum>
-  <w:abstractNum w:abstractNumId="4">
+  <w:abstractNum w:abstractNumId="4" w15:restartNumberingAfterBreak="0">
     <w:nsid w:val="17C17A80"/>
     <w:multiLevelType w:val="hybridMultilevel"/>
     <w:tmpl w:val="B6BA8D1E"/>
@@ -18525,7 +19477,7 @@
       </w:rPr>
     </w:lvl>
   </w:abstractNum>
-  <w:abstractNum w:abstractNumId="5">
+  <w:abstractNum w:abstractNumId="5" w15:restartNumberingAfterBreak="0">
     <w:nsid w:val="32312FA7"/>
     <w:multiLevelType w:val="multilevel"/>
     <w:tmpl w:val="6C929598"/>
@@ -18674,7 +19626,7 @@
       </w:rPr>
     </w:lvl>
   </w:abstractNum>
-  <w:abstractNum w:abstractNumId="6">
+  <w:abstractNum w:abstractNumId="6" w15:restartNumberingAfterBreak="0">
     <w:nsid w:val="38A96019"/>
     <w:multiLevelType w:val="hybridMultilevel"/>
     <w:tmpl w:val="CB36834A"/>
@@ -18787,7 +19739,7 @@
       </w:rPr>
     </w:lvl>
   </w:abstractNum>
-  <w:abstractNum w:abstractNumId="7">
+  <w:abstractNum w:abstractNumId="7" w15:restartNumberingAfterBreak="0">
     <w:nsid w:val="393F5EB5"/>
     <w:multiLevelType w:val="hybridMultilevel"/>
     <w:tmpl w:val="9252B894"/>
@@ -18873,7 +19825,7 @@
       </w:pPr>
     </w:lvl>
   </w:abstractNum>
-  <w:abstractNum w:abstractNumId="8">
+  <w:abstractNum w:abstractNumId="8" w15:restartNumberingAfterBreak="0">
     <w:nsid w:val="3C961523"/>
     <w:multiLevelType w:val="hybridMultilevel"/>
     <w:tmpl w:val="29F8812C"/>
@@ -18985,7 +19937,7 @@
       </w:rPr>
     </w:lvl>
   </w:abstractNum>
-  <w:abstractNum w:abstractNumId="9">
+  <w:abstractNum w:abstractNumId="9" w15:restartNumberingAfterBreak="0">
     <w:nsid w:val="3E6867CD"/>
     <w:multiLevelType w:val="hybridMultilevel"/>
     <w:tmpl w:val="9252B894"/>
@@ -19071,7 +20023,7 @@
       </w:pPr>
     </w:lvl>
   </w:abstractNum>
-  <w:abstractNum w:abstractNumId="10">
+  <w:abstractNum w:abstractNumId="10" w15:restartNumberingAfterBreak="0">
     <w:nsid w:val="502A13C4"/>
     <w:multiLevelType w:val="hybridMultilevel"/>
     <w:tmpl w:val="11E60866"/>
@@ -19184,7 +20136,7 @@
       </w:rPr>
     </w:lvl>
   </w:abstractNum>
-  <w:abstractNum w:abstractNumId="11">
+  <w:abstractNum w:abstractNumId="11" w15:restartNumberingAfterBreak="0">
     <w:nsid w:val="56583B8C"/>
     <w:multiLevelType w:val="hybridMultilevel"/>
     <w:tmpl w:val="69A4382A"/>
@@ -19270,25 +20222,25 @@
       </w:pPr>
     </w:lvl>
   </w:abstractNum>
-  <w:num w:numId="1">
+  <w:num w:numId="1" w16cid:durableId="712117621">
     <w:abstractNumId w:val="11"/>
   </w:num>
-  <w:num w:numId="2">
+  <w:num w:numId="2" w16cid:durableId="787352389">
     <w:abstractNumId w:val="7"/>
   </w:num>
-  <w:num w:numId="3">
+  <w:num w:numId="3" w16cid:durableId="1702626546">
     <w:abstractNumId w:val="10"/>
   </w:num>
-  <w:num w:numId="4">
+  <w:num w:numId="4" w16cid:durableId="333531084">
     <w:abstractNumId w:val="3"/>
   </w:num>
-  <w:num w:numId="5">
+  <w:num w:numId="5" w16cid:durableId="741559903">
     <w:abstractNumId w:val="2"/>
   </w:num>
-  <w:num w:numId="6">
+  <w:num w:numId="6" w16cid:durableId="1897088720">
     <w:abstractNumId w:val="9"/>
   </w:num>
-  <w:num w:numId="7">
+  <w:num w:numId="7" w16cid:durableId="276722720">
     <w:abstractNumId w:val="0"/>
     <w:lvlOverride w:ilvl="0">
       <w:lvl w:ilvl="0">
@@ -19303,26 +20255,26 @@
       </w:lvl>
     </w:lvlOverride>
   </w:num>
-  <w:num w:numId="8">
+  <w:num w:numId="8" w16cid:durableId="556669554">
     <w:abstractNumId w:val="1"/>
   </w:num>
-  <w:num w:numId="9">
+  <w:num w:numId="9" w16cid:durableId="384450686">
     <w:abstractNumId w:val="8"/>
   </w:num>
-  <w:num w:numId="10">
+  <w:num w:numId="10" w16cid:durableId="571619340">
     <w:abstractNumId w:val="4"/>
   </w:num>
-  <w:num w:numId="11">
+  <w:num w:numId="11" w16cid:durableId="370811519">
     <w:abstractNumId w:val="5"/>
   </w:num>
-  <w:num w:numId="12">
+  <w:num w:numId="12" w16cid:durableId="1435973732">
     <w:abstractNumId w:val="6"/>
   </w:num>
 </w:numbering>
 </file>
 
 <file path=word/styles.xml><?xml version="1.0" encoding="utf-8"?>
-<w:styles xmlns:r="http://schemas.openxmlformats.org/officeDocument/2006/relationships" xmlns:w="http://schemas.openxmlformats.org/wordprocessingml/2006/main">
+<w:styles xmlns:mc="http://schemas.openxmlformats.org/markup-compatibility/2006" xmlns:r="http://schemas.openxmlformats.org/officeDocument/2006/relationships" xmlns:w="http://schemas.openxmlformats.org/wordprocessingml/2006/main" xmlns:w14="http://schemas.microsoft.com/office/word/2010/wordml" xmlns:w15="http://schemas.microsoft.com/office/word/2012/wordml" xmlns:w16cex="http://schemas.microsoft.com/office/word/2018/wordml/cex" xmlns:w16cid="http://schemas.microsoft.com/office/word/2016/wordml/cid" xmlns:w16="http://schemas.microsoft.com/office/word/2018/wordml" xmlns:w16sdtdh="http://schemas.microsoft.com/office/word/2020/wordml/sdtdatahash" xmlns:w16se="http://schemas.microsoft.com/office/word/2015/wordml/symex" mc:Ignorable="w14 w15 w16se w16cid w16 w16cex w16sdtdh">
   <w:docDefaults>
     <w:rPrDefault>
       <w:rPr>
@@ -19338,144 +20290,383 @@
       </w:pPr>
     </w:pPrDefault>
   </w:docDefaults>
-  <w:latentStyles w:defLockedState="0" w:defUIPriority="99" w:defSemiHidden="1" w:defUnhideWhenUsed="1" w:defQFormat="0" w:count="267">
-    <w:lsdException w:name="Normal" w:semiHidden="0" w:uiPriority="0" w:unhideWhenUsed="0" w:qFormat="1"/>
-    <w:lsdException w:name="heading 1" w:semiHidden="0" w:uiPriority="9" w:unhideWhenUsed="0" w:qFormat="1"/>
-    <w:lsdException w:name="heading 2" w:uiPriority="9" w:qFormat="1"/>
-    <w:lsdException w:name="heading 3" w:uiPriority="9" w:qFormat="1"/>
-    <w:lsdException w:name="heading 4" w:uiPriority="9" w:qFormat="1"/>
-    <w:lsdException w:name="heading 5" w:uiPriority="9" w:qFormat="1"/>
-    <w:lsdException w:name="heading 6" w:uiPriority="9" w:qFormat="1"/>
-    <w:lsdException w:name="heading 7" w:uiPriority="9" w:qFormat="1"/>
-    <w:lsdException w:name="heading 8" w:uiPriority="9" w:qFormat="1"/>
-    <w:lsdException w:name="heading 9" w:uiPriority="9" w:qFormat="1"/>
-    <w:lsdException w:name="toc 1" w:uiPriority="39"/>
-    <w:lsdException w:name="toc 2" w:uiPriority="39"/>
-    <w:lsdException w:name="toc 3" w:uiPriority="39"/>
-    <w:lsdException w:name="toc 4" w:uiPriority="39"/>
-    <w:lsdException w:name="toc 5" w:uiPriority="39"/>
-    <w:lsdException w:name="toc 6" w:uiPriority="39"/>
-    <w:lsdException w:name="toc 7" w:uiPriority="39"/>
-    <w:lsdException w:name="toc 8" w:uiPriority="39"/>
-    <w:lsdException w:name="toc 9" w:uiPriority="39"/>
-    <w:lsdException w:name="caption" w:uiPriority="35" w:qFormat="1"/>
-    <w:lsdException w:name="Title" w:semiHidden="0" w:uiPriority="10" w:unhideWhenUsed="0" w:qFormat="1"/>
-    <w:lsdException w:name="Default Paragraph Font" w:uiPriority="1"/>
-    <w:lsdException w:name="Subtitle" w:semiHidden="0" w:uiPriority="11" w:unhideWhenUsed="0" w:qFormat="1"/>
-    <w:lsdException w:name="Strong" w:semiHidden="0" w:uiPriority="22" w:unhideWhenUsed="0" w:qFormat="1"/>
-    <w:lsdException w:name="Emphasis" w:semiHidden="0" w:uiPriority="20" w:unhideWhenUsed="0" w:qFormat="1"/>
-    <w:lsdException w:name="Table Grid" w:semiHidden="0" w:uiPriority="59" w:unhideWhenUsed="0"/>
-    <w:lsdException w:name="Placeholder Text" w:unhideWhenUsed="0"/>
-    <w:lsdException w:name="No Spacing" w:semiHidden="0" w:uiPriority="1" w:unhideWhenUsed="0" w:qFormat="1"/>
-    <w:lsdException w:name="Light Shading" w:semiHidden="0" w:uiPriority="60" w:unhideWhenUsed="0"/>
-    <w:lsdException w:name="Light List" w:semiHidden="0" w:uiPriority="61" w:unhideWhenUsed="0"/>
-    <w:lsdException w:name="Light Grid" w:semiHidden="0" w:uiPriority="62" w:unhideWhenUsed="0"/>
-    <w:lsdException w:name="Medium Shading 1" w:semiHidden="0" w:uiPriority="63" w:unhideWhenUsed="0"/>
-    <w:lsdException w:name="Medium Shading 2" w:semiHidden="0" w:uiPriority="64" w:unhideWhenUsed="0"/>
-    <w:lsdException w:name="Medium List 1" w:semiHidden="0" w:uiPriority="65" w:unhideWhenUsed="0"/>
-    <w:lsdException w:name="Medium List 2" w:semiHidden="0" w:uiPriority="66" w:unhideWhenUsed="0"/>
-    <w:lsdException w:name="Medium Grid 1" w:semiHidden="0" w:uiPriority="67" w:unhideWhenUsed="0"/>
-    <w:lsdException w:name="Medium Grid 2" w:semiHidden="0" w:uiPriority="68" w:unhideWhenUsed="0"/>
-    <w:lsdException w:name="Medium Grid 3" w:semiHidden="0" w:uiPriority="69" w:unhideWhenUsed="0"/>
-    <w:lsdException w:name="Dark List" w:semiHidden="0" w:uiPriority="70" w:unhideWhenUsed="0"/>
-    <w:lsdException w:name="Colorful Shading" w:semiHidden="0" w:uiPriority="71" w:unhideWhenUsed="0"/>
-    <w:lsdException w:name="Colorful List" w:semiHidden="0" w:uiPriority="72" w:unhideWhenUsed="0"/>
-    <w:lsdException w:name="Colorful Grid" w:semiHidden="0" w:uiPriority="73" w:unhideWhenUsed="0"/>
-    <w:lsdException w:name="Light Shading Accent 1" w:semiHidden="0" w:uiPriority="60" w:unhideWhenUsed="0"/>
-    <w:lsdException w:name="Light List Accent 1" w:semiHidden="0" w:uiPriority="61" w:unhideWhenUsed="0"/>
-    <w:lsdException w:name="Light Grid Accent 1" w:semiHidden="0" w:uiPriority="62" w:unhideWhenUsed="0"/>
-    <w:lsdException w:name="Medium Shading 1 Accent 1" w:semiHidden="0" w:uiPriority="63" w:unhideWhenUsed="0"/>
-    <w:lsdException w:name="Medium Shading 2 Accent 1" w:semiHidden="0" w:uiPriority="64" w:unhideWhenUsed="0"/>
-    <w:lsdException w:name="Medium List 1 Accent 1" w:semiHidden="0" w:uiPriority="65" w:unhideWhenUsed="0"/>
-    <w:lsdException w:name="Revision" w:unhideWhenUsed="0"/>
-    <w:lsdException w:name="List Paragraph" w:semiHidden="0" w:uiPriority="34" w:unhideWhenUsed="0" w:qFormat="1"/>
-    <w:lsdException w:name="Quote" w:semiHidden="0" w:uiPriority="29" w:unhideWhenUsed="0" w:qFormat="1"/>
-    <w:lsdException w:name="Intense Quote" w:semiHidden="0" w:uiPriority="30" w:unhideWhenUsed="0" w:qFormat="1"/>
-    <w:lsdException w:name="Medium List 2 Accent 1" w:semiHidden="0" w:uiPriority="66" w:unhideWhenUsed="0"/>
-    <w:lsdException w:name="Medium Grid 1 Accent 1" w:semiHidden="0" w:uiPriority="67" w:unhideWhenUsed="0"/>
-    <w:lsdException w:name="Medium Grid 2 Accent 1" w:semiHidden="0" w:uiPriority="68" w:unhideWhenUsed="0"/>
-    <w:lsdException w:name="Medium Grid 3 Accent 1" w:semiHidden="0" w:uiPriority="69" w:unhideWhenUsed="0"/>
-    <w:lsdException w:name="Dark List Accent 1" w:semiHidden="0" w:uiPriority="70" w:unhideWhenUsed="0"/>
-    <w:lsdException w:name="Colorful Shading Accent 1" w:semiHidden="0" w:uiPriority="71" w:unhideWhenUsed="0"/>
-    <w:lsdException w:name="Colorful List Accent 1" w:semiHidden="0" w:uiPriority="72" w:unhideWhenUsed="0"/>
-    <w:lsdException w:name="Colorful Grid Accent 1" w:semiHidden="0" w:uiPriority="73" w:unhideWhenUsed="0"/>
-    <w:lsdException w:name="Light Shading Accent 2" w:semiHidden="0" w:uiPriority="60" w:unhideWhenUsed="0"/>
-    <w:lsdException w:name="Light List Accent 2" w:semiHidden="0" w:uiPriority="61" w:unhideWhenUsed="0"/>
-    <w:lsdException w:name="Light Grid Accent 2" w:semiHidden="0" w:uiPriority="62" w:unhideWhenUsed="0"/>
-    <w:lsdException w:name="Medium Shading 1 Accent 2" w:semiHidden="0" w:uiPriority="63" w:unhideWhenUsed="0"/>
-    <w:lsdException w:name="Medium Shading 2 Accent 2" w:semiHidden="0" w:uiPriority="64" w:unhideWhenUsed="0"/>
-    <w:lsdException w:name="Medium List 1 Accent 2" w:semiHidden="0" w:uiPriority="65" w:unhideWhenUsed="0"/>
-    <w:lsdException w:name="Medium List 2 Accent 2" w:semiHidden="0" w:uiPriority="66" w:unhideWhenUsed="0"/>
-    <w:lsdException w:name="Medium Grid 1 Accent 2" w:semiHidden="0" w:uiPriority="67" w:unhideWhenUsed="0"/>
-    <w:lsdException w:name="Medium Grid 2 Accent 2" w:semiHidden="0" w:uiPriority="68" w:unhideWhenUsed="0"/>
-    <w:lsdException w:name="Medium Grid 3 Accent 2" w:semiHidden="0" w:uiPriority="69" w:unhideWhenUsed="0"/>
-    <w:lsdException w:name="Dark List Accent 2" w:semiHidden="0" w:uiPriority="70" w:unhideWhenUsed="0"/>
-    <w:lsdException w:name="Colorful Shading Accent 2" w:semiHidden="0" w:uiPriority="71" w:unhideWhenUsed="0"/>
-    <w:lsdException w:name="Colorful List Accent 2" w:semiHidden="0" w:uiPriority="72" w:unhideWhenUsed="0"/>
-    <w:lsdException w:name="Colorful Grid Accent 2" w:semiHidden="0" w:uiPriority="73" w:unhideWhenUsed="0"/>
-    <w:lsdException w:name="Light Shading Accent 3" w:semiHidden="0" w:uiPriority="60" w:unhideWhenUsed="0"/>
-    <w:lsdException w:name="Light List Accent 3" w:semiHidden="0" w:uiPriority="61" w:unhideWhenUsed="0"/>
-    <w:lsdException w:name="Light Grid Accent 3" w:semiHidden="0" w:uiPriority="62" w:unhideWhenUsed="0"/>
-    <w:lsdException w:name="Medium Shading 1 Accent 3" w:semiHidden="0" w:uiPriority="63" w:unhideWhenUsed="0"/>
-    <w:lsdException w:name="Medium Shading 2 Accent 3" w:semiHidden="0" w:uiPriority="64" w:unhideWhenUsed="0"/>
-    <w:lsdException w:name="Medium List 1 Accent 3" w:semiHidden="0" w:uiPriority="65" w:unhideWhenUsed="0"/>
-    <w:lsdException w:name="Medium List 2 Accent 3" w:semiHidden="0" w:uiPriority="66" w:unhideWhenUsed="0"/>
-    <w:lsdException w:name="Medium Grid 1 Accent 3" w:semiHidden="0" w:uiPriority="67" w:unhideWhenUsed="0"/>
-    <w:lsdException w:name="Medium Grid 2 Accent 3" w:semiHidden="0" w:uiPriority="68" w:unhideWhenUsed="0"/>
-    <w:lsdException w:name="Medium Grid 3 Accent 3" w:semiHidden="0" w:uiPriority="69" w:unhideWhenUsed="0"/>
-    <w:lsdException w:name="Dark List Accent 3" w:semiHidden="0" w:uiPriority="70" w:unhideWhenUsed="0"/>
-    <w:lsdException w:name="Colorful Shading Accent 3" w:semiHidden="0" w:uiPriority="71" w:unhideWhenUsed="0"/>
-    <w:lsdException w:name="Colorful List Accent 3" w:semiHidden="0" w:uiPriority="72" w:unhideWhenUsed="0"/>
-    <w:lsdException w:name="Colorful Grid Accent 3" w:semiHidden="0" w:uiPriority="73" w:unhideWhenUsed="0"/>
-    <w:lsdException w:name="Light Shading Accent 4" w:semiHidden="0" w:uiPriority="60" w:unhideWhenUsed="0"/>
-    <w:lsdException w:name="Light List Accent 4" w:semiHidden="0" w:uiPriority="61" w:unhideWhenUsed="0"/>
-    <w:lsdException w:name="Light Grid Accent 4" w:semiHidden="0" w:uiPriority="62" w:unhideWhenUsed="0"/>
-    <w:lsdException w:name="Medium Shading 1 Accent 4" w:semiHidden="0" w:uiPriority="63" w:unhideWhenUsed="0"/>
-    <w:lsdException w:name="Medium Shading 2 Accent 4" w:semiHidden="0" w:uiPriority="64" w:unhideWhenUsed="0"/>
-    <w:lsdException w:name="Medium List 1 Accent 4" w:semiHidden="0" w:uiPriority="65" w:unhideWhenUsed="0"/>
-    <w:lsdException w:name="Medium List 2 Accent 4" w:semiHidden="0" w:uiPriority="66" w:unhideWhenUsed="0"/>
-    <w:lsdException w:name="Medium Grid 1 Accent 4" w:semiHidden="0" w:uiPriority="67" w:unhideWhenUsed="0"/>
-    <w:lsdException w:name="Medium Grid 2 Accent 4" w:semiHidden="0" w:uiPriority="68" w:unhideWhenUsed="0"/>
-    <w:lsdException w:name="Medium Grid 3 Accent 4" w:semiHidden="0" w:uiPriority="69" w:unhideWhenUsed="0"/>
-    <w:lsdException w:name="Dark List Accent 4" w:semiHidden="0" w:uiPriority="70" w:unhideWhenUsed="0"/>
-    <w:lsdException w:name="Colorful Shading Accent 4" w:semiHidden="0" w:uiPriority="71" w:unhideWhenUsed="0"/>
-    <w:lsdException w:name="Colorful List Accent 4" w:semiHidden="0" w:uiPriority="72" w:unhideWhenUsed="0"/>
-    <w:lsdException w:name="Colorful Grid Accent 4" w:semiHidden="0" w:uiPriority="73" w:unhideWhenUsed="0"/>
-    <w:lsdException w:name="Light Shading Accent 5" w:semiHidden="0" w:uiPriority="60" w:unhideWhenUsed="0"/>
-    <w:lsdException w:name="Light List Accent 5" w:semiHidden="0" w:uiPriority="61" w:unhideWhenUsed="0"/>
-    <w:lsdException w:name="Light Grid Accent 5" w:semiHidden="0" w:uiPriority="62" w:unhideWhenUsed="0"/>
-    <w:lsdException w:name="Medium Shading 1 Accent 5" w:semiHidden="0" w:uiPriority="63" w:unhideWhenUsed="0"/>
-    <w:lsdException w:name="Medium Shading 2 Accent 5" w:semiHidden="0" w:uiPriority="64" w:unhideWhenUsed="0"/>
-    <w:lsdException w:name="Medium List 1 Accent 5" w:semiHidden="0" w:uiPriority="65" w:unhideWhenUsed="0"/>
-    <w:lsdException w:name="Medium List 2 Accent 5" w:semiHidden="0" w:uiPriority="66" w:unhideWhenUsed="0"/>
-    <w:lsdException w:name="Medium Grid 1 Accent 5" w:semiHidden="0" w:uiPriority="67" w:unhideWhenUsed="0"/>
-    <w:lsdException w:name="Medium Grid 2 Accent 5" w:semiHidden="0" w:uiPriority="68" w:unhideWhenUsed="0"/>
-    <w:lsdException w:name="Medium Grid 3 Accent 5" w:semiHidden="0" w:uiPriority="69" w:unhideWhenUsed="0"/>
-    <w:lsdException w:name="Dark List Accent 5" w:semiHidden="0" w:uiPriority="70" w:unhideWhenUsed="0"/>
-    <w:lsdException w:name="Colorful Shading Accent 5" w:semiHidden="0" w:uiPriority="71" w:unhideWhenUsed="0"/>
-    <w:lsdException w:name="Colorful List Accent 5" w:semiHidden="0" w:uiPriority="72" w:unhideWhenUsed="0"/>
-    <w:lsdException w:name="Colorful Grid Accent 5" w:semiHidden="0" w:uiPriority="73" w:unhideWhenUsed="0"/>
-    <w:lsdException w:name="Light Shading Accent 6" w:semiHidden="0" w:uiPriority="60" w:unhideWhenUsed="0"/>
-    <w:lsdException w:name="Light List Accent 6" w:semiHidden="0" w:uiPriority="61" w:unhideWhenUsed="0"/>
-    <w:lsdException w:name="Light Grid Accent 6" w:semiHidden="0" w:uiPriority="62" w:unhideWhenUsed="0"/>
-    <w:lsdException w:name="Medium Shading 1 Accent 6" w:semiHidden="0" w:uiPriority="63" w:unhideWhenUsed="0"/>
-    <w:lsdException w:name="Medium Shading 2 Accent 6" w:semiHidden="0" w:uiPriority="64" w:unhideWhenUsed="0"/>
-    <w:lsdException w:name="Medium List 1 Accent 6" w:semiHidden="0" w:uiPriority="65" w:unhideWhenUsed="0"/>
-    <w:lsdException w:name="Medium List 2 Accent 6" w:semiHidden="0" w:uiPriority="66" w:unhideWhenUsed="0"/>
-    <w:lsdException w:name="Medium Grid 1 Accent 6" w:semiHidden="0" w:uiPriority="67" w:unhideWhenUsed="0"/>
-    <w:lsdException w:name="Medium Grid 2 Accent 6" w:semiHidden="0" w:uiPriority="68" w:unhideWhenUsed="0"/>
-    <w:lsdException w:name="Medium Grid 3 Accent 6" w:semiHidden="0" w:uiPriority="69" w:unhideWhenUsed="0"/>
-    <w:lsdException w:name="Dark List Accent 6" w:semiHidden="0" w:uiPriority="70" w:unhideWhenUsed="0"/>
-    <w:lsdException w:name="Colorful Shading Accent 6" w:semiHidden="0" w:uiPriority="71" w:unhideWhenUsed="0"/>
-    <w:lsdException w:name="Colorful List Accent 6" w:semiHidden="0" w:uiPriority="72" w:unhideWhenUsed="0"/>
-    <w:lsdException w:name="Colorful Grid Accent 6" w:semiHidden="0" w:uiPriority="73" w:unhideWhenUsed="0"/>
-    <w:lsdException w:name="Subtle Emphasis" w:semiHidden="0" w:uiPriority="19" w:unhideWhenUsed="0" w:qFormat="1"/>
-    <w:lsdException w:name="Intense Emphasis" w:semiHidden="0" w:uiPriority="21" w:unhideWhenUsed="0" w:qFormat="1"/>
-    <w:lsdException w:name="Subtle Reference" w:semiHidden="0" w:uiPriority="31" w:unhideWhenUsed="0" w:qFormat="1"/>
-    <w:lsdException w:name="Intense Reference" w:semiHidden="0" w:uiPriority="32" w:unhideWhenUsed="0" w:qFormat="1"/>
-    <w:lsdException w:name="Book Title" w:semiHidden="0" w:uiPriority="33" w:unhideWhenUsed="0" w:qFormat="1"/>
-    <w:lsdException w:name="Bibliography" w:uiPriority="37"/>
-    <w:lsdException w:name="TOC Heading" w:uiPriority="39" w:qFormat="1"/>
+  <w:latentStyles w:defLockedState="0" w:defUIPriority="99" w:defSemiHidden="0" w:defUnhideWhenUsed="0" w:defQFormat="0" w:count="376">
+    <w:lsdException w:name="Normal" w:uiPriority="0" w:qFormat="1"/>
+    <w:lsdException w:name="heading 1" w:uiPriority="9" w:qFormat="1"/>
+    <w:lsdException w:name="heading 2" w:semiHidden="1" w:uiPriority="9" w:unhideWhenUsed="1" w:qFormat="1"/>
+    <w:lsdException w:name="heading 3" w:semiHidden="1" w:uiPriority="9" w:unhideWhenUsed="1" w:qFormat="1"/>
+    <w:lsdException w:name="heading 4" w:semiHidden="1" w:uiPriority="9" w:unhideWhenUsed="1" w:qFormat="1"/>
+    <w:lsdException w:name="heading 5" w:semiHidden="1" w:uiPriority="9" w:unhideWhenUsed="1" w:qFormat="1"/>
+    <w:lsdException w:name="heading 6" w:semiHidden="1" w:uiPriority="9" w:unhideWhenUsed="1" w:qFormat="1"/>
+    <w:lsdException w:name="heading 7" w:semiHidden="1" w:uiPriority="9" w:unhideWhenUsed="1" w:qFormat="1"/>
+    <w:lsdException w:name="heading 8" w:semiHidden="1" w:uiPriority="9" w:unhideWhenUsed="1" w:qFormat="1"/>
+    <w:lsdException w:name="heading 9" w:semiHidden="1" w:uiPriority="9" w:unhideWhenUsed="1" w:qFormat="1"/>
+    <w:lsdException w:name="index 1" w:semiHidden="1" w:unhideWhenUsed="1"/>
+    <w:lsdException w:name="index 2" w:semiHidden="1" w:unhideWhenUsed="1"/>
+    <w:lsdException w:name="index 3" w:semiHidden="1" w:unhideWhenUsed="1"/>
+    <w:lsdException w:name="index 4" w:semiHidden="1" w:unhideWhenUsed="1"/>
+    <w:lsdException w:name="index 5" w:semiHidden="1" w:unhideWhenUsed="1"/>
+    <w:lsdException w:name="index 6" w:semiHidden="1" w:unhideWhenUsed="1"/>
+    <w:lsdException w:name="index 7" w:semiHidden="1" w:unhideWhenUsed="1"/>
+    <w:lsdException w:name="index 8" w:semiHidden="1" w:unhideWhenUsed="1"/>
+    <w:lsdException w:name="index 9" w:semiHidden="1" w:unhideWhenUsed="1"/>
+    <w:lsdException w:name="toc 1" w:semiHidden="1" w:uiPriority="39" w:unhideWhenUsed="1"/>
+    <w:lsdException w:name="toc 2" w:semiHidden="1" w:uiPriority="39" w:unhideWhenUsed="1"/>
+    <w:lsdException w:name="toc 3" w:semiHidden="1" w:uiPriority="39" w:unhideWhenUsed="1"/>
+    <w:lsdException w:name="toc 4" w:semiHidden="1" w:uiPriority="39" w:unhideWhenUsed="1"/>
+    <w:lsdException w:name="toc 5" w:semiHidden="1" w:uiPriority="39" w:unhideWhenUsed="1"/>
+    <w:lsdException w:name="toc 6" w:semiHidden="1" w:uiPriority="39" w:unhideWhenUsed="1"/>
+    <w:lsdException w:name="toc 7" w:semiHidden="1" w:uiPriority="39" w:unhideWhenUsed="1"/>
+    <w:lsdException w:name="toc 8" w:semiHidden="1" w:uiPriority="39" w:unhideWhenUsed="1"/>
+    <w:lsdException w:name="toc 9" w:semiHidden="1" w:uiPriority="39" w:unhideWhenUsed="1"/>
+    <w:lsdException w:name="Normal Indent" w:semiHidden="1" w:unhideWhenUsed="1"/>
+    <w:lsdException w:name="footnote text" w:semiHidden="1" w:unhideWhenUsed="1"/>
+    <w:lsdException w:name="annotation text" w:semiHidden="1" w:unhideWhenUsed="1"/>
+    <w:lsdException w:name="header" w:semiHidden="1" w:unhideWhenUsed="1"/>
+    <w:lsdException w:name="footer" w:semiHidden="1" w:unhideWhenUsed="1"/>
+    <w:lsdException w:name="index heading" w:semiHidden="1" w:unhideWhenUsed="1"/>
+    <w:lsdException w:name="caption" w:semiHidden="1" w:uiPriority="35" w:unhideWhenUsed="1" w:qFormat="1"/>
+    <w:lsdException w:name="table of figures" w:semiHidden="1" w:unhideWhenUsed="1"/>
+    <w:lsdException w:name="envelope address" w:semiHidden="1" w:unhideWhenUsed="1"/>
+    <w:lsdException w:name="envelope return" w:semiHidden="1" w:unhideWhenUsed="1"/>
+    <w:lsdException w:name="footnote reference" w:semiHidden="1" w:unhideWhenUsed="1"/>
+    <w:lsdException w:name="annotation reference" w:semiHidden="1" w:unhideWhenUsed="1"/>
+    <w:lsdException w:name="line number" w:semiHidden="1" w:unhideWhenUsed="1"/>
+    <w:lsdException w:name="page number" w:semiHidden="1" w:unhideWhenUsed="1"/>
+    <w:lsdException w:name="endnote reference" w:semiHidden="1" w:unhideWhenUsed="1"/>
+    <w:lsdException w:name="endnote text" w:semiHidden="1" w:unhideWhenUsed="1"/>
+    <w:lsdException w:name="table of authorities" w:semiHidden="1" w:unhideWhenUsed="1"/>
+    <w:lsdException w:name="macro" w:semiHidden="1" w:unhideWhenUsed="1"/>
+    <w:lsdException w:name="toa heading" w:semiHidden="1" w:unhideWhenUsed="1"/>
+    <w:lsdException w:name="List" w:semiHidden="1" w:unhideWhenUsed="1"/>
+    <w:lsdException w:name="List Bullet" w:semiHidden="1" w:unhideWhenUsed="1"/>
+    <w:lsdException w:name="List Number" w:semiHidden="1" w:unhideWhenUsed="1"/>
+    <w:lsdException w:name="List 2" w:semiHidden="1" w:unhideWhenUsed="1"/>
+    <w:lsdException w:name="List 3" w:semiHidden="1" w:unhideWhenUsed="1"/>
+    <w:lsdException w:name="List 4" w:semiHidden="1" w:unhideWhenUsed="1"/>
+    <w:lsdException w:name="List 5" w:semiHidden="1" w:unhideWhenUsed="1"/>
+    <w:lsdException w:name="List Bullet 2" w:semiHidden="1" w:unhideWhenUsed="1"/>
+    <w:lsdException w:name="List Bullet 3" w:semiHidden="1" w:unhideWhenUsed="1"/>
+    <w:lsdException w:name="List Bullet 4" w:semiHidden="1" w:unhideWhenUsed="1"/>
+    <w:lsdException w:name="List Bullet 5" w:semiHidden="1" w:unhideWhenUsed="1"/>
+    <w:lsdException w:name="List Number 2" w:semiHidden="1" w:unhideWhenUsed="1"/>
+    <w:lsdException w:name="List Number 3" w:semiHidden="1" w:unhideWhenUsed="1"/>
+    <w:lsdException w:name="List Number 4" w:semiHidden="1" w:unhideWhenUsed="1"/>
+    <w:lsdException w:name="List Number 5" w:semiHidden="1" w:unhideWhenUsed="1"/>
+    <w:lsdException w:name="Title" w:uiPriority="10" w:qFormat="1"/>
+    <w:lsdException w:name="Closing" w:semiHidden="1" w:unhideWhenUsed="1"/>
+    <w:lsdException w:name="Signature" w:semiHidden="1" w:unhideWhenUsed="1"/>
+    <w:lsdException w:name="Default Paragraph Font" w:semiHidden="1" w:uiPriority="1" w:unhideWhenUsed="1"/>
+    <w:lsdException w:name="Body Text" w:semiHidden="1" w:unhideWhenUsed="1"/>
+    <w:lsdException w:name="Body Text Indent" w:semiHidden="1" w:unhideWhenUsed="1"/>
+    <w:lsdException w:name="List Continue" w:semiHidden="1" w:unhideWhenUsed="1"/>
+    <w:lsdException w:name="List Continue 2" w:semiHidden="1" w:unhideWhenUsed="1"/>
+    <w:lsdException w:name="List Continue 3" w:semiHidden="1" w:unhideWhenUsed="1"/>
+    <w:lsdException w:name="List Continue 4" w:semiHidden="1" w:unhideWhenUsed="1"/>
+    <w:lsdException w:name="List Continue 5" w:semiHidden="1" w:unhideWhenUsed="1"/>
+    <w:lsdException w:name="Message Header" w:semiHidden="1" w:unhideWhenUsed="1"/>
+    <w:lsdException w:name="Subtitle" w:uiPriority="11" w:qFormat="1"/>
+    <w:lsdException w:name="Salutation" w:semiHidden="1" w:unhideWhenUsed="1"/>
+    <w:lsdException w:name="Date" w:semiHidden="1" w:unhideWhenUsed="1"/>
+    <w:lsdException w:name="Body Text First Indent" w:semiHidden="1" w:unhideWhenUsed="1"/>
+    <w:lsdException w:name="Body Text First Indent 2" w:semiHidden="1" w:unhideWhenUsed="1"/>
+    <w:lsdException w:name="Note Heading" w:semiHidden="1" w:unhideWhenUsed="1"/>
+    <w:lsdException w:name="Body Text 2" w:semiHidden="1" w:unhideWhenUsed="1"/>
+    <w:lsdException w:name="Body Text 3" w:semiHidden="1" w:unhideWhenUsed="1"/>
+    <w:lsdException w:name="Body Text Indent 2" w:semiHidden="1" w:unhideWhenUsed="1"/>
+    <w:lsdException w:name="Body Text Indent 3" w:semiHidden="1" w:unhideWhenUsed="1"/>
+    <w:lsdException w:name="Block Text" w:semiHidden="1" w:unhideWhenUsed="1"/>
+    <w:lsdException w:name="Hyperlink" w:semiHidden="1" w:unhideWhenUsed="1"/>
+    <w:lsdException w:name="FollowedHyperlink" w:semiHidden="1" w:unhideWhenUsed="1"/>
+    <w:lsdException w:name="Strong" w:uiPriority="22" w:qFormat="1"/>
+    <w:lsdException w:name="Emphasis" w:uiPriority="20" w:qFormat="1"/>
+    <w:lsdException w:name="Document Map" w:semiHidden="1" w:unhideWhenUsed="1"/>
+    <w:lsdException w:name="Plain Text" w:semiHidden="1" w:unhideWhenUsed="1"/>
+    <w:lsdException w:name="E-mail Signature" w:semiHidden="1" w:unhideWhenUsed="1"/>
+    <w:lsdException w:name="HTML Top of Form" w:semiHidden="1" w:unhideWhenUsed="1"/>
+    <w:lsdException w:name="HTML Bottom of Form" w:semiHidden="1" w:unhideWhenUsed="1"/>
+    <w:lsdException w:name="Normal (Web)" w:semiHidden="1" w:unhideWhenUsed="1"/>
+    <w:lsdException w:name="HTML Acronym" w:semiHidden="1" w:unhideWhenUsed="1"/>
+    <w:lsdException w:name="HTML Address" w:semiHidden="1" w:unhideWhenUsed="1"/>
+    <w:lsdException w:name="HTML Cite" w:semiHidden="1" w:unhideWhenUsed="1"/>
+    <w:lsdException w:name="HTML Code" w:semiHidden="1" w:unhideWhenUsed="1"/>
+    <w:lsdException w:name="HTML Definition" w:semiHidden="1" w:unhideWhenUsed="1"/>
+    <w:lsdException w:name="HTML Keyboard" w:semiHidden="1" w:unhideWhenUsed="1"/>
+    <w:lsdException w:name="HTML Preformatted" w:semiHidden="1" w:unhideWhenUsed="1"/>
+    <w:lsdException w:name="HTML Sample" w:semiHidden="1" w:unhideWhenUsed="1"/>
+    <w:lsdException w:name="HTML Typewriter" w:semiHidden="1" w:unhideWhenUsed="1"/>
+    <w:lsdException w:name="HTML Variable" w:semiHidden="1" w:unhideWhenUsed="1"/>
+    <w:lsdException w:name="Normal Table" w:semiHidden="1" w:unhideWhenUsed="1"/>
+    <w:lsdException w:name="annotation subject" w:semiHidden="1" w:unhideWhenUsed="1"/>
+    <w:lsdException w:name="No List" w:semiHidden="1" w:unhideWhenUsed="1"/>
+    <w:lsdException w:name="Outline List 1" w:semiHidden="1" w:unhideWhenUsed="1"/>
+    <w:lsdException w:name="Outline List 2" w:semiHidden="1" w:unhideWhenUsed="1"/>
+    <w:lsdException w:name="Outline List 3" w:semiHidden="1" w:unhideWhenUsed="1"/>
+    <w:lsdException w:name="Table Simple 1" w:semiHidden="1" w:unhideWhenUsed="1"/>
+    <w:lsdException w:name="Table Simple 2" w:semiHidden="1" w:unhideWhenUsed="1"/>
+    <w:lsdException w:name="Table Simple 3" w:semiHidden="1" w:unhideWhenUsed="1"/>
+    <w:lsdException w:name="Table Classic 1" w:semiHidden="1" w:unhideWhenUsed="1"/>
+    <w:lsdException w:name="Table Classic 2" w:semiHidden="1" w:unhideWhenUsed="1"/>
+    <w:lsdException w:name="Table Classic 3" w:semiHidden="1" w:unhideWhenUsed="1"/>
+    <w:lsdException w:name="Table Classic 4" w:semiHidden="1" w:unhideWhenUsed="1"/>
+    <w:lsdException w:name="Table Colorful 1" w:semiHidden="1" w:unhideWhenUsed="1"/>
+    <w:lsdException w:name="Table Colorful 2" w:semiHidden="1" w:unhideWhenUsed="1"/>
+    <w:lsdException w:name="Table Colorful 3" w:semiHidden="1" w:unhideWhenUsed="1"/>
+    <w:lsdException w:name="Table Columns 1" w:semiHidden="1" w:unhideWhenUsed="1"/>
+    <w:lsdException w:name="Table Columns 2" w:semiHidden="1" w:unhideWhenUsed="1"/>
+    <w:lsdException w:name="Table Columns 3" w:semiHidden="1" w:unhideWhenUsed="1"/>
+    <w:lsdException w:name="Table Columns 4" w:semiHidden="1" w:unhideWhenUsed="1"/>
+    <w:lsdException w:name="Table Columns 5" w:semiHidden="1" w:unhideWhenUsed="1"/>
+    <w:lsdException w:name="Table Grid 1" w:semiHidden="1" w:unhideWhenUsed="1"/>
+    <w:lsdException w:name="Table Grid 2" w:semiHidden="1" w:unhideWhenUsed="1"/>
+    <w:lsdException w:name="Table Grid 3" w:semiHidden="1" w:unhideWhenUsed="1"/>
+    <w:lsdException w:name="Table Grid 4" w:semiHidden="1" w:unhideWhenUsed="1"/>
+    <w:lsdException w:name="Table Grid 5" w:semiHidden="1" w:unhideWhenUsed="1"/>
+    <w:lsdException w:name="Table Grid 6" w:semiHidden="1" w:unhideWhenUsed="1"/>
+    <w:lsdException w:name="Table Grid 7" w:semiHidden="1" w:unhideWhenUsed="1"/>
+    <w:lsdException w:name="Table Grid 8" w:semiHidden="1" w:unhideWhenUsed="1"/>
+    <w:lsdException w:name="Table List 1" w:semiHidden="1" w:unhideWhenUsed="1"/>
+    <w:lsdException w:name="Table List 2" w:semiHidden="1" w:unhideWhenUsed="1"/>
+    <w:lsdException w:name="Table List 3" w:semiHidden="1" w:unhideWhenUsed="1"/>
+    <w:lsdException w:name="Table List 4" w:semiHidden="1" w:unhideWhenUsed="1"/>
+    <w:lsdException w:name="Table List 5" w:semiHidden="1" w:unhideWhenUsed="1"/>
+    <w:lsdException w:name="Table List 6" w:semiHidden="1" w:unhideWhenUsed="1"/>
+    <w:lsdException w:name="Table List 7" w:semiHidden="1" w:unhideWhenUsed="1"/>
+    <w:lsdException w:name="Table List 8" w:semiHidden="1" w:unhideWhenUsed="1"/>
+    <w:lsdException w:name="Table 3D effects 1" w:semiHidden="1" w:unhideWhenUsed="1"/>
+    <w:lsdException w:name="Table 3D effects 2" w:semiHidden="1" w:unhideWhenUsed="1"/>
+    <w:lsdException w:name="Table 3D effects 3" w:semiHidden="1" w:unhideWhenUsed="1"/>
+    <w:lsdException w:name="Table Contemporary" w:semiHidden="1" w:unhideWhenUsed="1"/>
+    <w:lsdException w:name="Table Elegant" w:semiHidden="1" w:unhideWhenUsed="1"/>
+    <w:lsdException w:name="Table Professional" w:semiHidden="1" w:unhideWhenUsed="1"/>
+    <w:lsdException w:name="Table Subtle 1" w:semiHidden="1" w:unhideWhenUsed="1"/>
+    <w:lsdException w:name="Table Subtle 2" w:semiHidden="1" w:unhideWhenUsed="1"/>
+    <w:lsdException w:name="Table Web 1" w:semiHidden="1" w:unhideWhenUsed="1"/>
+    <w:lsdException w:name="Table Web 2" w:semiHidden="1" w:unhideWhenUsed="1"/>
+    <w:lsdException w:name="Table Web 3" w:semiHidden="1" w:unhideWhenUsed="1"/>
+    <w:lsdException w:name="Balloon Text" w:semiHidden="1" w:unhideWhenUsed="1"/>
+    <w:lsdException w:name="Table Grid" w:uiPriority="59"/>
+    <w:lsdException w:name="Table Theme" w:semiHidden="1" w:unhideWhenUsed="1"/>
+    <w:lsdException w:name="Placeholder Text" w:semiHidden="1"/>
+    <w:lsdException w:name="No Spacing" w:uiPriority="1" w:qFormat="1"/>
+    <w:lsdException w:name="Light Shading" w:uiPriority="60"/>
+    <w:lsdException w:name="Light List" w:uiPriority="61"/>
+    <w:lsdException w:name="Light Grid" w:uiPriority="62"/>
+    <w:lsdException w:name="Medium Shading 1" w:uiPriority="63"/>
+    <w:lsdException w:name="Medium Shading 2" w:uiPriority="64"/>
+    <w:lsdException w:name="Medium List 1" w:uiPriority="65"/>
+    <w:lsdException w:name="Medium List 2" w:uiPriority="66"/>
+    <w:lsdException w:name="Medium Grid 1" w:uiPriority="67"/>
+    <w:lsdException w:name="Medium Grid 2" w:uiPriority="68"/>
+    <w:lsdException w:name="Medium Grid 3" w:uiPriority="69"/>
+    <w:lsdException w:name="Dark List" w:uiPriority="70"/>
+    <w:lsdException w:name="Colorful Shading" w:uiPriority="71"/>
+    <w:lsdException w:name="Colorful List" w:uiPriority="72"/>
+    <w:lsdException w:name="Colorful Grid" w:uiPriority="73"/>
+    <w:lsdException w:name="Light Shading Accent 1" w:uiPriority="60"/>
+    <w:lsdException w:name="Light List Accent 1" w:uiPriority="61"/>
+    <w:lsdException w:name="Light Grid Accent 1" w:uiPriority="62"/>
+    <w:lsdException w:name="Medium Shading 1 Accent 1" w:uiPriority="63"/>
+    <w:lsdException w:name="Medium Shading 2 Accent 1" w:uiPriority="64"/>
+    <w:lsdException w:name="Medium List 1 Accent 1" w:uiPriority="65"/>
+    <w:lsdException w:name="Revision" w:semiHidden="1"/>
+    <w:lsdException w:name="List Paragraph" w:uiPriority="34" w:qFormat="1"/>
+    <w:lsdException w:name="Quote" w:uiPriority="29" w:qFormat="1"/>
+    <w:lsdException w:name="Intense Quote" w:uiPriority="30" w:qFormat="1"/>
+    <w:lsdException w:name="Medium List 2 Accent 1" w:uiPriority="66"/>
+    <w:lsdException w:name="Medium Grid 1 Accent 1" w:uiPriority="67"/>
+    <w:lsdException w:name="Medium Grid 2 Accent 1" w:uiPriority="68"/>
+    <w:lsdException w:name="Medium Grid 3 Accent 1" w:uiPriority="69"/>
+    <w:lsdException w:name="Dark List Accent 1" w:uiPriority="70"/>
+    <w:lsdException w:name="Colorful Shading Accent 1" w:uiPriority="71"/>
+    <w:lsdException w:name="Colorful List Accent 1" w:uiPriority="72"/>
+    <w:lsdException w:name="Colorful Grid Accent 1" w:uiPriority="73"/>
+    <w:lsdException w:name="Light Shading Accent 2" w:uiPriority="60"/>
+    <w:lsdException w:name="Light List Accent 2" w:uiPriority="61"/>
+    <w:lsdException w:name="Light Grid Accent 2" w:uiPriority="62"/>
+    <w:lsdException w:name="Medium Shading 1 Accent 2" w:uiPriority="63"/>
+    <w:lsdException w:name="Medium Shading 2 Accent 2" w:uiPriority="64"/>
+    <w:lsdException w:name="Medium List 1 Accent 2" w:uiPriority="65"/>
+    <w:lsdException w:name="Medium List 2 Accent 2" w:uiPriority="66"/>
+    <w:lsdException w:name="Medium Grid 1 Accent 2" w:uiPriority="67"/>
+    <w:lsdException w:name="Medium Grid 2 Accent 2" w:uiPriority="68"/>
+    <w:lsdException w:name="Medium Grid 3 Accent 2" w:uiPriority="69"/>
+    <w:lsdException w:name="Dark List Accent 2" w:uiPriority="70"/>
+    <w:lsdException w:name="Colorful Shading Accent 2" w:uiPriority="71"/>
+    <w:lsdException w:name="Colorful List Accent 2" w:uiPriority="72"/>
+    <w:lsdException w:name="Colorful Grid Accent 2" w:uiPriority="73"/>
+    <w:lsdException w:name="Light Shading Accent 3" w:uiPriority="60"/>
+    <w:lsdException w:name="Light List Accent 3" w:uiPriority="61"/>
+    <w:lsdException w:name="Light Grid Accent 3" w:uiPriority="62"/>
+    <w:lsdException w:name="Medium Shading 1 Accent 3" w:uiPriority="63"/>
+    <w:lsdException w:name="Medium Shading 2 Accent 3" w:uiPriority="64"/>
+    <w:lsdException w:name="Medium List 1 Accent 3" w:uiPriority="65"/>
+    <w:lsdException w:name="Medium List 2 Accent 3" w:uiPriority="66"/>
+    <w:lsdException w:name="Medium Grid 1 Accent 3" w:uiPriority="67"/>
+    <w:lsdException w:name="Medium Grid 2 Accent 3" w:uiPriority="68"/>
+    <w:lsdException w:name="Medium Grid 3 Accent 3" w:uiPriority="69"/>
+    <w:lsdException w:name="Dark List Accent 3" w:uiPriority="70"/>
+    <w:lsdException w:name="Colorful Shading Accent 3" w:uiPriority="71"/>
+    <w:lsdException w:name="Colorful List Accent 3" w:uiPriority="72"/>
+    <w:lsdException w:name="Colorful Grid Accent 3" w:uiPriority="73"/>
+    <w:lsdException w:name="Light Shading Accent 4" w:uiPriority="60"/>
+    <w:lsdException w:name="Light List Accent 4" w:uiPriority="61"/>
+    <w:lsdException w:name="Light Grid Accent 4" w:uiPriority="62"/>
+    <w:lsdException w:name="Medium Shading 1 Accent 4" w:uiPriority="63"/>
+    <w:lsdException w:name="Medium Shading 2 Accent 4" w:uiPriority="64"/>
+    <w:lsdException w:name="Medium List 1 Accent 4" w:uiPriority="65"/>
+    <w:lsdException w:name="Medium List 2 Accent 4" w:uiPriority="66"/>
+    <w:lsdException w:name="Medium Grid 1 Accent 4" w:uiPriority="67"/>
+    <w:lsdException w:name="Medium Grid 2 Accent 4" w:uiPriority="68"/>
+    <w:lsdException w:name="Medium Grid 3 Accent 4" w:uiPriority="69"/>
+    <w:lsdException w:name="Dark List Accent 4" w:uiPriority="70"/>
+    <w:lsdException w:name="Colorful Shading Accent 4" w:uiPriority="71"/>
+    <w:lsdException w:name="Colorful List Accent 4" w:uiPriority="72"/>
+    <w:lsdException w:name="Colorful Grid Accent 4" w:uiPriority="73"/>
+    <w:lsdException w:name="Light Shading Accent 5" w:uiPriority="60"/>
+    <w:lsdException w:name="Light List Accent 5" w:uiPriority="61"/>
+    <w:lsdException w:name="Light Grid Accent 5" w:uiPriority="62"/>
+    <w:lsdException w:name="Medium Shading 1 Accent 5" w:uiPriority="63"/>
+    <w:lsdException w:name="Medium Shading 2 Accent 5" w:uiPriority="64"/>
+    <w:lsdException w:name="Medium List 1 Accent 5" w:uiPriority="65"/>
+    <w:lsdException w:name="Medium List 2 Accent 5" w:uiPriority="66"/>
+    <w:lsdException w:name="Medium Grid 1 Accent 5" w:uiPriority="67"/>
+    <w:lsdException w:name="Medium Grid 2 Accent 5" w:uiPriority="68"/>
+    <w:lsdException w:name="Medium Grid 3 Accent 5" w:uiPriority="69"/>
+    <w:lsdException w:name="Dark List Accent 5" w:uiPriority="70"/>
+    <w:lsdException w:name="Colorful Shading Accent 5" w:uiPriority="71"/>
+    <w:lsdException w:name="Colorful List Accent 5" w:uiPriority="72"/>
+    <w:lsdException w:name="Colorful Grid Accent 5" w:uiPriority="73"/>
+    <w:lsdException w:name="Light Shading Accent 6" w:uiPriority="60"/>
+    <w:lsdException w:name="Light List Accent 6" w:uiPriority="61"/>
+    <w:lsdException w:name="Light Grid Accent 6" w:uiPriority="62"/>
+    <w:lsdException w:name="Medium Shading 1 Accent 6" w:uiPriority="63"/>
+    <w:lsdException w:name="Medium Shading 2 Accent 6" w:uiPriority="64"/>
+    <w:lsdException w:name="Medium List 1 Accent 6" w:uiPriority="65"/>
+    <w:lsdException w:name="Medium List 2 Accent 6" w:uiPriority="66"/>
+    <w:lsdException w:name="Medium Grid 1 Accent 6" w:uiPriority="67"/>
+    <w:lsdException w:name="Medium Grid 2 Accent 6" w:uiPriority="68"/>
+    <w:lsdException w:name="Medium Grid 3 Accent 6" w:uiPriority="69"/>
+    <w:lsdException w:name="Dark List Accent 6" w:uiPriority="70"/>
+    <w:lsdException w:name="Colorful Shading Accent 6" w:uiPriority="71"/>
+    <w:lsdException w:name="Colorful List Accent 6" w:uiPriority="72"/>
+    <w:lsdException w:name="Colorful Grid Accent 6" w:uiPriority="73"/>
+    <w:lsdException w:name="Subtle Emphasis" w:uiPriority="19" w:qFormat="1"/>
+    <w:lsdException w:name="Intense Emphasis" w:uiPriority="21" w:qFormat="1"/>
+    <w:lsdException w:name="Subtle Reference" w:uiPriority="31" w:qFormat="1"/>
+    <w:lsdException w:name="Intense Reference" w:uiPriority="32" w:qFormat="1"/>
+    <w:lsdException w:name="Book Title" w:uiPriority="33" w:qFormat="1"/>
+    <w:lsdException w:name="Bibliography" w:semiHidden="1" w:uiPriority="37" w:unhideWhenUsed="1"/>
+    <w:lsdException w:name="TOC Heading" w:semiHidden="1" w:uiPriority="39" w:unhideWhenUsed="1" w:qFormat="1"/>
+    <w:lsdException w:name="Plain Table 1" w:uiPriority="41"/>
+    <w:lsdException w:name="Plain Table 2" w:uiPriority="42"/>
+    <w:lsdException w:name="Plain Table 3" w:uiPriority="43"/>
+    <w:lsdException w:name="Plain Table 4" w:uiPriority="44"/>
+    <w:lsdException w:name="Plain Table 5" w:uiPriority="45"/>
+    <w:lsdException w:name="Grid Table Light" w:uiPriority="40"/>
+    <w:lsdException w:name="Grid Table 1 Light" w:uiPriority="46"/>
+    <w:lsdException w:name="Grid Table 2" w:uiPriority="47"/>
+    <w:lsdException w:name="Grid Table 3" w:uiPriority="48"/>
+    <w:lsdException w:name="Grid Table 4" w:uiPriority="49"/>
+    <w:lsdException w:name="Grid Table 5 Dark" w:uiPriority="50"/>
+    <w:lsdException w:name="Grid Table 6 Colorful" w:uiPriority="51"/>
+    <w:lsdException w:name="Grid Table 7 Colorful" w:uiPriority="52"/>
+    <w:lsdException w:name="Grid Table 1 Light Accent 1" w:uiPriority="46"/>
+    <w:lsdException w:name="Grid Table 2 Accent 1" w:uiPriority="47"/>
+    <w:lsdException w:name="Grid Table 3 Accent 1" w:uiPriority="48"/>
+    <w:lsdException w:name="Grid Table 4 Accent 1" w:uiPriority="49"/>
+    <w:lsdException w:name="Grid Table 5 Dark Accent 1" w:uiPriority="50"/>
+    <w:lsdException w:name="Grid Table 6 Colorful Accent 1" w:uiPriority="51"/>
+    <w:lsdException w:name="Grid Table 7 Colorful Accent 1" w:uiPriority="52"/>
+    <w:lsdException w:name="Grid Table 1 Light Accent 2" w:uiPriority="46"/>
+    <w:lsdException w:name="Grid Table 2 Accent 2" w:uiPriority="47"/>
+    <w:lsdException w:name="Grid Table 3 Accent 2" w:uiPriority="48"/>
+    <w:lsdException w:name="Grid Table 4 Accent 2" w:uiPriority="49"/>
+    <w:lsdException w:name="Grid Table 5 Dark Accent 2" w:uiPriority="50"/>
+    <w:lsdException w:name="Grid Table 6 Colorful Accent 2" w:uiPriority="51"/>
+    <w:lsdException w:name="Grid Table 7 Colorful Accent 2" w:uiPriority="52"/>
+    <w:lsdException w:name="Grid Table 1 Light Accent 3" w:uiPriority="46"/>
+    <w:lsdException w:name="Grid Table 2 Accent 3" w:uiPriority="47"/>
+    <w:lsdException w:name="Grid Table 3 Accent 3" w:uiPriority="48"/>
+    <w:lsdException w:name="Grid Table 4 Accent 3" w:uiPriority="49"/>
+    <w:lsdException w:name="Grid Table 5 Dark Accent 3" w:uiPriority="50"/>
+    <w:lsdException w:name="Grid Table 6 Colorful Accent 3" w:uiPriority="51"/>
+    <w:lsdException w:name="Grid Table 7 Colorful Accent 3" w:uiPriority="52"/>
+    <w:lsdException w:name="Grid Table 1 Light Accent 4" w:uiPriority="46"/>
+    <w:lsdException w:name="Grid Table 2 Accent 4" w:uiPriority="47"/>
+    <w:lsdException w:name="Grid Table 3 Accent 4" w:uiPriority="48"/>
+    <w:lsdException w:name="Grid Table 4 Accent 4" w:uiPriority="49"/>
+    <w:lsdException w:name="Grid Table 5 Dark Accent 4" w:uiPriority="50"/>
+    <w:lsdException w:name="Grid Table 6 Colorful Accent 4" w:uiPriority="51"/>
+    <w:lsdException w:name="Grid Table 7 Colorful Accent 4" w:uiPriority="52"/>
+    <w:lsdException w:name="Grid Table 1 Light Accent 5" w:uiPriority="46"/>
+    <w:lsdException w:name="Grid Table 2 Accent 5" w:uiPriority="47"/>
+    <w:lsdException w:name="Grid Table 3 Accent 5" w:uiPriority="48"/>
+    <w:lsdException w:name="Grid Table 4 Accent 5" w:uiPriority="49"/>
+    <w:lsdException w:name="Grid Table 5 Dark Accent 5" w:uiPriority="50"/>
+    <w:lsdException w:name="Grid Table 6 Colorful Accent 5" w:uiPriority="51"/>
+    <w:lsdException w:name="Grid Table 7 Colorful Accent 5" w:uiPriority="52"/>
+    <w:lsdException w:name="Grid Table 1 Light Accent 6" w:uiPriority="46"/>
+    <w:lsdException w:name="Grid Table 2 Accent 6" w:uiPriority="47"/>
+    <w:lsdException w:name="Grid Table 3 Accent 6" w:uiPriority="48"/>
+    <w:lsdException w:name="Grid Table 4 Accent 6" w:uiPriority="49"/>
+    <w:lsdException w:name="Grid Table 5 Dark Accent 6" w:uiPriority="50"/>
+    <w:lsdException w:name="Grid Table 6 Colorful Accent 6" w:uiPriority="51"/>
+    <w:lsdException w:name="Grid Table 7 Colorful Accent 6" w:uiPriority="52"/>
+    <w:lsdException w:name="List Table 1 Light" w:uiPriority="46"/>
+    <w:lsdException w:name="List Table 2" w:uiPriority="47"/>
+    <w:lsdException w:name="List Table 3" w:uiPriority="48"/>
+    <w:lsdException w:name="List Table 4" w:uiPriority="49"/>
+    <w:lsdException w:name="List Table 5 Dark" w:uiPriority="50"/>
+    <w:lsdException w:name="List Table 6 Colorful" w:uiPriority="51"/>
+    <w:lsdException w:name="List Table 7 Colorful" w:uiPriority="52"/>
+    <w:lsdException w:name="List Table 1 Light Accent 1" w:uiPriority="46"/>
+    <w:lsdException w:name="List Table 2 Accent 1" w:uiPriority="47"/>
+    <w:lsdException w:name="List Table 3 Accent 1" w:uiPriority="48"/>
+    <w:lsdException w:name="List Table 4 Accent 1" w:uiPriority="49"/>
+    <w:lsdException w:name="List Table 5 Dark Accent 1" w:uiPriority="50"/>
+    <w:lsdException w:name="List Table 6 Colorful Accent 1" w:uiPriority="51"/>
+    <w:lsdException w:name="List Table 7 Colorful Accent 1" w:uiPriority="52"/>
+    <w:lsdException w:name="List Table 1 Light Accent 2" w:uiPriority="46"/>
+    <w:lsdException w:name="List Table 2 Accent 2" w:uiPriority="47"/>
+    <w:lsdException w:name="List Table 3 Accent 2" w:uiPriority="48"/>
+    <w:lsdException w:name="List Table 4 Accent 2" w:uiPriority="49"/>
+    <w:lsdException w:name="List Table 5 Dark Accent 2" w:uiPriority="50"/>
+    <w:lsdException w:name="List Table 6 Colorful Accent 2" w:uiPriority="51"/>
+    <w:lsdException w:name="List Table 7 Colorful Accent 2" w:uiPriority="52"/>
+    <w:lsdException w:name="List Table 1 Light Accent 3" w:uiPriority="46"/>
+    <w:lsdException w:name="List Table 2 Accent 3" w:uiPriority="47"/>
+    <w:lsdException w:name="List Table 3 Accent 3" w:uiPriority="48"/>
+    <w:lsdException w:name="List Table 4 Accent 3" w:uiPriority="49"/>
+    <w:lsdException w:name="List Table 5 Dark Accent 3" w:uiPriority="50"/>
+    <w:lsdException w:name="List Table 6 Colorful Accent 3" w:uiPriority="51"/>
+    <w:lsdException w:name="List Table 7 Colorful Accent 3" w:uiPriority="52"/>
+    <w:lsdException w:name="List Table 1 Light Accent 4" w:uiPriority="46"/>
+    <w:lsdException w:name="List Table 2 Accent 4" w:uiPriority="47"/>
+    <w:lsdException w:name="List Table 3 Accent 4" w:uiPriority="48"/>
+    <w:lsdException w:name="List Table 4 Accent 4" w:uiPriority="49"/>
+    <w:lsdException w:name="List Table 5 Dark Accent 4" w:uiPriority="50"/>
+    <w:lsdException w:name="List Table 6 Colorful Accent 4" w:uiPriority="51"/>
+    <w:lsdException w:name="List Table 7 Colorful Accent 4" w:uiPriority="52"/>
+    <w:lsdException w:name="List Table 1 Light Accent 5" w:uiPriority="46"/>
+    <w:lsdException w:name="List Table 2 Accent 5" w:uiPriority="47"/>
+    <w:lsdException w:name="List Table 3 Accent 5" w:uiPriority="48"/>
+    <w:lsdException w:name="List Table 4 Accent 5" w:uiPriority="49"/>
+    <w:lsdException w:name="List Table 5 Dark Accent 5" w:uiPriority="50"/>
+    <w:lsdException w:name="List Table 6 Colorful Accent 5" w:uiPriority="51"/>
+    <w:lsdException w:name="List Table 7 Colorful Accent 5" w:uiPriority="52"/>
+    <w:lsdException w:name="List Table 1 Light Accent 6" w:uiPriority="46"/>
+    <w:lsdException w:name="List Table 2 Accent 6" w:uiPriority="47"/>
+    <w:lsdException w:name="List Table 3 Accent 6" w:uiPriority="48"/>
+    <w:lsdException w:name="List Table 4 Accent 6" w:uiPriority="49"/>
+    <w:lsdException w:name="List Table 5 Dark Accent 6" w:uiPriority="50"/>
+    <w:lsdException w:name="List Table 6 Colorful Accent 6" w:uiPriority="51"/>
+    <w:lsdException w:name="List Table 7 Colorful Accent 6" w:uiPriority="52"/>
+    <w:lsdException w:name="Mention" w:semiHidden="1" w:unhideWhenUsed="1"/>
+    <w:lsdException w:name="Smart Hyperlink" w:semiHidden="1" w:unhideWhenUsed="1"/>
+    <w:lsdException w:name="Hashtag" w:semiHidden="1" w:unhideWhenUsed="1"/>
+    <w:lsdException w:name="Unresolved Mention" w:semiHidden="1" w:unhideWhenUsed="1"/>
+    <w:lsdException w:name="Smart Link" w:semiHidden="1" w:unhideWhenUsed="1"/>
   </w:latentStyles>
   <w:style w:type="paragraph" w:default="1" w:styleId="Normal">
     <w:name w:val="Normal"/>
@@ -19578,7 +20769,6 @@
   <w:style w:type="character" w:default="1" w:styleId="Fontepargpadro">
     <w:name w:val="Default Paragraph Font"/>
     <w:uiPriority w:val="1"/>
-    <w:semiHidden/>
     <w:unhideWhenUsed/>
   </w:style>
   <w:style w:type="table" w:default="1" w:styleId="Tabelanormal">
@@ -19586,7 +20776,6 @@
     <w:uiPriority w:val="99"/>
     <w:semiHidden/>
     <w:unhideWhenUsed/>
-    <w:qFormat/>
     <w:tblPr>
       <w:tblInd w:w="0" w:type="dxa"/>
       <w:tblCellMar>
@@ -19612,7 +20801,6 @@
       <w:spacing w:after="0" w:line="240" w:lineRule="auto"/>
     </w:pPr>
     <w:tblPr>
-      <w:tblInd w:w="0" w:type="dxa"/>
       <w:tblBorders>
         <w:top w:val="single" w:sz="4" w:space="0" w:color="000000" w:themeColor="text1"/>
         <w:left w:val="single" w:sz="4" w:space="0" w:color="000000" w:themeColor="text1"/>
@@ -19621,12 +20809,6 @@
         <w:insideH w:val="single" w:sz="4" w:space="0" w:color="000000" w:themeColor="text1"/>
         <w:insideV w:val="single" w:sz="4" w:space="0" w:color="000000" w:themeColor="text1"/>
       </w:tblBorders>
-      <w:tblCellMar>
-        <w:top w:w="0" w:type="dxa"/>
-        <w:left w:w="108" w:type="dxa"/>
-        <w:bottom w:w="0" w:type="dxa"/>
-        <w:right w:w="108" w:type="dxa"/>
-      </w:tblCellMar>
     </w:tblPr>
   </w:style>
   <w:style w:type="paragraph" w:styleId="PargrafodaLista">
@@ -19855,9 +21037,10 @@
     <w:link w:val="Titulo2Relatorio"/>
     <w:rsid w:val="00B039C1"/>
     <w:rPr>
-      <w:rFonts w:ascii="Times" w:hAnsi="Times" w:cs="Times"/>
+      <w:rFonts w:ascii="Times" w:eastAsiaTheme="majorEastAsia" w:hAnsi="Times" w:cs="Times"/>
       <w:b/>
       <w:bCs/>
+      <w:color w:val="4F81BD" w:themeColor="accent1"/>
       <w:sz w:val="24"/>
       <w:szCs w:val="24"/>
     </w:rPr>
@@ -19906,7 +21089,10 @@
     <w:link w:val="Titulo3Relatorio"/>
     <w:rsid w:val="00B039C1"/>
     <w:rPr>
-      <w:rFonts w:ascii="Times" w:hAnsi="Times" w:cs="Times"/>
+      <w:rFonts w:ascii="Times" w:eastAsiaTheme="majorEastAsia" w:hAnsi="Times" w:cs="Times"/>
+      <w:b/>
+      <w:bCs/>
+      <w:color w:val="4F81BD" w:themeColor="accent1"/>
       <w:sz w:val="24"/>
       <w:szCs w:val="24"/>
     </w:rPr>
@@ -19987,7 +21173,12 @@
     <w:link w:val="Titulo4Relatorio"/>
     <w:rsid w:val="0090106E"/>
     <w:rPr>
-      <w:rFonts w:ascii="Times" w:hAnsi="Times" w:cs="Times"/>
+      <w:rFonts w:ascii="Times" w:eastAsiaTheme="majorEastAsia" w:hAnsi="Times" w:cs="Times"/>
+      <w:b/>
+      <w:bCs/>
+      <w:i/>
+      <w:iCs/>
+      <w:color w:val="4F81BD" w:themeColor="accent1"/>
       <w:sz w:val="24"/>
       <w:szCs w:val="24"/>
     </w:rPr>
@@ -20006,6 +21197,18 @@
       <w:sz w:val="24"/>
       <w:szCs w:val="24"/>
       <w:lang w:eastAsia="pt-BR"/>
+    </w:rPr>
+  </w:style>
+  <w:style w:type="character" w:styleId="MenoPendente">
+    <w:name w:val="Unresolved Mention"/>
+    <w:basedOn w:val="Fontepargpadro"/>
+    <w:uiPriority w:val="99"/>
+    <w:semiHidden/>
+    <w:unhideWhenUsed/>
+    <w:rsid w:val="001F450D"/>
+    <w:rPr>
+      <w:color w:val="605E5C"/>
+      <w:shd w:val="clear" w:color="auto" w:fill="E1DFDD"/>
     </w:rPr>
   </w:style>
 </w:styles>

</xml_diff>

<commit_message>
Revisão #3 atualizando graficos e tabelas.
</commit_message>
<xml_diff>
--- a/Relatorio_Equipe_HeapSort.docx
+++ b/Relatorio_Equipe_HeapSort.docx
@@ -15896,7 +15896,7 @@
         </w:rPr>
         <w:drawing>
           <wp:inline distT="0" distB="0" distL="0" distR="0">
-            <wp:extent cx="4138019" cy="3210212"/>
+            <wp:extent cx="5508000" cy="3241495"/>
             <wp:effectExtent l="19050" t="0" r="0" b="0"/>
             <wp:docPr id="12" name="Imagem 11" descr="ordered_input.PNG"/>
             <wp:cNvGraphicFramePr>
@@ -15918,7 +15918,7 @@
                   <pic:spPr>
                     <a:xfrm>
                       <a:off x="0" y="0"/>
-                      <a:ext cx="4138019" cy="3210212"/>
+                      <a:ext cx="5508000" cy="3241495"/>
                     </a:xfrm>
                     <a:prstGeom prst="rect">
                       <a:avLst/>
@@ -16004,7 +16004,23 @@
           <w:sz w:val="24"/>
           <w:szCs w:val="24"/>
         </w:rPr>
-        <w:t>(em milésimos)</w:t>
+        <w:t>(</w:t>
+      </w:r>
+      <w:r>
+        <w:rPr>
+          <w:color w:val="auto"/>
+          <w:sz w:val="24"/>
+          <w:szCs w:val="24"/>
+        </w:rPr>
+        <w:t>em segundos</w:t>
+      </w:r>
+      <w:r>
+        <w:rPr>
+          <w:color w:val="auto"/>
+          <w:sz w:val="24"/>
+          <w:szCs w:val="24"/>
+        </w:rPr>
+        <w:t>)</w:t>
       </w:r>
       <w:r>
         <w:rPr>
@@ -16353,7 +16369,7 @@
         </w:rPr>
         <w:drawing>
           <wp:inline distT="0" distB="0" distL="0" distR="0">
-            <wp:extent cx="5731508" cy="3543983"/>
+            <wp:extent cx="5731508" cy="3543982"/>
             <wp:effectExtent l="19050" t="0" r="2542" b="0"/>
             <wp:docPr id="15" name="Imagem 14" descr="ordered_input_grafico.PNG"/>
             <wp:cNvGraphicFramePr>
@@ -16375,7 +16391,7 @@
                   <pic:spPr>
                     <a:xfrm>
                       <a:off x="0" y="0"/>
-                      <a:ext cx="5731508" cy="3543983"/>
+                      <a:ext cx="5731508" cy="3543982"/>
                     </a:xfrm>
                     <a:prstGeom prst="rect">
                       <a:avLst/>
@@ -16598,8 +16614,8 @@
         </w:rPr>
         <w:drawing>
           <wp:inline distT="0" distB="0" distL="0" distR="0">
-            <wp:extent cx="4221846" cy="3277319"/>
-            <wp:effectExtent l="19050" t="0" r="7254" b="0"/>
+            <wp:extent cx="5508000" cy="3235522"/>
+            <wp:effectExtent l="19050" t="0" r="0" b="0"/>
             <wp:docPr id="13" name="Imagem 12" descr="reversed_input.PNG"/>
             <wp:cNvGraphicFramePr>
               <a:graphicFrameLocks xmlns:a="http://schemas.openxmlformats.org/drawingml/2006/main" noChangeAspect="1"/>
@@ -16620,7 +16636,7 @@
                   <pic:spPr>
                     <a:xfrm>
                       <a:off x="0" y="0"/>
-                      <a:ext cx="4221846" cy="3277319"/>
+                      <a:ext cx="5508000" cy="3235522"/>
                     </a:xfrm>
                     <a:prstGeom prst="rect">
                       <a:avLst/>
@@ -16706,7 +16722,23 @@
           <w:sz w:val="24"/>
           <w:szCs w:val="24"/>
         </w:rPr>
-        <w:t xml:space="preserve">Tabela comparativa(em milésimos) </w:t>
+        <w:t>Tabela comparativa(</w:t>
+      </w:r>
+      <w:r>
+        <w:rPr>
+          <w:color w:val="auto"/>
+          <w:sz w:val="24"/>
+          <w:szCs w:val="24"/>
+        </w:rPr>
+        <w:t>em segundos</w:t>
+      </w:r>
+      <w:r>
+        <w:rPr>
+          <w:color w:val="auto"/>
+          <w:sz w:val="24"/>
+          <w:szCs w:val="24"/>
+        </w:rPr>
+        <w:t xml:space="preserve">) </w:t>
       </w:r>
       <w:r>
         <w:rPr>
@@ -17023,7 +17055,7 @@
         </w:rPr>
         <w:drawing>
           <wp:inline distT="0" distB="0" distL="0" distR="0">
-            <wp:extent cx="5731508" cy="3543983"/>
+            <wp:extent cx="5731508" cy="3543982"/>
             <wp:effectExtent l="19050" t="0" r="2542" b="0"/>
             <wp:docPr id="16" name="Imagem 15" descr="reversed_input_grafico.PNG"/>
             <wp:cNvGraphicFramePr>
@@ -17045,7 +17077,7 @@
                   <pic:spPr>
                     <a:xfrm>
                       <a:off x="0" y="0"/>
-                      <a:ext cx="5731508" cy="3543983"/>
+                      <a:ext cx="5731508" cy="3543982"/>
                     </a:xfrm>
                     <a:prstGeom prst="rect">
                       <a:avLst/>
@@ -17276,7 +17308,7 @@
         </w:rPr>
         <w:drawing>
           <wp:inline distT="0" distB="0" distL="0" distR="0">
-            <wp:extent cx="4153260" cy="3216434"/>
+            <wp:extent cx="5508000" cy="3290091"/>
             <wp:effectExtent l="19050" t="0" r="0" b="0"/>
             <wp:docPr id="14" name="Imagem 13" descr="uniform_input.PNG"/>
             <wp:cNvGraphicFramePr>
@@ -17298,7 +17330,7 @@
                   <pic:spPr>
                     <a:xfrm>
                       <a:off x="0" y="0"/>
-                      <a:ext cx="4153260" cy="3216434"/>
+                      <a:ext cx="5508000" cy="3290091"/>
                     </a:xfrm>
                     <a:prstGeom prst="rect">
                       <a:avLst/>
@@ -17384,7 +17416,23 @@
           <w:sz w:val="24"/>
           <w:szCs w:val="24"/>
         </w:rPr>
-        <w:t xml:space="preserve">Tabela comparativa(em milésimos) </w:t>
+        <w:t>Tabela comparativa(</w:t>
+      </w:r>
+      <w:r>
+        <w:rPr>
+          <w:color w:val="auto"/>
+          <w:sz w:val="24"/>
+          <w:szCs w:val="24"/>
+        </w:rPr>
+        <w:t>em segundos</w:t>
+      </w:r>
+      <w:r>
+        <w:rPr>
+          <w:color w:val="auto"/>
+          <w:sz w:val="24"/>
+          <w:szCs w:val="24"/>
+        </w:rPr>
+        <w:t xml:space="preserve">) </w:t>
       </w:r>
       <w:r>
         <w:rPr>
@@ -20676,7 +20724,7 @@
           <w:rPr>
             <w:noProof/>
           </w:rPr>
-          <w:t>34</w:t>
+          <w:t>30</w:t>
         </w:r>
         <w:r>
           <w:rPr>

</xml_diff>

<commit_message>
Revisão #5 Revisando textos
</commit_message>
<xml_diff>
--- a/Relatorio_Equipe_HeapSort.docx
+++ b/Relatorio_Equipe_HeapSort.docx
@@ -5,7 +5,7 @@
     <w:p>
       <w:pPr>
         <w:spacing w:line="480" w:lineRule="auto"/>
-        <w:jc w:val="both"/>
+        <w:jc w:val="center"/>
         <w:rPr>
           <w:rFonts w:ascii="Times" w:hAnsi="Times" w:cs="Times"/>
           <w:sz w:val="24"/>
@@ -362,12 +362,9 @@
               <w:tab w:val="left" w:pos="440"/>
               <w:tab w:val="right" w:leader="dot" w:pos="9016"/>
             </w:tabs>
-            <w:jc w:val="both"/>
             <w:rPr>
-              <w:rFonts w:eastAsiaTheme="minorEastAsia"/>
+              <w:rFonts w:ascii="Times" w:eastAsiaTheme="minorEastAsia" w:hAnsi="Times" w:cs="Times"/>
               <w:noProof/>
-              <w:sz w:val="24"/>
-              <w:szCs w:val="24"/>
               <w:lang w:eastAsia="pt-BR"/>
             </w:rPr>
           </w:pPr>
@@ -395,24 +392,19 @@
             </w:rPr>
             <w:fldChar w:fldCharType="separate"/>
           </w:r>
-          <w:hyperlink w:anchor="_Toc200439697" w:history="1">
+          <w:hyperlink w:anchor="_Toc201083632" w:history="1">
             <w:r>
               <w:rPr>
                 <w:rStyle w:val="Hyperlink"/>
                 <w:rFonts w:ascii="Times" w:hAnsi="Times" w:cs="Times"/>
                 <w:noProof/>
-                <w:color w:val="auto"/>
-                <w:sz w:val="24"/>
-                <w:szCs w:val="24"/>
               </w:rPr>
               <w:t>1.</w:t>
             </w:r>
             <w:r>
               <w:rPr>
-                <w:rFonts w:eastAsiaTheme="minorEastAsia"/>
+                <w:rFonts w:ascii="Times" w:eastAsiaTheme="minorEastAsia" w:hAnsi="Times" w:cs="Times"/>
                 <w:noProof/>
-                <w:sz w:val="24"/>
-                <w:szCs w:val="24"/>
                 <w:lang w:eastAsia="pt-BR"/>
               </w:rPr>
               <w:tab/>
@@ -422,71 +414,61 @@
                 <w:rStyle w:val="Hyperlink"/>
                 <w:rFonts w:ascii="Times" w:hAnsi="Times" w:cs="Times"/>
                 <w:noProof/>
-                <w:color w:val="auto"/>
-                <w:sz w:val="24"/>
-                <w:szCs w:val="24"/>
               </w:rPr>
               <w:t>Introdução</w:t>
             </w:r>
             <w:r>
               <w:rPr>
+                <w:rFonts w:ascii="Times" w:hAnsi="Times" w:cs="Times"/>
                 <w:noProof/>
                 <w:webHidden/>
-                <w:sz w:val="24"/>
-                <w:szCs w:val="24"/>
               </w:rPr>
               <w:tab/>
             </w:r>
             <w:r>
               <w:rPr>
+                <w:rFonts w:ascii="Times" w:hAnsi="Times" w:cs="Times"/>
                 <w:noProof/>
                 <w:webHidden/>
-                <w:sz w:val="24"/>
-                <w:szCs w:val="24"/>
               </w:rPr>
               <w:fldChar w:fldCharType="begin"/>
             </w:r>
             <w:r>
               <w:rPr>
+                <w:rFonts w:ascii="Times" w:hAnsi="Times" w:cs="Times"/>
                 <w:noProof/>
                 <w:webHidden/>
-                <w:sz w:val="24"/>
-                <w:szCs w:val="24"/>
-              </w:rPr>
-              <w:instrText xml:space="preserve"> PAGEREF _Toc200439697 \h </w:instrText>
+              </w:rPr>
+              <w:instrText xml:space="preserve"> PAGEREF _Toc201083632 \h </w:instrText>
             </w:r>
             <w:r>
               <w:rPr>
+                <w:rFonts w:ascii="Times" w:hAnsi="Times" w:cs="Times"/>
                 <w:noProof/>
                 <w:webHidden/>
-                <w:sz w:val="24"/>
-                <w:szCs w:val="24"/>
               </w:rPr>
             </w:r>
             <w:r>
               <w:rPr>
+                <w:rFonts w:ascii="Times" w:hAnsi="Times" w:cs="Times"/>
                 <w:noProof/>
                 <w:webHidden/>
-                <w:sz w:val="24"/>
-                <w:szCs w:val="24"/>
               </w:rPr>
               <w:fldChar w:fldCharType="separate"/>
             </w:r>
             <w:r>
               <w:rPr>
+                <w:rFonts w:ascii="Times" w:hAnsi="Times" w:cs="Times"/>
                 <w:noProof/>
                 <w:webHidden/>
-                <w:sz w:val="24"/>
-                <w:szCs w:val="24"/>
-              </w:rPr>
-              <w:t>3</w:t>
+              </w:rPr>
+              <w:t>4</w:t>
             </w:r>
             <w:r>
               <w:rPr>
+                <w:rFonts w:ascii="Times" w:hAnsi="Times" w:cs="Times"/>
                 <w:noProof/>
                 <w:webHidden/>
-                <w:sz w:val="24"/>
-                <w:szCs w:val="24"/>
               </w:rPr>
               <w:fldChar w:fldCharType="end"/>
             </w:r>
@@ -499,33 +481,25 @@
               <w:tab w:val="left" w:pos="440"/>
               <w:tab w:val="right" w:leader="dot" w:pos="9016"/>
             </w:tabs>
-            <w:jc w:val="both"/>
             <w:rPr>
-              <w:rFonts w:eastAsiaTheme="minorEastAsia"/>
+              <w:rFonts w:ascii="Times" w:eastAsiaTheme="minorEastAsia" w:hAnsi="Times" w:cs="Times"/>
               <w:noProof/>
-              <w:sz w:val="24"/>
-              <w:szCs w:val="24"/>
               <w:lang w:eastAsia="pt-BR"/>
             </w:rPr>
           </w:pPr>
-          <w:hyperlink w:anchor="_Toc200439698" w:history="1">
+          <w:hyperlink w:anchor="_Toc201083633" w:history="1">
             <w:r>
               <w:rPr>
                 <w:rStyle w:val="Hyperlink"/>
                 <w:rFonts w:ascii="Times" w:hAnsi="Times" w:cs="Times"/>
                 <w:noProof/>
-                <w:color w:val="auto"/>
-                <w:sz w:val="24"/>
-                <w:szCs w:val="24"/>
               </w:rPr>
               <w:t>2.</w:t>
             </w:r>
             <w:r>
               <w:rPr>
-                <w:rFonts w:eastAsiaTheme="minorEastAsia"/>
+                <w:rFonts w:ascii="Times" w:eastAsiaTheme="minorEastAsia" w:hAnsi="Times" w:cs="Times"/>
                 <w:noProof/>
-                <w:sz w:val="24"/>
-                <w:szCs w:val="24"/>
                 <w:lang w:eastAsia="pt-BR"/>
               </w:rPr>
               <w:tab/>
@@ -535,71 +509,61 @@
                 <w:rStyle w:val="Hyperlink"/>
                 <w:rFonts w:ascii="Times" w:hAnsi="Times" w:cs="Times"/>
                 <w:noProof/>
-                <w:color w:val="auto"/>
-                <w:sz w:val="24"/>
-                <w:szCs w:val="24"/>
               </w:rPr>
               <w:t>Algoritmo Heap Sort</w:t>
             </w:r>
             <w:r>
               <w:rPr>
+                <w:rFonts w:ascii="Times" w:hAnsi="Times" w:cs="Times"/>
                 <w:noProof/>
                 <w:webHidden/>
-                <w:sz w:val="24"/>
-                <w:szCs w:val="24"/>
               </w:rPr>
               <w:tab/>
             </w:r>
             <w:r>
               <w:rPr>
+                <w:rFonts w:ascii="Times" w:hAnsi="Times" w:cs="Times"/>
                 <w:noProof/>
                 <w:webHidden/>
-                <w:sz w:val="24"/>
-                <w:szCs w:val="24"/>
               </w:rPr>
               <w:fldChar w:fldCharType="begin"/>
             </w:r>
             <w:r>
               <w:rPr>
+                <w:rFonts w:ascii="Times" w:hAnsi="Times" w:cs="Times"/>
                 <w:noProof/>
                 <w:webHidden/>
-                <w:sz w:val="24"/>
-                <w:szCs w:val="24"/>
-              </w:rPr>
-              <w:instrText xml:space="preserve"> PAGEREF _Toc200439698 \h </w:instrText>
+              </w:rPr>
+              <w:instrText xml:space="preserve"> PAGEREF _Toc201083633 \h </w:instrText>
             </w:r>
             <w:r>
               <w:rPr>
+                <w:rFonts w:ascii="Times" w:hAnsi="Times" w:cs="Times"/>
                 <w:noProof/>
                 <w:webHidden/>
-                <w:sz w:val="24"/>
-                <w:szCs w:val="24"/>
               </w:rPr>
             </w:r>
             <w:r>
               <w:rPr>
+                <w:rFonts w:ascii="Times" w:hAnsi="Times" w:cs="Times"/>
                 <w:noProof/>
                 <w:webHidden/>
-                <w:sz w:val="24"/>
-                <w:szCs w:val="24"/>
               </w:rPr>
               <w:fldChar w:fldCharType="separate"/>
             </w:r>
             <w:r>
               <w:rPr>
+                <w:rFonts w:ascii="Times" w:hAnsi="Times" w:cs="Times"/>
                 <w:noProof/>
                 <w:webHidden/>
-                <w:sz w:val="24"/>
-                <w:szCs w:val="24"/>
-              </w:rPr>
-              <w:t>4</w:t>
+              </w:rPr>
+              <w:t>7</w:t>
             </w:r>
             <w:r>
               <w:rPr>
+                <w:rFonts w:ascii="Times" w:hAnsi="Times" w:cs="Times"/>
                 <w:noProof/>
                 <w:webHidden/>
-                <w:sz w:val="24"/>
-                <w:szCs w:val="24"/>
               </w:rPr>
               <w:fldChar w:fldCharType="end"/>
             </w:r>
@@ -611,85 +575,73 @@
             <w:tabs>
               <w:tab w:val="right" w:leader="dot" w:pos="9016"/>
             </w:tabs>
-            <w:jc w:val="both"/>
             <w:rPr>
-              <w:rFonts w:eastAsiaTheme="minorEastAsia"/>
+              <w:rFonts w:ascii="Times" w:eastAsiaTheme="minorEastAsia" w:hAnsi="Times" w:cs="Times"/>
               <w:noProof/>
-              <w:sz w:val="24"/>
-              <w:szCs w:val="24"/>
               <w:lang w:eastAsia="pt-BR"/>
             </w:rPr>
           </w:pPr>
-          <w:hyperlink w:anchor="_Toc200439699" w:history="1">
+          <w:hyperlink w:anchor="_Toc201083634" w:history="1">
             <w:r>
               <w:rPr>
                 <w:rStyle w:val="Hyperlink"/>
+                <w:rFonts w:ascii="Times" w:hAnsi="Times" w:cs="Times"/>
                 <w:noProof/>
-                <w:color w:val="auto"/>
-                <w:sz w:val="24"/>
-                <w:szCs w:val="24"/>
-              </w:rPr>
-              <w:t>Detalhamento Do Funcionamento Do Algoritmo.</w:t>
+              </w:rPr>
+              <w:t>Detalhamento do Funcionamento do Algoritmo</w:t>
             </w:r>
             <w:r>
               <w:rPr>
+                <w:rFonts w:ascii="Times" w:hAnsi="Times" w:cs="Times"/>
                 <w:noProof/>
                 <w:webHidden/>
-                <w:sz w:val="24"/>
-                <w:szCs w:val="24"/>
               </w:rPr>
               <w:tab/>
             </w:r>
             <w:r>
               <w:rPr>
+                <w:rFonts w:ascii="Times" w:hAnsi="Times" w:cs="Times"/>
                 <w:noProof/>
                 <w:webHidden/>
-                <w:sz w:val="24"/>
-                <w:szCs w:val="24"/>
               </w:rPr>
               <w:fldChar w:fldCharType="begin"/>
             </w:r>
             <w:r>
               <w:rPr>
+                <w:rFonts w:ascii="Times" w:hAnsi="Times" w:cs="Times"/>
                 <w:noProof/>
                 <w:webHidden/>
-                <w:sz w:val="24"/>
-                <w:szCs w:val="24"/>
-              </w:rPr>
-              <w:instrText xml:space="preserve"> PAGEREF _Toc200439699 \h </w:instrText>
+              </w:rPr>
+              <w:instrText xml:space="preserve"> PAGEREF _Toc201083634 \h </w:instrText>
             </w:r>
             <w:r>
               <w:rPr>
+                <w:rFonts w:ascii="Times" w:hAnsi="Times" w:cs="Times"/>
                 <w:noProof/>
                 <w:webHidden/>
-                <w:sz w:val="24"/>
-                <w:szCs w:val="24"/>
               </w:rPr>
             </w:r>
             <w:r>
               <w:rPr>
+                <w:rFonts w:ascii="Times" w:hAnsi="Times" w:cs="Times"/>
                 <w:noProof/>
                 <w:webHidden/>
-                <w:sz w:val="24"/>
-                <w:szCs w:val="24"/>
               </w:rPr>
               <w:fldChar w:fldCharType="separate"/>
             </w:r>
             <w:r>
               <w:rPr>
+                <w:rFonts w:ascii="Times" w:hAnsi="Times" w:cs="Times"/>
                 <w:noProof/>
                 <w:webHidden/>
-                <w:sz w:val="24"/>
-                <w:szCs w:val="24"/>
-              </w:rPr>
-              <w:t>4</w:t>
+              </w:rPr>
+              <w:t>7</w:t>
             </w:r>
             <w:r>
               <w:rPr>
+                <w:rFonts w:ascii="Times" w:hAnsi="Times" w:cs="Times"/>
                 <w:noProof/>
                 <w:webHidden/>
-                <w:sz w:val="24"/>
-                <w:szCs w:val="24"/>
               </w:rPr>
               <w:fldChar w:fldCharType="end"/>
             </w:r>
@@ -701,85 +653,73 @@
             <w:tabs>
               <w:tab w:val="right" w:leader="dot" w:pos="9016"/>
             </w:tabs>
-            <w:jc w:val="both"/>
             <w:rPr>
-              <w:rFonts w:eastAsiaTheme="minorEastAsia"/>
+              <w:rFonts w:ascii="Times" w:eastAsiaTheme="minorEastAsia" w:hAnsi="Times" w:cs="Times"/>
               <w:noProof/>
-              <w:sz w:val="24"/>
-              <w:szCs w:val="24"/>
               <w:lang w:eastAsia="pt-BR"/>
             </w:rPr>
           </w:pPr>
-          <w:hyperlink w:anchor="_Toc200439700" w:history="1">
+          <w:hyperlink w:anchor="_Toc201083635" w:history="1">
             <w:r>
               <w:rPr>
                 <w:rStyle w:val="Hyperlink"/>
+                <w:rFonts w:ascii="Times" w:hAnsi="Times" w:cs="Times"/>
                 <w:noProof/>
-                <w:color w:val="auto"/>
-                <w:sz w:val="24"/>
-                <w:szCs w:val="24"/>
-              </w:rPr>
-              <w:t>Análise Da Complexidade Do Algoritmo.</w:t>
+              </w:rPr>
+              <w:t>Análise da Complexidade do Algoritmo</w:t>
             </w:r>
             <w:r>
               <w:rPr>
+                <w:rFonts w:ascii="Times" w:hAnsi="Times" w:cs="Times"/>
                 <w:noProof/>
                 <w:webHidden/>
-                <w:sz w:val="24"/>
-                <w:szCs w:val="24"/>
               </w:rPr>
               <w:tab/>
             </w:r>
             <w:r>
               <w:rPr>
+                <w:rFonts w:ascii="Times" w:hAnsi="Times" w:cs="Times"/>
                 <w:noProof/>
                 <w:webHidden/>
-                <w:sz w:val="24"/>
-                <w:szCs w:val="24"/>
               </w:rPr>
               <w:fldChar w:fldCharType="begin"/>
             </w:r>
             <w:r>
               <w:rPr>
+                <w:rFonts w:ascii="Times" w:hAnsi="Times" w:cs="Times"/>
                 <w:noProof/>
                 <w:webHidden/>
-                <w:sz w:val="24"/>
-                <w:szCs w:val="24"/>
-              </w:rPr>
-              <w:instrText xml:space="preserve"> PAGEREF _Toc200439700 \h </w:instrText>
+              </w:rPr>
+              <w:instrText xml:space="preserve"> PAGEREF _Toc201083635 \h </w:instrText>
             </w:r>
             <w:r>
               <w:rPr>
+                <w:rFonts w:ascii="Times" w:hAnsi="Times" w:cs="Times"/>
                 <w:noProof/>
                 <w:webHidden/>
-                <w:sz w:val="24"/>
-                <w:szCs w:val="24"/>
               </w:rPr>
             </w:r>
             <w:r>
               <w:rPr>
+                <w:rFonts w:ascii="Times" w:hAnsi="Times" w:cs="Times"/>
                 <w:noProof/>
                 <w:webHidden/>
-                <w:sz w:val="24"/>
-                <w:szCs w:val="24"/>
               </w:rPr>
               <w:fldChar w:fldCharType="separate"/>
             </w:r>
             <w:r>
               <w:rPr>
+                <w:rFonts w:ascii="Times" w:hAnsi="Times" w:cs="Times"/>
                 <w:noProof/>
                 <w:webHidden/>
-                <w:sz w:val="24"/>
-                <w:szCs w:val="24"/>
-              </w:rPr>
-              <w:t>5</w:t>
+              </w:rPr>
+              <w:t>8</w:t>
             </w:r>
             <w:r>
               <w:rPr>
+                <w:rFonts w:ascii="Times" w:hAnsi="Times" w:cs="Times"/>
                 <w:noProof/>
                 <w:webHidden/>
-                <w:sz w:val="24"/>
-                <w:szCs w:val="24"/>
               </w:rPr>
               <w:fldChar w:fldCharType="end"/>
             </w:r>
@@ -791,85 +731,73 @@
             <w:tabs>
               <w:tab w:val="right" w:leader="dot" w:pos="9016"/>
             </w:tabs>
-            <w:jc w:val="both"/>
             <w:rPr>
-              <w:rFonts w:eastAsiaTheme="minorEastAsia"/>
+              <w:rFonts w:ascii="Times" w:eastAsiaTheme="minorEastAsia" w:hAnsi="Times" w:cs="Times"/>
               <w:noProof/>
-              <w:sz w:val="24"/>
-              <w:szCs w:val="24"/>
               <w:lang w:eastAsia="pt-BR"/>
             </w:rPr>
           </w:pPr>
-          <w:hyperlink w:anchor="_Toc200439701" w:history="1">
+          <w:hyperlink w:anchor="_Toc201083636" w:history="1">
             <w:r>
               <w:rPr>
                 <w:rStyle w:val="Hyperlink"/>
+                <w:rFonts w:ascii="Times" w:hAnsi="Times" w:cs="Times"/>
                 <w:noProof/>
-                <w:color w:val="auto"/>
-                <w:sz w:val="24"/>
-                <w:szCs w:val="24"/>
-              </w:rPr>
-              <w:t>Melhores Cenários De Uso Do Algoritmo</w:t>
+              </w:rPr>
+              <w:t>Melhores Cenários de Uso do Algoritmo</w:t>
             </w:r>
             <w:r>
               <w:rPr>
+                <w:rFonts w:ascii="Times" w:hAnsi="Times" w:cs="Times"/>
                 <w:noProof/>
                 <w:webHidden/>
-                <w:sz w:val="24"/>
-                <w:szCs w:val="24"/>
               </w:rPr>
               <w:tab/>
             </w:r>
             <w:r>
               <w:rPr>
+                <w:rFonts w:ascii="Times" w:hAnsi="Times" w:cs="Times"/>
                 <w:noProof/>
                 <w:webHidden/>
-                <w:sz w:val="24"/>
-                <w:szCs w:val="24"/>
               </w:rPr>
               <w:fldChar w:fldCharType="begin"/>
             </w:r>
             <w:r>
               <w:rPr>
+                <w:rFonts w:ascii="Times" w:hAnsi="Times" w:cs="Times"/>
                 <w:noProof/>
                 <w:webHidden/>
-                <w:sz w:val="24"/>
-                <w:szCs w:val="24"/>
-              </w:rPr>
-              <w:instrText xml:space="preserve"> PAGEREF _Toc200439701 \h </w:instrText>
+              </w:rPr>
+              <w:instrText xml:space="preserve"> PAGEREF _Toc201083636 \h </w:instrText>
             </w:r>
             <w:r>
               <w:rPr>
+                <w:rFonts w:ascii="Times" w:hAnsi="Times" w:cs="Times"/>
                 <w:noProof/>
                 <w:webHidden/>
-                <w:sz w:val="24"/>
-                <w:szCs w:val="24"/>
               </w:rPr>
             </w:r>
             <w:r>
               <w:rPr>
+                <w:rFonts w:ascii="Times" w:hAnsi="Times" w:cs="Times"/>
                 <w:noProof/>
                 <w:webHidden/>
-                <w:sz w:val="24"/>
-                <w:szCs w:val="24"/>
               </w:rPr>
               <w:fldChar w:fldCharType="separate"/>
             </w:r>
             <w:r>
               <w:rPr>
+                <w:rFonts w:ascii="Times" w:hAnsi="Times" w:cs="Times"/>
                 <w:noProof/>
                 <w:webHidden/>
-                <w:sz w:val="24"/>
-                <w:szCs w:val="24"/>
-              </w:rPr>
-              <w:t>7</w:t>
+              </w:rPr>
+              <w:t>10</w:t>
             </w:r>
             <w:r>
               <w:rPr>
+                <w:rFonts w:ascii="Times" w:hAnsi="Times" w:cs="Times"/>
                 <w:noProof/>
                 <w:webHidden/>
-                <w:sz w:val="24"/>
-                <w:szCs w:val="24"/>
               </w:rPr>
               <w:fldChar w:fldCharType="end"/>
             </w:r>
@@ -881,85 +809,73 @@
             <w:tabs>
               <w:tab w:val="right" w:leader="dot" w:pos="9016"/>
             </w:tabs>
-            <w:jc w:val="both"/>
             <w:rPr>
-              <w:rFonts w:eastAsiaTheme="minorEastAsia"/>
+              <w:rFonts w:ascii="Times" w:eastAsiaTheme="minorEastAsia" w:hAnsi="Times" w:cs="Times"/>
               <w:noProof/>
-              <w:sz w:val="24"/>
-              <w:szCs w:val="24"/>
               <w:lang w:eastAsia="pt-BR"/>
             </w:rPr>
           </w:pPr>
-          <w:hyperlink w:anchor="_Toc200439702" w:history="1">
+          <w:hyperlink w:anchor="_Toc201083637" w:history="1">
             <w:r>
               <w:rPr>
                 <w:rStyle w:val="Hyperlink"/>
+                <w:rFonts w:ascii="Times" w:hAnsi="Times" w:cs="Times"/>
                 <w:noProof/>
-                <w:color w:val="auto"/>
-                <w:sz w:val="24"/>
-                <w:szCs w:val="24"/>
-              </w:rPr>
-              <w:t>Aplicações Com Necessidade De Garantia De Tempo.</w:t>
+              </w:rPr>
+              <w:t>Aplicações Com Necessidade de Garantia de Tempo</w:t>
             </w:r>
             <w:r>
               <w:rPr>
+                <w:rFonts w:ascii="Times" w:hAnsi="Times" w:cs="Times"/>
                 <w:noProof/>
                 <w:webHidden/>
-                <w:sz w:val="24"/>
-                <w:szCs w:val="24"/>
               </w:rPr>
               <w:tab/>
             </w:r>
             <w:r>
               <w:rPr>
+                <w:rFonts w:ascii="Times" w:hAnsi="Times" w:cs="Times"/>
                 <w:noProof/>
                 <w:webHidden/>
-                <w:sz w:val="24"/>
-                <w:szCs w:val="24"/>
               </w:rPr>
               <w:fldChar w:fldCharType="begin"/>
             </w:r>
             <w:r>
               <w:rPr>
+                <w:rFonts w:ascii="Times" w:hAnsi="Times" w:cs="Times"/>
                 <w:noProof/>
                 <w:webHidden/>
-                <w:sz w:val="24"/>
-                <w:szCs w:val="24"/>
-              </w:rPr>
-              <w:instrText xml:space="preserve"> PAGEREF _Toc200439702 \h </w:instrText>
+              </w:rPr>
+              <w:instrText xml:space="preserve"> PAGEREF _Toc201083637 \h </w:instrText>
             </w:r>
             <w:r>
               <w:rPr>
+                <w:rFonts w:ascii="Times" w:hAnsi="Times" w:cs="Times"/>
                 <w:noProof/>
                 <w:webHidden/>
-                <w:sz w:val="24"/>
-                <w:szCs w:val="24"/>
               </w:rPr>
             </w:r>
             <w:r>
               <w:rPr>
+                <w:rFonts w:ascii="Times" w:hAnsi="Times" w:cs="Times"/>
                 <w:noProof/>
                 <w:webHidden/>
-                <w:sz w:val="24"/>
-                <w:szCs w:val="24"/>
               </w:rPr>
               <w:fldChar w:fldCharType="separate"/>
             </w:r>
             <w:r>
               <w:rPr>
+                <w:rFonts w:ascii="Times" w:hAnsi="Times" w:cs="Times"/>
                 <w:noProof/>
                 <w:webHidden/>
-                <w:sz w:val="24"/>
-                <w:szCs w:val="24"/>
-              </w:rPr>
-              <w:t>7</w:t>
+              </w:rPr>
+              <w:t>10</w:t>
             </w:r>
             <w:r>
               <w:rPr>
+                <w:rFonts w:ascii="Times" w:hAnsi="Times" w:cs="Times"/>
                 <w:noProof/>
                 <w:webHidden/>
-                <w:sz w:val="24"/>
-                <w:szCs w:val="24"/>
               </w:rPr>
               <w:fldChar w:fldCharType="end"/>
             </w:r>
@@ -971,85 +887,73 @@
             <w:tabs>
               <w:tab w:val="right" w:leader="dot" w:pos="9016"/>
             </w:tabs>
-            <w:jc w:val="both"/>
             <w:rPr>
-              <w:rFonts w:eastAsiaTheme="minorEastAsia"/>
+              <w:rFonts w:ascii="Times" w:eastAsiaTheme="minorEastAsia" w:hAnsi="Times" w:cs="Times"/>
               <w:noProof/>
-              <w:sz w:val="24"/>
-              <w:szCs w:val="24"/>
               <w:lang w:eastAsia="pt-BR"/>
             </w:rPr>
           </w:pPr>
-          <w:hyperlink w:anchor="_Toc200439703" w:history="1">
+          <w:hyperlink w:anchor="_Toc201083638" w:history="1">
             <w:r>
               <w:rPr>
                 <w:rStyle w:val="Hyperlink"/>
+                <w:rFonts w:ascii="Times" w:hAnsi="Times" w:cs="Times"/>
                 <w:noProof/>
-                <w:color w:val="auto"/>
-                <w:sz w:val="24"/>
-                <w:szCs w:val="24"/>
-              </w:rPr>
-              <w:t>Ambientes Com Restrições De Memória.</w:t>
+              </w:rPr>
+              <w:t>Ambientes Com Restrições de Memória.</w:t>
             </w:r>
             <w:r>
               <w:rPr>
+                <w:rFonts w:ascii="Times" w:hAnsi="Times" w:cs="Times"/>
                 <w:noProof/>
                 <w:webHidden/>
-                <w:sz w:val="24"/>
-                <w:szCs w:val="24"/>
               </w:rPr>
               <w:tab/>
             </w:r>
             <w:r>
               <w:rPr>
+                <w:rFonts w:ascii="Times" w:hAnsi="Times" w:cs="Times"/>
                 <w:noProof/>
                 <w:webHidden/>
-                <w:sz w:val="24"/>
-                <w:szCs w:val="24"/>
               </w:rPr>
               <w:fldChar w:fldCharType="begin"/>
             </w:r>
             <w:r>
               <w:rPr>
+                <w:rFonts w:ascii="Times" w:hAnsi="Times" w:cs="Times"/>
                 <w:noProof/>
                 <w:webHidden/>
-                <w:sz w:val="24"/>
-                <w:szCs w:val="24"/>
-              </w:rPr>
-              <w:instrText xml:space="preserve"> PAGEREF _Toc200439703 \h </w:instrText>
+              </w:rPr>
+              <w:instrText xml:space="preserve"> PAGEREF _Toc201083638 \h </w:instrText>
             </w:r>
             <w:r>
               <w:rPr>
+                <w:rFonts w:ascii="Times" w:hAnsi="Times" w:cs="Times"/>
                 <w:noProof/>
                 <w:webHidden/>
-                <w:sz w:val="24"/>
-                <w:szCs w:val="24"/>
               </w:rPr>
             </w:r>
             <w:r>
               <w:rPr>
+                <w:rFonts w:ascii="Times" w:hAnsi="Times" w:cs="Times"/>
                 <w:noProof/>
                 <w:webHidden/>
-                <w:sz w:val="24"/>
-                <w:szCs w:val="24"/>
               </w:rPr>
               <w:fldChar w:fldCharType="separate"/>
             </w:r>
             <w:r>
               <w:rPr>
+                <w:rFonts w:ascii="Times" w:hAnsi="Times" w:cs="Times"/>
                 <w:noProof/>
                 <w:webHidden/>
-                <w:sz w:val="24"/>
-                <w:szCs w:val="24"/>
-              </w:rPr>
-              <w:t>7</w:t>
+              </w:rPr>
+              <w:t>10</w:t>
             </w:r>
             <w:r>
               <w:rPr>
+                <w:rFonts w:ascii="Times" w:hAnsi="Times" w:cs="Times"/>
                 <w:noProof/>
                 <w:webHidden/>
-                <w:sz w:val="24"/>
-                <w:szCs w:val="24"/>
               </w:rPr>
               <w:fldChar w:fldCharType="end"/>
             </w:r>
@@ -1061,85 +965,73 @@
             <w:tabs>
               <w:tab w:val="right" w:leader="dot" w:pos="9016"/>
             </w:tabs>
-            <w:jc w:val="both"/>
             <w:rPr>
-              <w:rFonts w:eastAsiaTheme="minorEastAsia"/>
+              <w:rFonts w:ascii="Times" w:eastAsiaTheme="minorEastAsia" w:hAnsi="Times" w:cs="Times"/>
               <w:noProof/>
-              <w:sz w:val="24"/>
-              <w:szCs w:val="24"/>
               <w:lang w:eastAsia="pt-BR"/>
             </w:rPr>
           </w:pPr>
-          <w:hyperlink w:anchor="_Toc200439704" w:history="1">
+          <w:hyperlink w:anchor="_Toc201083639" w:history="1">
             <w:r>
               <w:rPr>
                 <w:rStyle w:val="Hyperlink"/>
+                <w:rFonts w:ascii="Times" w:hAnsi="Times" w:cs="Times"/>
                 <w:noProof/>
-                <w:color w:val="auto"/>
-                <w:sz w:val="24"/>
-                <w:szCs w:val="24"/>
-              </w:rPr>
-              <w:t>Ideal para Grandes Volumes De Dados</w:t>
+              </w:rPr>
+              <w:t>Ideal para Volumes Consideráveis de Dados</w:t>
             </w:r>
             <w:r>
               <w:rPr>
+                <w:rFonts w:ascii="Times" w:hAnsi="Times" w:cs="Times"/>
                 <w:noProof/>
                 <w:webHidden/>
-                <w:sz w:val="24"/>
-                <w:szCs w:val="24"/>
               </w:rPr>
               <w:tab/>
             </w:r>
             <w:r>
               <w:rPr>
+                <w:rFonts w:ascii="Times" w:hAnsi="Times" w:cs="Times"/>
                 <w:noProof/>
                 <w:webHidden/>
-                <w:sz w:val="24"/>
-                <w:szCs w:val="24"/>
               </w:rPr>
               <w:fldChar w:fldCharType="begin"/>
             </w:r>
             <w:r>
               <w:rPr>
+                <w:rFonts w:ascii="Times" w:hAnsi="Times" w:cs="Times"/>
                 <w:noProof/>
                 <w:webHidden/>
-                <w:sz w:val="24"/>
-                <w:szCs w:val="24"/>
-              </w:rPr>
-              <w:instrText xml:space="preserve"> PAGEREF _Toc200439704 \h </w:instrText>
+              </w:rPr>
+              <w:instrText xml:space="preserve"> PAGEREF _Toc201083639 \h </w:instrText>
             </w:r>
             <w:r>
               <w:rPr>
+                <w:rFonts w:ascii="Times" w:hAnsi="Times" w:cs="Times"/>
                 <w:noProof/>
                 <w:webHidden/>
-                <w:sz w:val="24"/>
-                <w:szCs w:val="24"/>
               </w:rPr>
             </w:r>
             <w:r>
               <w:rPr>
+                <w:rFonts w:ascii="Times" w:hAnsi="Times" w:cs="Times"/>
                 <w:noProof/>
                 <w:webHidden/>
-                <w:sz w:val="24"/>
-                <w:szCs w:val="24"/>
               </w:rPr>
               <w:fldChar w:fldCharType="separate"/>
             </w:r>
             <w:r>
               <w:rPr>
+                <w:rFonts w:ascii="Times" w:hAnsi="Times" w:cs="Times"/>
                 <w:noProof/>
                 <w:webHidden/>
-                <w:sz w:val="24"/>
-                <w:szCs w:val="24"/>
-              </w:rPr>
-              <w:t>7</w:t>
+              </w:rPr>
+              <w:t>10</w:t>
             </w:r>
             <w:r>
               <w:rPr>
+                <w:rFonts w:ascii="Times" w:hAnsi="Times" w:cs="Times"/>
                 <w:noProof/>
                 <w:webHidden/>
-                <w:sz w:val="24"/>
-                <w:szCs w:val="24"/>
               </w:rPr>
               <w:fldChar w:fldCharType="end"/>
             </w:r>
@@ -1151,86 +1043,73 @@
             <w:tabs>
               <w:tab w:val="right" w:leader="dot" w:pos="9016"/>
             </w:tabs>
-            <w:jc w:val="both"/>
             <w:rPr>
-              <w:rFonts w:eastAsiaTheme="minorEastAsia"/>
+              <w:rFonts w:ascii="Times" w:eastAsiaTheme="minorEastAsia" w:hAnsi="Times" w:cs="Times"/>
               <w:noProof/>
-              <w:sz w:val="24"/>
-              <w:szCs w:val="24"/>
               <w:lang w:eastAsia="pt-BR"/>
             </w:rPr>
           </w:pPr>
-          <w:hyperlink w:anchor="_Toc200439705" w:history="1">
+          <w:hyperlink w:anchor="_Toc201083640" w:history="1">
             <w:r>
               <w:rPr>
                 <w:rStyle w:val="Hyperlink"/>
                 <w:rFonts w:ascii="Times" w:hAnsi="Times" w:cs="Times"/>
                 <w:noProof/>
-                <w:color w:val="auto"/>
-                <w:sz w:val="24"/>
-                <w:szCs w:val="24"/>
-              </w:rPr>
-              <w:t>Estabilidade Do Algoritmo.</w:t>
+              </w:rPr>
+              <w:t>Estabilidade do Algoritmo</w:t>
             </w:r>
             <w:r>
               <w:rPr>
+                <w:rFonts w:ascii="Times" w:hAnsi="Times" w:cs="Times"/>
                 <w:noProof/>
                 <w:webHidden/>
-                <w:sz w:val="24"/>
-                <w:szCs w:val="24"/>
               </w:rPr>
               <w:tab/>
             </w:r>
             <w:r>
               <w:rPr>
+                <w:rFonts w:ascii="Times" w:hAnsi="Times" w:cs="Times"/>
                 <w:noProof/>
                 <w:webHidden/>
-                <w:sz w:val="24"/>
-                <w:szCs w:val="24"/>
               </w:rPr>
               <w:fldChar w:fldCharType="begin"/>
             </w:r>
             <w:r>
               <w:rPr>
+                <w:rFonts w:ascii="Times" w:hAnsi="Times" w:cs="Times"/>
                 <w:noProof/>
                 <w:webHidden/>
-                <w:sz w:val="24"/>
-                <w:szCs w:val="24"/>
-              </w:rPr>
-              <w:instrText xml:space="preserve"> PAGEREF _Toc200439705 \h </w:instrText>
+              </w:rPr>
+              <w:instrText xml:space="preserve"> PAGEREF _Toc201083640 \h </w:instrText>
             </w:r>
             <w:r>
               <w:rPr>
+                <w:rFonts w:ascii="Times" w:hAnsi="Times" w:cs="Times"/>
                 <w:noProof/>
                 <w:webHidden/>
-                <w:sz w:val="24"/>
-                <w:szCs w:val="24"/>
               </w:rPr>
             </w:r>
             <w:r>
               <w:rPr>
+                <w:rFonts w:ascii="Times" w:hAnsi="Times" w:cs="Times"/>
                 <w:noProof/>
                 <w:webHidden/>
-                <w:sz w:val="24"/>
-                <w:szCs w:val="24"/>
               </w:rPr>
               <w:fldChar w:fldCharType="separate"/>
             </w:r>
             <w:r>
               <w:rPr>
+                <w:rFonts w:ascii="Times" w:hAnsi="Times" w:cs="Times"/>
                 <w:noProof/>
                 <w:webHidden/>
-                <w:sz w:val="24"/>
-                <w:szCs w:val="24"/>
-              </w:rPr>
-              <w:t>8</w:t>
+              </w:rPr>
+              <w:t>11</w:t>
             </w:r>
             <w:r>
               <w:rPr>
+                <w:rFonts w:ascii="Times" w:hAnsi="Times" w:cs="Times"/>
                 <w:noProof/>
                 <w:webHidden/>
-                <w:sz w:val="24"/>
-                <w:szCs w:val="24"/>
               </w:rPr>
               <w:fldChar w:fldCharType="end"/>
             </w:r>
@@ -1242,86 +1121,229 @@
             <w:tabs>
               <w:tab w:val="right" w:leader="dot" w:pos="9016"/>
             </w:tabs>
-            <w:jc w:val="both"/>
             <w:rPr>
-              <w:rFonts w:eastAsiaTheme="minorEastAsia"/>
+              <w:rFonts w:ascii="Times" w:eastAsiaTheme="minorEastAsia" w:hAnsi="Times" w:cs="Times"/>
               <w:noProof/>
-              <w:sz w:val="24"/>
-              <w:szCs w:val="24"/>
               <w:lang w:eastAsia="pt-BR"/>
             </w:rPr>
           </w:pPr>
-          <w:hyperlink w:anchor="_Toc200439706" w:history="1">
+          <w:hyperlink w:anchor="_Toc201083641" w:history="1">
             <w:r>
               <w:rPr>
                 <w:rStyle w:val="Hyperlink"/>
                 <w:rFonts w:ascii="Times" w:hAnsi="Times" w:cs="Times"/>
                 <w:noProof/>
-                <w:color w:val="auto"/>
-                <w:sz w:val="24"/>
-                <w:szCs w:val="24"/>
-              </w:rPr>
-              <w:t>Limitações Do Algoritmo.</w:t>
+              </w:rPr>
+              <w:t>Limitações do Algoritmo</w:t>
             </w:r>
             <w:r>
               <w:rPr>
+                <w:rFonts w:ascii="Times" w:hAnsi="Times" w:cs="Times"/>
                 <w:noProof/>
                 <w:webHidden/>
-                <w:sz w:val="24"/>
-                <w:szCs w:val="24"/>
               </w:rPr>
               <w:tab/>
             </w:r>
             <w:r>
               <w:rPr>
+                <w:rFonts w:ascii="Times" w:hAnsi="Times" w:cs="Times"/>
                 <w:noProof/>
                 <w:webHidden/>
-                <w:sz w:val="24"/>
-                <w:szCs w:val="24"/>
               </w:rPr>
               <w:fldChar w:fldCharType="begin"/>
             </w:r>
             <w:r>
               <w:rPr>
+                <w:rFonts w:ascii="Times" w:hAnsi="Times" w:cs="Times"/>
                 <w:noProof/>
                 <w:webHidden/>
-                <w:sz w:val="24"/>
-                <w:szCs w:val="24"/>
-              </w:rPr>
-              <w:instrText xml:space="preserve"> PAGEREF _Toc200439706 \h </w:instrText>
+              </w:rPr>
+              <w:instrText xml:space="preserve"> PAGEREF _Toc201083641 \h </w:instrText>
             </w:r>
             <w:r>
               <w:rPr>
+                <w:rFonts w:ascii="Times" w:hAnsi="Times" w:cs="Times"/>
                 <w:noProof/>
                 <w:webHidden/>
-                <w:sz w:val="24"/>
-                <w:szCs w:val="24"/>
               </w:rPr>
             </w:r>
             <w:r>
               <w:rPr>
+                <w:rFonts w:ascii="Times" w:hAnsi="Times" w:cs="Times"/>
                 <w:noProof/>
                 <w:webHidden/>
-                <w:sz w:val="24"/>
-                <w:szCs w:val="24"/>
               </w:rPr>
               <w:fldChar w:fldCharType="separate"/>
             </w:r>
             <w:r>
               <w:rPr>
+                <w:rFonts w:ascii="Times" w:hAnsi="Times" w:cs="Times"/>
                 <w:noProof/>
                 <w:webHidden/>
-                <w:sz w:val="24"/>
-                <w:szCs w:val="24"/>
-              </w:rPr>
-              <w:t>8</w:t>
+              </w:rPr>
+              <w:t>11</w:t>
             </w:r>
             <w:r>
               <w:rPr>
+                <w:rFonts w:ascii="Times" w:hAnsi="Times" w:cs="Times"/>
                 <w:noProof/>
                 <w:webHidden/>
-                <w:sz w:val="24"/>
-                <w:szCs w:val="24"/>
+              </w:rPr>
+              <w:fldChar w:fldCharType="end"/>
+            </w:r>
+          </w:hyperlink>
+        </w:p>
+        <w:p>
+          <w:pPr>
+            <w:pStyle w:val="Sumrio3"/>
+            <w:tabs>
+              <w:tab w:val="right" w:leader="dot" w:pos="9016"/>
+            </w:tabs>
+            <w:rPr>
+              <w:rFonts w:ascii="Times" w:eastAsiaTheme="minorEastAsia" w:hAnsi="Times" w:cs="Times"/>
+              <w:noProof/>
+              <w:lang w:eastAsia="pt-BR"/>
+            </w:rPr>
+          </w:pPr>
+          <w:hyperlink w:anchor="_Toc201083642" w:history="1">
+            <w:r>
+              <w:rPr>
+                <w:rStyle w:val="Hyperlink"/>
+                <w:rFonts w:ascii="Times" w:hAnsi="Times" w:cs="Times"/>
+                <w:noProof/>
+              </w:rPr>
+              <w:t>Instabilidade</w:t>
+            </w:r>
+            <w:r>
+              <w:rPr>
+                <w:rFonts w:ascii="Times" w:hAnsi="Times" w:cs="Times"/>
+                <w:noProof/>
+                <w:webHidden/>
+              </w:rPr>
+              <w:tab/>
+            </w:r>
+            <w:r>
+              <w:rPr>
+                <w:rFonts w:ascii="Times" w:hAnsi="Times" w:cs="Times"/>
+                <w:noProof/>
+                <w:webHidden/>
+              </w:rPr>
+              <w:fldChar w:fldCharType="begin"/>
+            </w:r>
+            <w:r>
+              <w:rPr>
+                <w:rFonts w:ascii="Times" w:hAnsi="Times" w:cs="Times"/>
+                <w:noProof/>
+                <w:webHidden/>
+              </w:rPr>
+              <w:instrText xml:space="preserve"> PAGEREF _Toc201083642 \h </w:instrText>
+            </w:r>
+            <w:r>
+              <w:rPr>
+                <w:rFonts w:ascii="Times" w:hAnsi="Times" w:cs="Times"/>
+                <w:noProof/>
+                <w:webHidden/>
+              </w:rPr>
+            </w:r>
+            <w:r>
+              <w:rPr>
+                <w:rFonts w:ascii="Times" w:hAnsi="Times" w:cs="Times"/>
+                <w:noProof/>
+                <w:webHidden/>
+              </w:rPr>
+              <w:fldChar w:fldCharType="separate"/>
+            </w:r>
+            <w:r>
+              <w:rPr>
+                <w:rFonts w:ascii="Times" w:hAnsi="Times" w:cs="Times"/>
+                <w:noProof/>
+                <w:webHidden/>
+              </w:rPr>
+              <w:t>11</w:t>
+            </w:r>
+            <w:r>
+              <w:rPr>
+                <w:rFonts w:ascii="Times" w:hAnsi="Times" w:cs="Times"/>
+                <w:noProof/>
+                <w:webHidden/>
+              </w:rPr>
+              <w:fldChar w:fldCharType="end"/>
+            </w:r>
+          </w:hyperlink>
+        </w:p>
+        <w:p>
+          <w:pPr>
+            <w:pStyle w:val="Sumrio3"/>
+            <w:tabs>
+              <w:tab w:val="right" w:leader="dot" w:pos="9016"/>
+            </w:tabs>
+            <w:rPr>
+              <w:rFonts w:ascii="Times" w:eastAsiaTheme="minorEastAsia" w:hAnsi="Times" w:cs="Times"/>
+              <w:noProof/>
+              <w:lang w:eastAsia="pt-BR"/>
+            </w:rPr>
+          </w:pPr>
+          <w:hyperlink w:anchor="_Toc201083643" w:history="1">
+            <w:r>
+              <w:rPr>
+                <w:rStyle w:val="Hyperlink"/>
+                <w:rFonts w:ascii="Times" w:hAnsi="Times" w:cs="Times"/>
+                <w:noProof/>
+              </w:rPr>
+              <w:t>Não Ideal para Conjuntos de Dados Pequenos</w:t>
+            </w:r>
+            <w:r>
+              <w:rPr>
+                <w:rFonts w:ascii="Times" w:hAnsi="Times" w:cs="Times"/>
+                <w:noProof/>
+                <w:webHidden/>
+              </w:rPr>
+              <w:tab/>
+            </w:r>
+            <w:r>
+              <w:rPr>
+                <w:rFonts w:ascii="Times" w:hAnsi="Times" w:cs="Times"/>
+                <w:noProof/>
+                <w:webHidden/>
+              </w:rPr>
+              <w:fldChar w:fldCharType="begin"/>
+            </w:r>
+            <w:r>
+              <w:rPr>
+                <w:rFonts w:ascii="Times" w:hAnsi="Times" w:cs="Times"/>
+                <w:noProof/>
+                <w:webHidden/>
+              </w:rPr>
+              <w:instrText xml:space="preserve"> PAGEREF _Toc201083643 \h </w:instrText>
+            </w:r>
+            <w:r>
+              <w:rPr>
+                <w:rFonts w:ascii="Times" w:hAnsi="Times" w:cs="Times"/>
+                <w:noProof/>
+                <w:webHidden/>
+              </w:rPr>
+            </w:r>
+            <w:r>
+              <w:rPr>
+                <w:rFonts w:ascii="Times" w:hAnsi="Times" w:cs="Times"/>
+                <w:noProof/>
+                <w:webHidden/>
+              </w:rPr>
+              <w:fldChar w:fldCharType="separate"/>
+            </w:r>
+            <w:r>
+              <w:rPr>
+                <w:rFonts w:ascii="Times" w:hAnsi="Times" w:cs="Times"/>
+                <w:noProof/>
+                <w:webHidden/>
+              </w:rPr>
+              <w:t>11</w:t>
+            </w:r>
+            <w:r>
+              <w:rPr>
+                <w:rFonts w:ascii="Times" w:hAnsi="Times" w:cs="Times"/>
+                <w:noProof/>
+                <w:webHidden/>
               </w:rPr>
               <w:fldChar w:fldCharType="end"/>
             </w:r>
@@ -1333,86 +1355,73 @@
             <w:tabs>
               <w:tab w:val="right" w:leader="dot" w:pos="9016"/>
             </w:tabs>
-            <w:jc w:val="both"/>
             <w:rPr>
-              <w:rFonts w:eastAsiaTheme="minorEastAsia"/>
+              <w:rFonts w:ascii="Times" w:eastAsiaTheme="minorEastAsia" w:hAnsi="Times" w:cs="Times"/>
               <w:noProof/>
-              <w:sz w:val="24"/>
-              <w:szCs w:val="24"/>
               <w:lang w:eastAsia="pt-BR"/>
             </w:rPr>
           </w:pPr>
-          <w:hyperlink w:anchor="_Toc200439707" w:history="1">
+          <w:hyperlink w:anchor="_Toc201083644" w:history="1">
             <w:r>
               <w:rPr>
                 <w:rStyle w:val="Hyperlink"/>
                 <w:rFonts w:ascii="Times" w:hAnsi="Times" w:cs="Times"/>
                 <w:noProof/>
-                <w:color w:val="auto"/>
-                <w:sz w:val="24"/>
-                <w:szCs w:val="24"/>
               </w:rPr>
               <w:t>Exemplos de Como O Processo de Ordenação Acontece.</w:t>
             </w:r>
             <w:r>
               <w:rPr>
+                <w:rFonts w:ascii="Times" w:hAnsi="Times" w:cs="Times"/>
                 <w:noProof/>
                 <w:webHidden/>
-                <w:sz w:val="24"/>
-                <w:szCs w:val="24"/>
               </w:rPr>
               <w:tab/>
             </w:r>
             <w:r>
               <w:rPr>
+                <w:rFonts w:ascii="Times" w:hAnsi="Times" w:cs="Times"/>
                 <w:noProof/>
                 <w:webHidden/>
-                <w:sz w:val="24"/>
-                <w:szCs w:val="24"/>
               </w:rPr>
               <w:fldChar w:fldCharType="begin"/>
             </w:r>
             <w:r>
               <w:rPr>
+                <w:rFonts w:ascii="Times" w:hAnsi="Times" w:cs="Times"/>
                 <w:noProof/>
                 <w:webHidden/>
-                <w:sz w:val="24"/>
-                <w:szCs w:val="24"/>
-              </w:rPr>
-              <w:instrText xml:space="preserve"> PAGEREF _Toc200439707 \h </w:instrText>
+              </w:rPr>
+              <w:instrText xml:space="preserve"> PAGEREF _Toc201083644 \h </w:instrText>
             </w:r>
             <w:r>
               <w:rPr>
+                <w:rFonts w:ascii="Times" w:hAnsi="Times" w:cs="Times"/>
                 <w:noProof/>
                 <w:webHidden/>
-                <w:sz w:val="24"/>
-                <w:szCs w:val="24"/>
               </w:rPr>
             </w:r>
             <w:r>
               <w:rPr>
+                <w:rFonts w:ascii="Times" w:hAnsi="Times" w:cs="Times"/>
                 <w:noProof/>
                 <w:webHidden/>
-                <w:sz w:val="24"/>
-                <w:szCs w:val="24"/>
               </w:rPr>
               <w:fldChar w:fldCharType="separate"/>
             </w:r>
             <w:r>
               <w:rPr>
+                <w:rFonts w:ascii="Times" w:hAnsi="Times" w:cs="Times"/>
                 <w:noProof/>
                 <w:webHidden/>
-                <w:sz w:val="24"/>
-                <w:szCs w:val="24"/>
-              </w:rPr>
-              <w:t>8</w:t>
+              </w:rPr>
+              <w:t>11</w:t>
             </w:r>
             <w:r>
               <w:rPr>
+                <w:rFonts w:ascii="Times" w:hAnsi="Times" w:cs="Times"/>
                 <w:noProof/>
                 <w:webHidden/>
-                <w:sz w:val="24"/>
-                <w:szCs w:val="24"/>
               </w:rPr>
               <w:fldChar w:fldCharType="end"/>
             </w:r>
@@ -1425,33 +1434,25 @@
               <w:tab w:val="left" w:pos="440"/>
               <w:tab w:val="right" w:leader="dot" w:pos="9016"/>
             </w:tabs>
-            <w:jc w:val="both"/>
             <w:rPr>
-              <w:rFonts w:eastAsiaTheme="minorEastAsia"/>
+              <w:rFonts w:ascii="Times" w:eastAsiaTheme="minorEastAsia" w:hAnsi="Times" w:cs="Times"/>
               <w:noProof/>
-              <w:sz w:val="24"/>
-              <w:szCs w:val="24"/>
               <w:lang w:eastAsia="pt-BR"/>
             </w:rPr>
           </w:pPr>
-          <w:hyperlink w:anchor="_Toc200439708" w:history="1">
+          <w:hyperlink w:anchor="_Toc201083645" w:history="1">
             <w:r>
               <w:rPr>
                 <w:rStyle w:val="Hyperlink"/>
                 <w:rFonts w:ascii="Times" w:hAnsi="Times" w:cs="Times"/>
                 <w:noProof/>
-                <w:color w:val="auto"/>
-                <w:sz w:val="24"/>
-                <w:szCs w:val="24"/>
               </w:rPr>
               <w:t>4.</w:t>
             </w:r>
             <w:r>
               <w:rPr>
-                <w:rFonts w:eastAsiaTheme="minorEastAsia"/>
+                <w:rFonts w:ascii="Times" w:eastAsiaTheme="minorEastAsia" w:hAnsi="Times" w:cs="Times"/>
                 <w:noProof/>
-                <w:sz w:val="24"/>
-                <w:szCs w:val="24"/>
                 <w:lang w:eastAsia="pt-BR"/>
               </w:rPr>
               <w:tab/>
@@ -1461,71 +1462,61 @@
                 <w:rStyle w:val="Hyperlink"/>
                 <w:rFonts w:ascii="Times" w:hAnsi="Times" w:cs="Times"/>
                 <w:noProof/>
-                <w:color w:val="auto"/>
-                <w:sz w:val="24"/>
-                <w:szCs w:val="24"/>
               </w:rPr>
               <w:t>Implementação e Testes</w:t>
             </w:r>
             <w:r>
               <w:rPr>
+                <w:rFonts w:ascii="Times" w:hAnsi="Times" w:cs="Times"/>
                 <w:noProof/>
                 <w:webHidden/>
-                <w:sz w:val="24"/>
-                <w:szCs w:val="24"/>
               </w:rPr>
               <w:tab/>
             </w:r>
             <w:r>
               <w:rPr>
+                <w:rFonts w:ascii="Times" w:hAnsi="Times" w:cs="Times"/>
                 <w:noProof/>
                 <w:webHidden/>
-                <w:sz w:val="24"/>
-                <w:szCs w:val="24"/>
               </w:rPr>
               <w:fldChar w:fldCharType="begin"/>
             </w:r>
             <w:r>
               <w:rPr>
+                <w:rFonts w:ascii="Times" w:hAnsi="Times" w:cs="Times"/>
                 <w:noProof/>
                 <w:webHidden/>
-                <w:sz w:val="24"/>
-                <w:szCs w:val="24"/>
-              </w:rPr>
-              <w:instrText xml:space="preserve"> PAGEREF _Toc200439708 \h </w:instrText>
+              </w:rPr>
+              <w:instrText xml:space="preserve"> PAGEREF _Toc201083645 \h </w:instrText>
             </w:r>
             <w:r>
               <w:rPr>
+                <w:rFonts w:ascii="Times" w:hAnsi="Times" w:cs="Times"/>
                 <w:noProof/>
                 <w:webHidden/>
-                <w:sz w:val="24"/>
-                <w:szCs w:val="24"/>
               </w:rPr>
             </w:r>
             <w:r>
               <w:rPr>
+                <w:rFonts w:ascii="Times" w:hAnsi="Times" w:cs="Times"/>
                 <w:noProof/>
                 <w:webHidden/>
-                <w:sz w:val="24"/>
-                <w:szCs w:val="24"/>
               </w:rPr>
               <w:fldChar w:fldCharType="separate"/>
             </w:r>
             <w:r>
               <w:rPr>
+                <w:rFonts w:ascii="Times" w:hAnsi="Times" w:cs="Times"/>
                 <w:noProof/>
                 <w:webHidden/>
-                <w:sz w:val="24"/>
-                <w:szCs w:val="24"/>
-              </w:rPr>
-              <w:t>10</w:t>
+              </w:rPr>
+              <w:t>13</w:t>
             </w:r>
             <w:r>
               <w:rPr>
+                <w:rFonts w:ascii="Times" w:hAnsi="Times" w:cs="Times"/>
                 <w:noProof/>
                 <w:webHidden/>
-                <w:sz w:val="24"/>
-                <w:szCs w:val="24"/>
               </w:rPr>
               <w:fldChar w:fldCharType="end"/>
             </w:r>
@@ -1537,85 +1528,73 @@
             <w:tabs>
               <w:tab w:val="right" w:leader="dot" w:pos="9016"/>
             </w:tabs>
-            <w:jc w:val="both"/>
             <w:rPr>
-              <w:rFonts w:eastAsiaTheme="minorEastAsia"/>
+              <w:rFonts w:ascii="Times" w:eastAsiaTheme="minorEastAsia" w:hAnsi="Times" w:cs="Times"/>
               <w:noProof/>
-              <w:sz w:val="24"/>
-              <w:szCs w:val="24"/>
               <w:lang w:eastAsia="pt-BR"/>
             </w:rPr>
           </w:pPr>
-          <w:hyperlink w:anchor="_Toc200439709" w:history="1">
+          <w:hyperlink w:anchor="_Toc201083646" w:history="1">
             <w:r>
               <w:rPr>
                 <w:rStyle w:val="Hyperlink"/>
+                <w:rFonts w:ascii="Times" w:hAnsi="Times" w:cs="Times"/>
                 <w:noProof/>
-                <w:color w:val="auto"/>
-                <w:sz w:val="24"/>
-                <w:szCs w:val="24"/>
-              </w:rPr>
-              <w:t>Detalhamento da implementação e decisões tomadas durante a construção do algoritmo.</w:t>
+              </w:rPr>
+              <w:t>Detalhamento da Implementação E Decisões Tomadas Durante A Construção do Algoritmo.</w:t>
             </w:r>
             <w:r>
               <w:rPr>
+                <w:rFonts w:ascii="Times" w:hAnsi="Times" w:cs="Times"/>
                 <w:noProof/>
                 <w:webHidden/>
-                <w:sz w:val="24"/>
-                <w:szCs w:val="24"/>
               </w:rPr>
               <w:tab/>
             </w:r>
             <w:r>
               <w:rPr>
+                <w:rFonts w:ascii="Times" w:hAnsi="Times" w:cs="Times"/>
                 <w:noProof/>
                 <w:webHidden/>
-                <w:sz w:val="24"/>
-                <w:szCs w:val="24"/>
               </w:rPr>
               <w:fldChar w:fldCharType="begin"/>
             </w:r>
             <w:r>
               <w:rPr>
+                <w:rFonts w:ascii="Times" w:hAnsi="Times" w:cs="Times"/>
                 <w:noProof/>
                 <w:webHidden/>
-                <w:sz w:val="24"/>
-                <w:szCs w:val="24"/>
-              </w:rPr>
-              <w:instrText xml:space="preserve"> PAGEREF _Toc200439709 \h </w:instrText>
+              </w:rPr>
+              <w:instrText xml:space="preserve"> PAGEREF _Toc201083646 \h </w:instrText>
             </w:r>
             <w:r>
               <w:rPr>
+                <w:rFonts w:ascii="Times" w:hAnsi="Times" w:cs="Times"/>
                 <w:noProof/>
                 <w:webHidden/>
-                <w:sz w:val="24"/>
-                <w:szCs w:val="24"/>
               </w:rPr>
             </w:r>
             <w:r>
               <w:rPr>
+                <w:rFonts w:ascii="Times" w:hAnsi="Times" w:cs="Times"/>
                 <w:noProof/>
                 <w:webHidden/>
-                <w:sz w:val="24"/>
-                <w:szCs w:val="24"/>
               </w:rPr>
               <w:fldChar w:fldCharType="separate"/>
             </w:r>
             <w:r>
               <w:rPr>
+                <w:rFonts w:ascii="Times" w:hAnsi="Times" w:cs="Times"/>
                 <w:noProof/>
                 <w:webHidden/>
-                <w:sz w:val="24"/>
-                <w:szCs w:val="24"/>
-              </w:rPr>
-              <w:t>10</w:t>
+              </w:rPr>
+              <w:t>13</w:t>
             </w:r>
             <w:r>
               <w:rPr>
+                <w:rFonts w:ascii="Times" w:hAnsi="Times" w:cs="Times"/>
                 <w:noProof/>
                 <w:webHidden/>
-                <w:sz w:val="24"/>
-                <w:szCs w:val="24"/>
               </w:rPr>
               <w:fldChar w:fldCharType="end"/>
             </w:r>
@@ -1627,85 +1606,73 @@
             <w:tabs>
               <w:tab w:val="right" w:leader="dot" w:pos="9016"/>
             </w:tabs>
-            <w:jc w:val="both"/>
             <w:rPr>
-              <w:rFonts w:eastAsiaTheme="minorEastAsia"/>
+              <w:rFonts w:ascii="Times" w:eastAsiaTheme="minorEastAsia" w:hAnsi="Times" w:cs="Times"/>
               <w:noProof/>
-              <w:sz w:val="24"/>
-              <w:szCs w:val="24"/>
               <w:lang w:eastAsia="pt-BR"/>
             </w:rPr>
           </w:pPr>
-          <w:hyperlink w:anchor="_Toc200439710" w:history="1">
+          <w:hyperlink w:anchor="_Toc201083647" w:history="1">
             <w:r>
               <w:rPr>
                 <w:rStyle w:val="Hyperlink"/>
+                <w:rFonts w:ascii="Times" w:hAnsi="Times" w:cs="Times"/>
                 <w:noProof/>
-                <w:color w:val="auto"/>
-                <w:sz w:val="24"/>
-                <w:szCs w:val="24"/>
-              </w:rPr>
-              <w:t>Algoritmo da obra Estrutura de Dados Usando C</w:t>
+              </w:rPr>
+              <w:t>Algoritmo da Obra Estrutura De Dados Usando C</w:t>
             </w:r>
             <w:r>
               <w:rPr>
+                <w:rFonts w:ascii="Times" w:hAnsi="Times" w:cs="Times"/>
                 <w:noProof/>
                 <w:webHidden/>
-                <w:sz w:val="24"/>
-                <w:szCs w:val="24"/>
               </w:rPr>
               <w:tab/>
             </w:r>
             <w:r>
               <w:rPr>
+                <w:rFonts w:ascii="Times" w:hAnsi="Times" w:cs="Times"/>
                 <w:noProof/>
                 <w:webHidden/>
-                <w:sz w:val="24"/>
-                <w:szCs w:val="24"/>
               </w:rPr>
               <w:fldChar w:fldCharType="begin"/>
             </w:r>
             <w:r>
               <w:rPr>
+                <w:rFonts w:ascii="Times" w:hAnsi="Times" w:cs="Times"/>
                 <w:noProof/>
                 <w:webHidden/>
-                <w:sz w:val="24"/>
-                <w:szCs w:val="24"/>
-              </w:rPr>
-              <w:instrText xml:space="preserve"> PAGEREF _Toc200439710 \h </w:instrText>
+              </w:rPr>
+              <w:instrText xml:space="preserve"> PAGEREF _Toc201083647 \h </w:instrText>
             </w:r>
             <w:r>
               <w:rPr>
+                <w:rFonts w:ascii="Times" w:hAnsi="Times" w:cs="Times"/>
                 <w:noProof/>
                 <w:webHidden/>
-                <w:sz w:val="24"/>
-                <w:szCs w:val="24"/>
               </w:rPr>
             </w:r>
             <w:r>
               <w:rPr>
+                <w:rFonts w:ascii="Times" w:hAnsi="Times" w:cs="Times"/>
                 <w:noProof/>
                 <w:webHidden/>
-                <w:sz w:val="24"/>
-                <w:szCs w:val="24"/>
               </w:rPr>
               <w:fldChar w:fldCharType="separate"/>
             </w:r>
             <w:r>
               <w:rPr>
+                <w:rFonts w:ascii="Times" w:hAnsi="Times" w:cs="Times"/>
                 <w:noProof/>
                 <w:webHidden/>
-                <w:sz w:val="24"/>
-                <w:szCs w:val="24"/>
-              </w:rPr>
-              <w:t>10</w:t>
+              </w:rPr>
+              <w:t>13</w:t>
             </w:r>
             <w:r>
               <w:rPr>
+                <w:rFonts w:ascii="Times" w:hAnsi="Times" w:cs="Times"/>
                 <w:noProof/>
                 <w:webHidden/>
-                <w:sz w:val="24"/>
-                <w:szCs w:val="24"/>
               </w:rPr>
               <w:fldChar w:fldCharType="end"/>
             </w:r>
@@ -1717,85 +1684,230 @@
             <w:tabs>
               <w:tab w:val="right" w:leader="dot" w:pos="9016"/>
             </w:tabs>
-            <w:jc w:val="both"/>
             <w:rPr>
-              <w:rFonts w:eastAsiaTheme="minorEastAsia"/>
+              <w:rFonts w:ascii="Times" w:eastAsiaTheme="minorEastAsia" w:hAnsi="Times" w:cs="Times"/>
               <w:noProof/>
-              <w:sz w:val="24"/>
-              <w:szCs w:val="24"/>
               <w:lang w:eastAsia="pt-BR"/>
             </w:rPr>
           </w:pPr>
-          <w:hyperlink w:anchor="_Toc200439711" w:history="1">
+          <w:hyperlink w:anchor="_Toc201083648" w:history="1">
             <w:r>
               <w:rPr>
                 <w:rStyle w:val="Hyperlink"/>
+                <w:rFonts w:ascii="Times" w:hAnsi="Times" w:cs="Times"/>
                 <w:noProof/>
-                <w:color w:val="auto"/>
-                <w:sz w:val="24"/>
-                <w:szCs w:val="24"/>
-              </w:rPr>
-              <w:t>Algoritmo do site Programmiz</w:t>
+              </w:rPr>
+              <w:t>Algoritmo de Amit G. Maru</w:t>
             </w:r>
             <w:r>
               <w:rPr>
+                <w:rFonts w:ascii="Times" w:hAnsi="Times" w:cs="Times"/>
                 <w:noProof/>
                 <w:webHidden/>
-                <w:sz w:val="24"/>
-                <w:szCs w:val="24"/>
               </w:rPr>
               <w:tab/>
             </w:r>
             <w:r>
               <w:rPr>
+                <w:rFonts w:ascii="Times" w:hAnsi="Times" w:cs="Times"/>
                 <w:noProof/>
                 <w:webHidden/>
-                <w:sz w:val="24"/>
-                <w:szCs w:val="24"/>
               </w:rPr>
               <w:fldChar w:fldCharType="begin"/>
             </w:r>
             <w:r>
               <w:rPr>
+                <w:rFonts w:ascii="Times" w:hAnsi="Times" w:cs="Times"/>
                 <w:noProof/>
                 <w:webHidden/>
-                <w:sz w:val="24"/>
-                <w:szCs w:val="24"/>
-              </w:rPr>
-              <w:instrText xml:space="preserve"> PAGEREF _Toc200439711 \h </w:instrText>
+              </w:rPr>
+              <w:instrText xml:space="preserve"> PAGEREF _Toc201083648 \h </w:instrText>
             </w:r>
             <w:r>
               <w:rPr>
+                <w:rFonts w:ascii="Times" w:hAnsi="Times" w:cs="Times"/>
                 <w:noProof/>
                 <w:webHidden/>
-                <w:sz w:val="24"/>
-                <w:szCs w:val="24"/>
               </w:rPr>
             </w:r>
             <w:r>
               <w:rPr>
+                <w:rFonts w:ascii="Times" w:hAnsi="Times" w:cs="Times"/>
                 <w:noProof/>
                 <w:webHidden/>
-                <w:sz w:val="24"/>
-                <w:szCs w:val="24"/>
               </w:rPr>
               <w:fldChar w:fldCharType="separate"/>
             </w:r>
             <w:r>
               <w:rPr>
+                <w:rFonts w:ascii="Times" w:hAnsi="Times" w:cs="Times"/>
                 <w:noProof/>
                 <w:webHidden/>
-                <w:sz w:val="24"/>
-                <w:szCs w:val="24"/>
               </w:rPr>
               <w:t>18</w:t>
             </w:r>
             <w:r>
               <w:rPr>
+                <w:rFonts w:ascii="Times" w:hAnsi="Times" w:cs="Times"/>
                 <w:noProof/>
                 <w:webHidden/>
-                <w:sz w:val="24"/>
-                <w:szCs w:val="24"/>
+              </w:rPr>
+              <w:fldChar w:fldCharType="end"/>
+            </w:r>
+          </w:hyperlink>
+        </w:p>
+        <w:p>
+          <w:pPr>
+            <w:pStyle w:val="Sumrio3"/>
+            <w:tabs>
+              <w:tab w:val="right" w:leader="dot" w:pos="9016"/>
+            </w:tabs>
+            <w:rPr>
+              <w:rFonts w:ascii="Times" w:eastAsiaTheme="minorEastAsia" w:hAnsi="Times" w:cs="Times"/>
+              <w:noProof/>
+              <w:lang w:eastAsia="pt-BR"/>
+            </w:rPr>
+          </w:pPr>
+          <w:hyperlink w:anchor="_Toc201083649" w:history="1">
+            <w:r>
+              <w:rPr>
+                <w:rStyle w:val="Hyperlink"/>
+                <w:rFonts w:ascii="Times" w:hAnsi="Times" w:cs="Times"/>
+                <w:noProof/>
+                <w:lang w:val="en-US"/>
+              </w:rPr>
+              <w:t>Algoritmo do Site GeeksForGeeks</w:t>
+            </w:r>
+            <w:r>
+              <w:rPr>
+                <w:rFonts w:ascii="Times" w:hAnsi="Times" w:cs="Times"/>
+                <w:noProof/>
+                <w:webHidden/>
+              </w:rPr>
+              <w:tab/>
+            </w:r>
+            <w:r>
+              <w:rPr>
+                <w:rFonts w:ascii="Times" w:hAnsi="Times" w:cs="Times"/>
+                <w:noProof/>
+                <w:webHidden/>
+              </w:rPr>
+              <w:fldChar w:fldCharType="begin"/>
+            </w:r>
+            <w:r>
+              <w:rPr>
+                <w:rFonts w:ascii="Times" w:hAnsi="Times" w:cs="Times"/>
+                <w:noProof/>
+                <w:webHidden/>
+              </w:rPr>
+              <w:instrText xml:space="preserve"> PAGEREF _Toc201083649 \h </w:instrText>
+            </w:r>
+            <w:r>
+              <w:rPr>
+                <w:rFonts w:ascii="Times" w:hAnsi="Times" w:cs="Times"/>
+                <w:noProof/>
+                <w:webHidden/>
+              </w:rPr>
+            </w:r>
+            <w:r>
+              <w:rPr>
+                <w:rFonts w:ascii="Times" w:hAnsi="Times" w:cs="Times"/>
+                <w:noProof/>
+                <w:webHidden/>
+              </w:rPr>
+              <w:fldChar w:fldCharType="separate"/>
+            </w:r>
+            <w:r>
+              <w:rPr>
+                <w:rFonts w:ascii="Times" w:hAnsi="Times" w:cs="Times"/>
+                <w:noProof/>
+                <w:webHidden/>
+              </w:rPr>
+              <w:t>21</w:t>
+            </w:r>
+            <w:r>
+              <w:rPr>
+                <w:rFonts w:ascii="Times" w:hAnsi="Times" w:cs="Times"/>
+                <w:noProof/>
+                <w:webHidden/>
+              </w:rPr>
+              <w:fldChar w:fldCharType="end"/>
+            </w:r>
+          </w:hyperlink>
+        </w:p>
+        <w:p>
+          <w:pPr>
+            <w:pStyle w:val="Sumrio3"/>
+            <w:tabs>
+              <w:tab w:val="right" w:leader="dot" w:pos="9016"/>
+            </w:tabs>
+            <w:rPr>
+              <w:rFonts w:ascii="Times" w:eastAsiaTheme="minorEastAsia" w:hAnsi="Times" w:cs="Times"/>
+              <w:noProof/>
+              <w:lang w:eastAsia="pt-BR"/>
+            </w:rPr>
+          </w:pPr>
+          <w:hyperlink w:anchor="_Toc201083650" w:history="1">
+            <w:r>
+              <w:rPr>
+                <w:rStyle w:val="Hyperlink"/>
+                <w:rFonts w:ascii="Times" w:hAnsi="Times" w:cs="Times"/>
+                <w:noProof/>
+              </w:rPr>
+              <w:t>Algoritmo do Site Programmiz</w:t>
+            </w:r>
+            <w:r>
+              <w:rPr>
+                <w:rFonts w:ascii="Times" w:hAnsi="Times" w:cs="Times"/>
+                <w:noProof/>
+                <w:webHidden/>
+              </w:rPr>
+              <w:tab/>
+            </w:r>
+            <w:r>
+              <w:rPr>
+                <w:rFonts w:ascii="Times" w:hAnsi="Times" w:cs="Times"/>
+                <w:noProof/>
+                <w:webHidden/>
+              </w:rPr>
+              <w:fldChar w:fldCharType="begin"/>
+            </w:r>
+            <w:r>
+              <w:rPr>
+                <w:rFonts w:ascii="Times" w:hAnsi="Times" w:cs="Times"/>
+                <w:noProof/>
+                <w:webHidden/>
+              </w:rPr>
+              <w:instrText xml:space="preserve"> PAGEREF _Toc201083650 \h </w:instrText>
+            </w:r>
+            <w:r>
+              <w:rPr>
+                <w:rFonts w:ascii="Times" w:hAnsi="Times" w:cs="Times"/>
+                <w:noProof/>
+                <w:webHidden/>
+              </w:rPr>
+            </w:r>
+            <w:r>
+              <w:rPr>
+                <w:rFonts w:ascii="Times" w:hAnsi="Times" w:cs="Times"/>
+                <w:noProof/>
+                <w:webHidden/>
+              </w:rPr>
+              <w:fldChar w:fldCharType="separate"/>
+            </w:r>
+            <w:r>
+              <w:rPr>
+                <w:rFonts w:ascii="Times" w:hAnsi="Times" w:cs="Times"/>
+                <w:noProof/>
+                <w:webHidden/>
+              </w:rPr>
+              <w:t>25</w:t>
+            </w:r>
+            <w:r>
+              <w:rPr>
+                <w:rFonts w:ascii="Times" w:hAnsi="Times" w:cs="Times"/>
+                <w:noProof/>
+                <w:webHidden/>
               </w:rPr>
               <w:fldChar w:fldCharType="end"/>
             </w:r>
@@ -1807,85 +1919,73 @@
             <w:tabs>
               <w:tab w:val="right" w:leader="dot" w:pos="9016"/>
             </w:tabs>
-            <w:jc w:val="both"/>
             <w:rPr>
-              <w:rFonts w:eastAsiaTheme="minorEastAsia"/>
+              <w:rFonts w:ascii="Times" w:eastAsiaTheme="minorEastAsia" w:hAnsi="Times" w:cs="Times"/>
               <w:noProof/>
-              <w:sz w:val="24"/>
-              <w:szCs w:val="24"/>
               <w:lang w:eastAsia="pt-BR"/>
             </w:rPr>
           </w:pPr>
-          <w:hyperlink w:anchor="_Toc200439712" w:history="1">
+          <w:hyperlink w:anchor="_Toc201083651" w:history="1">
             <w:r>
               <w:rPr>
                 <w:rStyle w:val="Hyperlink"/>
+                <w:rFonts w:ascii="Times" w:hAnsi="Times" w:cs="Times"/>
                 <w:noProof/>
-                <w:color w:val="auto"/>
-                <w:sz w:val="24"/>
-                <w:szCs w:val="24"/>
-              </w:rPr>
-              <w:t>Resultados Dos Testes</w:t>
+              </w:rPr>
+              <w:t>Resultados dos Testes</w:t>
             </w:r>
             <w:r>
               <w:rPr>
+                <w:rFonts w:ascii="Times" w:hAnsi="Times" w:cs="Times"/>
                 <w:noProof/>
                 <w:webHidden/>
-                <w:sz w:val="24"/>
-                <w:szCs w:val="24"/>
               </w:rPr>
               <w:tab/>
             </w:r>
             <w:r>
               <w:rPr>
+                <w:rFonts w:ascii="Times" w:hAnsi="Times" w:cs="Times"/>
                 <w:noProof/>
                 <w:webHidden/>
-                <w:sz w:val="24"/>
-                <w:szCs w:val="24"/>
               </w:rPr>
               <w:fldChar w:fldCharType="begin"/>
             </w:r>
             <w:r>
               <w:rPr>
+                <w:rFonts w:ascii="Times" w:hAnsi="Times" w:cs="Times"/>
                 <w:noProof/>
                 <w:webHidden/>
-                <w:sz w:val="24"/>
-                <w:szCs w:val="24"/>
-              </w:rPr>
-              <w:instrText xml:space="preserve"> PAGEREF _Toc200439712 \h </w:instrText>
+              </w:rPr>
+              <w:instrText xml:space="preserve"> PAGEREF _Toc201083651 \h </w:instrText>
             </w:r>
             <w:r>
               <w:rPr>
+                <w:rFonts w:ascii="Times" w:hAnsi="Times" w:cs="Times"/>
                 <w:noProof/>
                 <w:webHidden/>
-                <w:sz w:val="24"/>
-                <w:szCs w:val="24"/>
               </w:rPr>
             </w:r>
             <w:r>
               <w:rPr>
+                <w:rFonts w:ascii="Times" w:hAnsi="Times" w:cs="Times"/>
                 <w:noProof/>
                 <w:webHidden/>
-                <w:sz w:val="24"/>
-                <w:szCs w:val="24"/>
               </w:rPr>
               <w:fldChar w:fldCharType="separate"/>
             </w:r>
             <w:r>
               <w:rPr>
+                <w:rFonts w:ascii="Times" w:hAnsi="Times" w:cs="Times"/>
                 <w:noProof/>
                 <w:webHidden/>
-                <w:sz w:val="24"/>
-                <w:szCs w:val="24"/>
-              </w:rPr>
-              <w:t>23</w:t>
+              </w:rPr>
+              <w:t>29</w:t>
             </w:r>
             <w:r>
               <w:rPr>
+                <w:rFonts w:ascii="Times" w:hAnsi="Times" w:cs="Times"/>
                 <w:noProof/>
                 <w:webHidden/>
-                <w:sz w:val="24"/>
-                <w:szCs w:val="24"/>
               </w:rPr>
               <w:fldChar w:fldCharType="end"/>
             </w:r>
@@ -1897,85 +1997,73 @@
             <w:tabs>
               <w:tab w:val="right" w:leader="dot" w:pos="9016"/>
             </w:tabs>
-            <w:jc w:val="both"/>
             <w:rPr>
-              <w:rFonts w:eastAsiaTheme="minorEastAsia"/>
+              <w:rFonts w:ascii="Times" w:eastAsiaTheme="minorEastAsia" w:hAnsi="Times" w:cs="Times"/>
               <w:noProof/>
-              <w:sz w:val="24"/>
-              <w:szCs w:val="24"/>
               <w:lang w:eastAsia="pt-BR"/>
             </w:rPr>
           </w:pPr>
-          <w:hyperlink w:anchor="_Toc200439713" w:history="1">
+          <w:hyperlink w:anchor="_Toc201083652" w:history="1">
             <w:r>
               <w:rPr>
                 <w:rStyle w:val="Hyperlink"/>
+                <w:rFonts w:ascii="Times" w:hAnsi="Times" w:cs="Times"/>
                 <w:noProof/>
-                <w:color w:val="auto"/>
-                <w:sz w:val="24"/>
-                <w:szCs w:val="24"/>
               </w:rPr>
               <w:t>Ordered Input</w:t>
             </w:r>
             <w:r>
               <w:rPr>
+                <w:rFonts w:ascii="Times" w:hAnsi="Times" w:cs="Times"/>
                 <w:noProof/>
                 <w:webHidden/>
-                <w:sz w:val="24"/>
-                <w:szCs w:val="24"/>
               </w:rPr>
               <w:tab/>
             </w:r>
             <w:r>
               <w:rPr>
+                <w:rFonts w:ascii="Times" w:hAnsi="Times" w:cs="Times"/>
                 <w:noProof/>
                 <w:webHidden/>
-                <w:sz w:val="24"/>
-                <w:szCs w:val="24"/>
               </w:rPr>
               <w:fldChar w:fldCharType="begin"/>
             </w:r>
             <w:r>
               <w:rPr>
+                <w:rFonts w:ascii="Times" w:hAnsi="Times" w:cs="Times"/>
                 <w:noProof/>
                 <w:webHidden/>
-                <w:sz w:val="24"/>
-                <w:szCs w:val="24"/>
-              </w:rPr>
-              <w:instrText xml:space="preserve"> PAGEREF _Toc200439713 \h </w:instrText>
+              </w:rPr>
+              <w:instrText xml:space="preserve"> PAGEREF _Toc201083652 \h </w:instrText>
             </w:r>
             <w:r>
               <w:rPr>
+                <w:rFonts w:ascii="Times" w:hAnsi="Times" w:cs="Times"/>
                 <w:noProof/>
                 <w:webHidden/>
-                <w:sz w:val="24"/>
-                <w:szCs w:val="24"/>
               </w:rPr>
             </w:r>
             <w:r>
               <w:rPr>
+                <w:rFonts w:ascii="Times" w:hAnsi="Times" w:cs="Times"/>
                 <w:noProof/>
                 <w:webHidden/>
-                <w:sz w:val="24"/>
-                <w:szCs w:val="24"/>
               </w:rPr>
               <w:fldChar w:fldCharType="separate"/>
             </w:r>
             <w:r>
               <w:rPr>
+                <w:rFonts w:ascii="Times" w:hAnsi="Times" w:cs="Times"/>
                 <w:noProof/>
                 <w:webHidden/>
-                <w:sz w:val="24"/>
-                <w:szCs w:val="24"/>
-              </w:rPr>
-              <w:t>23</w:t>
+              </w:rPr>
+              <w:t>29</w:t>
             </w:r>
             <w:r>
               <w:rPr>
+                <w:rFonts w:ascii="Times" w:hAnsi="Times" w:cs="Times"/>
                 <w:noProof/>
                 <w:webHidden/>
-                <w:sz w:val="24"/>
-                <w:szCs w:val="24"/>
               </w:rPr>
               <w:fldChar w:fldCharType="end"/>
             </w:r>
@@ -1987,85 +2075,73 @@
             <w:tabs>
               <w:tab w:val="right" w:leader="dot" w:pos="9016"/>
             </w:tabs>
-            <w:jc w:val="both"/>
             <w:rPr>
-              <w:rFonts w:eastAsiaTheme="minorEastAsia"/>
+              <w:rFonts w:ascii="Times" w:eastAsiaTheme="minorEastAsia" w:hAnsi="Times" w:cs="Times"/>
               <w:noProof/>
-              <w:sz w:val="24"/>
-              <w:szCs w:val="24"/>
               <w:lang w:eastAsia="pt-BR"/>
             </w:rPr>
           </w:pPr>
-          <w:hyperlink w:anchor="_Toc200439714" w:history="1">
+          <w:hyperlink w:anchor="_Toc201083653" w:history="1">
             <w:r>
               <w:rPr>
                 <w:rStyle w:val="Hyperlink"/>
+                <w:rFonts w:ascii="Times" w:hAnsi="Times" w:cs="Times"/>
                 <w:noProof/>
-                <w:color w:val="auto"/>
-                <w:sz w:val="24"/>
-                <w:szCs w:val="24"/>
               </w:rPr>
               <w:t>Reverse Ordered Input</w:t>
             </w:r>
             <w:r>
               <w:rPr>
+                <w:rFonts w:ascii="Times" w:hAnsi="Times" w:cs="Times"/>
                 <w:noProof/>
                 <w:webHidden/>
-                <w:sz w:val="24"/>
-                <w:szCs w:val="24"/>
               </w:rPr>
               <w:tab/>
             </w:r>
             <w:r>
               <w:rPr>
+                <w:rFonts w:ascii="Times" w:hAnsi="Times" w:cs="Times"/>
                 <w:noProof/>
                 <w:webHidden/>
-                <w:sz w:val="24"/>
-                <w:szCs w:val="24"/>
               </w:rPr>
               <w:fldChar w:fldCharType="begin"/>
             </w:r>
             <w:r>
               <w:rPr>
+                <w:rFonts w:ascii="Times" w:hAnsi="Times" w:cs="Times"/>
                 <w:noProof/>
                 <w:webHidden/>
-                <w:sz w:val="24"/>
-                <w:szCs w:val="24"/>
-              </w:rPr>
-              <w:instrText xml:space="preserve"> PAGEREF _Toc200439714 \h </w:instrText>
+              </w:rPr>
+              <w:instrText xml:space="preserve"> PAGEREF _Toc201083653 \h </w:instrText>
             </w:r>
             <w:r>
               <w:rPr>
+                <w:rFonts w:ascii="Times" w:hAnsi="Times" w:cs="Times"/>
                 <w:noProof/>
                 <w:webHidden/>
-                <w:sz w:val="24"/>
-                <w:szCs w:val="24"/>
               </w:rPr>
             </w:r>
             <w:r>
               <w:rPr>
+                <w:rFonts w:ascii="Times" w:hAnsi="Times" w:cs="Times"/>
                 <w:noProof/>
                 <w:webHidden/>
-                <w:sz w:val="24"/>
-                <w:szCs w:val="24"/>
               </w:rPr>
               <w:fldChar w:fldCharType="separate"/>
             </w:r>
             <w:r>
               <w:rPr>
+                <w:rFonts w:ascii="Times" w:hAnsi="Times" w:cs="Times"/>
                 <w:noProof/>
                 <w:webHidden/>
-                <w:sz w:val="24"/>
-                <w:szCs w:val="24"/>
-              </w:rPr>
-              <w:t>25</w:t>
+              </w:rPr>
+              <w:t>31</w:t>
             </w:r>
             <w:r>
               <w:rPr>
+                <w:rFonts w:ascii="Times" w:hAnsi="Times" w:cs="Times"/>
                 <w:noProof/>
                 <w:webHidden/>
-                <w:sz w:val="24"/>
-                <w:szCs w:val="24"/>
               </w:rPr>
               <w:fldChar w:fldCharType="end"/>
             </w:r>
@@ -2077,85 +2153,73 @@
             <w:tabs>
               <w:tab w:val="right" w:leader="dot" w:pos="9016"/>
             </w:tabs>
-            <w:jc w:val="both"/>
             <w:rPr>
-              <w:rFonts w:eastAsiaTheme="minorEastAsia"/>
+              <w:rFonts w:ascii="Times" w:eastAsiaTheme="minorEastAsia" w:hAnsi="Times" w:cs="Times"/>
               <w:noProof/>
-              <w:sz w:val="24"/>
-              <w:szCs w:val="24"/>
               <w:lang w:eastAsia="pt-BR"/>
             </w:rPr>
           </w:pPr>
-          <w:hyperlink w:anchor="_Toc200439715" w:history="1">
+          <w:hyperlink w:anchor="_Toc201083654" w:history="1">
             <w:r>
               <w:rPr>
                 <w:rStyle w:val="Hyperlink"/>
+                <w:rFonts w:ascii="Times" w:hAnsi="Times" w:cs="Times"/>
                 <w:noProof/>
-                <w:color w:val="auto"/>
-                <w:sz w:val="24"/>
-                <w:szCs w:val="24"/>
               </w:rPr>
               <w:t>Uniform Input</w:t>
             </w:r>
             <w:r>
               <w:rPr>
+                <w:rFonts w:ascii="Times" w:hAnsi="Times" w:cs="Times"/>
                 <w:noProof/>
                 <w:webHidden/>
-                <w:sz w:val="24"/>
-                <w:szCs w:val="24"/>
               </w:rPr>
               <w:tab/>
             </w:r>
             <w:r>
               <w:rPr>
+                <w:rFonts w:ascii="Times" w:hAnsi="Times" w:cs="Times"/>
                 <w:noProof/>
                 <w:webHidden/>
-                <w:sz w:val="24"/>
-                <w:szCs w:val="24"/>
               </w:rPr>
               <w:fldChar w:fldCharType="begin"/>
             </w:r>
             <w:r>
               <w:rPr>
+                <w:rFonts w:ascii="Times" w:hAnsi="Times" w:cs="Times"/>
                 <w:noProof/>
                 <w:webHidden/>
-                <w:sz w:val="24"/>
-                <w:szCs w:val="24"/>
-              </w:rPr>
-              <w:instrText xml:space="preserve"> PAGEREF _Toc200439715 \h </w:instrText>
+              </w:rPr>
+              <w:instrText xml:space="preserve"> PAGEREF _Toc201083654 \h </w:instrText>
             </w:r>
             <w:r>
               <w:rPr>
+                <w:rFonts w:ascii="Times" w:hAnsi="Times" w:cs="Times"/>
                 <w:noProof/>
                 <w:webHidden/>
-                <w:sz w:val="24"/>
-                <w:szCs w:val="24"/>
               </w:rPr>
             </w:r>
             <w:r>
               <w:rPr>
+                <w:rFonts w:ascii="Times" w:hAnsi="Times" w:cs="Times"/>
                 <w:noProof/>
                 <w:webHidden/>
-                <w:sz w:val="24"/>
-                <w:szCs w:val="24"/>
               </w:rPr>
               <w:fldChar w:fldCharType="separate"/>
             </w:r>
             <w:r>
               <w:rPr>
+                <w:rFonts w:ascii="Times" w:hAnsi="Times" w:cs="Times"/>
                 <w:noProof/>
                 <w:webHidden/>
-                <w:sz w:val="24"/>
-                <w:szCs w:val="24"/>
-              </w:rPr>
-              <w:t>26</w:t>
+              </w:rPr>
+              <w:t>33</w:t>
             </w:r>
             <w:r>
               <w:rPr>
+                <w:rFonts w:ascii="Times" w:hAnsi="Times" w:cs="Times"/>
                 <w:noProof/>
                 <w:webHidden/>
-                <w:sz w:val="24"/>
-                <w:szCs w:val="24"/>
               </w:rPr>
               <w:fldChar w:fldCharType="end"/>
             </w:r>
@@ -2167,356 +2231,73 @@
             <w:tabs>
               <w:tab w:val="right" w:leader="dot" w:pos="9016"/>
             </w:tabs>
-            <w:jc w:val="both"/>
             <w:rPr>
-              <w:rFonts w:eastAsiaTheme="minorEastAsia"/>
+              <w:rFonts w:ascii="Times" w:eastAsiaTheme="minorEastAsia" w:hAnsi="Times" w:cs="Times"/>
               <w:noProof/>
-              <w:sz w:val="24"/>
-              <w:szCs w:val="24"/>
               <w:lang w:eastAsia="pt-BR"/>
             </w:rPr>
           </w:pPr>
-          <w:hyperlink w:anchor="_Toc200439716" w:history="1">
+          <w:hyperlink w:anchor="_Toc201083655" w:history="1">
             <w:r>
               <w:rPr>
                 <w:rStyle w:val="Hyperlink"/>
                 <w:rFonts w:ascii="Times" w:hAnsi="Times" w:cs="Times"/>
                 <w:noProof/>
-                <w:color w:val="auto"/>
-                <w:sz w:val="24"/>
-                <w:szCs w:val="24"/>
               </w:rPr>
               <w:t>Detalhes da Configuração do Computador Utilizado</w:t>
             </w:r>
             <w:r>
               <w:rPr>
+                <w:rFonts w:ascii="Times" w:hAnsi="Times" w:cs="Times"/>
                 <w:noProof/>
                 <w:webHidden/>
-                <w:sz w:val="24"/>
-                <w:szCs w:val="24"/>
               </w:rPr>
               <w:tab/>
             </w:r>
             <w:r>
               <w:rPr>
+                <w:rFonts w:ascii="Times" w:hAnsi="Times" w:cs="Times"/>
                 <w:noProof/>
                 <w:webHidden/>
-                <w:sz w:val="24"/>
-                <w:szCs w:val="24"/>
               </w:rPr>
               <w:fldChar w:fldCharType="begin"/>
             </w:r>
             <w:r>
               <w:rPr>
+                <w:rFonts w:ascii="Times" w:hAnsi="Times" w:cs="Times"/>
                 <w:noProof/>
                 <w:webHidden/>
-                <w:sz w:val="24"/>
-                <w:szCs w:val="24"/>
-              </w:rPr>
-              <w:instrText xml:space="preserve"> PAGEREF _Toc200439716 \h </w:instrText>
+              </w:rPr>
+              <w:instrText xml:space="preserve"> PAGEREF _Toc201083655 \h </w:instrText>
             </w:r>
             <w:r>
               <w:rPr>
+                <w:rFonts w:ascii="Times" w:hAnsi="Times" w:cs="Times"/>
                 <w:noProof/>
                 <w:webHidden/>
-                <w:sz w:val="24"/>
-                <w:szCs w:val="24"/>
               </w:rPr>
             </w:r>
             <w:r>
               <w:rPr>
+                <w:rFonts w:ascii="Times" w:hAnsi="Times" w:cs="Times"/>
                 <w:noProof/>
                 <w:webHidden/>
-                <w:sz w:val="24"/>
-                <w:szCs w:val="24"/>
               </w:rPr>
               <w:fldChar w:fldCharType="separate"/>
             </w:r>
             <w:r>
               <w:rPr>
+                <w:rFonts w:ascii="Times" w:hAnsi="Times" w:cs="Times"/>
                 <w:noProof/>
                 <w:webHidden/>
-                <w:sz w:val="24"/>
-                <w:szCs w:val="24"/>
-              </w:rPr>
-              <w:t>28</w:t>
+              </w:rPr>
+              <w:t>35</w:t>
             </w:r>
             <w:r>
               <w:rPr>
+                <w:rFonts w:ascii="Times" w:hAnsi="Times" w:cs="Times"/>
                 <w:noProof/>
                 <w:webHidden/>
-                <w:sz w:val="24"/>
-                <w:szCs w:val="24"/>
-              </w:rPr>
-              <w:fldChar w:fldCharType="end"/>
-            </w:r>
-          </w:hyperlink>
-        </w:p>
-        <w:p>
-          <w:pPr>
-            <w:pStyle w:val="Sumrio3"/>
-            <w:tabs>
-              <w:tab w:val="right" w:leader="dot" w:pos="9016"/>
-            </w:tabs>
-            <w:jc w:val="both"/>
-            <w:rPr>
-              <w:rFonts w:eastAsiaTheme="minorEastAsia"/>
-              <w:noProof/>
-              <w:sz w:val="24"/>
-              <w:szCs w:val="24"/>
-              <w:lang w:eastAsia="pt-BR"/>
-            </w:rPr>
-          </w:pPr>
-          <w:hyperlink w:anchor="_Toc200439717" w:history="1">
-            <w:r>
-              <w:rPr>
-                <w:rStyle w:val="Hyperlink"/>
-                <w:noProof/>
-                <w:color w:val="auto"/>
-                <w:sz w:val="24"/>
-                <w:szCs w:val="24"/>
-              </w:rPr>
-              <w:t>Sistema Operacional</w:t>
-            </w:r>
-            <w:r>
-              <w:rPr>
-                <w:noProof/>
-                <w:webHidden/>
-                <w:sz w:val="24"/>
-                <w:szCs w:val="24"/>
-              </w:rPr>
-              <w:tab/>
-            </w:r>
-            <w:r>
-              <w:rPr>
-                <w:noProof/>
-                <w:webHidden/>
-                <w:sz w:val="24"/>
-                <w:szCs w:val="24"/>
-              </w:rPr>
-              <w:fldChar w:fldCharType="begin"/>
-            </w:r>
-            <w:r>
-              <w:rPr>
-                <w:noProof/>
-                <w:webHidden/>
-                <w:sz w:val="24"/>
-                <w:szCs w:val="24"/>
-              </w:rPr>
-              <w:instrText xml:space="preserve"> PAGEREF _Toc200439717 \h </w:instrText>
-            </w:r>
-            <w:r>
-              <w:rPr>
-                <w:noProof/>
-                <w:webHidden/>
-                <w:sz w:val="24"/>
-                <w:szCs w:val="24"/>
-              </w:rPr>
-            </w:r>
-            <w:r>
-              <w:rPr>
-                <w:noProof/>
-                <w:webHidden/>
-                <w:sz w:val="24"/>
-                <w:szCs w:val="24"/>
-              </w:rPr>
-              <w:fldChar w:fldCharType="separate"/>
-            </w:r>
-            <w:r>
-              <w:rPr>
-                <w:noProof/>
-                <w:webHidden/>
-                <w:sz w:val="24"/>
-                <w:szCs w:val="24"/>
-              </w:rPr>
-              <w:t>28</w:t>
-            </w:r>
-            <w:r>
-              <w:rPr>
-                <w:noProof/>
-                <w:webHidden/>
-                <w:sz w:val="24"/>
-                <w:szCs w:val="24"/>
-              </w:rPr>
-              <w:fldChar w:fldCharType="end"/>
-            </w:r>
-          </w:hyperlink>
-        </w:p>
-        <w:p>
-          <w:pPr>
-            <w:pStyle w:val="Sumrio3"/>
-            <w:tabs>
-              <w:tab w:val="right" w:leader="dot" w:pos="9016"/>
-            </w:tabs>
-            <w:jc w:val="both"/>
-            <w:rPr>
-              <w:rFonts w:eastAsiaTheme="minorEastAsia"/>
-              <w:noProof/>
-              <w:sz w:val="24"/>
-              <w:szCs w:val="24"/>
-              <w:lang w:eastAsia="pt-BR"/>
-            </w:rPr>
-          </w:pPr>
-          <w:hyperlink w:anchor="_Toc200439718" w:history="1">
-            <w:r>
-              <w:rPr>
-                <w:rStyle w:val="Hyperlink"/>
-                <w:noProof/>
-                <w:color w:val="auto"/>
-                <w:sz w:val="24"/>
-                <w:szCs w:val="24"/>
-              </w:rPr>
-              <w:t>RAM</w:t>
-            </w:r>
-            <w:r>
-              <w:rPr>
-                <w:noProof/>
-                <w:webHidden/>
-                <w:sz w:val="24"/>
-                <w:szCs w:val="24"/>
-              </w:rPr>
-              <w:tab/>
-            </w:r>
-            <w:r>
-              <w:rPr>
-                <w:noProof/>
-                <w:webHidden/>
-                <w:sz w:val="24"/>
-                <w:szCs w:val="24"/>
-              </w:rPr>
-              <w:fldChar w:fldCharType="begin"/>
-            </w:r>
-            <w:r>
-              <w:rPr>
-                <w:noProof/>
-                <w:webHidden/>
-                <w:sz w:val="24"/>
-                <w:szCs w:val="24"/>
-              </w:rPr>
-              <w:instrText xml:space="preserve"> PAGEREF _Toc200439718 \h </w:instrText>
-            </w:r>
-            <w:r>
-              <w:rPr>
-                <w:noProof/>
-                <w:webHidden/>
-                <w:sz w:val="24"/>
-                <w:szCs w:val="24"/>
-              </w:rPr>
-            </w:r>
-            <w:r>
-              <w:rPr>
-                <w:noProof/>
-                <w:webHidden/>
-                <w:sz w:val="24"/>
-                <w:szCs w:val="24"/>
-              </w:rPr>
-              <w:fldChar w:fldCharType="separate"/>
-            </w:r>
-            <w:r>
-              <w:rPr>
-                <w:noProof/>
-                <w:webHidden/>
-                <w:sz w:val="24"/>
-                <w:szCs w:val="24"/>
-              </w:rPr>
-              <w:t>29</w:t>
-            </w:r>
-            <w:r>
-              <w:rPr>
-                <w:noProof/>
-                <w:webHidden/>
-                <w:sz w:val="24"/>
-                <w:szCs w:val="24"/>
-              </w:rPr>
-              <w:fldChar w:fldCharType="end"/>
-            </w:r>
-          </w:hyperlink>
-        </w:p>
-        <w:p>
-          <w:pPr>
-            <w:pStyle w:val="Sumrio3"/>
-            <w:tabs>
-              <w:tab w:val="right" w:leader="dot" w:pos="9016"/>
-            </w:tabs>
-            <w:jc w:val="both"/>
-            <w:rPr>
-              <w:rFonts w:eastAsiaTheme="minorEastAsia"/>
-              <w:noProof/>
-              <w:sz w:val="24"/>
-              <w:szCs w:val="24"/>
-              <w:lang w:eastAsia="pt-BR"/>
-            </w:rPr>
-          </w:pPr>
-          <w:hyperlink w:anchor="_Toc200439719" w:history="1">
-            <w:r>
-              <w:rPr>
-                <w:rStyle w:val="Hyperlink"/>
-                <w:noProof/>
-                <w:color w:val="auto"/>
-                <w:sz w:val="24"/>
-                <w:szCs w:val="24"/>
-              </w:rPr>
-              <w:t>CPU</w:t>
-            </w:r>
-            <w:r>
-              <w:rPr>
-                <w:noProof/>
-                <w:webHidden/>
-                <w:sz w:val="24"/>
-                <w:szCs w:val="24"/>
-              </w:rPr>
-              <w:tab/>
-            </w:r>
-            <w:r>
-              <w:rPr>
-                <w:noProof/>
-                <w:webHidden/>
-                <w:sz w:val="24"/>
-                <w:szCs w:val="24"/>
-              </w:rPr>
-              <w:fldChar w:fldCharType="begin"/>
-            </w:r>
-            <w:r>
-              <w:rPr>
-                <w:noProof/>
-                <w:webHidden/>
-                <w:sz w:val="24"/>
-                <w:szCs w:val="24"/>
-              </w:rPr>
-              <w:instrText xml:space="preserve"> PAGEREF _Toc200439719 \h </w:instrText>
-            </w:r>
-            <w:r>
-              <w:rPr>
-                <w:noProof/>
-                <w:webHidden/>
-                <w:sz w:val="24"/>
-                <w:szCs w:val="24"/>
-              </w:rPr>
-            </w:r>
-            <w:r>
-              <w:rPr>
-                <w:noProof/>
-                <w:webHidden/>
-                <w:sz w:val="24"/>
-                <w:szCs w:val="24"/>
-              </w:rPr>
-              <w:fldChar w:fldCharType="separate"/>
-            </w:r>
-            <w:r>
-              <w:rPr>
-                <w:noProof/>
-                <w:webHidden/>
-                <w:sz w:val="24"/>
-                <w:szCs w:val="24"/>
-              </w:rPr>
-              <w:t>30</w:t>
-            </w:r>
-            <w:r>
-              <w:rPr>
-                <w:noProof/>
-                <w:webHidden/>
-                <w:sz w:val="24"/>
-                <w:szCs w:val="24"/>
               </w:rPr>
               <w:fldChar w:fldCharType="end"/>
             </w:r>
@@ -2529,33 +2310,25 @@
               <w:tab w:val="left" w:pos="440"/>
               <w:tab w:val="right" w:leader="dot" w:pos="9016"/>
             </w:tabs>
-            <w:jc w:val="both"/>
             <w:rPr>
-              <w:rFonts w:eastAsiaTheme="minorEastAsia"/>
+              <w:rFonts w:ascii="Times" w:eastAsiaTheme="minorEastAsia" w:hAnsi="Times" w:cs="Times"/>
               <w:noProof/>
-              <w:sz w:val="24"/>
-              <w:szCs w:val="24"/>
               <w:lang w:eastAsia="pt-BR"/>
             </w:rPr>
           </w:pPr>
-          <w:hyperlink w:anchor="_Toc200439720" w:history="1">
+          <w:hyperlink w:anchor="_Toc201083656" w:history="1">
             <w:r>
               <w:rPr>
                 <w:rStyle w:val="Hyperlink"/>
                 <w:rFonts w:ascii="Times" w:hAnsi="Times" w:cs="Times"/>
                 <w:noProof/>
-                <w:color w:val="auto"/>
-                <w:sz w:val="24"/>
-                <w:szCs w:val="24"/>
               </w:rPr>
               <w:t>5.</w:t>
             </w:r>
             <w:r>
               <w:rPr>
-                <w:rFonts w:eastAsiaTheme="minorEastAsia"/>
+                <w:rFonts w:ascii="Times" w:eastAsiaTheme="minorEastAsia" w:hAnsi="Times" w:cs="Times"/>
                 <w:noProof/>
-                <w:sz w:val="24"/>
-                <w:szCs w:val="24"/>
                 <w:lang w:eastAsia="pt-BR"/>
               </w:rPr>
               <w:tab/>
@@ -2565,71 +2338,61 @@
                 <w:rStyle w:val="Hyperlink"/>
                 <w:rFonts w:ascii="Times" w:hAnsi="Times" w:cs="Times"/>
                 <w:noProof/>
-                <w:color w:val="auto"/>
-                <w:sz w:val="24"/>
-                <w:szCs w:val="24"/>
               </w:rPr>
               <w:t>Conclusão</w:t>
             </w:r>
             <w:r>
               <w:rPr>
+                <w:rFonts w:ascii="Times" w:hAnsi="Times" w:cs="Times"/>
                 <w:noProof/>
                 <w:webHidden/>
-                <w:sz w:val="24"/>
-                <w:szCs w:val="24"/>
               </w:rPr>
               <w:tab/>
             </w:r>
             <w:r>
               <w:rPr>
+                <w:rFonts w:ascii="Times" w:hAnsi="Times" w:cs="Times"/>
                 <w:noProof/>
                 <w:webHidden/>
-                <w:sz w:val="24"/>
-                <w:szCs w:val="24"/>
               </w:rPr>
               <w:fldChar w:fldCharType="begin"/>
             </w:r>
             <w:r>
               <w:rPr>
+                <w:rFonts w:ascii="Times" w:hAnsi="Times" w:cs="Times"/>
                 <w:noProof/>
                 <w:webHidden/>
-                <w:sz w:val="24"/>
-                <w:szCs w:val="24"/>
-              </w:rPr>
-              <w:instrText xml:space="preserve"> PAGEREF _Toc200439720 \h </w:instrText>
+              </w:rPr>
+              <w:instrText xml:space="preserve"> PAGEREF _Toc201083656 \h </w:instrText>
             </w:r>
             <w:r>
               <w:rPr>
+                <w:rFonts w:ascii="Times" w:hAnsi="Times" w:cs="Times"/>
                 <w:noProof/>
                 <w:webHidden/>
-                <w:sz w:val="24"/>
-                <w:szCs w:val="24"/>
               </w:rPr>
             </w:r>
             <w:r>
               <w:rPr>
+                <w:rFonts w:ascii="Times" w:hAnsi="Times" w:cs="Times"/>
                 <w:noProof/>
                 <w:webHidden/>
-                <w:sz w:val="24"/>
-                <w:szCs w:val="24"/>
               </w:rPr>
               <w:fldChar w:fldCharType="separate"/>
             </w:r>
             <w:r>
               <w:rPr>
+                <w:rFonts w:ascii="Times" w:hAnsi="Times" w:cs="Times"/>
                 <w:noProof/>
                 <w:webHidden/>
-                <w:sz w:val="24"/>
-                <w:szCs w:val="24"/>
-              </w:rPr>
-              <w:t>31</w:t>
+              </w:rPr>
+              <w:t>36</w:t>
             </w:r>
             <w:r>
               <w:rPr>
+                <w:rFonts w:ascii="Times" w:hAnsi="Times" w:cs="Times"/>
                 <w:noProof/>
                 <w:webHidden/>
-                <w:sz w:val="24"/>
-                <w:szCs w:val="24"/>
               </w:rPr>
               <w:fldChar w:fldCharType="end"/>
             </w:r>
@@ -2641,85 +2404,73 @@
             <w:tabs>
               <w:tab w:val="right" w:leader="dot" w:pos="9016"/>
             </w:tabs>
-            <w:jc w:val="both"/>
             <w:rPr>
-              <w:rFonts w:eastAsiaTheme="minorEastAsia"/>
+              <w:rFonts w:ascii="Times" w:eastAsiaTheme="minorEastAsia" w:hAnsi="Times" w:cs="Times"/>
               <w:noProof/>
-              <w:sz w:val="24"/>
-              <w:szCs w:val="24"/>
               <w:lang w:eastAsia="pt-BR"/>
             </w:rPr>
           </w:pPr>
-          <w:hyperlink w:anchor="_Toc200439721" w:history="1">
+          <w:hyperlink w:anchor="_Toc201083657" w:history="1">
             <w:r>
               <w:rPr>
                 <w:rStyle w:val="Hyperlink"/>
+                <w:rFonts w:ascii="Times" w:hAnsi="Times" w:cs="Times"/>
                 <w:noProof/>
-                <w:color w:val="auto"/>
-                <w:sz w:val="24"/>
-                <w:szCs w:val="24"/>
               </w:rPr>
               <w:t>Pontos Fortes</w:t>
             </w:r>
             <w:r>
               <w:rPr>
+                <w:rFonts w:ascii="Times" w:hAnsi="Times" w:cs="Times"/>
                 <w:noProof/>
                 <w:webHidden/>
-                <w:sz w:val="24"/>
-                <w:szCs w:val="24"/>
               </w:rPr>
               <w:tab/>
             </w:r>
             <w:r>
               <w:rPr>
+                <w:rFonts w:ascii="Times" w:hAnsi="Times" w:cs="Times"/>
                 <w:noProof/>
                 <w:webHidden/>
-                <w:sz w:val="24"/>
-                <w:szCs w:val="24"/>
               </w:rPr>
               <w:fldChar w:fldCharType="begin"/>
             </w:r>
             <w:r>
               <w:rPr>
+                <w:rFonts w:ascii="Times" w:hAnsi="Times" w:cs="Times"/>
                 <w:noProof/>
                 <w:webHidden/>
-                <w:sz w:val="24"/>
-                <w:szCs w:val="24"/>
-              </w:rPr>
-              <w:instrText xml:space="preserve"> PAGEREF _Toc200439721 \h </w:instrText>
+              </w:rPr>
+              <w:instrText xml:space="preserve"> PAGEREF _Toc201083657 \h </w:instrText>
             </w:r>
             <w:r>
               <w:rPr>
+                <w:rFonts w:ascii="Times" w:hAnsi="Times" w:cs="Times"/>
                 <w:noProof/>
                 <w:webHidden/>
-                <w:sz w:val="24"/>
-                <w:szCs w:val="24"/>
               </w:rPr>
             </w:r>
             <w:r>
               <w:rPr>
+                <w:rFonts w:ascii="Times" w:hAnsi="Times" w:cs="Times"/>
                 <w:noProof/>
                 <w:webHidden/>
-                <w:sz w:val="24"/>
-                <w:szCs w:val="24"/>
               </w:rPr>
               <w:fldChar w:fldCharType="separate"/>
             </w:r>
             <w:r>
               <w:rPr>
+                <w:rFonts w:ascii="Times" w:hAnsi="Times" w:cs="Times"/>
                 <w:noProof/>
                 <w:webHidden/>
-                <w:sz w:val="24"/>
-                <w:szCs w:val="24"/>
-              </w:rPr>
-              <w:t>31</w:t>
+              </w:rPr>
+              <w:t>36</w:t>
             </w:r>
             <w:r>
               <w:rPr>
+                <w:rFonts w:ascii="Times" w:hAnsi="Times" w:cs="Times"/>
                 <w:noProof/>
                 <w:webHidden/>
-                <w:sz w:val="24"/>
-                <w:szCs w:val="24"/>
               </w:rPr>
               <w:fldChar w:fldCharType="end"/>
             </w:r>
@@ -2731,85 +2482,73 @@
             <w:tabs>
               <w:tab w:val="right" w:leader="dot" w:pos="9016"/>
             </w:tabs>
-            <w:jc w:val="both"/>
             <w:rPr>
-              <w:rFonts w:eastAsiaTheme="minorEastAsia"/>
+              <w:rFonts w:ascii="Times" w:eastAsiaTheme="minorEastAsia" w:hAnsi="Times" w:cs="Times"/>
               <w:noProof/>
-              <w:sz w:val="24"/>
-              <w:szCs w:val="24"/>
               <w:lang w:eastAsia="pt-BR"/>
             </w:rPr>
           </w:pPr>
-          <w:hyperlink w:anchor="_Toc200439722" w:history="1">
+          <w:hyperlink w:anchor="_Toc201083658" w:history="1">
             <w:r>
               <w:rPr>
                 <w:rStyle w:val="Hyperlink"/>
+                <w:rFonts w:ascii="Times" w:hAnsi="Times" w:cs="Times"/>
                 <w:noProof/>
-                <w:color w:val="auto"/>
-                <w:sz w:val="24"/>
-                <w:szCs w:val="24"/>
               </w:rPr>
               <w:t>Pontos Fracos</w:t>
             </w:r>
             <w:r>
               <w:rPr>
+                <w:rFonts w:ascii="Times" w:hAnsi="Times" w:cs="Times"/>
                 <w:noProof/>
                 <w:webHidden/>
-                <w:sz w:val="24"/>
-                <w:szCs w:val="24"/>
               </w:rPr>
               <w:tab/>
             </w:r>
             <w:r>
               <w:rPr>
+                <w:rFonts w:ascii="Times" w:hAnsi="Times" w:cs="Times"/>
                 <w:noProof/>
                 <w:webHidden/>
-                <w:sz w:val="24"/>
-                <w:szCs w:val="24"/>
               </w:rPr>
               <w:fldChar w:fldCharType="begin"/>
             </w:r>
             <w:r>
               <w:rPr>
+                <w:rFonts w:ascii="Times" w:hAnsi="Times" w:cs="Times"/>
                 <w:noProof/>
                 <w:webHidden/>
-                <w:sz w:val="24"/>
-                <w:szCs w:val="24"/>
-              </w:rPr>
-              <w:instrText xml:space="preserve"> PAGEREF _Toc200439722 \h </w:instrText>
+              </w:rPr>
+              <w:instrText xml:space="preserve"> PAGEREF _Toc201083658 \h </w:instrText>
             </w:r>
             <w:r>
               <w:rPr>
+                <w:rFonts w:ascii="Times" w:hAnsi="Times" w:cs="Times"/>
                 <w:noProof/>
                 <w:webHidden/>
-                <w:sz w:val="24"/>
-                <w:szCs w:val="24"/>
               </w:rPr>
             </w:r>
             <w:r>
               <w:rPr>
+                <w:rFonts w:ascii="Times" w:hAnsi="Times" w:cs="Times"/>
                 <w:noProof/>
                 <w:webHidden/>
-                <w:sz w:val="24"/>
-                <w:szCs w:val="24"/>
               </w:rPr>
               <w:fldChar w:fldCharType="separate"/>
             </w:r>
             <w:r>
               <w:rPr>
+                <w:rFonts w:ascii="Times" w:hAnsi="Times" w:cs="Times"/>
                 <w:noProof/>
                 <w:webHidden/>
-                <w:sz w:val="24"/>
-                <w:szCs w:val="24"/>
-              </w:rPr>
-              <w:t>31</w:t>
+              </w:rPr>
+              <w:t>36</w:t>
             </w:r>
             <w:r>
               <w:rPr>
+                <w:rFonts w:ascii="Times" w:hAnsi="Times" w:cs="Times"/>
                 <w:noProof/>
                 <w:webHidden/>
-                <w:sz w:val="24"/>
-                <w:szCs w:val="24"/>
               </w:rPr>
               <w:fldChar w:fldCharType="end"/>
             </w:r>
@@ -2821,85 +2560,73 @@
             <w:tabs>
               <w:tab w:val="right" w:leader="dot" w:pos="9016"/>
             </w:tabs>
-            <w:jc w:val="both"/>
             <w:rPr>
-              <w:rFonts w:eastAsiaTheme="minorEastAsia"/>
+              <w:rFonts w:ascii="Times" w:eastAsiaTheme="minorEastAsia" w:hAnsi="Times" w:cs="Times"/>
               <w:noProof/>
-              <w:sz w:val="24"/>
-              <w:szCs w:val="24"/>
               <w:lang w:eastAsia="pt-BR"/>
             </w:rPr>
           </w:pPr>
-          <w:hyperlink w:anchor="_Toc200439723" w:history="1">
+          <w:hyperlink w:anchor="_Toc201083659" w:history="1">
             <w:r>
               <w:rPr>
                 <w:rStyle w:val="Hyperlink"/>
+                <w:rFonts w:ascii="Times" w:hAnsi="Times" w:cs="Times"/>
                 <w:noProof/>
-                <w:color w:val="auto"/>
-                <w:sz w:val="24"/>
-                <w:szCs w:val="24"/>
-              </w:rPr>
-              <w:t>Avaliação Do Desempenho Do Algoritmo Em Comparação Com O Quicksort.</w:t>
+              </w:rPr>
+              <w:t>Avaliação do Desempenho do Algoritmo Em Comparação Com O Quicksort</w:t>
             </w:r>
             <w:r>
               <w:rPr>
+                <w:rFonts w:ascii="Times" w:hAnsi="Times" w:cs="Times"/>
                 <w:noProof/>
                 <w:webHidden/>
-                <w:sz w:val="24"/>
-                <w:szCs w:val="24"/>
               </w:rPr>
               <w:tab/>
             </w:r>
             <w:r>
               <w:rPr>
+                <w:rFonts w:ascii="Times" w:hAnsi="Times" w:cs="Times"/>
                 <w:noProof/>
                 <w:webHidden/>
-                <w:sz w:val="24"/>
-                <w:szCs w:val="24"/>
               </w:rPr>
               <w:fldChar w:fldCharType="begin"/>
             </w:r>
             <w:r>
               <w:rPr>
+                <w:rFonts w:ascii="Times" w:hAnsi="Times" w:cs="Times"/>
                 <w:noProof/>
                 <w:webHidden/>
-                <w:sz w:val="24"/>
-                <w:szCs w:val="24"/>
-              </w:rPr>
-              <w:instrText xml:space="preserve"> PAGEREF _Toc200439723 \h </w:instrText>
+              </w:rPr>
+              <w:instrText xml:space="preserve"> PAGEREF _Toc201083659 \h </w:instrText>
             </w:r>
             <w:r>
               <w:rPr>
+                <w:rFonts w:ascii="Times" w:hAnsi="Times" w:cs="Times"/>
                 <w:noProof/>
                 <w:webHidden/>
-                <w:sz w:val="24"/>
-                <w:szCs w:val="24"/>
               </w:rPr>
             </w:r>
             <w:r>
               <w:rPr>
+                <w:rFonts w:ascii="Times" w:hAnsi="Times" w:cs="Times"/>
                 <w:noProof/>
                 <w:webHidden/>
-                <w:sz w:val="24"/>
-                <w:szCs w:val="24"/>
               </w:rPr>
               <w:fldChar w:fldCharType="separate"/>
             </w:r>
             <w:r>
               <w:rPr>
+                <w:rFonts w:ascii="Times" w:hAnsi="Times" w:cs="Times"/>
                 <w:noProof/>
                 <w:webHidden/>
-                <w:sz w:val="24"/>
-                <w:szCs w:val="24"/>
-              </w:rPr>
-              <w:t>31</w:t>
+              </w:rPr>
+              <w:t>37</w:t>
             </w:r>
             <w:r>
               <w:rPr>
+                <w:rFonts w:ascii="Times" w:hAnsi="Times" w:cs="Times"/>
                 <w:noProof/>
                 <w:webHidden/>
-                <w:sz w:val="24"/>
-                <w:szCs w:val="24"/>
               </w:rPr>
               <w:fldChar w:fldCharType="end"/>
             </w:r>
@@ -2912,33 +2639,25 @@
               <w:tab w:val="left" w:pos="440"/>
               <w:tab w:val="right" w:leader="dot" w:pos="9016"/>
             </w:tabs>
-            <w:jc w:val="both"/>
             <w:rPr>
-              <w:rFonts w:eastAsiaTheme="minorEastAsia"/>
+              <w:rFonts w:ascii="Times" w:eastAsiaTheme="minorEastAsia" w:hAnsi="Times" w:cs="Times"/>
               <w:noProof/>
-              <w:sz w:val="24"/>
-              <w:szCs w:val="24"/>
               <w:lang w:eastAsia="pt-BR"/>
             </w:rPr>
           </w:pPr>
-          <w:hyperlink w:anchor="_Toc200439724" w:history="1">
+          <w:hyperlink w:anchor="_Toc201083660" w:history="1">
             <w:r>
               <w:rPr>
                 <w:rStyle w:val="Hyperlink"/>
                 <w:rFonts w:ascii="Times" w:hAnsi="Times" w:cs="Times"/>
                 <w:noProof/>
-                <w:color w:val="auto"/>
-                <w:sz w:val="24"/>
-                <w:szCs w:val="24"/>
               </w:rPr>
               <w:t>6.</w:t>
             </w:r>
             <w:r>
               <w:rPr>
-                <w:rFonts w:eastAsiaTheme="minorEastAsia"/>
+                <w:rFonts w:ascii="Times" w:eastAsiaTheme="minorEastAsia" w:hAnsi="Times" w:cs="Times"/>
                 <w:noProof/>
-                <w:sz w:val="24"/>
-                <w:szCs w:val="24"/>
                 <w:lang w:eastAsia="pt-BR"/>
               </w:rPr>
               <w:tab/>
@@ -2948,71 +2667,61 @@
                 <w:rStyle w:val="Hyperlink"/>
                 <w:rFonts w:ascii="Times" w:hAnsi="Times" w:cs="Times"/>
                 <w:noProof/>
-                <w:color w:val="auto"/>
-                <w:sz w:val="24"/>
-                <w:szCs w:val="24"/>
               </w:rPr>
               <w:t>Referências</w:t>
             </w:r>
             <w:r>
               <w:rPr>
+                <w:rFonts w:ascii="Times" w:hAnsi="Times" w:cs="Times"/>
                 <w:noProof/>
                 <w:webHidden/>
-                <w:sz w:val="24"/>
-                <w:szCs w:val="24"/>
               </w:rPr>
               <w:tab/>
             </w:r>
             <w:r>
               <w:rPr>
+                <w:rFonts w:ascii="Times" w:hAnsi="Times" w:cs="Times"/>
                 <w:noProof/>
                 <w:webHidden/>
-                <w:sz w:val="24"/>
-                <w:szCs w:val="24"/>
               </w:rPr>
               <w:fldChar w:fldCharType="begin"/>
             </w:r>
             <w:r>
               <w:rPr>
+                <w:rFonts w:ascii="Times" w:hAnsi="Times" w:cs="Times"/>
                 <w:noProof/>
                 <w:webHidden/>
-                <w:sz w:val="24"/>
-                <w:szCs w:val="24"/>
-              </w:rPr>
-              <w:instrText xml:space="preserve"> PAGEREF _Toc200439724 \h </w:instrText>
+              </w:rPr>
+              <w:instrText xml:space="preserve"> PAGEREF _Toc201083660 \h </w:instrText>
             </w:r>
             <w:r>
               <w:rPr>
+                <w:rFonts w:ascii="Times" w:hAnsi="Times" w:cs="Times"/>
                 <w:noProof/>
                 <w:webHidden/>
-                <w:sz w:val="24"/>
-                <w:szCs w:val="24"/>
               </w:rPr>
             </w:r>
             <w:r>
               <w:rPr>
+                <w:rFonts w:ascii="Times" w:hAnsi="Times" w:cs="Times"/>
                 <w:noProof/>
                 <w:webHidden/>
-                <w:sz w:val="24"/>
-                <w:szCs w:val="24"/>
               </w:rPr>
               <w:fldChar w:fldCharType="separate"/>
             </w:r>
             <w:r>
               <w:rPr>
+                <w:rFonts w:ascii="Times" w:hAnsi="Times" w:cs="Times"/>
                 <w:noProof/>
                 <w:webHidden/>
-                <w:sz w:val="24"/>
-                <w:szCs w:val="24"/>
-              </w:rPr>
-              <w:t>33</w:t>
+              </w:rPr>
+              <w:t>39</w:t>
             </w:r>
             <w:r>
               <w:rPr>
+                <w:rFonts w:ascii="Times" w:hAnsi="Times" w:cs="Times"/>
                 <w:noProof/>
                 <w:webHidden/>
-                <w:sz w:val="24"/>
-                <w:szCs w:val="24"/>
               </w:rPr>
               <w:fldChar w:fldCharType="end"/>
             </w:r>
@@ -3072,7 +2781,7 @@
           <w:szCs w:val="24"/>
         </w:rPr>
       </w:pPr>
-      <w:bookmarkStart w:id="0" w:name="_Toc200439697"/>
+      <w:bookmarkStart w:id="0" w:name="_Toc201083632"/>
       <w:r>
         <w:rPr>
           <w:rFonts w:ascii="Times" w:hAnsi="Times" w:cs="Times"/>
@@ -3131,13 +2840,22 @@
         <w:t>principalmente</w:t>
       </w:r>
       <w:r>
-        <w:t xml:space="preserve"> pelos gêneros de FPS (First Person Shooter)e</w:t>
+        <w:t xml:space="preserve"> pelos gêneros de FPS (First Person Shooter)</w:t>
+      </w:r>
+      <w:r>
+        <w:t xml:space="preserve"> </w:t>
+      </w:r>
+      <w:r>
+        <w:t>e</w:t>
       </w:r>
       <w:r>
         <w:t xml:space="preserve"> estratégia</w:t>
       </w:r>
       <w:r>
         <w:t>,</w:t>
+      </w:r>
+      <w:r>
+        <w:t xml:space="preserve"> </w:t>
       </w:r>
       <w:r>
         <w:t>rankings de partidas</w:t>
@@ -3258,6 +2976,9 @@
         <w:t>.</w:t>
       </w:r>
       <w:r>
+        <w:t xml:space="preserve"> </w:t>
+      </w:r>
+      <w:r>
         <w:t>Além disso, há o</w:t>
       </w:r>
       <w:r>
@@ -3300,7 +3021,13 @@
         <w:t xml:space="preserve"> de implementar</w:t>
       </w:r>
       <w:r>
-        <w:t>,porém as suas propriedades</w:t>
+        <w:t>,</w:t>
+      </w:r>
+      <w:r>
+        <w:t xml:space="preserve"> </w:t>
+      </w:r>
+      <w:r>
+        <w:t>porém as suas propriedades</w:t>
       </w:r>
       <w:r>
         <w:t xml:space="preserve">, bem como a sua grandeza </w:t>
@@ -3314,7 +3041,13 @@
         </m:r>
       </m:oMath>
       <w:r>
-        <w:t>,faz com que ele seja inutilizado</w:t>
+        <w:t>,</w:t>
+      </w:r>
+      <w:r>
+        <w:t xml:space="preserve"> </w:t>
+      </w:r>
+      <w:r>
+        <w:t>faz com que ele seja inutilizado</w:t>
       </w:r>
       <w:r>
         <w:t xml:space="preserve"> no mercado, tornando-o </w:t>
@@ -3407,10 +3140,22 @@
         <w:t>) é executada</w:t>
       </w:r>
       <w:r>
-        <w:t>.A</w:t>
-      </w:r>
-      <w:r>
-        <w:t xml:space="preserve"> sua utilidade também se baseiana garantia de</w:t>
+        <w:t>.</w:t>
+      </w:r>
+      <w:r>
+        <w:t xml:space="preserve"> </w:t>
+      </w:r>
+      <w:r>
+        <w:t>A</w:t>
+      </w:r>
+      <w:r>
+        <w:t xml:space="preserve"> sua utilidade também se baseia</w:t>
+      </w:r>
+      <w:r>
+        <w:t xml:space="preserve"> </w:t>
+      </w:r>
+      <w:r>
+        <w:t>na garantia de</w:t>
       </w:r>
       <w:r>
         <w:t xml:space="preserve"> acesso rápido a informações</w:t>
@@ -3431,6 +3176,9 @@
         <w:t>.</w:t>
       </w:r>
       <w:r>
+        <w:t xml:space="preserve"> </w:t>
+      </w:r>
+      <w:r>
         <w:t xml:space="preserve">Porém, é válido </w:t>
       </w:r>
       <w:r>
@@ -3458,7 +3206,13 @@
         <w:t xml:space="preserve">excepcionalmente </w:t>
       </w:r>
       <w:r>
-        <w:t>necessário, pois fisicamente há um limite dentro da CPU,consider</w:t>
+        <w:t>necessário, pois fisicamente há um limite dentro da CPU,</w:t>
+      </w:r>
+      <w:r>
+        <w:t xml:space="preserve"> </w:t>
+      </w:r>
+      <w:r>
+        <w:t>consider</w:t>
       </w:r>
       <w:r>
         <w:t>a</w:t>
@@ -3470,7 +3224,13 @@
         <w:t xml:space="preserve"> o tempo de comunicação e armazenamento de dados na RAM</w:t>
       </w:r>
       <w:r>
-        <w:t>.Tal problemática, também pode-se ser explícita</w:t>
+        <w:t>.</w:t>
+      </w:r>
+      <w:r>
+        <w:t xml:space="preserve"> </w:t>
+      </w:r>
+      <w:r>
+        <w:t>Tal problemática, também pode ser explícita</w:t>
       </w:r>
       <w:r>
         <w:t xml:space="preserve"> durante o processamento d</w:t>
@@ -3487,7 +3247,10 @@
         <w:pStyle w:val="NormalRelatorio"/>
       </w:pPr>
       <w:r>
-        <w:t>Tais limitações, apresentam</w:t>
+        <w:t xml:space="preserve">Tais limitações, </w:t>
+      </w:r>
+      <w:r>
+        <w:t>apresentam</w:t>
       </w:r>
       <w:r>
         <w:t xml:space="preserve"> problemas</w:t>
@@ -3526,7 +3289,10 @@
         <w:t xml:space="preserve"> de produtos</w:t>
       </w:r>
       <w:r>
-        <w:t>,classificando-as atráves da</w:t>
+        <w:t>,</w:t>
+      </w:r>
+      <w:r>
+        <w:t xml:space="preserve"> classificando-as por</w:t>
       </w:r>
       <w:r>
         <w:t xml:space="preserve"> popularidade</w:t>
@@ -3538,7 +3304,16 @@
         <w:t xml:space="preserve"> alta</w:t>
       </w:r>
       <w:r>
-        <w:t>.Adicionalmente,</w:t>
+        <w:t>.</w:t>
+      </w:r>
+      <w:r>
+        <w:t xml:space="preserve"> </w:t>
+      </w:r>
+      <w:r>
+        <w:t>Adicionalmente,</w:t>
+      </w:r>
+      <w:r>
+        <w:t xml:space="preserve"> </w:t>
       </w:r>
       <w:r>
         <w:t>dentro de</w:t>
@@ -3559,6 +3334,9 @@
         <w:t>é necessário</w:t>
       </w:r>
       <w:r>
+        <w:t xml:space="preserve"> </w:t>
+      </w:r>
+      <w:r>
         <w:t>haver uma ordem pa</w:t>
       </w:r>
       <w:r>
@@ -3571,7 +3349,13 @@
         <w:t xml:space="preserve">. Além disso, </w:t>
       </w:r>
       <w:r>
-        <w:t>a definiçãod</w:t>
+        <w:t>a definição</w:t>
+      </w:r>
+      <w:r>
+        <w:t xml:space="preserve"> </w:t>
+      </w:r>
+      <w:r>
+        <w:t>d</w:t>
       </w:r>
       <w:r>
         <w:t>o que está em primeiro</w:t>
@@ -3658,7 +3442,13 @@
         <w:t>inicialmente conceituado e publicado por Robert W. Floyd em 1962 sob o nome Treesort</w:t>
       </w:r>
       <w:r>
-        <w:t>,s</w:t>
+        <w:t>,</w:t>
+      </w:r>
+      <w:r>
+        <w:t xml:space="preserve"> </w:t>
+      </w:r>
+      <w:r>
+        <w:t>s</w:t>
       </w:r>
       <w:r>
         <w:t>e</w:t>
@@ -3831,7 +3621,7 @@
           <w:szCs w:val="24"/>
         </w:rPr>
       </w:pPr>
-      <w:bookmarkStart w:id="1" w:name="_Toc200439698"/>
+      <w:bookmarkStart w:id="1" w:name="_Toc201083633"/>
       <w:r>
         <w:rPr>
           <w:rFonts w:ascii="Times" w:hAnsi="Times" w:cs="Times"/>
@@ -3878,7 +3668,7 @@
           <w:color w:val="auto"/>
         </w:rPr>
       </w:pPr>
-      <w:bookmarkStart w:id="2" w:name="_Toc200439699"/>
+      <w:bookmarkStart w:id="2" w:name="_Toc201083634"/>
       <w:r>
         <w:rPr>
           <w:color w:val="auto"/>
@@ -4081,15 +3871,23 @@
           <w:sz w:val="24"/>
           <w:szCs w:val="24"/>
         </w:rPr>
-        <w:t xml:space="preserve"> pode ser apresentada como uma ar</w:t>
-      </w:r>
-      <w:r>
-        <w:rPr>
-          <w:rFonts w:ascii="Times" w:hAnsi="Times" w:cs="Times"/>
-          <w:sz w:val="24"/>
-          <w:szCs w:val="24"/>
-        </w:rPr>
-        <w:t xml:space="preserve">vore “uma </w:t>
+        <w:t xml:space="preserve"> </w:t>
+      </w:r>
+      <w:r>
+        <w:rPr>
+          <w:rFonts w:ascii="Times" w:hAnsi="Times" w:cs="Times"/>
+          <w:sz w:val="24"/>
+          <w:szCs w:val="24"/>
+        </w:rPr>
+        <w:t xml:space="preserve">pode ser apresentada como </w:t>
+      </w:r>
+      <w:r>
+        <w:rPr>
+          <w:rFonts w:ascii="Times" w:hAnsi="Times" w:cs="Times"/>
+          <w:sz w:val="24"/>
+          <w:szCs w:val="24"/>
+        </w:rPr>
+        <w:t xml:space="preserve">uma </w:t>
       </w:r>
       <w:r>
         <w:rPr>
@@ -4113,7 +3911,31 @@
           <w:sz w:val="24"/>
           <w:szCs w:val="24"/>
         </w:rPr>
-        <w:t xml:space="preserve">ria com propriedades especiais” ou como um vetor. Para ordenar decrescente precisa construir um </w:t>
+        <w:t>ria com propriedades especiais</w:t>
+      </w:r>
+      <w:r>
+        <w:rPr>
+          <w:rFonts w:ascii="Times" w:hAnsi="Times" w:cs="Times"/>
+          <w:sz w:val="24"/>
+          <w:szCs w:val="24"/>
+        </w:rPr>
+        <w:t xml:space="preserve"> ou como um vetor. Para ordenar</w:t>
+      </w:r>
+      <w:r>
+        <w:rPr>
+          <w:rFonts w:ascii="Times" w:hAnsi="Times" w:cs="Times"/>
+          <w:sz w:val="24"/>
+          <w:szCs w:val="24"/>
+        </w:rPr>
+        <w:t xml:space="preserve"> no formato decrescente é necessário</w:t>
+      </w:r>
+      <w:r>
+        <w:rPr>
+          <w:rFonts w:ascii="Times" w:hAnsi="Times" w:cs="Times"/>
+          <w:sz w:val="24"/>
+          <w:szCs w:val="24"/>
+        </w:rPr>
+        <w:t xml:space="preserve"> construir um </w:t>
       </w:r>
       <w:r>
         <w:rPr>
@@ -4147,27 +3969,59 @@
           <w:sz w:val="24"/>
           <w:szCs w:val="24"/>
         </w:rPr>
-        <w:t xml:space="preserve"> agora p</w:t>
-      </w:r>
-      <w:r>
-        <w:rPr>
-          <w:rFonts w:ascii="Times" w:hAnsi="Times" w:cs="Times"/>
-          <w:sz w:val="24"/>
-          <w:szCs w:val="24"/>
-        </w:rPr>
-        <w:t>ara ordenação crescente constrói-se um</w:t>
-      </w:r>
-      <w:r>
-        <w:rPr>
-          <w:rFonts w:ascii="Times" w:hAnsi="Times" w:cs="Times"/>
-          <w:sz w:val="24"/>
-          <w:szCs w:val="24"/>
-        </w:rPr>
         <w:t xml:space="preserve"> </w:t>
       </w:r>
       <w:r>
         <w:rPr>
           <w:rFonts w:ascii="Times" w:hAnsi="Times" w:cs="Times"/>
+          <w:sz w:val="24"/>
+          <w:szCs w:val="24"/>
+        </w:rPr>
+        <w:t>já</w:t>
+      </w:r>
+      <w:r>
+        <w:rPr>
+          <w:rFonts w:ascii="Times" w:hAnsi="Times" w:cs="Times"/>
+          <w:sz w:val="24"/>
+          <w:szCs w:val="24"/>
+        </w:rPr>
+        <w:t xml:space="preserve"> p</w:t>
+      </w:r>
+      <w:r>
+        <w:rPr>
+          <w:rFonts w:ascii="Times" w:hAnsi="Times" w:cs="Times"/>
+          <w:sz w:val="24"/>
+          <w:szCs w:val="24"/>
+        </w:rPr>
+        <w:t>ara</w:t>
+      </w:r>
+      <w:r>
+        <w:rPr>
+          <w:rFonts w:ascii="Times" w:hAnsi="Times" w:cs="Times"/>
+          <w:sz w:val="24"/>
+          <w:szCs w:val="24"/>
+        </w:rPr>
+        <w:t xml:space="preserve"> uma</w:t>
+      </w:r>
+      <w:r>
+        <w:rPr>
+          <w:rFonts w:ascii="Times" w:hAnsi="Times" w:cs="Times"/>
+          <w:sz w:val="24"/>
+          <w:szCs w:val="24"/>
+        </w:rPr>
+        <w:t xml:space="preserve"> ordenação crescente constrói-se um</w:t>
+      </w:r>
+      <w:r>
+        <w:rPr>
+          <w:rFonts w:ascii="Times" w:hAnsi="Times" w:cs="Times"/>
+          <w:sz w:val="24"/>
+          <w:szCs w:val="24"/>
+        </w:rPr>
+        <w:t xml:space="preserve"> </w:t>
+      </w:r>
+      <w:r>
+        <w:rPr>
+          <w:rFonts w:ascii="Times" w:hAnsi="Times" w:cs="Times"/>
           <w:i/>
           <w:sz w:val="24"/>
           <w:szCs w:val="24"/>
@@ -4238,7 +4092,7 @@
           <w:sz w:val="24"/>
           <w:szCs w:val="24"/>
         </w:rPr>
-        <w:t xml:space="preserve"> o maior elemento fica na raiz</w:t>
+        <w:t xml:space="preserve"> localiza-se o maior elemento.</w:t>
       </w:r>
     </w:p>
     <w:p>
@@ -4277,7 +4131,7 @@
           <w:color w:val="auto"/>
         </w:rPr>
       </w:pPr>
-      <w:bookmarkStart w:id="3" w:name="_Toc200439700"/>
+      <w:bookmarkStart w:id="3" w:name="_Toc201083635"/>
       <w:r>
         <w:rPr>
           <w:color w:val="auto"/>
@@ -7223,7 +7077,7 @@
           <w:color w:val="auto"/>
         </w:rPr>
       </w:pPr>
-      <w:bookmarkStart w:id="4" w:name="_Toc200439701"/>
+      <w:bookmarkStart w:id="4" w:name="_Toc201083636"/>
       <w:r>
         <w:rPr>
           <w:color w:val="auto"/>
@@ -7463,7 +7317,7 @@
           <w:color w:val="auto"/>
         </w:rPr>
       </w:pPr>
-      <w:bookmarkStart w:id="5" w:name="_Toc200439702"/>
+      <w:bookmarkStart w:id="5" w:name="_Toc201083637"/>
       <w:r>
         <w:rPr>
           <w:color w:val="auto"/>
@@ -7610,7 +7464,7 @@
           <w:color w:val="auto"/>
         </w:rPr>
       </w:pPr>
-      <w:bookmarkStart w:id="6" w:name="_Toc200439703"/>
+      <w:bookmarkStart w:id="6" w:name="_Toc201083638"/>
       <w:r>
         <w:rPr>
           <w:color w:val="auto"/>
@@ -7702,7 +7556,7 @@
           <w:color w:val="auto"/>
         </w:rPr>
       </w:pPr>
-      <w:bookmarkStart w:id="7" w:name="_Toc200439704"/>
+      <w:bookmarkStart w:id="7" w:name="_Toc201083639"/>
       <w:r>
         <w:rPr>
           <w:color w:val="auto"/>
@@ -7836,7 +7690,7 @@
           <w:szCs w:val="24"/>
         </w:rPr>
       </w:pPr>
-      <w:bookmarkStart w:id="8" w:name="_Toc200439705"/>
+      <w:bookmarkStart w:id="8" w:name="_Toc201083640"/>
       <w:r>
         <w:rPr>
           <w:rFonts w:ascii="Times" w:hAnsi="Times" w:cs="Times"/>
@@ -8042,7 +7896,7 @@
           <w:szCs w:val="24"/>
         </w:rPr>
       </w:pPr>
-      <w:bookmarkStart w:id="9" w:name="_Toc200439706"/>
+      <w:bookmarkStart w:id="9" w:name="_Toc201083641"/>
       <w:r>
         <w:rPr>
           <w:rFonts w:ascii="Times" w:hAnsi="Times" w:cs="Times"/>
@@ -8074,17 +7928,27 @@
     </w:p>
     <w:p>
       <w:pPr>
+        <w:pStyle w:val="NormalRelatorio"/>
+      </w:pPr>
+      <w:r>
+        <w:t>Como em todo algoritmo de ordenação, o Heapsort possui determinadas desvantagens dependo do propósito de sua aplicação.</w:t>
+      </w:r>
+    </w:p>
+    <w:p>
+      <w:pPr>
         <w:pStyle w:val="Titulo3Relatorio"/>
         <w:rPr>
           <w:color w:val="auto"/>
         </w:rPr>
       </w:pPr>
+      <w:bookmarkStart w:id="10" w:name="_Toc201083642"/>
       <w:r>
         <w:rPr>
           <w:color w:val="auto"/>
         </w:rPr>
         <w:t>Instabilidade</w:t>
       </w:r>
+      <w:bookmarkEnd w:id="10"/>
     </w:p>
     <w:p>
       <w:pPr>
@@ -8161,12 +8025,14 @@
           <w:color w:val="auto"/>
         </w:rPr>
       </w:pPr>
+      <w:bookmarkStart w:id="11" w:name="_Toc201083643"/>
       <w:r>
         <w:rPr>
           <w:color w:val="auto"/>
         </w:rPr>
         <w:t>Não Ideal para Conjuntos de Dados Pequenos</w:t>
       </w:r>
+      <w:bookmarkEnd w:id="11"/>
     </w:p>
     <w:p>
       <w:pPr>
@@ -8322,6 +8188,26 @@
     </w:p>
     <w:p>
       <w:pPr>
+        <w:rPr>
+          <w:rFonts w:ascii="Times" w:eastAsiaTheme="majorEastAsia" w:hAnsi="Times" w:cs="Times"/>
+          <w:b/>
+          <w:bCs/>
+          <w:sz w:val="24"/>
+          <w:szCs w:val="24"/>
+        </w:rPr>
+      </w:pPr>
+      <w:bookmarkStart w:id="12" w:name="_Toc201083644"/>
+      <w:r>
+        <w:rPr>
+          <w:rFonts w:ascii="Times" w:hAnsi="Times" w:cs="Times"/>
+          <w:sz w:val="24"/>
+          <w:szCs w:val="24"/>
+        </w:rPr>
+        <w:br w:type="page"/>
+      </w:r>
+    </w:p>
+    <w:p>
+      <w:pPr>
         <w:pStyle w:val="Ttulo2"/>
         <w:spacing w:line="480" w:lineRule="auto"/>
         <w:jc w:val="both"/>
@@ -8332,7 +8218,6 @@
           <w:szCs w:val="24"/>
         </w:rPr>
       </w:pPr>
-      <w:bookmarkStart w:id="10" w:name="_Toc200439707"/>
       <w:r>
         <w:rPr>
           <w:rFonts w:ascii="Times" w:hAnsi="Times" w:cs="Times"/>
@@ -8340,6 +8225,7 @@
           <w:sz w:val="24"/>
           <w:szCs w:val="24"/>
         </w:rPr>
+        <w:lastRenderedPageBreak/>
         <w:t xml:space="preserve">Exemplos </w:t>
       </w:r>
       <w:r>
@@ -8351,7 +8237,7 @@
         </w:rPr>
         <w:t>de Como O Processo de Ordenação Acontece.</w:t>
       </w:r>
-      <w:bookmarkEnd w:id="10"/>
+      <w:bookmarkEnd w:id="12"/>
     </w:p>
     <w:p>
       <w:pPr>
@@ -8400,11 +8286,7 @@
         <w:t xml:space="preserve"> </w:t>
       </w:r>
       <w:r>
-        <w:t xml:space="preserve">faz com </w:t>
-      </w:r>
-      <w:r>
-        <w:lastRenderedPageBreak/>
-        <w:t xml:space="preserve">que esta propriedade garanta que </w:t>
+        <w:t xml:space="preserve">faz com que esta propriedade garanta que </w:t>
       </w:r>
       <w:r>
         <w:t>o valor de todos os nós seja</w:t>
@@ -8539,9 +8421,22 @@
     </w:p>
     <w:p>
       <w:pPr>
+        <w:rPr>
+          <w:rFonts w:ascii="Times" w:hAnsi="Times" w:cs="Times"/>
+          <w:sz w:val="24"/>
+          <w:szCs w:val="24"/>
+        </w:rPr>
+      </w:pPr>
+      <w:r>
+        <w:br w:type="page"/>
+      </w:r>
+    </w:p>
+    <w:p>
+      <w:pPr>
         <w:pStyle w:val="NormalRelatorio"/>
       </w:pPr>
       <w:r>
+        <w:lastRenderedPageBreak/>
         <w:t xml:space="preserve">A estrutura </w:t>
       </w:r>
       <w:r>
@@ -8693,22 +8588,9 @@
     </w:p>
     <w:p>
       <w:pPr>
-        <w:rPr>
-          <w:rFonts w:ascii="Times" w:hAnsi="Times" w:cs="Times"/>
-          <w:sz w:val="24"/>
-          <w:szCs w:val="24"/>
-        </w:rPr>
-      </w:pPr>
-      <w:r>
-        <w:br w:type="page"/>
-      </w:r>
-    </w:p>
-    <w:p>
-      <w:pPr>
         <w:pStyle w:val="NormalRelatorio"/>
       </w:pPr>
       <w:r>
-        <w:lastRenderedPageBreak/>
         <w:t>1. Seleçã</w:t>
       </w:r>
       <w:r>
@@ -8826,7 +8708,7 @@
           <w:szCs w:val="24"/>
         </w:rPr>
       </w:pPr>
-      <w:bookmarkStart w:id="11" w:name="_Toc200439708"/>
+      <w:bookmarkStart w:id="13" w:name="_Toc201083645"/>
       <w:r>
         <w:rPr>
           <w:rFonts w:ascii="Times" w:hAnsi="Times" w:cs="Times"/>
@@ -8836,7 +8718,7 @@
         </w:rPr>
         <w:t>Implementação e Testes</w:t>
       </w:r>
-      <w:bookmarkEnd w:id="11"/>
+      <w:bookmarkEnd w:id="13"/>
     </w:p>
     <w:p>
       <w:pPr>
@@ -8846,7 +8728,7 @@
           <w:color w:val="auto"/>
         </w:rPr>
       </w:pPr>
-      <w:bookmarkStart w:id="12" w:name="_Toc200439709"/>
+      <w:bookmarkStart w:id="14" w:name="_Toc201083646"/>
       <w:r>
         <w:rPr>
           <w:color w:val="auto"/>
@@ -8877,7 +8759,7 @@
         </w:rPr>
         <w:t>o Algoritmo.</w:t>
       </w:r>
-      <w:bookmarkEnd w:id="12"/>
+      <w:bookmarkEnd w:id="14"/>
     </w:p>
     <w:p>
       <w:pPr>
@@ -8911,11 +8793,12 @@
           <w:color w:val="auto"/>
         </w:rPr>
       </w:pPr>
-      <w:bookmarkStart w:id="13" w:name="_Toc200439710"/>
+      <w:bookmarkStart w:id="15" w:name="_Toc201083647"/>
       <w:r>
         <w:rPr>
           <w:color w:val="auto"/>
         </w:rPr>
+        <w:lastRenderedPageBreak/>
         <w:t xml:space="preserve">Algoritmo </w:t>
       </w:r>
       <w:r>
@@ -8948,7 +8831,7 @@
         </w:rPr>
         <w:t>Dados Usando C</w:t>
       </w:r>
-      <w:bookmarkEnd w:id="13"/>
+      <w:bookmarkEnd w:id="15"/>
     </w:p>
     <w:p>
       <w:pPr>
@@ -9171,7 +9054,6 @@
         <w:rPr>
           <w:color w:val="auto"/>
         </w:rPr>
-        <w:lastRenderedPageBreak/>
         <w:t>PQINSERT</w:t>
       </w:r>
     </w:p>
@@ -9604,7 +9486,16 @@
           <w:sz w:val="24"/>
           <w:szCs w:val="24"/>
         </w:rPr>
-        <w:t xml:space="preserve"> mesmo neste percurso(isto é, </w:t>
+        <w:t xml:space="preserve"> mesmo neste </w:t>
+      </w:r>
+      <w:r>
+        <w:rPr>
+          <w:rFonts w:ascii="Times" w:eastAsiaTheme="minorEastAsia" w:hAnsi="Times" w:cs="Times"/>
+          <w:sz w:val="24"/>
+          <w:szCs w:val="24"/>
+        </w:rPr>
+        <w:lastRenderedPageBreak/>
+        <w:t xml:space="preserve">percurso(isto é, </w:t>
       </w:r>
       <w:r>
         <w:rPr>
@@ -9859,7 +9750,6 @@
         <w:pStyle w:val="NormalRelatorio"/>
       </w:pPr>
       <w:r>
-        <w:lastRenderedPageBreak/>
         <w:t xml:space="preserve">Agora esta implementação de </w:t>
       </w:r>
       <w:r>
@@ -10434,6 +10324,22 @@
     </w:p>
     <w:p>
       <w:pPr>
+        <w:rPr>
+          <w:rFonts w:ascii="Times" w:eastAsiaTheme="majorEastAsia" w:hAnsi="Times" w:cs="Times"/>
+          <w:b/>
+          <w:bCs/>
+          <w:i/>
+          <w:iCs/>
+          <w:sz w:val="24"/>
+          <w:szCs w:val="24"/>
+        </w:rPr>
+      </w:pPr>
+      <w:r>
+        <w:br w:type="page"/>
+      </w:r>
+    </w:p>
+    <w:p>
+      <w:pPr>
         <w:pStyle w:val="Titulo4Relatorio"/>
         <w:spacing w:line="480" w:lineRule="auto"/>
         <w:jc w:val="both"/>
@@ -10445,6 +10351,7 @@
         <w:rPr>
           <w:color w:val="auto"/>
         </w:rPr>
+        <w:lastRenderedPageBreak/>
         <w:t>LARGESON</w:t>
       </w:r>
     </w:p>
@@ -10877,7 +10784,6 @@
         <w:rPr>
           <w:color w:val="auto"/>
         </w:rPr>
-        <w:lastRenderedPageBreak/>
         <w:t>PQMAXDELETE</w:t>
       </w:r>
     </w:p>
@@ -11384,6 +11290,7 @@
         <w:pStyle w:val="NormalRelatorio"/>
       </w:pPr>
       <w:r>
+        <w:lastRenderedPageBreak/>
         <w:t xml:space="preserve">Em um </w:t>
       </w:r>
       <w:r>
@@ -12545,6 +12452,21 @@
     </w:p>
     <w:p>
       <w:pPr>
+        <w:rPr>
+          <w:rFonts w:ascii="Times" w:eastAsiaTheme="majorEastAsia" w:hAnsi="Times" w:cs="Times"/>
+          <w:b/>
+          <w:bCs/>
+          <w:sz w:val="24"/>
+          <w:szCs w:val="24"/>
+        </w:rPr>
+      </w:pPr>
+      <w:bookmarkStart w:id="16" w:name="_Toc201083648"/>
+      <w:r>
+        <w:br w:type="page"/>
+      </w:r>
+    </w:p>
+    <w:p>
+      <w:pPr>
         <w:pStyle w:val="Titulo3Relatorio"/>
         <w:spacing w:line="480" w:lineRule="auto"/>
         <w:jc w:val="both"/>
@@ -12552,11 +12474,11 @@
           <w:color w:val="auto"/>
         </w:rPr>
       </w:pPr>
-      <w:bookmarkStart w:id="14" w:name="_Toc200439711"/>
       <w:r>
         <w:rPr>
           <w:color w:val="auto"/>
         </w:rPr>
+        <w:lastRenderedPageBreak/>
         <w:t>Algoritmo d</w:t>
       </w:r>
       <w:r>
@@ -12577,6 +12499,7 @@
         </w:rPr>
         <w:t>Amit G. Maru</w:t>
       </w:r>
+      <w:bookmarkEnd w:id="16"/>
     </w:p>
     <w:p>
       <w:pPr>
@@ -13060,16 +12983,7 @@
           <w:sz w:val="24"/>
           <w:szCs w:val="24"/>
         </w:rPr>
-        <w:t xml:space="preserve">é </w:t>
-      </w:r>
-      <w:r>
-        <w:rPr>
-          <w:rFonts w:ascii="Times" w:eastAsiaTheme="minorEastAsia" w:hAnsi="Times" w:cs="Times"/>
-          <w:sz w:val="24"/>
-          <w:szCs w:val="24"/>
-        </w:rPr>
-        <w:lastRenderedPageBreak/>
-        <w:t xml:space="preserve">chamada, considerando como parâmetros: o array representado em </w:t>
+        <w:t xml:space="preserve">é chamada, considerando como parâmetros: o array representado em </w:t>
       </w:r>
       <m:oMath>
         <m:r>
@@ -13096,7 +13010,15 @@
             <w:sz w:val="24"/>
             <w:szCs w:val="24"/>
           </w:rPr>
-          <m:t>heapsize</m:t>
+          <m:t>he</m:t>
+        </m:r>
+        <m:r>
+          <w:rPr>
+            <w:rFonts w:ascii="Cambria Math" w:eastAsiaTheme="minorEastAsia" w:hAnsi="Cambria Math" w:cs="Times"/>
+            <w:sz w:val="24"/>
+            <w:szCs w:val="24"/>
+          </w:rPr>
+          <m:t>apsize</m:t>
         </m:r>
       </m:oMath>
       <w:r>
@@ -13357,7 +13279,16 @@
           <w:sz w:val="24"/>
           <w:szCs w:val="24"/>
         </w:rPr>
-        <w:t xml:space="preserve">será decrementado e o procedimento </w:t>
+        <w:t xml:space="preserve">será decrementado e o </w:t>
+      </w:r>
+      <w:r>
+        <w:rPr>
+          <w:rFonts w:ascii="Times" w:eastAsiaTheme="minorEastAsia" w:hAnsi="Times" w:cs="Times"/>
+          <w:sz w:val="24"/>
+          <w:szCs w:val="24"/>
+        </w:rPr>
+        <w:lastRenderedPageBreak/>
+        <w:t xml:space="preserve">procedimento </w:t>
       </w:r>
       <w:r>
         <w:rPr>
@@ -13854,15 +13785,7 @@
           <w:rFonts w:eastAsiaTheme="minorEastAsia"/>
           <w:lang w:val="en-US"/>
         </w:rPr>
-        <w:t xml:space="preserve"> será decrementado e o </w:t>
-      </w:r>
-      <w:r>
-        <w:rPr>
-          <w:rFonts w:eastAsiaTheme="minorEastAsia"/>
-          <w:lang w:val="en-US"/>
-        </w:rPr>
-        <w:lastRenderedPageBreak/>
-        <w:t xml:space="preserve">procedimento </w:t>
+        <w:t xml:space="preserve"> será decrementado e o procedimento </w:t>
       </w:r>
       <w:r>
         <w:rPr>
@@ -14199,6 +14122,7 @@
         <w:rPr>
           <w:rFonts w:eastAsiaTheme="minorEastAsia"/>
         </w:rPr>
+        <w:lastRenderedPageBreak/>
         <w:t>Dentre as condicionais conseguintes, a primeira condição checa se</w:t>
       </w:r>
       <w:r>
@@ -14545,14 +14469,7 @@
         <w:rPr>
           <w:rFonts w:eastAsiaTheme="minorEastAsia"/>
         </w:rPr>
-        <w:t xml:space="preserve"> </w:t>
-      </w:r>
-      <w:r>
-        <w:rPr>
-          <w:rFonts w:eastAsiaTheme="minorEastAsia"/>
-        </w:rPr>
-        <w:lastRenderedPageBreak/>
-        <w:t xml:space="preserve">neste array(representado por </w:t>
+        <w:t xml:space="preserve"> neste array(representado por </w:t>
       </w:r>
       <m:oMath>
         <m:r>
@@ -14784,7 +14701,14 @@
         <w:rPr>
           <w:rFonts w:eastAsiaTheme="minorEastAsia"/>
         </w:rPr>
-        <w:t xml:space="preserve">. A sua proposta é solicitar ao usuário o valor do tamanho array(representado por </w:t>
+        <w:t xml:space="preserve">. A sua proposta é solicitar ao </w:t>
+      </w:r>
+      <w:r>
+        <w:rPr>
+          <w:rFonts w:eastAsiaTheme="minorEastAsia"/>
+        </w:rPr>
+        <w:lastRenderedPageBreak/>
+        <w:t xml:space="preserve">usuário o valor do tamanho array(representado por </w:t>
       </w:r>
       <w:r>
         <w:rPr>
@@ -14899,6 +14823,7 @@
           <w:lang w:val="en-US"/>
         </w:rPr>
       </w:pPr>
+      <w:bookmarkStart w:id="17" w:name="_Toc201083649"/>
       <w:r>
         <w:rPr>
           <w:color w:val="auto"/>
@@ -14906,6 +14831,7 @@
         </w:rPr>
         <w:t>Algoritmo do Site GeeksForGeeks</w:t>
       </w:r>
+      <w:bookmarkEnd w:id="17"/>
     </w:p>
     <w:p>
       <w:pPr>
@@ -15057,7 +14983,6 @@
         <w:rPr>
           <w:color w:val="auto"/>
         </w:rPr>
-        <w:lastRenderedPageBreak/>
         <w:t>HEAPIFY</w:t>
       </w:r>
     </w:p>
@@ -15522,7 +15447,16 @@
           <w:sz w:val="24"/>
           <w:szCs w:val="24"/>
         </w:rPr>
-        <w:t xml:space="preserve"> valerá a equação </w:t>
+        <w:t xml:space="preserve"> valerá a </w:t>
+      </w:r>
+      <w:r>
+        <w:rPr>
+          <w:rFonts w:ascii="Times" w:eastAsiaTheme="minorEastAsia" w:hAnsi="Times" w:cs="Times"/>
+          <w:sz w:val="24"/>
+          <w:szCs w:val="24"/>
+        </w:rPr>
+        <w:lastRenderedPageBreak/>
+        <w:t xml:space="preserve">equação </w:t>
       </w:r>
       <m:oMath>
         <m:r>
@@ -15856,11 +15790,7 @@
         <w:t>maximum</w:t>
       </w:r>
       <w:r>
-        <w:t xml:space="preserve">), prosseguir com </w:t>
-      </w:r>
-      <w:r>
-        <w:lastRenderedPageBreak/>
-        <w:t xml:space="preserve">swap(alternância) e </w:t>
+        <w:t xml:space="preserve">), prosseguir com swap(alternância) e </w:t>
       </w:r>
       <w:r>
         <w:rPr>
@@ -16122,6 +16052,7 @@
         <w:rPr>
           <w:color w:val="auto"/>
         </w:rPr>
+        <w:lastRenderedPageBreak/>
         <w:t>HEAPSORT</w:t>
       </w:r>
     </w:p>
@@ -16584,14 +16515,7 @@
         <w:rPr>
           <w:rFonts w:eastAsiaTheme="minorEastAsia"/>
         </w:rPr>
-        <w:t xml:space="preserve"> irá decrementar, </w:t>
-      </w:r>
-      <w:r>
-        <w:rPr>
-          <w:rFonts w:eastAsiaTheme="minorEastAsia"/>
-        </w:rPr>
-        <w:lastRenderedPageBreak/>
-        <w:t xml:space="preserve">ou seja, subtrair a posição a cada execução. Em seguida, o procedimento </w:t>
+        <w:t xml:space="preserve"> irá decrementar, ou seja, subtrair a posição a cada execução. Em seguida, o procedimento </w:t>
       </w:r>
       <w:r>
         <w:rPr>
@@ -16787,7 +16711,16 @@
           <w:sz w:val="24"/>
           <w:szCs w:val="24"/>
         </w:rPr>
-        <w:t xml:space="preserve">irá ser incrementado cada vez que for executado. E dentro deste laço será impresso a posição do array representado por </w:t>
+        <w:t xml:space="preserve">irá ser incrementado cada vez </w:t>
+      </w:r>
+      <w:r>
+        <w:rPr>
+          <w:rFonts w:ascii="Times" w:hAnsi="Times" w:cs="Times"/>
+          <w:sz w:val="24"/>
+          <w:szCs w:val="24"/>
+        </w:rPr>
+        <w:lastRenderedPageBreak/>
+        <w:t xml:space="preserve">que for executado. E dentro deste laço será impresso a posição do array representado por </w:t>
       </w:r>
       <m:oMath>
         <m:r>
@@ -16931,6 +16864,7 @@
           <w:color w:val="auto"/>
         </w:rPr>
       </w:pPr>
+      <w:bookmarkStart w:id="18" w:name="_Toc201083650"/>
       <w:r>
         <w:rPr>
           <w:color w:val="auto"/>
@@ -16956,7 +16890,7 @@
         </w:rPr>
         <w:t>Programmiz</w:t>
       </w:r>
-      <w:bookmarkEnd w:id="14"/>
+      <w:bookmarkEnd w:id="18"/>
     </w:p>
     <w:p>
       <w:pPr>
@@ -17333,6 +17267,22 @@
           <w:szCs w:val="24"/>
         </w:rPr>
         <w:t>aptações estarão mais evidentes.</w:t>
+      </w:r>
+    </w:p>
+    <w:p>
+      <w:pPr>
+        <w:rPr>
+          <w:rFonts w:ascii="Times" w:eastAsiaTheme="majorEastAsia" w:hAnsi="Times" w:cs="Times"/>
+          <w:b/>
+          <w:bCs/>
+          <w:i/>
+          <w:iCs/>
+          <w:sz w:val="24"/>
+          <w:szCs w:val="24"/>
+        </w:rPr>
+      </w:pPr>
+      <w:r>
+        <w:br w:type="page"/>
       </w:r>
     </w:p>
     <w:p>
@@ -19102,7 +19052,7 @@
           <w:color w:val="auto"/>
         </w:rPr>
       </w:pPr>
-      <w:bookmarkStart w:id="15" w:name="_Toc200439712"/>
+      <w:bookmarkStart w:id="19" w:name="_Toc201083651"/>
       <w:r>
         <w:rPr>
           <w:color w:val="auto"/>
@@ -19122,7 +19072,7 @@
         </w:rPr>
         <w:t>os Testes</w:t>
       </w:r>
-      <w:bookmarkEnd w:id="15"/>
+      <w:bookmarkEnd w:id="19"/>
     </w:p>
     <w:p>
       <w:pPr>
@@ -19215,14 +19165,14 @@
           <w:color w:val="auto"/>
         </w:rPr>
       </w:pPr>
-      <w:bookmarkStart w:id="16" w:name="_Toc200439713"/>
+      <w:bookmarkStart w:id="20" w:name="_Toc201083652"/>
       <w:r>
         <w:rPr>
           <w:color w:val="auto"/>
         </w:rPr>
         <w:t>Ordered Input</w:t>
       </w:r>
-      <w:bookmarkEnd w:id="16"/>
+      <w:bookmarkEnd w:id="20"/>
     </w:p>
     <w:p>
       <w:pPr>
@@ -19487,9 +19437,22 @@
     </w:p>
     <w:p>
       <w:pPr>
+        <w:rPr>
+          <w:rFonts w:ascii="Times" w:hAnsi="Times" w:cs="Times"/>
+          <w:sz w:val="24"/>
+          <w:szCs w:val="24"/>
+        </w:rPr>
+      </w:pPr>
+      <w:r>
+        <w:br w:type="page"/>
+      </w:r>
+    </w:p>
+    <w:p>
+      <w:pPr>
         <w:pStyle w:val="NormalRelatorio"/>
       </w:pPr>
       <w:r>
+        <w:lastRenderedPageBreak/>
         <w:t xml:space="preserve">Notou-se que a eficiência do algoritmo </w:t>
       </w:r>
       <w:r>
@@ -19554,11 +19517,7 @@
         </m:func>
       </m:oMath>
       <w:r>
-        <w:t xml:space="preserve"> em todos os </w:t>
-      </w:r>
-      <w:r>
-        <w:lastRenderedPageBreak/>
-        <w:t xml:space="preserve">casos. O </w:t>
+        <w:t xml:space="preserve"> em todos os casos. O </w:t>
       </w:r>
       <w:r>
         <w:rPr>
@@ -19588,9 +19547,6 @@
         <w:t xml:space="preserve">O </w:t>
       </w:r>
       <w:r>
-        <w:rPr>
-          <w:b/>
-        </w:rPr>
         <w:t>Selectionsort</w:t>
       </w:r>
       <w:r>
@@ -19652,9 +19608,6 @@
         <w:t xml:space="preserve">Já o </w:t>
       </w:r>
       <w:r>
-        <w:rPr>
-          <w:b/>
-        </w:rPr>
         <w:t>Quicksort</w:t>
       </w:r>
       <w:r>
@@ -19688,15 +19641,9 @@
         <w:t xml:space="preserve">, tendo a mesma complexidade de </w:t>
       </w:r>
       <w:r>
-        <w:rPr>
-          <w:b/>
-        </w:rPr>
         <w:t>Heap</w:t>
       </w:r>
       <w:r>
-        <w:rPr>
-          <w:b/>
-        </w:rPr>
         <w:t>sort</w:t>
       </w:r>
       <m:oMath>
@@ -19942,7 +19889,6 @@
           <w:szCs w:val="24"/>
         </w:rPr>
       </w:pPr>
-      <w:bookmarkStart w:id="17" w:name="_Toc200439714"/>
       <w:r>
         <w:br w:type="page"/>
       </w:r>
@@ -19956,6 +19902,7 @@
           <w:color w:val="auto"/>
         </w:rPr>
       </w:pPr>
+      <w:bookmarkStart w:id="21" w:name="_Toc201083653"/>
       <w:r>
         <w:rPr>
           <w:color w:val="auto"/>
@@ -19963,7 +19910,7 @@
         <w:lastRenderedPageBreak/>
         <w:t>Reverse Ordered Input</w:t>
       </w:r>
-      <w:bookmarkEnd w:id="17"/>
+      <w:bookmarkEnd w:id="21"/>
     </w:p>
     <w:p>
       <w:pPr>
@@ -20214,28 +20161,13 @@
         <w:t xml:space="preserve">Notou-se que a eficiência do algoritmo </w:t>
       </w:r>
       <w:r>
-        <w:rPr>
-          <w:b/>
-        </w:rPr>
-        <w:t>Quicksort</w:t>
-      </w:r>
-      <w:r>
-        <w:t xml:space="preserve"> é também superior aos demais algoritmos apresentados, mesmo o </w:t>
-      </w:r>
-      <w:r>
-        <w:rPr>
-          <w:b/>
-        </w:rPr>
+        <w:t xml:space="preserve">Quicksort é também superior aos demais algoritmos apresentados, mesmo o </w:t>
+      </w:r>
+      <w:r>
         <w:t>Heap</w:t>
       </w:r>
       <w:r>
-        <w:rPr>
-          <w:b/>
-        </w:rPr>
-        <w:t>sort</w:t>
-      </w:r>
-      <w:r>
-        <w:t xml:space="preserve"> mantendo a mesma complexidade </w:t>
+        <w:t xml:space="preserve">sort mantendo a mesma complexidade </w:t>
       </w:r>
       <m:oMath>
         <m:r>
@@ -20299,16 +20231,7 @@
         <w:t>heap</w:t>
       </w:r>
       <w:r>
-        <w:t xml:space="preserve">, afetando na sua corrida temporal. O </w:t>
-      </w:r>
-      <w:r>
-        <w:rPr>
-          <w:b/>
-        </w:rPr>
-        <w:t>Selectionsort</w:t>
-      </w:r>
-      <w:r>
-        <w:t xml:space="preserve"> é um algoritmo bem ineficiente, pois o seu número exagerado de comparações afeta de forma significativa o tempo de processamento, mantendo a grandeza </w:t>
+        <w:t xml:space="preserve">, afetando na sua corrida temporal. O Selectionsort é um algoritmo bem ineficiente, pois o seu número exagerado de comparações afeta de forma significativa o tempo de processamento, mantendo a grandeza </w:t>
       </w:r>
       <m:oMath>
         <m:r>
@@ -20357,16 +20280,10 @@
         <w:t xml:space="preserve"> em todos os casos</w:t>
       </w:r>
       <w:r>
-        <w:t xml:space="preserve">. Já o </w:t>
-      </w:r>
-      <w:r>
-        <w:rPr>
-          <w:b/>
-        </w:rPr>
-        <w:t>Quicksort</w:t>
-      </w:r>
-      <w:r>
-        <w:t>, é superior devido as suas operações eficientes de particionamento do vetor,</w:t>
+        <w:t>. Já o Quicksort, é superior devido as suas operações eficientes de particionamento</w:t>
+      </w:r>
+      <w:r>
+        <w:t xml:space="preserve"> do vetor,</w:t>
       </w:r>
       <w:r>
         <w:t xml:space="preserve"> nas </w:t>
@@ -20643,7 +20560,7 @@
           <w:color w:val="auto"/>
         </w:rPr>
       </w:pPr>
-      <w:bookmarkStart w:id="18" w:name="_Toc200439715"/>
+      <w:bookmarkStart w:id="22" w:name="_Toc201083654"/>
       <w:r>
         <w:rPr>
           <w:color w:val="auto"/>
@@ -20651,7 +20568,7 @@
         <w:lastRenderedPageBreak/>
         <w:t>Uniform Input</w:t>
       </w:r>
-      <w:bookmarkEnd w:id="18"/>
+      <w:bookmarkEnd w:id="22"/>
     </w:p>
     <w:p>
       <w:pPr>
@@ -20694,27 +20611,28 @@
         <w:t>rdenados vetores de tamanhos de:</w:t>
       </w:r>
       <w:r>
-        <w:t xml:space="preserve"> 10.000 a 4.000.000 de elementos. Foram executados os algoritmos de ordenação </w:t>
-      </w:r>
-      <w:r>
-        <w:rPr>
-          <w:b/>
+        <w:t xml:space="preserve"> 10.000 a 4.000.000 de elementos. Foram executados os algoritmos de </w:t>
+      </w:r>
+      <w:r>
+        <w:t xml:space="preserve">ordenação </w:t>
+      </w:r>
+      <w:r>
+        <w:rPr>
           <w:iCs/>
         </w:rPr>
-        <w:t>Quicksort</w:t>
+        <w:t>Quicksort, Selectionsort</w:t>
       </w:r>
       <w:r>
         <w:rPr>
           <w:iCs/>
         </w:rPr>
-        <w:t xml:space="preserve">, </w:t>
-      </w:r>
-      <w:r>
-        <w:rPr>
-          <w:b/>
+        <w:t>, Inser</w:t>
+      </w:r>
+      <w:r>
+        <w:rPr>
           <w:iCs/>
         </w:rPr>
-        <w:t>Selectionsort</w:t>
+        <w:t>tionsort</w:t>
       </w:r>
       <w:r>
         <w:rPr>
@@ -20724,26 +20642,21 @@
       </w:r>
       <w:r>
         <w:rPr>
-          <w:b/>
           <w:iCs/>
         </w:rPr>
         <w:t>Heap</w:t>
       </w:r>
       <w:r>
         <w:rPr>
-          <w:b/>
           <w:iCs/>
         </w:rPr>
-        <w:t>sort</w:t>
-      </w:r>
-      <w:r>
-        <w:rPr>
-          <w:iCs/>
-        </w:rPr>
-        <w:t>,</w:t>
-      </w:r>
-      <w:r>
-        <w:t xml:space="preserve"> e os seus tempos de execução foram comparados na tabela a seguir:</w:t>
+        <w:t>sort,</w:t>
+      </w:r>
+      <w:r>
+        <w:t xml:space="preserve"> e os seus</w:t>
+      </w:r>
+      <w:r>
+        <w:t xml:space="preserve"> tempos de execução foram comparados na tabela a seguir:</w:t>
       </w:r>
     </w:p>
     <w:p>
@@ -20904,31 +20817,16 @@
         <w:keepNext/>
       </w:pPr>
       <w:r>
-        <w:t xml:space="preserve">Notou-se que a eficiência do algoritmo </w:t>
-      </w:r>
-      <w:r>
-        <w:rPr>
-          <w:b/>
-        </w:rPr>
-        <w:t>Quicksort</w:t>
-      </w:r>
-      <w:r>
-        <w:t xml:space="preserve"> permaneceu superior aos demais algoritmos apresentados, mesmo o </w:t>
-      </w:r>
-      <w:r>
-        <w:rPr>
-          <w:b/>
-        </w:rPr>
+        <w:t xml:space="preserve">Notou-se que a eficiência do </w:t>
+      </w:r>
+      <w:r>
+        <w:t xml:space="preserve">algoritmo Quicksort permaneceu superior aos demais algoritmos apresentados, mesmo o </w:t>
+      </w:r>
+      <w:r>
         <w:t>Heap</w:t>
       </w:r>
       <w:r>
-        <w:rPr>
-          <w:b/>
-        </w:rPr>
-        <w:t>sort</w:t>
-      </w:r>
-      <w:r>
-        <w:t xml:space="preserve"> mantendo a mesma complexidade </w:t>
+        <w:t xml:space="preserve">sort mantendo a mesma complexidade </w:t>
       </w:r>
       <m:oMath>
         <m:r>
@@ -20992,16 +20890,10 @@
         <w:t>heap</w:t>
       </w:r>
       <w:r>
-        <w:t xml:space="preserve">, afetando na sua corrida temporal. O </w:t>
-      </w:r>
-      <w:r>
-        <w:rPr>
-          <w:b/>
-        </w:rPr>
-        <w:t>Selectionsort</w:t>
-      </w:r>
-      <w:r>
-        <w:t xml:space="preserve"> é um algoritmo bem ineficiente, pois o seu número exagerado de comparações afeta de forma significativa o tempo de processamento, mantendo a grandeza </w:t>
+        <w:t>, afetando na sua corrida temporal. O Selectionsort é um algoritmo bem ineficiente, pois o seu número exagerado de comparações afeta de</w:t>
+      </w:r>
+      <w:r>
+        <w:t xml:space="preserve"> forma significativa o tempo de processamento, mantendo a grandeza </w:t>
       </w:r>
       <m:oMath>
         <m:r>
@@ -21053,13 +20945,10 @@
         <w:t xml:space="preserve">. Já o </w:t>
       </w:r>
       <w:r>
-        <w:rPr>
-          <w:b/>
-        </w:rPr>
-        <w:t>Quicksort</w:t>
-      </w:r>
-      <w:r>
-        <w:t xml:space="preserve">, é superior devido as suas operações eficientes de particionamento do vetor, </w:t>
+        <w:t>Quicksort, é superior devido as suas operações eficientes de particionamento do vetor,</w:t>
+      </w:r>
+      <w:r>
+        <w:t xml:space="preserve"> </w:t>
       </w:r>
       <w:r>
         <w:lastRenderedPageBreak/>
@@ -21072,32 +20961,17 @@
         <w:t xml:space="preserve">, menos execuções de trocas e comparações mais leves. Atuando de forma mais efetiva quanto ao uso de processamento, tendo a mesma complexidade de </w:t>
       </w:r>
       <w:r>
-        <w:rPr>
-          <w:b/>
-        </w:rPr>
         <w:t>Heap</w:t>
       </w:r>
       <w:r>
-        <w:rPr>
-          <w:b/>
-        </w:rPr>
         <w:t>sort</w:t>
       </w:r>
       <m:oMath>
-        <m:r>
-          <m:rPr>
-            <m:sty m:val="bi"/>
-          </m:rPr>
-          <w:rPr>
-            <w:rFonts w:ascii="Cambria Math" w:hAnsi="Cambria Math"/>
-          </w:rPr>
-          <m:t xml:space="preserve"> </m:t>
-        </m:r>
         <m:r>
           <w:rPr>
             <w:rFonts w:ascii="Cambria Math" w:hAnsi="Cambria Math"/>
           </w:rPr>
-          <m:t>O(n</m:t>
+          <m:t xml:space="preserve"> O(n</m:t>
         </m:r>
         <m:func>
           <m:funcPr>
@@ -21179,13 +21053,22 @@
         <w:t>.</w:t>
       </w:r>
       <w:r>
-        <w:t>Sendo mais aparente no gráfico</w:t>
+        <w:t xml:space="preserve"> </w:t>
+      </w:r>
+      <w:r>
+        <w:t>Sendo mais</w:t>
+      </w:r>
+      <w:r>
+        <w:t xml:space="preserve"> aparente no gráfico</w:t>
       </w:r>
       <w:r>
         <w:t>:</w:t>
       </w:r>
       <w:r>
-        <w:t xml:space="preserve"> a seguir:</w:t>
+        <w:t xml:space="preserve"> a </w:t>
+      </w:r>
+      <w:r>
+        <w:t>seguir:</w:t>
       </w:r>
       <w:r>
         <w:rPr>
@@ -21323,7 +21206,6 @@
           <w:szCs w:val="24"/>
         </w:rPr>
       </w:pPr>
-      <w:bookmarkStart w:id="19" w:name="_Toc200439716"/>
       <w:r>
         <w:rPr>
           <w:rFonts w:ascii="Times" w:hAnsi="Times" w:cs="Times"/>
@@ -21345,6 +21227,7 @@
           <w:szCs w:val="24"/>
         </w:rPr>
       </w:pPr>
+      <w:bookmarkStart w:id="23" w:name="_Toc201083655"/>
       <w:r>
         <w:rPr>
           <w:rFonts w:ascii="Times" w:hAnsi="Times" w:cs="Times"/>
@@ -21373,7 +21256,7 @@
         </w:rPr>
         <w:t>da Configuração do Computador Utilizado</w:t>
       </w:r>
-      <w:bookmarkEnd w:id="19"/>
+      <w:bookmarkEnd w:id="23"/>
     </w:p>
     <w:p>
       <w:pPr>
@@ -21832,7 +21715,6 @@
           <w:szCs w:val="24"/>
         </w:rPr>
       </w:pPr>
-      <w:bookmarkStart w:id="20" w:name="_Toc200439720"/>
       <w:r>
         <w:rPr>
           <w:rFonts w:ascii="Times" w:hAnsi="Times" w:cs="Times"/>
@@ -21858,6 +21740,7 @@
           <w:szCs w:val="24"/>
         </w:rPr>
       </w:pPr>
+      <w:bookmarkStart w:id="24" w:name="_Toc201083656"/>
       <w:r>
         <w:rPr>
           <w:rFonts w:ascii="Times" w:hAnsi="Times" w:cs="Times"/>
@@ -21868,7 +21751,7 @@
         <w:lastRenderedPageBreak/>
         <w:t>Conclusão</w:t>
       </w:r>
-      <w:bookmarkEnd w:id="20"/>
+      <w:bookmarkEnd w:id="24"/>
     </w:p>
     <w:p>
       <w:pPr>
@@ -21878,14 +21761,14 @@
           <w:color w:val="auto"/>
         </w:rPr>
       </w:pPr>
-      <w:bookmarkStart w:id="21" w:name="_Toc200439721"/>
+      <w:bookmarkStart w:id="25" w:name="_Toc201083657"/>
       <w:r>
         <w:rPr>
           <w:color w:val="auto"/>
         </w:rPr>
         <w:t>Pontos Fortes</w:t>
       </w:r>
-      <w:bookmarkEnd w:id="21"/>
+      <w:bookmarkEnd w:id="25"/>
     </w:p>
     <w:p>
       <w:pPr>
@@ -22137,14 +22020,14 @@
           <w:color w:val="auto"/>
         </w:rPr>
       </w:pPr>
-      <w:bookmarkStart w:id="22" w:name="_Toc200439722"/>
+      <w:bookmarkStart w:id="26" w:name="_Toc201083658"/>
       <w:r>
         <w:rPr>
           <w:color w:val="auto"/>
         </w:rPr>
         <w:t>Pontos Fracos</w:t>
       </w:r>
-      <w:bookmarkEnd w:id="22"/>
+      <w:bookmarkEnd w:id="26"/>
     </w:p>
     <w:p>
       <w:pPr>
@@ -22540,7 +22423,7 @@
           <w:color w:val="auto"/>
         </w:rPr>
       </w:pPr>
-      <w:bookmarkStart w:id="23" w:name="_Toc200439723"/>
+      <w:bookmarkStart w:id="27" w:name="_Toc201083659"/>
       <w:r>
         <w:rPr>
           <w:color w:val="auto"/>
@@ -22578,7 +22461,7 @@
         </w:rPr>
         <w:t>Quicksort</w:t>
       </w:r>
-      <w:bookmarkEnd w:id="23"/>
+      <w:bookmarkEnd w:id="27"/>
     </w:p>
     <w:p>
       <w:pPr>
@@ -23403,7 +23286,7 @@
           <w:szCs w:val="24"/>
         </w:rPr>
       </w:pPr>
-      <w:bookmarkStart w:id="24" w:name="_Toc200439724"/>
+      <w:bookmarkStart w:id="28" w:name="_Toc201083660"/>
       <w:r>
         <w:rPr>
           <w:rFonts w:ascii="Times" w:hAnsi="Times" w:cs="Times"/>
@@ -23414,7 +23297,7 @@
         <w:lastRenderedPageBreak/>
         <w:t>Referências</w:t>
       </w:r>
-      <w:bookmarkEnd w:id="24"/>
+      <w:bookmarkEnd w:id="28"/>
     </w:p>
     <w:p>
       <w:pPr>
@@ -24502,33 +24385,6 @@
     </w:sectPr>
   </w:body>
 </w:document>
-</file>
-
-<file path=word/commentsExtended.xml><?xml version="1.0" encoding="utf-8"?>
-<w15:commentsEx xmlns:wpc="http://schemas.microsoft.com/office/word/2010/wordprocessingCanvas" xmlns:cx="http://schemas.microsoft.com/office/drawing/2014/chartex" xmlns:cx1="http://schemas.microsoft.com/office/drawing/2015/9/8/chartex" xmlns:cx2="http://schemas.microsoft.com/office/drawing/2015/10/21/chartex" xmlns:cx3="http://schemas.microsoft.com/office/drawing/2016/5/9/chartex" xmlns:cx4="http://schemas.microsoft.com/office/drawing/2016/5/10/chartex" xmlns:cx5="http://schemas.microsoft.com/office/drawing/2016/5/11/chartex" xmlns:cx6="http://schemas.microsoft.com/office/drawing/2016/5/12/chartex" xmlns:cx7="http://schemas.microsoft.com/office/drawing/2016/5/13/chartex" xmlns:cx8="http://schemas.microsoft.com/office/drawing/2016/5/14/chartex" xmlns:mc="http://schemas.openxmlformats.org/markup-compatibility/2006" xmlns:aink="http://schemas.microsoft.com/office/drawing/2016/ink" xmlns:am3d="http://schemas.microsoft.com/office/drawing/2017/model3d" xmlns:o="urn:schemas-microsoft-com:office:office" xmlns:oel="http://schemas.microsoft.com/office/2019/extlst" xmlns:r="http://schemas.openxmlformats.org/officeDocument/2006/relationships" xmlns:m="http://schemas.openxmlformats.org/officeDocument/2006/math" xmlns:v="urn:schemas-microsoft-com:vml" xmlns:wp14="http://schemas.microsoft.com/office/word/2010/wordprocessingDrawing" xmlns:wp="http://schemas.openxmlformats.org/drawingml/2006/wordprocessingDrawing" xmlns:w10="urn:schemas-microsoft-com:office:word" xmlns:w="http://schemas.openxmlformats.org/wordprocessingml/2006/main" xmlns:w14="http://schemas.microsoft.com/office/word/2010/wordml" xmlns:w15="http://schemas.microsoft.com/office/word/2012/wordml" xmlns:w16cex="http://schemas.microsoft.com/office/word/2018/wordml/cex" xmlns:w16cid="http://schemas.microsoft.com/office/word/2016/wordml/cid" xmlns:w16="http://schemas.microsoft.com/office/word/2018/wordml" xmlns:w16du="http://schemas.microsoft.com/office/word/2023/wordml/word16du" xmlns:w16sdtdh="http://schemas.microsoft.com/office/word/2020/wordml/sdtdatahash" xmlns:w16sdtfl="http://schemas.microsoft.com/office/word/2024/wordml/sdtformatlock" xmlns:w16se="http://schemas.microsoft.com/office/word/2015/wordml/symex" xmlns:wpg="http://schemas.microsoft.com/office/word/2010/wordprocessingGroup" xmlns:wpi="http://schemas.microsoft.com/office/word/2010/wordprocessingInk" xmlns:wne="http://schemas.microsoft.com/office/word/2006/wordml" xmlns:wps="http://schemas.microsoft.com/office/word/2010/wordprocessingShape" mc:Ignorable="w14 w15 w16se w16cid w16 w16cex w16sdtdh w16sdtfl w16du wp14">
-  <w15:commentEx w15:paraId="35FAB71F" w15:done="0"/>
-  <w15:commentEx w15:paraId="6DA6DAF5" w15:done="0"/>
-  <w15:commentEx w15:paraId="407EF9D3" w15:done="0"/>
-  <w15:commentEx w15:paraId="5423E914" w15:done="0"/>
-</w15:commentsEx>
-</file>
-
-<file path=word/commentsExtensible.xml><?xml version="1.0" encoding="utf-8"?>
-<w16cex:commentsExtensible xmlns:wpc="http://schemas.microsoft.com/office/word/2010/wordprocessingCanvas" xmlns:cx="http://schemas.microsoft.com/office/drawing/2014/chartex" xmlns:cx1="http://schemas.microsoft.com/office/drawing/2015/9/8/chartex" xmlns:cx2="http://schemas.microsoft.com/office/drawing/2015/10/21/chartex" xmlns:cx3="http://schemas.microsoft.com/office/drawing/2016/5/9/chartex" xmlns:cx4="http://schemas.microsoft.com/office/drawing/2016/5/10/chartex" xmlns:cx5="http://schemas.microsoft.com/office/drawing/2016/5/11/chartex" xmlns:cx6="http://schemas.microsoft.com/office/drawing/2016/5/12/chartex" xmlns:cx7="http://schemas.microsoft.com/office/drawing/2016/5/13/chartex" xmlns:cx8="http://schemas.microsoft.com/office/drawing/2016/5/14/chartex" xmlns:cr="http://schemas.microsoft.com/office/comments/2020/reactions" xmlns:mc="http://schemas.openxmlformats.org/markup-compatibility/2006" xmlns:aink="http://schemas.microsoft.com/office/drawing/2016/ink" xmlns:am3d="http://schemas.microsoft.com/office/drawing/2017/model3d" xmlns:o="urn:schemas-microsoft-com:office:office" xmlns:oel="http://schemas.microsoft.com/office/2019/extlst" xmlns:r="http://schemas.openxmlformats.org/officeDocument/2006/relationships" xmlns:m="http://schemas.openxmlformats.org/officeDocument/2006/math" xmlns:v="urn:schemas-microsoft-com:vml" xmlns:wp14="http://schemas.microsoft.com/office/word/2010/wordprocessingDrawing" xmlns:wp="http://schemas.openxmlformats.org/drawingml/2006/wordprocessingDrawing" xmlns:w10="urn:schemas-microsoft-com:office:word" xmlns:w="http://schemas.openxmlformats.org/wordprocessingml/2006/main" xmlns:w14="http://schemas.microsoft.com/office/word/2010/wordml" xmlns:w15="http://schemas.microsoft.com/office/word/2012/wordml" xmlns:w16cex="http://schemas.microsoft.com/office/word/2018/wordml/cex" xmlns:w16cid="http://schemas.microsoft.com/office/word/2016/wordml/cid" xmlns:w16="http://schemas.microsoft.com/office/word/2018/wordml" xmlns:w16du="http://schemas.microsoft.com/office/word/2023/wordml/word16du" xmlns:w16sdtdh="http://schemas.microsoft.com/office/word/2020/wordml/sdtdatahash" xmlns:w16sdtfl="http://schemas.microsoft.com/office/word/2024/wordml/sdtformatlock" xmlns:w16se="http://schemas.microsoft.com/office/word/2015/wordml/symex" xmlns:wpg="http://schemas.microsoft.com/office/word/2010/wordprocessingGroup" xmlns:wpi="http://schemas.microsoft.com/office/word/2010/wordprocessingInk" xmlns:wne="http://schemas.microsoft.com/office/word/2006/wordml" xmlns:wps="http://schemas.microsoft.com/office/word/2010/wordprocessingShape" mc:Ignorable="w14 w15 w16se w16cid w16 w16cex w16sdtdh w16sdtfl cr w16du wp14">
-  <w16cex:commentExtensible w16cex:durableId="14CD5637" w16cex:dateUtc="2025-06-11T21:34:00Z"/>
-  <w16cex:commentExtensible w16cex:durableId="427D0633" w16cex:dateUtc="2025-06-11T21:35:00Z"/>
-  <w16cex:commentExtensible w16cex:durableId="1CD6F2FC" w16cex:dateUtc="2025-06-11T21:36:00Z"/>
-  <w16cex:commentExtensible w16cex:durableId="3C264B45" w16cex:dateUtc="2025-06-11T21:48:00Z"/>
-</w16cex:commentsExtensible>
-</file>
-
-<file path=word/commentsIds.xml><?xml version="1.0" encoding="utf-8"?>
-<w16cid:commentsIds xmlns:wpc="http://schemas.microsoft.com/office/word/2010/wordprocessingCanvas" xmlns:cx="http://schemas.microsoft.com/office/drawing/2014/chartex" xmlns:cx1="http://schemas.microsoft.com/office/drawing/2015/9/8/chartex" xmlns:cx2="http://schemas.microsoft.com/office/drawing/2015/10/21/chartex" xmlns:cx3="http://schemas.microsoft.com/office/drawing/2016/5/9/chartex" xmlns:cx4="http://schemas.microsoft.com/office/drawing/2016/5/10/chartex" xmlns:cx5="http://schemas.microsoft.com/office/drawing/2016/5/11/chartex" xmlns:cx6="http://schemas.microsoft.com/office/drawing/2016/5/12/chartex" xmlns:cx7="http://schemas.microsoft.com/office/drawing/2016/5/13/chartex" xmlns:cx8="http://schemas.microsoft.com/office/drawing/2016/5/14/chartex" xmlns:mc="http://schemas.openxmlformats.org/markup-compatibility/2006" xmlns:aink="http://schemas.microsoft.com/office/drawing/2016/ink" xmlns:am3d="http://schemas.microsoft.com/office/drawing/2017/model3d" xmlns:o="urn:schemas-microsoft-com:office:office" xmlns:oel="http://schemas.microsoft.com/office/2019/extlst" xmlns:r="http://schemas.openxmlformats.org/officeDocument/2006/relationships" xmlns:m="http://schemas.openxmlformats.org/officeDocument/2006/math" xmlns:v="urn:schemas-microsoft-com:vml" xmlns:wp14="http://schemas.microsoft.com/office/word/2010/wordprocessingDrawing" xmlns:wp="http://schemas.openxmlformats.org/drawingml/2006/wordprocessingDrawing" xmlns:w10="urn:schemas-microsoft-com:office:word" xmlns:w="http://schemas.openxmlformats.org/wordprocessingml/2006/main" xmlns:w14="http://schemas.microsoft.com/office/word/2010/wordml" xmlns:w15="http://schemas.microsoft.com/office/word/2012/wordml" xmlns:w16cex="http://schemas.microsoft.com/office/word/2018/wordml/cex" xmlns:w16cid="http://schemas.microsoft.com/office/word/2016/wordml/cid" xmlns:w16="http://schemas.microsoft.com/office/word/2018/wordml" xmlns:w16du="http://schemas.microsoft.com/office/word/2023/wordml/word16du" xmlns:w16sdtdh="http://schemas.microsoft.com/office/word/2020/wordml/sdtdatahash" xmlns:w16sdtfl="http://schemas.microsoft.com/office/word/2024/wordml/sdtformatlock" xmlns:w16se="http://schemas.microsoft.com/office/word/2015/wordml/symex" xmlns:wpg="http://schemas.microsoft.com/office/word/2010/wordprocessingGroup" xmlns:wpi="http://schemas.microsoft.com/office/word/2010/wordprocessingInk" xmlns:wne="http://schemas.microsoft.com/office/word/2006/wordml" xmlns:wps="http://schemas.microsoft.com/office/word/2010/wordprocessingShape" mc:Ignorable="w14 w15 w16se w16cid w16 w16cex w16sdtdh w16sdtfl w16du wp14">
-  <w16cid:commentId w16cid:paraId="35FAB71F" w16cid:durableId="14CD5637"/>
-  <w16cid:commentId w16cid:paraId="6DA6DAF5" w16cid:durableId="427D0633"/>
-  <w16cid:commentId w16cid:paraId="407EF9D3" w16cid:durableId="1CD6F2FC"/>
-  <w16cid:commentId w16cid:paraId="5423E914" w16cid:durableId="3C264B45"/>
-</w16cid:commentsIds>
 </file>
 
 <file path=word/endnotes.xml><?xml version="1.0" encoding="utf-8"?>
@@ -24585,7 +24441,7 @@
           <w:rPr>
             <w:noProof/>
           </w:rPr>
-          <w:t>39</w:t>
+          <w:t>40</w:t>
         </w:r>
         <w:r>
           <w:rPr>
@@ -25926,14 +25782,6 @@
     <w:abstractNumId w:val="6"/>
   </w:num>
 </w:numbering>
-</file>
-
-<file path=word/people.xml><?xml version="1.0" encoding="utf-8"?>
-<w15:people xmlns:wpc="http://schemas.microsoft.com/office/word/2010/wordprocessingCanvas" xmlns:cx="http://schemas.microsoft.com/office/drawing/2014/chartex" xmlns:cx1="http://schemas.microsoft.com/office/drawing/2015/9/8/chartex" xmlns:cx2="http://schemas.microsoft.com/office/drawing/2015/10/21/chartex" xmlns:cx3="http://schemas.microsoft.com/office/drawing/2016/5/9/chartex" xmlns:cx4="http://schemas.microsoft.com/office/drawing/2016/5/10/chartex" xmlns:cx5="http://schemas.microsoft.com/office/drawing/2016/5/11/chartex" xmlns:cx6="http://schemas.microsoft.com/office/drawing/2016/5/12/chartex" xmlns:cx7="http://schemas.microsoft.com/office/drawing/2016/5/13/chartex" xmlns:cx8="http://schemas.microsoft.com/office/drawing/2016/5/14/chartex" xmlns:mc="http://schemas.openxmlformats.org/markup-compatibility/2006" xmlns:aink="http://schemas.microsoft.com/office/drawing/2016/ink" xmlns:am3d="http://schemas.microsoft.com/office/drawing/2017/model3d" xmlns:o="urn:schemas-microsoft-com:office:office" xmlns:oel="http://schemas.microsoft.com/office/2019/extlst" xmlns:r="http://schemas.openxmlformats.org/officeDocument/2006/relationships" xmlns:m="http://schemas.openxmlformats.org/officeDocument/2006/math" xmlns:v="urn:schemas-microsoft-com:vml" xmlns:wp14="http://schemas.microsoft.com/office/word/2010/wordprocessingDrawing" xmlns:wp="http://schemas.openxmlformats.org/drawingml/2006/wordprocessingDrawing" xmlns:w10="urn:schemas-microsoft-com:office:word" xmlns:w="http://schemas.openxmlformats.org/wordprocessingml/2006/main" xmlns:w14="http://schemas.microsoft.com/office/word/2010/wordml" xmlns:w15="http://schemas.microsoft.com/office/word/2012/wordml" xmlns:w16cex="http://schemas.microsoft.com/office/word/2018/wordml/cex" xmlns:w16cid="http://schemas.microsoft.com/office/word/2016/wordml/cid" xmlns:w16="http://schemas.microsoft.com/office/word/2018/wordml" xmlns:w16du="http://schemas.microsoft.com/office/word/2023/wordml/word16du" xmlns:w16sdtdh="http://schemas.microsoft.com/office/word/2020/wordml/sdtdatahash" xmlns:w16sdtfl="http://schemas.microsoft.com/office/word/2024/wordml/sdtformatlock" xmlns:w16se="http://schemas.microsoft.com/office/word/2015/wordml/symex" xmlns:wpg="http://schemas.microsoft.com/office/word/2010/wordprocessingGroup" xmlns:wpi="http://schemas.microsoft.com/office/word/2010/wordprocessingInk" xmlns:wne="http://schemas.microsoft.com/office/word/2006/wordml" xmlns:wps="http://schemas.microsoft.com/office/word/2010/wordprocessingShape" mc:Ignorable="w14 w15 w16se w16cid w16 w16cex w16sdtdh w16sdtfl w16du wp14">
-  <w15:person w15:author="MARCELO HENRIQUE COSTA DA SILVA">
-    <w15:presenceInfo w15:providerId="AD" w15:userId="S-1-5-21-1960408961-789336058-1343024091-54027"/>
-  </w15:person>
-</w15:people>
 </file>
 
 <file path=word/styles.xml><?xml version="1.0" encoding="utf-8"?>

</xml_diff>